<commit_message>
fix: Table S1 reecrite par station - 5 rivieres fausses (Suran, Beaume, Buech, Canal declarees Ain/Ardeche/Durance), 6 positions decalees jusqu a 41.4 km, structure a deux stations du Suran absente, total 181 au lieu de 180 ; fix: script 19 indexait station_reference sur la station seule et ecrasait la date 2015 du Suran par celle de 2014 (228 lignes, les 19 individus Cab portaient une date fausse d un an) ; feat: paragraphe 1 de l Article et du M&M reecrit avec les stations, les dates reelles et les categories genotypiques
</commit_message>
<xml_diff>
--- a/docs/manuscrit/Article.docx
+++ b/docs/manuscrit/Article.docx
@@ -37,7 +37,13 @@
           <w:b w:val="0"/>
           <w:i w:val="0"/>
         </w:rPr>
-        <w:t>We studied the host-associated bacterial microbiota of two interbreeding cyprinid fishes, the nase Chondrostoma nasus (hotu, code Cn) and the toxostome Parachondrostoma toxostoma (code Pt), together with unassigned Chondrostoma sp. individuals (code Ch) from their contact zone, which comprise the two parental species and their as-yet field-unresolved hybrids. Fish were sampled across nine sites of the Rhône drainage (Durance and Ardèche rivers, France) over two years (2014 and 2015), spanning a gradient of hybrid-zone context (allopatry, sympatry with hybridisation, and asymmetric introgression). A total of 183 individual fish were sequenced (134 Chondrostoma sp., 37 C. nasus, 12 P. toxostoma). The design is strongly unbalanced: site and year are largely confounded (only two sites were sampled in both years), as are taxon and site.</w:t>
+      </w:r>
+      <w:r>
+        <w:rPr>
+          <w:i w:val="0"/>
+          <w:color w:val="1F4E79"/>
+        </w:rPr>
+        <w:t>We studied the host-associated bacterial microbiota of two interbreeding cyprinid fishes, the nase Chondrostoma nasus (code Cn) and the toxostome Parachondrostoma toxostoma (code Pt), together with their hybrids (code Hy), in their contact zone. Fish were sampled at nine stations of the Rhône drainage (rivers Durance, Suran, Buech, Beaume and Ardèche, and one canal fed by the Largue; south-eastern France) over two years (2014 and 2015), spanning a gradient of hybrid-zone context (allopatry, sympatry with hybridisation, and asymmetric introgression). Two of the nine stations lie on the Suran, 17.2 km apart and separated by a barrier passable only downstream; they are treated as distinct stations throughout because they carry different taxa.</w:t>
       </w:r>
     </w:p>
     <w:p>
@@ -60,8 +66,13 @@
       </w:r>
     </w:p>
     <w:p>
+      <w:r/>
       <w:r>
-        <w:t>Site codes, rivers, WGS84 coordinates, years of sampling and the number of individuals and libraries per site are given in Supplementary Table S1. Collection dates are recorded at year resolution.</w:t>
+        <w:rPr>
+          <w:i w:val="0"/>
+          <w:color w:val="1F4E79"/>
+        </w:rPr>
+        <w:t>Stations, rivers, WGS84 coordinates, collection dates, years of sampling, genotypic composition and the number of individuals and libraries per station are given in Supplementary Table S1. Coordinates and collection dates are field records supplied by the collecting team; an earlier version of this dataset carried coordinates extrapolated from commune names, which have been replaced (see the note to Table S1).</w:t>
       </w:r>
     </w:p>
     <w:p>
@@ -70,7 +81,13 @@
         <w:rPr>
           <w:i w:val="0"/>
         </w:rPr>
-        <w:t>Individuals are counted per site and year of sampling, since the same station sampled in two years contributes distinct individuals to the design. Counting this way gives 181 individuals; collapsing years gives 156, because individual numbering restarts each year and identical numbers at one station are then merged. The two figures describe the same fish: 181 is the count used in the analyses, 156 the count obtained if the year is ignored. Supplementary Table S1 reports both.</w:t>
+      </w:r>
+      <w:r>
+        <w:rPr>
+          <w:i w:val="0"/>
+          <w:color w:val="1F4E79"/>
+        </w:rPr>
+        <w:t>Individuals are counted per site code and year of sampling, since the same station sampled in two years contributes distinct individuals to the design. Counting this way gives 180 individuals; collapsing years gives 156, because individual numbering restarts each year and identical numbers at one site are then merged. The two figures describe the same fish: 180 is the count used in the analyses, 156 the count obtained if the year is ignored.</w:t>
       </w:r>
     </w:p>
     <w:p>
@@ -79,7 +96,13 @@
           <w:b w:val="0"/>
           <w:i/>
         </w:rPr>
-        <w:t>L'identification fine des Chondrostoma sp. (statut parental vs hybride, code Species = Cn/Pt/Hy) est en cours de caractérisation et sera intégrée pour l'analyse de la question hybride ; elle n'affecte pas le traitement bioinformatique ci-dessous.</w:t>
+      </w:r>
+      <w:r>
+        <w:rPr>
+          <w:i w:val="0"/>
+          <w:color w:val="1F4E79"/>
+        </w:rPr>
+        <w:t>Species identity was resolved by genotyping rather than by morphology. Each individual was assigned to one of three categories from a chromosome-level assignment — Cn (59 individuals), Hy (30) and Pt (91) — and not by thresholding a median hybrid index, because a substantial minority of hybrids carry an extreme median index and their inter-chromosome discordance is what identifies them. Eight of the 49 individuals previously identified on morphology were reclassified. Three stations carry all three categories (74 individuals), which is the subset in which the hybrid contrast can be tested within a station.</w:t>
       </w:r>
     </w:p>
     <w:p>

</xml_diff>

<commit_message>
feat: redaction des six resultats produits mais non ecrits - nouvelles sections 8.8 (effet de position dans la plaque, avec les trois temoins qui le separent du taxon) et 8.9 (structure du confondant categorie/station/position et partition preliminaire), extension du 8.6 (metriques phylogenetiques sur les memes tirages, mesure de l accord entre profondeurs et conception de la sensibilite a 500), placeholder des modeles statistiques leve ; supplementaire: Tables S6 a S8 et Figures S1-S2
</commit_message>
<xml_diff>
--- a/docs/manuscrit/Article.docx
+++ b/docs/manuscrit/Article.docx
@@ -535,11 +535,56 @@
       <w:pPr/>
       <w:r>
         <w:rPr>
+          <w:i w:val="0"/>
+        </w:rPr>
+      </w:r>
+      <w:r>
+        <w:rPr>
+          <w:b w:val="0"/>
+          <w:i w:val="0"/>
+          <w:color w:val="1F4E79"/>
+        </w:rPr>
+        <w:t>Phylogenetic metrics were computed on the same draws as the taxonomic ones. Unweighted UniFrac, weighted normalized UniFrac and Faith's phylogenetic diversity were averaged over 400 rarefactions at 3,000 reads, run as two independent chains of 200 with disjoint seeds so that Monte-Carlo error could be measured rather than assumed: relative standard error ranged from 0.04 % (Shannon) to 0.18 % (inverse Simpson), with between-chain correlations of at least 0.99987 on every metric. Convergence established on Bray-Curtis was not assumed to transfer to UniFrac. As a control that could have failed, the three taxonomic alpha indices were recomputed on these draws and compared with the earlier, independently drawn series: agreement was r &gt; 0.999997 with mean relative deviations of 0.04-0.15 %.</w:t>
+      </w:r>
+    </w:p>
+    <w:p>
+      <w:pPr/>
+      <w:r>
+        <w:rPr>
+          <w:i w:val="0"/>
+        </w:rPr>
+      </w:r>
+      <w:r>
+        <w:rPr>
+          <w:b w:val="0"/>
+          <w:i w:val="0"/>
+          <w:color w:val="1F4E79"/>
+        </w:rPr>
+        <w:t>Because the rarefaction threshold both equalises depth and decides which samples enter, the second of these effects was quantified separately. On a fixed set of samples - those retained at 3,000 reads, so that only depth varies - dissimilarity matrices recomputed at 500 to 2,000 reads were compared with the 3,000-read reference. The two abundance-weighted metrics proved essentially invariant down to 500 reads (weighted UniFrac r = 0.9994, Bray-Curtis r = 0.9985), whereas the two presence-based metrics degraded (Jaccard r = 0.9617, unweighted UniFrac r = 0.9373) and observed richness fell by 42 %, confirming that the loss is driven by rare taxa rather than by a general low-depth artefact. Sample retention at 3,000 reads is not random with respect to the variable of interest: in the caudal fin 57 % of hybrids passed the threshold against 87 % of P. toxostoma, a 30-point gap reaching 53 points at one of the three stations carrying the full genotypic gradient. No threshold removes this selection without the corresponding loss of richness. Claims resting on abundance-weighted metrics are therefore accompanied by a sensitivity analysis at 500 reads, where the caudal-fin gap falls to 2.5 points and 2,067 samples are retained; claims resting on presence-based metrics are reported at 3,000 reads with the selection declared, since they cannot be tested at 500 and the midgut gap (15 points) persists there in any case.</w:t>
+      </w:r>
+      <w:r>
+        <w:rPr>
+          <w:color w:val="1F4E79"/>
+        </w:rPr>
+        <w:t xml:space="preserve"> Supplementary Table S7 and Figure S2.</w:t>
+      </w:r>
+    </w:p>
+    <w:p>
+      <w:pPr/>
+      <w:r>
+        <w:rPr>
           <w:i/>
           <w:color w:val="888888"/>
           <w:sz w:val="18"/>
         </w:rPr>
-        <w:t>[À COMPLÉTER : modèles statistiques — structure des effets aléatoires (séquençage niché dans la préparation de librairie, cf. §8.7), PERMANOVA et PERMDISP, méthode d'abondance différentielle, et contrastes le long du gradient de la zone hybride. Dépend de l'index hybride en cours de génotypage.]</w:t>
+      </w:r>
+      <w:r>
+        <w:rPr>
+          <w:b w:val="0"/>
+          <w:i w:val="0"/>
+          <w:color w:val="1F4E79"/>
+        </w:rPr>
+        <w:t>Statistical framework. Community composition is analysed by PERMANOVA on the averaged dissimilarity matrices, stratified by tissue. Stratification is imposed by the design rather than chosen: 168 of the 180 fish occupy the same plate column across all four tissues, so plate position is not estimable in a pooled model carrying fish identity. Station, not site code, is the spatial unit, since two site codes each span two Suran stations that share no genotypic category. Sequencing run is nested within library preparation (SS8.7), and plate column enters as a covariate (SS8.8). Because genotypic category, station and plate position are mutually entangled (SS8.9), no single sequential decomposition is reported: each model is fitted in both orderings and the interval between them is given, the ordering that serves category first bounding it from above and the ordering that serves it last from below. Permutations are constrained within station blocks where the question concerns a within-station contrast. Dispersion is tested separately with PERMDISP, since the transgressive hypothesis concerns the variability of hybrid microbiota and not only the position of its centroid, and since PERMANOVA is itself sensitive to heterogeneous dispersion. Every claim is reported per metric and per tissue; the choice of a differential-abundance method remains to be fixed.</w:t>
       </w:r>
     </w:p>
     <w:p>
@@ -575,6 +620,271 @@
           <w:i w:val="0"/>
         </w:rPr>
         <w:t>Relative to the biological signal, this technical variation is negligible. In a PERMANOVA on Bray–Curtis distances over the 1,784 samples retained after rarefaction, with the technical terms entered first so that they absorb the maximum variance the sequential decomposition can assign them, library preparation explained 0.03 % of the variance (R² = 0.0003, p = 0.63) and sequencing run within library 0.005 % (p = 1.00), against 9.2 % for tissue and 37.7 % for fish identity (both p = 0.002). Mean Bray–Curtis dissimilarity was 0.13 between two sequencing runs of one library and 0.25 across libraries, against 0.88 between different fish of the same tissue and 0.94 across tissues. Note that library preparation cannot be tested marginally, being perfectly aliased with run label (durance1 is the sole run of the first preparation).</w:t>
+      </w:r>
+    </w:p>
+    <w:p>
+      <w:pPr>
+        <w:pStyle w:val="Heading1"/>
+      </w:pPr>
+      <w:r/>
+      <w:r>
+        <w:rPr>
+          <w:b w:val="0"/>
+          <w:i w:val="0"/>
+        </w:rPr>
+        <w:t>8.8 Plate position</w:t>
+      </w:r>
+    </w:p>
+    <w:p>
+      <w:pPr>
+        <w:pStyle w:val="Heading1"/>
+      </w:pPr>
+      <w:r/>
+      <w:r>
+        <w:rPr>
+          <w:b w:val="0"/>
+          <w:i w:val="0"/>
+        </w:rPr>
+      </w:r>
+      <w:r>
+        <w:rPr>
+          <w:b w:val="0"/>
+          <w:i w:val="0"/>
+          <w:color w:val="1F4E79"/>
+        </w:rPr>
+        <w:t>Individuals were numbered in the field in an order that is not random with respect to genotype, and that order propagated to the extraction plates: category and plate column are strongly associated (Cramer's V = 0.48). Whether plate position affects composition was therefore tested rather than assumed. Rarefaction equalises depth, so a test on read depth would not have answered the question; PERMANOVA was run on composition, stratified by tissue, with permutations constrained within station blocks so that a detected column effect cannot be a station effect, and with each sequencing run analysed separately, plate position being identical across runs.</w:t>
+      </w:r>
+    </w:p>
+    <w:p>
+      <w:pPr>
+        <w:pStyle w:val="Heading1"/>
+      </w:pPr>
+      <w:r/>
+      <w:r>
+        <w:rPr>
+          <w:b w:val="0"/>
+          <w:i w:val="0"/>
+        </w:rPr>
+      </w:r>
+      <w:r>
+        <w:rPr>
+          <w:b w:val="0"/>
+          <w:i w:val="0"/>
+          <w:color w:val="1F4E79"/>
+        </w:rPr>
+      </w:r>
+      <w:r>
+        <w:rPr>
+          <w:b w:val="0"/>
+          <w:i w:val="0"/>
+          <w:color w:val="1F4E79"/>
+        </w:rPr>
+        <w:t>The effect is present in all 24 strata (12 tissue x run strata x 2 metrics, p &lt;= 0.007), replicated across the three runs. Because the terms differ in degrees of freedom, effect sizes are reported relative to their expectation under the null, R2/(df/(n-1)): plate column reaches 1.95 (median R2 = 0.141, 11 df), the same order as genotypic category (2.32; median R2 = 0.029, 2 df) and below station (3.69; median R2 = 0.196, 8 df).</w:t>
+      </w:r>
+      <w:r>
+        <w:rPr>
+          <w:color w:val="1F4E79"/>
+        </w:rPr>
+        <w:t xml:space="preserve"> Supplementary Table S6 and Figure S1.</w:t>
+      </w:r>
+    </w:p>
+    <w:p>
+      <w:pPr>
+        <w:pStyle w:val="Heading1"/>
+      </w:pPr>
+      <w:r/>
+      <w:r>
+        <w:rPr>
+          <w:b w:val="0"/>
+          <w:i w:val="0"/>
+        </w:rPr>
+      </w:r>
+      <w:r>
+        <w:rPr>
+          <w:b w:val="0"/>
+          <w:i w:val="0"/>
+          <w:color w:val="1F4E79"/>
+        </w:rPr>
+      </w:r>
+      <w:r>
+        <w:rPr>
+          <w:b w:val="0"/>
+          <w:i w:val="0"/>
+          <w:color w:val="1F4E79"/>
+        </w:rPr>
+      </w:r>
+      <w:r>
+        <w:rPr>
+          <w:b w:val="0"/>
+          <w:i w:val="0"/>
+          <w:color w:val="1F4E79"/>
+        </w:rPr>
+        <w:t>Three witnesses separate this effect from the biology it could be mistaken for. In the five stations carrying a single category, where a column effect is positional by construction, it persists (20 of 24 strata, ratio 2.11). In the symmetric ordering with category fitted first, column still contributes (21 of 24 strata). And the classic plate artefacts are absent: plate row is significant in 6 of 24 strata and plate edge in none, making the effect specific to column, as expected of an effect tracking processing order rather than evaporation or thermal gradients. The mechanism is not identified: extraction order, reagent-batch drift within a plate and cross-contamination between adjacent wells are not separated by these data, and no negative control isolates any of them. Plate column is therefore carried as a covariate in every model testing category, and one tissue's apparent category signal does not survive that adjustment.</w:t>
+      </w:r>
+    </w:p>
+    <w:p>
+      <w:pPr>
+        <w:pStyle w:val="Heading1"/>
+      </w:pPr>
+      <w:r/>
+      <w:r>
+        <w:rPr>
+          <w:b w:val="0"/>
+          <w:i w:val="0"/>
+        </w:rPr>
+      </w:r>
+      <w:r>
+        <w:rPr>
+          <w:b w:val="0"/>
+          <w:i w:val="0"/>
+          <w:color w:val="1F4E79"/>
+        </w:rPr>
+      </w:r>
+      <w:r>
+        <w:rPr>
+          <w:b w:val="0"/>
+          <w:i w:val="0"/>
+          <w:color w:val="1F4E79"/>
+        </w:rPr>
+      </w:r>
+      <w:r>
+        <w:rPr>
+          <w:b w:val="0"/>
+          <w:i w:val="0"/>
+          <w:color w:val="1F4E79"/>
+        </w:rPr>
+      </w:r>
+      <w:r>
+        <w:rPr>
+          <w:b w:val="0"/>
+          <w:i w:val="0"/>
+        </w:rPr>
+      </w:r>
+      <w:r>
+        <w:rPr>
+          <w:b w:val="0"/>
+          <w:i w:val="0"/>
+        </w:rPr>
+        <w:t>8.9 Structure of confounding in the genotypic design</w:t>
+      </w:r>
+    </w:p>
+    <w:p>
+      <w:pPr>
+        <w:pStyle w:val="Heading1"/>
+      </w:pPr>
+      <w:r/>
+      <w:r>
+        <w:rPr>
+          <w:b w:val="0"/>
+          <w:i w:val="0"/>
+        </w:rPr>
+      </w:r>
+      <w:r>
+        <w:rPr>
+          <w:b w:val="0"/>
+          <w:i w:val="0"/>
+          <w:color w:val="1F4E79"/>
+        </w:rPr>
+      </w:r>
+      <w:r>
+        <w:rPr>
+          <w:b w:val="0"/>
+          <w:i w:val="0"/>
+          <w:color w:val="1F4E79"/>
+        </w:rPr>
+      </w:r>
+      <w:r>
+        <w:rPr>
+          <w:b w:val="0"/>
+          <w:i w:val="0"/>
+          <w:color w:val="1F4E79"/>
+        </w:rPr>
+      </w:r>
+      <w:r>
+        <w:rPr>
+          <w:b w:val="0"/>
+          <w:i w:val="0"/>
+        </w:rPr>
+      </w:r>
+      <w:r>
+        <w:rPr>
+          <w:b w:val="0"/>
+          <w:i w:val="0"/>
+        </w:rPr>
+      </w:r>
+      <w:r>
+        <w:rPr>
+          <w:b w:val="0"/>
+          <w:i w:val="0"/>
+          <w:color w:val="1F4E79"/>
+        </w:rPr>
+        <w:t>Genotypic category is entangled with both the spatial and the technical axes, and the entanglement is a property of the design rather than a caveat of presentation. Between stations, category is confounded with station: of nine stations, three carry all three categories (74 individuals), the others one or two. Within those three stations, category and plate column are in turn strongly associated, because field numbering followed genotype. The sub-design in which category and position are fully separable at constant station comprises 32 individuals, too few to carry a principal test. One station carries category and position independently and serves as a small clean witness.</w:t>
+      </w:r>
+    </w:p>
+    <w:p>
+      <w:pPr>
+        <w:pStyle w:val="Heading1"/>
+      </w:pPr>
+      <w:r/>
+      <w:r>
+        <w:rPr>
+          <w:b w:val="0"/>
+          <w:i w:val="0"/>
+        </w:rPr>
+      </w:r>
+      <w:r>
+        <w:rPr>
+          <w:b w:val="0"/>
+          <w:i w:val="0"/>
+          <w:color w:val="1F4E79"/>
+        </w:rPr>
+      </w:r>
+      <w:r>
+        <w:rPr>
+          <w:b w:val="0"/>
+          <w:i w:val="0"/>
+          <w:color w:val="1F4E79"/>
+        </w:rPr>
+      </w:r>
+      <w:r>
+        <w:rPr>
+          <w:b w:val="0"/>
+          <w:i w:val="0"/>
+          <w:color w:val="1F4E79"/>
+        </w:rPr>
+      </w:r>
+      <w:r>
+        <w:rPr>
+          <w:b w:val="0"/>
+          <w:i w:val="0"/>
+        </w:rPr>
+      </w:r>
+      <w:r>
+        <w:rPr>
+          <w:b w:val="0"/>
+          <w:i w:val="0"/>
+        </w:rPr>
+      </w:r>
+      <w:r>
+        <w:rPr>
+          <w:b w:val="0"/>
+          <w:i w:val="0"/>
+          <w:color w:val="1F4E79"/>
+        </w:rPr>
+      </w:r>
+      <w:r>
+        <w:rPr>
+          <w:b w:val="0"/>
+          <w:i w:val="0"/>
+          <w:color w:val="1F4E79"/>
+        </w:rPr>
+        <w:t>A preliminary variance partition was run to size these terms before the ecological analysis, not as a result of it. Fitted in both orderings on the four metrics, genotypic category accounts for 1.4 % to 2.7 % of compositional variance, against 14 % to 36 % for station. No tissue is detected by all four metrics in both permutation schemes, so a global statement that hybrids differ is not supportable: the analysis must say which metric supports which claim, in which tissue. The hindgut shows no category effect on any metric. The caudal fin is detected by weighted UniFrac in all three runs and both schemes, and that result is unchanged in the 500-read sensitivity analysis, where the retention gap that motivated the doubt falls from 30 to 2.5 points - so it is not an artefact of depth-driven selection. The two witnesses that could have discriminated further, the separable sub-design and the independent station, are both underpowered and neither confirms nor refutes.</w:t>
+      </w:r>
+      <w:r>
+        <w:rPr>
+          <w:color w:val="1F4E79"/>
+        </w:rPr>
+        <w:t xml:space="preserve"> Supplementary Table S8.</w:t>
       </w:r>
     </w:p>
     <w:p>

</xml_diff>

<commit_message>
fix: distance entre les deux stations du Suran - j avais ecrit 17.2 km, qui est l ecart entre la coordonnee ENA extrapolee et la station reelle, reutilise par erreur pour une affirmation geographique differente ; la vraie distance Pont-d Ain / Chavannes est 25.4 km (haversine). Corrige dans les trois documents, documente dans decision_stations.md
</commit_message>
<xml_diff>
--- a/docs/manuscrit/Article.docx
+++ b/docs/manuscrit/Article.docx
@@ -43,7 +43,12 @@
           <w:i w:val="0"/>
           <w:color w:val="1F4E79"/>
         </w:rPr>
-        <w:t>We studied the host-associated bacterial microbiota of two interbreeding cyprinid fishes, the nase Chondrostoma nasus (code Cn) and the toxostome Parachondrostoma toxostoma (code Pt), together with their hybrids (code Hy), in their contact zone. Fish were sampled at nine stations of the Rhône drainage (rivers Durance, Suran, Buech, Beaume and Ardèche, and one canal fed by the Largue; south-eastern France) over two years (2014 and 2015), spanning a gradient of hybrid-zone context (allopatry, sympatry with hybridisation, and asymmetric introgression). Two of the nine stations lie on the Suran, 17.2 km apart and separated by a barrier passable only downstream; they are treated as distinct stations throughout because they carry different taxa.</w:t>
+      </w:r>
+      <w:r>
+        <w:rPr>
+          <w:i w:val="0"/>
+        </w:rPr>
+        <w:t>We studied the host-associated bacterial microbiota of two interbreeding cyprinid fishes, the nase Chondrostoma nasus (code Cn) and the toxostome Parachondrostoma toxostoma (code Pt), together with their hybrids (code Hy), in their contact zone. Fish were sampled at nine stations of the Rhône drainage (rivers Durance, Suran, Buech, Beaume and Ardèche, and one canal fed by the Largue; south-eastern France) over two years (2014 and 2015), spanning a gradient of hybrid-zone context (allopatry, sympatry with hybridisation, and asymmetric introgression). Two of the nine stations lie on the Suran, 25.4 km apart and separated by a barrier passable only downstream; they are treated as distinct stations throughout because they carry different taxa.</w:t>
       </w:r>
     </w:p>
     <w:p>

</xml_diff>

<commit_message>
fix: le hindgut - j avais ecrit qu aucune metrique ne le detecte, ce qui contredisait la Table S8 du meme supplementaire : Jaccard y est significatif dans 2 runs sur 3 en sequentiel et 1 sur 3 a station bloquee. Formulation remplacee par les chiffres exacts dans Article, M&M et les deux notes de decision
</commit_message>
<xml_diff>
--- a/docs/manuscrit/Article.docx
+++ b/docs/manuscrit/Article.docx
@@ -883,13 +883,14 @@
           <w:i w:val="0"/>
           <w:color w:val="1F4E79"/>
         </w:rPr>
-        <w:t>A preliminary variance partition was run to size these terms before the ecological analysis, not as a result of it. Fitted in both orderings on the four metrics, genotypic category accounts for 1.4 % to 2.7 % of compositional variance, against 14 % to 36 % for station. No tissue is detected by all four metrics in both permutation schemes, so a global statement that hybrids differ is not supportable: the analysis must say which metric supports which claim, in which tissue. The hindgut shows no category effect on any metric. The caudal fin is detected by weighted UniFrac in all three runs and both schemes, and that result is unchanged in the 500-read sensitivity analysis, where the retention gap that motivated the doubt falls from 30 to 2.5 points - so it is not an artefact of depth-driven selection. The two witnesses that could have discriminated further, the separable sub-design and the independent station, are both underpowered and neither confirms nor refutes.</w:t>
       </w:r>
       <w:r>
         <w:rPr>
           <w:color w:val="1F4E79"/>
         </w:rPr>
-        <w:t xml:space="preserve"> Supplementary Table S8.</w:t>
+      </w:r>
+      <w:r>
+        <w:t>A preliminary variance partition was run to size these terms before the ecological analysis, not as a result of it. Fitted in both orderings on the four metrics, genotypic category accounts for 1.4 % to 2.7 % of compositional variance, against 14 % to 36 % for station. No tissue is detected by all four metrics in both permutation schemes, so a global statement that hybrids differ is not supportable: the analysis must say which metric supports which claim, in which tissue. The hindgut is the weakest: no metric detects it in all three runs under either permutation scheme, and only Jaccard reaches significance at all, in 2 of three runs sequentially and 1 of three with station fixed by blocks (p = 0.036, 0.041, 0.063 and 0.042, 0.052, 0.123 respectively); the three other metrics detect nothing in any run. The caudal fin is detected by weighted UniFrac in all three runs and both schemes, and that result is unchanged in the 500-read sensitivity analysis, where the retention gap that motivated the doubt falls from 30 to 2.5 points - so it is not an artefact of depth-driven selection. The two witnesses that could have discriminated further, the separable sub-design and the independent station, are both underpowered and neither confirms nor refutes. Supplementary Table S8.</w:t>
       </w:r>
     </w:p>
     <w:p>

</xml_diff>

<commit_message>
feat: PERMDISP - la prediction transgressive en dispersion n est PAS soutenue et le sens est inverse (hybrides les MOINS disperses dans 31 tests sur 48, p=9.4e-6 ; un seul test significatif dans le sens transgressif, aucun en intra-station) ; controle decisif: la caudale montre une heterogeneite de dispersion sur 3 metriques mais PAS sur UniFrac pondere, la seule ou son effet de position est robuste - le resultat caudal est donc compositionnel et non une difference de variabilite ; reserve declaree: betadisper n accepte pas de covariable donc l effet de position n y est pas ajuste
</commit_message>
<xml_diff>
--- a/docs/manuscrit/Article.docx
+++ b/docs/manuscrit/Article.docx
@@ -897,6 +897,152 @@
       <w:pPr>
         <w:pStyle w:val="Heading1"/>
       </w:pPr>
+      <w:r/>
+      <w:r>
+        <w:rPr>
+          <w:b w:val="0"/>
+          <w:i w:val="0"/>
+        </w:rPr>
+      </w:r>
+      <w:r>
+        <w:rPr>
+          <w:b w:val="0"/>
+          <w:i w:val="0"/>
+          <w:color w:val="1F4E79"/>
+        </w:rPr>
+      </w:r>
+      <w:r>
+        <w:rPr>
+          <w:b w:val="0"/>
+          <w:i w:val="0"/>
+          <w:color w:val="1F4E79"/>
+        </w:rPr>
+      </w:r>
+      <w:r>
+        <w:rPr>
+          <w:b w:val="0"/>
+          <w:i w:val="0"/>
+          <w:color w:val="1F4E79"/>
+        </w:rPr>
+      </w:r>
+      <w:r>
+        <w:rPr>
+          <w:b w:val="0"/>
+          <w:i w:val="0"/>
+        </w:rPr>
+      </w:r>
+      <w:r>
+        <w:rPr>
+          <w:b w:val="0"/>
+          <w:i w:val="0"/>
+        </w:rPr>
+      </w:r>
+      <w:r>
+        <w:rPr>
+          <w:b w:val="0"/>
+          <w:i w:val="0"/>
+          <w:color w:val="1F4E79"/>
+        </w:rPr>
+      </w:r>
+      <w:r>
+        <w:rPr>
+          <w:b w:val="0"/>
+          <w:i w:val="0"/>
+          <w:color w:val="1F4E79"/>
+        </w:rPr>
+      </w:r>
+      <w:r>
+        <w:rPr>
+          <w:color w:val="1F4E79"/>
+        </w:rPr>
+      </w:r>
+      <w:r/>
+      <w:r>
+        <w:rPr>
+          <w:b w:val="0"/>
+          <w:i w:val="0"/>
+          <w:color w:val="1F4E79"/>
+        </w:rPr>
+        <w:t>Dispersion was tested with PERMDISP on the same matrices, both with permutations constrained within station blocks and separately within each of the three stations carrying all three categories, where a dispersion difference cannot be spatial. The transgressive prediction in its dispersion form — hybrids more variable than both parental categories — is not supported and the data point the other way. Across the 48 station-blocked tests, hybrids are the least dispersed of the three categories in 31 and the most dispersed in 9, against the third expected by chance under no ordering (binomial p = 9.4 x 10-6); the pattern holds within stations (52 of 108, p = 1.0 x 10-3). Only one test is both significant and in the transgressive direction, and none within station. Where dispersion does differ significantly it is P. toxostoma that is most variable, in the caudal fin and hindgut. The effect is small: the median hybrid distance to group centre lies 0.036 (Bray-Curtis) to 0.002 (weighted UniFrac) below the parental mean.</w:t>
+      </w:r>
+    </w:p>
+    <w:p>
+      <w:pPr>
+        <w:pStyle w:val="Heading1"/>
+      </w:pPr>
+      <w:r/>
+      <w:r>
+        <w:rPr>
+          <w:b w:val="0"/>
+          <w:i w:val="0"/>
+        </w:rPr>
+      </w:r>
+      <w:r>
+        <w:rPr>
+          <w:b w:val="0"/>
+          <w:i w:val="0"/>
+          <w:color w:val="1F4E79"/>
+        </w:rPr>
+      </w:r>
+      <w:r>
+        <w:rPr>
+          <w:b w:val="0"/>
+          <w:i w:val="0"/>
+          <w:color w:val="1F4E79"/>
+        </w:rPr>
+      </w:r>
+      <w:r>
+        <w:rPr>
+          <w:b w:val="0"/>
+          <w:i w:val="0"/>
+          <w:color w:val="1F4E79"/>
+        </w:rPr>
+      </w:r>
+      <w:r>
+        <w:rPr>
+          <w:b w:val="0"/>
+          <w:i w:val="0"/>
+        </w:rPr>
+      </w:r>
+      <w:r>
+        <w:rPr>
+          <w:b w:val="0"/>
+          <w:i w:val="0"/>
+        </w:rPr>
+      </w:r>
+      <w:r>
+        <w:rPr>
+          <w:b w:val="0"/>
+          <w:i w:val="0"/>
+          <w:color w:val="1F4E79"/>
+        </w:rPr>
+      </w:r>
+      <w:r>
+        <w:rPr>
+          <w:b w:val="0"/>
+          <w:i w:val="0"/>
+          <w:color w:val="1F4E79"/>
+        </w:rPr>
+      </w:r>
+      <w:r>
+        <w:rPr>
+          <w:color w:val="1F4E79"/>
+        </w:rPr>
+      </w:r>
+      <w:r/>
+      <w:r>
+        <w:rPr>
+          <w:b w:val="0"/>
+          <w:i w:val="0"/>
+          <w:color w:val="1F4E79"/>
+        </w:rPr>
+        <w:t>This bears directly on how the location results must be read, because PERMANOVA is sensitive to heterogeneous dispersion. In the caudal fin, dispersion is heterogeneous on Bray-Curtis, Jaccard and unweighted UniFrac in all three runs, so the location signals on those metrics cannot be separated from a dispersion effect. On weighted UniFrac - the one metric where the caudal-fin category effect is significant in all three runs and both permutation schemes - dispersion is homogeneous in all three runs, and it remains so within station. That control could have failed and did not: the caudal-fin result on weighted UniFrac is a difference in composition, not in variability. One reservation is not resolved here: betadisper accepts no covariate, so the plate-position effect of section 8.8 is not adjusted for, and a category whose samples are more spread across plate columns could carry inflated dispersion. Supplementary Table S9 and Figure S3.</w:t>
+      </w:r>
+    </w:p>
+    <w:p>
+      <w:pPr>
+        <w:pStyle w:val="Heading1"/>
+      </w:pPr>
       <w:r>
         <w:t>9. Reproducibility and data availability</w:t>
       </w:r>

</xml_diff>

<commit_message>
fix: erreur de signe dans la phrase sur la dispersion - l ecart en UniFrac pondere est +0.002 (hybrides legerement PLUS disperses), pas -0.002 ; la phrase rangeait les quatre metriques du meme cote. Corrigee avec les signes explicites et la nuance : le motif hybrides-moins-disperses est porte par les trois metriques sensibles aux taxons rares et absent de la ponderee
</commit_message>
<xml_diff>
--- a/docs/manuscrit/Article.docx
+++ b/docs/manuscrit/Article.docx
@@ -963,7 +963,9 @@
           <w:i w:val="0"/>
           <w:color w:val="1F4E79"/>
         </w:rPr>
-        <w:t>Dispersion was tested with PERMDISP on the same matrices, both with permutations constrained within station blocks and separately within each of the three stations carrying all three categories, where a dispersion difference cannot be spatial. The transgressive prediction in its dispersion form — hybrids more variable than both parental categories — is not supported and the data point the other way. Across the 48 station-blocked tests, hybrids are the least dispersed of the three categories in 31 and the most dispersed in 9, against the third expected by chance under no ordering (binomial p = 9.4 x 10-6); the pattern holds within stations (52 of 108, p = 1.0 x 10-3). Only one test is both significant and in the transgressive direction, and none within station. Where dispersion does differ significantly it is P. toxostoma that is most variable, in the caudal fin and hindgut. The effect is small: the median hybrid distance to group centre lies 0.036 (Bray-Curtis) to 0.002 (weighted UniFrac) below the parental mean.</w:t>
+      </w:r>
+      <w:r>
+        <w:t>Dispersion was tested with PERMDISP on the same matrices, both with permutations constrained within station blocks and separately within each of the three stations carrying all three categories, where a dispersion difference cannot be spatial. The transgressive prediction in its dispersion form — hybrids more variable than both parental categories — is not supported and the data point the other way. Across the 48 station-blocked tests, hybrids are the least dispersed of the three categories in 31 and the most dispersed in 9, against the third expected by chance under no ordering (binomial p = 9.4 x 10-6); the pattern holds within stations (52 of 108, p = 1.0 x 10-3). Only one test is both significant and in the transgressive direction, and none within station. Where dispersion does differ significantly it is P. toxostoma that is most variable, in the caudal fin and hindgut. The effect is small and not uniform across metrics: the median hybrid distance to group centre lies 0.036 (Bray-Curtis), 0.022 (unweighted UniFrac) and 0.010 (Jaccard) BELOW the parental mean, but +0.002 on weighted UniFrac, i.e. marginally above it. The less-dispersed pattern is therefore carried by the three metrics sensitive to rare taxa, and is absent from the abundance-weighted one.</w:t>
       </w:r>
     </w:p>
     <w:p>

</xml_diff>

<commit_message>
feat: introduction integree dans Article.docx - 5 paragraphes (1472 mots) inseres avant Materials and Methods, plus une note editoriale grise listant les quatre points a trancher ; les 76 paragraphes du Materials and Methods sont preserves a l identique, verifie paragraphe par paragraphe avant et apres insertion ; noms d especes et de genres en italique conformement a l usage du document
</commit_message>
<xml_diff>
--- a/docs/manuscrit/Article.docx
+++ b/docs/manuscrit/Article.docx
@@ -2,6 +2,118 @@
 <file path=word/document.xml><?xml version="1.0" encoding="utf-8"?>
 <w:document xmlns:wpc="http://schemas.microsoft.com/office/word/2010/wordprocessingCanvas" xmlns:mo="http://schemas.microsoft.com/office/mac/office/2008/main" xmlns:mc="http://schemas.openxmlformats.org/markup-compatibility/2006" xmlns:mv="urn:schemas-microsoft-com:mac:vml" xmlns:o="urn:schemas-microsoft-com:office:office" xmlns:r="http://schemas.openxmlformats.org/officeDocument/2006/relationships" xmlns:m="http://schemas.openxmlformats.org/officeDocument/2006/math" xmlns:v="urn:schemas-microsoft-com:vml" xmlns:wp14="http://schemas.microsoft.com/office/word/2010/wordprocessingDrawing" xmlns:wp="http://schemas.openxmlformats.org/drawingml/2006/wordprocessingDrawing" xmlns:w10="urn:schemas-microsoft-com:office:word" xmlns:w="http://schemas.openxmlformats.org/wordprocessingml/2006/main" xmlns:w14="http://schemas.microsoft.com/office/word/2010/wordml" xmlns:wpg="http://schemas.microsoft.com/office/word/2010/wordprocessingGroup" xmlns:wpi="http://schemas.microsoft.com/office/word/2010/wordprocessingInk" xmlns:wne="http://schemas.microsoft.com/office/word/2006/wordml" xmlns:wps="http://schemas.microsoft.com/office/word/2010/wordprocessingShape" mc:Ignorable="w14 wp14">
   <w:body>
+    <w:p>
+      <w:pPr>
+        <w:pStyle w:val="Title"/>
+      </w:pPr>
+      <w:r>
+        <w:t>Introduction</w:t>
+      </w:r>
+    </w:p>
+    <w:p>
+      <w:pPr/>
+      <w:r>
+        <w:rPr>
+          <w:i w:val="0"/>
+        </w:rPr>
+        <w:t>Animals and the microbial communities they harbour form composite biological units in which microbial composition contributes to host performance and to tolerance of environmental constraints (Bordenstein and Theis 2015). These associations are established largely by the sorting of microbial pools from the surrounding environment, a sorting that reflects host ecology and physiology — feeding behaviour, which selects among available resources, and the immune pathways underlying tolerance of or resistance to microbes (Shapira 2016; Shropshire and Bordenstein 2016; Adair and Douglas 2017). Environmental acquisition is particularly important in fish, which live in a medium favourable to bacterial growth, are continuously exposed to microbes at their epithelial barriers, and are mostly oviparous with limited maternal effects compared with mammals (Llewellyn et al. 2014); accordingly, surveys of wild populations report a predominant environmental component of variation in bacterial composition (Sevellec et al. 2014; Smith et al. 2015; Chiarello et al. 2018). Host genotype is nonetheless not without effect. A fourteen-year follow-up of wild baboons found microbiome phenotypes to be almost universally heritable, but with a typically low heritability that depends on context, and its authors concluded that large sample sizes are required to quantify it (Grieneisen et al. 2021); in stickleback, a host genetic influence on the gut microbiome became measurable once biological and technical components of variance had been decomposed beforehand (Small et al. 2019). If host ancestry shapes the fish microbiota, the expected effect is therefore small relative to the environmental one, and detecting it requires both substantial sample sizes and explicit control of the spatial and technical axes along which it could be mimicked.</w:t>
+      </w:r>
+    </w:p>
+    <w:p>
+      <w:pPr/>
+      <w:r>
+        <w:rPr>
+          <w:i w:val="0"/>
+        </w:rPr>
+        <w:t>Secondary contact zones make host ancestry a naturally occurring and naturally replicated variable, and they are where the question of a genomic contribution to microbiota assembly is posed most directly. Introgressive hybridisation may disrupt co-adapted gene complexes and thereby alter close host–microbe interactions (Wang et al. 2015); conversely, hybridisation is a source of genomic diversity and adaptive novelty involved in speciation and in range expansion into enlarged ecological niches (Pfennig et al. 2016; Schumer et al. 2018), and this diversity may extend to the microbiota through the acquisition of new microbial taxa. Three outcomes are usually contrasted: an intermediate or additive microbiota, varying monotonically with ancestry; dominance, in which hybrids resemble one parental species; and a transgressive microbiota, lying outside the range of both parents. Camper et al. (2024) gave this comparison an explicit framework for host-associated microbiomes, in which four idealised models of taxon membership — Union, Intersection, Gain and Loss — are never realised in pure form, so that the index measures the relative weight of each and the four weights sum to one. The Gain–Loss axis of that framework provides an operational definition of a transgressive microbiota, one that does not presuppose a cost to the host. The distinction matters, because the equation between transgression and dysbiosis has been challenged: on an ecologically successful hybrid lizard, Camper et al. (2025) report widespread transgressive segregation correlated with a restructuring of niche, and argue that the negative conclusions of the literature rest disproportionately on hybrids of low adaptive value. We follow the framework's own statement of scope, that the index describes a pattern and not a process, in the same sense as a beta-diversity measure.</w:t>
+      </w:r>
+    </w:p>
+    <w:p>
+      <w:pPr/>
+      <w:r>
+        <w:rPr>
+          <w:i w:val="0"/>
+        </w:rPr>
+        <w:t xml:space="preserve">What is known of hybrid microbiota in fish comes almost entirely from controlled crosses. Reciprocal hybrids of bream and culter, whose parents have contrasting feeding habits, show a strong correspondence between genotype and intestinal characteristics (Li et al. 2018); in intrageneric </w:t>
+      </w:r>
+      <w:r>
+        <w:rPr>
+          <w:i/>
+        </w:rPr>
+        <w:t>Takifugu</w:t>
+      </w:r>
+      <w:r>
+        <w:rPr>
+          <w:i w:val="0"/>
+        </w:rPr>
+        <w:t xml:space="preserve"> hybrids, host hybridisation outweighs cohabitation in shaping the gut microbiota (Jin et al. 2023); reciprocal hybrids of koi and goldfish resemble one parent rather than the midpoint of the two (Wang et al. 2022); and whitefish species pairs with their reciprocal hybrids have been compared in natural and controlled environments (Sevellec et al. 2019). This body of work has been reviewed recently (Cui et al. 2022). Studies of natural hybrid zones in other vertebrates, for their part, do not converge. Host ancestry predominates in </w:t>
+      </w:r>
+      <w:r>
+        <w:rPr>
+          <w:i/>
+        </w:rPr>
+        <w:t>Neotoma</w:t>
+      </w:r>
+      <w:r>
+        <w:rPr>
+          <w:i w:val="0"/>
+        </w:rPr>
+        <w:t xml:space="preserve"> woodrats, where habitat determines diet but genotype determines the gut microbiota (Nielsen et al. 2022), and in hybridising brown lemurs along a 180 km transect (Donohue et al. 2025). The opposite conclusion is reached in baboons spanning a hybrid zone, where site soil properties rather than genetic ancestry, relatedness or between-population genetic distance explain the gut microbiota (Grieneisen et al. 2019), and in wild house mice, where an apparent effect of admixture becomes weak once spatial autocorrelation is taken into account, on two replicates of the same hybrid zone (Čížková et al. 2023). In hybridising chickadees moved to a common environment, the change of environment affected microbiota richness but not community composition, while a corresponding effect of ancestry on composition was not statistically supported (Russell et al. 2026) — a result that argues for reporting alpha and beta diversity separately rather than for a directed expectation on either. Across this literature, no study combines a natural hybrid zone in fish, host ancestry quantified by genotyping rather than assigned by cross class, and several tissue compartments characterised in the same individual.</w:t>
+      </w:r>
+    </w:p>
+    <w:p>
+      <w:pPr/>
+      <w:r>
+        <w:rPr>
+          <w:i w:val="0"/>
+        </w:rPr>
+        <w:t xml:space="preserve">The nase </w:t>
+      </w:r>
+      <w:r>
+        <w:rPr>
+          <w:i/>
+        </w:rPr>
+        <w:t>Chondrostoma nasus</w:t>
+      </w:r>
+      <w:r>
+        <w:rPr>
+          <w:i w:val="0"/>
+        </w:rPr>
+        <w:t xml:space="preserve"> and the South-west European nase, or toxostome, </w:t>
+      </w:r>
+      <w:r>
+        <w:rPr>
+          <w:i/>
+        </w:rPr>
+        <w:t>Parachondrostoma toxostoma</w:t>
+      </w:r>
+      <w:r>
+        <w:rPr>
+          <w:i w:val="0"/>
+        </w:rPr>
+        <w:t xml:space="preserve"> offer that combination. The toxostome is endemic to southern France, where it is declining and is a species of conservation concern; the nase originates from central Europe and entered the Rhône basin following the construction of navigable connections across Europe during the last century (Gilles 1998), so that the two distributions have partially overlapped for about a hundred years. Hybridisation has been detected in the patchily distributed sympatric areas of the basin, with an incidence unrelated to habitat characteristics (Costedoat et al. 2005; Sinama et al. 2013; Guivier et al. 2019) — the configuration of a mosaic hybrid zone (Seehausen et al. 2008). Guivier et al. (2017) characterised the microbiota of four tissue compartments of the two species in strict parapatry on a single river, and found the tissue compartment to be the first factor of variation, with a marked contrast between externally and internally exposed tissues and with proportions of species-specific taxa that were asymmetric between compartments: the nase carried many specific taxa on its external tissues, the toxostome in its intestine. On that basis the authors proposed that introgressive hybridisation might affect the microbiota differently depending on the tissue considered, and closed by announcing the exploration of hybrid microbiota rearrangement, which their sample of sixteen fish at two stations could not support. The present study is that exploration, on 180 fish sampled at nine stations over six watercourses of the Rhône drainage in two years, with host ancestry resolved by genotyping across 25 chromosomes rather than by morphology, and with the same four compartments — caudal fin, gill, midgut and hindgut — characterised in each individual.</w:t>
+      </w:r>
+    </w:p>
+    <w:p>
+      <w:pPr/>
+      <w:r>
+        <w:rPr>
+          <w:i w:val="0"/>
+        </w:rPr>
+        <w:t>We ask whether the microbiota of individuals of mixed ancestry is intermediate between the two parental species, dominated by one of them, or displaced outside their range, and whether the answer is the same in all four compartments. Three points of design are stated at the outset rather than introduced with the results. First, because genotyping across 25 chromosomes separates an intermediate genome from a near-parental genome introgressed on a single chromosome, what counts as a hybrid is a decision and not a given: the contrast is therefore run twice, on intermediate genomes alone and on the wider set including introgressed near-parental individuals, with both passes declared in advance, and the displacement of the result between them measures the contribution of the introgressed individuals. Second, the comparison is reported both as a category contrast in a model spanning all stations — the only admissible form given the low heritability expected from Grieneisen et al. (2021) — and, as a complementary characterisation, as the four-dimensional index of Camper et al. (2024), whose core threshold and taxonomic rank are fixed a priori and whose sensitivity is reported, since on a natural hybrid system these choices move the index more than sample size or sequencing depth do. Third, genotypic category is entangled with the spatial axis in this design, station being by far the strongest correlate of composition, and field processing order propagated to plate position; results on category are consequently reported bracketed between the two sequential orderings rather than as a single decomposition, adjusted for plate position, and read as patterns co-varying with station and with category rather than as effects of ancestry alone. Two stations of the same river, 25 km apart and separated by a weir passable only downstream, were sampled in two successive years and provide an internal reference in which the two species are in contact geographically without detected hybridisation. Following Guivier et al. (2017), we expect any hybrid signal to be most pronounced in the digestive compartments, where the two parental species diverge most, rather than uniformly across the four tissues.</w:t>
+      </w:r>
+    </w:p>
+    <w:p>
+      <w:pPr/>
+      <w:r>
+        <w:rPr>
+          <w:i/>
+          <w:color w:val="888888"/>
+          <w:sz w:val="18"/>
+        </w:rPr>
+        <w:t>[Introduction, draft 1 — points à trancher. (i) Le document n'a pas de titre d'article : « Introduction » et « Materials and Methods » sont deux titres de section de même niveau. (ii) Les références Wang et al. (2015) et Sevellec et al. (2014) proviennent de la liste du manuscrit d'origine et n'ont pas été relues en texte intégral : vérifier leur pertinence à l'endroit où elles sont placées. (iii) Deux corrections à propager dans docs/biblio/microbiome_hybrid_all_refs.bib : Small et al. est daté 2018 alors que Crossref donne 2019 pour 10.1128/msystems.00331-19 ; et le corégone y figure comme préprint (10.1101/312231) alors que la version publiée existe — Sevellec et al. 2019, Ecology and Evolution, 10.1002/ece3.5676, qui est la version citée ici. (iv) Les deux passes de définition de l'hybride et les paramètres a priori du 4H annoncés au dernier paragraphe doivent correspondre au §8.6 une fois celui-ci rédigé.]</w:t>
+      </w:r>
+    </w:p>
     <w:p>
       <w:pPr>
         <w:pStyle w:val="Title"/>

</xml_diff>

<commit_message>
feat: manuscrit mis a jour sur la classification a 25 chromosomes, deux passes
Article : paragraphes 1 (effectifs 59/42/79, deux passes, 175+5 genotypes, 9/49 reclasses),
8.6 (ecarts de retention par passe ; cadre statistique aligne sur D2 : position hors modele
principal, en sensibilite), 8.8 (V 0,53/0,48 ; temoin intra-categorie remplace le temoin
mono-taxon morphologique ; origine de l association documentee) et 8.9 (encadrements par
passe, midgut/Jaccard seul resultat robuste, caudale/UF pondere present en passe 1 seulement,
hindgut, PERMDISP par passe). Seuls ces 10 paragraphes changent ; introduction intacte.

Supplement : Tables S1, S6, S7 (derniere colonne), S8 (2 passes x 2 modeles), S9 (2 passes)
et leurs legendes ; Host identity et Note S2 ; paragraphe faux sur Ain/Cab retire. Figures S1
et S3 non regenerees, signalees. Note de recalcul corrigee (sensibilite a 500 et hindgut
rapportes pour le modele principal, pas seulement avec position).
</commit_message>
<xml_diff>
--- a/docs/manuscrit/Article.docx
+++ b/docs/manuscrit/Article.docx
@@ -219,7 +219,7 @@
           <w:i w:val="0"/>
           <w:color w:val="1F4E79"/>
         </w:rPr>
-        <w:t>Species identity was resolved by genotyping rather than by morphology. Each individual was assigned to one of three categories from a chromosome-level assignment — Cn (59 individuals), Hy (30) and Pt (91) — and not by thresholding a median hybrid index, because a substantial minority of hybrids carry an extreme median index and their inter-chromosome discordance is what identifies them. Eight of the 49 individuals previously identified on morphology were reclassified. Three stations carry all three categories (74 individuals), which is the subset in which the hybrid contrast can be tested within a station.</w:t>
+        <w:t>Species identity was resolved by genotyping rather than by morphology. Each individual was assigned, from a chromosome-level assignment across 25 chromosomes, to one of three categories — Cn (59 individuals), Hy (42) and Pt (79) — and not by thresholding a median hybrid index, because a substantial minority of hybrids carry an extreme median index and their inter-chromosome discordance is what identifies them. Of the 180 individuals, 175 were genotyped from Q-scores on liver tissue and 5, all assigned to a parental category, from other tissues. The Hy category comprises two genome types: 20 intermediate genomes, and 22 near-parental genomes. What counts as a hybrid is therefore a decision, and every analysis of category is run twice, both passes being declared in advance: pass 1 retains the 20 intermediate hybrids and excludes the 22 near-parental individuals, which are not reassigned to a parental category (158 individuals); pass 2 retains all 42 (180 individuals). Nine of the 49 individuals previously identified on morphology were reclassified. Three stations carry all three categories — 74 individuals in pass 2 and 65 in pass 1, where Saint-Just-d'Ardèche retains a single hybrid — which is the subset in which the hybrid contrast can be tested within a station.</w:t>
       </w:r>
     </w:p>
     <w:p>
@@ -677,13 +677,12 @@
           <w:i w:val="0"/>
           <w:color w:val="1F4E79"/>
         </w:rPr>
-        <w:t>Because the rarefaction threshold both equalises depth and decides which samples enter, the second of these effects was quantified separately. On a fixed set of samples - those retained at 3,000 reads, so that only depth varies - dissimilarity matrices recomputed at 500 to 2,000 reads were compared with the 3,000-read reference. The two abundance-weighted metrics proved essentially invariant down to 500 reads (weighted UniFrac r = 0.9994, Bray-Curtis r = 0.9985), whereas the two presence-based metrics degraded (Jaccard r = 0.9617, unweighted UniFrac r = 0.9373) and observed richness fell by 42 %, confirming that the loss is driven by rare taxa rather than by a general low-depth artefact. Sample retention at 3,000 reads is not random with respect to the variable of interest: in the caudal fin 57 % of hybrids passed the threshold against 87 % of P. toxostoma, a 30-point gap reaching 53 points at one of the three stations carrying the full genotypic gradient. No threshold removes this selection without the corresponding loss of richness. Claims resting on abundance-weighted metrics are therefore accompanied by a sensitivity analysis at 500 reads, where the caudal-fin gap falls to 2.5 points and 2,067 samples are retained; claims resting on presence-based metrics are reported at 3,000 reads with the selection declared, since they cannot be tested at 500 and the midgut gap (15 points) persists there in any case.</w:t>
+        <w:t>Because the rarefaction threshold both equalises depth and decides which samples enter, the second of these effects was quantified separately. On a fixed set of samples - those retained at 3,000 reads, so that only depth varies - dissimilarity matrices recomputed at 500 to 2,000 reads were compared with the 3,000-read reference. The two abundance-weighted metrics proved essentially invariant down to 500 reads (weighted UniFrac r = 0.9994, Bray-Curtis r = 0.9985), whereas the two presence-based metrics degraded (Jaccard r = 0.9617, unweighted UniFrac r = 0.9373) and observed richness fell by 42 %, confirming that the loss is driven by rare taxa rather than by a general low-depth artefact. Sample retention at 3,000 reads is not random with respect to the variable of interest: in the caudal fin 50 % of intermediate hybrids passed the threshold against 86 % of P. toxostoma (pass 1), and 67 % of all 42 hybrids (pass 2), a gap of 36 and 20 points respectively, reaching 48 and 36 points at one of the three stations carrying the full genotypic gradient. No threshold removes this selection without the corresponding loss of richness. Claims resting on abundance-weighted metrics are therefore accompanied by a sensitivity analysis at 500 reads, where the caudal-fin gap falls to 3.8 points (pass 1) and 5.7 points (pass 2) and 2,067 samples are retained (1,825 in pass 1); claims resting on presence-based metrics are reported at 3,000 reads with the selection declared, since they cannot be tested at 500 and the midgut gap (14.0 and 8.9 points) persists there in any case. Supplementary Table S7 and Figure S2.</w:t>
       </w:r>
       <w:r>
         <w:rPr>
           <w:color w:val="1F4E79"/>
         </w:rPr>
-        <w:t xml:space="preserve"> Supplementary Table S7 and Figure S2.</w:t>
       </w:r>
     </w:p>
     <w:p>
@@ -701,7 +700,7 @@
           <w:i w:val="0"/>
           <w:color w:val="1F4E79"/>
         </w:rPr>
-        <w:t>Statistical framework. Community composition is analysed by PERMANOVA on the averaged dissimilarity matrices, stratified by tissue. Stratification is imposed by the design rather than chosen: 168 of the 180 fish occupy the same plate column across all four tissues, so plate position is not estimable in a pooled model carrying fish identity. Station, not site code, is the spatial unit, since two site codes each span two Suran stations that share no genotypic category. Sequencing run is nested within library preparation (SS8.7), and plate column enters as a covariate (SS8.8). Because genotypic category, station and plate position are mutually entangled (SS8.9), no single sequential decomposition is reported: each model is fitted in both orderings and the interval between them is given, the ordering that serves category first bounding it from above and the ordering that serves it last from below. Permutations are constrained within station blocks where the question concerns a within-station contrast. Dispersion is tested separately with PERMDISP, since the transgressive hypothesis concerns the variability of hybrid microbiota and not only the position of its centroid, and since PERMANOVA is itself sensitive to heterogeneous dispersion. Every claim is reported per metric and per tissue; the choice of a differential-abundance method remains to be fixed.</w:t>
+        <w:t>Statistical framework. Community composition is analysed by PERMANOVA on the averaged dissimilarity matrices, stratified by tissue. Stratification is imposed by the design rather than chosen: 168 of the 180 fish occupy the same plate column across all four tissues, so plate position is not estimable in a pooled model carrying fish identity. Station, not site code, is the spatial unit, since two site codes each span two Suran stations that share no genotypic category. Sequencing run is nested within library preparation (§8.7). Every analysis of genotypic category is run in the two passes defined in §1. Plate column is not entered in the principal models, which report patterns co-varying with station and category without separating them; because its effect on composition is real (§8.8), every model testing category is also fitted with plate column as a covariate and reported as a sensitivity analysis. Because genotypic category, station and plate position are mutually entangled (SS8.9), no single sequential decomposition is reported: each model is fitted in both orderings and the interval between them is given, the ordering that serves category first bounding it from above and the ordering that serves it last from below. Permutations are constrained within station blocks where the question concerns a within-station contrast. Dispersion is tested separately with PERMDISP, since the transgressive hypothesis concerns the variability of hybrid microbiota and not only the position of its centroid, and since PERMANOVA is itself sensitive to heterogeneous dispersion. Every claim is reported per metric and per tissue; the choice of a differential-abundance method remains to be fixed.</w:t>
       </w:r>
     </w:p>
     <w:p>
@@ -769,7 +768,7 @@
           <w:i w:val="0"/>
           <w:color w:val="1F4E79"/>
         </w:rPr>
-        <w:t>Individuals were numbered in the field in an order that is not random with respect to genotype, and that order propagated to the extraction plates: category and plate column are strongly associated (Cramer's V = 0.48). Whether plate position affects composition was therefore tested rather than assumed. Rarefaction equalises depth, so a test on read depth would not have answered the question; PERMANOVA was run on composition, stratified by tissue, with permutations constrained within station blocks so that a detected column effect cannot be a station effect, and with each sequencing run analysed separately, plate position being identical across runs.</w:t>
+        <w:t>Individuals were numbered in the field in sampling order, which is not random with respect to genotype: the more fragile nases were processed first, except at one station (Saint-Just-d'Ardèche), and plates were loaded in numbering order at five of the nine stations (Spearman ρ between individual number and plate column, 0.87–0.95). Genotypic category and plate column are accordingly strongly associated (Cramér's V = 0.53 in pass 1 and 0.48 in pass 2, computed on individuals). Whether plate position affects composition was therefore tested rather than assumed. Rarefaction equalises depth, so a test on read depth would not have answered the question; PERMANOVA was run on composition, stratified by tissue, with permutations constrained within station blocks so that a detected column effect cannot be a station effect, and with each sequencing run analysed separately, plate position being identical across runs.</w:t>
       </w:r>
     </w:p>
     <w:p>
@@ -796,13 +795,12 @@
           <w:i w:val="0"/>
           <w:color w:val="1F4E79"/>
         </w:rPr>
-        <w:t>The effect is present in all 24 strata (12 tissue x run strata x 2 metrics, p &lt;= 0.007), replicated across the three runs. Because the terms differ in degrees of freedom, effect sizes are reported relative to their expectation under the null, R2/(df/(n-1)): plate column reaches 1.95 (median R2 = 0.141, 11 df), the same order as genotypic category (2.32; median R2 = 0.029, 2 df) and below station (3.69; median R2 = 0.196, 8 df).</w:t>
+        <w:t>The effect is present in all 24 strata (12 tissue × run strata × 2 metrics) in both passes (p ≤ 0.033 in pass 1, p ≤ 0.007 in pass 2), replicated across the three runs; it does not depend on category labels, and the two passes differ only by the 22 individuals excluded from pass 1. Because the terms differ in degrees of freedom, effect sizes are reported relative to their expectation under the null, R2/(df/(n−1)): plate column reaches 1.84 in pass 1 and 1.95 in pass 2 (median R2 = 0.152 and 0.141, 11 df), the same order as genotypic category fitted after column (1.61 and 1.77; median R2 = 0.026 and 0.024, 2 df; significant in 19 and 18 of 24 strata) and below station (3.32 and 3.69; median R2 = 0.204 and 0.196, 8 df). Supplementary Table S6 and Figure S1.</w:t>
       </w:r>
       <w:r>
         <w:rPr>
           <w:color w:val="1F4E79"/>
         </w:rPr>
-        <w:t xml:space="preserve"> Supplementary Table S6 and Figure S1.</w:t>
       </w:r>
     </w:p>
     <w:p>
@@ -836,7 +834,7 @@
           <w:i w:val="0"/>
           <w:color w:val="1F4E79"/>
         </w:rPr>
-        <w:t>Three witnesses separate this effect from the biology it could be mistaken for. In the five stations carrying a single category, where a column effect is positional by construction, it persists (20 of 24 strata, ratio 2.11). In the symmetric ordering with category fitted first, column still contributes (21 of 24 strata). And the classic plate artefacts are absent: plate row is significant in 6 of 24 strata and plate edge in none, making the effect specific to column, as expected of an effect tracking processing order rather than evaporation or thermal gradients. The mechanism is not identified: extraction order, reagent-batch drift within a plate and cross-contamination between adjacent wells are not separated by these data, and no negative control isolates any of them. Plate column is therefore carried as a covariate in every model testing category, and one tissue's apparent category signal does not survive that adjustment.</w:t>
+        <w:t>Three witnesses separate this effect from the biology it could be mistaken for. Within a single genotypic category, where a column effect cannot be a category effect, it persists but more weakly: among P. toxostoma alone in 17 of 24 strata in both passes (ratio 1.65), among C. nasus alone in 6 (pass 1) and 7 (pass 2) of 24 (ratio 1.63); hybrids alone are too few to be tested (two strata in pass 2, none in pass 1). No site code carries a single genotypic category, and the only single-category station (Chavannes-sur-Suran, 19 P. toxostoma) is too small for a separate witness; the within-category subsets therefore replace the single-category-station witness of an earlier analysis, which rested on fish left unresolved by morphology. In the symmetric ordering with category fitted first, column still contributes (21 and 22 of 24 strata). And the classic plate artefacts are absent: plate row is significant in 7 and 6 of 24 strata and plate edge in none, making the effect specific to column, as expected of an effect tracking processing order rather than evaporation or thermal gradients. The origin of the association between category and column is documented above, but the mechanism of the column effect itself is not identified: extraction order, reagent-batch drift within a plate, cross-contamination between adjacent wells and the delay between capture and dissection are not separated by these data, and no negative control isolates any of them. Plate column is therefore not entered in the principal models (§8.6), but every model testing category is also reported with plate column as a covariate, and the two versions are compared in §8.9.</w:t>
       </w:r>
     </w:p>
     <w:p>
@@ -935,7 +933,7 @@
           <w:i w:val="0"/>
           <w:color w:val="1F4E79"/>
         </w:rPr>
-        <w:t>Genotypic category is entangled with both the spatial and the technical axes, and the entanglement is a property of the design rather than a caveat of presentation. Between stations, category is confounded with station: of nine stations, three carry all three categories (74 individuals), the others one or two. Within those three stations, category and plate column are in turn strongly associated, because field numbering followed genotype. The sub-design in which category and position are fully separable at constant station comprises 32 individuals, too few to carry a principal test. One station carries category and position independently and serves as a small clean witness.</w:t>
+        <w:t>Genotypic category is entangled with both the spatial and the technical axes, and the entanglement is a property of the design rather than a caveat of presentation. Between stations, category is confounded with station: of nine stations, three carry all three categories (74 individuals in pass 2, 65 in pass 1, where Saint-Just-d'Ardèche retains a single hybrid), the others one or two. Within those three stations, category and plate column are in turn strongly associated, because field numbering followed sampling order (§8.8). The sub-design in which category and position are fully separable at constant station comprises 31 individuals in pass 1 and 32 in pass 2, too few to carry a principal test. One station, Rosières, carries category and position independently (Cramér's V = 0.18, p = 0.35, in pass 2) and serves as a small clean witness; in pass 1 it retains a single hybrid and cannot witness a category effect.</w:t>
       </w:r>
     </w:p>
     <w:p>
@@ -1002,7 +1000,7 @@
         </w:rPr>
       </w:r>
       <w:r>
-        <w:t>A preliminary variance partition was run to size these terms before the ecological analysis, not as a result of it. Fitted in both orderings on the four metrics, genotypic category accounts for 1.4 % to 2.7 % of compositional variance, against 14 % to 36 % for station. No tissue is detected by all four metrics in both permutation schemes, so a global statement that hybrids differ is not supportable: the analysis must say which metric supports which claim, in which tissue. The hindgut is the weakest: no metric detects it in all three runs under either permutation scheme, and only Jaccard reaches significance at all, in 2 of three runs sequentially and 1 of three with station fixed by blocks (p = 0.036, 0.041, 0.063 and 0.042, 0.052, 0.123 respectively); the three other metrics detect nothing in any run. The caudal fin is detected by weighted UniFrac in all three runs and both schemes, and that result is unchanged in the 500-read sensitivity analysis, where the retention gap that motivated the doubt falls from 30 to 2.5 points - so it is not an artefact of depth-driven selection. The two witnesses that could have discriminated further, the separable sub-design and the independent station, are both underpowered and neither confirms nor refutes. Supplementary Table S8.</w:t>
+        <w:t>A preliminary variance partition was run to size these terms before the ecological analysis, not as a result of it, in both passes and on the four metrics. Fitted in both orderings without plate position, genotypic category accounts for a median of 1.7 % to 2.8 % of compositional variance across the 48 metric × tissue × run strata in pass 1 and 1.4 % to 3.0 % in pass 2, against a median of 19 % and 18 % for station (range across strata 14–36 % in pass 1 and 14–35 % in pass 2). No tissue is detected by all four metrics in all three runs under both permutation schemes, in either pass, with or without plate position, so a global statement that hybrids differ is not supportable: the analysis must say which metric supports which claim, in which tissue, and under which definition of a hybrid. One result is robust to every choice made here — both passes, with and without plate position, all three runs and both permutation schemes: the midgut on Jaccard (p ≤ 0.044). The caudal fin on weighted UniFrac is detected in all three runs and both schemes in pass 1 (p = 0.007–0.024), with or without plate position, and in no run in pass 2 (p = 0.073–0.235). A witness attributes this displacement to the definition of hybrids rather than to sample size: removing 22 randomly chosen individuals from the 158 that are not introgressed, twenty times, never restored the caudal signal in pass 2. At 500 reads the caudal signal is partial in pass 1 (three runs sequentially, p = 0.022–0.049; one of three with station fixed by blocks) and absent in pass 2, so it is not fully confirmed once the sample set retained at 3,000 reads is enlarged. The hindgut is the weakest tissue in pass 1 (only Jaccard is significant, in one run of three with station fixed by blocks) but not in pass 2, where with station fixed by blocks all four metrics detect it in all three runs; the witness does not resolve whether this difference reflects sample size or the definition of hybrids. The principal and sensitivity models differ in 7 of the 16 metric × tissue cells in each pass, of which 5 (pass 1) and 3 (pass 2) move between robust detection (three runs, both schemes), partial detection and none. Of the two witnesses that could have discriminated further, the separable sub-design detects category in 3 of 48 tests in pass 1 and 1 of 48 in pass 2 (with plate position), and Rosières, in pass 2, detects it in the gill on Jaccard and unweighted UniFrac in all three runs (p = 0.010–0.030); in pass 1 Rosières is not interpretable. Supplementary Table S8.</w:t>
       </w:r>
     </w:p>
     <w:p>
@@ -1077,7 +1075,7 @@
         </w:rPr>
       </w:r>
       <w:r>
-        <w:t>Dispersion was tested with PERMDISP on the same matrices, both with permutations constrained within station blocks and separately within each of the three stations carrying all three categories, where a dispersion difference cannot be spatial. The transgressive prediction in its dispersion form — hybrids more variable than both parental categories — is not supported and the data point the other way. Across the 48 station-blocked tests, hybrids are the least dispersed of the three categories in 31 and the most dispersed in 9, against the third expected by chance under no ordering (binomial p = 9.4 x 10-6); the pattern holds within stations (52 of 108, p = 1.0 x 10-3). Only one test is both significant and in the transgressive direction, and none within station. Where dispersion does differ significantly it is P. toxostoma that is most variable, in the caudal fin and hindgut. The effect is small and not uniform across metrics: the median hybrid distance to group centre lies 0.036 (Bray-Curtis), 0.022 (unweighted UniFrac) and 0.010 (Jaccard) BELOW the parental mean, but +0.002 on weighted UniFrac, i.e. marginally above it. The less-dispersed pattern is therefore carried by the three metrics sensitive to rare taxa, and is absent from the abundance-weighted one.</w:t>
+        <w:t>Dispersion was tested with PERMDISP on the same matrices, both with permutations constrained within station blocks and separately within each station carrying all three categories, where a dispersion difference cannot be spatial. The transgressive prediction in its dispersion form — hybrids more variable than both parental categories — is not supported and the data point the other way. Across the 48 station-blocked tests, hybrids are the least dispersed of the three categories in 32 (pass 1) and 34 (pass 2) and the most dispersed in 7 and 8, against the third expected by chance under no ordering (binomial p = 2.4 × 10-6 and 1.2 × 10-7). Within stations the pattern holds in pass 1 (45 of 68, p = 3.2 × 10-8); in pass 2 it is not significant over all 120 tests (41, p = 0.46), because the strata of Saint-Just-d'Ardèche, testable only in pass 2, and those of the Canal point the other way, but it holds on the 68 tests common to both passes (31 of 68, p = 0.024). Significant tests in the transgressive direction number 1 (pass 1) and 0 (pass 2) among station-blocked tests, and 0 and 5 within stations; the five of pass 2 all concern the gill at Saint-Just-d'Ardèche, where each stratum holds three or four P. toxostoma. Where dispersion does differ significantly it is mostly a parental category that is most variable: P. toxostoma in the caudal fin in pass 1; P. toxostoma or C. nasus in the midgut, and P. toxostoma in the hindgut and caudal fin, in pass 2. The effect is small: the median hybrid distance to group centre lies below the parental mean on Bray-Curtis (-0.029 and -0.065), unweighted UniFrac (-0.026 and -0.016) and Jaccard (-0.015 and -0.009); on weighted UniFrac it is null in pass 1 (+0.0002) and slightly below in pass 2 (-0.005). The less-dispersed pattern is therefore carried by the three metrics sensitive to rare taxa.</w:t>
       </w:r>
     </w:p>
     <w:p>
@@ -1150,7 +1148,7 @@
           <w:i w:val="0"/>
           <w:color w:val="1F4E79"/>
         </w:rPr>
-        <w:t>This bears directly on how the location results must be read, because PERMANOVA is sensitive to heterogeneous dispersion. In the caudal fin, dispersion is heterogeneous on Bray-Curtis, Jaccard and unweighted UniFrac in all three runs, so the location signals on those metrics cannot be separated from a dispersion effect. On weighted UniFrac - the one metric where the caudal-fin category effect is significant in all three runs and both permutation schemes - dispersion is homogeneous in all three runs, and it remains so within station. That control could have failed and did not: the caudal-fin result on weighted UniFrac is a difference in composition, not in variability. One reservation is not resolved here: betadisper accepts no covariate, so the plate-position effect of section 8.8 is not adjusted for, and a category whose samples are more spread across plate columns could carry inflated dispersion. Supplementary Table S9 and Figure S3.</w:t>
+        <w:t>This bears directly on how the location results must be read, because PERMANOVA is sensitive to heterogeneous dispersion. In the caudal fin, dispersion is heterogeneous on Jaccard in all three runs in both passes, and on Bray-Curtis and unweighted UniFrac in all three runs in pass 1, so the location signals on those metrics cannot be separated from a dispersion effect. On weighted UniFrac dispersion is homogeneous in all three runs in both passes, and remains so within station. In pass 1, where the caudal-fin category effect on weighted UniFrac is significant in all three runs and both permutation schemes, that control could have failed and did not: the result is a difference in composition, not in variability. In pass 2 there is no location effect to interpret. One reservation is not resolved here: betadisper accepts no covariate, so the plate-position effect of section 8.8 is not adjusted for, and a category whose samples are more spread across plate columns could carry inflated dispersion. Supplementary Table S9 and Figure S3.</w:t>
       </w:r>
     </w:p>
     <w:p>

</xml_diff>

<commit_message>
feat: figures S1 et S3 regenerees en deux passes ; introduction alignee
Figures (anglais, palette Okabe-Ito sans opposition rouge/vert) : S1 = categorie x colonne
(hybrides intermediaires et quasi-purs distingues), tailles d effet par passe, replication ;
S3 = dispersion par passe, bilan directionnel, caudale localisation vs dispersion (modele
principal). Titres verifies contre les donnees (branchie : hybrides marginalement les plus
disperses). Le code de lignee de l ancienne S1 reconstruisait le panneau (a) avec des
effectifs synthetiques : il n a pas ete reutilise.

Introduction : position de plaque selon D2 (hors modele principal, en sensibilite) ;
reference interne du Suran corrigee (2 hybrides intermediaires a Pont-d Ain, pas « sans
hybridation detectee ») ; controle par retraits aleatoires mentionne ; note (iv) mise a jour,
note (v) ajoutee (introgression sur un seul chromosome non verifiable sur nos fichiers).
</commit_message>
<xml_diff>
--- a/docs/manuscrit/Article.docx
+++ b/docs/manuscrit/Article.docx
@@ -100,7 +100,7 @@
         <w:rPr>
           <w:i w:val="0"/>
         </w:rPr>
-        <w:t>We ask whether the microbiota of individuals of mixed ancestry is intermediate between the two parental species, dominated by one of them, or displaced outside their range, and whether the answer is the same in all four compartments. Three points of design are stated at the outset rather than introduced with the results. First, because genotyping across 25 chromosomes separates an intermediate genome from a near-parental genome introgressed on a single chromosome, what counts as a hybrid is a decision and not a given: the contrast is therefore run twice, on intermediate genomes alone and on the wider set including introgressed near-parental individuals, with both passes declared in advance, and the displacement of the result between them measures the contribution of the introgressed individuals. Second, the comparison is reported both as a category contrast in a model spanning all stations — the only admissible form given the low heritability expected from Grieneisen et al. (2021) — and, as a complementary characterisation, as the four-dimensional index of Camper et al. (2024), whose core threshold and taxonomic rank are fixed a priori and whose sensitivity is reported, since on a natural hybrid system these choices move the index more than sample size or sequencing depth do. Third, genotypic category is entangled with the spatial axis in this design, station being by far the strongest correlate of composition, and field processing order propagated to plate position; results on category are consequently reported bracketed between the two sequential orderings rather than as a single decomposition, adjusted for plate position, and read as patterns co-varying with station and with category rather than as effects of ancestry alone. Two stations of the same river, 25 km apart and separated by a weir passable only downstream, were sampled in two successive years and provide an internal reference in which the two species are in contact geographically without detected hybridisation. Following Guivier et al. (2017), we expect any hybrid signal to be most pronounced in the digestive compartments, where the two parental species diverge most, rather than uniformly across the four tissues.</w:t>
+        <w:t>We ask whether the microbiota of individuals of mixed ancestry is intermediate between the two parental species, dominated by one of them, or displaced outside their range, and whether the answer is the same in all four compartments. Three points of design are stated at the outset rather than introduced with the results. First, because genotyping across 25 chromosomes separates an intermediate genome from a near-parental genome introgressed on a single chromosome, what counts as a hybrid is a decision and not a given: the contrast is therefore run twice, on intermediate genomes alone and on the wider set including introgressed near-parental individuals, with both passes declared in advance, and the displacement of the result between them measures the contribution of the introgressed individuals, a random-removal control separating that contribution from the accompanying change in sample size. Second, the comparison is reported both as a category contrast in a model spanning all stations — the only admissible form given the low heritability expected from Grieneisen et al. (2021) — and, as a complementary characterisation, as the four-dimensional index of Camper et al. (2024), whose core threshold and taxonomic rank are fixed a priori and whose sensitivity is reported, since on a natural hybrid system these choices move the index more than sample size or sequencing depth do. Third, genotypic category is entangled with the spatial axis in this design, station being by far the strongest correlate of composition, and field processing order propagated to plate position, whose effect on composition is real; results on category are consequently reported bracketed between the two sequential orderings rather than as a single decomposition, without plate position in the principal models and with it as a covariate in a sensitivity analysis, and read as patterns co-varying with station and with category rather than as effects of ancestry alone. Two stations of the same river, 25 km apart and separated by a weir passable only downstream, were sampled in two successive years and provide an internal reference in which the two parental species occupy separate stations of one river: C. nasus with two intermediate hybrids at one (14 individuals), P. toxostoma alone at the other (19). Following Guivier et al. (2017), we expect any hybrid signal to be most pronounced in the digestive compartments, where the two parental species diverge most, rather than uniformly across the four tissues.</w:t>
       </w:r>
     </w:p>
     <w:p>
@@ -111,7 +111,7 @@
           <w:color w:val="888888"/>
           <w:sz w:val="18"/>
         </w:rPr>
-        <w:t>[Introduction, draft 1 — points à trancher. (i) Le document n'a pas de titre d'article : « Introduction » et « Materials and Methods » sont deux titres de section de même niveau. (ii) Les références Wang et al. (2015) et Sevellec et al. (2014) proviennent de la liste du manuscrit d'origine et n'ont pas été relues en texte intégral : vérifier leur pertinence à l'endroit où elles sont placées. (iii) Deux corrections à propager dans docs/biblio/microbiome_hybrid_all_refs.bib : Small et al. est daté 2018 alors que Crossref donne 2019 pour 10.1128/msystems.00331-19 ; et le corégone y figure comme préprint (10.1101/312231) alors que la version publiée existe — Sevellec et al. 2019, Ecology and Evolution, 10.1002/ece3.5676, qui est la version citée ici. (iv) Les deux passes de définition de l'hybride et les paramètres a priori du 4H annoncés au dernier paragraphe doivent correspondre au §8.6 une fois celui-ci rédigé.]</w:t>
+        <w:t>[Introduction, draft 1 — points à trancher. (i) Le document n'a pas de titre d'article : « Introduction » et « Materials and Methods » sont deux titres de section de même niveau. (ii) Les références Wang et al. (2015) et Sevellec et al. (2014) proviennent de la liste du manuscrit d'origine et n'ont pas été relues en texte intégral : vérifier leur pertinence à l'endroit où elles sont placées. (iii) Deux corrections à propager dans docs/biblio/microbiome_hybrid_all_refs.bib : Small et al. est daté 2018 alors que Crossref donne 2019 pour 10.1128/msystems.00331-19 ; et le corégone y figure comme préprint (10.1101/312231) alors que la version publiée existe — Sevellec et al. 2019, Ecology and Evolution, 10.1002/ece3.5676, qui est la version citée ici. (iv) Les deux passes de définition de l'hybride et le traitement de la position de plaque (D2) sont alignés sur le §1 et le §8.6 (2026-09-25). Les paramètres a priori du 4H (seuil de core, rang taxonomique) ne sont pas encore fixés : le §8.6 ne les décrit pas. (v) « near-parental genome introgressed on a single chromosome » n'est pas vérifiable sur genotypes_verifies_sept_180.csv, qui ne porte pas les assignations par chromosome : à confirmer avec André.]</w:t>
       </w:r>
     </w:p>
     <w:p>

</xml_diff>

<commit_message>
fix(style): texte courant des sections 8.8, 8.9 et de la Note S2 en Normal (etait Titre 1) ; titres 8.8 et 8.9 en Titre 2 comme 8.1-8.7, gras force a non retire. Texte inchange. + rappel de verification ENA pour la prochaine session
</commit_message>
<xml_diff>
--- a/docs/manuscrit/Article.docx
+++ b/docs/manuscrit/Article.docx
@@ -740,21 +740,22 @@
     </w:p>
     <w:p>
       <w:pPr>
-        <w:pStyle w:val="Heading1"/>
+        <w:pStyle w:val="Heading2"/>
       </w:pPr>
-      <w:r/>
       <w:r>
         <w:rPr>
-          <w:b w:val="0"/>
+          <w:i w:val="0"/>
+        </w:rPr>
+      </w:r>
+      <w:r>
+        <w:rPr>
           <w:i w:val="0"/>
         </w:rPr>
         <w:t>8.8 Plate position</w:t>
       </w:r>
     </w:p>
     <w:p>
-      <w:pPr>
-        <w:pStyle w:val="Heading1"/>
-      </w:pPr>
+      <w:pPr/>
       <w:r/>
       <w:r>
         <w:rPr>
@@ -772,9 +773,7 @@
       </w:r>
     </w:p>
     <w:p>
-      <w:pPr>
-        <w:pStyle w:val="Heading1"/>
-      </w:pPr>
+      <w:pPr/>
       <w:r/>
       <w:r>
         <w:rPr>
@@ -804,9 +803,7 @@
       </w:r>
     </w:p>
     <w:p>
-      <w:pPr>
-        <w:pStyle w:val="Heading1"/>
-      </w:pPr>
+      <w:pPr/>
       <w:r/>
       <w:r>
         <w:rPr>
@@ -839,54 +836,50 @@
     </w:p>
     <w:p>
       <w:pPr>
-        <w:pStyle w:val="Heading1"/>
+        <w:pStyle w:val="Heading2"/>
       </w:pPr>
-      <w:r/>
       <w:r>
         <w:rPr>
-          <w:b w:val="0"/>
           <w:i w:val="0"/>
         </w:rPr>
       </w:r>
       <w:r>
         <w:rPr>
-          <w:b w:val="0"/>
+          <w:i w:val="0"/>
+        </w:rPr>
+      </w:r>
+      <w:r>
+        <w:rPr>
           <w:i w:val="0"/>
           <w:color w:val="1F4E79"/>
         </w:rPr>
       </w:r>
       <w:r>
         <w:rPr>
-          <w:b w:val="0"/>
           <w:i w:val="0"/>
           <w:color w:val="1F4E79"/>
         </w:rPr>
       </w:r>
       <w:r>
         <w:rPr>
-          <w:b w:val="0"/>
           <w:i w:val="0"/>
           <w:color w:val="1F4E79"/>
         </w:rPr>
       </w:r>
       <w:r>
         <w:rPr>
-          <w:b w:val="0"/>
           <w:i w:val="0"/>
         </w:rPr>
       </w:r>
       <w:r>
         <w:rPr>
-          <w:b w:val="0"/>
           <w:i w:val="0"/>
         </w:rPr>
         <w:t>8.9 Structure of confounding in the genotypic design</w:t>
       </w:r>
     </w:p>
     <w:p>
-      <w:pPr>
-        <w:pStyle w:val="Heading1"/>
-      </w:pPr>
+      <w:pPr/>
       <w:r/>
       <w:r>
         <w:rPr>
@@ -937,9 +930,7 @@
       </w:r>
     </w:p>
     <w:p>
-      <w:pPr>
-        <w:pStyle w:val="Heading1"/>
-      </w:pPr>
+      <w:pPr/>
       <w:r/>
       <w:r>
         <w:rPr>
@@ -1004,9 +995,7 @@
       </w:r>
     </w:p>
     <w:p>
-      <w:pPr>
-        <w:pStyle w:val="Heading1"/>
-      </w:pPr>
+      <w:pPr/>
       <w:r/>
       <w:r>
         <w:rPr>
@@ -1079,9 +1068,7 @@
       </w:r>
     </w:p>
     <w:p>
-      <w:pPr>
-        <w:pStyle w:val="Heading1"/>
-      </w:pPr>
+      <w:pPr/>
       <w:r/>
       <w:r>
         <w:rPr>

</xml_diff>

<commit_message>
feat: reponses d Andre du 30/09 integrees - les 5 individus sans foie (trois ajustes sur midgut et caudale, concordants en Pt ; deux a NA), financement EDF/FACIES confirme et section Funding ajoutee au manuscrit, dates de peche de Pertuis assignees (serie 1011-1014 au 07/07, serie 2011-2015 au 20/08) avec table de correction ENA de 44 echantillons prete mais non soumise ; RESERVE : les valeurs de mediane et de D du tableau pour les trois individus ajustes ne correspondent a aucun des deux ajustements fournis, leur provenance reste inconnue et la question posee reste donc sans reponse sur ce point
</commit_message>
<xml_diff>
--- a/docs/manuscrit/Article.docx
+++ b/docs/manuscrit/Article.docx
@@ -219,7 +219,7 @@
           <w:i w:val="0"/>
           <w:color w:val="1F4E79"/>
         </w:rPr>
-        <w:t>Species identity was resolved by genotyping rather than by morphology. Each individual was assigned, from a chromosome-level assignment across 25 chromosomes, to one of three categories — Cn (59 individuals), Hy (42) and Pt (79) — and not by thresholding a median hybrid index, because a substantial minority of hybrids carry an extreme median index and their inter-chromosome discordance is what identifies them. Of the 180 individuals, 175 were genotyped from Q-scores on liver tissue and 5, all assigned to a parental category, from other tissues. The Hy category comprises two genome types: 20 intermediate genomes, and 22 near-parental genomes. What counts as a hybrid is therefore a decision, and every analysis of category is run twice, both passes being declared in advance: pass 1 retains the 20 intermediate hybrids and excludes the 22 near-parental individuals, which are not reassigned to a parental category (158 individuals); pass 2 retains all 42 (180 individuals). Nine of the 49 individuals previously identified on morphology were reclassified. Three stations carry all three categories — 74 individuals in pass 2 and 65 in pass 1, where Saint-Just-d'Ardèche retains a single hybrid — which is the subset in which the hybrid contrast can be tested within a station.</w:t>
+        <w:t>Species identity was resolved by genotyping rather than by morphology. Each individual was assigned, from a chromosome-level assignment across 25 chromosomes, to one of three categories — Cn (59 individuals), Hy (42) and Pt (79) — and not by thresholding a median hybrid index, because a substantial minority of hybrids carry an extreme median index and their inter-chromosome discordance is what identifies them. Of the 180 individuals, 175 were genotyped from Q-scores on liver tissue. The remaining five, all assigned to a parental category, were resolved by other routes: three from Q-score fits on midgut and caudal fin, which agreed in assigning them to P. toxostoma, and two from an earlier and closely related method that left no Q-score record, so that no median index and no inter-chromosome discordance are reported for the latter two. The Hy category comprises two genome types: 20 intermediate genomes, and 22 near-parental genomes. What counts as a hybrid is therefore a decision, and every analysis of category is run twice, both passes being declared in advance: pass 1 retains the 20 intermediate hybrids and excludes the 22 near-parental individuals, which are not reassigned to a parental category (158 individuals); pass 2 retains all 42 (180 individuals). Nine of the 49 individuals previously identified on morphology were reclassified. Three stations carry all three categories — 74 individuals in pass 2 and 65 in pass 1, where Saint-Just-d'Ardèche retains a single hybrid — which is the subset in which the hybrid contrast can be tested within a station.</w:t>
       </w:r>
     </w:p>
     <w:p>
@@ -1198,6 +1198,31 @@
         <w:t>[À COMPLÉTER : lien vers le dépôt de code (git) et, le cas échéant, DOI Zenodo de la version utilisée pour l'article.]</w:t>
       </w:r>
     </w:p>
+    <w:p>
+      <w:pPr>
+        <w:pStyle w:val="Heading1"/>
+      </w:pPr>
+      <w:r>
+        <w:t>Funding</w:t>
+      </w:r>
+    </w:p>
+    <w:p>
+      <w:pPr/>
+      <w:r>
+        <w:t>This work was funded by Électricité de France (EDF) through the FACIES project, with the support of the Fédération de l'Ain; the 2014–2015 sampling reported here was carried out under that same contract.</w:t>
+      </w:r>
+    </w:p>
+    <w:p>
+      <w:pPr/>
+      <w:r>
+        <w:rPr>
+          <w:i/>
+          <w:color w:val="888888"/>
+          <w:sz w:val="18"/>
+        </w:rPr>
+        <w:t>[Financement confirmé par André le 2026-09-30 : « c'est le même contrat qui a servi à cette étude ». À compléter avant soumission : la référence exacte du contrat EDF et le nom légal complet de la Fédération, à reprendre des remerciements de Guivier et al. (2017), que je n'ai pas relus ; et la section Acknowledgements proprement dite (appui de terrain), à rédiger avec les co-auteurs.]</w:t>
+      </w:r>
+    </w:p>
     <w:sectPr>
       <w:pgSz w:w="12240" w:h="15840"/>
       <w:pgMar w:top="1440" w:right="1800" w:bottom="1440" w:left="1800" w:header="720" w:footer="720" w:gutter="0"/>

</xml_diff>

<commit_message>
fix: les six ecarts de l audit corriges. Les deux notes editoriales fausses sont reecrites (parametres 4H fixes par D5 ; 17 des 22 quasi-purs introgresses sur un seul chromosome, 4 sur deux, 1 sur six, colonne n_chromosomes_introgresses) et l introduction ne generalise plus ; le paragraphe 9 porte la correction ENA du 25/09 et sa verification 727/1199, et donne les dates au jour pres sauf Pertuis avec note grise sur la correction prete non soumise ; 25 puits vides et 75 echantillons au lieu de 75 puits. CHIMIE : verifiee sur les RunParameters.xml de durance1 et durance3 - ReagentKitVersion=Version3, code-barres MS-600V3, lectures 251/8/8/251 : le kit est bien v3 mais 600 cycles lance en 2x251, donc l hypothese d un kit v2 500 cycles d Article_notes_a_trancher etait fausse et seule la mention 2x300 l etait
</commit_message>
<xml_diff>
--- a/docs/manuscrit/Article.docx
+++ b/docs/manuscrit/Article.docx
@@ -100,7 +100,7 @@
         <w:rPr>
           <w:i w:val="0"/>
         </w:rPr>
-        <w:t>We ask whether the microbiota of individuals of mixed ancestry is intermediate between the two parental species, dominated by one of them, or displaced outside their range, and whether the answer is the same in all four compartments. Three points of design are stated at the outset rather than introduced with the results. First, because genotyping across 25 chromosomes separates an intermediate genome from a near-parental genome introgressed on a single chromosome, what counts as a hybrid is a decision and not a given: the contrast is therefore run twice, on intermediate genomes alone and on the wider set including introgressed near-parental individuals, with both passes declared in advance, and the displacement of the result between them measures the contribution of the introgressed individuals, a random-removal control separating that contribution from the accompanying change in sample size. Second, the comparison is reported both as a category contrast in a model spanning all stations — the only admissible form given the low heritability expected from Grieneisen et al. (2021) — and, as a complementary characterisation, as the four-dimensional index of Camper et al. (2024), whose core threshold and taxonomic rank are fixed a priori and whose sensitivity is reported, since on a natural hybrid system these choices move the index more than sample size or sequencing depth do. Third, genotypic category is entangled with the spatial axis in this design, station being by far the strongest correlate of composition, and field processing order propagated to plate position, whose effect on composition is real; results on category are consequently reported bracketed between the two sequential orderings rather than as a single decomposition, without plate position in the principal models and with it as a covariate in a sensitivity analysis, and read as patterns co-varying with station and with category rather than as effects of ancestry alone. Two stations of the same river, 25 km apart and separated by a weir passable only downstream, were sampled in two successive years and provide an internal reference in which the two parental species occupy separate stations of one river: C. nasus with two intermediate hybrids at one (14 individuals), P. toxostoma alone at the other (19). Following Guivier et al. (2017), we expect any hybrid signal to be most pronounced in the digestive compartments, where the two parental species diverge most, rather than uniformly across the four tissues.</w:t>
+        <w:t>We ask whether the microbiota of individuals of mixed ancestry is intermediate between the two parental species, dominated by one of them, or displaced outside their range, and whether the answer is the same in all four compartments. Three points of design are stated at the outset rather than introduced with the results. First, because genotyping across 25 chromosomes separates an intermediate genome from a near-parental genome introgressed on one or a few chromosomes — a single one in 17 of the 22 such individuals —, what counts as a hybrid is a decision and not a given: the contrast is therefore run twice, on intermediate genomes alone and on the wider set including introgressed near-parental individuals, with both passes declared in advance, and the displacement of the result between them measures the contribution of the introgressed individuals, a random-removal control separating that contribution from the accompanying change in sample size. Second, the comparison is reported both as a category contrast in a model spanning all stations — the only admissible form given the low heritability expected from Grieneisen et al. (2021) — and, as a complementary characterisation, as the four-dimensional index of Camper et al. (2024), whose core threshold and taxonomic rank are fixed a priori and whose sensitivity is reported, since on a natural hybrid system these choices move the index more than sample size or sequencing depth do. Third, genotypic category is entangled with the spatial axis in this design, station being by far the strongest correlate of composition, and field processing order propagated to plate position, whose effect on composition is real; results on category are consequently reported bracketed between the two sequential orderings rather than as a single decomposition, without plate position in the principal models and with it as a covariate in a sensitivity analysis, and read as patterns co-varying with station and with category rather than as effects of ancestry alone. Two stations of the same river, 25 km apart and separated by a weir passable only downstream, were sampled in two successive years and provide an internal reference in which the two parental species occupy separate stations of one river: C. nasus with two intermediate hybrids at one (14 individuals), P. toxostoma alone at the other (19). Following Guivier et al. (2017), we expect any hybrid signal to be most pronounced in the digestive compartments, where the two parental species diverge most, rather than uniformly across the four tissues.</w:t>
       </w:r>
     </w:p>
     <w:p>
@@ -111,7 +111,7 @@
           <w:color w:val="888888"/>
           <w:sz w:val="18"/>
         </w:rPr>
-        <w:t>[Introduction, draft 1 — points à trancher. (i) Le document n'a pas de titre d'article : « Introduction » et « Materials and Methods » sont deux titres de section de même niveau. (ii) Les références Wang et al. (2015) et Sevellec et al. (2014) proviennent de la liste du manuscrit d'origine et n'ont pas été relues en texte intégral : vérifier leur pertinence à l'endroit où elles sont placées. (iii) Deux corrections à propager dans docs/biblio/microbiome_hybrid_all_refs.bib : Small et al. est daté 2018 alors que Crossref donne 2019 pour 10.1128/msystems.00331-19 ; et le corégone y figure comme préprint (10.1101/312231) alors que la version publiée existe — Sevellec et al. 2019, Ecology and Evolution, 10.1002/ece3.5676, qui est la version citée ici. (iv) Les deux passes de définition de l'hybride et le traitement de la position de plaque (D2) sont alignés sur le §1 et le §8.6 (2026-09-25). Les paramètres a priori du 4H (seuil de core, rang taxonomique) ne sont pas encore fixés : le §8.6 ne les décrit pas. (v) « near-parental genome introgressed on a single chromosome » n'est pas vérifiable sur genotypes_verifies_sept_180.csv, qui ne porte pas les assignations par chromosome : à confirmer avec André.]</w:t>
+        <w:t>[Introduction, draft 1 — points à trancher. (i) Le document n'a pas de titre d'article : « Introduction » et « Materials and Methods » sont deux titres de section de même niveau. (ii) Les références Wang et al. (2015) et Sevellec et al. (2014) proviennent de la liste du manuscrit d'origine et n'ont pas été relues en texte intégral : vérifier leur pertinence à l'endroit où elles sont placées. (iii) Deux corrections à propager dans docs/biblio/microbiome_hybrid_all_refs.bib : Small et al. est daté 2018 alors que Crossref donne 2019 pour 10.1128/msystems.00331-19 ; et le corégone y figure comme préprint (10.1101/312231) alors que la version publiée existe — Sevellec et al. 2019, Ecology and Evolution, 10.1002/ece3.5676, qui est la version citée ici. (iv) Les deux passes de définition de l'hybride et le traitement de la position de plaque (D2) sont alignés sur le §1 et le §8.6 (2026-09-25). Les paramètres a priori du 4H sont fixés par la décision D5 du 2026-09-25 : ρ = 0,5 au rang du genre, sensibilité rapportée sur ρ ∈ {0,3 ; 0,5 ; 0,7}, ϑ = ε = 0. Ce qui manque est leur description au §8.6, à écrire en même temps que le calcul 4H. (v) Vérifié sur genotypes_verifies_sept_180.csv, colonne n_chromosomes_introgresses : parmi les 22 quasi-purs, 17 sont introgressés sur un seul chromosome, 4 sur deux et 1 sur six. Le §1 et l'introduction portent désormais ces chiffres.]</w:t>
       </w:r>
     </w:p>
     <w:p>
@@ -219,7 +219,7 @@
           <w:i w:val="0"/>
           <w:color w:val="1F4E79"/>
         </w:rPr>
-        <w:t>Species identity was resolved by genotyping rather than by morphology. Each individual was assigned, from a chromosome-level assignment across 25 chromosomes, to one of three categories — Cn (59 individuals), Hy (42) and Pt (79) — and not by thresholding a median hybrid index, because a substantial minority of hybrids carry an extreme median index and their inter-chromosome discordance is what identifies them. Of the 180 individuals, 175 were genotyped from Q-scores on liver tissue. The remaining five, all assigned to a parental category, were resolved by other routes: three from Q-score fits on midgut and caudal fin, which agreed in assigning them to P. toxostoma, and two from an earlier and closely related method that left no Q-score record, so that no median index and no inter-chromosome discordance are reported for the latter two. The Hy category comprises two genome types: 20 intermediate genomes, and 22 near-parental genomes. What counts as a hybrid is therefore a decision, and every analysis of category is run twice, both passes being declared in advance: pass 1 retains the 20 intermediate hybrids and excludes the 22 near-parental individuals, which are not reassigned to a parental category (158 individuals); pass 2 retains all 42 (180 individuals). Nine of the 49 individuals previously identified on morphology were reclassified. Three stations carry all three categories — 74 individuals in pass 2 and 65 in pass 1, where Saint-Just-d'Ardèche retains a single hybrid — which is the subset in which the hybrid contrast can be tested within a station.</w:t>
+        <w:t>Species identity was resolved by genotyping rather than by morphology. Each individual was assigned, from a chromosome-level assignment across 25 chromosomes, to one of three categories — Cn (59 individuals), Hy (42) and Pt (79) — and not by thresholding a median hybrid index, because a substantial minority of hybrids carry an extreme median index and their inter-chromosome discordance is what identifies them. Of the 180 individuals, 175 were genotyped from Q-scores on liver tissue. The remaining five, all assigned to a parental category, were resolved by other routes: three from Q-score fits on midgut and caudal fin, which agreed in assigning them to P. toxostoma, and two from an earlier and closely related method that left no Q-score record, so that no median index and no inter-chromosome discordance are reported for the latter two. The Hy category comprises two genome types: 20 intermediate genomes, and 22 near-parental genomes, introgressed on a single chromosome in 17 cases, on two in four and on six in one. What counts as a hybrid is therefore a decision, and every analysis of category is run twice, both passes being declared in advance: pass 1 retains the 20 intermediate hybrids and excludes the 22 near-parental individuals, which are not reassigned to a parental category (158 individuals); pass 2 retains all 42 (180 individuals). Nine of the 49 individuals previously identified on morphology were reclassified. Three stations carry all three categories — 74 individuals in pass 2 and 65 in pass 1, where Saint-Just-d'Ardèche retains a single hybrid — which is the subset in which the hybrid contrast can be tested within a station.</w:t>
       </w:r>
     </w:p>
     <w:p>
@@ -263,7 +263,7 @@
           <w:b w:val="0"/>
           <w:i w:val="0"/>
         </w:rPr>
-        <w:t>Bacterial DNA was extracted from each tissue with the Qiagen Food Mericon kit (Qiagen, Venlo, Netherlands), following a slightly modified protocol detailed in Guivier et al. (2018). A 251 bp fragment of the V4 region of the bacterial 16S rRNA gene was amplified using the dual-index method of Kozich et al. (2013), with forward and reverse primers carrying an 8 bp index and Illumina adapters (Caporaso primers 515F GTGCCAGCMGCCGCGGTAA / 806R GGACTACHVGGGTWTCTAAT). DNA amplification, purification and pooling of PCR products followed Galan et al. (2016). The final library was quantified with the Kapa quantification kit (Kapa Biosystems) and loaded on an Illumina MiSeq flow cell with reagent kit v3 (2 × 300 cycles).</w:t>
+        <w:t>Bacterial DNA was extracted from each tissue with the Qiagen Food Mericon kit (Qiagen, Venlo, Netherlands), following a slightly modified protocol detailed in Guivier et al. (2018). A 251 bp fragment of the V4 region of the bacterial 16S rRNA gene was amplified using the dual-index method of Kozich et al. (2013), with forward and reverse primers carrying an 8 bp index and Illumina adapters (Caporaso primers 515F GTGCCAGCMGCCGCGGTAA / 806R GGACTACHVGGGTWTCTAAT). DNA amplification, purification and pooling of PCR products followed Galan et al. (2016). The final library was quantified with the Kapa quantification kit (Kapa Biosystems) and loaded on an Illumina MiSeq flow cell with reagent kit v3 (600 cycles), run as 2 × 251 bp paired-end reads with two 8 bp index reads (518 of the 600 cycles).</w:t>
       </w:r>
     </w:p>
     <w:p>
@@ -282,7 +282,7 @@
           <w:color w:val="888888"/>
           <w:sz w:val="18"/>
         </w:rPr>
-        <w:t>[Transposé du manuscrit d'origine (même équipe, même assay) : kit Qiagen Food Mericon, dual-index Kozich (2013), protocole Galan (2016), quantification Kapa, MiSeq v3 (2×300). Le manuscrit d'origine ne portait que sur une partie des données (branchie et midgut) ; le plan Durance à quatre tissus fait foi — confirmé par les co-auteurs.]</w:t>
+        <w:t>[Transposé du manuscrit d'origine (même équipe, même assay) : kit Qiagen Food Mericon, dual-index Kozich (2013), protocole Galan (2016), quantification Kapa. La chimie n'est plus transposée : les fiches de run de durance1 et durance3 donnent ReagentKitVersion=Version3, code-barres MS…-600V3 et des lectures 251/8/8/251, soit le kit v3 600 cycles en 2×251 — l'hypothèse d'un kit v2 500 cycles formulée dans Article_notes_a_trancher.md est écartée. durance2 n'a pas de dossier de run, mais ses lectures mesurent aussi 251 pb. Le manuscrit d'origine ne portait que sur une partie des données (branchie et midgut) ; le plan Durance à quatre tissus fait foi — confirmé par les co-auteurs.]</w:t>
       </w:r>
     </w:p>
     <w:p>
@@ -311,7 +311,7 @@
           <w:b w:val="0"/>
           <w:i w:val="0"/>
         </w:rPr>
-        <w:t>Negative controls comprised extraction blanks and no-template PCR controls; the original sequencing project of this laboratory reports the same two categories (four extraction negative controls and eight amplification negative controls). In the Durance dataset we verified four extraction blanks — one per tissue (Blanc-Caudal, Blanc-Branchie, Blanc-Midgut, Blanc-Hindgut) — and eight no-template PCR controls (T-1 to T-8), each sequenced in all three runs, i.e. 12 and 24 control samples respectively (36 negative controls in total). Two aliquots of a commercial mock community — the ZymoBIOMICS Microbial Community Standard (Zymo Research, Irvine, CA, USA), a defined mixture of eight known bacterial taxa — were processed alongside the samples as positive controls (6 mock samples across runs). In addition, 75 empty wells received no library and were sequenced to monitor index hopping between libraries.</w:t>
+        <w:t>Negative controls comprised extraction blanks and no-template PCR controls; the original sequencing project of this laboratory reports the same two categories (four extraction negative controls and eight amplification negative controls). In the Durance dataset we verified four extraction blanks — one per tissue (Blanc-Caudal, Blanc-Branchie, Blanc-Midgut, Blanc-Hindgut) — and eight no-template PCR controls (T-1 to T-8), each sequenced in all three runs, i.e. 12 and 24 control samples respectively (36 negative controls in total). Two aliquots of a commercial mock community — the ZymoBIOMICS Microbial Community Standard (Zymo Research, Irvine, CA, USA), a defined mixture of eight known bacterial taxa — were processed alongside the samples as positive controls (6 mock samples across runs). In addition, 25 empty wells received no library and were sequenced in all three runs — 75 empty-well samples — to monitor index hopping between libraries.</w:t>
       </w:r>
     </w:p>
     <w:p>
@@ -530,7 +530,7 @@
           <w:b w:val="0"/>
           <w:i w:val="0"/>
         </w:rPr>
-        <w:t>Cross-talk between libraries (index hopping) was quantified using the 75 empty wells, which received no library and in which any read therefore represents leakage (67 of them retained at least one read after filtering; the remaining 8 contained none). Across all empty wells these accumulated 41 reads out of 26.8 million (0.0002 %; median 0 reads per well, maximum 13), indicating negligible index hopping. No background-noise subtraction was applied on this basis.</w:t>
+        <w:t>Cross-talk between libraries (index hopping) was quantified using the 25 empty wells, which received no library and in which any read therefore represents leakage; across the three runs they give 75 empty-well samples, of which 67 retained at least one read after filtering and 8 none. Across all empty wells these accumulated 41 reads out of 26.8 million (0.0002 %; median 0 reads per well, maximum 13), indicating negligible index hopping. No background-noise subtraction was applied on this basis.</w:t>
       </w:r>
     </w:p>
     <w:p>
@@ -700,7 +700,7 @@
           <w:i w:val="0"/>
           <w:color w:val="1F4E79"/>
         </w:rPr>
-        <w:t>Statistical framework. Community composition is analysed by PERMANOVA on the averaged dissimilarity matrices, stratified by tissue. Stratification is imposed by the design rather than chosen: 168 of the 180 fish occupy the same plate column across all four tissues, so plate position is not estimable in a pooled model carrying fish identity. Station, not site code, is the spatial unit, since two site codes each span two Suran stations that share no genotypic category. Sequencing run is nested within library preparation (§8.7). Every analysis of genotypic category is run in the two passes defined in §1. Plate column is not entered in the principal models, which report patterns co-varying with station and category without separating them; because its effect on composition is real (§8.8), every model testing category is also fitted with plate column as a covariate and reported as a sensitivity analysis. Because genotypic category, station and plate position are mutually entangled (SS8.9), no single sequential decomposition is reported: each model is fitted in both orderings and the interval between them is given, the ordering that serves category first bounding it from above and the ordering that serves it last from below. Permutations are constrained within station blocks where the question concerns a within-station contrast. Dispersion is tested separately with PERMDISP, since the transgressive hypothesis concerns the variability of hybrid microbiota and not only the position of its centroid, and since PERMANOVA is itself sensitive to heterogeneous dispersion. Every claim is reported per metric and per tissue. Four dissimilarities are carried throughout — Bray–Curtis, Jaccard, unweighted and weighted UniFrac — together with four alpha indices: observed richness, Shannon, inverse Simpson and Faith's phylogenetic diversity. Because resequencing one library recovers only 48 % of the ASVs present at 1–3 reads (§8.7), presence-based metrics are not treated as sufficient on their own: a result is stated as established only where at least one abundance-weighted and one presence-based metric support it, and is otherwise reported as metric-dependent with the supporting metrics named. Figures quoted in running text use Shannon for alpha diversity and Bray–Curtis for composition, both abundance-weighted, with the remaining metrics reported alongside rather than relegated. Weighting is not the operative axis for composition: Bray–Curtis, though abundance-weighted, patterns with the two presence-based dissimilarities on both category and dispersion, whereas weighted UniFrac stands apart, so the rule is applied metric by metric rather than by weighting class. The choice of a differential-abundance method remains to be fixed.</w:t>
+        <w:t>Statistical framework. Community composition is analysed by PERMANOVA on the averaged dissimilarity matrices, stratified by tissue. Stratification is imposed by the design rather than chosen: 168 of the 180 fish occupy the same plate column across all four tissues, so plate position is not estimable in a pooled model carrying fish identity. Station, not site code, is the spatial unit, since two site codes each span two Suran stations that share no genotypic category. Sequencing run is nested within library preparation (§8.7). Every analysis of genotypic category is run in the two passes defined in §1. Plate column is not entered in the principal models, which report patterns co-varying with station and category without separating them; because its effect on composition is real (§8.8), every model testing category is also fitted with plate column as a covariate and reported as a sensitivity analysis. Because genotypic category, station and plate position are mutually entangled (SS8.9), no single sequential decomposition is reported: each model is fitted in both orderings and the interval between them is given, the ordering that serves category first bounding it from above and the ordering that serves it last from below. Permutations are constrained within station blocks where the question concerns a within-station contrast. Dispersion is tested separately with PERMDISP, since the transgressive hypothesis concerns the variability of hybrid microbiota and not only the position of its centroid, and since PERMANOVA is itself sensitive to heterogeneous dispersion. Every claim is reported per metric and per tissue; the choice of a differential-abundance method remains to be fixed.</w:t>
       </w:r>
     </w:p>
     <w:p>
@@ -1175,7 +1175,7 @@
           <w:i w:val="0"/>
           <w:color w:val="1F4E79"/>
         </w:rPr>
-        <w:t>ENA metadata were corrected on 2026-08-31 (field-record coordinates, exact collection dates and genotype-resolved host identities); PRJEB124417 is up to date. The correction covered 3,472 fields across the 727 biological samples and was verified field by field; the 41 controls, the sample accessions, the aliases and the sequence files were unchanged.</w:t>
+        <w:t>ENA metadata were corrected on 2026-08-31 (field-record coordinates, exact collection dates and genotype-resolved host identities); PRJEB124417 is up to date. The correction covered 3,472 fields across the 727 biological samples and was verified field by field; the 41 controls, the sample accessions, the aliases and the sequence files were unchanged. A second correction, on 2026-09-25, aligned host identity on the 25-chromosome genotyping: sample title, host scientific name and host common name were updated for 568 samples (1,199 fields), hybrids being recorded as nasus x toxostoma. It was then verified against the archive itself: 727 samples queried, 1,199 fields conforming, none discrepant. Neither correction altered a sample accession, an alias or a sequence file.</w:t>
       </w:r>
     </w:p>
     <w:p>
@@ -1184,7 +1184,18 @@
         <w:rPr>
           <w:i w:val="0"/>
         </w:rPr>
-        <w:t>Metadata completeness. Sampling-site coordinates and environmental context terms were obtained from the field records and are reported per site in Supplementary Table S1. Collection dates are given at year resolution, the precision at which sampling was recorded for this dataset; ENA accepts year-only collection dates.</w:t>
+        <w:t>Metadata completeness. Sampling-site coordinates and environmental context terms were obtained from the field records and are reported per site in Supplementary Table S1. Collection dates are given at day resolution for every station except Pertuis, where the two 2014 fishing campaigns are deposited as the interval 2014-07-07/2014-08-20.</w:t>
+      </w:r>
+    </w:p>
+    <w:p>
+      <w:pPr/>
+      <w:r>
+        <w:rPr>
+          <w:i/>
+          <w:color w:val="888888"/>
+          <w:sz w:val="18"/>
+        </w:rPr>
+        <w:t>[Pertuis : les individus sont désormais assignés à leur campagne (série 1011-1014 au 07/07/2014, série 2011-2015 au 20/08/2014 — André, 2026-09-30). La table de correction ena_deposit/ena_corrections_pertuis_dates.tsv est prête (44 échantillons) mais n'est pas encore soumise ; remplacer l'intervalle par les deux dates ici une fois le MODIFY passé.]</w:t>
       </w:r>
     </w:p>
     <w:p>

</xml_diff>

<commit_message>
fix: verification chiffree du manuscrit contre les donnees - 44 controles, 41 concordants. Deux valeurs fausses corrigees : le seuil decontam 0,5 ne retire pas 2,12 pourcent EN PLUS mais 2,13 au total, soit 1,89 point de plus que le seuil retenu ; et la dissimilarite de Jaccard inter-librairie vaut 0,720 et non 0,719. Le troisieme ecart n est pas dans le manuscrit : analysis_metadata.csv porte 2181 lignes contre 2180 colonnes dans la table propre, la ligne en trop etant 15Bue1014Ch03A__durance3 ecarte comme vide a l etape DADA2 et documente dans le README, sans effet sur les analyses qui lisent la table. Script 30 versionne ; la table des controles reste dans results/, non versionne par convention
</commit_message>
<xml_diff>
--- a/docs/manuscrit/Article.docx
+++ b/docs/manuscrit/Article.docx
@@ -508,7 +508,7 @@
           <w:b w:val="0"/>
           <w:i w:val="0"/>
         </w:rPr>
-        <w:t>Reagent and laboratory contaminants were identified with decontam v1.30.0 (Davis et al. 2018) using the prevalence method, which contrasts the prevalence of each ASV in true samples against negative controls. DNA concentrations were not available for the Durance libraries, precluding the frequency method. The negative set comprised extraction blanks and PCR (no-template) negative controls, each present in all three sequencing runs (36 control samples in total); mock communities and empty wells were excluded from this step. Batches were defined by sequencing run. Two classification thresholds were compared (0.1, the package default, and 0.5). The default threshold of 0.1 was retained: it flagged 66 ASVs (0.15 % of ASVs) while retaining 99.76 % of reads, and the flagged taxa were taxonomically consistent with common reagent contaminants (Pseudomonadaceae, Moraxellaceae, Micrococcaceae, Propionibacteriaceae, Streptococcaceae). The more aggressive 0.5 threshold additionally removed 2.12 % of reads, including ASVs carrying genuine biological signal — most notably a Candidatus Branchiomonas ASV that was prevalent in gill and external tissues and essentially absent from negative controls — and was therefore rejected.</w:t>
+        <w:t>Reagent and laboratory contaminants were identified with decontam v1.30.0 (Davis et al. 2018) using the prevalence method, which contrasts the prevalence of each ASV in true samples against negative controls. DNA concentrations were not available for the Durance libraries, precluding the frequency method. The negative set comprised extraction blanks and PCR (no-template) negative controls, each present in all three sequencing runs (36 control samples in total); mock communities and empty wells were excluded from this step. Batches were defined by sequencing run. Two classification thresholds were compared (0.1, the package default, and 0.5). The default threshold of 0.1 was retained: it flagged 66 ASVs (0.15 % of ASVs) while retaining 99.76 % of reads, and the flagged taxa were taxonomically consistent with common reagent contaminants (Pseudomonadaceae, Moraxellaceae, Micrococcaceae, Propionibacteriaceae, Streptococcaceae). The more aggressive 0.5 threshold removed 2.13 % of reads in total, 1.89 points more than the retained threshold, including ASVs carrying genuine biological signal — most notably a Candidatus Branchiomonas ASV that was prevalent in gill and external tissues and essentially absent from negative controls — and was therefore rejected.</w:t>
       </w:r>
     </w:p>
     <w:p>
@@ -717,7 +717,7 @@
     <w:p>
       <w:pPr/>
       <w:r>
-        <w:t>The nested replication structure was verified directly from the data. Each pair of runs was compared within sample after rarefaction to a common depth, so that detection probability is identical by construction (548 samples reaching 3,000 reads in all three runs). The two runs sharing a library were markedly more similar to each other (mean Bray–Curtis 0.118, Jaccard 0.445) than either was to the run from the independent library (0.248 and 0.719 respectively); the two library-crossing comparisons were statistically indistinguishable from each other (paired Wilcoxon, p = 0.48) and both differed from the within-library comparison (p &lt; 10⁻⁸⁹). Recapture of rare ASVs (1–3 reads) showed the same pattern (0.48 within library vs 0.19 across).</w:t>
+        <w:t>The nested replication structure was verified directly from the data. Each pair of runs was compared within sample after rarefaction to a common depth, so that detection probability is identical by construction (548 samples reaching 3,000 reads in all three runs). The two runs sharing a library were markedly more similar to each other (mean Bray–Curtis 0.118, Jaccard 0.445) than either was to the run from the independent library (0.248 and 0.720 respectively); the two library-crossing comparisons were statistically indistinguishable from each other (paired Wilcoxon, p = 0.48) and both differed from the within-library comparison (p &lt; 10⁻⁸⁹). Recapture of rare ASVs (1–3 reads) showed the same pattern (0.48 within library vs 0.19 across).</w:t>
       </w:r>
     </w:p>
     <w:p>

</xml_diff>

<commit_message>
docs: manuscrit mis a jour avec les arbitrages de JF du 03/10 (texte ajoute en bleu) - Article : titre provisoire (sous-titre du supplement), appel de la nouvelle Table S2 au paragraphe 1, lien GitHub public au paragraphe 9 (note grise Zenodo conservee), Funding avec le contrat de these EDF-CNRS AGDI 428481, point (i) de la note de l introduction actualise (cible Animal Microbiome). Supplement : table de genotypage individuel inseree en Table S2 (180 lignes, 17 colonnes, section paysage), Tables S2-S9 renumerotees S3-S10 (8 appels dans l article, 12 dans le supplement). Correction : la note Host identity attribuait la classification a un genotypage microsatellite, contredit par l article (25 chromosomes). Signale sans correction : l ordre des premieres citations des tables n etait deja pas croissant (1,4,2,7,6,8,9,3) contrairement a l annonce du supplement
</commit_message>
<xml_diff>
--- a/docs/manuscrit/Article.docx
+++ b/docs/manuscrit/Article.docx
@@ -2,6 +2,18 @@
 <file path=word/document.xml><?xml version="1.0" encoding="utf-8"?>
 <w:document xmlns:wpc="http://schemas.microsoft.com/office/word/2010/wordprocessingCanvas" xmlns:mo="http://schemas.microsoft.com/office/mac/office/2008/main" xmlns:mc="http://schemas.openxmlformats.org/markup-compatibility/2006" xmlns:mv="urn:schemas-microsoft-com:mac:vml" xmlns:o="urn:schemas-microsoft-com:office:office" xmlns:r="http://schemas.openxmlformats.org/officeDocument/2006/relationships" xmlns:m="http://schemas.openxmlformats.org/officeDocument/2006/math" xmlns:v="urn:schemas-microsoft-com:vml" xmlns:wp14="http://schemas.microsoft.com/office/word/2010/wordprocessingDrawing" xmlns:wp="http://schemas.openxmlformats.org/drawingml/2006/wordprocessingDrawing" xmlns:w10="urn:schemas-microsoft-com:office:word" xmlns:w="http://schemas.openxmlformats.org/wordprocessingml/2006/main" xmlns:w14="http://schemas.microsoft.com/office/word/2010/wordml" xmlns:wpg="http://schemas.microsoft.com/office/word/2010/wordprocessingGroup" xmlns:wpi="http://schemas.microsoft.com/office/word/2010/wordprocessingInk" xmlns:wne="http://schemas.microsoft.com/office/word/2006/wordml" xmlns:wps="http://schemas.microsoft.com/office/word/2010/wordprocessingShape" mc:Ignorable="w14 wp14">
   <w:body>
+    <w:p>
+      <w:pPr>
+        <w:pStyle w:val="Title"/>
+      </w:pPr>
+      <w:r>
+        <w:rPr>
+          <w:i w:val="0"/>
+          <w:color w:val="1F4E79"/>
+        </w:rPr>
+        <w:t>Host-associated bacterial microbiota of hybridising cyprinid fishes</w:t>
+      </w:r>
+    </w:p>
     <w:p>
       <w:pPr>
         <w:pStyle w:val="Title"/>
@@ -111,7 +123,7 @@
           <w:color w:val="888888"/>
           <w:sz w:val="18"/>
         </w:rPr>
-        <w:t>[Introduction, draft 1 — points à trancher. (i) Le document n'a pas de titre d'article : « Introduction » et « Materials and Methods » sont deux titres de section de même niveau. (ii) Les références Wang et al. (2015) et Sevellec et al. (2014) proviennent de la liste du manuscrit d'origine et n'ont pas été relues en texte intégral : vérifier leur pertinence à l'endroit où elles sont placées. (iii) Deux corrections à propager dans docs/biblio/microbiome_hybrid_all_refs.bib : Small et al. est daté 2018 alors que Crossref donne 2019 pour 10.1128/msystems.00331-19 ; et le corégone y figure comme préprint (10.1101/312231) alors que la version publiée existe — Sevellec et al. 2019, Ecology and Evolution, 10.1002/ece3.5676, qui est la version citée ici. (iv) Les deux passes de définition de l'hybride et le traitement de la position de plaque (D2) sont alignés sur le §1 et le §8.6 (2026-09-25). Les paramètres a priori du 4H sont fixés par la décision D5 du 2026-09-25 : ρ = 0,5 au rang du genre, sensibilité rapportée sur ρ ∈ {0,3 ; 0,5 ; 0,7}, ϑ = ε = 0. Ce qui manque est leur description au §8.6, à écrire en même temps que le calcul 4H. (v) Vérifié sur genotypes_verifies_sept_180.csv, colonne n_chromosomes_introgresses : parmi les 22 quasi-purs, 17 sont introgressés sur un seul chromosome, 4 sur deux et 1 sur six. Le §1 et l'introduction portent désormais ces chiffres.]</w:t>
+        <w:t>[Introduction, draft 1 — points à trancher. (i) Titre provisoire inséré : sous-titre du supplément (JF, 2026-10-03) ; titre définitif en fin d'écriture. Cible Animal Microbiome (JF, 2026-10-03) : la structure Background / Methods / Results / Discussion / Conclusions et la section Declarations restent à mettre en place. (ii) Les références Wang et al. (2015) et Sevellec et al. (2014) proviennent de la liste du manuscrit d'origine et n'ont pas été relues en texte intégral : vérifier leur pertinence à l'endroit où elles sont placées. (iii) Deux corrections à propager dans docs/biblio/microbiome_hybrid_all_refs.bib : Small et al. est daté 2018 alors que Crossref donne 2019 pour 10.1128/msystems.00331-19 ; et le corégone y figure comme préprint (10.1101/312231) alors que la version publiée existe — Sevellec et al. 2019, Ecology and Evolution, 10.1002/ece3.5676, qui est la version citée ici. (iv) Les deux passes de définition de l'hybride et le traitement de la position de plaque (D2) sont alignés sur le §1 et le §8.6 (2026-09-25). Les paramètres a priori du 4H sont fixés par la décision D5 du 2026-09-25 : ρ = 0,5 au rang du genre, sensibilité rapportée sur ρ ∈ {0,3 ; 0,5 ; 0,7}, ϑ = ε = 0. Ce qui manque est leur description au §8.6, à écrire en même temps que le calcul 4H. (v) Vérifié sur genotypes_verifies_sept_180.csv, colonne n_chromosomes_introgresses : parmi les 22 quasi-purs, 17 sont introgressés sur un seul chromosome, 4 sur deux et 1 sur six. Le §1 et l'introduction portent désormais ces chiffres.]</w:t>
       </w:r>
     </w:p>
     <w:p>
@@ -234,7 +246,21 @@
           <w:i w:val="0"/>
           <w:color w:val="1F4E79"/>
         </w:rPr>
-        <w:t>Species identity was resolved by genotyping rather than by morphology. Each individual was assigned, from a chromosome-level assignment across 25 chromosomes, to one of three categories — Cn (59 individuals), Hy (42) and Pt (79) — and not by thresholding a median hybrid index, because a substantial minority of hybrids carry an extreme median index and their inter-chromosome discordance is what identifies them. Of the 180 individuals, 175 were genotyped from Q-scores on liver tissue. The remaining five, all assigned to a parental category, were resolved by other routes: three from Q-score fits on midgut and caudal fin, which agreed in assigning them to P. toxostoma, and two from an earlier and closely related method that left no Q-score record, so that no median index and no inter-chromosome discordance are reported for the latter two. The Hy category comprises two genome types: 20 intermediate genomes, and 22 near-parental genomes, introgressed on a single chromosome in 17 cases, on two in four and on six in one. What counts as a hybrid is therefore a decision, and every analysis of category is run twice, both passes being declared in advance: pass 1 retains the 20 intermediate hybrids and excludes the 22 near-parental individuals, which are not reassigned to a parental category (158 individuals); pass 2 retains all 42 (180 individuals). Nine of the 49 individuals previously identified on morphology were reclassified. Three stations carry all three categories — 74 individuals in pass 2 and 65 in pass 1, where Saint-Just-d'Ardèche retains a single hybrid — which is the subset in which the hybrid contrast can be tested within a station.</w:t>
+        <w:t>Species identity was resolved by genotyping rather than by morphology. Each individual was assigned, from a chromosome-level assignment across 25 chromosomes, to one of three categories — Cn (59 individuals), Hy (42) and Pt (79) — and not by thresholding a median hybrid index, because a substantial minority of hybrids carry an extreme median index and their inter-chromosome discordance is what identifies them. Of the 180 individuals, 175 were genotyped from Q-scores on liver tissue.</w:t>
+      </w:r>
+      <w:r>
+        <w:rPr>
+          <w:i w:val="0"/>
+          <w:color w:val="1F4E79"/>
+        </w:rPr>
+        <w:t xml:space="preserve"> Individual genotypes, with the tissue on which each was obtained, are given in Supplementary Table S2.</w:t>
+      </w:r>
+      <w:r>
+        <w:rPr>
+          <w:i w:val="0"/>
+          <w:color w:val="1F4E79"/>
+        </w:rPr>
+        <w:t xml:space="preserve"> The remaining five, all assigned to a parental category, were resolved by other routes: three from Q-score fits on midgut and caudal fin, which agreed in assigning them to P. toxostoma, and two from an earlier and closely related method that left no Q-score record, so that no median index and no inter-chromosome discordance are reported for the latter two. The Hy category comprises two genome types: 20 intermediate genomes, and 22 near-parental genomes, introgressed on a single chromosome in 17 cases, on two in four and on six in one. What counts as a hybrid is therefore a decision, and every analysis of category is run twice, both passes being declared in advance: pass 1 retains the 20 intermediate hybrids and excludes the 22 near-parental individuals, which are not reassigned to a parental category (158 individuals); pass 2 retains all 42 (180 individuals). Nine of the 49 individuals previously identified on morphology were reclassified. Three stations carry all three categories — 74 individuals in pass 2 and 65 in pass 1, where Saint-Just-d'Ardèche retains a single hybrid — which is the subset in which the hybrid contrast can be tested within a station.</w:t>
       </w:r>
     </w:p>
     <w:p>
@@ -329,7 +355,7 @@
         <w:t>Libraries were sequenced on an Illumina MiSeq on 10 July 2017 (durance1), 5 October 2017 (durance2) and 3 November 2017 (durance3), with a 10 % PhiX spike-in. PCR conditions, purification and pooling followed Galan et al. (2016).</w:t>
       </w:r>
       <w:r>
-        <w:t xml:space="preserve"> Run labels, flow cells, dates and the mapping of runs to library preparations are given in Supplementary Table S4.</w:t>
+        <w:t xml:space="preserve"> Run labels, flow cells, dates and the mapping of runs to library preparations are given in Supplementary Table S5.</w:t>
       </w:r>
     </w:p>
     <w:p>
@@ -358,7 +384,7 @@
         <w:t>The mock community was the ZymoBIOMICS Microbial Community Standard (Zymo Research, cat. D6300).</w:t>
       </w:r>
       <w:r>
-        <w:t xml:space="preserve"> The number of biological samples, controls and empty wells actually deposited is given in Supplementary Table S2.</w:t>
+        <w:t xml:space="preserve"> The number of biological samples, controls and empty wells actually deposited is given in Supplementary Table S3.</w:t>
       </w:r>
     </w:p>
     <w:p>
@@ -702,7 +728,7 @@
           <w:i w:val="0"/>
           <w:color w:val="1F4E79"/>
         </w:rPr>
-        <w:t>Because the rarefaction threshold both equalises depth and decides which samples enter, the second of these effects was quantified separately. On a fixed set of samples - those retained at 3,000 reads, so that only depth varies - dissimilarity matrices recomputed at 500 to 2,000 reads were compared with the 3,000-read reference. The two abundance-weighted metrics proved essentially invariant down to 500 reads (weighted UniFrac r = 0.9994, Bray-Curtis r = 0.9985), whereas the two presence-based metrics degraded (Jaccard r = 0.9617, unweighted UniFrac r = 0.9373) and observed richness fell by 42 %, confirming that the loss is driven by rare taxa rather than by a general low-depth artefact. Sample retention at 3,000 reads is not random with respect to the variable of interest: in the caudal fin 50 % of intermediate hybrids passed the threshold against 86 % of P. toxostoma (pass 1), and 67 % of all 42 hybrids (pass 2), a gap of 36 and 20 points respectively, reaching 48 and 36 points at one of the three stations carrying the full genotypic gradient. No threshold removes this selection without the corresponding loss of richness. Claims resting on abundance-weighted metrics are therefore accompanied by a sensitivity analysis at 500 reads, where the caudal-fin gap falls to 3.8 points (pass 1) and 5.7 points (pass 2) and 2,067 samples are retained (1,825 in pass 1); claims resting on presence-based metrics are reported at 3,000 reads with the selection declared, since they cannot be tested at 500 and the midgut gap (14.0 and 8.9 points) persists there in any case. Supplementary Table S7 and Figure S2.</w:t>
+        <w:t>Because the rarefaction threshold both equalises depth and decides which samples enter, the second of these effects was quantified separately. On a fixed set of samples - those retained at 3,000 reads, so that only depth varies - dissimilarity matrices recomputed at 500 to 2,000 reads were compared with the 3,000-read reference. The two abundance-weighted metrics proved essentially invariant down to 500 reads (weighted UniFrac r = 0.9994, Bray-Curtis r = 0.9985), whereas the two presence-based metrics degraded (Jaccard r = 0.9617, unweighted UniFrac r = 0.9373) and observed richness fell by 42 %, confirming that the loss is driven by rare taxa rather than by a general low-depth artefact. Sample retention at 3,000 reads is not random with respect to the variable of interest: in the caudal fin 50 % of intermediate hybrids passed the threshold against 86 % of P. toxostoma (pass 1), and 67 % of all 42 hybrids (pass 2), a gap of 36 and 20 points respectively, reaching 48 and 36 points at one of the three stations carrying the full genotypic gradient. No threshold removes this selection without the corresponding loss of richness. Claims resting on abundance-weighted metrics are therefore accompanied by a sensitivity analysis at 500 reads, where the caudal-fin gap falls to 3.8 points (pass 1) and 5.7 points (pass 2) and 2,067 samples are retained (1,825 in pass 1); claims resting on presence-based metrics are reported at 3,000 reads with the selection declared, since they cannot be tested at 500 and the midgut gap (14.0 and 8.9 points) persists there in any case. Supplementary Table S8 and Figure S2.</w:t>
       </w:r>
       <w:r>
         <w:rPr>
@@ -751,7 +777,7 @@
         <w:t>Library preparation therefore roughly doubles the technical dissimilarity contributed by sequencing alone, with a proportionally larger effect on presence–absence than on relative abundances. Sequencing run was accordingly modelled as nested within library preparation rather than as a three-level factor with interchangeable levels. Because each sample is present in every batch, technical and biological factors are crossed rather than confounded, so batch-correction methods designed for confounded meta-analyses were not applied.</w:t>
       </w:r>
       <w:r>
-        <w:t xml:space="preserve"> Index assignment across preparations and the verification of sample-to-file matching are detailed in Supplementary Table S4 and Note S1.</w:t>
+        <w:t xml:space="preserve"> Index assignment across preparations and the verification of sample-to-file matching are detailed in Supplementary Table S5 and Note S1.</w:t>
       </w:r>
     </w:p>
     <w:p>
@@ -819,7 +845,7 @@
           <w:i w:val="0"/>
           <w:color w:val="1F4E79"/>
         </w:rPr>
-        <w:t>The effect is present in all 24 strata (12 tissue × run strata × 2 metrics) in both passes (p ≤ 0.033 in pass 1, p ≤ 0.007 in pass 2), replicated across the three runs; it does not depend on category labels, and the two passes differ only by the 22 individuals excluded from pass 1. Because the terms differ in degrees of freedom, effect sizes are reported relative to their expectation under the null, R2/(df/(n−1)): plate column reaches 1.84 in pass 1 and 1.95 in pass 2 (median R2 = 0.152 and 0.141, 11 df), the same order as genotypic category fitted after column (1.61 and 1.77; median R2 = 0.026 and 0.024, 2 df; significant in 19 and 18 of 24 strata) and below station (3.32 and 3.69; median R2 = 0.204 and 0.196, 8 df). Supplementary Table S6 and Figure S1.</w:t>
+        <w:t>The effect is present in all 24 strata (12 tissue × run strata × 2 metrics) in both passes (p ≤ 0.033 in pass 1, p ≤ 0.007 in pass 2), replicated across the three runs; it does not depend on category labels, and the two passes differ only by the 22 individuals excluded from pass 1. Because the terms differ in degrees of freedom, effect sizes are reported relative to their expectation under the null, R2/(df/(n−1)): plate column reaches 1.84 in pass 1 and 1.95 in pass 2 (median R2 = 0.152 and 0.141, 11 df), the same order as genotypic category fitted after column (1.61 and 1.77; median R2 = 0.026 and 0.024, 2 df; significant in 19 and 18 of 24 strata) and below station (3.32 and 3.69; median R2 = 0.204 and 0.196, 8 df). Supplementary Table S7 and Figure S1.</w:t>
       </w:r>
       <w:r>
         <w:rPr>
@@ -1016,7 +1042,7 @@
         </w:rPr>
       </w:r>
       <w:r>
-        <w:t>A preliminary variance partition was run to size these terms before the ecological analysis, not as a result of it, in both passes and on the four metrics. Fitted in both orderings without plate position, genotypic category accounts for a median of 1.7 % to 2.8 % of compositional variance across the 48 metric × tissue × run strata in pass 1 and 1.4 % to 3.0 % in pass 2, against a median of 19 % and 18 % for station (range across strata 14–36 % in pass 1 and 14–35 % in pass 2). No tissue is detected by all four metrics in all three runs under both permutation schemes, in either pass, with or without plate position, so a global statement that hybrids differ is not supportable: the analysis must say which metric supports which claim, in which tissue, and under which definition of a hybrid. One result is robust to every choice made here — both passes, with and without plate position, all three runs and both permutation schemes: the midgut on Jaccard (p ≤ 0.044). The caudal fin on weighted UniFrac is detected in all three runs and both schemes in pass 1 (p = 0.007–0.024), with or without plate position, and in no run in pass 2 (p = 0.073–0.235). A witness attributes this displacement to the definition of hybrids rather than to sample size: removing 22 randomly chosen individuals from the 158 that are not introgressed, twenty times, never restored the caudal signal in pass 2. At 500 reads the caudal signal is partial in pass 1 (three runs sequentially, p = 0.022–0.049; one of three with station fixed by blocks) and absent in pass 2, so it is not fully confirmed once the sample set retained at 3,000 reads is enlarged. The hindgut is the weakest tissue in pass 1 (only Jaccard is significant, in one run of three with station fixed by blocks) but not in pass 2, where with station fixed by blocks all four metrics detect it in all three runs; the witness does not resolve whether this difference reflects sample size or the definition of hybrids. The principal and sensitivity models differ in 7 of the 16 metric × tissue cells in each pass, of which 5 (pass 1) and 3 (pass 2) move between robust detection (three runs, both schemes), partial detection and none. Of the two witnesses that could have discriminated further, the separable sub-design detects category in 3 of 48 tests in pass 1 and 1 of 48 in pass 2 (with plate position), and Rosières, in pass 2, detects it in the gill on Jaccard and unweighted UniFrac in all three runs (p = 0.010–0.030); in pass 1 Rosières is not interpretable. Supplementary Table S8.</w:t>
+        <w:t>A preliminary variance partition was run to size these terms before the ecological analysis, not as a result of it, in both passes and on the four metrics. Fitted in both orderings without plate position, genotypic category accounts for a median of 1.7 % to 2.8 % of compositional variance across the 48 metric × tissue × run strata in pass 1 and 1.4 % to 3.0 % in pass 2, against a median of 19 % and 18 % for station (range across strata 14–36 % in pass 1 and 14–35 % in pass 2). No tissue is detected by all four metrics in all three runs under both permutation schemes, in either pass, with or without plate position, so a global statement that hybrids differ is not supportable: the analysis must say which metric supports which claim, in which tissue, and under which definition of a hybrid. One result is robust to every choice made here — both passes, with and without plate position, all three runs and both permutation schemes: the midgut on Jaccard (p ≤ 0.044). The caudal fin on weighted UniFrac is detected in all three runs and both schemes in pass 1 (p = 0.007–0.024), with or without plate position, and in no run in pass 2 (p = 0.073–0.235). A witness attributes this displacement to the definition of hybrids rather than to sample size: removing 22 randomly chosen individuals from the 158 that are not introgressed, twenty times, never restored the caudal signal in pass 2. At 500 reads the caudal signal is partial in pass 1 (three runs sequentially, p = 0.022–0.049; one of three with station fixed by blocks) and absent in pass 2, so it is not fully confirmed once the sample set retained at 3,000 reads is enlarged. The hindgut is the weakest tissue in pass 1 (only Jaccard is significant, in one run of three with station fixed by blocks) but not in pass 2, where with station fixed by blocks all four metrics detect it in all three runs; the witness does not resolve whether this difference reflects sample size or the definition of hybrids. The principal and sensitivity models differ in 7 of the 16 metric × tissue cells in each pass, of which 5 (pass 1) and 3 (pass 2) move between robust detection (three runs, both schemes), partial detection and none. Of the two witnesses that could have discriminated further, the separable sub-design detects category in 3 of 48 tests in pass 1 and 1 of 48 in pass 2 (with plate position), and Rosières, in pass 2, detects it in the gill on Jaccard and unweighted UniFrac in all three runs (p = 0.010–0.030); in pass 1 Rosières is not interpretable. Supplementary Table S9.</w:t>
       </w:r>
     </w:p>
     <w:p>
@@ -1160,7 +1186,7 @@
           <w:i w:val="0"/>
           <w:color w:val="1F4E79"/>
         </w:rPr>
-        <w:t>This bears directly on how the location results must be read, because PERMANOVA is sensitive to heterogeneous dispersion. In the caudal fin, dispersion is heterogeneous on Jaccard in all three runs in both passes, and on Bray-Curtis and unweighted UniFrac in all three runs in pass 1, so the location signals on those metrics cannot be separated from a dispersion effect. On weighted UniFrac dispersion is homogeneous in all three runs in both passes, and remains so within station. In pass 1, where the caudal-fin category effect on weighted UniFrac is significant in all three runs and both permutation schemes, that control could have failed and did not: the result is a difference in composition, not in variability. In pass 2 there is no location effect to interpret. One reservation is not resolved here: betadisper accepts no covariate, so the plate-position effect of section 8.8 is not adjusted for, and a category whose samples are more spread across plate columns could carry inflated dispersion. Supplementary Table S9 and Figure S3.</w:t>
+        <w:t>This bears directly on how the location results must be read, because PERMANOVA is sensitive to heterogeneous dispersion. In the caudal fin, dispersion is heterogeneous on Jaccard in all three runs in both passes, and on Bray-Curtis and unweighted UniFrac in all three runs in pass 1, so the location signals on those metrics cannot be separated from a dispersion effect. On weighted UniFrac dispersion is homogeneous in all three runs in both passes, and remains so within station. In pass 1, where the caudal-fin category effect on weighted UniFrac is significant in all three runs and both permutation schemes, that control could have failed and did not: the result is a difference in composition, not in variability. In pass 2 there is no location effect to interpret. One reservation is not resolved here: betadisper accepts no covariate, so the plate-position effect of section 8.8 is not adjusted for, and a category whose samples are more spread across plate columns could carry inflated dispersion. Supplementary Table S10 and Figure S3.</w:t>
       </w:r>
     </w:p>
     <w:p>
@@ -1179,13 +1205,21 @@
         </w:rPr>
         <w:t>All processing steps are scripted, version-controlled with git and logged (runs.log), with parameter choices justified in the script headers; metadata corrections are traced by explicit flags rather than applied silently.</w:t>
       </w:r>
+      <w:r>
+        <w:rPr>
+          <w:b w:val="0"/>
+          <w:i w:val="0"/>
+          <w:color w:val="1F4E79"/>
+        </w:rPr>
+        <w:t xml:space="preserve"> The code is publicly available at https://github.com/martinjfsupagro/microbiome-hybrid.</w:t>
+      </w:r>
     </w:p>
     <w:p>
       <w:r>
         <w:rPr>
           <w:i w:val="0"/>
         </w:rPr>
-        <w:t>Raw sequence data have been deposited in the European Nucleotide Archive (ENA) at EMBL-EBI under accession number PRJEB124417. The submission comprises 768 samples and 2,304 sequencing runs (4,608 FASTQ files, 11.7 GB). Each sample was processed through two independent one-step dual-index PCR library preparations: the first library was sequenced once (run label durance1) and the second was sequenced twice on separate flow cells (durance2, durance3). Runs are named accordingly, so that the nested replication structure described in §8.7 — sequencing replication nested within library preparation — can be recovered directly from the run titles. Sample metadata follow the GSC MIxS host-associated checklist (ERC000013) and report collection year, sampling-site coordinates, host species and sampled tissue. Extraction blanks, no-template PCR controls and mock community aliquots are included in the submission and are identified as such in the sample titles; the 25 empty wells used to quantify index hopping (§8.2) are likewise deposited. Per-run accessions, file names and MD5 checksums for all 4,608 files are given in Supplementary Table S3.</w:t>
+        <w:t>Raw sequence data have been deposited in the European Nucleotide Archive (ENA) at EMBL-EBI under accession number PRJEB124417. The submission comprises 768 samples and 2,304 sequencing runs (4,608 FASTQ files, 11.7 GB). Each sample was processed through two independent one-step dual-index PCR library preparations: the first library was sequenced once (run label durance1) and the second was sequenced twice on separate flow cells (durance2, durance3). Runs are named accordingly, so that the nested replication structure described in §8.7 — sequencing replication nested within library preparation — can be recovered directly from the run titles. Sample metadata follow the GSC MIxS host-associated checklist (ERC000013) and report collection year, sampling-site coordinates, host species and sampled tissue. Extraction blanks, no-template PCR controls and mock community aliquots are included in the submission and are identified as such in the sample titles; the 25 empty wells used to quantify index hopping (§8.2) are likewise deposited. Per-run accessions, file names and MD5 checksums for all 4,608 files are given in Supplementary Table S4.</w:t>
       </w:r>
     </w:p>
     <w:p>
@@ -1231,7 +1265,7 @@
           <w:color w:val="888888"/>
           <w:sz w:val="18"/>
         </w:rPr>
-        <w:t>[À COMPLÉTER : lien vers le dépôt de code (git) et, le cas échéant, DOI Zenodo de la version utilisée pour l'article.]</w:t>
+        <w:t>[À COMPLÉTER : DOI Zenodo de la version utilisée pour l'article, le cas échéant (question 2.7, non tranché). Dépôt GitHub public (JF, 2026-10-03) ; vérifier que le miroir public est à jour au moment de la soumission — le 2026-10-03 il s'arrêtait au commit du 2026-09-25.]</w:t>
       </w:r>
     </w:p>
     <w:p>
@@ -1249,7 +1283,7 @@
           <w:i w:val="0"/>
           <w:color w:val="1F4E79"/>
         </w:rPr>
-        <w:t>This work was funded by Électricité de France (EDF), through the contract that also funded Guivier et al. (2017) within the FACIES project and that financed the doctoral thesis of Arnaud Ungaro, with the support of the Fédération de l'Ain pour la pêche et la protection des milieux aquatiques.</w:t>
+        <w:t>This work was funded by Électricité de France (EDF) through an EDF–CNRS doctoral contract (AGDI 428481) financing the thesis of Arnaud Ungaro, the contract that also funded Guivier et al. (2017) within the FACIES project, with the support of the Fédération de l'Ain pour la pêche et la protection des milieux aquatiques.</w:t>
       </w:r>
     </w:p>
     <w:p>
@@ -1260,7 +1294,7 @@
           <w:color w:val="888888"/>
           <w:sz w:val="18"/>
         </w:rPr>
-        <w:t>[Financement : André, 2026-09-30 (même contrat qu'en 2017) et 2026-10-03 (EDF finance la thèse d'A. Ungaro ; intitulé de la Fédération identique aux remerciements de Guivier et al. 2017). Aucune référence de contrat n'est fournie : citer sans numéro ou demander la référence à EDF — décision de JF (question 2.13). Section Acknowledgements : à rédiger en fin de manuscrit (André, 2026-10-03).]</w:t>
+        <w:t>[Financement : référence du contrat « EDF-CNRS AGDI 428481 » (André, 2026-10-03). Le rattachement de ce contrat de thèse au projet FACIES de Guivier et al. (2017) combine deux réponses d'André (2026-09-30 et 2026-10-03) et n'est pas confirmé explicitement — à vérifier. Section Acknowledgements : à rédiger en fin de manuscrit (André, 2026-10-03).]</w:t>
       </w:r>
     </w:p>
     <w:sectPr>

</xml_diff>

<commit_message>
fix: regle D7 restauree au paragraphe 8.6 d Article.docx, mot pour mot depuis c2c1171 - elle avait ete perdue douze minutes apres son ecriture, au commit f2dd265 du 30/09, ou le paragraphe Statistical framework a ete repris d une version anterieure, alors que les registres la disaient presente. Paragraphe 8.8 : la plaque suit l ordre de traitement dans chaque campagne (rho 0,55-0,95, R32), et non a cinq stations sur neuf ; note grise sur le mecanisme (sejour en vivier), a reformuler apres D2. Paragraphe 8.9 : l affaiblissement caudal a 500 lectures tient a l ensemble d echantillons, pas a la profondeur (R29), temoin d effectif a 500 lectures 0/20. DECISIONS : entree du 03/10 et correction de l entree D7 du 30/09 ; A_FAIRE (redaction) et DONNEES (md5 de MS) mis a jour
</commit_message>
<xml_diff>
--- a/docs/manuscrit/Article.docx
+++ b/docs/manuscrit/Article.docx
@@ -751,7 +751,15 @@
           <w:i w:val="0"/>
           <w:color w:val="1F4E79"/>
         </w:rPr>
-        <w:t>Statistical framework. Community composition is analysed by PERMANOVA on the averaged dissimilarity matrices, stratified by tissue. Stratification is imposed by the design rather than chosen: 168 of the 180 fish occupy the same plate column across all four tissues, so plate position is not estimable in a pooled model carrying fish identity. Station, not site code, is the spatial unit, since two site codes each span two Suran stations that share no genotypic category. Sequencing run is nested within library preparation (§8.7). Every analysis of genotypic category is run in the two passes defined in §1. Plate column is not entered in the principal models, which report patterns co-varying with station and category without separating them; because its effect on composition is real (§8.8), every model testing category is also fitted with plate column as a covariate and reported as a sensitivity analysis. Because genotypic category, station and plate position are mutually entangled (SS8.9), no single sequential decomposition is reported: each model is fitted in both orderings and the interval between them is given, the ordering that serves category first bounding it from above and the ordering that serves it last from below. Permutations are constrained within station blocks where the question concerns a within-station contrast. Dispersion is tested separately with PERMDISP, since the transgressive hypothesis concerns the variability of hybrid microbiota and not only the position of its centroid, and since PERMANOVA is itself sensitive to heterogeneous dispersion. Every claim is reported per metric and per tissue; the choice of a differential-abundance method remains to be fixed.</w:t>
+        <w:t xml:space="preserve">Statistical framework. Community composition is analysed by PERMANOVA on the averaged dissimilarity matrices, stratified by tissue. Stratification is imposed by the design rather than chosen: 168 of the 180 fish occupy the same plate column across all four tissues, so plate position is not estimable in a pooled model carrying fish identity. Station, not site code, is the spatial unit, since two site codes each span two Suran stations that share no genotypic category. Sequencing run is nested within library preparation (§8.7). Every analysis of genotypic category is run in the two passes defined in §1. Plate column is not entered in the principal models, which report patterns co-varying with station and category without separating them; because its effect on composition is real (§8.8), every model testing category is also fitted with plate column as a covariate and reported as a sensitivity analysis. Because genotypic category, station and plate position are mutually entangled (SS8.9), no single sequential decomposition is reported: each model is fitted in both orderings and the interval between them is given, the ordering that serves category first bounding it from above and the ordering that serves it last from below. Permutations are constrained within station blocks where the question concerns a within-station contrast. Dispersion is tested separately with PERMDISP, since the transgressive hypothesis concerns the variability of hybrid microbiota and not only the position of its centroid, and since PERMANOVA is itself sensitive to heterogeneous dispersion. </w:t>
+      </w:r>
+      <w:r>
+        <w:rPr>
+          <w:b w:val="0"/>
+          <w:i w:val="0"/>
+          <w:color w:val="1F4E79"/>
+        </w:rPr>
+        <w:t>Every claim is reported per metric and per tissue. Four dissimilarities are carried throughout — Bray–Curtis, Jaccard, unweighted and weighted UniFrac — together with four alpha indices: observed richness, Shannon, inverse Simpson and Faith's phylogenetic diversity. Because resequencing one library recovers only 48 % of the ASVs present at 1–3 reads (§8.7), presence-based metrics are not treated as sufficient on their own: a result is stated as established only where at least one abundance-weighted and one presence-based metric support it, and is otherwise reported as metric-dependent with the supporting metrics named. Figures quoted in running text use Shannon for alpha diversity and Bray–Curtis for composition, both abundance-weighted, with the remaining metrics reported alongside rather than relegated. Weighting is not the operative axis for composition: Bray–Curtis, though abundance-weighted, patterns with the two presence-based dissimilarities on both category and dispersion, whereas weighted UniFrac stands apart, so the rule is applied metric by metric rather than by weighting class. The choice of a differential-abundance method remains to be fixed.</w:t>
       </w:r>
     </w:p>
     <w:p>
@@ -820,7 +828,23 @@
           <w:i w:val="0"/>
           <w:color w:val="1F4E79"/>
         </w:rPr>
-        <w:t>Individuals were numbered in the field in sampling order, which is not random with respect to genotype: the more fragile nases were processed first, except at one station (Saint-Just-d'Ardèche), and plates were loaded in numbering order at five of the nine stations (Spearman ρ between individual number and plate column, 0.87–0.95). Genotypic category and plate column are accordingly strongly associated (Cramér's V = 0.53 in pass 1 and 0.48 in pass 2, computed on individuals). Whether plate position affects composition was therefore tested rather than assumed. Rarefaction equalises depth, so a test on read depth would not have answered the question; PERMANOVA was run on composition, stratified by tissue, with permutations constrained within station blocks so that a detected column effect cannot be a station effect, and with each sequencing run analysed separately, plate position being identical across runs.</w:t>
+        <w:t xml:space="preserve">Individuals were numbered in the field in sampling order, which is not random with respect to genotype: the more fragile nases were processed first, except at one station (Saint-Just-d'Ardèche), </w:t>
+      </w:r>
+      <w:r>
+        <w:rPr>
+          <w:b w:val="0"/>
+          <w:i w:val="0"/>
+          <w:color w:val="1F4E79"/>
+        </w:rPr>
+        <w:t>and plates were loaded in processing order within every fishing campaign (Spearman ρ between individual number and plate column within campaigns, 0.55–0.95)</w:t>
+      </w:r>
+      <w:r>
+        <w:rPr>
+          <w:b w:val="0"/>
+          <w:i w:val="0"/>
+          <w:color w:val="1F4E79"/>
+        </w:rPr>
+        <w:t>. Genotypic category and plate column are accordingly strongly associated (Cramér's V = 0.53 in pass 1 and 0.48 in pass 2, computed on individuals). Whether plate position affects composition was therefore tested rather than assumed. Rarefaction equalises depth, so a test on read depth would not have answered the question; PERMANOVA was run on composition, stratified by tissue, with permutations constrained within station blocks so that a detected column effect cannot be a station effect, and with each sequencing run analysed separately, plate position being identical across runs.</w:t>
       </w:r>
     </w:p>
     <w:p>
@@ -883,6 +907,17 @@
           <w:color w:val="1F4E79"/>
         </w:rPr>
         <w:t>Three witnesses separate this effect from the biology it could be mistaken for. Within a single genotypic category, where a column effect cannot be a category effect, it persists but more weakly: among P. toxostoma alone in 17 of 24 strata in both passes (ratio 1.65), among C. nasus alone in 6 (pass 1) and 7 (pass 2) of 24 (ratio 1.63); hybrids alone are too few to be tested (two strata in pass 2, none in pass 1). No site code carries a single genotypic category, and the only single-category station (Chavannes-sur-Suran, 19 P. toxostoma) is too small for a separate witness; the within-category subsets therefore replace the single-category-station witness of an earlier analysis, which rested on fish left unresolved by morphology. In the symmetric ordering with category fitted first, column still contributes (21 and 22 of 24 strata). And the classic plate artefacts are absent: plate row is significant in 7 and 6 of 24 strata and plate edge in none, making the effect specific to column, as expected of an effect tracking processing order rather than evaporation or thermal gradients. The origin of the association between category and column is documented above, but the mechanism of the column effect itself is not identified: extraction order, reagent-batch drift within a plate, cross-contamination between adjacent wells and the delay between capture and dissection are not separated by these data, and no negative control isolates any of them. Plate column is therefore not entered in the principal models (§8.6), but every model testing category is also reported with plate column as a covariate, and the two versions are compared in §8.9.</w:t>
+      </w:r>
+    </w:p>
+    <w:p>
+      <w:pPr/>
+      <w:r>
+        <w:rPr>
+          <w:i/>
+          <w:color w:val="888888"/>
+          <w:sz w:val="18"/>
+        </w:rPr>
+        <w:t>[À reformuler après l'arbitrage D2 de JF : « the delay between capture and dissection » ne correspond plus au protocole. Les poissons sont gardés vivants en vivier jusqu'à la dissection, 4–6 min par poisson (André, 2026-10-03) ; le confondant est la durée de séjour en vivier, c'est-à-dire l'ordre de traitement. Dans chaque campagne, la colonne suit cet ordre, et le test du 2026-10-03 ne peut pas séparer les deux (RESULTATS R32, docs/recalcul/note_tests_2026-10-03.md).]</w:t>
       </w:r>
     </w:p>
     <w:p>
@@ -1042,7 +1077,20 @@
         </w:rPr>
       </w:r>
       <w:r>
-        <w:t>A preliminary variance partition was run to size these terms before the ecological analysis, not as a result of it, in both passes and on the four metrics. Fitted in both orderings without plate position, genotypic category accounts for a median of 1.7 % to 2.8 % of compositional variance across the 48 metric × tissue × run strata in pass 1 and 1.4 % to 3.0 % in pass 2, against a median of 19 % and 18 % for station (range across strata 14–36 % in pass 1 and 14–35 % in pass 2). No tissue is detected by all four metrics in all three runs under both permutation schemes, in either pass, with or without plate position, so a global statement that hybrids differ is not supportable: the analysis must say which metric supports which claim, in which tissue, and under which definition of a hybrid. One result is robust to every choice made here — both passes, with and without plate position, all three runs and both permutation schemes: the midgut on Jaccard (p ≤ 0.044). The caudal fin on weighted UniFrac is detected in all three runs and both schemes in pass 1 (p = 0.007–0.024), with or without plate position, and in no run in pass 2 (p = 0.073–0.235). A witness attributes this displacement to the definition of hybrids rather than to sample size: removing 22 randomly chosen individuals from the 158 that are not introgressed, twenty times, never restored the caudal signal in pass 2. At 500 reads the caudal signal is partial in pass 1 (three runs sequentially, p = 0.022–0.049; one of three with station fixed by blocks) and absent in pass 2, so it is not fully confirmed once the sample set retained at 3,000 reads is enlarged. The hindgut is the weakest tissue in pass 1 (only Jaccard is significant, in one run of three with station fixed by blocks) but not in pass 2, where with station fixed by blocks all four metrics detect it in all three runs; the witness does not resolve whether this difference reflects sample size or the definition of hybrids. The principal and sensitivity models differ in 7 of the 16 metric × tissue cells in each pass, of which 5 (pass 1) and 3 (pass 2) move between robust detection (three runs, both schemes), partial detection and none. Of the two witnesses that could have discriminated further, the separable sub-design detects category in 3 of 48 tests in pass 1 and 1 of 48 in pass 2 (with plate position), and Rosières, in pass 2, detects it in the gill on Jaccard and unweighted UniFrac in all three runs (p = 0.010–0.030); in pass 1 Rosières is not interpretable. Supplementary Table S9.</w:t>
+        <w:t xml:space="preserve">A preliminary variance partition was run to size these terms before the ecological analysis, not as a result of it, in both passes and on the four metrics. Fitted in both orderings without plate position, genotypic category accounts for a median of 1.7 % to 2.8 % of compositional variance across the 48 metric × tissue × run strata in pass 1 and 1.4 % to 3.0 % in pass 2, against a median of 19 % and 18 % for station (range across strata 14–36 % in pass 1 and 14–35 % in pass 2). No tissue is detected by all four metrics in all three runs under both permutation schemes, in either pass, with or without plate position, so a global statement that hybrids differ is not supportable: the analysis must say which metric supports which claim, in which tissue, and under which definition of a hybrid. One result is robust to every choice made here — both passes, with and without plate position, all three runs and both permutation schemes: the midgut on Jaccard (p ≤ 0.044). The caudal fin on weighted UniFrac is detected in all three runs and both schemes in pass 1 (p = 0.007–0.024), with or without plate position, and in no run in pass 2 (p = 0.073–0.235). A witness attributes this displacement to the definition of hybrids rather than to sample size: removing 22 randomly chosen individuals from the 158 that are not introgressed, twenty times, never restored the caudal signal in pass 2. At 500 reads the caudal signal is partial in pass 1 (three runs sequentially, p = 0.022–0.049; one of three with station fixed by blocks) and absent in pass 2, </w:t>
+      </w:r>
+      <w:r>
+        <w:rPr>
+          <w:i w:val="0"/>
+          <w:color w:val="1F4E79"/>
+        </w:rPr>
+        <w:t>an attenuation that is not an effect of depth: restricted to the samples retained at 3,000 reads, the 500-read matrices give the same result as at 3,000 reads (all three runs, both station-blocked schemes, p = 0.010–0.026), so the signal is diluted by the caudal-fin samples that pass the threshold only at 500 reads. As at 3,000 reads, none of twenty random removals of 22 non-introgressed individuals from pass 2 reproduced the pass-1 pattern at 500 reads.</w:t>
+      </w:r>
+      <w:r>
+        <w:rPr>
+          <w:i w:val="0"/>
+        </w:rPr>
+        <w:t xml:space="preserve"> The hindgut is the weakest tissue in pass 1 (only Jaccard is significant, in one run of three with station fixed by blocks) but not in pass 2, where with station fixed by blocks all four metrics detect it in all three runs; the witness does not resolve whether this difference reflects sample size or the definition of hybrids. The principal and sensitivity models differ in 7 of the 16 metric × tissue cells in each pass, of which 5 (pass 1) and 3 (pass 2) move between robust detection (three runs, both schemes), partial detection and none. Of the two witnesses that could have discriminated further, the separable sub-design detects category in 3 of 48 tests in pass 1 and 1 of 48 in pass 2 (with plate position), and Rosières, in pass 2, detects it in the gill on Jaccard and unweighted UniFrac in all three runs (p = 0.010–0.030); in pass 1 Rosières is not interpretable. Supplementary Table S9.</w:t>
       </w:r>
     </w:p>
     <w:p>

</xml_diff>

<commit_message>
docs: article restructure Animal Microbiome (Results, Discussion, Declarations, 51 references), figures 1-5, 4H (R33), PERMDISP corrige (R34), verification 59/59, cloture _etat
</commit_message>
<xml_diff>
--- a/docs/manuscrit/Article.docx
+++ b/docs/manuscrit/Article.docx
@@ -19,111 +19,139 @@
         <w:pStyle w:val="Title"/>
       </w:pPr>
       <w:r>
-        <w:t>Introduction</w:t>
+        <w:rPr>
+          <w:color w:val="1F4E79"/>
+        </w:rPr>
+        <w:t>Abstract</w:t>
       </w:r>
     </w:p>
     <w:p>
       <w:pPr/>
       <w:r>
         <w:rPr>
-          <w:i w:val="0"/>
-        </w:rPr>
-        <w:t>Animals and the microbial communities they harbour form composite biological units in which microbial composition contributes to host performance and to tolerance of environmental constraints (Bordenstein and Theis 2015). These associations are established largely by the sorting of microbial pools from the surrounding environment, a sorting that reflects host ecology and physiology — feeding behaviour, which selects among available resources, and the immune pathways underlying tolerance of or resistance to microbes (Shapira 2016; Shropshire and Bordenstein 2016; Adair and Douglas 2017). Environmental acquisition is particularly important in fish, which live in a medium favourable to bacterial growth, are continuously exposed to microbes at their epithelial barriers, and are mostly oviparous with limited maternal effects compared with mammals (Llewellyn et al. 2014); accordingly, surveys of wild populations report a predominant environmental component of variation in bacterial composition (Sevellec et al. 2014; Smith et al. 2015; Chiarello et al. 2018). Host genotype is nonetheless not without effect. A fourteen-year follow-up of wild baboons found microbiome phenotypes to be almost universally heritable, but with a typically low heritability that depends on context, and its authors concluded that large sample sizes are required to quantify it (Grieneisen et al. 2021); in stickleback, a host genetic influence on the gut microbiome became measurable once biological and technical components of variance had been decomposed beforehand (Small et al. 2019). If host ancestry shapes the fish microbiota, the expected effect is therefore small relative to the environmental one, and detecting it requires both substantial sample sizes and explicit control of the spatial and technical axes along which it could be mimicked.</w:t>
+          <w:b/>
+          <w:color w:val="1F4E79"/>
+        </w:rPr>
+        <w:t xml:space="preserve">Background: </w:t>
+      </w:r>
+      <w:r>
+        <w:rPr>
+          <w:color w:val="1F4E79"/>
+        </w:rPr>
+        <w:t>Hybridisation can reorganise host–microbe associations, but whether the microbiota of hybrids is intermediate between the parental species, dominated by one of them or transgressive has rarely been tested in natural hybrid zones, and never across several tissues of the same fish. We characterised the bacterial microbiota of the caudal fin, gill, midgut and hindgut of 180 nases (</w:t>
+      </w:r>
+      <w:r>
+        <w:rPr>
+          <w:i/>
+          <w:color w:val="1F4E79"/>
+        </w:rPr>
+        <w:t>Chondrostoma nasus</w:t>
+      </w:r>
+      <w:r>
+        <w:rPr>
+          <w:color w:val="1F4E79"/>
+        </w:rPr>
+        <w:t>), toxostomes (</w:t>
+      </w:r>
+      <w:r>
+        <w:rPr>
+          <w:i/>
+          <w:color w:val="1F4E79"/>
+        </w:rPr>
+        <w:t>Parachondrostoma toxostoma</w:t>
+      </w:r>
+      <w:r>
+        <w:rPr>
+          <w:color w:val="1F4E79"/>
+        </w:rPr>
+        <w:t>) and their hybrids sampled at nine stations of the Rhône drainage, with ancestry resolved by genotyping across 25 chromosomes and hybrids defined in two pre-declared ways.</w:t>
       </w:r>
     </w:p>
     <w:p>
       <w:pPr/>
       <w:r>
         <w:rPr>
-          <w:i w:val="0"/>
-        </w:rPr>
-        <w:t>Secondary contact zones make host ancestry a naturally occurring and naturally replicated variable, and they are where the question of a genomic contribution to microbiota assembly is posed most directly. Introgressive hybridisation may disrupt co-adapted gene complexes and thereby alter close host–microbe interactions (Wang et al. 2015); conversely, hybridisation is a source of genomic diversity and adaptive novelty involved in speciation and in range expansion into enlarged ecological niches (Pfennig et al. 2016; Schumer et al. 2018), and this diversity may extend to the microbiota through the acquisition of new microbial taxa. Three outcomes are usually contrasted: an intermediate or additive microbiota, varying monotonically with ancestry; dominance, in which hybrids resemble one parental species; and a transgressive microbiota, lying outside the range of both parents. Camper et al. (2024) gave this comparison an explicit framework for host-associated microbiomes, in which four idealised models of taxon membership — Union, Intersection, Gain and Loss — are never realised in pure form, so that the index measures the relative weight of each and the four weights sum to one. The Gain–Loss axis of that framework provides an operational definition of a transgressive microbiota, one that does not presuppose a cost to the host. The distinction matters, because the equation between transgression and dysbiosis has been challenged: on an ecologically successful hybrid lizard, Camper et al. (2025) report widespread transgressive segregation correlated with a restructuring of niche, and argue that the negative conclusions of the literature rest disproportionately on hybrids of low adaptive value. We follow the framework's own statement of scope, that the index describes a pattern and not a process, in the same sense as a beta-diversity measure.</w:t>
+          <w:b/>
+          <w:color w:val="1F4E79"/>
+        </w:rPr>
+        <w:t xml:space="preserve">Results: </w:t>
+      </w:r>
+      <w:r>
+        <w:rPr>
+          <w:color w:val="1F4E79"/>
+        </w:rPr>
+        <w:t xml:space="preserve">Sequencing of the V4 region of the 16S rRNA gene, replicated across two library preparations and three runs, contributed negligible technical variance. Station explained about a fifth of compositional variance and genotypic category 1.4–3.0 %. No transgressive pattern was found: hybrids were transgressive in none of 32 alpha-diversity tests, were more dispersed than both parents no more often than expected by chance, and no transgressive reading of the four-dimensional (4H) index survived the pre-declared robustness rule; hybrids preferentially retained the core taxa shared by both parents in every compartment. Departures of hybrids from their parents were specific to compartments and metrics: the midgut on Jaccard distances was detected under every analytical choice, whereas a caudal-fin signal on weighted UniFrac was present only when near-parental introgressed individuals were excluded from the hybrid class. In alpha diversity, intermediate hybrids resembled </w:t>
+      </w:r>
+      <w:r>
+        <w:rPr>
+          <w:i/>
+          <w:color w:val="1F4E79"/>
+        </w:rPr>
+        <w:t>C. nasus</w:t>
+      </w:r>
+      <w:r>
+        <w:rPr>
+          <w:color w:val="1F4E79"/>
+        </w:rPr>
+        <w:t xml:space="preserve"> in the caudal fin. Plate position affected composition and followed the order in which fish were processed, from which it cannot be separated in this design.</w:t>
       </w:r>
     </w:p>
     <w:p>
       <w:pPr/>
       <w:r>
         <w:rPr>
-          <w:i w:val="0"/>
-        </w:rPr>
-        <w:t xml:space="preserve">What is known of hybrid microbiota in fish comes almost entirely from controlled crosses. Reciprocal hybrids of bream and culter, whose parents have contrasting feeding habits, show a strong correspondence between genotype and intestinal characteristics (Li et al. 2018); in intrageneric </w:t>
-      </w:r>
-      <w:r>
-        <w:rPr>
-          <w:i/>
-        </w:rPr>
-        <w:t>Takifugu</w:t>
-      </w:r>
-      <w:r>
-        <w:rPr>
-          <w:i w:val="0"/>
-        </w:rPr>
-        <w:t xml:space="preserve"> hybrids, host hybridisation outweighs cohabitation in shaping the gut microbiota (Jin et al. 2023); reciprocal hybrids of koi and goldfish resemble one parent rather than the midpoint of the two (Wang et al. 2022); and whitefish species pairs with their reciprocal hybrids have been compared in natural and controlled environments (Sevellec et al. 2019). This body of work has been reviewed recently (Cui et al. 2022). Studies of natural hybrid zones in other vertebrates, for their part, do not converge. Host ancestry predominates in </w:t>
-      </w:r>
-      <w:r>
-        <w:rPr>
-          <w:i/>
-        </w:rPr>
-        <w:t>Neotoma</w:t>
-      </w:r>
-      <w:r>
-        <w:rPr>
-          <w:i w:val="0"/>
-        </w:rPr>
-        <w:t xml:space="preserve"> woodrats, where habitat determines diet but genotype determines the gut microbiota (Nielsen et al. 2022), and in hybridising brown lemurs along a 180 km transect (Donohue et al. 2025). The opposite conclusion is reached in baboons spanning a hybrid zone, where site soil properties rather than genetic ancestry, relatedness or between-population genetic distance explain the gut microbiota (Grieneisen et al. 2019), and in wild house mice, where an apparent effect of admixture becomes weak once spatial autocorrelation is taken into account, on two replicates of the same hybrid zone (Čížková et al. 2023). In hybridising chickadees moved to a common environment, the change of environment affected microbiota richness but not community composition, while a corresponding effect of ancestry on composition was not statistically supported (Russell et al. 2026) — a result that argues for reporting alpha and beta diversity separately rather than for a directed expectation on either. Across this literature, no study combines a natural hybrid zone in fish, host ancestry quantified by genotyping rather than assigned by cross class, and several tissue compartments characterised in the same individual.</w:t>
+          <w:b/>
+          <w:color w:val="1F4E79"/>
+        </w:rPr>
+        <w:t xml:space="preserve">Conclusions: </w:t>
+      </w:r>
+      <w:r>
+        <w:rPr>
+          <w:color w:val="1F4E79"/>
+        </w:rPr>
+        <w:t>In this mosaic hybrid zone the microbiota of hybrids lies within the parental range, and its departures from either parent are small relative to spatial variation, specific to compartments and metrics, and dependent on how hybrids are defined. The data give no support to a disrupted, transgressive hybrid microbiota.</w:t>
       </w:r>
     </w:p>
     <w:p>
       <w:pPr/>
       <w:r>
         <w:rPr>
-          <w:i w:val="0"/>
-        </w:rPr>
-        <w:t xml:space="preserve">The nase </w:t>
+          <w:b/>
+          <w:color w:val="1F4E79"/>
+        </w:rPr>
+        <w:t xml:space="preserve">Keywords: </w:t>
+      </w:r>
+      <w:r>
+        <w:rPr>
+          <w:color w:val="1F4E79"/>
+        </w:rPr>
+        <w:t xml:space="preserve">hybridisation; hybrid zone; host-associated microbiota; 16S rRNA gene; Cyprinidae; </w:t>
       </w:r>
       <w:r>
         <w:rPr>
           <w:i/>
+          <w:color w:val="1F4E79"/>
         </w:rPr>
         <w:t>Chondrostoma nasus</w:t>
       </w:r>
       <w:r>
         <w:rPr>
-          <w:i w:val="0"/>
-        </w:rPr>
-        <w:t xml:space="preserve"> and the South-west European nase, or toxostome, </w:t>
+          <w:color w:val="1F4E79"/>
+        </w:rPr>
+        <w:t xml:space="preserve">; </w:t>
       </w:r>
       <w:r>
         <w:rPr>
           <w:i/>
+          <w:color w:val="1F4E79"/>
         </w:rPr>
         <w:t>Parachondrostoma toxostoma</w:t>
       </w:r>
       <w:r>
         <w:rPr>
-          <w:i w:val="0"/>
-        </w:rPr>
-        <w:t xml:space="preserve"> offer that combination. The toxostome is endemic to southern France, where it is declining and is a species of conservation concern; the nase originates from central Europe and entered the Rhône basin following the construction of navigable connections across Europe during the last century (Gilles 1998), so that the two distributions have partially overlapped for about a hundred years. Hybridisation has been detected in the patchily distributed sympatric areas of the basin, with an incidence unrelated to habitat characteristics (Costedoat et al. 2005; Sinama et al. 2013; Guivier et al. 2019) — the configuration of a mosaic hybrid zone (Seehausen et al. 2008). Guivier et al. (2017) characterised the microbiota of four tissue compartments of the two species in strict parapatry on a single river, and found the tissue compartment to be the first factor of variation, with a marked contrast between externally and internally exposed tissues and with proportions of species-specific taxa that were asymmetric between compartments: the nase carried many specific taxa on its external tissues, the toxostome in its intestine. On that basis the authors proposed that introgressive hybridisation might affect the microbiota differently depending on the tissue considered, and closed by announcing the exploration of hybrid microbiota rearrangement, which their sample of sixteen fish at two stations could not support. The present study is that exploration, on 180 fish sampled at nine stations over six watercourses of the Rhône drainage in two years, with host ancestry resolved by genotyping across 25 chromosomes rather than by morphology, and with the same four compartments — caudal fin, gill, midgut and hindgut — characterised in each individual.</w:t>
-      </w:r>
-    </w:p>
-    <w:p>
-      <w:pPr/>
-      <w:r>
-        <w:rPr>
-          <w:i w:val="0"/>
-        </w:rPr>
-        <w:t>We ask whether the microbiota of individuals of mixed ancestry is intermediate between the two parental species, dominated by one of them, or displaced outside their range, and whether the answer is the same in all four compartments. Three points of design are stated at the outset rather than introduced with the results. First, because genotyping across 25 chromosomes separates an intermediate genome from a near-parental genome introgressed on one or a few chromosomes — a single one in 17 of the 22 such individuals —, what counts as a hybrid is a decision and not a given: the contrast is therefore run twice, on intermediate genomes alone and on the wider set including introgressed near-parental individuals, with both passes declared in advance, and the displacement of the result between them measures the contribution of the introgressed individuals, a random-removal control separating that contribution from the accompanying change in sample size. Second, the comparison is reported both as a category contrast in a model spanning all stations — the only admissible form given the low heritability expected from Grieneisen et al. (2021) — and, as a complementary characterisation, as the four-dimensional index of Camper et al. (2024), whose core threshold and taxonomic rank are fixed a priori and whose sensitivity is reported, since on a natural hybrid system these choices move the index more than sample size or sequencing depth do. Third, genotypic category is entangled with the spatial axis in this design, station being by far the strongest correlate of composition, and field processing order propagated to plate position, whose effect on composition is real; results on category are consequently reported bracketed between the two sequential orderings rather than as a single decomposition, without plate position in the principal models and with it as a covariate in a sensitivity analysis, and read as patterns co-varying with station and with category rather than as effects of ancestry alone. Two stations of the same river, 25 km apart and separated by a weir passable only downstream, were sampled in two successive years and provide an internal reference in which the two parental species occupy separate stations of one river: C. nasus with two intermediate hybrids at one (14 individuals), P. toxostoma alone at the other (19). Following Guivier et al. (2017), we expect any hybrid signal to be most pronounced in the digestive compartments, where the two parental species diverge most, rather than uniformly across the four tissues.</w:t>
-      </w:r>
-    </w:p>
-    <w:p>
-      <w:pPr/>
-      <w:r>
-        <w:rPr>
-          <w:i/>
-          <w:color w:val="888888"/>
-          <w:sz w:val="18"/>
-        </w:rPr>
-        <w:t>[Introduction, draft 1 — points à trancher. (i) Titre provisoire inséré : sous-titre du supplément (JF, 2026-10-03) ; titre définitif en fin d'écriture. Cible Animal Microbiome (JF, 2026-10-03) : la structure Background / Methods / Results / Discussion / Conclusions et la section Declarations restent à mettre en place. (ii) Les références Wang et al. (2015) et Sevellec et al. (2014) proviennent de la liste du manuscrit d'origine et n'ont pas été relues en texte intégral : vérifier leur pertinence à l'endroit où elles sont placées. (iii) Deux corrections à propager dans docs/biblio/microbiome_hybrid_all_refs.bib : Small et al. est daté 2018 alors que Crossref donne 2019 pour 10.1128/msystems.00331-19 ; et le corégone y figure comme préprint (10.1101/312231) alors que la version publiée existe — Sevellec et al. 2019, Ecology and Evolution, 10.1002/ece3.5676, qui est la version citée ici. (iv) Les deux passes de définition de l'hybride et le traitement de la position de plaque (D2) sont alignés sur le §1 et le §8.6 (2026-09-25). Les paramètres a priori du 4H sont fixés par la décision D5 du 2026-09-25 : ρ = 0,5 au rang du genre, sensibilité rapportée sur ρ ∈ {0,3 ; 0,5 ; 0,7}, ϑ = ε = 0. Ce qui manque est leur description au §8.6, à écrire en même temps que le calcul 4H. (v) Vérifié sur genotypes_verifies_sept_180.csv, colonne n_chromosomes_introgresses : parmi les 22 quasi-purs, 17 sont introgressés sur un seul chromosome, 4 sur deux et 1 sur six. Le §1 et l'introduction portent désormais ces chiffres.]</w:t>
+          <w:color w:val="1F4E79"/>
+        </w:rPr>
+        <w:t>; transgressive segregation; 4H index; tissue compartment</w:t>
       </w:r>
     </w:p>
     <w:p>
@@ -132,9 +160,133 @@
       </w:pPr>
       <w:r>
         <w:rPr>
+          <w:color w:val="1F4E79"/>
+        </w:rPr>
+        <w:t>Background</w:t>
+      </w:r>
+    </w:p>
+    <w:p>
+      <w:pPr/>
+      <w:r>
+        <w:rPr>
           <w:i w:val="0"/>
         </w:rPr>
-        <w:t>Materials and Methods</w:t>
+        <w:t>Animals and the microbial communities they harbour form composite biological units in which microbial composition contributes to host performance and to tolerance of environmental constraints [1]. These associations are established largely by the sorting of microbial pools from the surrounding environment, a sorting that reflects host ecology and physiology — feeding behaviour, which selects among available resources, and the immune pathways underlying tolerance of or resistance to microbes [2–4]. Environmental acquisition is particularly important in fish, which live in a medium favourable to bacterial growth, are continuously exposed to microbes at their epithelial barriers, and are mostly oviparous with limited maternal effects compared with mammals [5]; accordingly, surveys of wild populations report a predominant environmental component of variation in bacterial composition [6–8]. Host genotype is nonetheless not without effect. A fourteen-year follow-up of wild baboons found microbiome phenotypes to be almost universally heritable, but with a typically low heritability that depends on context, and its authors concluded that large sample sizes are required to quantify it [9]; in stickleback, a host genetic influence on the gut microbiome became measurable once biological and technical components of variance had been decomposed beforehand [10]. If host ancestry shapes the fish microbiota, the expected effect is therefore small relative to the environmental one, and detecting it requires both substantial sample sizes and explicit control of the spatial and technical axes along which it could be mimicked.</w:t>
+      </w:r>
+    </w:p>
+    <w:p>
+      <w:pPr/>
+      <w:r>
+        <w:rPr>
+          <w:i w:val="0"/>
+        </w:rPr>
+        <w:t>Secondary contact zones make host ancestry a naturally occurring and naturally replicated variable, and they are where the question of a genomic contribution to microbiota assembly is posed most directly. Introgressive hybridisation may disrupt co-adapted gene complexes and thereby alter close host–microbe interactions [11]; conversely, hybridisation is a source of genomic diversity and adaptive novelty involved in speciation and in range expansion into enlarged ecological niches [12, 13], and this diversity may extend to the microbiota through the acquisition of new microbial taxa. Three outcomes are usually contrasted: an intermediate or additive microbiota, varying monotonically with ancestry; dominance, in which hybrids resemble one parental species; and a transgressive microbiota, lying outside the range of both parents. Camper et al. [14] gave this comparison an explicit framework for host-associated microbiomes, in which four idealised models of taxon membership — Union, Intersection, Gain and Loss — are never realised in pure form, so that the index measures the relative weight of each and the four weights sum to one. The Gain–Loss axis of that framework provides an operational definition of a transgressive microbiota, one that does not presuppose a cost to the host. The distinction matters, because the equation between transgression and dysbiosis has been challenged: on an ecologically successful hybrid lizard, Camper et al. [15] report widespread transgressive segregation correlated with a restructuring of niche, and argue that the negative conclusions of the literature rest disproportionately on hybrids of low adaptive value. We follow the framework's own statement of scope, that the index describes a pattern and not a process, in the same sense as a beta-diversity measure.</w:t>
+      </w:r>
+    </w:p>
+    <w:p>
+      <w:pPr/>
+      <w:r>
+        <w:rPr>
+          <w:i w:val="0"/>
+        </w:rPr>
+        <w:t xml:space="preserve">What is known of hybrid microbiota in fish comes almost entirely from controlled crosses. Reciprocal hybrids of bream and culter, whose parents have contrasting feeding habits, show a strong correspondence between genotype and intestinal characteristics [16]; in intrageneric </w:t>
+      </w:r>
+      <w:r>
+        <w:rPr>
+          <w:i/>
+        </w:rPr>
+        <w:t>Takifugu</w:t>
+      </w:r>
+      <w:r>
+        <w:rPr>
+          <w:i w:val="0"/>
+        </w:rPr>
+        <w:t xml:space="preserve"> hybrids, host hybridisation outweighs cohabitation in shaping the gut microbiota [17]; reciprocal hybrids of koi and goldfish resemble one parent rather than the midpoint of the two [18]; and whitefish species pairs with their reciprocal hybrids have been compared in natural and controlled environments [19]. This body of work has been reviewed recently [20]. Studies of natural hybrid zones in other vertebrates, for their part, do not converge. Host ancestry predominates in </w:t>
+      </w:r>
+      <w:r>
+        <w:rPr>
+          <w:i/>
+        </w:rPr>
+        <w:t>Neotoma</w:t>
+      </w:r>
+      <w:r>
+        <w:rPr>
+          <w:i w:val="0"/>
+        </w:rPr>
+        <w:t xml:space="preserve"> woodrats, where habitat determines diet but genotype determines the gut microbiota [21], and in hybridising brown lemurs along a 180 km transect [22]. The opposite conclusion is reached in baboons spanning a hybrid zone, where site soil properties rather than genetic ancestry, relatedness or between-population genetic distance explain the gut microbiota [23], and in wild house mice, where an apparent effect of admixture becomes weak once spatial autocorrelation is taken into account, on two replicates of the same hybrid zone [24]. In hybridising chickadees moved to a common environment, the change of environment affected microbiota richness but not community composition, while a corresponding effect of ancestry on composition was not statistically supported [25] — a result that argues for reporting alpha and beta diversity separately rather than for a directed expectation on either. Across this literature, no study combines a natural hybrid zone in fish, host ancestry quantified by genotyping rather than assigned by cross class, and several tissue compartments characterised in the same individual.</w:t>
+      </w:r>
+    </w:p>
+    <w:p>
+      <w:pPr/>
+      <w:r>
+        <w:rPr>
+          <w:i w:val="0"/>
+        </w:rPr>
+        <w:t xml:space="preserve">The nase </w:t>
+      </w:r>
+      <w:r>
+        <w:rPr>
+          <w:i/>
+        </w:rPr>
+        <w:t>Chondrostoma nasus</w:t>
+      </w:r>
+      <w:r>
+        <w:rPr>
+          <w:i w:val="0"/>
+        </w:rPr>
+        <w:t xml:space="preserve"> and the South-west European nase, or toxostome, </w:t>
+      </w:r>
+      <w:r>
+        <w:rPr>
+          <w:i/>
+        </w:rPr>
+        <w:t>Parachondrostoma toxostoma</w:t>
+      </w:r>
+      <w:r>
+        <w:rPr>
+          <w:i w:val="0"/>
+        </w:rPr>
+        <w:t xml:space="preserve"> offer that combination. The toxostome is endemic to southern France, where it is declining and is a species of conservation concern; the nase originates from central Europe and entered the Rhône basin following the construction of navigable connections across Europe during the last century [26], so that the two distributions have partially overlapped for about a hundred years. Hybridisation has been detected in the patchily distributed sympatric areas of the basin, with an incidence unrelated to habitat characteristics [27–29] — the configuration of a mosaic hybrid zone [30]. Guivier et al. [31] characterised the microbiota of four tissue compartments of the two species in strict parapatry on a single river, and found the tissue compartment to be the first factor of variation, with a marked contrast between externally and internally exposed tissues and with proportions of species-specific taxa that were asymmetric between compartments: the nase carried many specific taxa on its external tissues, the toxostome in its intestine. On that basis the authors proposed that introgressive hybridisation might affect the microbiota differently depending on the tissue considered, and closed by announcing the exploration of hybrid microbiota rearrangement, which their sample of sixteen fish at two stations could not support. The present study is that exploration, on 180 fish sampled at nine stations over six watercourses of the Rhône drainage in two years, with host ancestry resolved by genotyping across 25 chromosomes rather than by morphology, and with the same four compartments — caudal fin, gill, midgut and hindgut — characterised in each individual.</w:t>
+      </w:r>
+    </w:p>
+    <w:p>
+      <w:pPr/>
+      <w:r>
+        <w:rPr>
+          <w:i w:val="0"/>
+        </w:rPr>
+        <w:t>We ask whether the microbiota of individuals of mixed ancestry is intermediate between the two parental species, dominated by one of them, or displaced outside their range, and whether the answer is the same in all four compartments. Three points of design are stated at the outset rather than introduced with the results. First, because genotyping across 25 chromosomes separates an intermediate genome from a near-parental genome introgressed on one or a few chromosomes — a single one in 17 of the 22 such individuals —, what counts as a hybrid is a decision and not a given: the contrast is therefore run twice, on intermediate genomes alone and on the wider set including introgressed near-parental individuals, with both passes declared in advance, and the displacement of the result between them measures the contribution of the introgressed individuals, a random-removal control separating that contribution from the accompanying change in sample size. Second, the comparison is reported both as a category contrast in a model spanning all stations — the only admissible form given the low heritability expected from Grieneisen et al. [9] — and, as a complementary characterisation, as the four-dimensional index of Camper et al. [14], whose core threshold and taxonomic rank are fixed a priori and whose sensitivity is reported, since on a natural hybrid system these choices move the index more than sample size or sequencing depth do. Third, genotypic category is entangled with the spatial axis in this design, station being by far the strongest correlate of composition, and field processing order propagated to plate position, whose effect on composition is real; results on category are consequently reported bracketed between the two sequential orderings rather than as a single decomposition, without plate position in the principal models and with it as a covariate in a sensitivity analysis, and read as patterns co-varying with station and with category rather than as effects of ancestry alone. Two stations of the same river, 25 km apart and separated by a weir passable only downstream, were sampled in two successive years and provide an internal reference in which the two parental species occupy separate stations of one river: C. nasus with two intermediate hybrids at one (14 individuals), P. toxostoma alone at the other (19). Following Guivier et al. [31], we expect any hybrid signal to be most pronounced in the digestive compartments, where the two parental species diverge most, rather than uniformly across the four tissues.</w:t>
+      </w:r>
+    </w:p>
+    <w:p>
+      <w:pPr/>
+      <w:r>
+        <w:rPr>
+          <w:i/>
+          <w:color w:val="888888"/>
+          <w:sz w:val="18"/>
+        </w:rPr>
+        <w:t>[Introduction, draft 1 — points à trancher. (i) Titre provisoire inséré : sous-titre du supplément (JF, 2026-10-03) ; titre définitif en fin d'écriture. Cible Animal Microbiome (JF, 2026-10-03) : la structure Background / Methods / Results / Discussion / Conclusions et la section Declarations restent à mettre en place. (ii) Les références Wang et al. (2015) et Sevellec et al. (2014) proviennent de la liste du manuscrit d'origine et n'ont pas été relues en texte intégral : vérifier leur pertinence à l'endroit où elles sont placées. (iii) Deux corrections à propager dans docs/biblio/microbiome_hybrid_all_refs.bib : Small et al. est daté 2018 alors que Crossref donne 2019 pour 10.1128/msystems.00331-19 ; et le corégone y figure comme préprint (10.1101/312231) alors que la version publiée existe — Sevellec et al. 2019, Ecology and Evolution, 10.1002/ece3.5676, qui est la version citée ici. (iv) Les deux passes de définition de l'hybride et le traitement de la position de plaque (D2) sont alignés sur le §1 et le §8.6 (2026-09-25). Les paramètres a priori du 4H sont fixés par la décision D5 du 2026-09-25 : ρ = 0,5 au rang du genre, sensibilité rapportée sur ρ ∈ {0,3 ; 0,5 ; 0,7}, ϑ = ε = 0. Ce qui manque est leur description au §8.6, à écrire en même temps que le calcul 4H. (v) Vérifié sur genotypes_verifies_sept_180.csv, colonne n_chromosomes_introgresses : parmi les 22 quasi-purs, 17 sont introgressés sur un seul chromosome, 4 sur deux et 1 sur six. Le §1 et l'introduction portent désormais ces chiffres.]</w:t>
+      </w:r>
+      <w:r>
+        <w:rPr>
+          <w:i/>
+          <w:color w:val="888888"/>
+          <w:sz w:val="18"/>
+        </w:rPr>
+        <w:t xml:space="preserve"> [2026-10-03, soir : structure Animal Microbiome en place (Abstract, Background, Methods, Results, Discussion, Conclusions, Declarations, References numérotées, légendes) ; méthodes 4H au §8.11.]</w:t>
+      </w:r>
+    </w:p>
+    <w:p>
+      <w:pPr>
+        <w:pStyle w:val="Title"/>
+      </w:pPr>
+      <w:r>
+        <w:rPr>
+          <w:i w:val="0"/>
+          <w:color w:val="1F4E79"/>
+        </w:rPr>
+        <w:t>Methods</w:t>
       </w:r>
     </w:p>
     <w:p>
@@ -327,14 +479,14 @@
           <w:i w:val="0"/>
           <w:color w:val="1F4E79"/>
         </w:rPr>
-        <w:t>Guivier et al. (2017)</w:t>
+        <w:t>Guivier et al. [31]</w:t>
       </w:r>
       <w:r>
         <w:rPr>
           <w:b w:val="0"/>
           <w:i w:val="0"/>
         </w:rPr>
-        <w:t>. A 251 bp fragment of the V4 region of the bacterial 16S rRNA gene was amplified using the dual-index method of Kozich et al. (2013), with forward and reverse primers carrying an 8 bp index and Illumina adapters (Caporaso primers 515F GTGCCAGCMGCCGCGGTAA / 806R GGACTACHVGGGTWTCTAAT). DNA amplification, purification and pooling of PCR products followed Galan et al. (2016). The final library was quantified with the Kapa quantification kit (Kapa Biosystems) and loaded on an Illumina MiSeq flow cell with reagent kit v3 (600 cycles), run as 2 × 251 bp paired-end reads with two 8 bp index reads (518 of the 600 cycles).</w:t>
+        <w:t>. A 251 bp fragment of the V4 region of the bacterial 16S rRNA gene was amplified using the dual-index method of Kozich et al. [32], with forward and reverse primers carrying an 8 bp index and Illumina adapters (Caporaso primers 515F GTGCCAGCMGCCGCGGTAA / 806R GGACTACHVGGGTWTCTAAT). DNA amplification, purification and pooling of PCR products followed Galan et al. [33]. The final library was quantified with the Kapa quantification kit (Kapa Biosystems) and loaded on an Illumina MiSeq flow cell with reagent kit v3 (600 cycles), run as 2 × 251 bp paired-end reads with two 8 bp index reads (518 of the 600 cycles).</w:t>
       </w:r>
     </w:p>
     <w:p>
@@ -343,7 +495,7 @@
           <w:b w:val="0"/>
           <w:i w:val="0"/>
         </w:rPr>
-        <w:t>For the present study the 768 samples were processed through two independent library preparations, each using the one-step dual-index PCR of Kozich et al. (2013), in which the indices are incorporated during amplification. The first amplicon library was sequenced once (run durance1); the second, prepared from an independent PCR of the same samples, was sequenced twice on separate flow cells (runs durance2 and durance3). The same plate layout and the same set of 768 index combinations were used for both preparations, but the assignment of index pairs to wells differs between them: relative to durance1, the i7 index differs for 384 of the 768 libraries and the i5 index for 576, whereas durance2 and durance3 carry identical index pairs throughout (Supplementary Data, Index assignment). A distinct index assignment is a direct consequence of the one-step protocol, in which re-indexing an existing amplicon pool is not possible. Each biological sample is therefore represented three times, but with a nested rather than a flat replication structure: two levels of library preparation, and two sequencing runs within the second library. This design separates the variability contributed by library preparation from that contributed by sequencing alone, and neither is confounded with any biological factor.</w:t>
+        <w:t>For the present study the 768 samples were processed through two independent library preparations, each using the one-step dual-index PCR of Kozich et al. [32], in which the indices are incorporated during amplification. The first amplicon library was sequenced once (run durance1); the second, prepared from an independent PCR of the same samples, was sequenced twice on separate flow cells (runs durance2 and durance3). The same plate layout and the same set of 768 index combinations were used for both preparations, but the assignment of index pairs to wells differs between them: relative to durance1, the i7 index differs for 384 of the 768 libraries and the i5 index for 576, whereas durance2 and durance3 carry identical index pairs throughout (Supplementary Data, Index assignment). A distinct index assignment is a direct consequence of the one-step protocol, in which re-indexing an existing amplicon pool is not possible. Each biological sample is therefore represented three times, but with a nested rather than a flat replication structure: two levels of library preparation, and two sequencing runs within the second library. This design separates the variability contributed by library preparation from that contributed by sequencing alone, and neither is confounded with any biological factor.</w:t>
       </w:r>
     </w:p>
     <w:p>
@@ -352,7 +504,7 @@
           <w:i w:val="0"/>
           <w:color w:val="1F4E79"/>
         </w:rPr>
-        <w:t>Libraries were sequenced on an Illumina MiSeq on 10 July 2017 (durance1), 5 October 2017 (durance2) and 3 November 2017 (durance3), with a 10 % PhiX spike-in. PCR conditions, purification and pooling followed Galan et al. (2016).</w:t>
+        <w:t>Libraries were sequenced on an Illumina MiSeq on 10 July 2017 (durance1), 5 October 2017 (durance2) and 3 November 2017 (durance3), with a 10 % PhiX spike-in. PCR conditions, purification and pooling followed Galan et al. [33].</w:t>
       </w:r>
       <w:r>
         <w:t xml:space="preserve"> Run labels, flow cells, dates and the mapping of runs to library preparations are given in Supplementary Table S5.</w:t>
@@ -401,7 +553,52 @@
           <w:b w:val="0"/>
           <w:i w:val="0"/>
         </w:rPr>
-        <w:t>Reads were processed with a custom, version-controlled pipeline (git-tracked; each parameter justified in the script headers). The three runs were processed separately through denoising and merged thereafter. Software versions: cutadapt 5.0; R 4.5.3 with DADA2 1.38.0; SILVA reference v138.2 (DADA2 formatted, Zenodo 14169026); BLAST+ 2.13.0; FastQC and MultiQC for quality control. The 16S V4 primers, being also the sequencing primers (Schloss dual-index protocol), are not present in the reads; no 5′ primer trimming was therefore applied.</w:t>
+        <w:t xml:space="preserve">Reads were processed with a custom, version-controlled pipeline (git-tracked; each parameter justified in the script headers). The three runs were processed separately through denoising and merged thereafter. Software versions: </w:t>
+      </w:r>
+      <w:r>
+        <w:rPr>
+          <w:b w:val="0"/>
+          <w:i w:val="0"/>
+          <w:color w:val="1F4E79"/>
+        </w:rPr>
+        <w:t>cutadapt 5.0 [34];</w:t>
+      </w:r>
+      <w:r>
+        <w:rPr>
+          <w:b w:val="0"/>
+          <w:i w:val="0"/>
+        </w:rPr>
+        <w:t xml:space="preserve"> R 4.5.3 with </w:t>
+      </w:r>
+      <w:r>
+        <w:rPr>
+          <w:b w:val="0"/>
+          <w:i w:val="0"/>
+          <w:color w:val="1F4E79"/>
+        </w:rPr>
+        <w:t>DADA2 1.38.0 [35];</w:t>
+      </w:r>
+      <w:r>
+        <w:rPr>
+          <w:b w:val="0"/>
+          <w:i w:val="0"/>
+        </w:rPr>
+        <w:t xml:space="preserve"> </w:t>
+      </w:r>
+      <w:r>
+        <w:rPr>
+          <w:b w:val="0"/>
+          <w:i w:val="0"/>
+          <w:color w:val="1F4E79"/>
+        </w:rPr>
+        <w:t>SILVA reference v138.2 [36]</w:t>
+      </w:r>
+      <w:r>
+        <w:rPr>
+          <w:b w:val="0"/>
+          <w:i w:val="0"/>
+        </w:rPr>
+        <w:t xml:space="preserve"> (DADA2 formatted, Zenodo 14169026); BLAST+ 2.13.0; FastQC and MultiQC for quality control. The 16S V4 primers, being also the sequencing primers (Schloss dual-index protocol), are not present in the reads; no 5′ primer trimming was therefore applied.</w:t>
       </w:r>
     </w:p>
     <w:p>
@@ -559,7 +756,7 @@
           <w:b w:val="0"/>
           <w:i w:val="0"/>
         </w:rPr>
-        <w:t>Reagent and laboratory contaminants were identified with decontam v1.30.0 (Davis et al. 2018) using the prevalence method, which contrasts the prevalence of each ASV in true samples against negative controls. DNA concentrations were not available for the Durance libraries, precluding the frequency method. The negative set comprised extraction blanks and PCR (no-template) negative controls, each present in all three sequencing runs (36 control samples in total); mock communities and empty wells were excluded from this step. Batches were defined by sequencing run. Two classification thresholds were compared (0.1, the package default, and 0.5). The default threshold of 0.1 was retained: it flagged 66 ASVs (0.15 % of ASVs) while retaining 99.76 % of reads, and the flagged taxa were taxonomically consistent with common reagent contaminants (Pseudomonadaceae, Moraxellaceae, Micrococcaceae, Propionibacteriaceae, Streptococcaceae). The more aggressive 0.5 threshold removed 2.13 % of reads in total, 1.89 points more than the retained threshold, including ASVs carrying genuine biological signal — most notably a Candidatus Branchiomonas ASV that was prevalent in gill and external tissues and essentially absent from negative controls — and was therefore rejected.</w:t>
+        <w:t>Reagent and laboratory contaminants were identified with decontam v1.30.0 [37] using the prevalence method, which contrasts the prevalence of each ASV in true samples against negative controls. DNA concentrations were not available for the Durance libraries, precluding the frequency method. The negative set comprised extraction blanks and PCR (no-template) negative controls, each present in all three sequencing runs (36 control samples in total); mock communities and empty wells were excluded from this step. Batches were defined by sequencing run. Two classification thresholds were compared (0.1, the package default, and 0.5). The default threshold of 0.1 was retained: it flagged 66 ASVs (0.15 % of ASVs) while retaining 99.76 % of reads, and the flagged taxa were taxonomically consistent with common reagent contaminants (Pseudomonadaceae, Moraxellaceae, Micrococcaceae, Propionibacteriaceae, Streptococcaceae). The more aggressive 0.5 threshold removed 2.13 % of reads in total, 1.89 points more than the retained threshold, including ASVs carrying genuine biological signal — most notably a Candidatus Branchiomonas ASV that was prevalent in gill and external tissues and essentially absent from negative controls — and was therefore rejected.</w:t>
       </w:r>
     </w:p>
     <w:p>
@@ -647,7 +844,67 @@
           <w:b w:val="0"/>
           <w:i w:val="0"/>
         </w:rPr>
-        <w:t>A de novo phylogeny was built from the ASV sequences with QIIME 2 (align-to-tree-mafft-fasttree): multiple alignment with MAFFT, masking of highly variable positions, tree inference with FastTree 2, and midpoint rooting. Fragment insertion into a reference backbone (SEPP) was not used because the ASVs are near-complete V4 amplicons (~251 bp) for which de novo alignment is appropriate. The resulting rooted tree covers all ASVs of the analysis table and supports UniFrac distances and Faith's phylogenetic diversity.</w:t>
+        <w:t xml:space="preserve">A de novo phylogeny was built from the ASV sequences with </w:t>
+      </w:r>
+      <w:r>
+        <w:rPr>
+          <w:b w:val="0"/>
+          <w:i w:val="0"/>
+          <w:color w:val="1F4E79"/>
+        </w:rPr>
+        <w:t>QIIME 2 [38]</w:t>
+      </w:r>
+      <w:r>
+        <w:rPr>
+          <w:b w:val="0"/>
+          <w:i w:val="0"/>
+        </w:rPr>
+        <w:t xml:space="preserve"> (align-to-tree-mafft-fasttree): multiple alignment with </w:t>
+      </w:r>
+      <w:r>
+        <w:rPr>
+          <w:b w:val="0"/>
+          <w:i w:val="0"/>
+          <w:color w:val="1F4E79"/>
+        </w:rPr>
+        <w:t>MAFFT [39],</w:t>
+      </w:r>
+      <w:r>
+        <w:rPr>
+          <w:b w:val="0"/>
+          <w:i w:val="0"/>
+        </w:rPr>
+        <w:t xml:space="preserve"> masking of highly variable positions, tree inference with </w:t>
+      </w:r>
+      <w:r>
+        <w:rPr>
+          <w:b w:val="0"/>
+          <w:i w:val="0"/>
+          <w:color w:val="1F4E79"/>
+        </w:rPr>
+        <w:t>FastTree 2 [40],</w:t>
+      </w:r>
+      <w:r>
+        <w:rPr>
+          <w:b w:val="0"/>
+          <w:i w:val="0"/>
+        </w:rPr>
+        <w:t xml:space="preserve"> and midpoint rooting. Fragment insertion into a reference backbone (SEPP) was not used because the ASVs are near-complete V4 amplicons (~251 bp) for which de novo alignment is appropriate. The resulting rooted tree covers all ASVs of the analysis table and supports </w:t>
+      </w:r>
+      <w:r>
+        <w:rPr>
+          <w:b w:val="0"/>
+          <w:i w:val="0"/>
+          <w:color w:val="1F4E79"/>
+        </w:rPr>
+        <w:t>UniFrac distances [41] and Faith's phylogenetic diversity [42]</w:t>
+      </w:r>
+      <w:r>
+        <w:rPr>
+          <w:b w:val="0"/>
+          <w:i w:val="0"/>
+        </w:rPr>
+        <w:t>.</w:t>
       </w:r>
     </w:p>
     <w:p>
@@ -669,7 +926,7 @@
           <w:b w:val="0"/>
           <w:i w:val="0"/>
         </w:rPr>
-        <w:t>Uneven sequencing effort was controlled by rarefaction, currently the most robust approach for alpha- and beta-diversity metrics (Schloss 2024). No universal threshold exists; the depth was therefore chosen on the data using three criteria. First, richness plateaued below 3,000 reads in rarefaction curves, so this depth captures the recoverable diversity. Second, a threshold of 3,000 reads retained 81.8 % of samples (1,784/2,180), against 72.6 % at 5,000 reads. Third — and decisively — sample retention at 3,000 reads was balanced across sequencing runs (80.2–83.5 % per run), the main technical batch factor, so rarefaction does not confound depth with batch. A higher threshold was rejected because it increased uneven sample loss across sites and taxa without improving coverage.</w:t>
+        <w:t>Uneven sequencing effort was controlled by rarefaction, currently the most robust approach for alpha- and beta-diversity metrics [43]. No universal threshold exists; the depth was therefore chosen on the data using three criteria. First, richness plateaued below 3,000 reads in rarefaction curves, so this depth captures the recoverable diversity. Second, a threshold of 3,000 reads retained 81.8 % of samples (1,784/2,180), against 72.6 % at 5,000 reads. Third — and decisively — sample retention at 3,000 reads was balanced across sequencing runs (80.2–83.5 % per run), the main technical batch factor, so rarefaction does not confound depth with batch. A higher threshold was rejected because it increased uneven sample loss across sites and taxa without improving coverage.</w:t>
       </w:r>
     </w:p>
     <w:p>
@@ -678,7 +935,7 @@
         <w:rPr>
           <w:i w:val="0"/>
         </w:rPr>
-        <w:t>Rarefaction was applied repeatedly rather than as a single draw (Cameron et al. 2021). Alpha-diversity indices (observed richness, Shannon, inverse Simpson) were averaged over 1,000 independent rarefactions, and Bray–Curtis and Jaccard dissimilarity matrices over 400. Metrics were averaged rather than count tables: averaging tables would populate each cell with the union of detections across draws and inflate observed richness above what 3,000 reads can support, reintroducing the very depth dependence that rarefaction removes.</w:t>
+        <w:t>Rarefaction was applied repeatedly rather than as a single draw [44]. Alpha-diversity indices (observed richness, Shannon, inverse Simpson) were averaged over 1,000 independent rarefactions, and Bray–Curtis and Jaccard dissimilarity matrices over 400. Metrics were averaged rather than count tables: averaging tables would populate each cell with the union of detections across draws and inflate observed richness above what 3,000 reads can support, reintroducing the very depth dependence that rarefaction removes.</w:t>
       </w:r>
     </w:p>
     <w:p>
@@ -687,7 +944,33 @@
         <w:rPr>
           <w:i w:val="0"/>
         </w:rPr>
-        <w:t>Monte-Carlo error was quantified rather than assumed. Because a cumulative mean at N draws and one at 2N share their first N draws and are therefore autocorrelated, convergence was assessed by running two independent chains with disjoint seeds and comparing their means at matched iteration counts, the standard error of a single chain being sd(chain₁ − chain₂)/√2. This error decreased as N^−0.49 (Bray–Curtis) and N^−0.51 (Jaccard), matching the N^−0.5 expected for an average of independent draws. At 100 iterations it stood at 0.04 % of the mean dissimilarity (0.0004 in absolute terms), three orders of magnitude below both the technical (0.118–0.248) and the biological (0.880) dissimilarity scales reported in §8.7, so 100 iterations would have sufficed for the beta-diversity matrices. Median Monte-Carlo standard deviations for the alpha indices were 0.023 for Shannon (0.8 % of the median value), 2.37 for observed richness (1.9 %) and 0.21 for inverse Simpson (2.5 %); the abundance-weighted indices were thus the more stable, consistent with the limited reproducibility of rare ASVs (§8.7).</w:t>
+        <w:t xml:space="preserve">Monte-Carlo error was quantified rather than assumed. Because a cumulative mean at N draws and one at 2N share their first N draws and are therefore autocorrelated, convergence was assessed by running two independent chains with disjoint seeds and comparing their means at matched iteration counts, the standard error of a single chain being sd(chain₁ − chain₂)/√2. This error decreased as N^−0.49 (Bray–Curtis) and N^−0.51 (Jaccard), matching the N^−0.5 expected for an average of independent draws. At 100 iterations it stood at 0.04 % of the mean dissimilarity (0.0004 in absolute terms), three orders of magnitude below both the technical (0.118–0.248) and the biological (0.880) dissimilarity scales reported in </w:t>
+      </w:r>
+      <w:r>
+        <w:rPr>
+          <w:i w:val="0"/>
+          <w:color w:val="1F4E79"/>
+        </w:rPr>
+        <w:t>Results</w:t>
+      </w:r>
+      <w:r>
+        <w:rPr>
+          <w:i w:val="0"/>
+        </w:rPr>
+        <w:t>, so 100 iterations would have sufficed for the beta-diversity matrices. Median Monte-Carlo standard deviations for the alpha indices were 0.023 for Shannon (0.8 % of the median value), 2.37 for observed richness (1.9 %) and 0.21 for inverse Simpson (2.5 %); the abundance-weighted indices were thus the more stable, consistent with the limited reproducibility of rare ASVs (</w:t>
+      </w:r>
+      <w:r>
+        <w:rPr>
+          <w:i w:val="0"/>
+          <w:color w:val="1F4E79"/>
+        </w:rPr>
+        <w:t>Results</w:t>
+      </w:r>
+      <w:r>
+        <w:rPr>
+          <w:i w:val="0"/>
+        </w:rPr>
+        <w:t>).</w:t>
       </w:r>
     </w:p>
     <w:p>
@@ -734,32 +1017,6 @@
         <w:rPr>
           <w:color w:val="1F4E79"/>
         </w:rPr>
-      </w:r>
-    </w:p>
-    <w:p>
-      <w:pPr/>
-      <w:r>
-        <w:rPr>
-          <w:i/>
-          <w:color w:val="888888"/>
-          <w:sz w:val="18"/>
-        </w:rPr>
-      </w:r>
-      <w:r>
-        <w:rPr>
-          <w:b w:val="0"/>
-          <w:i w:val="0"/>
-          <w:color w:val="1F4E79"/>
-        </w:rPr>
-        <w:t xml:space="preserve">Statistical framework. Community composition is analysed by PERMANOVA on the averaged dissimilarity matrices, stratified by tissue. Stratification is imposed by the design rather than chosen: 168 of the 180 fish occupy the same plate column across all four tissues, so plate position is not estimable in a pooled model carrying fish identity. Station, not site code, is the spatial unit, since two site codes each span two Suran stations that share no genotypic category. Sequencing run is nested within library preparation (§8.7). Every analysis of genotypic category is run in the two passes defined in §1. Plate column is not entered in the principal models, which report patterns co-varying with station and category without separating them; because its effect on composition is real (§8.8), every model testing category is also fitted with plate column as a covariate and reported as a sensitivity analysis. Because genotypic category, station and plate position are mutually entangled (SS8.9), no single sequential decomposition is reported: each model is fitted in both orderings and the interval between them is given, the ordering that serves category first bounding it from above and the ordering that serves it last from below. Permutations are constrained within station blocks where the question concerns a within-station contrast. Dispersion is tested separately with PERMDISP, since the transgressive hypothesis concerns the variability of hybrid microbiota and not only the position of its centroid, and since PERMANOVA is itself sensitive to heterogeneous dispersion. </w:t>
-      </w:r>
-      <w:r>
-        <w:rPr>
-          <w:b w:val="0"/>
-          <w:i w:val="0"/>
-          <w:color w:val="1F4E79"/>
-        </w:rPr>
-        <w:t>Every claim is reported per metric and per tissue. Four dissimilarities are carried throughout — Bray–Curtis, Jaccard, unweighted and weighted UniFrac — together with four alpha indices: observed richness, Shannon, inverse Simpson and Faith's phylogenetic diversity. Because resequencing one library recovers only 48 % of the ASVs present at 1–3 reads (§8.7), presence-based metrics are not treated as sufficient on their own: a result is stated as established only where at least one abundance-weighted and one presence-based metric support it, and is otherwise reported as metric-dependent with the supporting metrics named. Figures quoted in running text use Shannon for alpha diversity and Bray–Curtis for composition, both abundance-weighted, with the remaining metrics reported alongside rather than relegated. Weighting is not the operative axis for composition: Bray–Curtis, though abundance-weighted, patterns with the two presence-based dissimilarities on both category and dispersion, whereas weighted UniFrac stands apart, so the rule is applied metric by metric rather than by weighting class. The choice of a differential-abundance method remains to be fixed.</w:t>
       </w:r>
     </w:p>
     <w:p>
@@ -768,33 +1025,143 @@
       </w:pPr>
       <w:r>
         <w:rPr>
-          <w:i w:val="0"/>
-        </w:rPr>
-        <w:t>8.7 Technical replication structure</w:t>
+          <w:color w:val="1F4E79"/>
+        </w:rPr>
+        <w:t>8.7 Statistical framework</w:t>
       </w:r>
     </w:p>
     <w:p>
       <w:pPr/>
       <w:r>
-        <w:t>The nested replication structure was verified directly from the data. Each pair of runs was compared within sample after rarefaction to a common depth, so that detection probability is identical by construction (548 samples reaching 3,000 reads in all three runs). The two runs sharing a library were markedly more similar to each other (mean Bray–Curtis 0.118, Jaccard 0.445) than either was to the run from the independent library (0.248 and 0.720 respectively); the two library-crossing comparisons were statistically indistinguishable from each other (paired Wilcoxon, p = 0.48) and both differed from the within-library comparison (p &lt; 10⁻⁸⁹). Recapture of rare ASVs (1–3 reads) showed the same pattern (0.48 within library vs 0.19 across).</w:t>
-      </w:r>
-    </w:p>
-    <w:p>
-      <w:pPr/>
-      <w:r>
-        <w:t>Library preparation therefore roughly doubles the technical dissimilarity contributed by sequencing alone, with a proportionally larger effect on presence–absence than on relative abundances. Sequencing run was accordingly modelled as nested within library preparation rather than as a three-level factor with interchangeable levels. Because each sample is present in every batch, technical and biological factors are crossed rather than confounded, so batch-correction methods designed for confounded meta-analyses were not applied.</w:t>
-      </w:r>
-      <w:r>
-        <w:t xml:space="preserve"> Index assignment across preparations and the verification of sample-to-file matching are detailed in Supplementary Table S5 and Note S1.</w:t>
-      </w:r>
-    </w:p>
-    <w:p>
-      <w:pPr/>
-      <w:r>
-        <w:rPr>
+        <w:rPr>
+          <w:i/>
+          <w:color w:val="888888"/>
+          <w:sz w:val="18"/>
+        </w:rPr>
+      </w:r>
+      <w:r>
+        <w:rPr>
+          <w:b w:val="0"/>
           <w:i w:val="0"/>
-        </w:rPr>
-        <w:t>Relative to the biological signal, this technical variation is negligible. In a PERMANOVA on Bray–Curtis distances over the 1,784 samples retained after rarefaction, with the technical terms entered first so that they absorb the maximum variance the sequential decomposition can assign them, library preparation explained 0.03 % of the variance (R² = 0.0003, p = 0.63) and sequencing run within library 0.005 % (p = 1.00), against 9.2 % for tissue and 37.7 % for fish identity (both p = 0.002). Mean Bray–Curtis dissimilarity was 0.13 between two sequencing runs of one library and 0.25 across libraries, against 0.88 between different fish of the same tissue and 0.94 across tissues. Note that library preparation cannot be tested marginally, being perfectly aliased with run label (durance1 is the sole run of the first preparation).</w:t>
+          <w:color w:val="1F4E79"/>
+        </w:rPr>
+        <w:t xml:space="preserve">Community composition is analysed </w:t>
+      </w:r>
+      <w:r>
+        <w:rPr>
+          <w:b w:val="0"/>
+          <w:i w:val="0"/>
+          <w:color w:val="1F4E79"/>
+        </w:rPr>
+        <w:t>by PERMANOVA [45] on</w:t>
+      </w:r>
+      <w:r>
+        <w:rPr>
+          <w:b w:val="0"/>
+          <w:i w:val="0"/>
+          <w:color w:val="1F4E79"/>
+        </w:rPr>
+        <w:t xml:space="preserve"> the averaged dissimilarity matrices, stratified by tissue. Stratification is imposed by the design rather than chosen: 168 of the 180 fish occupy the same plate column across all four tissues, so plate position is not estimable in a pooled model carrying fish identity. Station, not site code, is the spatial unit, since two site codes each span two Suran stations that share no genotypic category. Sequencing run is nested within library preparation (</w:t>
+      </w:r>
+      <w:r>
+        <w:rPr>
+          <w:b w:val="0"/>
+          <w:i w:val="0"/>
+          <w:color w:val="1F4E79"/>
+        </w:rPr>
+        <w:t>§8.8</w:t>
+      </w:r>
+      <w:r>
+        <w:rPr>
+          <w:b w:val="0"/>
+          <w:i w:val="0"/>
+          <w:color w:val="1F4E79"/>
+        </w:rPr>
+        <w:t>). Every analysis of genotypic category is run in the two passes defined in §1. Plate column is not entered in the principal models, which report patterns co-varying with station and category without separating them; because its effect on composition is real (</w:t>
+      </w:r>
+      <w:r>
+        <w:rPr>
+          <w:b w:val="0"/>
+          <w:i w:val="0"/>
+          <w:color w:val="1F4E79"/>
+        </w:rPr>
+        <w:t>§8.9; Results</w:t>
+      </w:r>
+      <w:r>
+        <w:rPr>
+          <w:b w:val="0"/>
+          <w:i w:val="0"/>
+          <w:color w:val="1F4E79"/>
+        </w:rPr>
+        <w:t>), every model testing category is also fitted with plate column as a covariate and reported as a sensitivity analysis. Because genotypic category, station and plate position are mutually entangled (</w:t>
+      </w:r>
+      <w:r>
+        <w:rPr>
+          <w:b w:val="0"/>
+          <w:i w:val="0"/>
+          <w:color w:val="1F4E79"/>
+        </w:rPr>
+        <w:t>Results</w:t>
+      </w:r>
+      <w:r>
+        <w:rPr>
+          <w:b w:val="0"/>
+          <w:i w:val="0"/>
+          <w:color w:val="1F4E79"/>
+        </w:rPr>
+        <w:t xml:space="preserve">), no single sequential decomposition is reported: each model is fitted in both orderings and the interval between them is given, the ordering that serves category first bounding it from above and the ordering that serves it last from below. Permutations are constrained within station blocks where the question concerns a within-station contrast. Dispersion is tested separately </w:t>
+      </w:r>
+      <w:r>
+        <w:rPr>
+          <w:b w:val="0"/>
+          <w:i w:val="0"/>
+          <w:color w:val="1F4E79"/>
+        </w:rPr>
+        <w:t>with PERMDISP [46],</w:t>
+      </w:r>
+      <w:r>
+        <w:rPr>
+          <w:b w:val="0"/>
+          <w:i w:val="0"/>
+          <w:color w:val="1F4E79"/>
+        </w:rPr>
+        <w:t xml:space="preserve"> since the transgressive hypothesis concerns the variability of hybrid microbiota and not only the position of its centroid, and since PERMANOVA is itself sensitive to heterogeneous dispersion. </w:t>
+      </w:r>
+      <w:r>
+        <w:rPr>
+          <w:b w:val="0"/>
+          <w:i w:val="0"/>
+          <w:color w:val="1F4E79"/>
+        </w:rPr>
+        <w:t>Every claim is reported per metric and per tissue. Four dissimilarities are carried throughout — Bray–Curtis, Jaccard, unweighted and weighted UniFrac — together with four alpha indices: observed richness, Shannon, inverse Simpson and Faith's phylogenetic diversity. Because resequencing one library recovers only 48 % of the ASVs present at 1–3 reads (</w:t>
+      </w:r>
+      <w:r>
+        <w:rPr>
+          <w:b w:val="0"/>
+          <w:i w:val="0"/>
+          <w:color w:val="1F4E79"/>
+        </w:rPr>
+        <w:t>Results</w:t>
+      </w:r>
+      <w:r>
+        <w:rPr>
+          <w:b w:val="0"/>
+          <w:i w:val="0"/>
+          <w:color w:val="1F4E79"/>
+        </w:rPr>
+        <w:t>), presence-based metrics are not treated as sufficient on their own: a result is stated as established only where at least one abundance-weighted and one presence-based metric support it, and is otherwise reported as metric-dependent with the supporting metrics named. Figures quoted in running text use Shannon for alpha diversity and Bray–Curtis for composition, both abundance-weighted, with the remaining metrics reported alongside rather than relegated. Weighting is not the operative axis for composition: Bray–Curtis, though abundance-weighted, patterns with the two presence-based dissimilarities on both category and dispersion, whereas weighted UniFrac stands apart, so the rule is applied metric by metric rather than by weighting class. The choice of a differential-abundance method remains to be fixed.</w:t>
+      </w:r>
+      <w:r>
+        <w:rPr>
+          <w:color w:val="1F4E79"/>
+        </w:rPr>
+        <w:t xml:space="preserve"> PERMANOVA (adonis2) and PERMDISP (betadisper) were run with vegan 2.7-5 [47].</w:t>
+      </w:r>
+      <w:r>
+        <w:rPr>
+          <w:color w:val="1F4E79"/>
+        </w:rPr>
+        <w:t xml:space="preserve"> Distances to group medians in PERMDISP were corrected for small-sample bias (bias.adjust = TRUE [48]), hybrids being the smallest category in every stratum.</w:t>
       </w:r>
     </w:p>
     <w:p>
@@ -804,120 +1171,18 @@
       <w:r>
         <w:rPr>
           <w:i w:val="0"/>
-        </w:rPr>
-      </w:r>
-      <w:r>
-        <w:rPr>
-          <w:i w:val="0"/>
-        </w:rPr>
-        <w:t>8.8 Plate position</w:t>
+          <w:color w:val="1F4E79"/>
+        </w:rPr>
+        <w:t>8.8 Technical replication structure</w:t>
       </w:r>
     </w:p>
     <w:p>
       <w:pPr/>
-      <w:r/>
-      <w:r>
-        <w:rPr>
-          <w:b w:val="0"/>
-          <w:i w:val="0"/>
-        </w:rPr>
-      </w:r>
-      <w:r>
-        <w:rPr>
-          <w:b w:val="0"/>
-          <w:i w:val="0"/>
-          <w:color w:val="1F4E79"/>
-        </w:rPr>
-        <w:t xml:space="preserve">Individuals were numbered in the field in sampling order, which is not random with respect to genotype: the more fragile nases were processed first, except at one station (Saint-Just-d'Ardèche), </w:t>
-      </w:r>
-      <w:r>
-        <w:rPr>
-          <w:b w:val="0"/>
-          <w:i w:val="0"/>
-          <w:color w:val="1F4E79"/>
-        </w:rPr>
-        <w:t>and plates were loaded in processing order within every fishing campaign (Spearman ρ between individual number and plate column within campaigns, 0.55–0.95)</w:t>
-      </w:r>
-      <w:r>
-        <w:rPr>
-          <w:b w:val="0"/>
-          <w:i w:val="0"/>
-          <w:color w:val="1F4E79"/>
-        </w:rPr>
-        <w:t>. Genotypic category and plate column are accordingly strongly associated (Cramér's V = 0.53 in pass 1 and 0.48 in pass 2, computed on individuals). Whether plate position affects composition was therefore tested rather than assumed. Rarefaction equalises depth, so a test on read depth would not have answered the question; PERMANOVA was run on composition, stratified by tissue, with permutations constrained within station blocks so that a detected column effect cannot be a station effect, and with each sequencing run analysed separately, plate position being identical across runs.</w:t>
-      </w:r>
-    </w:p>
-    <w:p>
-      <w:pPr/>
-      <w:r/>
-      <w:r>
-        <w:rPr>
-          <w:b w:val="0"/>
-          <w:i w:val="0"/>
-        </w:rPr>
-      </w:r>
-      <w:r>
-        <w:rPr>
-          <w:b w:val="0"/>
-          <w:i w:val="0"/>
-          <w:color w:val="1F4E79"/>
-        </w:rPr>
-      </w:r>
-      <w:r>
-        <w:rPr>
-          <w:b w:val="0"/>
-          <w:i w:val="0"/>
-          <w:color w:val="1F4E79"/>
-        </w:rPr>
-        <w:t>The effect is present in all 24 strata (12 tissue × run strata × 2 metrics) in both passes (p ≤ 0.033 in pass 1, p ≤ 0.007 in pass 2), replicated across the three runs; it does not depend on category labels, and the two passes differ only by the 22 individuals excluded from pass 1. Because the terms differ in degrees of freedom, effect sizes are reported relative to their expectation under the null, R2/(df/(n−1)): plate column reaches 1.84 in pass 1 and 1.95 in pass 2 (median R2 = 0.152 and 0.141, 11 df), the same order as genotypic category fitted after column (1.61 and 1.77; median R2 = 0.026 and 0.024, 2 df; significant in 19 and 18 of 24 strata) and below station (3.32 and 3.69; median R2 = 0.204 and 0.196, 8 df). Supplementary Table S7 and Figure S1.</w:t>
-      </w:r>
-      <w:r>
-        <w:rPr>
-          <w:color w:val="1F4E79"/>
-        </w:rPr>
-      </w:r>
-    </w:p>
-    <w:p>
-      <w:pPr/>
-      <w:r/>
-      <w:r>
-        <w:rPr>
-          <w:b w:val="0"/>
-          <w:i w:val="0"/>
-        </w:rPr>
-      </w:r>
-      <w:r>
-        <w:rPr>
-          <w:b w:val="0"/>
-          <w:i w:val="0"/>
-          <w:color w:val="1F4E79"/>
-        </w:rPr>
-      </w:r>
-      <w:r>
-        <w:rPr>
-          <w:b w:val="0"/>
-          <w:i w:val="0"/>
-          <w:color w:val="1F4E79"/>
-        </w:rPr>
-      </w:r>
-      <w:r>
-        <w:rPr>
-          <w:b w:val="0"/>
-          <w:i w:val="0"/>
-          <w:color w:val="1F4E79"/>
-        </w:rPr>
-        <w:t>Three witnesses separate this effect from the biology it could be mistaken for. Within a single genotypic category, where a column effect cannot be a category effect, it persists but more weakly: among P. toxostoma alone in 17 of 24 strata in both passes (ratio 1.65), among C. nasus alone in 6 (pass 1) and 7 (pass 2) of 24 (ratio 1.63); hybrids alone are too few to be tested (two strata in pass 2, none in pass 1). No site code carries a single genotypic category, and the only single-category station (Chavannes-sur-Suran, 19 P. toxostoma) is too small for a separate witness; the within-category subsets therefore replace the single-category-station witness of an earlier analysis, which rested on fish left unresolved by morphology. In the symmetric ordering with category fitted first, column still contributes (21 and 22 of 24 strata). And the classic plate artefacts are absent: plate row is significant in 7 and 6 of 24 strata and plate edge in none, making the effect specific to column, as expected of an effect tracking processing order rather than evaporation or thermal gradients. The origin of the association between category and column is documented above, but the mechanism of the column effect itself is not identified: extraction order, reagent-batch drift within a plate, cross-contamination between adjacent wells and the delay between capture and dissection are not separated by these data, and no negative control isolates any of them. Plate column is therefore not entered in the principal models (§8.6), but every model testing category is also reported with plate column as a covariate, and the two versions are compared in §8.9.</w:t>
-      </w:r>
-    </w:p>
-    <w:p>
-      <w:pPr/>
-      <w:r>
-        <w:rPr>
-          <w:i/>
-          <w:color w:val="888888"/>
-          <w:sz w:val="18"/>
-        </w:rPr>
-        <w:t>[À reformuler après l'arbitrage D2 de JF : « the delay between capture and dissection » ne correspond plus au protocole. Les poissons sont gardés vivants en vivier jusqu'à la dissection, 4–6 min par poisson (André, 2026-10-03) ; le confondant est la durée de séjour en vivier, c'est-à-dire l'ordre de traitement. Dans chaque campagne, la colonne suit cet ordre, et le test du 2026-10-03 ne peut pas séparer les deux (RESULTATS R32, docs/recalcul/note_tests_2026-10-03.md).]</w:t>
+      <w:r>
+        <w:rPr>
+          <w:color w:val="1F4E79"/>
+        </w:rPr>
+        <w:t>Technical replication was assessed in two ways. Each pair of runs was compared within sample after rarefaction to a common depth, on the 548 samples reaching 3,000 reads in all three runs, so that detection probability is identical by construction; Bray–Curtis and Jaccard dissimilarities and the recapture of rare ASVs (1–3 reads) were contrasted between the pair of runs sharing a library and the two library-crossing pairs with paired Wilcoxon tests. The variance attributable to library preparation and to sequencing run was then estimated by PERMANOVA on Bray–Curtis distances over the 1,784 rarefied samples, with the technical terms entered first so that they absorb the maximum variance a sequential decomposition can assign them, followed by tissue and fish identity.</w:t>
       </w:r>
     </w:p>
     <w:p>
@@ -927,41 +1192,14 @@
       <w:r>
         <w:rPr>
           <w:i w:val="0"/>
-        </w:rPr>
+          <w:color w:val="1F4E79"/>
+        </w:rPr>
+        <w:t>8.9 Plate position</w:t>
       </w:r>
       <w:r>
         <w:rPr>
           <w:i w:val="0"/>
         </w:rPr>
-      </w:r>
-      <w:r>
-        <w:rPr>
-          <w:i w:val="0"/>
-          <w:color w:val="1F4E79"/>
-        </w:rPr>
-      </w:r>
-      <w:r>
-        <w:rPr>
-          <w:i w:val="0"/>
-          <w:color w:val="1F4E79"/>
-        </w:rPr>
-      </w:r>
-      <w:r>
-        <w:rPr>
-          <w:i w:val="0"/>
-          <w:color w:val="1F4E79"/>
-        </w:rPr>
-      </w:r>
-      <w:r>
-        <w:rPr>
-          <w:i w:val="0"/>
-        </w:rPr>
-      </w:r>
-      <w:r>
-        <w:rPr>
-          <w:i w:val="0"/>
-        </w:rPr>
-        <w:t>8.9 Structure of confounding in the genotypic design</w:t>
       </w:r>
     </w:p>
     <w:p>
@@ -979,6 +1217,7 @@
           <w:i w:val="0"/>
           <w:color w:val="1F4E79"/>
         </w:rPr>
+        <w:t xml:space="preserve">Individuals were numbered in the field in sampling order, which is not random with respect to genotype: the more fragile nases were processed first, except at one station (Saint-Just-d'Ardèche), </w:t>
       </w:r>
       <w:r>
         <w:rPr>
@@ -986,6 +1225,7 @@
           <w:i w:val="0"/>
           <w:color w:val="1F4E79"/>
         </w:rPr>
+        <w:t>and plates were loaded in processing order within every fishing campaign (Spearman ρ between individual number and plate column within campaigns, 0.55–0.95)</w:t>
       </w:r>
       <w:r>
         <w:rPr>
@@ -993,26 +1233,171 @@
           <w:i w:val="0"/>
           <w:color w:val="1F4E79"/>
         </w:rPr>
-      </w:r>
-      <w:r>
-        <w:rPr>
-          <w:b w:val="0"/>
-          <w:i w:val="0"/>
-        </w:rPr>
-      </w:r>
-      <w:r>
-        <w:rPr>
-          <w:b w:val="0"/>
-          <w:i w:val="0"/>
-        </w:rPr>
-      </w:r>
-      <w:r>
-        <w:rPr>
-          <w:b w:val="0"/>
-          <w:i w:val="0"/>
-          <w:color w:val="1F4E79"/>
-        </w:rPr>
-        <w:t>Genotypic category is entangled with both the spatial and the technical axes, and the entanglement is a property of the design rather than a caveat of presentation. Between stations, category is confounded with station: of nine stations, three carry all three categories (74 individuals in pass 2, 65 in pass 1, where Saint-Just-d'Ardèche retains a single hybrid), the others one or two. Within those three stations, category and plate column are in turn strongly associated, because field numbering followed sampling order (§8.8). The sub-design in which category and position are fully separable at constant station comprises 31 individuals in pass 1 and 32 in pass 2, too few to carry a principal test. One station, Rosières, carries category and position independently (Cramér's V = 0.18, p = 0.35, in pass 2) and serves as a small clean witness; in pass 1 it retains a single hybrid and cannot witness a category effect.</w:t>
+        <w:t>. Genotypic category and plate column are accordingly strongly associated (Cramér's V = 0.53 in pass 1 and 0.48 in pass 2, computed on individuals). Whether plate position affects composition was therefore tested rather than assumed. Rarefaction equalises depth, so a test on read depth would not have answered the question; PERMANOVA was run on composition, stratified by tissue, with permutations constrained within station blocks so that a detected column effect cannot be a station effect, and with each sequencing run analysed separately, plate position being identical across runs.</w:t>
+      </w:r>
+    </w:p>
+    <w:p>
+      <w:pPr>
+        <w:pStyle w:val="Heading2"/>
+      </w:pPr>
+      <w:r>
+        <w:rPr>
+          <w:color w:val="1F4E79"/>
+        </w:rPr>
+        <w:t>8.10 Alpha diversity</w:t>
+      </w:r>
+    </w:p>
+    <w:p>
+      <w:pPr/>
+      <w:r>
+        <w:rPr>
+          <w:color w:val="1F4E79"/>
+        </w:rPr>
+        <w:t xml:space="preserve">Alpha diversity was summarised per individual and tissue as the mean over the three runs of the rarefied indices (observed richness, Shannon, inverse Simpson and Faith's phylogenetic diversity), analysed on the log scale, every analysis being run on the four indices. First, the contrasts between external (caudal fin, gill) and internal (midgut, hindgut) compartments, and between midgut and hindgut, were tested within individual by a paired t-test on log values, with the Wilcoxon signed-rank test reported alongside, and expressed as ratios of geometric means with 95 % confidence intervals. Second, the variance of log alpha diversity over the 1,784 rarefied samples was partitioned by a linear model with tissue, site-year, individual, library preparation and sequencing run; sequential and marginal shares of the sum of squares are reported, nested terms having no marginal share of their own. Third, the effect of genotypic category was tested per tissue and pass by ordinary least squares, log(index) ~ station + category, with an F test of the category term and the contrasts hybrid − </w:t>
+      </w:r>
+      <w:r>
+        <w:rPr>
+          <w:i/>
+          <w:color w:val="1F4E79"/>
+        </w:rPr>
+        <w:t>C. nasus</w:t>
+      </w:r>
+      <w:r>
+        <w:rPr>
+          <w:color w:val="1F4E79"/>
+        </w:rPr>
+        <w:t xml:space="preserve">, hybrid − </w:t>
+      </w:r>
+      <w:r>
+        <w:rPr>
+          <w:i/>
+          <w:color w:val="1F4E79"/>
+        </w:rPr>
+        <w:t>P. toxostoma</w:t>
+      </w:r>
+      <w:r>
+        <w:rPr>
+          <w:color w:val="1F4E79"/>
+        </w:rPr>
+        <w:t xml:space="preserve"> and hybrid − parental midpoint with 95 % confidence intervals; plate position was added as a covariate in a sensitivity model. Hybrids were classified as intermediate when their estimate lay between the two parental estimates and did not differ from their midpoint; as dominant when their interval included one parent and excluded the other; and as transgressive when their estimate lay beyond the parental range with an interval excluding the nearer parent. When no criterion or more than one was met, the class is reported as undetermined. This rule, and the three tests of §8.12, were declared before computation.</w:t>
+      </w:r>
+    </w:p>
+    <w:p>
+      <w:pPr>
+        <w:pStyle w:val="Heading2"/>
+      </w:pPr>
+      <w:r>
+        <w:rPr>
+          <w:color w:val="1F4E79"/>
+        </w:rPr>
+        <w:t>8.11 Four-dimensional (4H) index</w:t>
+      </w:r>
+    </w:p>
+    <w:p>
+      <w:pPr/>
+      <w:r>
+        <w:rPr>
+          <w:color w:val="1F4E79"/>
+        </w:rPr>
+        <w:t xml:space="preserve">The 4H index [14] was computed with the R package HybridMicrobiomes 0.1.1 [49] and phyloseq [50], on three host classes — </w:t>
+      </w:r>
+      <w:r>
+        <w:rPr>
+          <w:i/>
+          <w:color w:val="1F4E79"/>
+        </w:rPr>
+        <w:t>C. nasus</w:t>
+      </w:r>
+      <w:r>
+        <w:rPr>
+          <w:color w:val="1F4E79"/>
+        </w:rPr>
+        <w:t xml:space="preserve">, hybrids and </w:t>
+      </w:r>
+      <w:r>
+        <w:rPr>
+          <w:i/>
+          <w:color w:val="1F4E79"/>
+        </w:rPr>
+        <w:t>P. toxostoma</w:t>
+      </w:r>
+      <w:r>
+        <w:rPr>
+          <w:color w:val="1F4E79"/>
+        </w:rPr>
+        <w:t xml:space="preserve"> — in each pass, tissue and sequencing run separately. Its parameters and reading rules were fixed in a document committed before any index was computed: core fraction ρ = 0.5 at genus rank, with sensitivity at ρ = 0.3 and 0.7 and at family rank, and no abundance threshold (ϑ = ε = 0); ρ ≥ 0.8 was excluded because the Intersection dimension vanishes there on the published natural hybrid system. ASV counts were aggregated to genus; 48.6 % of ASVs, carrying 64.1 % of reads, were assigned to a genus (family: 77.9 % and 90.6 %), and unassigned ASVs were excluded. Because the package rarefies the aggregated table, samples were required to carry at least 1,000 genus-assigned reads (1,749 of the 1,784 rarefied samples) and were rarefied to that depth at each of 500 bootstraps; on the published natural hybrid system the parental axis varies by at most 0.067 between 1,000 and 10,000 reads [14]. Each bootstrap drew without replacement the same number of hosts N from each class, N being one less than the smallest class of pass 1 in the stratum (9 in the caudal fin, 10–19 elsewhere), and the same N was applied to pass 2 so that the two passes are compared on equal footing; pass 2 was also computed at its own N. An abundance-based version of the index (inspired by Bray–Curtis), the pre-analysis of core fractions, the null plane and a null hybrid model averaging one randomly drawn individual of each parental species were computed with the same settings. The index is reported along its parental (Union + Intersection) and transgressive (Gain + Loss) axes. An axis was called dominant when it exceeded 0.5 in all three runs, and robust when the same axis dominated at ρ = 0.3, at ρ = 0.7, at family rank and in the abundance-based version; two compartments were called different when the 95 % bootstrap intervals of the transgressive axis were disjoint in all three runs. The PERMANOVA comparison of bootstrap sets offered by the package was not used, because its p-value decreases with the arbitrarily chosen number of bootstraps. Preferential retention of the taxa shared by both parents was inferred when more than 95 % of bootstraps lay on the Intersection side of the null plane in all three runs. Following the framework's own statement of scope, the index is read as a pattern of taxon membership, not as evidence of an assembly process.</w:t>
+      </w:r>
+    </w:p>
+    <w:p>
+      <w:pPr>
+        <w:pStyle w:val="Heading2"/>
+      </w:pPr>
+      <w:r>
+        <w:rPr>
+          <w:color w:val="1F4E79"/>
+        </w:rPr>
+        <w:t>8.12 Pre-declared controls</w:t>
+      </w:r>
+    </w:p>
+    <w:p>
+      <w:pPr/>
+      <w:r>
+        <w:rPr>
+          <w:color w:val="1F4E79"/>
+        </w:rPr>
+        <w:t xml:space="preserve">Four further controls were declared, with their reading rules, in a document committed before computation, and their verdicts were applied by script. (i) Whether the attenuation of the caudal-fin signal at 500 reads reflects depth or the sample set: the 500-read matrices were restricted to the samples retained at 3,000 reads. (ii) Whether near-parental hybrids dilute the caudal-fin contrast: 19 </w:t>
+      </w:r>
+      <w:r>
+        <w:rPr>
+          <w:i/>
+          <w:color w:val="1F4E79"/>
+        </w:rPr>
+        <w:t>P. toxostoma</w:t>
+      </w:r>
+      <w:r>
+        <w:rPr>
+          <w:color w:val="1F4E79"/>
+        </w:rPr>
+        <w:t xml:space="preserve"> and 3 </w:t>
+      </w:r>
+      <w:r>
+        <w:rPr>
+          <w:i/>
+          <w:color w:val="1F4E79"/>
+        </w:rPr>
+        <w:t>C. nasus</w:t>
+      </w:r>
+      <w:r>
+        <w:rPr>
+          <w:color w:val="1F4E79"/>
+        </w:rPr>
+        <w:t xml:space="preserve"> drawn from the stations of the near-parental individuals were relabelled as hybrids in pass 1 (20 draws), and near-parental hybrids of </w:t>
+      </w:r>
+      <w:r>
+        <w:rPr>
+          <w:i/>
+          <w:color w:val="1F4E79"/>
+        </w:rPr>
+        <w:t>P. toxostoma</w:t>
+      </w:r>
+      <w:r>
+        <w:rPr>
+          <w:color w:val="1F4E79"/>
+        </w:rPr>
+        <w:t xml:space="preserve"> background were compared directly with pure </w:t>
+      </w:r>
+      <w:r>
+        <w:rPr>
+          <w:i/>
+          <w:color w:val="1F4E79"/>
+        </w:rPr>
+        <w:t>P. toxostoma</w:t>
+      </w:r>
+      <w:r>
+        <w:rPr>
+          <w:color w:val="1F4E79"/>
+        </w:rPr>
+        <w:t xml:space="preserve"> and with intermediate hybrids. (iii) The classification of hybrid alpha diversity described in §8.10. (iv) Whether plate column and processing order can be separated, by the Spearman correlation between individual number and plate column within each fishing campaign.</w:t>
       </w:r>
     </w:p>
     <w:p>
@@ -1076,21 +1461,16 @@
           <w:color w:val="1F4E79"/>
         </w:rPr>
       </w:r>
-      <w:r>
-        <w:t xml:space="preserve">A preliminary variance partition was run to size these terms before the ecological analysis, not as a result of it, in both passes and on the four metrics. Fitted in both orderings without plate position, genotypic category accounts for a median of 1.7 % to 2.8 % of compositional variance across the 48 metric × tissue × run strata in pass 1 and 1.4 % to 3.0 % in pass 2, against a median of 19 % and 18 % for station (range across strata 14–36 % in pass 1 and 14–35 % in pass 2). No tissue is detected by all four metrics in all three runs under both permutation schemes, in either pass, with or without plate position, so a global statement that hybrids differ is not supportable: the analysis must say which metric supports which claim, in which tissue, and under which definition of a hybrid. One result is robust to every choice made here — both passes, with and without plate position, all three runs and both permutation schemes: the midgut on Jaccard (p ≤ 0.044). The caudal fin on weighted UniFrac is detected in all three runs and both schemes in pass 1 (p = 0.007–0.024), with or without plate position, and in no run in pass 2 (p = 0.073–0.235). A witness attributes this displacement to the definition of hybrids rather than to sample size: removing 22 randomly chosen individuals from the 158 that are not introgressed, twenty times, never restored the caudal signal in pass 2. At 500 reads the caudal signal is partial in pass 1 (three runs sequentially, p = 0.022–0.049; one of three with station fixed by blocks) and absent in pass 2, </w:t>
-      </w:r>
-      <w:r>
-        <w:rPr>
+      <w:r/>
+      <w:r>
+        <w:rPr>
+          <w:b w:val="0"/>
           <w:i w:val="0"/>
           <w:color w:val="1F4E79"/>
         </w:rPr>
-        <w:t>an attenuation that is not an effect of depth: restricted to the samples retained at 3,000 reads, the 500-read matrices give the same result as at 3,000 reads (all three runs, both station-blocked schemes, p = 0.010–0.026), so the signal is diluted by the caudal-fin samples that pass the threshold only at 500 reads. As at 3,000 reads, none of twenty random removals of 22 non-introgressed individuals from pass 2 reproduced the pass-1 pattern at 500 reads.</w:t>
-      </w:r>
-      <w:r>
-        <w:rPr>
-          <w:i w:val="0"/>
-        </w:rPr>
-        <w:t xml:space="preserve"> The hindgut is the weakest tissue in pass 1 (only Jaccard is significant, in one run of three with station fixed by blocks) but not in pass 2, where with station fixed by blocks all four metrics detect it in all three runs; the witness does not resolve whether this difference reflects sample size or the definition of hybrids. The principal and sensitivity models differ in 7 of the 16 metric × tissue cells in each pass, of which 5 (pass 1) and 3 (pass 2) move between robust detection (three runs, both schemes), partial detection and none. Of the two witnesses that could have discriminated further, the separable sub-design detects category in 3 of 48 tests in pass 1 and 1 of 48 in pass 2 (with plate position), and Rosières, in pass 2, detects it in the gill on Jaccard and unweighted UniFrac in all three runs (p = 0.010–0.030); in pass 1 Rosières is not interpretable. Supplementary Table S9.</w:t>
+      </w:r>
+      <w:r>
+        <w:t>Dispersion was tested with PERMDISP on the same matrices, both with permutations constrained within station blocks and separately within each station carrying all three categories, where a dispersion difference cannot be spatial. The transgressive prediction in its dispersion form — hybrids more variable than both parental categories — is not supported and the data point the other way. Across the 48 station-blocked tests, hybrids are the least dispersed of the three categories in 32 (pass 1) and 34 (pass 2) and the most dispersed in 7 and 8, against the third expected by chance under no ordering (binomial p = 2.4 × 10-6 and 1.2 × 10-7). Within stations the pattern holds in pass 1 (45 of 68, p = 3.2 × 10-8); in pass 2 it is not significant over all 120 tests (41, p = 0.46), because the strata of Saint-Just-d'Ardèche, testable only in pass 2, and those of the Canal point the other way, but it holds on the 68 tests common to both passes (31 of 68, p = 0.024). Significant tests in the transgressive direction number 1 (pass 1) and 0 (pass 2) among station-blocked tests, and 0 and 5 within stations; the five of pass 2 all concern the gill at Saint-Just-d'Ardèche, where each stratum holds three or four P. toxostoma. Where dispersion does differ significantly it is mostly a parental category that is most variable: P. toxostoma in the caudal fin in pass 1; P. toxostoma or C. nasus in the midgut, and P. toxostoma in the hindgut and caudal fin, in pass 2. The effect is small: the median hybrid distance to group centre lies below the parental mean on Bray-Curtis (-0.029 and -0.065), unweighted UniFrac (-0.026 and -0.016) and Jaccard (-0.015 and -0.009); on weighted UniFrac it is null in pass 1 (+0.0002) and slightly below in pass 2 (-0.005). The less-dispersed pattern is therefore carried by the three metrics sensitive to rare taxa.</w:t>
       </w:r>
     </w:p>
     <w:p>
@@ -1161,19 +1541,15 @@
           <w:i w:val="0"/>
           <w:color w:val="1F4E79"/>
         </w:rPr>
-      </w:r>
-      <w:r>
-        <w:t>Dispersion was tested with PERMDISP on the same matrices, both with permutations constrained within station blocks and separately within each station carrying all three categories, where a dispersion difference cannot be spatial. The transgressive prediction in its dispersion form — hybrids more variable than both parental categories — is not supported and the data point the other way. Across the 48 station-blocked tests, hybrids are the least dispersed of the three categories in 32 (pass 1) and 34 (pass 2) and the most dispersed in 7 and 8, against the third expected by chance under no ordering (binomial p = 2.4 × 10-6 and 1.2 × 10-7). Within stations the pattern holds in pass 1 (45 of 68, p = 3.2 × 10-8); in pass 2 it is not significant over all 120 tests (41, p = 0.46), because the strata of Saint-Just-d'Ardèche, testable only in pass 2, and those of the Canal point the other way, but it holds on the 68 tests common to both passes (31 of 68, p = 0.024). Significant tests in the transgressive direction number 1 (pass 1) and 0 (pass 2) among station-blocked tests, and 0 and 5 within stations; the five of pass 2 all concern the gill at Saint-Just-d'Ardèche, where each stratum holds three or four P. toxostoma. Where dispersion does differ significantly it is mostly a parental category that is most variable: P. toxostoma in the caudal fin in pass 1; P. toxostoma or C. nasus in the midgut, and P. toxostoma in the hindgut and caudal fin, in pass 2. The effect is small: the median hybrid distance to group centre lies below the parental mean on Bray-Curtis (-0.029 and -0.065), unweighted UniFrac (-0.026 and -0.016) and Jaccard (-0.015 and -0.009); on weighted UniFrac it is null in pass 1 (+0.0002) and slightly below in pass 2 (-0.005). The less-dispersed pattern is therefore carried by the three metrics sensitive to rare taxa.</w:t>
-      </w:r>
-    </w:p>
-    <w:p>
-      <w:pPr/>
-      <w:r/>
+        <w:t xml:space="preserve">This bears directly on how the location results must be read, because PERMANOVA is sensitive to heterogeneous dispersion. In the caudal fin, dispersion is heterogeneous on Jaccard in all three runs in both passes, and on Bray-Curtis and unweighted UniFrac in all three runs in pass 1, so the location signals on those metrics cannot be separated from a dispersion effect. On weighted UniFrac dispersion is homogeneous in all three runs in both passes, and remains so within station. In pass 1, where the caudal-fin category effect on weighted UniFrac is significant in all three runs and both permutation schemes, that control could have failed and did not: the result is a difference in composition, not in variability. In pass 2 there is no location effect to interpret. One reservation is not resolved here: betadisper accepts no covariate, so the plate-position effect of </w:t>
+      </w:r>
       <w:r>
         <w:rPr>
           <w:b w:val="0"/>
           <w:i w:val="0"/>
-        </w:rPr>
+          <w:color w:val="1F4E79"/>
+        </w:rPr>
+        <w:t>§8.9</w:t>
       </w:r>
       <w:r>
         <w:rPr>
@@ -1181,60 +1557,7 @@
           <w:i w:val="0"/>
           <w:color w:val="1F4E79"/>
         </w:rPr>
-      </w:r>
-      <w:r>
-        <w:rPr>
-          <w:b w:val="0"/>
-          <w:i w:val="0"/>
-          <w:color w:val="1F4E79"/>
-        </w:rPr>
-      </w:r>
-      <w:r>
-        <w:rPr>
-          <w:b w:val="0"/>
-          <w:i w:val="0"/>
-          <w:color w:val="1F4E79"/>
-        </w:rPr>
-      </w:r>
-      <w:r>
-        <w:rPr>
-          <w:b w:val="0"/>
-          <w:i w:val="0"/>
-        </w:rPr>
-      </w:r>
-      <w:r>
-        <w:rPr>
-          <w:b w:val="0"/>
-          <w:i w:val="0"/>
-        </w:rPr>
-      </w:r>
-      <w:r>
-        <w:rPr>
-          <w:b w:val="0"/>
-          <w:i w:val="0"/>
-          <w:color w:val="1F4E79"/>
-        </w:rPr>
-      </w:r>
-      <w:r>
-        <w:rPr>
-          <w:b w:val="0"/>
-          <w:i w:val="0"/>
-          <w:color w:val="1F4E79"/>
-        </w:rPr>
-      </w:r>
-      <w:r>
-        <w:rPr>
-          <w:color w:val="1F4E79"/>
-        </w:rPr>
-      </w:r>
-      <w:r/>
-      <w:r>
-        <w:rPr>
-          <w:b w:val="0"/>
-          <w:i w:val="0"/>
-          <w:color w:val="1F4E79"/>
-        </w:rPr>
-        <w:t>This bears directly on how the location results must be read, because PERMANOVA is sensitive to heterogeneous dispersion. In the caudal fin, dispersion is heterogeneous on Jaccard in all three runs in both passes, and on Bray-Curtis and unweighted UniFrac in all three runs in pass 1, so the location signals on those metrics cannot be separated from a dispersion effect. On weighted UniFrac dispersion is homogeneous in all three runs in both passes, and remains so within station. In pass 1, where the caudal-fin category effect on weighted UniFrac is significant in all three runs and both permutation schemes, that control could have failed and did not: the result is a difference in composition, not in variability. In pass 2 there is no location effect to interpret. One reservation is not resolved here: betadisper accepts no covariate, so the plate-position effect of section 8.8 is not adjusted for, and a category whose samples are more spread across plate columns could carry inflated dispersion. Supplementary Table S10 and Figure S3.</w:t>
+        <w:t xml:space="preserve"> is not adjusted for, and a category whose samples are more spread across plate columns could carry inflated dispersion. Supplementary Table S10 and Figure S3.</w:t>
       </w:r>
     </w:p>
     <w:p>
@@ -1267,7 +1590,20 @@
         <w:rPr>
           <w:i w:val="0"/>
         </w:rPr>
-        <w:t>Raw sequence data have been deposited in the European Nucleotide Archive (ENA) at EMBL-EBI under accession number PRJEB124417. The submission comprises 768 samples and 2,304 sequencing runs (4,608 FASTQ files, 11.7 GB). Each sample was processed through two independent one-step dual-index PCR library preparations: the first library was sequenced once (run label durance1) and the second was sequenced twice on separate flow cells (durance2, durance3). Runs are named accordingly, so that the nested replication structure described in §8.7 — sequencing replication nested within library preparation — can be recovered directly from the run titles. Sample metadata follow the GSC MIxS host-associated checklist (ERC000013) and report collection year, sampling-site coordinates, host species and sampled tissue. Extraction blanks, no-template PCR controls and mock community aliquots are included in the submission and are identified as such in the sample titles; the 25 empty wells used to quantify index hopping (§8.2) are likewise deposited. Per-run accessions, file names and MD5 checksums for all 4,608 files are given in Supplementary Table S4.</w:t>
+        <w:t xml:space="preserve">Raw sequence data have been deposited in the European Nucleotide Archive (ENA) at EMBL-EBI under accession number PRJEB124417. The submission comprises 768 samples and 2,304 sequencing runs (4,608 FASTQ files, 11.7 GB). Each sample was processed through two independent one-step dual-index PCR library preparations: the first library was sequenced once (run label durance1) and the second was sequenced twice on separate flow cells (durance2, durance3). Runs are named accordingly, so that the nested replication structure described in </w:t>
+      </w:r>
+      <w:r>
+        <w:rPr>
+          <w:i w:val="0"/>
+          <w:color w:val="1F4E79"/>
+        </w:rPr>
+        <w:t>§8.8</w:t>
+      </w:r>
+      <w:r>
+        <w:rPr>
+          <w:i w:val="0"/>
+        </w:rPr>
+        <w:t xml:space="preserve"> — sequencing replication nested within library preparation — can be recovered directly from the run titles. Sample metadata follow the GSC MIxS host-associated checklist (ERC000013) and report collection year, sampling-site coordinates, host species and sampled tissue. Extraction blanks, no-template PCR controls and mock community aliquots are included in the submission and are identified as such in the sample titles; the 25 empty wells used to quantify index hopping (§8.2) are likewise deposited. Per-run accessions, file names and MD5 checksums for all 4,608 files are given in Supplementary Table S4.</w:t>
       </w:r>
     </w:p>
     <w:p>
@@ -1314,6 +1650,17 @@
           <w:sz w:val="18"/>
         </w:rPr>
         <w:t>[À COMPLÉTER : DOI Zenodo de la version utilisée pour l'article, le cas échéant (question 2.7, non tranché). Dépôt GitHub public (JF, 2026-10-03) ; vérifier que le miroir public est à jour au moment de la soumission — le 2026-10-03 il s'arrêtait au commit du 2026-09-25.]</w:t>
+      </w:r>
+    </w:p>
+    <w:p>
+      <w:pPr>
+        <w:pStyle w:val="Title"/>
+      </w:pPr>
+      <w:r>
+        <w:rPr>
+          <w:color w:val="1F4E79"/>
+        </w:rPr>
+        <w:t>Results</w:t>
       </w:r>
     </w:p>
     <w:p>
@@ -1321,28 +1668,1787 @@
         <w:pStyle w:val="Heading1"/>
       </w:pPr>
       <w:r>
-        <w:t>Funding</w:t>
+        <w:rPr>
+          <w:color w:val="1F4E79"/>
+        </w:rPr>
+        <w:t>Genotypic design and its entanglement with station</w:t>
       </w:r>
     </w:p>
     <w:p>
       <w:pPr/>
       <w:r>
         <w:rPr>
-          <w:i w:val="0"/>
-          <w:color w:val="1F4E79"/>
-        </w:rPr>
-        <w:t>This work was funded by Électricité de France (EDF) through an EDF–CNRS doctoral contract (AGDI 428481) financing the thesis of Arnaud Ungaro, the contract that also funded Guivier et al. (2017) within the FACIES project, with the support of the Fédération de l'Ain pour la pêche et la protection des milieux aquatiques.</w:t>
+          <w:color w:val="1F4E79"/>
+        </w:rPr>
+        <w:t xml:space="preserve">The 180 fish comprised 59 </w:t>
+      </w:r>
+      <w:r>
+        <w:rPr>
+          <w:i/>
+          <w:color w:val="1F4E79"/>
+        </w:rPr>
+        <w:t>C. nasus</w:t>
+      </w:r>
+      <w:r>
+        <w:rPr>
+          <w:color w:val="1F4E79"/>
+        </w:rPr>
+        <w:t xml:space="preserve">, 42 hybrids and 79 </w:t>
+      </w:r>
+      <w:r>
+        <w:rPr>
+          <w:i/>
+          <w:color w:val="1F4E79"/>
+        </w:rPr>
+        <w:t>P. toxostoma</w:t>
+      </w:r>
+      <w:r>
+        <w:rPr>
+          <w:color w:val="1F4E79"/>
+        </w:rPr>
+        <w:t xml:space="preserve">, unevenly distributed across the nine stations (Fig. 1a). Near-parental hybrids carry a median hybrid index close to that of one parent but an inter-chromosome discordance D of 0.15–0.60, against at most 0.12 in parental individuals (Fig. 1b); categories were assigned from chromosome-level assignments rather than by thresholding either quantity (§1). Of the 22 near-parental hybrids, 19 have a </w:t>
+      </w:r>
+      <w:r>
+        <w:rPr>
+          <w:i/>
+          <w:color w:val="1F4E79"/>
+        </w:rPr>
+        <w:t>P. toxostoma</w:t>
+      </w:r>
+      <w:r>
+        <w:rPr>
+          <w:color w:val="1F4E79"/>
+        </w:rPr>
+        <w:t xml:space="preserve"> background and 3 a </w:t>
+      </w:r>
+      <w:r>
+        <w:rPr>
+          <w:i/>
+          <w:color w:val="1F4E79"/>
+        </w:rPr>
+        <w:t>C. nasus</w:t>
+      </w:r>
+      <w:r>
+        <w:rPr>
+          <w:color w:val="1F4E79"/>
+        </w:rPr>
+        <w:t xml:space="preserve"> background.</w:t>
       </w:r>
     </w:p>
     <w:p>
       <w:pPr/>
+      <w:r/>
+      <w:r>
+        <w:rPr>
+          <w:b w:val="0"/>
+          <w:i w:val="0"/>
+        </w:rPr>
+      </w:r>
+      <w:r>
+        <w:rPr>
+          <w:b w:val="0"/>
+          <w:i w:val="0"/>
+          <w:color w:val="1F4E79"/>
+        </w:rPr>
+      </w:r>
+      <w:r>
+        <w:rPr>
+          <w:b w:val="0"/>
+          <w:i w:val="0"/>
+          <w:color w:val="1F4E79"/>
+        </w:rPr>
+      </w:r>
+      <w:r>
+        <w:rPr>
+          <w:b w:val="0"/>
+          <w:i w:val="0"/>
+          <w:color w:val="1F4E79"/>
+        </w:rPr>
+      </w:r>
+      <w:r>
+        <w:rPr>
+          <w:b w:val="0"/>
+          <w:i w:val="0"/>
+        </w:rPr>
+      </w:r>
+      <w:r>
+        <w:rPr>
+          <w:b w:val="0"/>
+          <w:i w:val="0"/>
+        </w:rPr>
+      </w:r>
+      <w:r>
+        <w:rPr>
+          <w:b w:val="0"/>
+          <w:i w:val="0"/>
+          <w:color w:val="1F4E79"/>
+        </w:rPr>
+        <w:t>Genotypic category is entangled with both the spatial and the technical axes, and the entanglement is a property of the design rather than a caveat of presentation. Between stations, category is confounded with station: of nine stations, three carry all three categories (74 individuals in pass 2, 65 in pass 1, where Saint-Just-d'Ardèche retains a single hybrid), the others one or two. Within those three stations, category and plate column are in turn strongly associated, because field numbering followed sampling order (</w:t>
+      </w:r>
+      <w:r>
+        <w:rPr>
+          <w:b w:val="0"/>
+          <w:i w:val="0"/>
+          <w:color w:val="1F4E79"/>
+        </w:rPr>
+        <w:t>§8.9</w:t>
+      </w:r>
+      <w:r>
+        <w:rPr>
+          <w:b w:val="0"/>
+          <w:i w:val="0"/>
+          <w:color w:val="1F4E79"/>
+        </w:rPr>
+        <w:t>). The sub-design in which category and position are fully separable at constant station comprises 31 individuals in pass 1 and 32 in pass 2, too few to carry a principal test. One station, Rosières, carries category and position independently (Cramér's V = 0.18, p = 0.35, in pass 2) and serves as a small clean witness; in pass 1 it retains a single hybrid and cannot witness a category effect.</w:t>
+      </w:r>
+    </w:p>
+    <w:p>
+      <w:pPr>
+        <w:pStyle w:val="Heading1"/>
+      </w:pPr>
+      <w:r>
+        <w:rPr>
+          <w:color w:val="1F4E79"/>
+        </w:rPr>
+        <w:t>Technical variation is small relative to biological variation</w:t>
+      </w:r>
+    </w:p>
+    <w:p>
+      <w:pPr/>
+      <w:r>
+        <w:t>The nested replication structure was verified directly from the data. Each pair of runs was compared within sample after rarefaction to a common depth, so that detection probability is identical by construction (548 samples reaching 3,000 reads in all three runs). The two runs sharing a library were markedly more similar to each other (mean Bray–Curtis 0.118, Jaccard 0.445) than either was to the run from the independent library (0.248 and 0.720 respectively); the two library-crossing comparisons were statistically indistinguishable from each other (paired Wilcoxon, p = 0.48) and both differed from the within-library comparison (p &lt; 10⁻⁸⁹). Recapture of rare ASVs (1–3 reads) showed the same pattern (0.48 within library vs 0.19 across).</w:t>
+      </w:r>
+    </w:p>
+    <w:p>
+      <w:pPr/>
+      <w:r>
+        <w:t>Library preparation therefore roughly doubles the technical dissimilarity contributed by sequencing alone, with a proportionally larger effect on presence–absence than on relative abundances. Sequencing run was accordingly modelled as nested within library preparation rather than as a three-level factor with interchangeable levels. Because each sample is present in every batch, technical and biological factors are crossed rather than confounded, so batch-correction methods designed for confounded meta-analyses were not applied.</w:t>
+      </w:r>
+      <w:r>
+        <w:t xml:space="preserve"> Index assignment across preparations and the verification of sample-to-file matching are detailed in Supplementary Table S5 and Note S1.</w:t>
+      </w:r>
+    </w:p>
+    <w:p>
+      <w:pPr/>
+      <w:r>
+        <w:rPr>
+          <w:i w:val="0"/>
+        </w:rPr>
+        <w:t>Relative to the biological signal, this technical variation is negligible. In a PERMANOVA on Bray–Curtis distances over the 1,784 samples retained after rarefaction, with the technical terms entered first so that they absorb the maximum variance the sequential decomposition can assign them, library preparation explained 0.03 % of the variance (R² = 0.0003, p = 0.63) and sequencing run within library 0.005 % (p = 1.00), against 9.2 % for tissue and 37.7 % for fish identity (both p = 0.002). Mean Bray–Curtis dissimilarity was 0.13 between two sequencing runs of one library and 0.25 across libraries, against 0.88 between different fish of the same tissue and 0.94 across tissues. Note that library preparation cannot be tested marginally, being perfectly aliased with run label (durance1 is the sole run of the first preparation).</w:t>
+      </w:r>
+    </w:p>
+    <w:p>
+      <w:pPr>
+        <w:pStyle w:val="Heading1"/>
+      </w:pPr>
+      <w:r>
+        <w:rPr>
+          <w:color w:val="1F4E79"/>
+        </w:rPr>
+        <w:t>Plate position</w:t>
+      </w:r>
+    </w:p>
+    <w:p>
+      <w:pPr/>
+      <w:r>
+        <w:rPr>
+          <w:color w:val="1F4E79"/>
+        </w:rPr>
+        <w:t xml:space="preserve">Plate column affected composition. </w:t>
+      </w:r>
+      <w:r/>
+      <w:r>
+        <w:rPr>
+          <w:b w:val="0"/>
+          <w:i w:val="0"/>
+        </w:rPr>
+      </w:r>
+      <w:r>
+        <w:rPr>
+          <w:b w:val="0"/>
+          <w:i w:val="0"/>
+          <w:color w:val="1F4E79"/>
+        </w:rPr>
+      </w:r>
+      <w:r>
+        <w:rPr>
+          <w:b w:val="0"/>
+          <w:i w:val="0"/>
+          <w:color w:val="1F4E79"/>
+        </w:rPr>
+        <w:t>The effect is present in all 24 strata (12 tissue × run strata × 2 metrics) in both passes (p ≤ 0.033 in pass 1, p ≤ 0.007 in pass 2), replicated across the three runs; it does not depend on category labels, and the two passes differ only by the 22 individuals excluded from pass 1. Because the terms differ in degrees of freedom, effect sizes are reported relative to their expectation under the null, R2/(df/(n−1)): plate column reaches 1.84 in pass 1 and 1.95 in pass 2 (median R2 = 0.152 and 0.141, 11 df), the same order as genotypic category fitted after column (1.61 and 1.77; median R2 = 0.026 and 0.024, 2 df; significant in 19 and 18 of 24 strata) and below station (3.32 and 3.69; median R2 = 0.204 and 0.196, 8 df). Supplementary Table S7 and Figure S1.</w:t>
+      </w:r>
+      <w:r>
+        <w:rPr>
+          <w:color w:val="1F4E79"/>
+        </w:rPr>
+      </w:r>
+    </w:p>
+    <w:p>
+      <w:pPr/>
+      <w:r/>
+      <w:r>
+        <w:rPr>
+          <w:b w:val="0"/>
+          <w:i w:val="0"/>
+        </w:rPr>
+      </w:r>
+      <w:r>
+        <w:rPr>
+          <w:b w:val="0"/>
+          <w:i w:val="0"/>
+          <w:color w:val="1F4E79"/>
+        </w:rPr>
+      </w:r>
+      <w:r>
+        <w:rPr>
+          <w:b w:val="0"/>
+          <w:i w:val="0"/>
+          <w:color w:val="1F4E79"/>
+        </w:rPr>
+      </w:r>
+      <w:r>
+        <w:rPr>
+          <w:b w:val="0"/>
+          <w:i w:val="0"/>
+          <w:color w:val="1F4E79"/>
+        </w:rPr>
+        <w:t>Three witnesses separate this effect from the biology it could be mistaken for. Within a single genotypic category, where a column effect cannot be a category effect, it persists but more weakly: among P. toxostoma alone in 17 of 24 strata in both passes (ratio 1.65), among C. nasus alone in 6 (pass 1) and 7 (pass 2) of 24 (ratio 1.63); hybrids alone are too few to be tested (two strata in pass 2, none in pass 1). No site code carries a single genotypic category, and the only single-category station (Chavannes-sur-Suran, 19 P. toxostoma) is too small for a separate witness; the within-category subsets therefore replace the single-category-station witness of an earlier analysis, which rested on fish left unresolved by morphology. In the symmetric ordering with category fitted first, column still contributes (21 and 22 of 24 strata). And the classic plate artefacts are absent: plate row is significant in 7 and 6 of 24 strata and plate edge in none, making the effect specific to column, as expected of an effect tracking processing order rather than evaporation or thermal gradients. The origin of the association between category and column is documented above, but the mechanism of the column effect itself is not identified: extraction order, reagent-batch drift within a plate, cross-contamination between adjacent wells and the delay between capture and dissection are not separated by these data, and no negative control isolates any of them. Plate column is therefore not entered in the principal models (</w:t>
+      </w:r>
+      <w:r>
+        <w:rPr>
+          <w:b w:val="0"/>
+          <w:i w:val="0"/>
+          <w:color w:val="1F4E79"/>
+        </w:rPr>
+        <w:t>§8.7</w:t>
+      </w:r>
+      <w:r>
+        <w:rPr>
+          <w:b w:val="0"/>
+          <w:i w:val="0"/>
+          <w:color w:val="1F4E79"/>
+        </w:rPr>
+        <w:t xml:space="preserve">), but every model testing category is also reported with plate column as a covariate, and the two versions are </w:t>
+      </w:r>
+      <w:r>
+        <w:rPr>
+          <w:b w:val="0"/>
+          <w:i w:val="0"/>
+          <w:color w:val="1F4E79"/>
+        </w:rPr>
+        <w:t>compared below</w:t>
+      </w:r>
+      <w:r>
+        <w:rPr>
+          <w:b w:val="0"/>
+          <w:i w:val="0"/>
+          <w:color w:val="1F4E79"/>
+        </w:rPr>
+        <w:t>.</w:t>
+      </w:r>
+    </w:p>
+    <w:p>
+      <w:pPr/>
+      <w:r>
+        <w:rPr>
+          <w:color w:val="1F4E79"/>
+        </w:rPr>
+        <w:t>Within every fishing campaign, plate column followed the order in which fish were processed (Spearman ρ between individual number and plate column, 0.55–0.95 over 12 station-year campaigns; §8.9 and §8.12), so that in this design the column effect cannot be separated from processing order, and therefore from the time each fish spent in the holding tank before dissection.</w:t>
+      </w:r>
       <w:r>
         <w:rPr>
           <w:i/>
           <w:color w:val="888888"/>
           <w:sz w:val="18"/>
         </w:rPr>
+        <w:t xml:space="preserve"> [ρ recalculé par scripts/40-verif_article_v2.py (results/verif_article/spearman_toutes_campagnes.tsv) : 0,548–0,950. Les deux campagnes de Pertuis 2014 sont agrégées ; Pont-d'Ain 2014 (moins de 4 poissons) n'est pas calculable.]</w:t>
+      </w:r>
+    </w:p>
+    <w:p>
+      <w:pPr/>
+      <w:r>
+        <w:rPr>
+          <w:i/>
+          <w:color w:val="888888"/>
+          <w:sz w:val="18"/>
+        </w:rPr>
+        <w:t>[À reformuler après l'arbitrage D2 de JF : « the delay between capture and dissection » ne correspond plus au protocole. Les poissons sont gardés vivants en vivier jusqu'à la dissection, 4–6 min par poisson (André, 2026-10-03) ; le confondant est la durée de séjour en vivier, c'est-à-dire l'ordre de traitement. Dans chaque campagne, la colonne suit cet ordre, et le test du 2026-10-03 ne peut pas séparer les deux (RESULTATS R32, docs/recalcul/note_tests_2026-10-03.md).]</w:t>
+      </w:r>
+    </w:p>
+    <w:p>
+      <w:pPr>
+        <w:pStyle w:val="Heading1"/>
+      </w:pPr>
+      <w:r>
+        <w:rPr>
+          <w:color w:val="1F4E79"/>
+        </w:rPr>
+        <w:t>Alpha diversity</w:t>
+      </w:r>
+    </w:p>
+    <w:p>
+      <w:pPr/>
+      <w:r>
+        <w:rPr>
+          <w:color w:val="1F4E79"/>
+        </w:rPr>
+        <w:t>Alpha diversity was higher in the external than in the internal compartments on all four indices (Fig. 2): the ratio of geometric means was 1.51 for Shannon (95 % confidence interval 1.40–1.64), 3.00 for inverse Simpson (2.48–3.63), 1.93 for observed richness (1.71–2.18) and 1.62 for Faith's phylogenetic diversity (1.50–1.76; n = 174 individuals; Wilcoxon p ≤ 4.6 × 10⁻¹⁷). The midgut was less diverse than the hindgut on the two unweighted indices only — observed richness, ratio 0.83 (p = 0.009), and Faith's phylogenetic diversity, 0.87 (p = 0.003) — and not on Shannon (0.94, p = 0.18) or inverse Simpson (0.87, p = 0.25; n = 136), so that this contrast is metric-dependent under the rule of §8.7. Tissue was the largest identifiable source of variance in log alpha diversity (marginal share 19–26 % depending on the index), followed by individual (17–21 %) and site-year (10–14 %, sequential share), with technical terms contributing at most 0.3 % and a residual of 38–45 %; the order of the factors was the same on the four indices.</w:t>
+      </w:r>
+    </w:p>
+    <w:p>
+      <w:pPr/>
+      <w:r>
+        <w:rPr>
+          <w:color w:val="1F4E79"/>
+        </w:rPr>
+        <w:t xml:space="preserve">Hybrids were transgressive in none of the 32 combinations of pass, tissue and index (Fig. 2). The only classification supported by both an abundance-weighted and a presence-based index was dominance of </w:t>
+      </w:r>
+      <w:r>
+        <w:rPr>
+          <w:i/>
+          <w:color w:val="1F4E79"/>
+        </w:rPr>
+        <w:t>C. nasus</w:t>
+      </w:r>
+      <w:r>
+        <w:rPr>
+          <w:color w:val="1F4E79"/>
+        </w:rPr>
+        <w:t xml:space="preserve"> — hybrids not distinguishable from </w:t>
+      </w:r>
+      <w:r>
+        <w:rPr>
+          <w:i/>
+          <w:color w:val="1F4E79"/>
+        </w:rPr>
+        <w:t>C. nasus</w:t>
+      </w:r>
+      <w:r>
+        <w:rPr>
+          <w:color w:val="1F4E79"/>
+        </w:rPr>
+        <w:t xml:space="preserve"> but distinct from </w:t>
+      </w:r>
+      <w:r>
+        <w:rPr>
+          <w:i/>
+          <w:color w:val="1F4E79"/>
+        </w:rPr>
+        <w:t>P. toxostoma</w:t>
+      </w:r>
+      <w:r>
+        <w:rPr>
+          <w:color w:val="1F4E79"/>
+        </w:rPr>
+        <w:t xml:space="preserve"> — in the caudal fin in pass 1 (four indices of four; p for category 0.012–0.128) and in the midgut in pass 2 (three of four; p = 0.040–0.111). The first was unchanged with plate position as a covariate; the second was not, two indices becoming intermediate and two undetermined. Five of the 32 principal tests reached p &lt; 0.05, without correction for multiplicity, and dominance denotes here the absence of a detectable difference from </w:t>
+      </w:r>
+      <w:r>
+        <w:rPr>
+          <w:i/>
+          <w:color w:val="1F4E79"/>
+        </w:rPr>
+        <w:t>C. nasus</w:t>
+      </w:r>
+      <w:r>
+        <w:rPr>
+          <w:color w:val="1F4E79"/>
+        </w:rPr>
+        <w:t>, not an equality.</w:t>
+      </w:r>
+      <w:r>
+        <w:rPr>
+          <w:i/>
+          <w:color w:val="888888"/>
+          <w:sz w:val="18"/>
+        </w:rPr>
+        <w:t xml:space="preserve"> [Non testé : C. nasus étant en général traité en premier (§1), le classement « dominant Cn » pourrait refléter l'ordre de traitement (RESULTATS R31). Le contraste femelles/mâles (R27) n'est pas rapporté tant que le code de sexe « X » n'est pas confirmé.]</w:t>
+      </w:r>
+    </w:p>
+    <w:p>
+      <w:pPr>
+        <w:pStyle w:val="Heading1"/>
+      </w:pPr>
+      <w:r>
+        <w:rPr>
+          <w:color w:val="1F4E79"/>
+        </w:rPr>
+        <w:t>Composition by genotypic category</w:t>
+      </w:r>
+    </w:p>
+    <w:p>
+      <w:pPr/>
+      <w:r/>
+      <w:r>
+        <w:rPr>
+          <w:b w:val="0"/>
+          <w:i w:val="0"/>
+        </w:rPr>
+      </w:r>
+      <w:r>
+        <w:rPr>
+          <w:b w:val="0"/>
+          <w:i w:val="0"/>
+          <w:color w:val="1F4E79"/>
+        </w:rPr>
+      </w:r>
+      <w:r>
+        <w:rPr>
+          <w:b w:val="0"/>
+          <w:i w:val="0"/>
+          <w:color w:val="1F4E79"/>
+        </w:rPr>
+      </w:r>
+      <w:r>
+        <w:rPr>
+          <w:b w:val="0"/>
+          <w:i w:val="0"/>
+          <w:color w:val="1F4E79"/>
+        </w:rPr>
+      </w:r>
+      <w:r>
+        <w:rPr>
+          <w:b w:val="0"/>
+          <w:i w:val="0"/>
+        </w:rPr>
+      </w:r>
+      <w:r>
+        <w:rPr>
+          <w:b w:val="0"/>
+          <w:i w:val="0"/>
+        </w:rPr>
+      </w:r>
+      <w:r>
+        <w:rPr>
+          <w:b w:val="0"/>
+          <w:i w:val="0"/>
+          <w:color w:val="1F4E79"/>
+        </w:rPr>
+      </w:r>
+      <w:r>
+        <w:rPr>
+          <w:b w:val="0"/>
+          <w:i w:val="0"/>
+          <w:color w:val="1F4E79"/>
+        </w:rPr>
+      </w:r>
+      <w:r>
+        <w:rPr>
+          <w:color w:val="1F4E79"/>
+        </w:rPr>
+      </w:r>
+      <w:r>
+        <w:t xml:space="preserve">A preliminary variance partition was run to size these terms before the ecological analysis, not as a result of it, in both passes and on the four metrics. Fitted in both orderings without plate position, genotypic category accounts for a median of 1.7 % to 2.8 % of compositional variance across the 48 metric × tissue × run strata in pass 1 and 1.4 % to 3.0 % in pass 2, against a median of 19 % and 18 % for station (range across strata 14–36 % in pass 1 and 14–35 % in pass 2). No tissue is detected by all four metrics in all three runs under both permutation schemes, in either pass, with or without plate position, so a global statement that hybrids differ is not supportable: the analysis must say which metric supports which claim, in which tissue, and under which definition of a hybrid. One result is robust to every choice made here — both passes, with and without plate position, all three runs and both permutation schemes: the midgut on Jaccard (p ≤ 0.044). The caudal fin on weighted UniFrac is detected in all three runs and both schemes in pass 1 (p = 0.007–0.024), with or without plate position, and in no run in pass 2 (p = 0.073–0.235). A witness attributes this displacement to the definition of hybrids rather than to sample size: removing 22 randomly chosen individuals from the 158 that are not introgressed, twenty times, never restored the caudal signal in pass 2. At 500 reads the caudal signal is partial in pass 1 (three runs sequentially, p = 0.022–0.049; one of three with station fixed by blocks) and absent in pass 2, </w:t>
+      </w:r>
+      <w:r>
+        <w:rPr>
+          <w:i w:val="0"/>
+          <w:color w:val="1F4E79"/>
+        </w:rPr>
+        <w:t>an attenuation that is not an effect of depth: restricted to the samples retained at 3,000 reads, the 500-read matrices give the same result as at 3,000 reads (all three runs, both station-blocked schemes, p = 0.010–0.026), so the signal is diluted by the caudal-fin samples that pass the threshold only at 500 reads. As at 3,000 reads, none of twenty random removals of 22 non-introgressed individuals from pass 2 reproduced the pass-1 pattern at 500 reads.</w:t>
+      </w:r>
+      <w:r>
+        <w:rPr>
+          <w:i w:val="0"/>
+        </w:rPr>
+        <w:t xml:space="preserve"> The hindgut is the weakest tissue in pass 1 (only Jaccard is significant, in one run of three with station fixed by blocks) but not in pass 2, where with station fixed by blocks all four metrics detect it in all three runs; the witness does not resolve whether this difference reflects sample size or the definition of hybrids. The principal and sensitivity models differ in 7 of the 16 metric × tissue cells in each pass, of which 5 (pass 1) and 3 (pass 2) move between robust detection (three runs, both schemes), partial detection and none. Of the two witnesses that could have discriminated further, the separable sub-design detects category in 3 of 48 tests in pass 1 and 1 of 48 in pass 2 (with plate position), and Rosières, in pass 2, detects it in the gill on Jaccard and unweighted UniFrac in all three runs (p = 0.010–0.030); in pass 1 Rosières is not interpretable. Supplementary Table S9.</w:t>
+      </w:r>
+    </w:p>
+    <w:p>
+      <w:pPr/>
+      <w:r>
+        <w:rPr>
+          <w:color w:val="1F4E79"/>
+        </w:rPr>
+        <w:t>Figure 3 summarises these detections in the principal model with permutations constrained within station blocks (Fig. 3a, b), and the variance shares on which they rest (Fig. 3c). Fitted before category, station accounted for a median of 20.9 % (pass 1) and 20.1 % (pass 2) of compositional variance; category accounted for 2.8 % and 3.0 % when fitted first and 1.7 % and 1.4 % when fitted last. Whether the loss of the caudal-fin signal between passes is produced by dilution of the hybrid–</w:t>
+      </w:r>
+      <w:r>
+        <w:rPr>
+          <w:i/>
+          <w:color w:val="1F4E79"/>
+        </w:rPr>
+        <w:t>P. toxostoma</w:t>
+      </w:r>
+      <w:r>
+        <w:rPr>
+          <w:color w:val="1F4E79"/>
+        </w:rPr>
+        <w:t xml:space="preserve"> contrast by the 19 near-parental hybrids of </w:t>
+      </w:r>
+      <w:r>
+        <w:rPr>
+          <w:i/>
+          <w:color w:val="1F4E79"/>
+        </w:rPr>
+        <w:t>P. toxostoma</w:t>
+      </w:r>
+      <w:r>
+        <w:rPr>
+          <w:color w:val="1F4E79"/>
+        </w:rPr>
+        <w:t xml:space="preserve"> background was tested (§8.12) and remains undetermined. Relabelling as hybrids 19 </w:t>
+      </w:r>
+      <w:r>
+        <w:rPr>
+          <w:i/>
+          <w:color w:val="1F4E79"/>
+        </w:rPr>
+        <w:t>P. toxostoma</w:t>
+      </w:r>
+      <w:r>
+        <w:rPr>
+          <w:color w:val="1F4E79"/>
+        </w:rPr>
+        <w:t xml:space="preserve"> and 3 </w:t>
+      </w:r>
+      <w:r>
+        <w:rPr>
+          <w:i/>
+          <w:color w:val="1F4E79"/>
+        </w:rPr>
+        <w:t>C. nasus</w:t>
+      </w:r>
+      <w:r>
+        <w:rPr>
+          <w:color w:val="1F4E79"/>
+        </w:rPr>
+        <w:t xml:space="preserve"> drawn from the stations of the near-parental individuals removed the pass-1 signal in 16 of 20 draws, so that such dilution is sufficient to produce the displacement; but the near-parental hybrids of </w:t>
+      </w:r>
+      <w:r>
+        <w:rPr>
+          <w:i/>
+          <w:color w:val="1F4E79"/>
+        </w:rPr>
+        <w:t>P. toxostoma</w:t>
+      </w:r>
+      <w:r>
+        <w:rPr>
+          <w:color w:val="1F4E79"/>
+        </w:rPr>
+        <w:t xml:space="preserve"> background differed neither from pure </w:t>
+      </w:r>
+      <w:r>
+        <w:rPr>
+          <w:i/>
+          <w:color w:val="1F4E79"/>
+        </w:rPr>
+        <w:t>P. toxostoma</w:t>
+      </w:r>
+      <w:r>
+        <w:rPr>
+          <w:color w:val="1F4E79"/>
+        </w:rPr>
+        <w:t xml:space="preserve"> (p = 0.28–0.60) nor from intermediate hybrids (p = 0.15–0.26; n = 25–26), so that dilution is not established.</w:t>
+      </w:r>
+      <w:r>
+        <w:rPr>
+          <w:i/>
+          <w:color w:val="888888"/>
+          <w:sz w:val="18"/>
+        </w:rPr>
+        <w:t xml:space="preserve"> [Le paragraphe précédent vient des Methods (ancien §8.9) : « not as a result of it » est à reformuler maintenant qu'il figure en Results. Les médianes de station de ce paragraphe (19 % et 18 %) sont celles de la station servie après la catégorie ; 20,9 % et 20,1 % ci-dessus, station servie en premier.]</w:t>
+      </w:r>
+    </w:p>
+    <w:p>
+      <w:pPr>
+        <w:pStyle w:val="Heading1"/>
+      </w:pPr>
+      <w:r>
+        <w:rPr>
+          <w:color w:val="1F4E79"/>
+        </w:rPr>
+        <w:t>Dispersion</w:t>
+      </w:r>
+    </w:p>
+    <w:p>
+      <w:pPr/>
+      <w:r>
+        <w:rPr>
+          <w:color w:val="1F4E79"/>
+        </w:rPr>
+        <w:t xml:space="preserve">The transgressive prediction in its dispersion form — hybrids more variable than both parental categories — was not supported in either pass (Fig. 4). With station fixed by blocks, hybrids were the least dispersed of the three categories in 22 of 48 tests in pass 1 and 32 of 48 in pass 2, against the third expected under no ordering (one-sided binomial p = 0.048 and 2.4 × 10⁻⁶), and the most dispersed in 18 and 10 (p = 0.32 and 0.98). Within the stations carrying all three categories, where a dispersion difference cannot be spatial, neither direction departed from chance: hybrids were the least dispersed in 25 of 68 tests in pass 1 and 39 of 120 in pass 2, and the most dispersed in 17 and 45. The lower dispersion of hybrids is therefore a pattern of the station-blocked analysis, clear in pass 2 only and carried mainly by Bray–Curtis (median difference between hybrids and the parental mean −0.068 in pass 2 and −0.008 in pass 1), the other metrics differing by less than 0.013. Significant tests in the transgressive direction numbered 3 in pass 1 (the gill on unweighted UniFrac in two runs and the caudal fin on weighted UniFrac in one) and none in pass 2 with station fixed by blocks, and none and 5 within stations, the five of pass 2 all concerning the gill at Saint-Just-d'Ardèche, where each stratum holds three or four </w:t>
+      </w:r>
+      <w:r>
+        <w:rPr>
+          <w:i/>
+          <w:color w:val="1F4E79"/>
+        </w:rPr>
+        <w:t>P. toxostoma</w:t>
+      </w:r>
+      <w:r>
+        <w:rPr>
+          <w:color w:val="1F4E79"/>
+        </w:rPr>
+        <w:t>.</w:t>
+      </w:r>
+    </w:p>
+    <w:p>
+      <w:pPr/>
+      <w:r>
+        <w:rPr>
+          <w:color w:val="1F4E79"/>
+        </w:rPr>
+        <w:t xml:space="preserve">This bears on how the location results are read, because PERMANOVA is sensitive to heterogeneous dispersion. With station fixed by blocks, dispersion in the caudal fin was homogeneous on all four metrics in pass 2 and in all but one test in pass 1 (weighted UniFrac, one run of three, p = 0.048, hybrids most dispersed): the caudal-fin location signal on weighted UniFrac in pass 1 is a difference in composition in two runs and cannot be separated from a dispersion difference in the third. The robust midgut signal on Jaccard was accompanied by homogeneous dispersion in pass 1 and in two runs of three in pass 2. By contrast, dispersion was heterogeneous in all three runs in the midgut on unweighted UniFrac in both passes and, in pass 2, in the midgut and hindgut on Bray–Curtis, </w:t>
+      </w:r>
+      <w:r>
+        <w:rPr>
+          <w:i/>
+          <w:color w:val="1F4E79"/>
+        </w:rPr>
+        <w:t>P. toxostoma</w:t>
+      </w:r>
+      <w:r>
+        <w:rPr>
+          <w:color w:val="1F4E79"/>
+        </w:rPr>
+        <w:t xml:space="preserve"> being the most dispersed category there; the location signals detected on those metrics in those compartments cannot be separated from a dispersion effect. One reservation is not resolved: betadisper accepts no covariate, so the plate-position effect (§8.9) is not adjusted for, and a category whose samples are more spread across plate columns could carry inflated dispersion. Supplementary Table S10 and Figure S3.</w:t>
+      </w:r>
+      <w:r>
+        <w:rPr>
+          <w:i/>
+          <w:color w:val="888888"/>
+          <w:sz w:val="18"/>
+        </w:rPr>
+        <w:t xml:space="preserve"> [Correction du 2026-10-03 : l'ancienne version de ces deux paragraphes, sans correction de petit effectif, donnait 32/48 (passe 1) et 34/48 (passe 2) en station bloquée, 45/68 intra-station en passe 1 et une dispersion hétérogène en caudale ; elle est retirée (docs/plan_permdisp_biais_2026-10-03.md, scripts 24 et 39). Table S10 et Figure S3 du supplément portent encore les valeurs non corrigées : à régénérer.]</w:t>
+      </w:r>
+    </w:p>
+    <w:p>
+      <w:pPr>
+        <w:pStyle w:val="Heading1"/>
+      </w:pPr>
+      <w:r>
+        <w:rPr>
+          <w:color w:val="1F4E79"/>
+        </w:rPr>
+        <w:t>Four-dimensional index</w:t>
+      </w:r>
+    </w:p>
+    <w:p>
+      <w:pPr/>
+      <w:r>
+        <w:rPr>
+          <w:color w:val="1F4E79"/>
+        </w:rPr>
+        <w:t>Under the principal setting, the transgressive axis of the 4H index exceeded 0.5 in all three runs in the caudal fin, midgut and hindgut of both passes (Gain + Loss = 0.58–0.69), carried by the Loss model, whereas the parental axis dominated in the gill (Gain + Loss = 0.41–0.46), carried by Intersection (Fig. 5a). None of these transgressive readings was robust under the pre-declared rule (Fig. 5b): the abundance-based version placed all eight tissue × pass combinations on the parental axis, and at family rank the caudal fin also fell on the parental side. The only robust reading was the parental axis of the gill in pass 2; in pass 1 the gill was undetermined at ρ = 0.7. No pair of compartments was distinguished, the 95 % bootstrap intervals of the transgressive axis overlapping in at least one run for every pair, in both passes. In every tissue and both passes at least 98.4 % of bootstraps lay on the Intersection side of the null plane: hybrids preferentially retain the core taxa shared by both parental species. The core of hybrids represented less than half of the mean parental core in the midgut of pass 1 (two runs of three; ratio 0.45–0.64) and 0.51–1.07 of it elsewhere. Compared at equal N, passes 1 and 2 fell on the same axis in every tissue.</w:t>
+      </w:r>
+    </w:p>
+    <w:p>
+      <w:pPr/>
+      <w:r>
+        <w:rPr>
+          <w:color w:val="1F4E79"/>
+        </w:rPr>
+        <w:t>Two observations lie outside the pre-declared rules and are reported as descriptions only. A null hybrid built by averaging one randomly drawn individual of each parental species already reached a transgressive share of 0.40–0.57; the observed share exceeded it by 0.08–0.15 in the caudal fin, 0.09–0.22 in the midgut and 0.03–0.13 in the hindgut, and differed from it by −0.04 to +0.06 in the gill (Fig. 5). Computed at its own, larger N (26–40 hosts per class), pass 2 moved the caudal fin to the parental axis (Gain + Loss = 0.42–0.47), while the midgut and hindgut remained on the transgressive side.</w:t>
+      </w:r>
+    </w:p>
+    <w:p>
+      <w:pPr>
+        <w:pStyle w:val="Title"/>
+      </w:pPr>
+      <w:r>
+        <w:rPr>
+          <w:color w:val="1F4E79"/>
+        </w:rPr>
+        <w:t>Discussion</w:t>
+      </w:r>
+    </w:p>
+    <w:p>
+      <w:pPr/>
+      <w:r>
+        <w:rPr>
+          <w:color w:val="1F4E79"/>
+        </w:rPr>
+        <w:t xml:space="preserve">Across alpha diversity, community dispersion and the 4H index, the microbiota of hybrids between </w:t>
+      </w:r>
+      <w:r>
+        <w:rPr>
+          <w:i/>
+          <w:color w:val="1F4E79"/>
+        </w:rPr>
+        <w:t>C. nasus</w:t>
+      </w:r>
+      <w:r>
+        <w:rPr>
+          <w:color w:val="1F4E79"/>
+        </w:rPr>
+        <w:t xml:space="preserve"> and </w:t>
+      </w:r>
+      <w:r>
+        <w:rPr>
+          <w:i/>
+          <w:color w:val="1F4E79"/>
+        </w:rPr>
+        <w:t>P. toxostoma</w:t>
+      </w:r>
+      <w:r>
+        <w:rPr>
+          <w:color w:val="1F4E79"/>
+        </w:rPr>
+        <w:t xml:space="preserve"> showed no transgressive pattern. Hybrids were transgressive in none of 32 alpha-diversity tests, </w:t>
+      </w:r>
+      <w:r>
+        <w:rPr>
+          <w:color w:val="1F4E79"/>
+        </w:rPr>
+        <w:t>were more dispersed than both parents no more often than expected by chance,</w:t>
+      </w:r>
+      <w:r>
+        <w:rPr>
+          <w:color w:val="1F4E79"/>
+        </w:rPr>
+        <w:t xml:space="preserve"> and no transgressive reading of the 4H index survived the robustness rule declared before computation. Where hybrids could be placed relative to their parents, they fell within the parental range: dominance of </w:t>
+      </w:r>
+      <w:r>
+        <w:rPr>
+          <w:i/>
+          <w:color w:val="1F4E79"/>
+        </w:rPr>
+        <w:t>C. nasus</w:t>
+      </w:r>
+      <w:r>
+        <w:rPr>
+          <w:color w:val="1F4E79"/>
+        </w:rPr>
+        <w:t xml:space="preserve"> in caudal-fin alpha diversity in pass 1, a parental, Intersection-dominated 4H index in the gill, and preferential retention of the core taxa shared by both parental species in every compartment. The departures detected in composition were small — genotypic category accounted for a median of 1.4–3.0 % of compositional variance against about a fifth for station — and confined to particular compartments, metrics and definitions of a hybrid. This places the system with natural hybrid zones in which the environmental component dominates [23, 24] rather than with those in which host ancestry does [21, 22], while keeping in view that a small genetic effect is the expected magnitude for a heritable but weakly heritable trait [9] and that its detection required separating the spatial and technical axes beforehand, as in stickleback [10].</w:t>
+      </w:r>
+    </w:p>
+    <w:p>
+      <w:pPr/>
+      <w:r>
+        <w:rPr>
+          <w:color w:val="1F4E79"/>
+        </w:rPr>
+        <w:t>The expectation derived from Guivier et al. [31], that a hybrid signal would be most pronounced in the digestive compartments, is partly supported. The only compositional result that withstood every analytical choice concerned the midgut, on a presence-based metric, and in pass 2 both digestive compartments were detected by all four metrics with station fixed by blocks. But the caudal fin carried, in pass 1, a signal on weighted UniFrac that no digestive compartment showed on that metric, the gill was the compartment in which the 4H index was robustly parental, and the 4H index distinguished no pair of compartments. Hybrid status therefore does not matter equally in all compartments, but which compartment carries a difference depends on the metric. The rule adopted here, which states a result as established only when an abundance-weighted and a presence-based metric both support it, makes this dependence explicit rather than resolving it; it also explains why the 4H index, a presence-based construct in its principal form, departed from its abundance-based version in every compartment but the gill.</w:t>
+      </w:r>
+    </w:p>
+    <w:p>
+      <w:pPr/>
+      <w:r>
+        <w:rPr>
+          <w:color w:val="1F4E79"/>
+        </w:rPr>
+        <w:t xml:space="preserve">How hybrids are defined mattered as much as which compartment is examined. The caudal-fin signal obtained with the 20 intermediate hybrids disappeared when the 22 near-parental individuals were added, and twenty random removals of 22 non-introgressed fish never reproduced the displacement, so that it is attributable to who is called a hybrid rather than to sample size. Whether near-parental hybrids of </w:t>
+      </w:r>
+      <w:r>
+        <w:rPr>
+          <w:i/>
+          <w:color w:val="1F4E79"/>
+        </w:rPr>
+        <w:t>P. toxostoma</w:t>
+      </w:r>
+      <w:r>
+        <w:rPr>
+          <w:color w:val="1F4E79"/>
+        </w:rPr>
+        <w:t xml:space="preserve"> background dilute the contrast because their microbiota resembles that of </w:t>
+      </w:r>
+      <w:r>
+        <w:rPr>
+          <w:i/>
+          <w:color w:val="1F4E79"/>
+        </w:rPr>
+        <w:t>P. toxostoma</w:t>
+      </w:r>
+      <w:r>
+        <w:rPr>
+          <w:color w:val="1F4E79"/>
+        </w:rPr>
+        <w:t xml:space="preserve"> could not be established at the available sample size. In a mosaic hybrid zone [30] in which most introgressed individuals depart from a parental genome on a single chromosome, a hybrid class is a decision; reporting both passes shows how much of any conclusion rests on that decision, and we suggest that studies of natural hybrid zones report it in the same way.</w:t>
+      </w:r>
+    </w:p>
+    <w:p>
+      <w:pPr/>
+      <w:r>
+        <w:rPr>
+          <w:color w:val="1F4E79"/>
+        </w:rPr>
+        <w:t>That hybrids were not more dispersed than their parents runs against the expectation that the microbiota of hybrids is more variable because their genomes combine parental elements in variable proportions. The opposite tendency, hybrids less dispersed than both parents, was clear only in pass 2 with station fixed by blocks, absent within stations and carried mainly by Bray–Curtis, and should not be read as a general property of hybrids here. The dispersion analysis also illustrates a pitfall of unbalanced designs: without correction for group size the distance to the group centre is underestimated in small groups, and because hybrids were the smallest category in every stratum, the uncorrected analysis yielded a strong and apparently replicated reduction of hybrid dispersion — 32 of 48 station-blocked tests in pass 1 and 45 of 68 within stations — that largely disappeared once corrected. Hybrid classes are small in most natural hybrid zones, and the correction should be applied by default in that setting [48].</w:t>
+      </w:r>
+    </w:p>
+    <w:p>
+      <w:pPr/>
+      <w:r>
+        <w:rPr>
+          <w:color w:val="1F4E79"/>
+        </w:rPr>
+        <w:t xml:space="preserve">The 4H index adds two points that the location and dispersion analyses do not. First, in its abundance-based version — the form in which the framework's authors compared published systems [14] — the index placed every compartment on the parental axis (Gain + Loss = 0.22–0.35), as in the </w:t>
+      </w:r>
+      <w:r>
+        <w:rPr>
+          <w:i/>
+          <w:color w:val="1F4E79"/>
+        </w:rPr>
+        <w:t>Neotoma</w:t>
+      </w:r>
+      <w:r>
+        <w:rPr>
+          <w:color w:val="1F4E79"/>
+        </w:rPr>
+        <w:t xml:space="preserve"> woodrat system (0.12) and unlike the </w:t>
+      </w:r>
+      <w:r>
+        <w:rPr>
+          <w:i/>
+          <w:color w:val="1F4E79"/>
+        </w:rPr>
+        <w:t>Aspidoscelis</w:t>
+      </w:r>
+      <w:r>
+        <w:rPr>
+          <w:color w:val="1F4E79"/>
+        </w:rPr>
+        <w:t xml:space="preserve"> lizard and </w:t>
+      </w:r>
+      <w:r>
+        <w:rPr>
+          <w:i/>
+          <w:color w:val="1F4E79"/>
+        </w:rPr>
+        <w:t>Kikihia</w:t>
+      </w:r>
+      <w:r>
+        <w:rPr>
+          <w:color w:val="1F4E79"/>
+        </w:rPr>
+        <w:t xml:space="preserve"> cicada systems (0.71 and 0.64); on a hybrid lizard, transgression has been associated with ecological success rather than with dysbiosis [15], so the absence of transgression here carries no implication for hybrid fitness either way. Second, as its authors found for a natural hybrid system, the index was sensitive to its settings: the choice between presence and abundance reversed the reading in three compartments of four, and in the caudal fin so did the number of hosts per class, from 9 to 26–27. A null hybrid built from parental individuals already sits close to the 0.5 boundary between the two axes, which makes that boundary a weak criterion for calling a hybrid microbiota transgressive. We therefore read the 4H index as a description of taxon membership conditional on its settings, and not as an independent test of the intermediate, dominant and transgressive hypotheses.</w:t>
+      </w:r>
+    </w:p>
+    <w:p>
+      <w:pPr/>
+      <w:r>
+        <w:rPr>
+          <w:color w:val="1F4E79"/>
+        </w:rPr>
+        <w:t xml:space="preserve">Four limits bound these conclusions. Genotypic category is confounded with station, and the three stations that carry all three categories hold 65–74 individuals, so that every category effect is estimated mostly between stations and is read as a pattern co-varying with station and category. Plate position affected composition and followed processing order in every campaign; the mechanism — extraction order, reagent drift within a plate, cross-contamination between adjacent wells or time spent in the holding tank — is not identified, and because </w:t>
+      </w:r>
+      <w:r>
+        <w:rPr>
+          <w:i/>
+          <w:color w:val="1F4E79"/>
+        </w:rPr>
+        <w:t>C. nasus</w:t>
+      </w:r>
+      <w:r>
+        <w:rPr>
+          <w:color w:val="1F4E79"/>
+        </w:rPr>
+        <w:t xml:space="preserve"> was generally processed first it could contribute to the dominance of </w:t>
+      </w:r>
+      <w:r>
+        <w:rPr>
+          <w:i/>
+          <w:color w:val="1F4E79"/>
+        </w:rPr>
+        <w:t>C. nasus</w:t>
+      </w:r>
+      <w:r>
+        <w:rPr>
+          <w:color w:val="1F4E79"/>
+        </w:rPr>
+        <w:t xml:space="preserve"> in caudal-fin alpha diversity, which was not tested. Rarefaction to 3,000 reads retained intermediate hybrids less often than </w:t>
+      </w:r>
+      <w:r>
+        <w:rPr>
+          <w:i/>
+          <w:color w:val="1F4E79"/>
+        </w:rPr>
+        <w:t>P. toxostoma</w:t>
+      </w:r>
+      <w:r>
+        <w:rPr>
+          <w:color w:val="1F4E79"/>
+        </w:rPr>
+        <w:t xml:space="preserve"> in the caudal fin, a selection that is declared but cannot be removed for presence-based metrics. And only 64 % of reads could be aggregated to genus for the 4H index, whose genus-level reading therefore rests on the better-assigned part of each community.</w:t>
+      </w:r>
+    </w:p>
+    <w:p>
+      <w:pPr>
+        <w:pStyle w:val="Title"/>
+      </w:pPr>
+      <w:r>
+        <w:rPr>
+          <w:color w:val="1F4E79"/>
+        </w:rPr>
+        <w:t>Conclusions</w:t>
+      </w:r>
+    </w:p>
+    <w:p>
+      <w:pPr/>
+      <w:r>
+        <w:rPr>
+          <w:color w:val="1F4E79"/>
+        </w:rPr>
+        <w:t xml:space="preserve">In a natural, mosaic hybrid zone between </w:t>
+      </w:r>
+      <w:r>
+        <w:rPr>
+          <w:i/>
+          <w:color w:val="1F4E79"/>
+        </w:rPr>
+        <w:t>C. nasus</w:t>
+      </w:r>
+      <w:r>
+        <w:rPr>
+          <w:color w:val="1F4E79"/>
+        </w:rPr>
+        <w:t xml:space="preserve"> and </w:t>
+      </w:r>
+      <w:r>
+        <w:rPr>
+          <w:i/>
+          <w:color w:val="1F4E79"/>
+        </w:rPr>
+        <w:t>P. toxostoma</w:t>
+      </w:r>
+      <w:r>
+        <w:rPr>
+          <w:color w:val="1F4E79"/>
+        </w:rPr>
+        <w:t xml:space="preserve">, the bacterial microbiota of hybrids lay within the parental range in four tissue compartments: no transgressive pattern was found in alpha diversity, </w:t>
+      </w:r>
+      <w:r>
+        <w:rPr>
+          <w:color w:val="1F4E79"/>
+        </w:rPr>
+        <w:t>community dispersion</w:t>
+      </w:r>
+      <w:r>
+        <w:rPr>
+          <w:color w:val="1F4E79"/>
+        </w:rPr>
+        <w:t xml:space="preserve"> or the 4H index, and hybrids preferentially retained the core taxa shared by both parents. Departures from the parents were small relative to spatial variation and depended on the compartment, the metric and the definition of a hybrid. Studies of hybrid microbiota in natural populations should therefore report the definition of a hybrid, the metric and the tissue alongside each result, and treat spatial and technical structure as part of the design rather than as noise.</w:t>
+      </w:r>
+    </w:p>
+    <w:p>
+      <w:pPr>
+        <w:pStyle w:val="Title"/>
+      </w:pPr>
+      <w:r>
+        <w:rPr>
+          <w:color w:val="1F4E79"/>
+        </w:rPr>
+        <w:t>Abbreviations</w:t>
+      </w:r>
+    </w:p>
+    <w:p>
+      <w:pPr/>
+      <w:r>
+        <w:rPr>
+          <w:color w:val="1F4E79"/>
+        </w:rPr>
+        <w:t xml:space="preserve">4H: four-dimensional hybrid microbiome index (Union, Intersection, Gain, Loss); ASV: amplicon sequence variant; Cn: </w:t>
+      </w:r>
+      <w:r>
+        <w:rPr>
+          <w:i/>
+          <w:color w:val="1F4E79"/>
+        </w:rPr>
+        <w:t>Chondrostoma nasus</w:t>
+      </w:r>
+      <w:r>
+        <w:rPr>
+          <w:color w:val="1F4E79"/>
+        </w:rPr>
+        <w:t xml:space="preserve">; D: inter-chromosome discordance of the hybrid index; Hy: hybrid; PERMANOVA: permutational multivariate analysis of variance; PERMDISP: permutational analysis of multivariate dispersions; Pt: </w:t>
+      </w:r>
+      <w:r>
+        <w:rPr>
+          <w:i/>
+          <w:color w:val="1F4E79"/>
+        </w:rPr>
+        <w:t>Parachondrostoma toxostoma</w:t>
+      </w:r>
+      <w:r>
+        <w:rPr>
+          <w:color w:val="1F4E79"/>
+        </w:rPr>
+        <w:t>; UniFrac: unique fraction metric.</w:t>
+      </w:r>
+    </w:p>
+    <w:p>
+      <w:pPr>
+        <w:pStyle w:val="Title"/>
+      </w:pPr>
+      <w:r>
+        <w:rPr>
+          <w:color w:val="1F4E79"/>
+        </w:rPr>
+        <w:t>Declarations</w:t>
+      </w:r>
+    </w:p>
+    <w:p>
+      <w:pPr>
+        <w:pStyle w:val="Heading1"/>
+      </w:pPr>
+      <w:r>
+        <w:rPr>
+          <w:color w:val="1F4E79"/>
+        </w:rPr>
+        <w:t>Ethics approval and consent to participate</w:t>
+      </w:r>
+    </w:p>
+    <w:p>
+      <w:pPr/>
+      <w:r>
+        <w:rPr>
+          <w:color w:val="1F4E79"/>
+        </w:rPr>
+        <w:t>Fish were captured by electrofishing and euthanised before dissection under authorisations n° 2014-156-0001 and n° 2015-1426DDT605, following international guidelines of animal care.</w:t>
+      </w:r>
+      <w:r>
+        <w:rPr>
+          <w:i/>
+          <w:color w:val="888888"/>
+          <w:sz w:val="18"/>
+        </w:rPr>
+        <w:t xml:space="preserve"> [À compléter (questions de suivi à André, 2026-10-03) : autorités de délivrance — ONEMA et DDT 04, 05 et 84 selon André — et couverture des stations de l'Ain et de l'Ardèche ; méthode d'euthanasie (dislocation cervicale, non confirmée). Consentement : sans objet.]</w:t>
+      </w:r>
+    </w:p>
+    <w:p>
+      <w:pPr>
+        <w:pStyle w:val="Heading1"/>
+      </w:pPr>
+      <w:r>
+        <w:rPr>
+          <w:color w:val="1F4E79"/>
+        </w:rPr>
+        <w:t>Consent for publication</w:t>
+      </w:r>
+    </w:p>
+    <w:p>
+      <w:pPr/>
+      <w:r>
+        <w:rPr>
+          <w:color w:val="1F4E79"/>
+        </w:rPr>
+        <w:t>Not applicable.</w:t>
+      </w:r>
+    </w:p>
+    <w:p>
+      <w:pPr>
+        <w:pStyle w:val="Heading1"/>
+      </w:pPr>
+      <w:r>
+        <w:rPr>
+          <w:color w:val="1F4E79"/>
+        </w:rPr>
+        <w:t>Availability of data and materials</w:t>
+      </w:r>
+    </w:p>
+    <w:p>
+      <w:pPr/>
+      <w:r>
+        <w:rPr>
+          <w:color w:val="1F4E79"/>
+        </w:rPr>
+        <w:t>The raw sequence data are available in the European Nucleotide Archive under accession PRJEB124417. The code, the scripts that produced every result and the decision log are available at https://github.com/martinjfsupagro/microbiome-hybrid [51]. Individual genotypes are given in Supplementary Table S2.</w:t>
+      </w:r>
+      <w:r>
+        <w:rPr>
+          <w:i/>
+          <w:color w:val="888888"/>
+          <w:sz w:val="18"/>
+        </w:rPr>
+        <w:t xml:space="preserve"> [DOI Zenodo de la version citée : à créer à la soumission (question 2.7, non tranchée).]</w:t>
+      </w:r>
+    </w:p>
+    <w:p>
+      <w:pPr>
+        <w:pStyle w:val="Heading1"/>
+      </w:pPr>
+      <w:r>
+        <w:rPr>
+          <w:color w:val="1F4E79"/>
+        </w:rPr>
+        <w:t>Competing interests</w:t>
+      </w:r>
+    </w:p>
+    <w:p>
+      <w:pPr/>
+      <w:r>
+        <w:rPr>
+          <w:color w:val="1F4E79"/>
+        </w:rPr>
+        <w:t>The authors declare that they have no competing interests.</w:t>
+      </w:r>
+      <w:r>
+        <w:rPr>
+          <w:i/>
+          <w:color w:val="888888"/>
+          <w:sz w:val="18"/>
+        </w:rPr>
+        <w:t xml:space="preserve"> [À confirmer par chaque auteur.]</w:t>
+      </w:r>
+    </w:p>
+    <w:p>
+      <w:pPr>
+        <w:pStyle w:val="Heading1"/>
+      </w:pPr>
+      <w:r>
+        <w:t>Funding</w:t>
+      </w:r>
+    </w:p>
+    <w:p>
+      <w:pPr/>
+      <w:r>
+        <w:rPr>
+          <w:i w:val="0"/>
+          <w:color w:val="1F4E79"/>
+        </w:rPr>
+        <w:t>This work was funded by Électricité de France (EDF) through an EDF–CNRS doctoral contract (AGDI 428481) financing the thesis of Arnaud Ungaro, the contract that also funded Guivier et al. [31] within the FACIES project, with the support of the Fédération de l'Ain pour la pêche et la protection des milieux aquatiques.</w:t>
+      </w:r>
+    </w:p>
+    <w:p>
+      <w:pPr/>
+      <w:r>
+        <w:rPr>
+          <w:i/>
+          <w:color w:val="888888"/>
+          <w:sz w:val="18"/>
+        </w:rPr>
         <w:t>[Financement : référence du contrat « EDF-CNRS AGDI 428481 » (André, 2026-10-03). Le rattachement de ce contrat de thèse au projet FACIES de Guivier et al. (2017) combine deux réponses d'André (2026-09-30 et 2026-10-03) et n'est pas confirmé explicitement — à vérifier. Section Acknowledgements : à rédiger en fin de manuscrit (André, 2026-10-03).]</w:t>
+      </w:r>
+    </w:p>
+    <w:p>
+      <w:pPr>
+        <w:pStyle w:val="Heading1"/>
+      </w:pPr>
+      <w:r>
+        <w:rPr>
+          <w:color w:val="1F4E79"/>
+        </w:rPr>
+        <w:t>Authors' contributions</w:t>
+      </w:r>
+    </w:p>
+    <w:p>
+      <w:pPr/>
+      <w:r>
+        <w:rPr>
+          <w:i/>
+          <w:color w:val="888888"/>
+          <w:sz w:val="18"/>
+        </w:rPr>
+        <w:t>[À rédiger : contributions par initiales (conception, terrain, laboratoire, génotypage, analyse, rédaction), liste des auteurs à fixer.]</w:t>
+      </w:r>
+    </w:p>
+    <w:p>
+      <w:pPr>
+        <w:pStyle w:val="Heading1"/>
+      </w:pPr>
+      <w:r>
+        <w:rPr>
+          <w:color w:val="1F4E79"/>
+        </w:rPr>
+        <w:t>Acknowledgements</w:t>
+      </w:r>
+    </w:p>
+    <w:p>
+      <w:pPr/>
+      <w:r>
+        <w:rPr>
+          <w:i/>
+          <w:color w:val="888888"/>
+          <w:sz w:val="18"/>
+        </w:rPr>
+        <w:t>[À rédiger en fin de manuscrit (André, 2026-10-03).]</w:t>
+      </w:r>
+    </w:p>
+    <w:p>
+      <w:pPr>
+        <w:pStyle w:val="Title"/>
+      </w:pPr>
+      <w:r>
+        <w:rPr>
+          <w:color w:val="1F4E79"/>
+        </w:rPr>
+        <w:t>References</w:t>
+      </w:r>
+    </w:p>
+    <w:p>
+      <w:pPr/>
+      <w:r>
+        <w:rPr>
+          <w:color w:val="1F4E79"/>
+        </w:rPr>
+        <w:t>1. Bordenstein SR, Theis KR. Host Biology in Light of the Microbiome: Ten Principles of Holobionts and Hologenomes. PLOS Biology. 2015;13:e1002226. https://doi.org/10.1371/journal.pbio.1002226.</w:t>
+      </w:r>
+    </w:p>
+    <w:p>
+      <w:pPr/>
+      <w:r>
+        <w:rPr>
+          <w:color w:val="1F4E79"/>
+        </w:rPr>
+        <w:t>2. Shapira M. Gut Microbiotas and Host Evolution: Scaling Up Symbiosis. Trends in Ecology &amp; Evolution. 2016;31:539–549. https://doi.org/10.1016/j.tree.2016.03.006.</w:t>
+      </w:r>
+    </w:p>
+    <w:p>
+      <w:pPr/>
+      <w:r>
+        <w:rPr>
+          <w:color w:val="1F4E79"/>
+        </w:rPr>
+        <w:t>3. Shropshire JD, Bordenstein SR. Speciation by Symbiosis: the Microbiome and Behavior. mBio. 2016;7:e01785–15. https://doi.org/10.1128/mbio.01785-15.</w:t>
+      </w:r>
+    </w:p>
+    <w:p>
+      <w:pPr/>
+      <w:r>
+        <w:rPr>
+          <w:color w:val="1F4E79"/>
+        </w:rPr>
+        <w:t>4. Adair KL, Douglas AE. Making a microbiome: the many determinants of host-associated microbial community composition. Current Opinion in Microbiology. 2017;35:23–29. https://doi.org/10.1016/j.mib.2016.11.002.</w:t>
+      </w:r>
+    </w:p>
+    <w:p>
+      <w:pPr/>
+      <w:r>
+        <w:rPr>
+          <w:color w:val="1F4E79"/>
+        </w:rPr>
+        <w:t>5. Llewellyn MS, Boutin S, Hoseinifar SH, Derome N. Teleost microbiomes: the state of the art in their characterization, manipulation and importance in aquaculture and fisheries. Frontiers in Microbiology. 2014;5. https://doi.org/10.3389/fmicb.2014.00207.</w:t>
+      </w:r>
+    </w:p>
+    <w:p>
+      <w:pPr/>
+      <w:r>
+        <w:rPr>
+          <w:color w:val="1F4E79"/>
+        </w:rPr>
+        <w:t>6. Sevellec M, Pavey SA, Boutin S, Filteau M, Derome N, Bernatchez L. Microbiome investigation in the ecological speciation context of lake whitefish (Coregonus clupeaformis) using next‐generation sequencing. Journal of Evolutionary Biology. 2014;27:1029–1046. https://doi.org/10.1111/jeb.12374.</w:t>
+      </w:r>
+    </w:p>
+    <w:p>
+      <w:pPr/>
+      <w:r>
+        <w:rPr>
+          <w:color w:val="1F4E79"/>
+        </w:rPr>
+        <w:t>7. Smith CCR, Snowberg LK, Caporaso JG, Knight R, Bolnick DI. Dietary input of microbes and host genetic variation shape among-population differences in stickleback gut microbiota. The ISME Journal. 2015;9:2515–2526. https://doi.org/10.1038/ismej.2015.64.</w:t>
+      </w:r>
+    </w:p>
+    <w:p>
+      <w:pPr/>
+      <w:r>
+        <w:rPr>
+          <w:color w:val="1F4E79"/>
+        </w:rPr>
+        <w:t>8. Chiarello M, Auguet J-C, Bettarel Y, Bouvier C, Claverie T, Graham NAJ, Rieuvilleneuve F, Sucré E, Bouvier T, Villéger S. Skin microbiome of coral reef fish is highly variable and driven by host phylogeny and diet. Microbiome. 2018;6:147. https://doi.org/10.1186/s40168-018-0530-4.</w:t>
+      </w:r>
+    </w:p>
+    <w:p>
+      <w:pPr/>
+      <w:r>
+        <w:rPr>
+          <w:color w:val="1F4E79"/>
+        </w:rPr>
+        <w:t>9. Grieneisen L, Dasari M, Gould TJ, Björk JR, Grenier J-C, Yotova V, Jansen D, Gottel N, Gordon JB, Learn NH, Gesquiere LR, Wango TL, Mututua RS, Warutere JK, Siodi L, Gilbert JA, Barreiro LB, Alberts SC, Tung J, Archie EA, Blekhman R. Gut microbiome heritability is nearly universal but environmentally contingent. Science. 2021;373:181–186. https://doi.org/10.1126/science.aba5483.</w:t>
+      </w:r>
+    </w:p>
+    <w:p>
+      <w:pPr/>
+      <w:r>
+        <w:rPr>
+          <w:color w:val="1F4E79"/>
+        </w:rPr>
+        <w:t>10. Small CM, Currey M, Beck EA, Bassham S, Cresko WA. Highly Reproducible 16S Sequencing Facilitates Measurement of Host Genetic Influences on the Stickleback Gut Microbiome. mSystems. 2019;4:e00331–19. https://doi.org/10.1128/msystems.00331-19.</w:t>
+      </w:r>
+    </w:p>
+    <w:p>
+      <w:pPr/>
+      <w:r>
+        <w:rPr>
+          <w:color w:val="1F4E79"/>
+        </w:rPr>
+        <w:t>11. Wang J, Kalyan S, Steck N, Turner LM, Harr B, Künzel S, Vallier M, Häsler R, Franke A, Oberg H-H, Ibrahim SM, Grassl GA, Kabelitz D, Baines JF. Analysis of intestinal microbiota in hybrid house mice reveals evolutionary divergence in a vertebrate hologenome. Nature Communications. 2015;6:6440. https://doi.org/10.1038/ncomms7440.</w:t>
+      </w:r>
+    </w:p>
+    <w:p>
+      <w:pPr/>
+      <w:r>
+        <w:rPr>
+          <w:color w:val="1F4E79"/>
+        </w:rPr>
+        <w:t>12. Pfennig KS, Kelly AL, Pierce AA. Hybridization as a facilitator of species range expansion. Proceedings of the Royal Society B: Biological Sciences. 2016;283:20161329. https://doi.org/10.1098/rspb.2016.1329.</w:t>
+      </w:r>
+    </w:p>
+    <w:p>
+      <w:pPr/>
+      <w:r>
+        <w:rPr>
+          <w:color w:val="1F4E79"/>
+        </w:rPr>
+        <w:t>13. Schumer M, Xu C, Powell DL, Durvasula A, Skov L, Holland C, Blazier JC, Sankararaman S, Andolfatto P, Rosenthal GG, Przeworski M. Natural selection interacts with recombination to shape the evolution of hybrid genomes. Science. 2018;360:656–660. https://doi.org/10.1126/science.aar3684.</w:t>
+      </w:r>
+    </w:p>
+    <w:p>
+      <w:pPr/>
+      <w:r>
+        <w:rPr>
+          <w:color w:val="1F4E79"/>
+        </w:rPr>
+        <w:t>14. Camper BT, Laughlin Z, Malagon D, Denton R, Bewick S. A conceptual framework for host‐associated microbiomes of hybrid organisms. Methods in Ecology and Evolution. 2024;15:511–529. https://doi.org/10.1111/2041-210x.14279.</w:t>
+      </w:r>
+    </w:p>
+    <w:p>
+      <w:pPr/>
+      <w:r>
+        <w:rPr>
+          <w:color w:val="1F4E79"/>
+        </w:rPr>
+        <w:t>15. Camper BT, Kanes AS, Laughlin ZT, Manuel RT, Bewick SA. Transgressive hybrids as hopeful holobionts. Microbiome. 2025;13:19. https://doi.org/10.1186/s40168-024-01994-8.</w:t>
+      </w:r>
+    </w:p>
+    <w:p>
+      <w:pPr/>
+      <w:r>
+        <w:rPr>
+          <w:color w:val="1F4E79"/>
+        </w:rPr>
+        <w:t>16. Li W, Liu J, Tan H, Yang C, Ren L, Liu Q, Wang S, Hu F, Xiao J, Zhao R, Tao M, Zhang C, Qin Q, Liu S. Genetic Effects on the Gut Microbiota Assemblages of Hybrid Fish From Parents With Different Feeding Habits. Frontiers in Microbiology. 2018;9:2972. https://doi.org/10.3389/fmicb.2018.02972.</w:t>
+      </w:r>
+    </w:p>
+    <w:p>
+      <w:pPr/>
+      <w:r>
+        <w:rPr>
+          <w:color w:val="1F4E79"/>
+        </w:rPr>
+        <w:t>17. Jin X, Zhu H, Shi Y, Chen Z, Wang Y, Gui J-F, Zhao Z. Host Hybridization Dominates over Cohabitation in Affecting Gut Microbiota of Intrageneric Hybrid Takifugu Pufferfish. mSystems. 2023;8:e01181–22. https://doi.org/10.1128/msystems.01181-22.</w:t>
+      </w:r>
+    </w:p>
+    <w:p>
+      <w:pPr/>
+      <w:r>
+        <w:rPr>
+          <w:color w:val="1F4E79"/>
+        </w:rPr>
+        <w:t>18. Wang Q, Liu J-H, Wen B, Gao J-Z, Chen Z-Z. Gut microbiota communities of reciprocal hybrids from koi (Cyprinus carpio) and goldfish (Carassius auratus) are more similar to koi than goldfish. Journal of Applied Microbiology. 2022;133:960–971. https://doi.org/10.1111/jam.15616.</w:t>
+      </w:r>
+    </w:p>
+    <w:p>
+      <w:pPr/>
+      <w:r>
+        <w:rPr>
+          <w:color w:val="1F4E79"/>
+        </w:rPr>
+        <w:t>19. Sevellec M, Laporte M, Bernatchez A, Derome N, Bernatchez L. Evidence for host effect on the intestinal microbiota of whitefish (Coregonus sp.) species pairs and their hybrids. Ecology and Evolution. 2019;9:11762–11774. https://doi.org/10.1002/ece3.5676.</w:t>
+      </w:r>
+    </w:p>
+    <w:p>
+      <w:pPr/>
+      <w:r>
+        <w:rPr>
+          <w:color w:val="1F4E79"/>
+        </w:rPr>
+        <w:t>20. Cui X, Zhang Q, Zhang Q, Zhang Y, Chen H, Liu G, Zhu L. Research Progress of the Gut Microbiome in Hybrid Fish. Microorganisms. 2022;10:891. https://doi.org/10.3390/microorganisms10050891.</w:t>
+      </w:r>
+    </w:p>
+    <w:p>
+      <w:pPr/>
+      <w:r>
+        <w:rPr>
+          <w:color w:val="1F4E79"/>
+        </w:rPr>
+        <w:t>21. Nielsen DP, Harrison JG, Byer NW, Faske TM, Parchman TL, Simison WB, Matocq MD. The gut microbiome reflects ancestry despite dietary shifts across a hybrid zone. Ecology Letters. 2023;26:63–75. https://doi.org/10.1111/ele.14135.</w:t>
+      </w:r>
+    </w:p>
+    <w:p>
+      <w:pPr/>
+      <w:r>
+        <w:rPr>
+          <w:color w:val="1F4E79"/>
+        </w:rPr>
+        <w:t>22. Donohue ME, Stephens J, Weisenbeck DR, Martin KR, Frederick JH, Black AN, Ranaivosolo WJ, Raheimanjato JP, Fahmy M, Bliss M, Wright PC, Weisrock D, Everson KM. Host ancestry outweighs ecology in shaping the gut microbiome of hybridizing brown lemurs. bioRxiv. 2025. https://doi.org/10.64898/2025.12.10.693535.</w:t>
+      </w:r>
+    </w:p>
+    <w:p>
+      <w:pPr/>
+      <w:r>
+        <w:rPr>
+          <w:color w:val="1F4E79"/>
+        </w:rPr>
+        <w:t>23. Grieneisen LE, Charpentier MJE, Alberts SC, Blekhman R, Bradburd G, Tung J, Archie EA. Genes, geology and germs: gut microbiota across a primate hybrid zone are explained by site soil properties, not host species. Proceedings of the Royal Society B: Biological Sciences. 2019;286:20190431. https://doi.org/10.1098/rspb.2019.0431.</w:t>
+      </w:r>
+    </w:p>
+    <w:p>
+      <w:pPr/>
+      <w:r>
+        <w:rPr>
+          <w:color w:val="1F4E79"/>
+        </w:rPr>
+        <w:t>24. Čížková D, Schmiedová L, Kváč M, Sak B, Macholán M, Piálek J, Kreisinger J. The effect of host admixture on wild house mouse gut microbiota is weak when accounting for spatial autocorrelation. Molecular Ecology. 2024;33:e17192. https://doi.org/10.1111/mec.17192.</w:t>
+      </w:r>
+    </w:p>
+    <w:p>
+      <w:pPr/>
+      <w:r>
+        <w:rPr>
+          <w:color w:val="1F4E79"/>
+        </w:rPr>
+        <w:t>25. Russell AC, Vohsen SA, Spinelli JMC, Martinez N, Curry RL, Roth TC, Semenov GA, Taylor SA, Rice AM. Environment impacts gut microbiome richness in hybridizing chickadees, while ancestry influences community composition. Ecosphere. 2026;17:e70611. https://doi.org/10.1002/ecs2.70611.</w:t>
+      </w:r>
+    </w:p>
+    <w:p>
+      <w:pPr/>
+      <w:r>
+        <w:rPr>
+          <w:color w:val="1F4E79"/>
+        </w:rPr>
+        <w:t>26. Gilles A. Research on european cyprinids polyspecific complex : systematics, speciation and hybrid zones. Thèse de doctorat. 1998.</w:t>
+      </w:r>
+    </w:p>
+    <w:p>
+      <w:pPr/>
+      <w:r>
+        <w:rPr>
+          <w:color w:val="1F4E79"/>
+        </w:rPr>
+        <w:t>27. COSTEDOAT C, PECH N, SALDUCCI M-D, CHAPPAZ R, GILLES A. Evolution of mosaic hybrid zone between invasive and endemic species of Cyprinidae through space and time. Biological Journal of the Linnean Society. 2005;85:135–155. https://doi.org/10.1111/j.1095-8312.2005.00478.x.</w:t>
+      </w:r>
+    </w:p>
+    <w:p>
+      <w:pPr/>
+      <w:r>
+        <w:rPr>
+          <w:color w:val="1F4E79"/>
+        </w:rPr>
+        <w:t>28. Sinama M, Gilles A, Costedoat C, Corse E, Olivier J-M, Chappaz R, Pech N. Non-homogeneous combination of two porous genomes induces complex body shape trajectories in cyprinid hybrids. Frontiers in Zoology. 2013;10:22. https://doi.org/10.1186/1742-9994-10-22.</w:t>
+      </w:r>
+    </w:p>
+    <w:p>
+      <w:pPr/>
+      <w:r>
+        <w:rPr>
+          <w:color w:val="1F4E79"/>
+        </w:rPr>
+        <w:t>29. Guivier E, Gilles A, Pech N, Duflot N, Tissot L, Chappaz R. Canals as ecological corridors and hybridization zones for two cyprinid species. Hydrobiologia. 2019;830:1–16. https://doi.org/10.1007/s10750-018-3843-1.</w:t>
+      </w:r>
+    </w:p>
+    <w:p>
+      <w:pPr/>
+      <w:r>
+        <w:rPr>
+          <w:color w:val="1F4E79"/>
+        </w:rPr>
+        <w:t>30. SEEHAUSEN O, TAKIMOTO G, ROY D, JOKELA J. Speciation reversal and biodiversity dynamics with hybridization in changing environments. Molecular Ecology. 2008;17:30–44. https://doi.org/10.1111/j.1365-294x.2007.03529.x.</w:t>
+      </w:r>
+    </w:p>
+    <w:p>
+      <w:pPr/>
+      <w:r>
+        <w:rPr>
+          <w:color w:val="1F4E79"/>
+        </w:rPr>
+        <w:t>31. Guivier E, Martin J-F, Pech N, Ungaro A, Chappaz R, Gilles A. Microbiota Diversity Within and Between the Tissues of Two Wild Interbreeding Species. Microbial Ecology. 2018;75:799–810. https://doi.org/10.1007/s00248-017-1077-9.</w:t>
+      </w:r>
+    </w:p>
+    <w:p>
+      <w:pPr/>
+      <w:r>
+        <w:rPr>
+          <w:color w:val="1F4E79"/>
+        </w:rPr>
+        <w:t>32. Kozich JJ, Westcott SL, Baxter NT, Highlander SK, Schloss PD. Development of a Dual-Index Sequencing Strategy and Curation Pipeline for Analyzing Amplicon Sequence Data on the MiSeq Illumina Sequencing Platform. Applied and Environmental Microbiology. 2013;79:5112–5120. https://doi.org/10.1128/aem.01043-13.</w:t>
+      </w:r>
+    </w:p>
+    <w:p>
+      <w:pPr/>
+      <w:r>
+        <w:rPr>
+          <w:color w:val="1F4E79"/>
+        </w:rPr>
+        <w:t>33. Galan M, Razzauti M, Bard E, Bernard M, Brouat C, Charbonnel N, Dehne-Garcia A, Loiseau A, Tatard C, Tamisier L, Vayssier-Taussat M, Vignes H, Cosson J-F. 16S rRNA Amplicon Sequencing for Epidemiological Surveys of Bacteria in Wildlife. mSystems. 2016;1:e00032–16. https://doi.org/10.1128/msystems.00032-16.</w:t>
+      </w:r>
+    </w:p>
+    <w:p>
+      <w:pPr/>
+      <w:r>
+        <w:rPr>
+          <w:color w:val="1F4E79"/>
+        </w:rPr>
+        <w:t>34. Martin M. Cutadapt removes adapter sequences from high-throughput sequencing reads. EMBnet.journal. 2011;17:10. https://doi.org/10.14806/ej.17.1.200.</w:t>
+      </w:r>
+    </w:p>
+    <w:p>
+      <w:pPr/>
+      <w:r>
+        <w:rPr>
+          <w:color w:val="1F4E79"/>
+        </w:rPr>
+        <w:t>35. Callahan BJ, McMurdie PJ, Rosen MJ, Han AW, Johnson AJA, Holmes SP. DADA2: High-resolution sample inference from Illumina amplicon data. Nature Methods. 2016;13:581–583. https://doi.org/10.1038/nmeth.3869.</w:t>
+      </w:r>
+    </w:p>
+    <w:p>
+      <w:pPr/>
+      <w:r>
+        <w:rPr>
+          <w:color w:val="1F4E79"/>
+        </w:rPr>
+        <w:t>36. Quast C, Pruesse E, Yilmaz P, Gerken J, Schweer T, Yarza P, Peplies J, Glöckner FO. The SILVA ribosomal RNA gene database project: improved data processing and web-based tools. Nucleic Acids Research. 2013;41:D590–D596. https://doi.org/10.1093/nar/gks1219.</w:t>
+      </w:r>
+    </w:p>
+    <w:p>
+      <w:pPr/>
+      <w:r>
+        <w:rPr>
+          <w:color w:val="1F4E79"/>
+        </w:rPr>
+        <w:t>37. Davis NM, Proctor DM, Holmes SP, Relman DA, Callahan BJ. Simple statistical identification and removal of contaminant sequences in marker-gene and metagenomics data. Microbiome. 2018;6:226. https://doi.org/10.1186/s40168-018-0605-2.</w:t>
+      </w:r>
+    </w:p>
+    <w:p>
+      <w:pPr/>
+      <w:r>
+        <w:rPr>
+          <w:color w:val="1F4E79"/>
+        </w:rPr>
+        <w:t>38. Bolyen E, Rideout JR, Dillon MR, Bokulich NA, Abnet CC, Al-Ghalith GA, Alexander H, Alm EJ, Arumugam M, Asnicar F, Bai Y, Bisanz JE, Bittinger K, Brejnrod A, Brislawn CJ, Brown CT, Callahan BJ, Caraballo-Rodríguez AM, Chase J, Cope EK, Da Silva R, Diener C, Dorrestein PC, Douglas GM, Durall DM, Duvallet C, Edwardson CF, Ernst M, Estaki M, Fouquier J, et al.. Reproducible, interactive, scalable and extensible microbiome data science using QIIME 2. Nature Biotechnology. 2019;37:852–857. https://doi.org/10.1038/s41587-019-0209-9.</w:t>
+      </w:r>
+    </w:p>
+    <w:p>
+      <w:pPr/>
+      <w:r>
+        <w:rPr>
+          <w:color w:val="1F4E79"/>
+        </w:rPr>
+        <w:t>39. Katoh K, Standley DM. MAFFT Multiple Sequence Alignment Software Version 7: Improvements in Performance and Usability. Molecular Biology and Evolution. 2013;30:772–780. https://doi.org/10.1093/molbev/mst010.</w:t>
+      </w:r>
+    </w:p>
+    <w:p>
+      <w:pPr/>
+      <w:r>
+        <w:rPr>
+          <w:color w:val="1F4E79"/>
+        </w:rPr>
+        <w:t>40. Price MN, Dehal PS, Arkin AP. FastTree 2 – Approximately Maximum-Likelihood Trees for Large Alignments. PLoS ONE. 2010;5:e9490. https://doi.org/10.1371/journal.pone.0009490.</w:t>
+      </w:r>
+    </w:p>
+    <w:p>
+      <w:pPr/>
+      <w:r>
+        <w:rPr>
+          <w:color w:val="1F4E79"/>
+        </w:rPr>
+        <w:t>41. Lozupone C, Knight R. UniFrac: a New Phylogenetic Method for Comparing Microbial Communities. Applied and Environmental Microbiology. 2005;71:8228–8235. https://doi.org/10.1128/aem.71.12.8228-8235.2005.</w:t>
+      </w:r>
+    </w:p>
+    <w:p>
+      <w:pPr/>
+      <w:r>
+        <w:rPr>
+          <w:color w:val="1F4E79"/>
+        </w:rPr>
+        <w:t>42. Faith DP. Conservation evaluation and phylogenetic diversity. Biological Conservation. 1992;61:1–10. https://doi.org/10.1016/0006-3207(92)91201-3.</w:t>
+      </w:r>
+    </w:p>
+    <w:p>
+      <w:pPr/>
+      <w:r>
+        <w:rPr>
+          <w:color w:val="1F4E79"/>
+        </w:rPr>
+        <w:t>43. Schloss PD. Rarefaction is currently the best approach to control for uneven sequencing effort in amplicon sequence analyses. mSphere. 2024;9:e00354–23. https://doi.org/10.1128/msphere.00354-23.</w:t>
+      </w:r>
+    </w:p>
+    <w:p>
+      <w:pPr/>
+      <w:r>
+        <w:rPr>
+          <w:color w:val="1F4E79"/>
+        </w:rPr>
+        <w:t>44. Cameron ES, Schmidt PJ, Tremblay BJ-M, Emelko MB, Müller KM. Enhancing diversity analysis by repeatedly rarefying next generation sequencing data describing microbial communities. Scientific Reports. 2021;11:22302. https://doi.org/10.1038/s41598-021-01636-1.</w:t>
+      </w:r>
+    </w:p>
+    <w:p>
+      <w:pPr/>
+      <w:r>
+        <w:rPr>
+          <w:color w:val="1F4E79"/>
+        </w:rPr>
+        <w:t>45. Anderson MJ. A new method for non‐parametric multivariate analysis of variance. Austral Ecology. 2001;26:32–46. https://doi.org/10.1111/j.1442-9993.2001.01070.pp.x.</w:t>
+      </w:r>
+    </w:p>
+    <w:p>
+      <w:pPr/>
+      <w:r>
+        <w:rPr>
+          <w:color w:val="1F4E79"/>
+        </w:rPr>
+        <w:t>46. Anderson MJ. Distance‐Based Tests for Homogeneity of Multivariate Dispersions. Biometrics. 2006;62:245–253. https://doi.org/10.1111/j.1541-0420.2005.00440.x.</w:t>
+      </w:r>
+    </w:p>
+    <w:p>
+      <w:pPr/>
+      <w:r>
+        <w:rPr>
+          <w:color w:val="1F4E79"/>
+        </w:rPr>
+        <w:t>47. Oksanen J, Simpson GL, Blanchet FG, Kindt R, Legendre P, Minchin PR, et al. vegan: Community Ecology Package. R package version 2.7-5. https://CRAN.R-project.org/package=vegan.</w:t>
+      </w:r>
+    </w:p>
+    <w:p>
+      <w:pPr/>
+      <w:r>
+        <w:rPr>
+          <w:color w:val="1F4E79"/>
+        </w:rPr>
+        <w:t>48. Stier AC, Geange SW, Hanson KM, Bolker BM. Predator density and timing of arrival affect reef fish community assembly. Ecology. 2013;94:1057–1068. https://doi.org/10.1890/11-1983.1.</w:t>
+      </w:r>
+    </w:p>
+    <w:p>
+      <w:pPr/>
+      <w:r>
+        <w:rPr>
+          <w:color w:val="1F4E79"/>
+        </w:rPr>
+        <w:t>49. Camper B, Bewick S. HybridMicrobiomes: Analysis of Host-Associated Microbiomes from Hybrid Organisms. R package version 0.1.1. 2023. https://doi.org/10.32614/CRAN.package.HybridMicrobiomes.</w:t>
+      </w:r>
+    </w:p>
+    <w:p>
+      <w:pPr/>
+      <w:r>
+        <w:rPr>
+          <w:color w:val="1F4E79"/>
+        </w:rPr>
+        <w:t>50. McMurdie PJ, Holmes S. phyloseq: An R Package for Reproducible Interactive Analysis and Graphics of Microbiome Census Data. PLoS ONE. 2013;8:e61217. https://doi.org/10.1371/journal.pone.0061217.</w:t>
+      </w:r>
+    </w:p>
+    <w:p>
+      <w:pPr/>
+      <w:r>
+        <w:rPr>
+          <w:color w:val="1F4E79"/>
+        </w:rPr>
+        <w:t>51. microbiome-hybrid: scripts, results registry and decision log. GitHub repository. https://github.com/martinjfsupagro/microbiome-hybrid. Accessed 3 Oct 2026.</w:t>
+      </w:r>
+    </w:p>
+    <w:p>
+      <w:pPr/>
+      <w:r>
+        <w:rPr>
+          <w:i/>
+          <w:color w:val="888888"/>
+          <w:sz w:val="18"/>
+        </w:rPr>
+        <w:t>[Références : noms de revues non abrégés (à abréger selon la norme NLM avant soumission) ; Small et al. et Sevellec et al. cités dans leur version publiée (2019, Crossref) et non dans celle de la .bib ; Sinama et al. 2013 : deux notices possibles (thèse ou Frontiers in Zoology), la seconde retenue — à confirmer ; références logicielles (DADA2, SILVA, cutadapt, QIIME 2, MAFFT, FastTree, UniFrac, Faith, PERMANOVA, PERMDISP, Stier et al., phyloseq, vegan, HybridMicrobiomes) ajoutées le 2026-10-03, vérifiées sur Crossref, absentes de la .bib ; année = année du volume imprimé quand elle existe (Guivier et al. Microb Ecol 2018;75, en ligne 2017 ; Nielsen et al. 2023 ; Čížková et al. 2024 ; Guivier et al. Hydrobiologia 2019) — à confirmer.]</w:t>
+      </w:r>
+    </w:p>
+    <w:p>
+      <w:pPr>
+        <w:pStyle w:val="Title"/>
+      </w:pPr>
+      <w:r>
+        <w:rPr>
+          <w:color w:val="1F4E79"/>
+        </w:rPr>
+        <w:t>Figure legends</w:t>
+      </w:r>
+    </w:p>
+    <w:p>
+      <w:pPr/>
+      <w:r>
+        <w:rPr>
+          <w:b/>
+          <w:color w:val="1F4E79"/>
+        </w:rPr>
+        <w:t xml:space="preserve">Figure 1. Genotypic composition of the nine stations and the two genome types of hybrids. </w:t>
+      </w:r>
+      <w:r>
+        <w:rPr>
+          <w:color w:val="1F4E79"/>
+        </w:rPr>
+        <w:t xml:space="preserve">a Individuals per station and genotypic category from 25-chromosome genotyping (n = 180), stations listed by river. Near-parental hybrids are introgressed on one to six of the 25 chromosomes. b Median hybrid index (0 = </w:t>
+      </w:r>
+      <w:r>
+        <w:rPr>
+          <w:i/>
+          <w:color w:val="1F4E79"/>
+        </w:rPr>
+        <w:t>P. toxostoma</w:t>
+      </w:r>
+      <w:r>
+        <w:rPr>
+          <w:color w:val="1F4E79"/>
+        </w:rPr>
+        <w:t xml:space="preserve">, 1 = </w:t>
+      </w:r>
+      <w:r>
+        <w:rPr>
+          <w:i/>
+          <w:color w:val="1F4E79"/>
+        </w:rPr>
+        <w:t>C. nasus</w:t>
+      </w:r>
+      <w:r>
+        <w:rPr>
+          <w:color w:val="1F4E79"/>
+        </w:rPr>
+        <w:t>) against the inter-chromosome discordance D for the 175 individuals genotyped from Q-scores on liver tissue; dashed line, D = 0.12. Categories were assigned from chromosome-level assignments, not by thresholding either axis; near-parental hybrids combine a parental median index with D ≥ 0.15.</w:t>
+      </w:r>
+    </w:p>
+    <w:p>
+      <w:pPr/>
+      <w:r>
+        <w:rPr>
+          <w:b/>
+          <w:color w:val="1F4E79"/>
+        </w:rPr>
+        <w:t xml:space="preserve">Figure 2. Alpha diversity by tissue and genotypic category. </w:t>
+      </w:r>
+      <w:r>
+        <w:rPr>
+          <w:color w:val="1F4E79"/>
+        </w:rPr>
+        <w:t>Shannon index (a) and Faith's phylogenetic diversity (b) per individual and tissue, as the mean over the three sequencing runs of values averaged over 400 rarefactions at 3,000 reads. Hybrids are shown separately as intermediate (Hy int.) and near-parental (Hy near-p.); pass 1 contrasts intermediate hybrids with the parental species and pass 2 pools both genome types. Numbers above each group: individuals; horizontal bars: medians. Tests are reported in the text; no combination of pass, tissue and index classified hybrids as transgressive.</w:t>
+      </w:r>
+    </w:p>
+    <w:p>
+      <w:pPr/>
+      <w:r>
+        <w:rPr>
+          <w:b/>
+          <w:color w:val="1F4E79"/>
+        </w:rPr>
+        <w:t xml:space="preserve">Figure 3. Detection of genotypic category in composition, and variance shares of station and category. </w:t>
+      </w:r>
+      <w:r>
+        <w:rPr>
+          <w:color w:val="1F4E79"/>
+        </w:rPr>
+        <w:t>a, b Number of sequencing runs (of three) in which genotypic category was significant (PERMANOVA, p &lt; 0.05), per metric and tissue, in pass 1 (20 intermediate hybrids, 158 individuals) and pass 2 (all 42 hybrids, 180 individuals), in the principal model (category alone, permutations within station blocks, no plate position). In parentheses: the sensitivity model with plate position fitted first, where it differs. c Variance explained (R², %) in each of the 48 metric × tissue × run strata by station fitted first, and by category fitted first or last, in models without plate position; horizontal bars: medians.</w:t>
+      </w:r>
+    </w:p>
+    <w:p>
+      <w:pPr/>
+      <w:r>
+        <w:rPr>
+          <w:b/>
+          <w:color w:val="1F4E79"/>
+        </w:rPr>
+        <w:t xml:space="preserve">Figure 4. Dispersion of hybrids relative to the parental mean, corrected for group size. </w:t>
+      </w:r>
+      <w:r>
+        <w:rPr>
+          <w:color w:val="1F4E79"/>
+        </w:rPr>
+        <w:t>Difference between the median distance of hybrids to their group median and the mean of the two parental values, per metric, tissue (symbols) and sequencing run, with permutations constrained within station blocks and distances corrected for small-sample bias. Values below 0: hybrids less dispersed than the parental mean. Filled symbols: PERMDISP test of category significant (p &lt; 0.05). a Pass 1; b pass 2.</w:t>
+      </w:r>
+    </w:p>
+    <w:p>
+      <w:pPr/>
+      <w:r>
+        <w:rPr>
+          <w:b/>
+          <w:color w:val="1F4E79"/>
+        </w:rPr>
+        <w:t xml:space="preserve">Figure 5. Four-dimensional (4H) index of hybrid microbiota and its sensitivity to settings. </w:t>
+      </w:r>
+      <w:r>
+        <w:rPr>
+          <w:color w:val="1F4E79"/>
+        </w:rPr>
+        <w:t>a Mean over the three runs of the four dimensions of the index — Union, Intersection, Gain and Loss — under the principal setting (incidence-based, genus rank, ρ = 0.5), per tissue and pass, at the common number of hosts per class (9–19); the parental axis is Union + Intersection and the transgressive axis Gain + Loss. Black bars: boundary between the two axes for the null hybrid (average of one randomly drawn individual of each parental species); dashed line, 0.5. b Transgressive axis per run under each setting: principal, ρ = 0.3, ρ = 0.7, family rank, abundance-based (Bray–Curtis) version, and pass 2 at its own number of hosts (26–40). Grey band: range of the null hybrid, computed under the principal setting only. Open symbols, pass 1; filled symbols, pass 2. 500 bootstraps per run, on the 1,749 samples with at least 1,000 genus-assigned reads.</w:t>
       </w:r>
     </w:p>
     <w:sectPr>

</xml_diff>

<commit_message>
docs: tables supplementaires renumerotees dans l ordre de premiere citation (S5>S3, S3>S4, S6>S5, S8>S6, S4>S7, S7>S8), appel de la table de convergence ajoute au 8.6 ; fix: deux paragraphes de dispersion perimes (PERMDISP non corrige) retires des Methods ; script 40 : controles d absence et d ordre des tables ; _etat
</commit_message>
<xml_diff>
--- a/docs/manuscrit/Article.docx
+++ b/docs/manuscrit/Article.docx
@@ -368,7 +368,35 @@
           <w:i w:val="0"/>
           <w:color w:val="1F4E79"/>
         </w:rPr>
-        <w:t>Stations, rivers, WGS84 coordinates, collection dates, years of sampling, genotypic composition and the number of individuals and libraries per station are given in Supplementary Table S1. Coordinates and collection dates are field records supplied by the collecting team; an earlier version of this dataset carried coordinates extrapolated from commune names, which have been replaced (see the note to Table S1).</w:t>
+        <w:t>Stations, rivers, WGS84 coordinates, collection dates, years of sampling, genotypic composition and the number of individuals and libraries per station are given in Supplementary Table S</w:t>
+      </w:r>
+      <w:r>
+        <w:rPr>
+          <w:i w:val="0"/>
+          <w:color w:val="1F4E79"/>
+        </w:rPr>
+        <w:t>1</w:t>
+      </w:r>
+      <w:r>
+        <w:rPr>
+          <w:i w:val="0"/>
+          <w:color w:val="1F4E79"/>
+        </w:rPr>
+        <w:t>. Coordinates and collection dates are field records supplied by the collecting team; an earlier version of this dataset carried coordinates extrapolated from commune names, which have been replaced (see the note to Table S</w:t>
+      </w:r>
+      <w:r>
+        <w:rPr>
+          <w:i w:val="0"/>
+          <w:color w:val="1F4E79"/>
+        </w:rPr>
+        <w:t>1</w:t>
+      </w:r>
+      <w:r>
+        <w:rPr>
+          <w:i w:val="0"/>
+          <w:color w:val="1F4E79"/>
+        </w:rPr>
+        <w:t>).</w:t>
       </w:r>
     </w:p>
     <w:p>
@@ -405,7 +433,21 @@
           <w:i w:val="0"/>
           <w:color w:val="1F4E79"/>
         </w:rPr>
-        <w:t xml:space="preserve"> Individual genotypes, with the tissue on which each was obtained, are given in Supplementary Table S2.</w:t>
+        <w:t xml:space="preserve"> Individual genotypes, with the tissue on which each was obtained, are given in Supplementary Table S</w:t>
+      </w:r>
+      <w:r>
+        <w:rPr>
+          <w:i w:val="0"/>
+          <w:color w:val="1F4E79"/>
+        </w:rPr>
+        <w:t>2</w:t>
+      </w:r>
+      <w:r>
+        <w:rPr>
+          <w:i w:val="0"/>
+          <w:color w:val="1F4E79"/>
+        </w:rPr>
+        <w:t>.</w:t>
       </w:r>
       <w:r>
         <w:rPr>
@@ -507,7 +549,16 @@
         <w:t>Libraries were sequenced on an Illumina MiSeq on 10 July 2017 (durance1), 5 October 2017 (durance2) and 3 November 2017 (durance3), with a 10 % PhiX spike-in. PCR conditions, purification and pooling followed Galan et al. [33].</w:t>
       </w:r>
       <w:r>
-        <w:t xml:space="preserve"> Run labels, flow cells, dates and the mapping of runs to library preparations are given in Supplementary Table S5.</w:t>
+        <w:t xml:space="preserve"> Run labels, flow cells, dates and the mapping of runs to library preparations are given in Supplementary Table S</w:t>
+      </w:r>
+      <w:r>
+        <w:rPr>
+          <w:color w:val="1F4E79"/>
+        </w:rPr>
+        <w:t>3</w:t>
+      </w:r>
+      <w:r>
+        <w:t>.</w:t>
       </w:r>
     </w:p>
     <w:p>
@@ -536,7 +587,16 @@
         <w:t>The mock community was the ZymoBIOMICS Microbial Community Standard (Zymo Research, cat. D6300).</w:t>
       </w:r>
       <w:r>
-        <w:t xml:space="preserve"> The number of biological samples, controls and empty wells actually deposited is given in Supplementary Table S3.</w:t>
+        <w:t xml:space="preserve"> The number of biological samples, controls and empty wells actually deposited is given in Supplementary Table S</w:t>
+      </w:r>
+      <w:r>
+        <w:rPr>
+          <w:color w:val="1F4E79"/>
+        </w:rPr>
+        <w:t>4</w:t>
+      </w:r>
+      <w:r>
+        <w:t>.</w:t>
       </w:r>
     </w:p>
     <w:p>
@@ -972,6 +1032,24 @@
         </w:rPr>
         <w:t>).</w:t>
       </w:r>
+      <w:r>
+        <w:rPr>
+          <w:color w:val="1F4E79"/>
+        </w:rPr>
+        <w:t xml:space="preserve"> Convergence values are given in Supplementary Table S</w:t>
+      </w:r>
+      <w:r>
+        <w:rPr>
+          <w:color w:val="1F4E79"/>
+        </w:rPr>
+        <w:t>5</w:t>
+      </w:r>
+      <w:r>
+        <w:rPr>
+          <w:color w:val="1F4E79"/>
+        </w:rPr>
+        <w:t>.</w:t>
+      </w:r>
     </w:p>
     <w:p>
       <w:pPr/>
@@ -1011,7 +1089,23 @@
           <w:i w:val="0"/>
           <w:color w:val="1F4E79"/>
         </w:rPr>
-        <w:t>Because the rarefaction threshold both equalises depth and decides which samples enter, the second of these effects was quantified separately. On a fixed set of samples - those retained at 3,000 reads, so that only depth varies - dissimilarity matrices recomputed at 500 to 2,000 reads were compared with the 3,000-read reference. The two abundance-weighted metrics proved essentially invariant down to 500 reads (weighted UniFrac r = 0.9994, Bray-Curtis r = 0.9985), whereas the two presence-based metrics degraded (Jaccard r = 0.9617, unweighted UniFrac r = 0.9373) and observed richness fell by 42 %, confirming that the loss is driven by rare taxa rather than by a general low-depth artefact. Sample retention at 3,000 reads is not random with respect to the variable of interest: in the caudal fin 50 % of intermediate hybrids passed the threshold against 86 % of P. toxostoma (pass 1), and 67 % of all 42 hybrids (pass 2), a gap of 36 and 20 points respectively, reaching 48 and 36 points at one of the three stations carrying the full genotypic gradient. No threshold removes this selection without the corresponding loss of richness. Claims resting on abundance-weighted metrics are therefore accompanied by a sensitivity analysis at 500 reads, where the caudal-fin gap falls to 3.8 points (pass 1) and 5.7 points (pass 2) and 2,067 samples are retained (1,825 in pass 1); claims resting on presence-based metrics are reported at 3,000 reads with the selection declared, since they cannot be tested at 500 and the midgut gap (14.0 and 8.9 points) persists there in any case. Supplementary Table S8 and Figure S2.</w:t>
+        <w:t>Because the rarefaction threshold both equalises depth and decides which samples enter, the second of these effects was quantified separately. On a fixed set of samples - those retained at 3,000 reads, so that only depth varies - dissimilarity matrices recomputed at 500 to 2,000 reads were compared with the 3,000-read reference. The two abundance-weighted metrics proved essentially invariant down to 500 reads (weighted UniFrac r = 0.9994, Bray-Curtis r = 0.9985), whereas the two presence-based metrics degraded (Jaccard r = 0.9617, unweighted UniFrac r = 0.9373) and observed richness fell by 42 %, confirming that the loss is driven by rare taxa rather than by a general low-depth artefact. Sample retention at 3,000 reads is not random with respect to the variable of interest: in the caudal fin 50 % of intermediate hybrids passed the threshold against 86 % of P. toxostoma (pass 1), and 67 % of all 42 hybrids (pass 2), a gap of 36 and 20 points respectively, reaching 48 and 36 points at one of the three stations carrying the full genotypic gradient. No threshold removes this selection without the corresponding loss of richness. Claims resting on abundance-weighted metrics are therefore accompanied by a sensitivity analysis at 500 reads, where the caudal-fin gap falls to 3.8 points (pass 1) and 5.7 points (pass 2) and 2,067 samples are retained (1,825 in pass 1); claims resting on presence-based metrics are reported at 3,000 reads with the selection declared, since they cannot be tested at 500 and the midgut gap (14.0 and 8.9 points) persists there in any case. Supplementary Table S</w:t>
+      </w:r>
+      <w:r>
+        <w:rPr>
+          <w:b w:val="0"/>
+          <w:i w:val="0"/>
+          <w:color w:val="1F4E79"/>
+        </w:rPr>
+        <w:t>6</w:t>
+      </w:r>
+      <w:r>
+        <w:rPr>
+          <w:b w:val="0"/>
+          <w:i w:val="0"/>
+          <w:color w:val="1F4E79"/>
+        </w:rPr>
+        <w:t xml:space="preserve"> and Figure S2.</w:t>
       </w:r>
       <w:r>
         <w:rPr>
@@ -1401,13 +1495,20 @@
       </w:r>
     </w:p>
     <w:p>
-      <w:pPr/>
-      <w:r/>
+      <w:pPr>
+        <w:pStyle w:val="Heading1"/>
+      </w:pPr>
+      <w:r>
+        <w:t>9. Reproducibility and data availability</w:t>
+      </w:r>
+    </w:p>
+    <w:p>
       <w:r>
         <w:rPr>
           <w:b w:val="0"/>
           <w:i w:val="0"/>
         </w:rPr>
+        <w:t>All processing steps are scripted, version-controlled with git and logged (runs.log), with parameter choices justified in the script headers; metadata corrections are traced by explicit flags rather than applied silently.</w:t>
       </w:r>
       <w:r>
         <w:rPr>
@@ -1415,6 +1516,48 @@
           <w:i w:val="0"/>
           <w:color w:val="1F4E79"/>
         </w:rPr>
+        <w:t xml:space="preserve"> The code is publicly available at https://github.com/martinjfsupagro/microbiome-hybrid.</w:t>
+      </w:r>
+    </w:p>
+    <w:p>
+      <w:r>
+        <w:rPr>
+          <w:i w:val="0"/>
+        </w:rPr>
+        <w:t xml:space="preserve">Raw sequence data have been deposited in the European Nucleotide Archive (ENA) at EMBL-EBI under accession number PRJEB124417. The submission comprises 768 samples and 2,304 sequencing runs (4,608 FASTQ files, 11.7 GB). Each sample was processed through two independent one-step dual-index PCR library preparations: the first library was sequenced once (run label durance1) and the second was sequenced twice on separate flow cells (durance2, durance3). Runs are named accordingly, so that the nested replication structure described in </w:t>
+      </w:r>
+      <w:r>
+        <w:rPr>
+          <w:i w:val="0"/>
+          <w:color w:val="1F4E79"/>
+        </w:rPr>
+        <w:t>§8.8</w:t>
+      </w:r>
+      <w:r>
+        <w:rPr>
+          <w:i w:val="0"/>
+        </w:rPr>
+        <w:t xml:space="preserve"> — sequencing replication nested within library preparation — can be recovered directly from the run titles. Sample metadata follow the GSC MIxS host-associated checklist (ERC000013) and report collection year, sampling-site coordinates, host species and sampled tissue. Extraction blanks, no-template PCR controls and mock community aliquots are included in the submission and are identified as such in the sample titles; the 25 empty wells used to quantify index hopping (§8.2) are likewise deposited. Per-run accessions, file names and MD5 checksums for all 4,608 files are given in Supplementary Table S</w:t>
+      </w:r>
+      <w:r>
+        <w:rPr>
+          <w:i w:val="0"/>
+          <w:color w:val="1F4E79"/>
+        </w:rPr>
+        <w:t>7</w:t>
+      </w:r>
+      <w:r>
+        <w:rPr>
+          <w:i w:val="0"/>
+        </w:rPr>
+        <w:t>.</w:t>
+      </w:r>
+    </w:p>
+    <w:p>
+      <w:r>
+        <w:rPr>
+          <w:i w:val="0"/>
+        </w:rPr>
       </w:r>
       <w:r>
         <w:rPr>
@@ -1422,142 +1565,61 @@
           <w:i w:val="0"/>
           <w:color w:val="1F4E79"/>
         </w:rPr>
-      </w:r>
-      <w:r>
-        <w:rPr>
-          <w:b w:val="0"/>
-          <w:i w:val="0"/>
-          <w:color w:val="1F4E79"/>
-        </w:rPr>
-      </w:r>
-      <w:r>
-        <w:rPr>
-          <w:b w:val="0"/>
-          <w:i w:val="0"/>
-        </w:rPr>
-      </w:r>
-      <w:r>
-        <w:rPr>
-          <w:b w:val="0"/>
-          <w:i w:val="0"/>
-        </w:rPr>
-      </w:r>
-      <w:r>
-        <w:rPr>
-          <w:b w:val="0"/>
-          <w:i w:val="0"/>
-          <w:color w:val="1F4E79"/>
-        </w:rPr>
-      </w:r>
-      <w:r>
-        <w:rPr>
-          <w:b w:val="0"/>
-          <w:i w:val="0"/>
-          <w:color w:val="1F4E79"/>
-        </w:rPr>
-      </w:r>
-      <w:r>
-        <w:rPr>
-          <w:color w:val="1F4E79"/>
-        </w:rPr>
-      </w:r>
-      <w:r/>
-      <w:r>
-        <w:rPr>
-          <w:b w:val="0"/>
-          <w:i w:val="0"/>
-          <w:color w:val="1F4E79"/>
-        </w:rPr>
-      </w:r>
-      <w:r>
-        <w:t>Dispersion was tested with PERMDISP on the same matrices, both with permutations constrained within station blocks and separately within each station carrying all three categories, where a dispersion difference cannot be spatial. The transgressive prediction in its dispersion form — hybrids more variable than both parental categories — is not supported and the data point the other way. Across the 48 station-blocked tests, hybrids are the least dispersed of the three categories in 32 (pass 1) and 34 (pass 2) and the most dispersed in 7 and 8, against the third expected by chance under no ordering (binomial p = 2.4 × 10-6 and 1.2 × 10-7). Within stations the pattern holds in pass 1 (45 of 68, p = 3.2 × 10-8); in pass 2 it is not significant over all 120 tests (41, p = 0.46), because the strata of Saint-Just-d'Ardèche, testable only in pass 2, and those of the Canal point the other way, but it holds on the 68 tests common to both passes (31 of 68, p = 0.024). Significant tests in the transgressive direction number 1 (pass 1) and 0 (pass 2) among station-blocked tests, and 0 and 5 within stations; the five of pass 2 all concern the gill at Saint-Just-d'Ardèche, where each stratum holds three or four P. toxostoma. Where dispersion does differ significantly it is mostly a parental category that is most variable: P. toxostoma in the caudal fin in pass 1; P. toxostoma or C. nasus in the midgut, and P. toxostoma in the hindgut and caudal fin, in pass 2. The effect is small: the median hybrid distance to group centre lies below the parental mean on Bray-Curtis (-0.029 and -0.065), unweighted UniFrac (-0.026 and -0.016) and Jaccard (-0.015 and -0.009); on weighted UniFrac it is null in pass 1 (+0.0002) and slightly below in pass 2 (-0.005). The less-dispersed pattern is therefore carried by the three metrics sensitive to rare taxa.</w:t>
+        <w:t>ENA metadata were corrected on 2026-08-31 (field-record coordinates, exact collection dates and genotype-resolved host identities); PRJEB124417 is up to date. The correction covered 3,472 fields across the 727 biological samples and was verified field by field; the 41 controls, the sample accessions, the aliases and the sequence files were unchanged. A second correction, on 2026-09-25, aligned host identity on the 25-chromosome genotyping: sample title, host scientific name and host common name were updated for 568 samples (1,199 fields), hybrids being recorded as nasus x toxostoma. It was then verified against the archive itself: 727 samples queried, 1,199 fields conforming, none discrepant. Neither correction altered a sample accession, an alias or a sequence file.</w:t>
       </w:r>
     </w:p>
     <w:p>
       <w:pPr/>
-      <w:r/>
-      <w:r>
-        <w:rPr>
-          <w:b w:val="0"/>
+      <w:r>
+        <w:rPr>
           <w:i w:val="0"/>
         </w:rPr>
-      </w:r>
-      <w:r>
-        <w:rPr>
-          <w:b w:val="0"/>
+        <w:t>Metadata completeness. Sampling-site coordinates and environmental context terms were obtained from the field records and are reported per site in Supplementary Table S</w:t>
+      </w:r>
+      <w:r>
+        <w:rPr>
           <w:i w:val="0"/>
-          <w:color w:val="1F4E79"/>
-        </w:rPr>
-      </w:r>
-      <w:r>
-        <w:rPr>
-          <w:b w:val="0"/>
+        </w:rPr>
+        <w:t>1</w:t>
+      </w:r>
+      <w:r>
+        <w:rPr>
           <w:i w:val="0"/>
-          <w:color w:val="1F4E79"/>
-        </w:rPr>
-      </w:r>
-      <w:r>
-        <w:rPr>
-          <w:b w:val="0"/>
-          <w:i w:val="0"/>
-          <w:color w:val="1F4E79"/>
-        </w:rPr>
-      </w:r>
-      <w:r>
-        <w:rPr>
-          <w:b w:val="0"/>
-          <w:i w:val="0"/>
-        </w:rPr>
-      </w:r>
-      <w:r>
-        <w:rPr>
-          <w:b w:val="0"/>
-          <w:i w:val="0"/>
-        </w:rPr>
-      </w:r>
-      <w:r>
-        <w:rPr>
-          <w:b w:val="0"/>
-          <w:i w:val="0"/>
-          <w:color w:val="1F4E79"/>
-        </w:rPr>
-      </w:r>
-      <w:r>
-        <w:rPr>
-          <w:b w:val="0"/>
-          <w:i w:val="0"/>
-          <w:color w:val="1F4E79"/>
-        </w:rPr>
-      </w:r>
-      <w:r>
-        <w:rPr>
-          <w:color w:val="1F4E79"/>
-        </w:rPr>
-      </w:r>
-      <w:r/>
-      <w:r>
-        <w:rPr>
-          <w:b w:val="0"/>
-          <w:i w:val="0"/>
-          <w:color w:val="1F4E79"/>
-        </w:rPr>
-        <w:t xml:space="preserve">This bears directly on how the location results must be read, because PERMANOVA is sensitive to heterogeneous dispersion. In the caudal fin, dispersion is heterogeneous on Jaccard in all three runs in both passes, and on Bray-Curtis and unweighted UniFrac in all three runs in pass 1, so the location signals on those metrics cannot be separated from a dispersion effect. On weighted UniFrac dispersion is homogeneous in all three runs in both passes, and remains so within station. In pass 1, where the caudal-fin category effect on weighted UniFrac is significant in all three runs and both permutation schemes, that control could have failed and did not: the result is a difference in composition, not in variability. In pass 2 there is no location effect to interpret. One reservation is not resolved here: betadisper accepts no covariate, so the plate-position effect of </w:t>
-      </w:r>
-      <w:r>
-        <w:rPr>
-          <w:b w:val="0"/>
-          <w:i w:val="0"/>
-          <w:color w:val="1F4E79"/>
-        </w:rPr>
-        <w:t>§8.9</w:t>
-      </w:r>
-      <w:r>
-        <w:rPr>
-          <w:b w:val="0"/>
-          <w:i w:val="0"/>
-          <w:color w:val="1F4E79"/>
-        </w:rPr>
-        <w:t xml:space="preserve"> is not adjusted for, and a category whose samples are more spread across plate columns could carry inflated dispersion. Supplementary Table S10 and Figure S3.</w:t>
+        </w:rPr>
+        <w:t>. Collection dates are given at day resolution for every station except Pertuis, where the two 2014 fishing campaigns are deposited as the interval 2014-07-07/2014-08-20.</w:t>
+      </w:r>
+    </w:p>
+    <w:p>
+      <w:pPr/>
+      <w:r>
+        <w:rPr>
+          <w:i/>
+          <w:color w:val="888888"/>
+          <w:sz w:val="18"/>
+        </w:rPr>
+        <w:t>[Pertuis : les individus sont désormais assignés à leur campagne (série 1011-1014 au 07/07/2014, série 2011-2015 au 20/08/2014 — André, 2026-09-30). La table de correction ena_deposit/ena_corrections_pertuis_dates.tsv est prête (44 échantillons) mais n'est pas encore soumise ; remplacer l'intervalle par les deux dates ici une fois le MODIFY passé.]</w:t>
+      </w:r>
+    </w:p>
+    <w:p>
+      <w:pPr/>
+      <w:r>
+        <w:rPr>
+          <w:i/>
+          <w:color w:val="888888"/>
+          <w:sz w:val="18"/>
+        </w:rPr>
+        <w:t>[À COMPLÉTER : DOI Zenodo de la version utilisée pour l'article, le cas échéant (question 2.7, non tranché). Dépôt GitHub public (JF, 2026-10-03) ; vérifier que le miroir public est à jour au moment de la soumission — le 2026-10-03 il s'arrêtait au commit du 2026-09-25.]</w:t>
+      </w:r>
+    </w:p>
+    <w:p>
+      <w:pPr>
+        <w:pStyle w:val="Title"/>
+      </w:pPr>
+      <w:r>
+        <w:rPr>
+          <w:color w:val="1F4E79"/>
+        </w:rPr>
+        <w:t>Results</w:t>
       </w:r>
     </w:p>
     <w:p>
@@ -1565,80 +1627,326 @@
         <w:pStyle w:val="Heading1"/>
       </w:pPr>
       <w:r>
-        <w:t>9. Reproducibility and data availability</w:t>
-      </w:r>
-    </w:p>
-    <w:p>
-      <w:r>
-        <w:rPr>
-          <w:b w:val="0"/>
-          <w:i w:val="0"/>
-        </w:rPr>
-        <w:t>All processing steps are scripted, version-controlled with git and logged (runs.log), with parameter choices justified in the script headers; metadata corrections are traced by explicit flags rather than applied silently.</w:t>
-      </w:r>
-      <w:r>
-        <w:rPr>
-          <w:b w:val="0"/>
-          <w:i w:val="0"/>
-          <w:color w:val="1F4E79"/>
-        </w:rPr>
-        <w:t xml:space="preserve"> The code is publicly available at https://github.com/martinjfsupagro/microbiome-hybrid.</w:t>
-      </w:r>
-    </w:p>
-    <w:p>
-      <w:r>
-        <w:rPr>
-          <w:i w:val="0"/>
-        </w:rPr>
-        <w:t xml:space="preserve">Raw sequence data have been deposited in the European Nucleotide Archive (ENA) at EMBL-EBI under accession number PRJEB124417. The submission comprises 768 samples and 2,304 sequencing runs (4,608 FASTQ files, 11.7 GB). Each sample was processed through two independent one-step dual-index PCR library preparations: the first library was sequenced once (run label durance1) and the second was sequenced twice on separate flow cells (durance2, durance3). Runs are named accordingly, so that the nested replication structure described in </w:t>
-      </w:r>
-      <w:r>
-        <w:rPr>
-          <w:i w:val="0"/>
-          <w:color w:val="1F4E79"/>
-        </w:rPr>
-        <w:t>§8.8</w:t>
-      </w:r>
-      <w:r>
-        <w:rPr>
-          <w:i w:val="0"/>
-        </w:rPr>
-        <w:t xml:space="preserve"> — sequencing replication nested within library preparation — can be recovered directly from the run titles. Sample metadata follow the GSC MIxS host-associated checklist (ERC000013) and report collection year, sampling-site coordinates, host species and sampled tissue. Extraction blanks, no-template PCR controls and mock community aliquots are included in the submission and are identified as such in the sample titles; the 25 empty wells used to quantify index hopping (§8.2) are likewise deposited. Per-run accessions, file names and MD5 checksums for all 4,608 files are given in Supplementary Table S4.</w:t>
-      </w:r>
-    </w:p>
-    <w:p>
-      <w:r>
-        <w:rPr>
-          <w:i w:val="0"/>
-        </w:rPr>
-      </w:r>
-      <w:r>
-        <w:rPr>
-          <w:b w:val="0"/>
-          <w:i w:val="0"/>
-          <w:color w:val="1F4E79"/>
-        </w:rPr>
-        <w:t>ENA metadata were corrected on 2026-08-31 (field-record coordinates, exact collection dates and genotype-resolved host identities); PRJEB124417 is up to date. The correction covered 3,472 fields across the 727 biological samples and was verified field by field; the 41 controls, the sample accessions, the aliases and the sequence files were unchanged. A second correction, on 2026-09-25, aligned host identity on the 25-chromosome genotyping: sample title, host scientific name and host common name were updated for 568 samples (1,199 fields), hybrids being recorded as nasus x toxostoma. It was then verified against the archive itself: 727 samples queried, 1,199 fields conforming, none discrepant. Neither correction altered a sample accession, an alias or a sequence file.</w:t>
+        <w:rPr>
+          <w:color w:val="1F4E79"/>
+        </w:rPr>
+        <w:t>Genotypic design and its entanglement with station</w:t>
       </w:r>
     </w:p>
     <w:p>
       <w:pPr/>
       <w:r>
         <w:rPr>
-          <w:i w:val="0"/>
-        </w:rPr>
-        <w:t>Metadata completeness. Sampling-site coordinates and environmental context terms were obtained from the field records and are reported per site in Supplementary Table S1. Collection dates are given at day resolution for every station except Pertuis, where the two 2014 fishing campaigns are deposited as the interval 2014-07-07/2014-08-20.</w:t>
+          <w:color w:val="1F4E79"/>
+        </w:rPr>
+        <w:t xml:space="preserve">The 180 fish comprised 59 </w:t>
+      </w:r>
+      <w:r>
+        <w:rPr>
+          <w:i/>
+          <w:color w:val="1F4E79"/>
+        </w:rPr>
+        <w:t>C. nasus</w:t>
+      </w:r>
+      <w:r>
+        <w:rPr>
+          <w:color w:val="1F4E79"/>
+        </w:rPr>
+        <w:t xml:space="preserve">, 42 hybrids and 79 </w:t>
+      </w:r>
+      <w:r>
+        <w:rPr>
+          <w:i/>
+          <w:color w:val="1F4E79"/>
+        </w:rPr>
+        <w:t>P. toxostoma</w:t>
+      </w:r>
+      <w:r>
+        <w:rPr>
+          <w:color w:val="1F4E79"/>
+        </w:rPr>
+        <w:t xml:space="preserve">, unevenly distributed across the nine stations (Fig. 1a). Near-parental hybrids carry a median hybrid index close to that of one parent but an inter-chromosome discordance D of 0.15–0.60, against at most 0.12 in parental individuals (Fig. 1b); categories were assigned from chromosome-level assignments rather than by thresholding either quantity (§1). Of the 22 near-parental hybrids, 19 have a </w:t>
+      </w:r>
+      <w:r>
+        <w:rPr>
+          <w:i/>
+          <w:color w:val="1F4E79"/>
+        </w:rPr>
+        <w:t>P. toxostoma</w:t>
+      </w:r>
+      <w:r>
+        <w:rPr>
+          <w:color w:val="1F4E79"/>
+        </w:rPr>
+        <w:t xml:space="preserve"> background and 3 a </w:t>
+      </w:r>
+      <w:r>
+        <w:rPr>
+          <w:i/>
+          <w:color w:val="1F4E79"/>
+        </w:rPr>
+        <w:t>C. nasus</w:t>
+      </w:r>
+      <w:r>
+        <w:rPr>
+          <w:color w:val="1F4E79"/>
+        </w:rPr>
+        <w:t xml:space="preserve"> background.</w:t>
       </w:r>
     </w:p>
     <w:p>
       <w:pPr/>
+      <w:r/>
+      <w:r>
+        <w:rPr>
+          <w:b w:val="0"/>
+          <w:i w:val="0"/>
+        </w:rPr>
+      </w:r>
+      <w:r>
+        <w:rPr>
+          <w:b w:val="0"/>
+          <w:i w:val="0"/>
+          <w:color w:val="1F4E79"/>
+        </w:rPr>
+      </w:r>
+      <w:r>
+        <w:rPr>
+          <w:b w:val="0"/>
+          <w:i w:val="0"/>
+          <w:color w:val="1F4E79"/>
+        </w:rPr>
+      </w:r>
+      <w:r>
+        <w:rPr>
+          <w:b w:val="0"/>
+          <w:i w:val="0"/>
+          <w:color w:val="1F4E79"/>
+        </w:rPr>
+      </w:r>
+      <w:r>
+        <w:rPr>
+          <w:b w:val="0"/>
+          <w:i w:val="0"/>
+        </w:rPr>
+      </w:r>
+      <w:r>
+        <w:rPr>
+          <w:b w:val="0"/>
+          <w:i w:val="0"/>
+        </w:rPr>
+      </w:r>
+      <w:r>
+        <w:rPr>
+          <w:b w:val="0"/>
+          <w:i w:val="0"/>
+          <w:color w:val="1F4E79"/>
+        </w:rPr>
+        <w:t>Genotypic category is entangled with both the spatial and the technical axes, and the entanglement is a property of the design rather than a caveat of presentation. Between stations, category is confounded with station: of nine stations, three carry all three categories (74 individuals in pass 2, 65 in pass 1, where Saint-Just-d'Ardèche retains a single hybrid), the others one or two. Within those three stations, category and plate column are in turn strongly associated, because field numbering followed sampling order (</w:t>
+      </w:r>
+      <w:r>
+        <w:rPr>
+          <w:b w:val="0"/>
+          <w:i w:val="0"/>
+          <w:color w:val="1F4E79"/>
+        </w:rPr>
+        <w:t>§8.9</w:t>
+      </w:r>
+      <w:r>
+        <w:rPr>
+          <w:b w:val="0"/>
+          <w:i w:val="0"/>
+          <w:color w:val="1F4E79"/>
+        </w:rPr>
+        <w:t>). The sub-design in which category and position are fully separable at constant station comprises 31 individuals in pass 1 and 32 in pass 2, too few to carry a principal test. One station, Rosières, carries category and position independently (Cramér's V = 0.18, p = 0.35, in pass 2) and serves as a small clean witness; in pass 1 it retains a single hybrid and cannot witness a category effect.</w:t>
+      </w:r>
+    </w:p>
+    <w:p>
+      <w:pPr>
+        <w:pStyle w:val="Heading1"/>
+      </w:pPr>
+      <w:r>
+        <w:rPr>
+          <w:color w:val="1F4E79"/>
+        </w:rPr>
+        <w:t>Technical variation is small relative to biological variation</w:t>
+      </w:r>
+    </w:p>
+    <w:p>
+      <w:pPr/>
+      <w:r>
+        <w:t>The nested replication structure was verified directly from the data. Each pair of runs was compared within sample after rarefaction to a common depth, so that detection probability is identical by construction (548 samples reaching 3,000 reads in all three runs). The two runs sharing a library were markedly more similar to each other (mean Bray–Curtis 0.118, Jaccard 0.445) than either was to the run from the independent library (0.248 and 0.720 respectively); the two library-crossing comparisons were statistically indistinguishable from each other (paired Wilcoxon, p = 0.48) and both differed from the within-library comparison (p &lt; 10⁻⁸⁹). Recapture of rare ASVs (1–3 reads) showed the same pattern (0.48 within library vs 0.19 across).</w:t>
+      </w:r>
+    </w:p>
+    <w:p>
+      <w:pPr/>
+      <w:r>
+        <w:t>Library preparation therefore roughly doubles the technical dissimilarity contributed by sequencing alone, with a proportionally larger effect on presence–absence than on relative abundances. Sequencing run was accordingly modelled as nested within library preparation rather than as a three-level factor with interchangeable levels. Because each sample is present in every batch, technical and biological factors are crossed rather than confounded, so batch-correction methods designed for confounded meta-analyses were not applied.</w:t>
+      </w:r>
+      <w:r>
+        <w:t xml:space="preserve"> Index assignment across preparations and the verification of sample-to-file matching are detailed in Supplementary Table S</w:t>
+      </w:r>
+      <w:r>
+        <w:rPr>
+          <w:color w:val="1F4E79"/>
+        </w:rPr>
+        <w:t>3</w:t>
+      </w:r>
+      <w:r>
+        <w:t xml:space="preserve"> and Note S1.</w:t>
+      </w:r>
+    </w:p>
+    <w:p>
+      <w:pPr/>
+      <w:r>
+        <w:rPr>
+          <w:i w:val="0"/>
+        </w:rPr>
+        <w:t>Relative to the biological signal, this technical variation is negligible. In a PERMANOVA on Bray–Curtis distances over the 1,784 samples retained after rarefaction, with the technical terms entered first so that they absorb the maximum variance the sequential decomposition can assign them, library preparation explained 0.03 % of the variance (R² = 0.0003, p = 0.63) and sequencing run within library 0.005 % (p = 1.00), against 9.2 % for tissue and 37.7 % for fish identity (both p = 0.002). Mean Bray–Curtis dissimilarity was 0.13 between two sequencing runs of one library and 0.25 across libraries, against 0.88 between different fish of the same tissue and 0.94 across tissues. Note that library preparation cannot be tested marginally, being perfectly aliased with run label (durance1 is the sole run of the first preparation).</w:t>
+      </w:r>
+    </w:p>
+    <w:p>
+      <w:pPr>
+        <w:pStyle w:val="Heading1"/>
+      </w:pPr>
+      <w:r>
+        <w:rPr>
+          <w:color w:val="1F4E79"/>
+        </w:rPr>
+        <w:t>Plate position</w:t>
+      </w:r>
+    </w:p>
+    <w:p>
+      <w:pPr/>
+      <w:r>
+        <w:rPr>
+          <w:color w:val="1F4E79"/>
+        </w:rPr>
+        <w:t xml:space="preserve">Plate column affected composition. </w:t>
+      </w:r>
+      <w:r/>
+      <w:r>
+        <w:rPr>
+          <w:b w:val="0"/>
+          <w:i w:val="0"/>
+        </w:rPr>
+      </w:r>
+      <w:r>
+        <w:rPr>
+          <w:b w:val="0"/>
+          <w:i w:val="0"/>
+          <w:color w:val="1F4E79"/>
+        </w:rPr>
+      </w:r>
+      <w:r>
+        <w:rPr>
+          <w:b w:val="0"/>
+          <w:i w:val="0"/>
+          <w:color w:val="1F4E79"/>
+        </w:rPr>
+        <w:t>The effect is present in all 24 strata (12 tissue × run strata × 2 metrics) in both passes (p ≤ 0.033 in pass 1, p ≤ 0.007 in pass 2), replicated across the three runs; it does not depend on category labels, and the two passes differ only by the 22 individuals excluded from pass 1. Because the terms differ in degrees of freedom, effect sizes are reported relative to their expectation under the null, R2/(df/(n−1)): plate column reaches 1.84 in pass 1 and 1.95 in pass 2 (median R2 = 0.152 and 0.141, 11 df), the same order as genotypic category fitted after column (1.61 and 1.77; median R2 = 0.026 and 0.024, 2 df; significant in 19 and 18 of 24 strata) and below station (3.32 and 3.69; median R2 = 0.204 and 0.196, 8 df). Supplementary Table S</w:t>
+      </w:r>
+      <w:r>
+        <w:rPr>
+          <w:b w:val="0"/>
+          <w:i w:val="0"/>
+          <w:color w:val="1F4E79"/>
+        </w:rPr>
+        <w:t>8</w:t>
+      </w:r>
+      <w:r>
+        <w:rPr>
+          <w:b w:val="0"/>
+          <w:i w:val="0"/>
+          <w:color w:val="1F4E79"/>
+        </w:rPr>
+        <w:t xml:space="preserve"> and Figure S1.</w:t>
+      </w:r>
+      <w:r>
+        <w:rPr>
+          <w:color w:val="1F4E79"/>
+        </w:rPr>
+      </w:r>
+    </w:p>
+    <w:p>
+      <w:pPr/>
+      <w:r/>
+      <w:r>
+        <w:rPr>
+          <w:b w:val="0"/>
+          <w:i w:val="0"/>
+        </w:rPr>
+      </w:r>
+      <w:r>
+        <w:rPr>
+          <w:b w:val="0"/>
+          <w:i w:val="0"/>
+          <w:color w:val="1F4E79"/>
+        </w:rPr>
+      </w:r>
+      <w:r>
+        <w:rPr>
+          <w:b w:val="0"/>
+          <w:i w:val="0"/>
+          <w:color w:val="1F4E79"/>
+        </w:rPr>
+      </w:r>
+      <w:r>
+        <w:rPr>
+          <w:b w:val="0"/>
+          <w:i w:val="0"/>
+          <w:color w:val="1F4E79"/>
+        </w:rPr>
+        <w:t>Three witnesses separate this effect from the biology it could be mistaken for. Within a single genotypic category, where a column effect cannot be a category effect, it persists but more weakly: among P. toxostoma alone in 17 of 24 strata in both passes (ratio 1.65), among C. nasus alone in 6 (pass 1) and 7 (pass 2) of 24 (ratio 1.63); hybrids alone are too few to be tested (two strata in pass 2, none in pass 1). No site code carries a single genotypic category, and the only single-category station (Chavannes-sur-Suran, 19 P. toxostoma) is too small for a separate witness; the within-category subsets therefore replace the single-category-station witness of an earlier analysis, which rested on fish left unresolved by morphology. In the symmetric ordering with category fitted first, column still contributes (21 and 22 of 24 strata). And the classic plate artefacts are absent: plate row is significant in 7 and 6 of 24 strata and plate edge in none, making the effect specific to column, as expected of an effect tracking processing order rather than evaporation or thermal gradients. The origin of the association between category and column is documented above, but the mechanism of the column effect itself is not identified: extraction order, reagent-batch drift within a plate, cross-contamination between adjacent wells and the delay between capture and dissection are not separated by these data, and no negative control isolates any of them. Plate column is therefore not entered in the principal models (</w:t>
+      </w:r>
+      <w:r>
+        <w:rPr>
+          <w:b w:val="0"/>
+          <w:i w:val="0"/>
+          <w:color w:val="1F4E79"/>
+        </w:rPr>
+        <w:t>§8.7</w:t>
+      </w:r>
+      <w:r>
+        <w:rPr>
+          <w:b w:val="0"/>
+          <w:i w:val="0"/>
+          <w:color w:val="1F4E79"/>
+        </w:rPr>
+        <w:t xml:space="preserve">), but every model testing category is also reported with plate column as a covariate, and the two versions are </w:t>
+      </w:r>
+      <w:r>
+        <w:rPr>
+          <w:b w:val="0"/>
+          <w:i w:val="0"/>
+          <w:color w:val="1F4E79"/>
+        </w:rPr>
+        <w:t>compared below</w:t>
+      </w:r>
+      <w:r>
+        <w:rPr>
+          <w:b w:val="0"/>
+          <w:i w:val="0"/>
+          <w:color w:val="1F4E79"/>
+        </w:rPr>
+        <w:t>.</w:t>
+      </w:r>
+    </w:p>
+    <w:p>
+      <w:pPr/>
+      <w:r>
+        <w:rPr>
+          <w:color w:val="1F4E79"/>
+        </w:rPr>
+        <w:t>Within every fishing campaign, plate column followed the order in which fish were processed (Spearman ρ between individual number and plate column, 0.55–0.95 over 12 station-year campaigns; §8.9 and §8.12), so that in this design the column effect cannot be separated from processing order, and therefore from the time each fish spent in the holding tank before dissection.</w:t>
+      </w:r>
       <w:r>
         <w:rPr>
           <w:i/>
           <w:color w:val="888888"/>
           <w:sz w:val="18"/>
         </w:rPr>
-        <w:t>[Pertuis : les individus sont désormais assignés à leur campagne (série 1011-1014 au 07/07/2014, série 2011-2015 au 20/08/2014 — André, 2026-09-30). La table de correction ena_deposit/ena_corrections_pertuis_dates.tsv est prête (44 échantillons) mais n'est pas encore soumise ; remplacer l'intervalle par les deux dates ici une fois le MODIFY passé.]</w:t>
+        <w:t xml:space="preserve"> [ρ recalculé par scripts/40-verif_article_v2.py (results/verif_article/spearman_toutes_campagnes.tsv) : 0,548–0,950. Les deux campagnes de Pertuis 2014 sont agrégées ; Pont-d'Ain 2014 (moins de 4 poissons) n'est pas calculable.]</w:t>
       </w:r>
     </w:p>
     <w:p>
@@ -1649,7 +1957,412 @@
           <w:color w:val="888888"/>
           <w:sz w:val="18"/>
         </w:rPr>
-        <w:t>[À COMPLÉTER : DOI Zenodo de la version utilisée pour l'article, le cas échéant (question 2.7, non tranché). Dépôt GitHub public (JF, 2026-10-03) ; vérifier que le miroir public est à jour au moment de la soumission — le 2026-10-03 il s'arrêtait au commit du 2026-09-25.]</w:t>
+        <w:t>[À reformuler après l'arbitrage D2 de JF : « the delay between capture and dissection » ne correspond plus au protocole. Les poissons sont gardés vivants en vivier jusqu'à la dissection, 4–6 min par poisson (André, 2026-10-03) ; le confondant est la durée de séjour en vivier, c'est-à-dire l'ordre de traitement. Dans chaque campagne, la colonne suit cet ordre, et le test du 2026-10-03 ne peut pas séparer les deux (RESULTATS R32, docs/recalcul/note_tests_2026-10-03.md).]</w:t>
+      </w:r>
+    </w:p>
+    <w:p>
+      <w:pPr>
+        <w:pStyle w:val="Heading1"/>
+      </w:pPr>
+      <w:r>
+        <w:rPr>
+          <w:color w:val="1F4E79"/>
+        </w:rPr>
+        <w:t>Alpha diversity</w:t>
+      </w:r>
+    </w:p>
+    <w:p>
+      <w:pPr/>
+      <w:r>
+        <w:rPr>
+          <w:color w:val="1F4E79"/>
+        </w:rPr>
+        <w:t>Alpha diversity was higher in the external than in the internal compartments on all four indices (Fig. 2): the ratio of geometric means was 1.51 for Shannon (95 % confidence interval 1.40–1.64), 3.00 for inverse Simpson (2.48–3.63), 1.93 for observed richness (1.71–2.18) and 1.62 for Faith's phylogenetic diversity (1.50–1.76; n = 174 individuals; Wilcoxon p ≤ 4.6 × 10⁻¹⁷). The midgut was less diverse than the hindgut on the two unweighted indices only — observed richness, ratio 0.83 (p = 0.009), and Faith's phylogenetic diversity, 0.87 (p = 0.003) — and not on Shannon (0.94, p = 0.18) or inverse Simpson (0.87, p = 0.25; n = 136), so that this contrast is metric-dependent under the rule of §8.7. Tissue was the largest identifiable source of variance in log alpha diversity (marginal share 19–26 % depending on the index), followed by individual (17–21 %) and site-year (10–14 %, sequential share), with technical terms contributing at most 0.3 % and a residual of 38–45 %; the order of the factors was the same on the four indices.</w:t>
+      </w:r>
+    </w:p>
+    <w:p>
+      <w:pPr/>
+      <w:r>
+        <w:rPr>
+          <w:color w:val="1F4E79"/>
+        </w:rPr>
+        <w:t xml:space="preserve">Hybrids were transgressive in none of the 32 combinations of pass, tissue and index (Fig. 2). The only classification supported by both an abundance-weighted and a presence-based index was dominance of </w:t>
+      </w:r>
+      <w:r>
+        <w:rPr>
+          <w:i/>
+          <w:color w:val="1F4E79"/>
+        </w:rPr>
+        <w:t>C. nasus</w:t>
+      </w:r>
+      <w:r>
+        <w:rPr>
+          <w:color w:val="1F4E79"/>
+        </w:rPr>
+        <w:t xml:space="preserve"> — hybrids not distinguishable from </w:t>
+      </w:r>
+      <w:r>
+        <w:rPr>
+          <w:i/>
+          <w:color w:val="1F4E79"/>
+        </w:rPr>
+        <w:t>C. nasus</w:t>
+      </w:r>
+      <w:r>
+        <w:rPr>
+          <w:color w:val="1F4E79"/>
+        </w:rPr>
+        <w:t xml:space="preserve"> but distinct from </w:t>
+      </w:r>
+      <w:r>
+        <w:rPr>
+          <w:i/>
+          <w:color w:val="1F4E79"/>
+        </w:rPr>
+        <w:t>P. toxostoma</w:t>
+      </w:r>
+      <w:r>
+        <w:rPr>
+          <w:color w:val="1F4E79"/>
+        </w:rPr>
+        <w:t xml:space="preserve"> — in the caudal fin in pass 1 (four indices of four; p for category 0.012–0.128) and in the midgut in pass 2 (three of four; p = 0.040–0.111). The first was unchanged with plate position as a covariate; the second was not, two indices becoming intermediate and two undetermined. Five of the 32 principal tests reached p &lt; 0.05, without correction for multiplicity, and dominance denotes here the absence of a detectable difference from </w:t>
+      </w:r>
+      <w:r>
+        <w:rPr>
+          <w:i/>
+          <w:color w:val="1F4E79"/>
+        </w:rPr>
+        <w:t>C. nasus</w:t>
+      </w:r>
+      <w:r>
+        <w:rPr>
+          <w:color w:val="1F4E79"/>
+        </w:rPr>
+        <w:t>, not an equality.</w:t>
+      </w:r>
+      <w:r>
+        <w:rPr>
+          <w:i/>
+          <w:color w:val="888888"/>
+          <w:sz w:val="18"/>
+        </w:rPr>
+        <w:t xml:space="preserve"> [Non testé : C. nasus étant en général traité en premier (§1), le classement « dominant Cn » pourrait refléter l'ordre de traitement (RESULTATS R31). Le contraste femelles/mâles (R27) n'est pas rapporté tant que le code de sexe « X » n'est pas confirmé.]</w:t>
+      </w:r>
+    </w:p>
+    <w:p>
+      <w:pPr>
+        <w:pStyle w:val="Heading1"/>
+      </w:pPr>
+      <w:r>
+        <w:rPr>
+          <w:color w:val="1F4E79"/>
+        </w:rPr>
+        <w:t>Composition by genotypic category</w:t>
+      </w:r>
+    </w:p>
+    <w:p>
+      <w:pPr/>
+      <w:r/>
+      <w:r>
+        <w:rPr>
+          <w:b w:val="0"/>
+          <w:i w:val="0"/>
+        </w:rPr>
+      </w:r>
+      <w:r>
+        <w:rPr>
+          <w:b w:val="0"/>
+          <w:i w:val="0"/>
+          <w:color w:val="1F4E79"/>
+        </w:rPr>
+      </w:r>
+      <w:r>
+        <w:rPr>
+          <w:b w:val="0"/>
+          <w:i w:val="0"/>
+          <w:color w:val="1F4E79"/>
+        </w:rPr>
+      </w:r>
+      <w:r>
+        <w:rPr>
+          <w:b w:val="0"/>
+          <w:i w:val="0"/>
+          <w:color w:val="1F4E79"/>
+        </w:rPr>
+      </w:r>
+      <w:r>
+        <w:rPr>
+          <w:b w:val="0"/>
+          <w:i w:val="0"/>
+        </w:rPr>
+      </w:r>
+      <w:r>
+        <w:rPr>
+          <w:b w:val="0"/>
+          <w:i w:val="0"/>
+        </w:rPr>
+      </w:r>
+      <w:r>
+        <w:rPr>
+          <w:b w:val="0"/>
+          <w:i w:val="0"/>
+          <w:color w:val="1F4E79"/>
+        </w:rPr>
+      </w:r>
+      <w:r>
+        <w:rPr>
+          <w:b w:val="0"/>
+          <w:i w:val="0"/>
+          <w:color w:val="1F4E79"/>
+        </w:rPr>
+      </w:r>
+      <w:r>
+        <w:rPr>
+          <w:color w:val="1F4E79"/>
+        </w:rPr>
+      </w:r>
+      <w:r>
+        <w:t xml:space="preserve">A preliminary variance partition was run to size these terms before the ecological analysis, not as a result of it, in both passes and on the four metrics. Fitted in both orderings without plate position, genotypic category accounts for a median of 1.7 % to 2.8 % of compositional variance across the 48 metric × tissue × run strata in pass 1 and 1.4 % to 3.0 % in pass 2, against a median of 19 % and 18 % for station (range across strata 14–36 % in pass 1 and 14–35 % in pass 2). No tissue is detected by all four metrics in all three runs under both permutation schemes, in either pass, with or without plate position, so a global statement that hybrids differ is not supportable: the analysis must say which metric supports which claim, in which tissue, and under which definition of a hybrid. One result is robust to every choice made here — both passes, with and without plate position, all three runs and both permutation schemes: the midgut on Jaccard (p ≤ 0.044). The caudal fin on weighted UniFrac is detected in all three runs and both schemes in pass 1 (p = 0.007–0.024), with or without plate position, and in no run in pass 2 (p = 0.073–0.235). A witness attributes this displacement to the definition of hybrids rather than to sample size: removing 22 randomly chosen individuals from the 158 that are not introgressed, twenty times, never restored the caudal signal in pass 2. At 500 reads the caudal signal is partial in pass 1 (three runs sequentially, p = 0.022–0.049; one of three with station fixed by blocks) and absent in pass 2, </w:t>
+      </w:r>
+      <w:r>
+        <w:rPr>
+          <w:i w:val="0"/>
+          <w:color w:val="1F4E79"/>
+        </w:rPr>
+        <w:t>an attenuation that is not an effect of depth: restricted to the samples retained at 3,000 reads, the 500-read matrices give the same result as at 3,000 reads (all three runs, both station-blocked schemes, p = 0.010–0.026), so the signal is diluted by the caudal-fin samples that pass the threshold only at 500 reads. As at 3,000 reads, none of twenty random removals of 22 non-introgressed individuals from pass 2 reproduced the pass-1 pattern at 500 reads.</w:t>
+      </w:r>
+      <w:r>
+        <w:rPr>
+          <w:i w:val="0"/>
+        </w:rPr>
+        <w:t xml:space="preserve"> The hindgut is the weakest tissue in pass 1 (only Jaccard is significant, in one run of three with station fixed by blocks) but not in pass 2, where with station fixed by blocks all four metrics detect it in all three runs; the witness does not resolve whether this difference reflects sample size or the definition of hybrids. The principal and sensitivity models differ in 7 of the 16 metric × tissue cells in each pass, of which 5 (pass 1) and 3 (pass 2) move between robust detection (three runs, both schemes), partial detection and none. Of the two witnesses that could have discriminated further, the separable sub-design detects category in 3 of 48 tests in pass 1 and 1 of 48 in pass 2 (with plate position), and Rosières, in pass 2, detects it in the gill on Jaccard and unweighted UniFrac in all three runs (p = 0.010–0.030); in pass 1 Rosières is not interpretable. Supplementary Table S</w:t>
+      </w:r>
+      <w:r>
+        <w:rPr>
+          <w:i w:val="0"/>
+        </w:rPr>
+        <w:t>9</w:t>
+      </w:r>
+      <w:r>
+        <w:rPr>
+          <w:i w:val="0"/>
+        </w:rPr>
+        <w:t>.</w:t>
+      </w:r>
+    </w:p>
+    <w:p>
+      <w:pPr/>
+      <w:r>
+        <w:rPr>
+          <w:color w:val="1F4E79"/>
+        </w:rPr>
+        <w:t>Figure 3 summarises these detections in the principal model with permutations constrained within station blocks (Fig. 3a, b), and the variance shares on which they rest (Fig. 3c). Fitted before category, station accounted for a median of 20.9 % (pass 1) and 20.1 % (pass 2) of compositional variance; category accounted for 2.8 % and 3.0 % when fitted first and 1.7 % and 1.4 % when fitted last. Whether the loss of the caudal-fin signal between passes is produced by dilution of the hybrid–</w:t>
+      </w:r>
+      <w:r>
+        <w:rPr>
+          <w:i/>
+          <w:color w:val="1F4E79"/>
+        </w:rPr>
+        <w:t>P. toxostoma</w:t>
+      </w:r>
+      <w:r>
+        <w:rPr>
+          <w:color w:val="1F4E79"/>
+        </w:rPr>
+        <w:t xml:space="preserve"> contrast by the 19 near-parental hybrids of </w:t>
+      </w:r>
+      <w:r>
+        <w:rPr>
+          <w:i/>
+          <w:color w:val="1F4E79"/>
+        </w:rPr>
+        <w:t>P. toxostoma</w:t>
+      </w:r>
+      <w:r>
+        <w:rPr>
+          <w:color w:val="1F4E79"/>
+        </w:rPr>
+        <w:t xml:space="preserve"> background was tested (§8.12) and remains undetermined. Relabelling as hybrids 19 </w:t>
+      </w:r>
+      <w:r>
+        <w:rPr>
+          <w:i/>
+          <w:color w:val="1F4E79"/>
+        </w:rPr>
+        <w:t>P. toxostoma</w:t>
+      </w:r>
+      <w:r>
+        <w:rPr>
+          <w:color w:val="1F4E79"/>
+        </w:rPr>
+        <w:t xml:space="preserve"> and 3 </w:t>
+      </w:r>
+      <w:r>
+        <w:rPr>
+          <w:i/>
+          <w:color w:val="1F4E79"/>
+        </w:rPr>
+        <w:t>C. nasus</w:t>
+      </w:r>
+      <w:r>
+        <w:rPr>
+          <w:color w:val="1F4E79"/>
+        </w:rPr>
+        <w:t xml:space="preserve"> drawn from the stations of the near-parental individuals removed the pass-1 signal in 16 of 20 draws, so that such dilution is sufficient to produce the displacement; but the near-parental hybrids of </w:t>
+      </w:r>
+      <w:r>
+        <w:rPr>
+          <w:i/>
+          <w:color w:val="1F4E79"/>
+        </w:rPr>
+        <w:t>P. toxostoma</w:t>
+      </w:r>
+      <w:r>
+        <w:rPr>
+          <w:color w:val="1F4E79"/>
+        </w:rPr>
+        <w:t xml:space="preserve"> background differed neither from pure </w:t>
+      </w:r>
+      <w:r>
+        <w:rPr>
+          <w:i/>
+          <w:color w:val="1F4E79"/>
+        </w:rPr>
+        <w:t>P. toxostoma</w:t>
+      </w:r>
+      <w:r>
+        <w:rPr>
+          <w:color w:val="1F4E79"/>
+        </w:rPr>
+        <w:t xml:space="preserve"> (p = 0.28–0.60) nor from intermediate hybrids (p = 0.15–0.26; n = 25–26), so that dilution is not established.</w:t>
+      </w:r>
+      <w:r>
+        <w:rPr>
+          <w:i/>
+          <w:color w:val="888888"/>
+          <w:sz w:val="18"/>
+        </w:rPr>
+        <w:t xml:space="preserve"> [Le paragraphe précédent vient des Methods (ancien §8.9) : « not as a result of it » est à reformuler maintenant qu'il figure en Results. Les médianes de station de ce paragraphe (19 % et 18 %) sont celles de la station servie après la catégorie ; 20,9 % et 20,1 % ci-dessus, station servie en premier.]</w:t>
+      </w:r>
+    </w:p>
+    <w:p>
+      <w:pPr>
+        <w:pStyle w:val="Heading1"/>
+      </w:pPr>
+      <w:r>
+        <w:rPr>
+          <w:color w:val="1F4E79"/>
+        </w:rPr>
+        <w:t>Dispersion</w:t>
+      </w:r>
+    </w:p>
+    <w:p>
+      <w:pPr/>
+      <w:r>
+        <w:rPr>
+          <w:color w:val="1F4E79"/>
+        </w:rPr>
+        <w:t xml:space="preserve">The transgressive prediction in its dispersion form — hybrids more variable than both parental categories — was not supported in either pass (Fig. 4). With station fixed by blocks, hybrids were the least dispersed of the three categories in 22 of 48 tests in pass 1 and 32 of 48 in pass 2, against the third expected under no ordering (one-sided binomial p = 0.048 and 2.4 × 10⁻⁶), and the most dispersed in 18 and 10 (p = 0.32 and 0.98). Within the stations carrying all three categories, where a dispersion difference cannot be spatial, neither direction departed from chance: hybrids were the least dispersed in 25 of 68 tests in pass 1 and 39 of 120 in pass 2, and the most dispersed in 17 and 45. The lower dispersion of hybrids is therefore a pattern of the station-blocked analysis, clear in pass 2 only and carried mainly by Bray–Curtis (median difference between hybrids and the parental mean −0.068 in pass 2 and −0.008 in pass 1), the other metrics differing by less than 0.013. Significant tests in the transgressive direction numbered 3 in pass 1 (the gill on unweighted UniFrac in two runs and the caudal fin on weighted UniFrac in one) and none in pass 2 with station fixed by blocks, and none and 5 within stations, the five of pass 2 all concerning the gill at Saint-Just-d'Ardèche, where each stratum holds three or four </w:t>
+      </w:r>
+      <w:r>
+        <w:rPr>
+          <w:i/>
+          <w:color w:val="1F4E79"/>
+        </w:rPr>
+        <w:t>P. toxostoma</w:t>
+      </w:r>
+      <w:r>
+        <w:rPr>
+          <w:color w:val="1F4E79"/>
+        </w:rPr>
+        <w:t>.</w:t>
+      </w:r>
+    </w:p>
+    <w:p>
+      <w:pPr/>
+      <w:r>
+        <w:rPr>
+          <w:color w:val="1F4E79"/>
+        </w:rPr>
+        <w:t xml:space="preserve">This bears on how the location results are read, because PERMANOVA is sensitive to heterogeneous dispersion. With station fixed by blocks, dispersion in the caudal fin was homogeneous on all four metrics in pass 2 and in all but one test in pass 1 (weighted UniFrac, one run of three, p = 0.048, hybrids most dispersed): the caudal-fin location signal on weighted UniFrac in pass 1 is a difference in composition in two runs and cannot be separated from a dispersion difference in the third. The robust midgut signal on Jaccard was accompanied by homogeneous dispersion in pass 1 and in two runs of three in pass 2. By contrast, dispersion was heterogeneous in all three runs in the midgut on unweighted UniFrac in both passes and, in pass 2, in the midgut and hindgut on Bray–Curtis, </w:t>
+      </w:r>
+      <w:r>
+        <w:rPr>
+          <w:i/>
+          <w:color w:val="1F4E79"/>
+        </w:rPr>
+        <w:t>P. toxostoma</w:t>
+      </w:r>
+      <w:r>
+        <w:rPr>
+          <w:color w:val="1F4E79"/>
+        </w:rPr>
+        <w:t xml:space="preserve"> being the most dispersed category there; the location signals detected on those metrics in those compartments cannot be separated from a dispersion effect. One reservation is not resolved: betadisper accepts no covariate, so the plate-position effect (§8.9) is not adjusted for, and a category whose samples are more spread across plate columns could carry inflated dispersion. Supplementary Table S</w:t>
+      </w:r>
+      <w:r>
+        <w:rPr>
+          <w:color w:val="1F4E79"/>
+        </w:rPr>
+        <w:t>10</w:t>
+      </w:r>
+      <w:r>
+        <w:rPr>
+          <w:color w:val="1F4E79"/>
+        </w:rPr>
+        <w:t xml:space="preserve"> and Figure S3.</w:t>
+      </w:r>
+      <w:r>
+        <w:rPr>
+          <w:i/>
+          <w:color w:val="888888"/>
+          <w:sz w:val="18"/>
+        </w:rPr>
+        <w:t xml:space="preserve"> [Correction du 2026-10-03 : l'ancienne version de ces deux paragraphes, sans correction de petit effectif, donnait 32/48 (passe 1) et 34/48 (passe 2) en station bloquée, 45/68 intra-station en passe 1 et une dispersion hétérogène en caudale ; elle est retirée (docs/plan_permdisp_biais_2026-10-03.md, scripts 24 et 39). Table S</w:t>
+      </w:r>
+      <w:r>
+        <w:rPr>
+          <w:i/>
+          <w:color w:val="888888"/>
+          <w:sz w:val="18"/>
+        </w:rPr>
+        <w:t>10</w:t>
+      </w:r>
+      <w:r>
+        <w:rPr>
+          <w:i/>
+          <w:color w:val="888888"/>
+          <w:sz w:val="18"/>
+        </w:rPr>
+        <w:t xml:space="preserve"> et Figure S3 du supplément régénérées avec les valeurs corrigées le 2026-10-05 (scripts/41-supp_S10_S3.py).]</w:t>
+      </w:r>
+    </w:p>
+    <w:p>
+      <w:pPr>
+        <w:pStyle w:val="Heading1"/>
+      </w:pPr>
+      <w:r>
+        <w:rPr>
+          <w:color w:val="1F4E79"/>
+        </w:rPr>
+        <w:t>Four-dimensional index</w:t>
+      </w:r>
+    </w:p>
+    <w:p>
+      <w:pPr/>
+      <w:r>
+        <w:rPr>
+          <w:color w:val="1F4E79"/>
+        </w:rPr>
+        <w:t>Under the principal setting, the transgressive axis of the 4H index exceeded 0.5 in all three runs in the caudal fin, midgut and hindgut of both passes (Gain + Loss = 0.58–0.69), carried by the Loss model, whereas the parental axis dominated in the gill (Gain + Loss = 0.41–0.46), carried by Intersection (Fig. 5a). None of these transgressive readings was robust under the pre-declared rule (Fig. 5b): the abundance-based version placed all eight tissue × pass combinations on the parental axis, and at family rank the caudal fin also fell on the parental side. The only robust reading was the parental axis of the gill in pass 2; in pass 1 the gill was undetermined at ρ = 0.7. No pair of compartments was distinguished, the 95 % bootstrap intervals of the transgressive axis overlapping in at least one run for every pair, in both passes. In every tissue and both passes at least 98.4 % of bootstraps lay on the Intersection side of the null plane: hybrids preferentially retain the core taxa shared by both parental species. The core of hybrids represented less than half of the mean parental core in the midgut of pass 1 (two runs of three; ratio 0.45–0.64) and 0.51–1.07 of it elsewhere. Compared at equal N, passes 1 and 2 fell on the same axis in every tissue.</w:t>
+      </w:r>
+    </w:p>
+    <w:p>
+      <w:pPr/>
+      <w:r>
+        <w:rPr>
+          <w:color w:val="1F4E79"/>
+        </w:rPr>
+        <w:t>Two observations lie outside the pre-declared rules and are reported as descriptions only. A null hybrid built by averaging one randomly drawn individual of each parental species already reached a transgressive share of 0.40–0.57; the observed share exceeded it by 0.08–0.15 in the caudal fin, 0.09–0.22 in the midgut and 0.03–0.13 in the hindgut, and differed from it by −0.04 to +0.06 in the gill (Fig. 5). Computed at its own, larger N (26–40 hosts per class), pass 2 moved the caudal fin to the parental axis (Gain + Loss = 0.42–0.47), while the midgut and hindgut remained on the transgressive side.</w:t>
       </w:r>
     </w:p>
     <w:p>
@@ -1660,7 +2373,331 @@
         <w:rPr>
           <w:color w:val="1F4E79"/>
         </w:rPr>
-        <w:t>Results</w:t>
+        <w:t>Discussion</w:t>
+      </w:r>
+    </w:p>
+    <w:p>
+      <w:pPr/>
+      <w:r>
+        <w:rPr>
+          <w:color w:val="1F4E79"/>
+        </w:rPr>
+        <w:t xml:space="preserve">Across alpha diversity, community dispersion and the 4H index, the microbiota of hybrids between </w:t>
+      </w:r>
+      <w:r>
+        <w:rPr>
+          <w:i/>
+          <w:color w:val="1F4E79"/>
+        </w:rPr>
+        <w:t>C. nasus</w:t>
+      </w:r>
+      <w:r>
+        <w:rPr>
+          <w:color w:val="1F4E79"/>
+        </w:rPr>
+        <w:t xml:space="preserve"> and </w:t>
+      </w:r>
+      <w:r>
+        <w:rPr>
+          <w:i/>
+          <w:color w:val="1F4E79"/>
+        </w:rPr>
+        <w:t>P. toxostoma</w:t>
+      </w:r>
+      <w:r>
+        <w:rPr>
+          <w:color w:val="1F4E79"/>
+        </w:rPr>
+        <w:t xml:space="preserve"> showed no transgressive pattern. Hybrids were transgressive in none of 32 alpha-diversity tests, </w:t>
+      </w:r>
+      <w:r>
+        <w:rPr>
+          <w:color w:val="1F4E79"/>
+        </w:rPr>
+        <w:t>were more dispersed than both parents no more often than expected by chance,</w:t>
+      </w:r>
+      <w:r>
+        <w:rPr>
+          <w:color w:val="1F4E79"/>
+        </w:rPr>
+        <w:t xml:space="preserve"> and no transgressive reading of the 4H index survived the robustness rule declared before computation. Where hybrids could be placed relative to their parents, they fell within the parental range: dominance of </w:t>
+      </w:r>
+      <w:r>
+        <w:rPr>
+          <w:i/>
+          <w:color w:val="1F4E79"/>
+        </w:rPr>
+        <w:t>C. nasus</w:t>
+      </w:r>
+      <w:r>
+        <w:rPr>
+          <w:color w:val="1F4E79"/>
+        </w:rPr>
+        <w:t xml:space="preserve"> in caudal-fin alpha diversity in pass 1, a parental, Intersection-dominated 4H index in the gill, and preferential retention of the core taxa shared by both parental species in every compartment. The departures detected in composition were small — genotypic category accounted for a median of 1.4–3.0 % of compositional variance against about a fifth for station — and confined to particular compartments, metrics and definitions of a hybrid. This places the system with natural hybrid zones in which the environmental component dominates [23, 24] rather than with those in which host ancestry does [21, 22], while keeping in view that a small genetic effect is the expected magnitude for a heritable but weakly heritable trait [9] and that its detection required separating the spatial and technical axes beforehand, as in stickleback [10].</w:t>
+      </w:r>
+    </w:p>
+    <w:p>
+      <w:pPr/>
+      <w:r>
+        <w:rPr>
+          <w:color w:val="1F4E79"/>
+        </w:rPr>
+        <w:t>The expectation derived from Guivier et al. [31], that a hybrid signal would be most pronounced in the digestive compartments, is partly supported. The only compositional result that withstood every analytical choice concerned the midgut, on a presence-based metric, and in pass 2 both digestive compartments were detected by all four metrics with station fixed by blocks. But the caudal fin carried, in pass 1, a signal on weighted UniFrac that no digestive compartment showed on that metric, the gill was the compartment in which the 4H index was robustly parental, and the 4H index distinguished no pair of compartments. Hybrid status therefore does not matter equally in all compartments, but which compartment carries a difference depends on the metric. The rule adopted here, which states a result as established only when an abundance-weighted and a presence-based metric both support it, makes this dependence explicit rather than resolving it; it also explains why the 4H index, a presence-based construct in its principal form, departed from its abundance-based version in every compartment but the gill.</w:t>
+      </w:r>
+    </w:p>
+    <w:p>
+      <w:pPr/>
+      <w:r>
+        <w:rPr>
+          <w:color w:val="1F4E79"/>
+        </w:rPr>
+        <w:t xml:space="preserve">How hybrids are defined mattered as much as which compartment is examined. The caudal-fin signal obtained with the 20 intermediate hybrids disappeared when the 22 near-parental individuals were added, and twenty random removals of 22 non-introgressed fish never reproduced the displacement, so that it is attributable to who is called a hybrid rather than to sample size. Whether near-parental hybrids of </w:t>
+      </w:r>
+      <w:r>
+        <w:rPr>
+          <w:i/>
+          <w:color w:val="1F4E79"/>
+        </w:rPr>
+        <w:t>P. toxostoma</w:t>
+      </w:r>
+      <w:r>
+        <w:rPr>
+          <w:color w:val="1F4E79"/>
+        </w:rPr>
+        <w:t xml:space="preserve"> background dilute the contrast because their microbiota resembles that of </w:t>
+      </w:r>
+      <w:r>
+        <w:rPr>
+          <w:i/>
+          <w:color w:val="1F4E79"/>
+        </w:rPr>
+        <w:t>P. toxostoma</w:t>
+      </w:r>
+      <w:r>
+        <w:rPr>
+          <w:color w:val="1F4E79"/>
+        </w:rPr>
+        <w:t xml:space="preserve"> could not be established at the available sample size. In a mosaic hybrid zone [30] in which most introgressed individuals depart from a parental genome on a single chromosome, a hybrid class is a decision; reporting both passes shows how much of any conclusion rests on that decision, and we suggest that studies of natural hybrid zones report it in the same way.</w:t>
+      </w:r>
+    </w:p>
+    <w:p>
+      <w:pPr/>
+      <w:r>
+        <w:rPr>
+          <w:color w:val="1F4E79"/>
+        </w:rPr>
+        <w:t>That hybrids were not more dispersed than their parents runs against the expectation that the microbiota of hybrids is more variable because their genomes combine parental elements in variable proportions. The opposite tendency, hybrids less dispersed than both parents, was clear only in pass 2 with station fixed by blocks, absent within stations and carried mainly by Bray–Curtis, and should not be read as a general property of hybrids here. The dispersion analysis also illustrates a pitfall of unbalanced designs: without correction for group size the distance to the group centre is underestimated in small groups, and because hybrids were the smallest category in every stratum, the uncorrected analysis yielded a strong and apparently replicated reduction of hybrid dispersion — 32 of 48 station-blocked tests in pass 1 and 45 of 68 within stations — that largely disappeared once corrected. Hybrid classes are small in most natural hybrid zones, and the correction should be applied by default in that setting [48].</w:t>
+      </w:r>
+    </w:p>
+    <w:p>
+      <w:pPr/>
+      <w:r>
+        <w:rPr>
+          <w:color w:val="1F4E79"/>
+        </w:rPr>
+        <w:t xml:space="preserve">The 4H index adds two points that the location and dispersion analyses do not. First, in its abundance-based version — the form in which the framework's authors compared published systems [14] — the index placed every compartment on the parental axis (Gain + Loss = 0.22–0.35), as in the </w:t>
+      </w:r>
+      <w:r>
+        <w:rPr>
+          <w:i/>
+          <w:color w:val="1F4E79"/>
+        </w:rPr>
+        <w:t>Neotoma</w:t>
+      </w:r>
+      <w:r>
+        <w:rPr>
+          <w:color w:val="1F4E79"/>
+        </w:rPr>
+        <w:t xml:space="preserve"> woodrat system (0.12) and unlike the </w:t>
+      </w:r>
+      <w:r>
+        <w:rPr>
+          <w:i/>
+          <w:color w:val="1F4E79"/>
+        </w:rPr>
+        <w:t>Aspidoscelis</w:t>
+      </w:r>
+      <w:r>
+        <w:rPr>
+          <w:color w:val="1F4E79"/>
+        </w:rPr>
+        <w:t xml:space="preserve"> lizard and </w:t>
+      </w:r>
+      <w:r>
+        <w:rPr>
+          <w:i/>
+          <w:color w:val="1F4E79"/>
+        </w:rPr>
+        <w:t>Kikihia</w:t>
+      </w:r>
+      <w:r>
+        <w:rPr>
+          <w:color w:val="1F4E79"/>
+        </w:rPr>
+        <w:t xml:space="preserve"> cicada systems (0.71 and 0.64); on a hybrid lizard, transgression has been associated with ecological success rather than with dysbiosis [15], so the absence of transgression here carries no implication for hybrid fitness either way. Second, as its authors found for a natural hybrid system, the index was sensitive to its settings: the choice between presence and abundance reversed the reading in three compartments of four, and in the caudal fin so did the number of hosts per class, from 9 to 26–27. A null hybrid built from parental individuals already sits close to the 0.5 boundary between the two axes, which makes that boundary a weak criterion for calling a hybrid microbiota transgressive. We therefore read the 4H index as a description of taxon membership conditional on its settings, and not as an independent test of the intermediate, dominant and transgressive hypotheses.</w:t>
+      </w:r>
+    </w:p>
+    <w:p>
+      <w:pPr/>
+      <w:r>
+        <w:rPr>
+          <w:color w:val="1F4E79"/>
+        </w:rPr>
+        <w:t xml:space="preserve">Four limits bound these conclusions. Genotypic category is confounded with station, and the three stations that carry all three categories hold 65–74 individuals, so that every category effect is estimated mostly between stations and is read as a pattern co-varying with station and category. Plate position affected composition and followed processing order in every campaign; the mechanism — extraction order, reagent drift within a plate, cross-contamination between adjacent wells or time spent in the holding tank — is not identified, and because </w:t>
+      </w:r>
+      <w:r>
+        <w:rPr>
+          <w:i/>
+          <w:color w:val="1F4E79"/>
+        </w:rPr>
+        <w:t>C. nasus</w:t>
+      </w:r>
+      <w:r>
+        <w:rPr>
+          <w:color w:val="1F4E79"/>
+        </w:rPr>
+        <w:t xml:space="preserve"> was generally processed first it could contribute to the dominance of </w:t>
+      </w:r>
+      <w:r>
+        <w:rPr>
+          <w:i/>
+          <w:color w:val="1F4E79"/>
+        </w:rPr>
+        <w:t>C. nasus</w:t>
+      </w:r>
+      <w:r>
+        <w:rPr>
+          <w:color w:val="1F4E79"/>
+        </w:rPr>
+        <w:t xml:space="preserve"> in caudal-fin alpha diversity, which was not tested. Rarefaction to 3,000 reads retained intermediate hybrids less often than </w:t>
+      </w:r>
+      <w:r>
+        <w:rPr>
+          <w:i/>
+          <w:color w:val="1F4E79"/>
+        </w:rPr>
+        <w:t>P. toxostoma</w:t>
+      </w:r>
+      <w:r>
+        <w:rPr>
+          <w:color w:val="1F4E79"/>
+        </w:rPr>
+        <w:t xml:space="preserve"> in the caudal fin, a selection that is declared but cannot be removed for presence-based metrics. And only 64 % of reads could be aggregated to genus for the 4H index, whose genus-level reading therefore rests on the better-assigned part of each community.</w:t>
+      </w:r>
+    </w:p>
+    <w:p>
+      <w:pPr>
+        <w:pStyle w:val="Title"/>
+      </w:pPr>
+      <w:r>
+        <w:rPr>
+          <w:color w:val="1F4E79"/>
+        </w:rPr>
+        <w:t>Conclusions</w:t>
+      </w:r>
+    </w:p>
+    <w:p>
+      <w:pPr/>
+      <w:r>
+        <w:rPr>
+          <w:color w:val="1F4E79"/>
+        </w:rPr>
+        <w:t xml:space="preserve">In a natural, mosaic hybrid zone between </w:t>
+      </w:r>
+      <w:r>
+        <w:rPr>
+          <w:i/>
+          <w:color w:val="1F4E79"/>
+        </w:rPr>
+        <w:t>C. nasus</w:t>
+      </w:r>
+      <w:r>
+        <w:rPr>
+          <w:color w:val="1F4E79"/>
+        </w:rPr>
+        <w:t xml:space="preserve"> and </w:t>
+      </w:r>
+      <w:r>
+        <w:rPr>
+          <w:i/>
+          <w:color w:val="1F4E79"/>
+        </w:rPr>
+        <w:t>P. toxostoma</w:t>
+      </w:r>
+      <w:r>
+        <w:rPr>
+          <w:color w:val="1F4E79"/>
+        </w:rPr>
+        <w:t xml:space="preserve">, the bacterial microbiota of hybrids lay within the parental range in four tissue compartments: no transgressive pattern was found in alpha diversity, </w:t>
+      </w:r>
+      <w:r>
+        <w:rPr>
+          <w:color w:val="1F4E79"/>
+        </w:rPr>
+        <w:t>community dispersion</w:t>
+      </w:r>
+      <w:r>
+        <w:rPr>
+          <w:color w:val="1F4E79"/>
+        </w:rPr>
+        <w:t xml:space="preserve"> or the 4H index, and hybrids preferentially retained the core taxa shared by both parents. Departures from the parents were small relative to spatial variation and depended on the compartment, the metric and the definition of a hybrid. Studies of hybrid microbiota in natural populations should therefore report the definition of a hybrid, the metric and the tissue alongside each result, and treat spatial and technical structure as part of the design rather than as noise.</w:t>
+      </w:r>
+    </w:p>
+    <w:p>
+      <w:pPr>
+        <w:pStyle w:val="Title"/>
+      </w:pPr>
+      <w:r>
+        <w:rPr>
+          <w:color w:val="1F4E79"/>
+        </w:rPr>
+        <w:t>Abbreviations</w:t>
+      </w:r>
+    </w:p>
+    <w:p>
+      <w:pPr/>
+      <w:r>
+        <w:rPr>
+          <w:color w:val="1F4E79"/>
+        </w:rPr>
+        <w:t xml:space="preserve">4H: four-dimensional hybrid microbiome index (Union, Intersection, Gain, Loss); ASV: amplicon sequence variant; Cn: </w:t>
+      </w:r>
+      <w:r>
+        <w:rPr>
+          <w:i/>
+          <w:color w:val="1F4E79"/>
+        </w:rPr>
+        <w:t>Chondrostoma nasus</w:t>
+      </w:r>
+      <w:r>
+        <w:rPr>
+          <w:color w:val="1F4E79"/>
+        </w:rPr>
+        <w:t xml:space="preserve">; D: inter-chromosome discordance of the hybrid index; Hy: hybrid; PERMANOVA: permutational multivariate analysis of variance; PERMDISP: permutational analysis of multivariate dispersions; Pt: </w:t>
+      </w:r>
+      <w:r>
+        <w:rPr>
+          <w:i/>
+          <w:color w:val="1F4E79"/>
+        </w:rPr>
+        <w:t>Parachondrostoma toxostoma</w:t>
+      </w:r>
+      <w:r>
+        <w:rPr>
+          <w:color w:val="1F4E79"/>
+        </w:rPr>
+        <w:t>; UniFrac: unique fraction metric.</w:t>
+      </w:r>
+    </w:p>
+    <w:p>
+      <w:pPr>
+        <w:pStyle w:val="Title"/>
+      </w:pPr>
+      <w:r>
+        <w:rPr>
+          <w:color w:val="1F4E79"/>
+        </w:rPr>
+        <w:t>Declarations</w:t>
       </w:r>
     </w:p>
     <w:p>
@@ -1671,7 +2708,7 @@
         <w:rPr>
           <w:color w:val="1F4E79"/>
         </w:rPr>
-        <w:t>Genotypic design and its entanglement with station</w:t>
+        <w:t>Ethics approval and consent to participate</w:t>
       </w:r>
     </w:p>
     <w:p>
@@ -1680,126 +2717,15 @@
         <w:rPr>
           <w:color w:val="1F4E79"/>
         </w:rPr>
-        <w:t xml:space="preserve">The 180 fish comprised 59 </w:t>
+        <w:t>Fish were captured by electrofishing and euthanised before dissection under authorisations n° 2014-156-0001 and n° 2015-1426DDT605, following international guidelines of animal care.</w:t>
       </w:r>
       <w:r>
         <w:rPr>
           <w:i/>
-          <w:color w:val="1F4E79"/>
-        </w:rPr>
-        <w:t>C. nasus</w:t>
-      </w:r>
-      <w:r>
-        <w:rPr>
-          <w:color w:val="1F4E79"/>
-        </w:rPr>
-        <w:t xml:space="preserve">, 42 hybrids and 79 </w:t>
-      </w:r>
-      <w:r>
-        <w:rPr>
-          <w:i/>
-          <w:color w:val="1F4E79"/>
-        </w:rPr>
-        <w:t>P. toxostoma</w:t>
-      </w:r>
-      <w:r>
-        <w:rPr>
-          <w:color w:val="1F4E79"/>
-        </w:rPr>
-        <w:t xml:space="preserve">, unevenly distributed across the nine stations (Fig. 1a). Near-parental hybrids carry a median hybrid index close to that of one parent but an inter-chromosome discordance D of 0.15–0.60, against at most 0.12 in parental individuals (Fig. 1b); categories were assigned from chromosome-level assignments rather than by thresholding either quantity (§1). Of the 22 near-parental hybrids, 19 have a </w:t>
-      </w:r>
-      <w:r>
-        <w:rPr>
-          <w:i/>
-          <w:color w:val="1F4E79"/>
-        </w:rPr>
-        <w:t>P. toxostoma</w:t>
-      </w:r>
-      <w:r>
-        <w:rPr>
-          <w:color w:val="1F4E79"/>
-        </w:rPr>
-        <w:t xml:space="preserve"> background and 3 a </w:t>
-      </w:r>
-      <w:r>
-        <w:rPr>
-          <w:i/>
-          <w:color w:val="1F4E79"/>
-        </w:rPr>
-        <w:t>C. nasus</w:t>
-      </w:r>
-      <w:r>
-        <w:rPr>
-          <w:color w:val="1F4E79"/>
-        </w:rPr>
-        <w:t xml:space="preserve"> background.</w:t>
-      </w:r>
-    </w:p>
-    <w:p>
-      <w:pPr/>
-      <w:r/>
-      <w:r>
-        <w:rPr>
-          <w:b w:val="0"/>
-          <w:i w:val="0"/>
-        </w:rPr>
-      </w:r>
-      <w:r>
-        <w:rPr>
-          <w:b w:val="0"/>
-          <w:i w:val="0"/>
-          <w:color w:val="1F4E79"/>
-        </w:rPr>
-      </w:r>
-      <w:r>
-        <w:rPr>
-          <w:b w:val="0"/>
-          <w:i w:val="0"/>
-          <w:color w:val="1F4E79"/>
-        </w:rPr>
-      </w:r>
-      <w:r>
-        <w:rPr>
-          <w:b w:val="0"/>
-          <w:i w:val="0"/>
-          <w:color w:val="1F4E79"/>
-        </w:rPr>
-      </w:r>
-      <w:r>
-        <w:rPr>
-          <w:b w:val="0"/>
-          <w:i w:val="0"/>
-        </w:rPr>
-      </w:r>
-      <w:r>
-        <w:rPr>
-          <w:b w:val="0"/>
-          <w:i w:val="0"/>
-        </w:rPr>
-      </w:r>
-      <w:r>
-        <w:rPr>
-          <w:b w:val="0"/>
-          <w:i w:val="0"/>
-          <w:color w:val="1F4E79"/>
-        </w:rPr>
-        <w:t>Genotypic category is entangled with both the spatial and the technical axes, and the entanglement is a property of the design rather than a caveat of presentation. Between stations, category is confounded with station: of nine stations, three carry all three categories (74 individuals in pass 2, 65 in pass 1, where Saint-Just-d'Ardèche retains a single hybrid), the others one or two. Within those three stations, category and plate column are in turn strongly associated, because field numbering followed sampling order (</w:t>
-      </w:r>
-      <w:r>
-        <w:rPr>
-          <w:b w:val="0"/>
-          <w:i w:val="0"/>
-          <w:color w:val="1F4E79"/>
-        </w:rPr>
-        <w:t>§8.9</w:t>
-      </w:r>
-      <w:r>
-        <w:rPr>
-          <w:b w:val="0"/>
-          <w:i w:val="0"/>
-          <w:color w:val="1F4E79"/>
-        </w:rPr>
-        <w:t>). The sub-design in which category and position are fully separable at constant station comprises 31 individuals in pass 1 and 32 in pass 2, too few to carry a principal test. One station, Rosières, carries category and position independently (Cramér's V = 0.18, p = 0.35, in pass 2) and serves as a small clean witness; in pass 1 it retains a single hybrid and cannot witness a category effect.</w:t>
+          <w:color w:val="888888"/>
+          <w:sz w:val="18"/>
+        </w:rPr>
+        <w:t xml:space="preserve"> [À compléter (questions de suivi à André, 2026-10-03) : autorités de délivrance — ONEMA et DDT 04, 05 et 84 selon André — et couverture des stations de l'Ain et de l'Ardèche ; méthode d'euthanasie (dislocation cervicale, non confirmée). Consentement : sans objet.]</w:t>
       </w:r>
     </w:p>
     <w:p>
@@ -1810,31 +2736,16 @@
         <w:rPr>
           <w:color w:val="1F4E79"/>
         </w:rPr>
-        <w:t>Technical variation is small relative to biological variation</w:t>
+        <w:t>Consent for publication</w:t>
       </w:r>
     </w:p>
     <w:p>
       <w:pPr/>
       <w:r>
-        <w:t>The nested replication structure was verified directly from the data. Each pair of runs was compared within sample after rarefaction to a common depth, so that detection probability is identical by construction (548 samples reaching 3,000 reads in all three runs). The two runs sharing a library were markedly more similar to each other (mean Bray–Curtis 0.118, Jaccard 0.445) than either was to the run from the independent library (0.248 and 0.720 respectively); the two library-crossing comparisons were statistically indistinguishable from each other (paired Wilcoxon, p = 0.48) and both differed from the within-library comparison (p &lt; 10⁻⁸⁹). Recapture of rare ASVs (1–3 reads) showed the same pattern (0.48 within library vs 0.19 across).</w:t>
-      </w:r>
-    </w:p>
-    <w:p>
-      <w:pPr/>
-      <w:r>
-        <w:t>Library preparation therefore roughly doubles the technical dissimilarity contributed by sequencing alone, with a proportionally larger effect on presence–absence than on relative abundances. Sequencing run was accordingly modelled as nested within library preparation rather than as a three-level factor with interchangeable levels. Because each sample is present in every batch, technical and biological factors are crossed rather than confounded, so batch-correction methods designed for confounded meta-analyses were not applied.</w:t>
-      </w:r>
-      <w:r>
-        <w:t xml:space="preserve"> Index assignment across preparations and the verification of sample-to-file matching are detailed in Supplementary Table S5 and Note S1.</w:t>
-      </w:r>
-    </w:p>
-    <w:p>
-      <w:pPr/>
-      <w:r>
-        <w:rPr>
-          <w:i w:val="0"/>
-        </w:rPr>
-        <w:t>Relative to the biological signal, this technical variation is negligible. In a PERMANOVA on Bray–Curtis distances over the 1,784 samples retained after rarefaction, with the technical terms entered first so that they absorb the maximum variance the sequential decomposition can assign them, library preparation explained 0.03 % of the variance (R² = 0.0003, p = 0.63) and sequencing run within library 0.005 % (p = 1.00), against 9.2 % for tissue and 37.7 % for fish identity (both p = 0.002). Mean Bray–Curtis dissimilarity was 0.13 between two sequencing runs of one library and 0.25 across libraries, against 0.88 between different fish of the same tissue and 0.94 across tissues. Note that library preparation cannot be tested marginally, being perfectly aliased with run label (durance1 is the sole run of the first preparation).</w:t>
+        <w:rPr>
+          <w:color w:val="1F4E79"/>
+        </w:rPr>
+        <w:t>Not applicable.</w:t>
       </w:r>
     </w:p>
     <w:p>
@@ -1845,7 +2756,7 @@
         <w:rPr>
           <w:color w:val="1F4E79"/>
         </w:rPr>
-        <w:t>Plate position</w:t>
+        <w:t>Availability of data and materials</w:t>
       </w:r>
     </w:p>
     <w:p>
@@ -1854,894 +2765,19 @@
         <w:rPr>
           <w:color w:val="1F4E79"/>
         </w:rPr>
-        <w:t xml:space="preserve">Plate column affected composition. </w:t>
-      </w:r>
-      <w:r/>
-      <w:r>
-        <w:rPr>
-          <w:b w:val="0"/>
-          <w:i w:val="0"/>
-        </w:rPr>
-      </w:r>
-      <w:r>
-        <w:rPr>
-          <w:b w:val="0"/>
-          <w:i w:val="0"/>
-          <w:color w:val="1F4E79"/>
-        </w:rPr>
-      </w:r>
-      <w:r>
-        <w:rPr>
-          <w:b w:val="0"/>
-          <w:i w:val="0"/>
-          <w:color w:val="1F4E79"/>
-        </w:rPr>
-        <w:t>The effect is present in all 24 strata (12 tissue × run strata × 2 metrics) in both passes (p ≤ 0.033 in pass 1, p ≤ 0.007 in pass 2), replicated across the three runs; it does not depend on category labels, and the two passes differ only by the 22 individuals excluded from pass 1. Because the terms differ in degrees of freedom, effect sizes are reported relative to their expectation under the null, R2/(df/(n−1)): plate column reaches 1.84 in pass 1 and 1.95 in pass 2 (median R2 = 0.152 and 0.141, 11 df), the same order as genotypic category fitted after column (1.61 and 1.77; median R2 = 0.026 and 0.024, 2 df; significant in 19 and 18 of 24 strata) and below station (3.32 and 3.69; median R2 = 0.204 and 0.196, 8 df). Supplementary Table S7 and Figure S1.</w:t>
-      </w:r>
-      <w:r>
-        <w:rPr>
-          <w:color w:val="1F4E79"/>
-        </w:rPr>
-      </w:r>
-    </w:p>
-    <w:p>
-      <w:pPr/>
-      <w:r/>
-      <w:r>
-        <w:rPr>
-          <w:b w:val="0"/>
-          <w:i w:val="0"/>
-        </w:rPr>
-      </w:r>
-      <w:r>
-        <w:rPr>
-          <w:b w:val="0"/>
-          <w:i w:val="0"/>
-          <w:color w:val="1F4E79"/>
-        </w:rPr>
-      </w:r>
-      <w:r>
-        <w:rPr>
-          <w:b w:val="0"/>
-          <w:i w:val="0"/>
-          <w:color w:val="1F4E79"/>
-        </w:rPr>
-      </w:r>
-      <w:r>
-        <w:rPr>
-          <w:b w:val="0"/>
-          <w:i w:val="0"/>
-          <w:color w:val="1F4E79"/>
-        </w:rPr>
-        <w:t>Three witnesses separate this effect from the biology it could be mistaken for. Within a single genotypic category, where a column effect cannot be a category effect, it persists but more weakly: among P. toxostoma alone in 17 of 24 strata in both passes (ratio 1.65), among C. nasus alone in 6 (pass 1) and 7 (pass 2) of 24 (ratio 1.63); hybrids alone are too few to be tested (two strata in pass 2, none in pass 1). No site code carries a single genotypic category, and the only single-category station (Chavannes-sur-Suran, 19 P. toxostoma) is too small for a separate witness; the within-category subsets therefore replace the single-category-station witness of an earlier analysis, which rested on fish left unresolved by morphology. In the symmetric ordering with category fitted first, column still contributes (21 and 22 of 24 strata). And the classic plate artefacts are absent: plate row is significant in 7 and 6 of 24 strata and plate edge in none, making the effect specific to column, as expected of an effect tracking processing order rather than evaporation or thermal gradients. The origin of the association between category and column is documented above, but the mechanism of the column effect itself is not identified: extraction order, reagent-batch drift within a plate, cross-contamination between adjacent wells and the delay between capture and dissection are not separated by these data, and no negative control isolates any of them. Plate column is therefore not entered in the principal models (</w:t>
-      </w:r>
-      <w:r>
-        <w:rPr>
-          <w:b w:val="0"/>
-          <w:i w:val="0"/>
-          <w:color w:val="1F4E79"/>
-        </w:rPr>
-        <w:t>§8.7</w:t>
-      </w:r>
-      <w:r>
-        <w:rPr>
-          <w:b w:val="0"/>
-          <w:i w:val="0"/>
-          <w:color w:val="1F4E79"/>
-        </w:rPr>
-        <w:t xml:space="preserve">), but every model testing category is also reported with plate column as a covariate, and the two versions are </w:t>
-      </w:r>
-      <w:r>
-        <w:rPr>
-          <w:b w:val="0"/>
-          <w:i w:val="0"/>
-          <w:color w:val="1F4E79"/>
-        </w:rPr>
-        <w:t>compared below</w:t>
-      </w:r>
-      <w:r>
-        <w:rPr>
-          <w:b w:val="0"/>
-          <w:i w:val="0"/>
+        <w:t>The raw sequence data are available in the European Nucleotide Archive under accession PRJEB124417. The code, the scripts that produced every result and the decision log are available at https://github.com/martinjfsupagro/microbiome-hybrid [51]. Individual genotypes are given in Supplementary Table S</w:t>
+      </w:r>
+      <w:r>
+        <w:rPr>
+          <w:color w:val="1F4E79"/>
+        </w:rPr>
+        <w:t>2</w:t>
+      </w:r>
+      <w:r>
+        <w:rPr>
           <w:color w:val="1F4E79"/>
         </w:rPr>
         <w:t>.</w:t>
-      </w:r>
-    </w:p>
-    <w:p>
-      <w:pPr/>
-      <w:r>
-        <w:rPr>
-          <w:color w:val="1F4E79"/>
-        </w:rPr>
-        <w:t>Within every fishing campaign, plate column followed the order in which fish were processed (Spearman ρ between individual number and plate column, 0.55–0.95 over 12 station-year campaigns; §8.9 and §8.12), so that in this design the column effect cannot be separated from processing order, and therefore from the time each fish spent in the holding tank before dissection.</w:t>
-      </w:r>
-      <w:r>
-        <w:rPr>
-          <w:i/>
-          <w:color w:val="888888"/>
-          <w:sz w:val="18"/>
-        </w:rPr>
-        <w:t xml:space="preserve"> [ρ recalculé par scripts/40-verif_article_v2.py (results/verif_article/spearman_toutes_campagnes.tsv) : 0,548–0,950. Les deux campagnes de Pertuis 2014 sont agrégées ; Pont-d'Ain 2014 (moins de 4 poissons) n'est pas calculable.]</w:t>
-      </w:r>
-    </w:p>
-    <w:p>
-      <w:pPr/>
-      <w:r>
-        <w:rPr>
-          <w:i/>
-          <w:color w:val="888888"/>
-          <w:sz w:val="18"/>
-        </w:rPr>
-        <w:t>[À reformuler après l'arbitrage D2 de JF : « the delay between capture and dissection » ne correspond plus au protocole. Les poissons sont gardés vivants en vivier jusqu'à la dissection, 4–6 min par poisson (André, 2026-10-03) ; le confondant est la durée de séjour en vivier, c'est-à-dire l'ordre de traitement. Dans chaque campagne, la colonne suit cet ordre, et le test du 2026-10-03 ne peut pas séparer les deux (RESULTATS R32, docs/recalcul/note_tests_2026-10-03.md).]</w:t>
-      </w:r>
-    </w:p>
-    <w:p>
-      <w:pPr>
-        <w:pStyle w:val="Heading1"/>
-      </w:pPr>
-      <w:r>
-        <w:rPr>
-          <w:color w:val="1F4E79"/>
-        </w:rPr>
-        <w:t>Alpha diversity</w:t>
-      </w:r>
-    </w:p>
-    <w:p>
-      <w:pPr/>
-      <w:r>
-        <w:rPr>
-          <w:color w:val="1F4E79"/>
-        </w:rPr>
-        <w:t>Alpha diversity was higher in the external than in the internal compartments on all four indices (Fig. 2): the ratio of geometric means was 1.51 for Shannon (95 % confidence interval 1.40–1.64), 3.00 for inverse Simpson (2.48–3.63), 1.93 for observed richness (1.71–2.18) and 1.62 for Faith's phylogenetic diversity (1.50–1.76; n = 174 individuals; Wilcoxon p ≤ 4.6 × 10⁻¹⁷). The midgut was less diverse than the hindgut on the two unweighted indices only — observed richness, ratio 0.83 (p = 0.009), and Faith's phylogenetic diversity, 0.87 (p = 0.003) — and not on Shannon (0.94, p = 0.18) or inverse Simpson (0.87, p = 0.25; n = 136), so that this contrast is metric-dependent under the rule of §8.7. Tissue was the largest identifiable source of variance in log alpha diversity (marginal share 19–26 % depending on the index), followed by individual (17–21 %) and site-year (10–14 %, sequential share), with technical terms contributing at most 0.3 % and a residual of 38–45 %; the order of the factors was the same on the four indices.</w:t>
-      </w:r>
-    </w:p>
-    <w:p>
-      <w:pPr/>
-      <w:r>
-        <w:rPr>
-          <w:color w:val="1F4E79"/>
-        </w:rPr>
-        <w:t xml:space="preserve">Hybrids were transgressive in none of the 32 combinations of pass, tissue and index (Fig. 2). The only classification supported by both an abundance-weighted and a presence-based index was dominance of </w:t>
-      </w:r>
-      <w:r>
-        <w:rPr>
-          <w:i/>
-          <w:color w:val="1F4E79"/>
-        </w:rPr>
-        <w:t>C. nasus</w:t>
-      </w:r>
-      <w:r>
-        <w:rPr>
-          <w:color w:val="1F4E79"/>
-        </w:rPr>
-        <w:t xml:space="preserve"> — hybrids not distinguishable from </w:t>
-      </w:r>
-      <w:r>
-        <w:rPr>
-          <w:i/>
-          <w:color w:val="1F4E79"/>
-        </w:rPr>
-        <w:t>C. nasus</w:t>
-      </w:r>
-      <w:r>
-        <w:rPr>
-          <w:color w:val="1F4E79"/>
-        </w:rPr>
-        <w:t xml:space="preserve"> but distinct from </w:t>
-      </w:r>
-      <w:r>
-        <w:rPr>
-          <w:i/>
-          <w:color w:val="1F4E79"/>
-        </w:rPr>
-        <w:t>P. toxostoma</w:t>
-      </w:r>
-      <w:r>
-        <w:rPr>
-          <w:color w:val="1F4E79"/>
-        </w:rPr>
-        <w:t xml:space="preserve"> — in the caudal fin in pass 1 (four indices of four; p for category 0.012–0.128) and in the midgut in pass 2 (three of four; p = 0.040–0.111). The first was unchanged with plate position as a covariate; the second was not, two indices becoming intermediate and two undetermined. Five of the 32 principal tests reached p &lt; 0.05, without correction for multiplicity, and dominance denotes here the absence of a detectable difference from </w:t>
-      </w:r>
-      <w:r>
-        <w:rPr>
-          <w:i/>
-          <w:color w:val="1F4E79"/>
-        </w:rPr>
-        <w:t>C. nasus</w:t>
-      </w:r>
-      <w:r>
-        <w:rPr>
-          <w:color w:val="1F4E79"/>
-        </w:rPr>
-        <w:t>, not an equality.</w:t>
-      </w:r>
-      <w:r>
-        <w:rPr>
-          <w:i/>
-          <w:color w:val="888888"/>
-          <w:sz w:val="18"/>
-        </w:rPr>
-        <w:t xml:space="preserve"> [Non testé : C. nasus étant en général traité en premier (§1), le classement « dominant Cn » pourrait refléter l'ordre de traitement (RESULTATS R31). Le contraste femelles/mâles (R27) n'est pas rapporté tant que le code de sexe « X » n'est pas confirmé.]</w:t>
-      </w:r>
-    </w:p>
-    <w:p>
-      <w:pPr>
-        <w:pStyle w:val="Heading1"/>
-      </w:pPr>
-      <w:r>
-        <w:rPr>
-          <w:color w:val="1F4E79"/>
-        </w:rPr>
-        <w:t>Composition by genotypic category</w:t>
-      </w:r>
-    </w:p>
-    <w:p>
-      <w:pPr/>
-      <w:r/>
-      <w:r>
-        <w:rPr>
-          <w:b w:val="0"/>
-          <w:i w:val="0"/>
-        </w:rPr>
-      </w:r>
-      <w:r>
-        <w:rPr>
-          <w:b w:val="0"/>
-          <w:i w:val="0"/>
-          <w:color w:val="1F4E79"/>
-        </w:rPr>
-      </w:r>
-      <w:r>
-        <w:rPr>
-          <w:b w:val="0"/>
-          <w:i w:val="0"/>
-          <w:color w:val="1F4E79"/>
-        </w:rPr>
-      </w:r>
-      <w:r>
-        <w:rPr>
-          <w:b w:val="0"/>
-          <w:i w:val="0"/>
-          <w:color w:val="1F4E79"/>
-        </w:rPr>
-      </w:r>
-      <w:r>
-        <w:rPr>
-          <w:b w:val="0"/>
-          <w:i w:val="0"/>
-        </w:rPr>
-      </w:r>
-      <w:r>
-        <w:rPr>
-          <w:b w:val="0"/>
-          <w:i w:val="0"/>
-        </w:rPr>
-      </w:r>
-      <w:r>
-        <w:rPr>
-          <w:b w:val="0"/>
-          <w:i w:val="0"/>
-          <w:color w:val="1F4E79"/>
-        </w:rPr>
-      </w:r>
-      <w:r>
-        <w:rPr>
-          <w:b w:val="0"/>
-          <w:i w:val="0"/>
-          <w:color w:val="1F4E79"/>
-        </w:rPr>
-      </w:r>
-      <w:r>
-        <w:rPr>
-          <w:color w:val="1F4E79"/>
-        </w:rPr>
-      </w:r>
-      <w:r>
-        <w:t xml:space="preserve">A preliminary variance partition was run to size these terms before the ecological analysis, not as a result of it, in both passes and on the four metrics. Fitted in both orderings without plate position, genotypic category accounts for a median of 1.7 % to 2.8 % of compositional variance across the 48 metric × tissue × run strata in pass 1 and 1.4 % to 3.0 % in pass 2, against a median of 19 % and 18 % for station (range across strata 14–36 % in pass 1 and 14–35 % in pass 2). No tissue is detected by all four metrics in all three runs under both permutation schemes, in either pass, with or without plate position, so a global statement that hybrids differ is not supportable: the analysis must say which metric supports which claim, in which tissue, and under which definition of a hybrid. One result is robust to every choice made here — both passes, with and without plate position, all three runs and both permutation schemes: the midgut on Jaccard (p ≤ 0.044). The caudal fin on weighted UniFrac is detected in all three runs and both schemes in pass 1 (p = 0.007–0.024), with or without plate position, and in no run in pass 2 (p = 0.073–0.235). A witness attributes this displacement to the definition of hybrids rather than to sample size: removing 22 randomly chosen individuals from the 158 that are not introgressed, twenty times, never restored the caudal signal in pass 2. At 500 reads the caudal signal is partial in pass 1 (three runs sequentially, p = 0.022–0.049; one of three with station fixed by blocks) and absent in pass 2, </w:t>
-      </w:r>
-      <w:r>
-        <w:rPr>
-          <w:i w:val="0"/>
-          <w:color w:val="1F4E79"/>
-        </w:rPr>
-        <w:t>an attenuation that is not an effect of depth: restricted to the samples retained at 3,000 reads, the 500-read matrices give the same result as at 3,000 reads (all three runs, both station-blocked schemes, p = 0.010–0.026), so the signal is diluted by the caudal-fin samples that pass the threshold only at 500 reads. As at 3,000 reads, none of twenty random removals of 22 non-introgressed individuals from pass 2 reproduced the pass-1 pattern at 500 reads.</w:t>
-      </w:r>
-      <w:r>
-        <w:rPr>
-          <w:i w:val="0"/>
-        </w:rPr>
-        <w:t xml:space="preserve"> The hindgut is the weakest tissue in pass 1 (only Jaccard is significant, in one run of three with station fixed by blocks) but not in pass 2, where with station fixed by blocks all four metrics detect it in all three runs; the witness does not resolve whether this difference reflects sample size or the definition of hybrids. The principal and sensitivity models differ in 7 of the 16 metric × tissue cells in each pass, of which 5 (pass 1) and 3 (pass 2) move between robust detection (three runs, both schemes), partial detection and none. Of the two witnesses that could have discriminated further, the separable sub-design detects category in 3 of 48 tests in pass 1 and 1 of 48 in pass 2 (with plate position), and Rosières, in pass 2, detects it in the gill on Jaccard and unweighted UniFrac in all three runs (p = 0.010–0.030); in pass 1 Rosières is not interpretable. Supplementary Table S9.</w:t>
-      </w:r>
-    </w:p>
-    <w:p>
-      <w:pPr/>
-      <w:r>
-        <w:rPr>
-          <w:color w:val="1F4E79"/>
-        </w:rPr>
-        <w:t>Figure 3 summarises these detections in the principal model with permutations constrained within station blocks (Fig. 3a, b), and the variance shares on which they rest (Fig. 3c). Fitted before category, station accounted for a median of 20.9 % (pass 1) and 20.1 % (pass 2) of compositional variance; category accounted for 2.8 % and 3.0 % when fitted first and 1.7 % and 1.4 % when fitted last. Whether the loss of the caudal-fin signal between passes is produced by dilution of the hybrid–</w:t>
-      </w:r>
-      <w:r>
-        <w:rPr>
-          <w:i/>
-          <w:color w:val="1F4E79"/>
-        </w:rPr>
-        <w:t>P. toxostoma</w:t>
-      </w:r>
-      <w:r>
-        <w:rPr>
-          <w:color w:val="1F4E79"/>
-        </w:rPr>
-        <w:t xml:space="preserve"> contrast by the 19 near-parental hybrids of </w:t>
-      </w:r>
-      <w:r>
-        <w:rPr>
-          <w:i/>
-          <w:color w:val="1F4E79"/>
-        </w:rPr>
-        <w:t>P. toxostoma</w:t>
-      </w:r>
-      <w:r>
-        <w:rPr>
-          <w:color w:val="1F4E79"/>
-        </w:rPr>
-        <w:t xml:space="preserve"> background was tested (§8.12) and remains undetermined. Relabelling as hybrids 19 </w:t>
-      </w:r>
-      <w:r>
-        <w:rPr>
-          <w:i/>
-          <w:color w:val="1F4E79"/>
-        </w:rPr>
-        <w:t>P. toxostoma</w:t>
-      </w:r>
-      <w:r>
-        <w:rPr>
-          <w:color w:val="1F4E79"/>
-        </w:rPr>
-        <w:t xml:space="preserve"> and 3 </w:t>
-      </w:r>
-      <w:r>
-        <w:rPr>
-          <w:i/>
-          <w:color w:val="1F4E79"/>
-        </w:rPr>
-        <w:t>C. nasus</w:t>
-      </w:r>
-      <w:r>
-        <w:rPr>
-          <w:color w:val="1F4E79"/>
-        </w:rPr>
-        <w:t xml:space="preserve"> drawn from the stations of the near-parental individuals removed the pass-1 signal in 16 of 20 draws, so that such dilution is sufficient to produce the displacement; but the near-parental hybrids of </w:t>
-      </w:r>
-      <w:r>
-        <w:rPr>
-          <w:i/>
-          <w:color w:val="1F4E79"/>
-        </w:rPr>
-        <w:t>P. toxostoma</w:t>
-      </w:r>
-      <w:r>
-        <w:rPr>
-          <w:color w:val="1F4E79"/>
-        </w:rPr>
-        <w:t xml:space="preserve"> background differed neither from pure </w:t>
-      </w:r>
-      <w:r>
-        <w:rPr>
-          <w:i/>
-          <w:color w:val="1F4E79"/>
-        </w:rPr>
-        <w:t>P. toxostoma</w:t>
-      </w:r>
-      <w:r>
-        <w:rPr>
-          <w:color w:val="1F4E79"/>
-        </w:rPr>
-        <w:t xml:space="preserve"> (p = 0.28–0.60) nor from intermediate hybrids (p = 0.15–0.26; n = 25–26), so that dilution is not established.</w:t>
-      </w:r>
-      <w:r>
-        <w:rPr>
-          <w:i/>
-          <w:color w:val="888888"/>
-          <w:sz w:val="18"/>
-        </w:rPr>
-        <w:t xml:space="preserve"> [Le paragraphe précédent vient des Methods (ancien §8.9) : « not as a result of it » est à reformuler maintenant qu'il figure en Results. Les médianes de station de ce paragraphe (19 % et 18 %) sont celles de la station servie après la catégorie ; 20,9 % et 20,1 % ci-dessus, station servie en premier.]</w:t>
-      </w:r>
-    </w:p>
-    <w:p>
-      <w:pPr>
-        <w:pStyle w:val="Heading1"/>
-      </w:pPr>
-      <w:r>
-        <w:rPr>
-          <w:color w:val="1F4E79"/>
-        </w:rPr>
-        <w:t>Dispersion</w:t>
-      </w:r>
-    </w:p>
-    <w:p>
-      <w:pPr/>
-      <w:r>
-        <w:rPr>
-          <w:color w:val="1F4E79"/>
-        </w:rPr>
-        <w:t xml:space="preserve">The transgressive prediction in its dispersion form — hybrids more variable than both parental categories — was not supported in either pass (Fig. 4). With station fixed by blocks, hybrids were the least dispersed of the three categories in 22 of 48 tests in pass 1 and 32 of 48 in pass 2, against the third expected under no ordering (one-sided binomial p = 0.048 and 2.4 × 10⁻⁶), and the most dispersed in 18 and 10 (p = 0.32 and 0.98). Within the stations carrying all three categories, where a dispersion difference cannot be spatial, neither direction departed from chance: hybrids were the least dispersed in 25 of 68 tests in pass 1 and 39 of 120 in pass 2, and the most dispersed in 17 and 45. The lower dispersion of hybrids is therefore a pattern of the station-blocked analysis, clear in pass 2 only and carried mainly by Bray–Curtis (median difference between hybrids and the parental mean −0.068 in pass 2 and −0.008 in pass 1), the other metrics differing by less than 0.013. Significant tests in the transgressive direction numbered 3 in pass 1 (the gill on unweighted UniFrac in two runs and the caudal fin on weighted UniFrac in one) and none in pass 2 with station fixed by blocks, and none and 5 within stations, the five of pass 2 all concerning the gill at Saint-Just-d'Ardèche, where each stratum holds three or four </w:t>
-      </w:r>
-      <w:r>
-        <w:rPr>
-          <w:i/>
-          <w:color w:val="1F4E79"/>
-        </w:rPr>
-        <w:t>P. toxostoma</w:t>
-      </w:r>
-      <w:r>
-        <w:rPr>
-          <w:color w:val="1F4E79"/>
-        </w:rPr>
-        <w:t>.</w:t>
-      </w:r>
-    </w:p>
-    <w:p>
-      <w:pPr/>
-      <w:r>
-        <w:rPr>
-          <w:color w:val="1F4E79"/>
-        </w:rPr>
-        <w:t xml:space="preserve">This bears on how the location results are read, because PERMANOVA is sensitive to heterogeneous dispersion. With station fixed by blocks, dispersion in the caudal fin was homogeneous on all four metrics in pass 2 and in all but one test in pass 1 (weighted UniFrac, one run of three, p = 0.048, hybrids most dispersed): the caudal-fin location signal on weighted UniFrac in pass 1 is a difference in composition in two runs and cannot be separated from a dispersion difference in the third. The robust midgut signal on Jaccard was accompanied by homogeneous dispersion in pass 1 and in two runs of three in pass 2. By contrast, dispersion was heterogeneous in all three runs in the midgut on unweighted UniFrac in both passes and, in pass 2, in the midgut and hindgut on Bray–Curtis, </w:t>
-      </w:r>
-      <w:r>
-        <w:rPr>
-          <w:i/>
-          <w:color w:val="1F4E79"/>
-        </w:rPr>
-        <w:t>P. toxostoma</w:t>
-      </w:r>
-      <w:r>
-        <w:rPr>
-          <w:color w:val="1F4E79"/>
-        </w:rPr>
-        <w:t xml:space="preserve"> being the most dispersed category there; the location signals detected on those metrics in those compartments cannot be separated from a dispersion effect. One reservation is not resolved: betadisper accepts no covariate, so the plate-position effect (§8.9) is not adjusted for, and a category whose samples are more spread across plate columns could carry inflated dispersion. Supplementary Table S10 and Figure S3.</w:t>
-      </w:r>
-      <w:r>
-        <w:rPr>
-          <w:i/>
-          <w:color w:val="888888"/>
-          <w:sz w:val="18"/>
-        </w:rPr>
-        <w:t xml:space="preserve"> [Correction du 2026-10-03 : l'ancienne version de ces deux paragraphes, sans correction de petit effectif, donnait 32/48 (passe 1) et 34/48 (passe 2) en station bloquée, 45/68 intra-station en passe 1 et une dispersion hétérogène en caudale ; elle est retirée (docs/plan_permdisp_biais_2026-10-03.md, scripts 24 et 39). Table S10 et Figure S3 du supplément régénérées avec les valeurs corrigées le 2026-10-05 (scripts/41-supp_S10_S3.py).]</w:t>
-      </w:r>
-    </w:p>
-    <w:p>
-      <w:pPr>
-        <w:pStyle w:val="Heading1"/>
-      </w:pPr>
-      <w:r>
-        <w:rPr>
-          <w:color w:val="1F4E79"/>
-        </w:rPr>
-        <w:t>Four-dimensional index</w:t>
-      </w:r>
-    </w:p>
-    <w:p>
-      <w:pPr/>
-      <w:r>
-        <w:rPr>
-          <w:color w:val="1F4E79"/>
-        </w:rPr>
-        <w:t>Under the principal setting, the transgressive axis of the 4H index exceeded 0.5 in all three runs in the caudal fin, midgut and hindgut of both passes (Gain + Loss = 0.58–0.69), carried by the Loss model, whereas the parental axis dominated in the gill (Gain + Loss = 0.41–0.46), carried by Intersection (Fig. 5a). None of these transgressive readings was robust under the pre-declared rule (Fig. 5b): the abundance-based version placed all eight tissue × pass combinations on the parental axis, and at family rank the caudal fin also fell on the parental side. The only robust reading was the parental axis of the gill in pass 2; in pass 1 the gill was undetermined at ρ = 0.7. No pair of compartments was distinguished, the 95 % bootstrap intervals of the transgressive axis overlapping in at least one run for every pair, in both passes. In every tissue and both passes at least 98.4 % of bootstraps lay on the Intersection side of the null plane: hybrids preferentially retain the core taxa shared by both parental species. The core of hybrids represented less than half of the mean parental core in the midgut of pass 1 (two runs of three; ratio 0.45–0.64) and 0.51–1.07 of it elsewhere. Compared at equal N, passes 1 and 2 fell on the same axis in every tissue.</w:t>
-      </w:r>
-    </w:p>
-    <w:p>
-      <w:pPr/>
-      <w:r>
-        <w:rPr>
-          <w:color w:val="1F4E79"/>
-        </w:rPr>
-        <w:t>Two observations lie outside the pre-declared rules and are reported as descriptions only. A null hybrid built by averaging one randomly drawn individual of each parental species already reached a transgressive share of 0.40–0.57; the observed share exceeded it by 0.08–0.15 in the caudal fin, 0.09–0.22 in the midgut and 0.03–0.13 in the hindgut, and differed from it by −0.04 to +0.06 in the gill (Fig. 5). Computed at its own, larger N (26–40 hosts per class), pass 2 moved the caudal fin to the parental axis (Gain + Loss = 0.42–0.47), while the midgut and hindgut remained on the transgressive side.</w:t>
-      </w:r>
-    </w:p>
-    <w:p>
-      <w:pPr>
-        <w:pStyle w:val="Title"/>
-      </w:pPr>
-      <w:r>
-        <w:rPr>
-          <w:color w:val="1F4E79"/>
-        </w:rPr>
-        <w:t>Discussion</w:t>
-      </w:r>
-    </w:p>
-    <w:p>
-      <w:pPr/>
-      <w:r>
-        <w:rPr>
-          <w:color w:val="1F4E79"/>
-        </w:rPr>
-        <w:t xml:space="preserve">Across alpha diversity, community dispersion and the 4H index, the microbiota of hybrids between </w:t>
-      </w:r>
-      <w:r>
-        <w:rPr>
-          <w:i/>
-          <w:color w:val="1F4E79"/>
-        </w:rPr>
-        <w:t>C. nasus</w:t>
-      </w:r>
-      <w:r>
-        <w:rPr>
-          <w:color w:val="1F4E79"/>
-        </w:rPr>
-        <w:t xml:space="preserve"> and </w:t>
-      </w:r>
-      <w:r>
-        <w:rPr>
-          <w:i/>
-          <w:color w:val="1F4E79"/>
-        </w:rPr>
-        <w:t>P. toxostoma</w:t>
-      </w:r>
-      <w:r>
-        <w:rPr>
-          <w:color w:val="1F4E79"/>
-        </w:rPr>
-        <w:t xml:space="preserve"> showed no transgressive pattern. Hybrids were transgressive in none of 32 alpha-diversity tests, </w:t>
-      </w:r>
-      <w:r>
-        <w:rPr>
-          <w:color w:val="1F4E79"/>
-        </w:rPr>
-        <w:t>were more dispersed than both parents no more often than expected by chance,</w:t>
-      </w:r>
-      <w:r>
-        <w:rPr>
-          <w:color w:val="1F4E79"/>
-        </w:rPr>
-        <w:t xml:space="preserve"> and no transgressive reading of the 4H index survived the robustness rule declared before computation. Where hybrids could be placed relative to their parents, they fell within the parental range: dominance of </w:t>
-      </w:r>
-      <w:r>
-        <w:rPr>
-          <w:i/>
-          <w:color w:val="1F4E79"/>
-        </w:rPr>
-        <w:t>C. nasus</w:t>
-      </w:r>
-      <w:r>
-        <w:rPr>
-          <w:color w:val="1F4E79"/>
-        </w:rPr>
-        <w:t xml:space="preserve"> in caudal-fin alpha diversity in pass 1, a parental, Intersection-dominated 4H index in the gill, and preferential retention of the core taxa shared by both parental species in every compartment. The departures detected in composition were small — genotypic category accounted for a median of 1.4–3.0 % of compositional variance against about a fifth for station — and confined to particular compartments, metrics and definitions of a hybrid. This places the system with natural hybrid zones in which the environmental component dominates [23, 24] rather than with those in which host ancestry does [21, 22], while keeping in view that a small genetic effect is the expected magnitude for a heritable but weakly heritable trait [9] and that its detection required separating the spatial and technical axes beforehand, as in stickleback [10].</w:t>
-      </w:r>
-    </w:p>
-    <w:p>
-      <w:pPr/>
-      <w:r>
-        <w:rPr>
-          <w:color w:val="1F4E79"/>
-        </w:rPr>
-        <w:t>The expectation derived from Guivier et al. [31], that a hybrid signal would be most pronounced in the digestive compartments, is partly supported. The only compositional result that withstood every analytical choice concerned the midgut, on a presence-based metric, and in pass 2 both digestive compartments were detected by all four metrics with station fixed by blocks. But the caudal fin carried, in pass 1, a signal on weighted UniFrac that no digestive compartment showed on that metric, the gill was the compartment in which the 4H index was robustly parental, and the 4H index distinguished no pair of compartments. Hybrid status therefore does not matter equally in all compartments, but which compartment carries a difference depends on the metric. The rule adopted here, which states a result as established only when an abundance-weighted and a presence-based metric both support it, makes this dependence explicit rather than resolving it; it also explains why the 4H index, a presence-based construct in its principal form, departed from its abundance-based version in every compartment but the gill.</w:t>
-      </w:r>
-    </w:p>
-    <w:p>
-      <w:pPr/>
-      <w:r>
-        <w:rPr>
-          <w:color w:val="1F4E79"/>
-        </w:rPr>
-        <w:t xml:space="preserve">How hybrids are defined mattered as much as which compartment is examined. The caudal-fin signal obtained with the 20 intermediate hybrids disappeared when the 22 near-parental individuals were added, and twenty random removals of 22 non-introgressed fish never reproduced the displacement, so that it is attributable to who is called a hybrid rather than to sample size. Whether near-parental hybrids of </w:t>
-      </w:r>
-      <w:r>
-        <w:rPr>
-          <w:i/>
-          <w:color w:val="1F4E79"/>
-        </w:rPr>
-        <w:t>P. toxostoma</w:t>
-      </w:r>
-      <w:r>
-        <w:rPr>
-          <w:color w:val="1F4E79"/>
-        </w:rPr>
-        <w:t xml:space="preserve"> background dilute the contrast because their microbiota resembles that of </w:t>
-      </w:r>
-      <w:r>
-        <w:rPr>
-          <w:i/>
-          <w:color w:val="1F4E79"/>
-        </w:rPr>
-        <w:t>P. toxostoma</w:t>
-      </w:r>
-      <w:r>
-        <w:rPr>
-          <w:color w:val="1F4E79"/>
-        </w:rPr>
-        <w:t xml:space="preserve"> could not be established at the available sample size. In a mosaic hybrid zone [30] in which most introgressed individuals depart from a parental genome on a single chromosome, a hybrid class is a decision; reporting both passes shows how much of any conclusion rests on that decision, and we suggest that studies of natural hybrid zones report it in the same way.</w:t>
-      </w:r>
-    </w:p>
-    <w:p>
-      <w:pPr/>
-      <w:r>
-        <w:rPr>
-          <w:color w:val="1F4E79"/>
-        </w:rPr>
-        <w:t>That hybrids were not more dispersed than their parents runs against the expectation that the microbiota of hybrids is more variable because their genomes combine parental elements in variable proportions. The opposite tendency, hybrids less dispersed than both parents, was clear only in pass 2 with station fixed by blocks, absent within stations and carried mainly by Bray–Curtis, and should not be read as a general property of hybrids here. The dispersion analysis also illustrates a pitfall of unbalanced designs: without correction for group size the distance to the group centre is underestimated in small groups, and because hybrids were the smallest category in every stratum, the uncorrected analysis yielded a strong and apparently replicated reduction of hybrid dispersion — 32 of 48 station-blocked tests in pass 1 and 45 of 68 within stations — that largely disappeared once corrected. Hybrid classes are small in most natural hybrid zones, and the correction should be applied by default in that setting [48].</w:t>
-      </w:r>
-    </w:p>
-    <w:p>
-      <w:pPr/>
-      <w:r>
-        <w:rPr>
-          <w:color w:val="1F4E79"/>
-        </w:rPr>
-        <w:t xml:space="preserve">The 4H index adds two points that the location and dispersion analyses do not. First, in its abundance-based version — the form in which the framework's authors compared published systems [14] — the index placed every compartment on the parental axis (Gain + Loss = 0.22–0.35), as in the </w:t>
-      </w:r>
-      <w:r>
-        <w:rPr>
-          <w:i/>
-          <w:color w:val="1F4E79"/>
-        </w:rPr>
-        <w:t>Neotoma</w:t>
-      </w:r>
-      <w:r>
-        <w:rPr>
-          <w:color w:val="1F4E79"/>
-        </w:rPr>
-        <w:t xml:space="preserve"> woodrat system (0.12) and unlike the </w:t>
-      </w:r>
-      <w:r>
-        <w:rPr>
-          <w:i/>
-          <w:color w:val="1F4E79"/>
-        </w:rPr>
-        <w:t>Aspidoscelis</w:t>
-      </w:r>
-      <w:r>
-        <w:rPr>
-          <w:color w:val="1F4E79"/>
-        </w:rPr>
-        <w:t xml:space="preserve"> lizard and </w:t>
-      </w:r>
-      <w:r>
-        <w:rPr>
-          <w:i/>
-          <w:color w:val="1F4E79"/>
-        </w:rPr>
-        <w:t>Kikihia</w:t>
-      </w:r>
-      <w:r>
-        <w:rPr>
-          <w:color w:val="1F4E79"/>
-        </w:rPr>
-        <w:t xml:space="preserve"> cicada systems (0.71 and 0.64); on a hybrid lizard, transgression has been associated with ecological success rather than with dysbiosis [15], so the absence of transgression here carries no implication for hybrid fitness either way. Second, as its authors found for a natural hybrid system, the index was sensitive to its settings: the choice between presence and abundance reversed the reading in three compartments of four, and in the caudal fin so did the number of hosts per class, from 9 to 26–27. A null hybrid built from parental individuals already sits close to the 0.5 boundary between the two axes, which makes that boundary a weak criterion for calling a hybrid microbiota transgressive. We therefore read the 4H index as a description of taxon membership conditional on its settings, and not as an independent test of the intermediate, dominant and transgressive hypotheses.</w:t>
-      </w:r>
-    </w:p>
-    <w:p>
-      <w:pPr/>
-      <w:r>
-        <w:rPr>
-          <w:color w:val="1F4E79"/>
-        </w:rPr>
-        <w:t xml:space="preserve">Four limits bound these conclusions. Genotypic category is confounded with station, and the three stations that carry all three categories hold 65–74 individuals, so that every category effect is estimated mostly between stations and is read as a pattern co-varying with station and category. Plate position affected composition and followed processing order in every campaign; the mechanism — extraction order, reagent drift within a plate, cross-contamination between adjacent wells or time spent in the holding tank — is not identified, and because </w:t>
-      </w:r>
-      <w:r>
-        <w:rPr>
-          <w:i/>
-          <w:color w:val="1F4E79"/>
-        </w:rPr>
-        <w:t>C. nasus</w:t>
-      </w:r>
-      <w:r>
-        <w:rPr>
-          <w:color w:val="1F4E79"/>
-        </w:rPr>
-        <w:t xml:space="preserve"> was generally processed first it could contribute to the dominance of </w:t>
-      </w:r>
-      <w:r>
-        <w:rPr>
-          <w:i/>
-          <w:color w:val="1F4E79"/>
-        </w:rPr>
-        <w:t>C. nasus</w:t>
-      </w:r>
-      <w:r>
-        <w:rPr>
-          <w:color w:val="1F4E79"/>
-        </w:rPr>
-        <w:t xml:space="preserve"> in caudal-fin alpha diversity, which was not tested. Rarefaction to 3,000 reads retained intermediate hybrids less often than </w:t>
-      </w:r>
-      <w:r>
-        <w:rPr>
-          <w:i/>
-          <w:color w:val="1F4E79"/>
-        </w:rPr>
-        <w:t>P. toxostoma</w:t>
-      </w:r>
-      <w:r>
-        <w:rPr>
-          <w:color w:val="1F4E79"/>
-        </w:rPr>
-        <w:t xml:space="preserve"> in the caudal fin, a selection that is declared but cannot be removed for presence-based metrics. And only 64 % of reads could be aggregated to genus for the 4H index, whose genus-level reading therefore rests on the better-assigned part of each community.</w:t>
-      </w:r>
-    </w:p>
-    <w:p>
-      <w:pPr>
-        <w:pStyle w:val="Title"/>
-      </w:pPr>
-      <w:r>
-        <w:rPr>
-          <w:color w:val="1F4E79"/>
-        </w:rPr>
-        <w:t>Conclusions</w:t>
-      </w:r>
-    </w:p>
-    <w:p>
-      <w:pPr/>
-      <w:r>
-        <w:rPr>
-          <w:color w:val="1F4E79"/>
-        </w:rPr>
-        <w:t xml:space="preserve">In a natural, mosaic hybrid zone between </w:t>
-      </w:r>
-      <w:r>
-        <w:rPr>
-          <w:i/>
-          <w:color w:val="1F4E79"/>
-        </w:rPr>
-        <w:t>C. nasus</w:t>
-      </w:r>
-      <w:r>
-        <w:rPr>
-          <w:color w:val="1F4E79"/>
-        </w:rPr>
-        <w:t xml:space="preserve"> and </w:t>
-      </w:r>
-      <w:r>
-        <w:rPr>
-          <w:i/>
-          <w:color w:val="1F4E79"/>
-        </w:rPr>
-        <w:t>P. toxostoma</w:t>
-      </w:r>
-      <w:r>
-        <w:rPr>
-          <w:color w:val="1F4E79"/>
-        </w:rPr>
-        <w:t xml:space="preserve">, the bacterial microbiota of hybrids lay within the parental range in four tissue compartments: no transgressive pattern was found in alpha diversity, </w:t>
-      </w:r>
-      <w:r>
-        <w:rPr>
-          <w:color w:val="1F4E79"/>
-        </w:rPr>
-        <w:t>community dispersion</w:t>
-      </w:r>
-      <w:r>
-        <w:rPr>
-          <w:color w:val="1F4E79"/>
-        </w:rPr>
-        <w:t xml:space="preserve"> or the 4H index, and hybrids preferentially retained the core taxa shared by both parents. Departures from the parents were small relative to spatial variation and depended on the compartment, the metric and the definition of a hybrid. Studies of hybrid microbiota in natural populations should therefore report the definition of a hybrid, the metric and the tissue alongside each result, and treat spatial and technical structure as part of the design rather than as noise.</w:t>
-      </w:r>
-    </w:p>
-    <w:p>
-      <w:pPr>
-        <w:pStyle w:val="Title"/>
-      </w:pPr>
-      <w:r>
-        <w:rPr>
-          <w:color w:val="1F4E79"/>
-        </w:rPr>
-        <w:t>Abbreviations</w:t>
-      </w:r>
-    </w:p>
-    <w:p>
-      <w:pPr/>
-      <w:r>
-        <w:rPr>
-          <w:color w:val="1F4E79"/>
-        </w:rPr>
-        <w:t xml:space="preserve">4H: four-dimensional hybrid microbiome index (Union, Intersection, Gain, Loss); ASV: amplicon sequence variant; Cn: </w:t>
-      </w:r>
-      <w:r>
-        <w:rPr>
-          <w:i/>
-          <w:color w:val="1F4E79"/>
-        </w:rPr>
-        <w:t>Chondrostoma nasus</w:t>
-      </w:r>
-      <w:r>
-        <w:rPr>
-          <w:color w:val="1F4E79"/>
-        </w:rPr>
-        <w:t xml:space="preserve">; D: inter-chromosome discordance of the hybrid index; Hy: hybrid; PERMANOVA: permutational multivariate analysis of variance; PERMDISP: permutational analysis of multivariate dispersions; Pt: </w:t>
-      </w:r>
-      <w:r>
-        <w:rPr>
-          <w:i/>
-          <w:color w:val="1F4E79"/>
-        </w:rPr>
-        <w:t>Parachondrostoma toxostoma</w:t>
-      </w:r>
-      <w:r>
-        <w:rPr>
-          <w:color w:val="1F4E79"/>
-        </w:rPr>
-        <w:t>; UniFrac: unique fraction metric.</w:t>
-      </w:r>
-    </w:p>
-    <w:p>
-      <w:pPr>
-        <w:pStyle w:val="Title"/>
-      </w:pPr>
-      <w:r>
-        <w:rPr>
-          <w:color w:val="1F4E79"/>
-        </w:rPr>
-        <w:t>Declarations</w:t>
-      </w:r>
-    </w:p>
-    <w:p>
-      <w:pPr>
-        <w:pStyle w:val="Heading1"/>
-      </w:pPr>
-      <w:r>
-        <w:rPr>
-          <w:color w:val="1F4E79"/>
-        </w:rPr>
-        <w:t>Ethics approval and consent to participate</w:t>
-      </w:r>
-    </w:p>
-    <w:p>
-      <w:pPr/>
-      <w:r>
-        <w:rPr>
-          <w:color w:val="1F4E79"/>
-        </w:rPr>
-        <w:t>Fish were captured by electrofishing and euthanised before dissection under authorisations n° 2014-156-0001 and n° 2015-1426DDT605, following international guidelines of animal care.</w:t>
-      </w:r>
-      <w:r>
-        <w:rPr>
-          <w:i/>
-          <w:color w:val="888888"/>
-          <w:sz w:val="18"/>
-        </w:rPr>
-        <w:t xml:space="preserve"> [À compléter (questions de suivi à André, 2026-10-03) : autorités de délivrance — ONEMA et DDT 04, 05 et 84 selon André — et couverture des stations de l'Ain et de l'Ardèche ; méthode d'euthanasie (dislocation cervicale, non confirmée). Consentement : sans objet.]</w:t>
-      </w:r>
-    </w:p>
-    <w:p>
-      <w:pPr>
-        <w:pStyle w:val="Heading1"/>
-      </w:pPr>
-      <w:r>
-        <w:rPr>
-          <w:color w:val="1F4E79"/>
-        </w:rPr>
-        <w:t>Consent for publication</w:t>
-      </w:r>
-    </w:p>
-    <w:p>
-      <w:pPr/>
-      <w:r>
-        <w:rPr>
-          <w:color w:val="1F4E79"/>
-        </w:rPr>
-        <w:t>Not applicable.</w:t>
-      </w:r>
-    </w:p>
-    <w:p>
-      <w:pPr>
-        <w:pStyle w:val="Heading1"/>
-      </w:pPr>
-      <w:r>
-        <w:rPr>
-          <w:color w:val="1F4E79"/>
-        </w:rPr>
-        <w:t>Availability of data and materials</w:t>
-      </w:r>
-    </w:p>
-    <w:p>
-      <w:pPr/>
-      <w:r>
-        <w:rPr>
-          <w:color w:val="1F4E79"/>
-        </w:rPr>
-        <w:t>The raw sequence data are available in the European Nucleotide Archive under accession PRJEB124417. The code, the scripts that produced every result and the decision log are available at https://github.com/martinjfsupagro/microbiome-hybrid [51]. Individual genotypes are given in Supplementary Table S2.</w:t>
       </w:r>
       <w:r>
         <w:rPr>

</xml_diff>

<commit_message>
docs: corrections mecaniques sur les deux versions (script 44) : figures S dans l ordre de citation (S1 = compromis profondeur, regeneree en anglais ; S2 = position), titres des tables S6/S8/S9/S10, 31 revues abregees NLM, figure 4 titres et legende alignes, note ENA perimee ; fix: ecarts de retention du 8.6 = run durance1 (precise), recalcules par le nouveau script 43 (l ancienne figure portait des valeurs perimees) ; script 40 etendu ; _etat
</commit_message>
<xml_diff>
--- a/docs/manuscrit/Article.docx
+++ b/docs/manuscrit/Article.docx
@@ -1089,7 +1089,7 @@
           <w:i w:val="0"/>
           <w:color w:val="1F4E79"/>
         </w:rPr>
-        <w:t>Because the rarefaction threshold both equalises depth and decides which samples enter, the second of these effects was quantified separately. On a fixed set of samples - those retained at 3,000 reads, so that only depth varies - dissimilarity matrices recomputed at 500 to 2,000 reads were compared with the 3,000-read reference. The two abundance-weighted metrics proved essentially invariant down to 500 reads (weighted UniFrac r = 0.9994, Bray-Curtis r = 0.9985), whereas the two presence-based metrics degraded (Jaccard r = 0.9617, unweighted UniFrac r = 0.9373) and observed richness fell by 42 %, confirming that the loss is driven by rare taxa rather than by a general low-depth artefact. Sample retention at 3,000 reads is not random with respect to the variable of interest: in the caudal fin 50 % of intermediate hybrids passed the threshold against 86 % of P. toxostoma (pass 1), and 67 % of all 42 hybrids (pass 2), a gap of 36 and 20 points respectively, reaching 48 and 36 points at one of the three stations carrying the full genotypic gradient. No threshold removes this selection without the corresponding loss of richness. Claims resting on abundance-weighted metrics are therefore accompanied by a sensitivity analysis at 500 reads, where the caudal-fin gap falls to 3.8 points (pass 1) and 5.7 points (pass 2) and 2,067 samples are retained (1,825 in pass 1); claims resting on presence-based metrics are reported at 3,000 reads with the selection declared, since they cannot be tested at 500 and the midgut gap (14.0 and 8.9 points) persists there in any case. Supplementary Table S</w:t>
+        <w:t xml:space="preserve">Because the rarefaction threshold both equalises depth and decides which samples enter, the second of these effects was quantified separately. On a fixed set of samples - those retained at 3,000 reads, so that only depth varies - dissimilarity matrices recomputed at 500 to 2,000 reads were compared with the 3,000-read reference. The two abundance-weighted metrics proved essentially invariant down to 500 reads (weighted UniFrac r = 0.9994, Bray-Curtis r = 0.9985), whereas the two presence-based metrics degraded (Jaccard r = 0.9617, unweighted UniFrac r = 0.9373) and observed richness fell by 42 %, confirming that the loss is driven by rare taxa rather than by a general low-depth artefact. Sample retention at 3,000 reads is not random with respect to the variable of interest: </w:t>
       </w:r>
       <w:r>
         <w:rPr>
@@ -1097,7 +1097,7 @@
           <w:i w:val="0"/>
           <w:color w:val="1F4E79"/>
         </w:rPr>
-        <w:t>6</w:t>
+        <w:t>in the caudal fin, in sequencing run durance1, 50 % of intermediate hybrids</w:t>
       </w:r>
       <w:r>
         <w:rPr>
@@ -1105,12 +1105,36 @@
           <w:i w:val="0"/>
           <w:color w:val="1F4E79"/>
         </w:rPr>
-        <w:t xml:space="preserve"> and Figure S2.</w:t>
-      </w:r>
-      <w:r>
-        <w:rPr>
-          <w:color w:val="1F4E79"/>
-        </w:rPr>
+        <w:t xml:space="preserve"> passed the threshold against 86 % of P. toxostoma (pass 1), and 67 % of all 42 hybrids (pass 2), a gap of 36 and 20 points respectively, reaching 48 and 36 points at one of the three stations carrying the full genotypic gradient. No threshold removes this selection without the corresponding loss of richness. Claims resting on abundance-weighted metrics are therefore accompanied by a sensitivity analysis at 500 reads, where the caudal-fin gap falls to 3.8 points (pass 1) and 5.7 points (pass 2) and 2,067 samples are retained (1,825 in pass 1); claims resting on presence-based metrics are reported at 3,000 reads with the selection declared, since they cannot be tested at 500 and the midgut gap (14.0 and 8.9 points) persists there in any case. Supplementary Table S</w:t>
+      </w:r>
+      <w:r>
+        <w:rPr>
+          <w:b w:val="0"/>
+          <w:i w:val="0"/>
+          <w:color w:val="1F4E79"/>
+        </w:rPr>
+        <w:t>6</w:t>
+      </w:r>
+      <w:r>
+        <w:rPr>
+          <w:b w:val="0"/>
+          <w:i w:val="0"/>
+          <w:color w:val="1F4E79"/>
+        </w:rPr>
+        <w:t xml:space="preserve"> and Figure S1.</w:t>
+      </w:r>
+      <w:r>
+        <w:rPr>
+          <w:color w:val="1F4E79"/>
+        </w:rPr>
+      </w:r>
+      <w:r>
+        <w:rPr>
+          <w:i/>
+          <w:color w:val="888888"/>
+          <w:sz w:val="18"/>
+        </w:rPr>
+        <w:t xml:space="preserve"> [Écarts de rétention : valeurs du run durance1 (scripts/43-retention_profondeur.py, results/depth_agreement/retention_par_categorie.tsv, 2026-10-05) ; aucun script ne les produisait auparavant. Sur les trois runs : caudale à 3 000 lectures 29,0–36,4 points (passe 1) et 14,7–19,8 (passe 2) ; à 500 lectures 2,6–3,8 et 3,4–5,7 ; midgut à 500 lectures 5,7–14,0 et 7,8–8,9 (runs confondus : 32,3 / 17,2 ; 3,4 / 4,5 ; 8,5 / 8,2). Le midgut de la passe 1 dépend du run (14,0 dans durance1, 5,7 dans les deux autres). Rapporter la valeur d'un run ou l'étendue : à trancher par JF.]</w:t>
       </w:r>
     </w:p>
     <w:p>
@@ -1860,7 +1884,7 @@
           <w:i w:val="0"/>
           <w:color w:val="1F4E79"/>
         </w:rPr>
-        <w:t xml:space="preserve"> and Figure S1.</w:t>
+        <w:t xml:space="preserve"> and Figure S2.</w:t>
       </w:r>
       <w:r>
         <w:rPr>
@@ -2495,7 +2519,19 @@
         <w:rPr>
           <w:color w:val="1F4E79"/>
         </w:rPr>
-        <w:t xml:space="preserve">The 4H index adds two points that the location and dispersion analyses do not. First, in its abundance-based version — the form in which the framework's authors compared published systems [14] — the index placed every compartment on the parental axis (Gain + Loss = 0.22–0.35), as in the </w:t>
+        <w:t xml:space="preserve">The 4H index adds two points that the location and dispersion analyses do not. First, in its abundance-based version — </w:t>
+      </w:r>
+      <w:r>
+        <w:rPr>
+          <w:color w:val="1F4E79"/>
+        </w:rPr>
+        <w:t>one of the two forms in which the framework's authors compared published systems [14]</w:t>
+      </w:r>
+      <w:r>
+        <w:rPr>
+          <w:color w:val="1F4E79"/>
+        </w:rPr>
+        <w:t xml:space="preserve"> — the index placed every compartment on the parental axis (Gain + Loss = 0.22–0.35), as in the </w:t>
       </w:r>
       <w:r>
         <w:rPr>
@@ -2906,7 +2942,7 @@
         <w:rPr>
           <w:color w:val="1F4E79"/>
         </w:rPr>
-        <w:t>1. Bordenstein SR, Theis KR. Host Biology in Light of the Microbiome: Ten Principles of Holobionts and Hologenomes. PLOS Biology. 2015;13:e1002226. https://doi.org/10.1371/journal.pbio.1002226.</w:t>
+        <w:t>1. Bordenstein SR, Theis KR. Host Biology in Light of the Microbiome: Ten Principles of Holobionts and Hologenomes. PLoS Biol. 2015;13:e1002226. https://doi.org/10.1371/journal.pbio.1002226.</w:t>
       </w:r>
     </w:p>
     <w:p>
@@ -2915,7 +2951,7 @@
         <w:rPr>
           <w:color w:val="1F4E79"/>
         </w:rPr>
-        <w:t>2. Shapira M. Gut Microbiotas and Host Evolution: Scaling Up Symbiosis. Trends in Ecology &amp; Evolution. 2016;31:539–549. https://doi.org/10.1016/j.tree.2016.03.006.</w:t>
+        <w:t>2. Shapira M. Gut Microbiotas and Host Evolution: Scaling Up Symbiosis. Trends Ecol Evol. 2016;31:539–549. https://doi.org/10.1016/j.tree.2016.03.006.</w:t>
       </w:r>
     </w:p>
     <w:p>
@@ -2933,7 +2969,7 @@
         <w:rPr>
           <w:color w:val="1F4E79"/>
         </w:rPr>
-        <w:t>4. Adair KL, Douglas AE. Making a microbiome: the many determinants of host-associated microbial community composition. Current Opinion in Microbiology. 2017;35:23–29. https://doi.org/10.1016/j.mib.2016.11.002.</w:t>
+        <w:t>4. Adair KL, Douglas AE. Making a microbiome: the many determinants of host-associated microbial community composition. Curr Opin Microbiol. 2017;35:23–29. https://doi.org/10.1016/j.mib.2016.11.002.</w:t>
       </w:r>
     </w:p>
     <w:p>
@@ -2942,7 +2978,7 @@
         <w:rPr>
           <w:color w:val="1F4E79"/>
         </w:rPr>
-        <w:t>5. Llewellyn MS, Boutin S, Hoseinifar SH, Derome N. Teleost microbiomes: the state of the art in their characterization, manipulation and importance in aquaculture and fisheries. Frontiers in Microbiology. 2014;5. https://doi.org/10.3389/fmicb.2014.00207.</w:t>
+        <w:t>5. Llewellyn MS, Boutin S, Hoseinifar SH, Derome N. Teleost microbiomes: the state of the art in their characterization, manipulation and importance in aquaculture and fisheries. Front Microbiol. 2014;5. https://doi.org/10.3389/fmicb.2014.00207.</w:t>
       </w:r>
     </w:p>
     <w:p>
@@ -2951,7 +2987,7 @@
         <w:rPr>
           <w:color w:val="1F4E79"/>
         </w:rPr>
-        <w:t>6. Sevellec M, Pavey SA, Boutin S, Filteau M, Derome N, Bernatchez L. Microbiome investigation in the ecological speciation context of lake whitefish (Coregonus clupeaformis) using next‐generation sequencing. Journal of Evolutionary Biology. 2014;27:1029–1046. https://doi.org/10.1111/jeb.12374.</w:t>
+        <w:t>6. Sevellec M, Pavey SA, Boutin S, Filteau M, Derome N, Bernatchez L. Microbiome investigation in the ecological speciation context of lake whitefish (Coregonus clupeaformis) using next‐generation sequencing. J Evol Biol. 2014;27:1029–1046. https://doi.org/10.1111/jeb.12374.</w:t>
       </w:r>
     </w:p>
     <w:p>
@@ -2960,7 +2996,7 @@
         <w:rPr>
           <w:color w:val="1F4E79"/>
         </w:rPr>
-        <w:t>7. Smith CCR, Snowberg LK, Caporaso JG, Knight R, Bolnick DI. Dietary input of microbes and host genetic variation shape among-population differences in stickleback gut microbiota. The ISME Journal. 2015;9:2515–2526. https://doi.org/10.1038/ismej.2015.64.</w:t>
+        <w:t>7. Smith CCR, Snowberg LK, Caporaso JG, Knight R, Bolnick DI. Dietary input of microbes and host genetic variation shape among-population differences in stickleback gut microbiota. ISME J. 2015;9:2515–2526. https://doi.org/10.1038/ismej.2015.64.</w:t>
       </w:r>
     </w:p>
     <w:p>
@@ -2996,7 +3032,7 @@
         <w:rPr>
           <w:color w:val="1F4E79"/>
         </w:rPr>
-        <w:t>11. Wang J, Kalyan S, Steck N, Turner LM, Harr B, Künzel S, Vallier M, Häsler R, Franke A, Oberg H-H, Ibrahim SM, Grassl GA, Kabelitz D, Baines JF. Analysis of intestinal microbiota in hybrid house mice reveals evolutionary divergence in a vertebrate hologenome. Nature Communications. 2015;6:6440. https://doi.org/10.1038/ncomms7440.</w:t>
+        <w:t>11. Wang J, Kalyan S, Steck N, Turner LM, Harr B, Künzel S, Vallier M, Häsler R, Franke A, Oberg H-H, Ibrahim SM, Grassl GA, Kabelitz D, Baines JF. Analysis of intestinal microbiota in hybrid house mice reveals evolutionary divergence in a vertebrate hologenome. Nat Commun. 2015;6:6440. https://doi.org/10.1038/ncomms7440.</w:t>
       </w:r>
     </w:p>
     <w:p>
@@ -3005,7 +3041,7 @@
         <w:rPr>
           <w:color w:val="1F4E79"/>
         </w:rPr>
-        <w:t>12. Pfennig KS, Kelly AL, Pierce AA. Hybridization as a facilitator of species range expansion. Proceedings of the Royal Society B: Biological Sciences. 2016;283:20161329. https://doi.org/10.1098/rspb.2016.1329.</w:t>
+        <w:t>12. Pfennig KS, Kelly AL, Pierce AA. Hybridization as a facilitator of species range expansion. Proc Biol Sci. 2016;283:20161329. https://doi.org/10.1098/rspb.2016.1329.</w:t>
       </w:r>
     </w:p>
     <w:p>
@@ -3023,7 +3059,7 @@
         <w:rPr>
           <w:color w:val="1F4E79"/>
         </w:rPr>
-        <w:t>14. Camper BT, Laughlin Z, Malagon D, Denton R, Bewick S. A conceptual framework for host‐associated microbiomes of hybrid organisms. Methods in Ecology and Evolution. 2024;15:511–529. https://doi.org/10.1111/2041-210x.14279.</w:t>
+        <w:t>14. Camper BT, Laughlin Z, Malagon D, Denton R, Bewick S. A conceptual framework for host‐associated microbiomes of hybrid organisms. Methods Ecol Evol. 2024;15:511–529. https://doi.org/10.1111/2041-210x.14279.</w:t>
       </w:r>
     </w:p>
     <w:p>
@@ -3041,7 +3077,7 @@
         <w:rPr>
           <w:color w:val="1F4E79"/>
         </w:rPr>
-        <w:t>16. Li W, Liu J, Tan H, Yang C, Ren L, Liu Q, Wang S, Hu F, Xiao J, Zhao R, Tao M, Zhang C, Qin Q, Liu S. Genetic Effects on the Gut Microbiota Assemblages of Hybrid Fish From Parents With Different Feeding Habits. Frontiers in Microbiology. 2018;9:2972. https://doi.org/10.3389/fmicb.2018.02972.</w:t>
+        <w:t>16. Li W, Liu J, Tan H, Yang C, Ren L, Liu Q, Wang S, Hu F, Xiao J, Zhao R, Tao M, Zhang C, Qin Q, Liu S. Genetic Effects on the Gut Microbiota Assemblages of Hybrid Fish From Parents With Different Feeding Habits. Front Microbiol. 2018;9:2972. https://doi.org/10.3389/fmicb.2018.02972.</w:t>
       </w:r>
     </w:p>
     <w:p>
@@ -3059,7 +3095,7 @@
         <w:rPr>
           <w:color w:val="1F4E79"/>
         </w:rPr>
-        <w:t>18. Wang Q, Liu J-H, Wen B, Gao J-Z, Chen Z-Z. Gut microbiota communities of reciprocal hybrids from koi (Cyprinus carpio) and goldfish (Carassius auratus) are more similar to koi than goldfish. Journal of Applied Microbiology. 2022;133:960–971. https://doi.org/10.1111/jam.15616.</w:t>
+        <w:t>18. Wang Q, Liu J-H, Wen B, Gao J-Z, Chen Z-Z. Gut microbiota communities of reciprocal hybrids from koi (Cyprinus carpio) and goldfish (Carassius auratus) are more similar to koi than goldfish. J Appl Microbiol. 2022;133:960–971. https://doi.org/10.1111/jam.15616.</w:t>
       </w:r>
     </w:p>
     <w:p>
@@ -3068,7 +3104,7 @@
         <w:rPr>
           <w:color w:val="1F4E79"/>
         </w:rPr>
-        <w:t>19. Sevellec M, Laporte M, Bernatchez A, Derome N, Bernatchez L. Evidence for host effect on the intestinal microbiota of whitefish (Coregonus sp.) species pairs and their hybrids. Ecology and Evolution. 2019;9:11762–11774. https://doi.org/10.1002/ece3.5676.</w:t>
+        <w:t>19. Sevellec M, Laporte M, Bernatchez A, Derome N, Bernatchez L. Evidence for host effect on the intestinal microbiota of whitefish (Coregonus sp.) species pairs and their hybrids. Ecol Evol. 2019;9:11762–11774. https://doi.org/10.1002/ece3.5676.</w:t>
       </w:r>
     </w:p>
     <w:p>
@@ -3086,7 +3122,7 @@
         <w:rPr>
           <w:color w:val="1F4E79"/>
         </w:rPr>
-        <w:t>21. Nielsen DP, Harrison JG, Byer NW, Faske TM, Parchman TL, Simison WB, Matocq MD. The gut microbiome reflects ancestry despite dietary shifts across a hybrid zone. Ecology Letters. 2023;26:63–75. https://doi.org/10.1111/ele.14135.</w:t>
+        <w:t>21. Nielsen DP, Harrison JG, Byer NW, Faske TM, Parchman TL, Simison WB, Matocq MD. The gut microbiome reflects ancestry despite dietary shifts across a hybrid zone. Ecol Lett. 2023;26:63–75. https://doi.org/10.1111/ele.14135.</w:t>
       </w:r>
     </w:p>
     <w:p>
@@ -3104,7 +3140,7 @@
         <w:rPr>
           <w:color w:val="1F4E79"/>
         </w:rPr>
-        <w:t>23. Grieneisen LE, Charpentier MJE, Alberts SC, Blekhman R, Bradburd G, Tung J, Archie EA. Genes, geology and germs: gut microbiota across a primate hybrid zone are explained by site soil properties, not host species. Proceedings of the Royal Society B: Biological Sciences. 2019;286:20190431. https://doi.org/10.1098/rspb.2019.0431.</w:t>
+        <w:t>23. Grieneisen LE, Charpentier MJE, Alberts SC, Blekhman R, Bradburd G, Tung J, Archie EA. Genes, geology and germs: gut microbiota across a primate hybrid zone are explained by site soil properties, not host species. Proc Biol Sci. 2019;286:20190431. https://doi.org/10.1098/rspb.2019.0431.</w:t>
       </w:r>
     </w:p>
     <w:p>
@@ -3113,7 +3149,7 @@
         <w:rPr>
           <w:color w:val="1F4E79"/>
         </w:rPr>
-        <w:t>24. Čížková D, Schmiedová L, Kváč M, Sak B, Macholán M, Piálek J, Kreisinger J. The effect of host admixture on wild house mouse gut microbiota is weak when accounting for spatial autocorrelation. Molecular Ecology. 2024;33:e17192. https://doi.org/10.1111/mec.17192.</w:t>
+        <w:t>24. Čížková D, Schmiedová L, Kváč M, Sak B, Macholán M, Piálek J, Kreisinger J. The effect of host admixture on wild house mouse gut microbiota is weak when accounting for spatial autocorrelation. Mol Ecol. 2024;33:e17192. https://doi.org/10.1111/mec.17192.</w:t>
       </w:r>
     </w:p>
     <w:p>
@@ -3140,7 +3176,7 @@
         <w:rPr>
           <w:color w:val="1F4E79"/>
         </w:rPr>
-        <w:t>27. COSTEDOAT C, PECH N, SALDUCCI M-D, CHAPPAZ R, GILLES A. Evolution of mosaic hybrid zone between invasive and endemic species of Cyprinidae through space and time. Biological Journal of the Linnean Society. 2005;85:135–155. https://doi.org/10.1111/j.1095-8312.2005.00478.x.</w:t>
+        <w:t>27. COSTEDOAT C, PECH N, SALDUCCI M-D, CHAPPAZ R, GILLES A. Evolution of mosaic hybrid zone between invasive and endemic species of Cyprinidae through space and time. Biol J Linn Soc Lond. 2005;85:135–155. https://doi.org/10.1111/j.1095-8312.2005.00478.x.</w:t>
       </w:r>
     </w:p>
     <w:p>
@@ -3149,7 +3185,7 @@
         <w:rPr>
           <w:color w:val="1F4E79"/>
         </w:rPr>
-        <w:t>28. Sinama M, Gilles A, Costedoat C, Corse E, Olivier J-M, Chappaz R, Pech N. Non-homogeneous combination of two porous genomes induces complex body shape trajectories in cyprinid hybrids. Frontiers in Zoology. 2013;10:22. https://doi.org/10.1186/1742-9994-10-22.</w:t>
+        <w:t>28. Sinama M, Gilles A, Costedoat C, Corse E, Olivier J-M, Chappaz R, Pech N. Non-homogeneous combination of two porous genomes induces complex body shape trajectories in cyprinid hybrids. Front Zool. 2013;10:22. https://doi.org/10.1186/1742-9994-10-22.</w:t>
       </w:r>
     </w:p>
     <w:p>
@@ -3167,7 +3203,7 @@
         <w:rPr>
           <w:color w:val="1F4E79"/>
         </w:rPr>
-        <w:t>30. SEEHAUSEN O, TAKIMOTO G, ROY D, JOKELA J. Speciation reversal and biodiversity dynamics with hybridization in changing environments. Molecular Ecology. 2008;17:30–44. https://doi.org/10.1111/j.1365-294x.2007.03529.x.</w:t>
+        <w:t>30. SEEHAUSEN O, TAKIMOTO G, ROY D, JOKELA J. Speciation reversal and biodiversity dynamics with hybridization in changing environments. Mol Ecol. 2008;17:30–44. https://doi.org/10.1111/j.1365-294x.2007.03529.x.</w:t>
       </w:r>
     </w:p>
     <w:p>
@@ -3176,7 +3212,7 @@
         <w:rPr>
           <w:color w:val="1F4E79"/>
         </w:rPr>
-        <w:t>31. Guivier E, Martin J-F, Pech N, Ungaro A, Chappaz R, Gilles A. Microbiota Diversity Within and Between the Tissues of Two Wild Interbreeding Species. Microbial Ecology. 2018;75:799–810. https://doi.org/10.1007/s00248-017-1077-9.</w:t>
+        <w:t>31. Guivier E, Martin J-F, Pech N, Ungaro A, Chappaz R, Gilles A. Microbiota Diversity Within and Between the Tissues of Two Wild Interbreeding Species. Microb Ecol. 2018;75:799–810. https://doi.org/10.1007/s00248-017-1077-9.</w:t>
       </w:r>
     </w:p>
     <w:p>
@@ -3185,7 +3221,7 @@
         <w:rPr>
           <w:color w:val="1F4E79"/>
         </w:rPr>
-        <w:t>32. Kozich JJ, Westcott SL, Baxter NT, Highlander SK, Schloss PD. Development of a Dual-Index Sequencing Strategy and Curation Pipeline for Analyzing Amplicon Sequence Data on the MiSeq Illumina Sequencing Platform. Applied and Environmental Microbiology. 2013;79:5112–5120. https://doi.org/10.1128/aem.01043-13.</w:t>
+        <w:t>32. Kozich JJ, Westcott SL, Baxter NT, Highlander SK, Schloss PD. Development of a Dual-Index Sequencing Strategy and Curation Pipeline for Analyzing Amplicon Sequence Data on the MiSeq Illumina Sequencing Platform. Appl Environ Microbiol. 2013;79:5112–5120. https://doi.org/10.1128/aem.01043-13.</w:t>
       </w:r>
     </w:p>
     <w:p>
@@ -3203,7 +3239,7 @@
         <w:rPr>
           <w:color w:val="1F4E79"/>
         </w:rPr>
-        <w:t>34. Martin M. Cutadapt removes adapter sequences from high-throughput sequencing reads. EMBnet.journal. 2011;17:10. https://doi.org/10.14806/ej.17.1.200.</w:t>
+        <w:t>34. Martin M. Cutadapt removes adapter sequences from high-throughput sequencing reads. EMBnet J. 2011;17:10. https://doi.org/10.14806/ej.17.1.200.</w:t>
       </w:r>
     </w:p>
     <w:p>
@@ -3212,7 +3248,7 @@
         <w:rPr>
           <w:color w:val="1F4E79"/>
         </w:rPr>
-        <w:t>35. Callahan BJ, McMurdie PJ, Rosen MJ, Han AW, Johnson AJA, Holmes SP. DADA2: High-resolution sample inference from Illumina amplicon data. Nature Methods. 2016;13:581–583. https://doi.org/10.1038/nmeth.3869.</w:t>
+        <w:t>35. Callahan BJ, McMurdie PJ, Rosen MJ, Han AW, Johnson AJA, Holmes SP. DADA2: High-resolution sample inference from Illumina amplicon data. Nat Methods. 2016;13:581–583. https://doi.org/10.1038/nmeth.3869.</w:t>
       </w:r>
     </w:p>
     <w:p>
@@ -3221,7 +3257,7 @@
         <w:rPr>
           <w:color w:val="1F4E79"/>
         </w:rPr>
-        <w:t>36. Quast C, Pruesse E, Yilmaz P, Gerken J, Schweer T, Yarza P, Peplies J, Glöckner FO. The SILVA ribosomal RNA gene database project: improved data processing and web-based tools. Nucleic Acids Research. 2013;41:D590–D596. https://doi.org/10.1093/nar/gks1219.</w:t>
+        <w:t>36. Quast C, Pruesse E, Yilmaz P, Gerken J, Schweer T, Yarza P, Peplies J, Glöckner FO. The SILVA ribosomal RNA gene database project: improved data processing and web-based tools. Nucleic Acids Res. 2013;41:D590–D596. https://doi.org/10.1093/nar/gks1219.</w:t>
       </w:r>
     </w:p>
     <w:p>
@@ -3239,7 +3275,7 @@
         <w:rPr>
           <w:color w:val="1F4E79"/>
         </w:rPr>
-        <w:t>38. Bolyen E, Rideout JR, Dillon MR, Bokulich NA, Abnet CC, Al-Ghalith GA, Alexander H, Alm EJ, Arumugam M, Asnicar F, Bai Y, Bisanz JE, Bittinger K, Brejnrod A, Brislawn CJ, Brown CT, Callahan BJ, Caraballo-Rodríguez AM, Chase J, Cope EK, Da Silva R, Diener C, Dorrestein PC, Douglas GM, Durall DM, Duvallet C, Edwardson CF, Ernst M, Estaki M, Fouquier J, et al.. Reproducible, interactive, scalable and extensible microbiome data science using QIIME 2. Nature Biotechnology. 2019;37:852–857. https://doi.org/10.1038/s41587-019-0209-9.</w:t>
+        <w:t>38. Bolyen E, Rideout JR, Dillon MR, Bokulich NA, Abnet CC, Al-Ghalith GA, Alexander H, Alm EJ, Arumugam M, Asnicar F, Bai Y, Bisanz JE, Bittinger K, Brejnrod A, Brislawn CJ, Brown CT, Callahan BJ, Caraballo-Rodríguez AM, Chase J, Cope EK, Da Silva R, Diener C, Dorrestein PC, Douglas GM, Durall DM, Duvallet C, Edwardson CF, Ernst M, Estaki M, Fouquier J, et al.. Reproducible, interactive, scalable and extensible microbiome data science using QIIME 2. Nat Biotechnol. 2019;37:852–857. https://doi.org/10.1038/s41587-019-0209-9.</w:t>
       </w:r>
     </w:p>
     <w:p>
@@ -3248,7 +3284,7 @@
         <w:rPr>
           <w:color w:val="1F4E79"/>
         </w:rPr>
-        <w:t>39. Katoh K, Standley DM. MAFFT Multiple Sequence Alignment Software Version 7: Improvements in Performance and Usability. Molecular Biology and Evolution. 2013;30:772–780. https://doi.org/10.1093/molbev/mst010.</w:t>
+        <w:t>39. Katoh K, Standley DM. MAFFT Multiple Sequence Alignment Software Version 7: Improvements in Performance and Usability. Mol Biol Evol. 2013;30:772–780. https://doi.org/10.1093/molbev/mst010.</w:t>
       </w:r>
     </w:p>
     <w:p>
@@ -3257,7 +3293,7 @@
         <w:rPr>
           <w:color w:val="1F4E79"/>
         </w:rPr>
-        <w:t>40. Price MN, Dehal PS, Arkin AP. FastTree 2 – Approximately Maximum-Likelihood Trees for Large Alignments. PLoS ONE. 2010;5:e9490. https://doi.org/10.1371/journal.pone.0009490.</w:t>
+        <w:t>40. Price MN, Dehal PS, Arkin AP. FastTree 2 – Approximately Maximum-Likelihood Trees for Large Alignments. PLoS One. 2010;5:e9490. https://doi.org/10.1371/journal.pone.0009490.</w:t>
       </w:r>
     </w:p>
     <w:p>
@@ -3266,7 +3302,7 @@
         <w:rPr>
           <w:color w:val="1F4E79"/>
         </w:rPr>
-        <w:t>41. Lozupone C, Knight R. UniFrac: a New Phylogenetic Method for Comparing Microbial Communities. Applied and Environmental Microbiology. 2005;71:8228–8235. https://doi.org/10.1128/aem.71.12.8228-8235.2005.</w:t>
+        <w:t>41. Lozupone C, Knight R. UniFrac: a New Phylogenetic Method for Comparing Microbial Communities. Appl Environ Microbiol. 2005;71:8228–8235. https://doi.org/10.1128/aem.71.12.8228-8235.2005.</w:t>
       </w:r>
     </w:p>
     <w:p>
@@ -3275,7 +3311,7 @@
         <w:rPr>
           <w:color w:val="1F4E79"/>
         </w:rPr>
-        <w:t>42. Faith DP. Conservation evaluation and phylogenetic diversity. Biological Conservation. 1992;61:1–10. https://doi.org/10.1016/0006-3207(92)91201-3.</w:t>
+        <w:t>42. Faith DP. Conservation evaluation and phylogenetic diversity. Biol Conserv. 1992;61:1–10. https://doi.org/10.1016/0006-3207(92)91201-3.</w:t>
       </w:r>
     </w:p>
     <w:p>
@@ -3293,7 +3329,7 @@
         <w:rPr>
           <w:color w:val="1F4E79"/>
         </w:rPr>
-        <w:t>44. Cameron ES, Schmidt PJ, Tremblay BJ-M, Emelko MB, Müller KM. Enhancing diversity analysis by repeatedly rarefying next generation sequencing data describing microbial communities. Scientific Reports. 2021;11:22302. https://doi.org/10.1038/s41598-021-01636-1.</w:t>
+        <w:t>44. Cameron ES, Schmidt PJ, Tremblay BJ-M, Emelko MB, Müller KM. Enhancing diversity analysis by repeatedly rarefying next generation sequencing data describing microbial communities. Sci Rep. 2021;11:22302. https://doi.org/10.1038/s41598-021-01636-1.</w:t>
       </w:r>
     </w:p>
     <w:p>
@@ -3302,7 +3338,7 @@
         <w:rPr>
           <w:color w:val="1F4E79"/>
         </w:rPr>
-        <w:t>45. Anderson MJ. A new method for non‐parametric multivariate analysis of variance. Austral Ecology. 2001;26:32–46. https://doi.org/10.1111/j.1442-9993.2001.01070.pp.x.</w:t>
+        <w:t>45. Anderson MJ. A new method for non‐parametric multivariate analysis of variance. Austral Ecol. 2001;26:32–46. https://doi.org/10.1111/j.1442-9993.2001.01070.pp.x.</w:t>
       </w:r>
     </w:p>
     <w:p>
@@ -3347,7 +3383,7 @@
         <w:rPr>
           <w:color w:val="1F4E79"/>
         </w:rPr>
-        <w:t>50. McMurdie PJ, Holmes S. phyloseq: An R Package for Reproducible Interactive Analysis and Graphics of Microbiome Census Data. PLoS ONE. 2013;8:e61217. https://doi.org/10.1371/journal.pone.0061217.</w:t>
+        <w:t>50. McMurdie PJ, Holmes S. phyloseq: An R Package for Reproducible Interactive Analysis and Graphics of Microbiome Census Data. PLoS One. 2013;8:e61217. https://doi.org/10.1371/journal.pone.0061217.</w:t>
       </w:r>
     </w:p>
     <w:p>
@@ -3367,7 +3403,7 @@
           <w:color w:val="888888"/>
           <w:sz w:val="18"/>
         </w:rPr>
-        <w:t>[Références : noms de revues non abrégés (à abréger selon la norme NLM avant soumission) ; Small et al. et Sevellec et al. cités dans leur version publiée (2019, Crossref) et non dans celle de la .bib ; Sinama et al. 2013 : deux notices possibles (thèse ou Frontiers in Zoology), la seconde retenue — à confirmer ; références logicielles (DADA2, SILVA, cutadapt, QIIME 2, MAFFT, FastTree, UniFrac, Faith, PERMANOVA, PERMDISP, Stier et al., phyloseq, vegan, HybridMicrobiomes) ajoutées le 2026-10-03, vérifiées sur Crossref, absentes de la .bib ; année = année du volume imprimé quand elle existe (Guivier et al. Microb Ecol 2018;75, en ligne 2017 ; Nielsen et al. 2023 ; Čížková et al. 2024 ; Guivier et al. Hydrobiologia 2019) — à confirmer.]</w:t>
+        <w:t>[Références : noms de revues abrégés le 2026-10-05 selon le catalogue NLM (MedlineTA, recherche par ISSN ; scripts/44-corrections_mecaniques.py) ; préprint, thèse, logiciels et dépôt non abrégés ; Small et al. et Sevellec et al. cités dans leur version publiée (2019, Crossref) et non dans celle de la .bib ; Sinama et al. 2013 : deux notices possibles (thèse ou Frontiers in Zoology), la seconde retenue — à confirmer ; références logicielles (DADA2, SILVA, cutadapt, QIIME 2, MAFFT, FastTree, UniFrac, Faith, PERMANOVA, PERMDISP, Stier et al., phyloseq, vegan, HybridMicrobiomes) ajoutées le 2026-10-03, vérifiées sur Crossref, absentes de la .bib ; année = année du volume imprimé quand elle existe (Guivier et al. Microb Ecol 2018;75, en ligne 2017 ; Nielsen et al. 2023 ; Čížková et al. 2024 ; Guivier et al. Hydrobiologia 2019) — à confirmer.]</w:t>
       </w:r>
     </w:p>
     <w:p>
@@ -3468,7 +3504,19 @@
         <w:rPr>
           <w:color w:val="1F4E79"/>
         </w:rPr>
-        <w:t>Difference between the median distance of hybrids to their group median and the mean of the two parental values, per metric, tissue (symbols) and sequencing run, with permutations constrained within station blocks and distances corrected for small-sample bias. Values below 0: hybrids less dispersed than the parental mean. Filled symbols: PERMDISP test of category significant (p &lt; 0.05). a Pass 1; b pass 2.</w:t>
+        <w:t xml:space="preserve">Difference between the median distance of hybrids to their group median and the mean of the two parental values, per metric, tissue (symbols) and sequencing run, with permutations constrained within station blocks and distances corrected for small-sample bias. </w:t>
+      </w:r>
+      <w:r>
+        <w:rPr>
+          <w:color w:val="1F4E79"/>
+        </w:rPr>
+        <w:t>Values below 0: hybrids less dispersed than the mean of the two parents; panel titles give the number of tests in which hybrids were less dispersed than both parents, a stricter condition.</w:t>
+      </w:r>
+      <w:r>
+        <w:rPr>
+          <w:color w:val="1F4E79"/>
+        </w:rPr>
+        <w:t xml:space="preserve"> Filled symbols: PERMDISP test of category significant (p &lt; 0.05). a Pass 1; b pass 2.</w:t>
       </w:r>
     </w:p>
     <w:p>

</xml_diff>

<commit_message>
fix: part du 12S recalculee (script 45 : 14-15 % par run, mediane 12 %, 0-99 % par echantillon ; 15-67 % n etait reproduit par aucun calcul) dans le 5, la Note S2 et R2 ; docs: images du supplement a 15,24 cm, note de la Figure S1 corrigee, note d introduction reduite ; .bib : Small 2019 et Sevellec 2019 (script 46) ; script 30 : deux attentes perimees mises a jour ; index hybride : sens verifie ; _etat
</commit_message>
<xml_diff>
--- a/docs/manuscrit/Article.docx
+++ b/docs/manuscrit/Article.docx
@@ -266,15 +266,7 @@
           <w:color w:val="888888"/>
           <w:sz w:val="18"/>
         </w:rPr>
-        <w:t>[Introduction, draft 1 — points à trancher. (i) Titre provisoire inséré : sous-titre du supplément (JF, 2026-10-03) ; titre définitif en fin d'écriture. Cible Animal Microbiome (JF, 2026-10-03) : la structure Background / Methods / Results / Discussion / Conclusions et la section Declarations restent à mettre en place. (ii) Les références Wang et al. (2015) et Sevellec et al. (2014) proviennent de la liste du manuscrit d'origine et n'ont pas été relues en texte intégral : vérifier leur pertinence à l'endroit où elles sont placées. (iii) Deux corrections à propager dans docs/biblio/microbiome_hybrid_all_refs.bib : Small et al. est daté 2018 alors que Crossref donne 2019 pour 10.1128/msystems.00331-19 ; et le corégone y figure comme préprint (10.1101/312231) alors que la version publiée existe — Sevellec et al. 2019, Ecology and Evolution, 10.1002/ece3.5676, qui est la version citée ici. (iv) Les deux passes de définition de l'hybride et le traitement de la position de plaque (D2) sont alignés sur le §1 et le §8.6 (2026-09-25). Les paramètres a priori du 4H sont fixés par la décision D5 du 2026-09-25 : ρ = 0,5 au rang du genre, sensibilité rapportée sur ρ ∈ {0,3 ; 0,5 ; 0,7}, ϑ = ε = 0. Ce qui manque est leur description au §8.6, à écrire en même temps que le calcul 4H. (v) Vérifié sur genotypes_verifies_sept_180.csv, colonne n_chromosomes_introgresses : parmi les 22 quasi-purs, 17 sont introgressés sur un seul chromosome, 4 sur deux et 1 sur six. Le §1 et l'introduction portent désormais ces chiffres.]</w:t>
-      </w:r>
-      <w:r>
-        <w:rPr>
-          <w:i/>
-          <w:color w:val="888888"/>
-          <w:sz w:val="18"/>
-        </w:rPr>
-        <w:t xml:space="preserve"> [2026-10-03, soir : structure Animal Microbiome en place (Abstract, Background, Methods, Results, Discussion, Conclusions, Declarations, References numérotées, légendes) ; méthodes 4H au §8.11.]</w:t>
+        <w:t>[Introduction — reste ouvert (note réduite le 2026-10-05 ; points réglés retirés : structure Animal Microbiome, description du 4H au §8.11, effectifs des quasi-purs, corrections Small 2019 et Sevellec 2019 propagées dans la .bib). (i) Titre provisoire (sous-titre du supplément, JF 2026-10-03) ; titre définitif en fin d'écriture. (ii) Wang et al. 2015 [11] et Sevellec et al. 2014 [6] viennent de la liste du manuscrit d'origine et n'ont pas été relus en texte intégral : vérifier leur pertinence là où ils sont cités.]</w:t>
       </w:r>
     </w:p>
     <w:p>
@@ -692,7 +684,22 @@
           <w:b w:val="0"/>
           <w:i w:val="0"/>
         </w:rPr>
-        <w:t>The 16S V4 primers co-amplify the host mitochondrial 12S rRNA gene (15–67% of reads per sample). Because the host 12S amplicon (~190 bp) is shorter than the bacterial V4 amplicon (~253 bp), host reads were removed upstream by length with cutadapt 5.0: the reverse complements of 806R and 515F were sought at the 3′ end of R1 and R2 respectively (options -a/-A, error rate -e 0.1, minimum overlap -O 10), and read pairs shorter than 240 bp after trimming (--minimum-length 240) were discarded. In a genuine ~253 bp V4 amplicon the opposite primer is never reached within a 251 bp read, so the read stays near full length and is retained; shorter host 12S reads are trimmed below threshold and removed. Discarded reads were kept separately (--too-short-output) as an exploitable host signal.</w:t>
+        <w:t xml:space="preserve">The 16S V4 primers co-amplify the host mitochondrial 12S rRNA gene </w:t>
+      </w:r>
+      <w:r>
+        <w:rPr>
+          <w:b w:val="0"/>
+          <w:i w:val="0"/>
+          <w:color w:val="1F4E79"/>
+        </w:rPr>
+        <w:t>(host 12S and primer dimers: 14–15 % of reads per run; median 12 % per biological sample, range 0–99 %)</w:t>
+      </w:r>
+      <w:r>
+        <w:rPr>
+          <w:b w:val="0"/>
+          <w:i w:val="0"/>
+        </w:rPr>
+        <w:t>. Because the host 12S amplicon (~190 bp) is shorter than the bacterial V4 amplicon (~253 bp), host reads were removed upstream by length with cutadapt 5.0: the reverse complements of 806R and 515F were sought at the 3′ end of R1 and R2 respectively (options -a/-A, error rate -e 0.1, minimum overlap -O 10), and read pairs shorter than 240 bp after trimming (--minimum-length 240) were discarded. In a genuine ~253 bp V4 amplicon the opposite primer is never reached within a 251 bp read, so the read stays near full length and is retained; shorter host 12S reads are trimmed below threshold and removed. Discarded reads were kept separately (--too-short-output) as an exploitable host signal.</w:t>
       </w:r>
     </w:p>
     <w:p>

</xml_diff>

<commit_message>
fix: 8.11, variation de l axe parental 0.067 -> 0.066 (Camper et al. 2024, Table S.4.1 : 0,0664) ; exclusion de rho >= 0,8 verifiee (Tables S.2.1-S.2.2) ; tables S extraites dans docs/biblio ; script 40 : deux controles ; _etat
</commit_message>
<xml_diff>
--- a/docs/manuscrit/Article.docx
+++ b/docs/manuscrit/Article.docx
@@ -1450,7 +1450,27 @@
         <w:rPr>
           <w:color w:val="1F4E79"/>
         </w:rPr>
-        <w:t xml:space="preserve"> — in each pass, tissue and sequencing run separately. Its parameters and reading rules were fixed in a document committed before any index was computed: core fraction ρ = 0.5 at genus rank, with sensitivity at ρ = 0.3 and 0.7 and at family rank, and no abundance threshold (ϑ = ε = 0); ρ ≥ 0.8 was excluded because the Intersection dimension vanishes there on the published natural hybrid system. ASV counts were aggregated to genus; 48.6 % of ASVs, carrying 64.1 % of reads, were assigned to a genus (family: 77.9 % and 90.6 %), and unassigned ASVs were excluded. Because the package rarefies the aggregated table, samples were required to carry at least 1,000 genus-assigned reads (1,749 of the 1,784 rarefied samples) and were rarefied to that depth at each of 500 bootstraps; on the published natural hybrid system the parental axis varies by at most 0.067 between 1,000 and 10,000 reads [14]. Each bootstrap drew without replacement the same number of hosts N from each class, N being one less than the smallest class of pass 1 in the stratum (9 in the caudal fin, 10–19 elsewhere), and the same N was applied to pass 2 so that the two passes are compared on equal footing; pass 2 was also computed at its own N. An abundance-based version of the index (inspired by Bray–Curtis), the pre-analysis of core fractions, the null plane and a null hybrid model averaging one randomly drawn individual of each parental species were computed with the same settings. The index is reported along its parental (Union + Intersection) and transgressive (Gain + Loss) axes. An axis was called dominant when it exceeded 0.5 in all three runs, and robust when the same axis dominated at ρ = 0.3, at ρ = 0.7, at family rank and in the abundance-based version; two compartments were called different when the 95 % bootstrap intervals of the transgressive axis were disjoint in all three runs. The PERMANOVA comparison of bootstrap sets offered by the package was not used, because its p-value decreases with the arbitrarily chosen number of bootstraps. Preferential retention of the taxa shared by both parents was inferred when more than 95 % of bootstraps lay on the Intersection side of the null plane in all three runs. Following the framework's own statement of scope, the index is read as a pattern of taxon membership, not as evidence of an assembly process.</w:t>
+        <w:t xml:space="preserve"> — in each pass, tissue and sequencing run separately. Its parameters and reading rules were fixed in a document committed before any index was computed: core fraction ρ = 0.5 at genus rank, with sensitivity at ρ = 0.3 and 0.7 and at family rank, and no abundance threshold (ϑ = ε = 0); ρ ≥ 0.8 was excluded because the Intersection dimension vanishes there on the published natural hybrid system. ASV counts were aggregated to genus; 48.6 % of ASVs, carrying 64.1 % of reads, were assigned to a genus (family: 77.9 % and 90.6 %), and unassigned ASVs were excluded. Because the package rarefies the aggregated table, samples were required to carry at least 1,000 genus-assigned reads (1,749 of the 1,784 rarefied samples) and were rarefied to that depth at each of 500 bootstraps; on the published natural hybrid system the parental axis </w:t>
+      </w:r>
+      <w:r>
+        <w:rPr>
+          <w:color w:val="1F4E79"/>
+        </w:rPr>
+        <w:t>varies by at most 0.066 between 1,000 and 10,000 reads [14]</w:t>
+      </w:r>
+      <w:r>
+        <w:rPr>
+          <w:color w:val="1F4E79"/>
+        </w:rPr>
+        <w:t>. Each bootstrap drew without replacement the same number of hosts N from each class, N being one less than the smallest class of pass 1 in the stratum (9 in the caudal fin, 10–19 elsewhere), and the same N was applied to pass 2 so that the two passes are compared on equal footing; pass 2 was also computed at its own N. An abundance-based version of the index (inspired by Bray–Curtis), the pre-analysis of core fractions, the null plane and a null hybrid model averaging one randomly drawn individual of each parental species were computed with the same settings. The index is reported along its parental (Union + Intersection) and transgressive (Gain + Loss) axes. An axis was called dominant when it exceeded 0.5 in all three runs, and robust when the same axis dominated at ρ = 0.3, at ρ = 0.7, at family rank and in the abundance-based version; two compartments were called different when the 95 % bootstrap intervals of the transgressive axis were disjoint in all three runs. The PERMANOVA comparison of bootstrap sets offered by the package was not used, because its p-value decreases with the arbitrarily chosen number of bootstraps. Preferential retention of the taxa shared by both parents was inferred when more than 95 % of bootstraps lay on the Intersection side of the null plane in all three runs. Following the framework's own statement of scope, the index is read as a pattern of taxon membership, not as evidence of an assembly process.</w:t>
+      </w:r>
+      <w:r>
+        <w:rPr>
+          <w:i/>
+          <w:color w:val="888888"/>
+          <w:sz w:val="18"/>
+        </w:rPr>
+        <w:t xml:space="preserve"> [0,066 : Camper et al. 2024, Supporting Information, Table S.4.1 (lézard Aspidoscelis, version Jaccard, axe parental 0,4183 → 0,4847) ; 0,045 en version Bray-Curtis (Table S.4.2). L'ancienne valeur 0,067 était mal arrondie. Exclusion de ρ ≥ 0,8 vérifiée : Intersection = 0 à ρ = 0,8 dans les Tables S.2.1 et S.2.2 (0,015 et 0,010 à ρ = 0,7). Vérifié le 2026-10-05.]</w:t>
       </w:r>
     </w:p>
     <w:p>

</xml_diff>

<commit_message>
docs: la version resserree devient la reference unique (choix de JF du 06/10) - Article_resserre.docx -> Article.docx, Supplementary_Data_resserre.docx -> Supplementary_Data.docx ; versions longues archivees en docs/manuscrit/archive/*_long_2026-10-05.docx. Le defaut du script 40 (argv[1]) pointe desormais sur le manuscrit vivant ; le script 30 est independant du docx. Les scripts 42, 44, 47 et 48 citent les anciens noms : scripts a usage unique, non rejouables.
</commit_message>
<xml_diff>
--- a/docs/manuscrit/Article.docx
+++ b/docs/manuscrit/Article.docx
@@ -15,143 +15,13 @@
       </w:r>
     </w:p>
     <w:p>
-      <w:pPr>
-        <w:pStyle w:val="Title"/>
-      </w:pPr>
-      <w:r>
-        <w:rPr>
-          <w:color w:val="1F4E79"/>
-        </w:rPr>
-        <w:t>Abstract</w:t>
-      </w:r>
-    </w:p>
-    <w:p>
-      <w:pPr/>
-      <w:r>
-        <w:rPr>
-          <w:b/>
-          <w:color w:val="1F4E79"/>
-        </w:rPr>
-        <w:t xml:space="preserve">Background: </w:t>
-      </w:r>
-      <w:r>
-        <w:rPr>
-          <w:color w:val="1F4E79"/>
-        </w:rPr>
-        <w:t>Hybridisation can reorganise host–microbe associations, but whether the microbiota of hybrids is intermediate between the parental species, dominated by one of them or transgressive has rarely been tested in natural hybrid zones, and never across several tissues of the same fish. We characterised the bacterial microbiota of the caudal fin, gill, midgut and hindgut of 180 nases (</w:t>
-      </w:r>
       <w:r>
         <w:rPr>
           <w:i/>
-          <w:color w:val="1F4E79"/>
-        </w:rPr>
-        <w:t>Chondrostoma nasus</w:t>
-      </w:r>
-      <w:r>
-        <w:rPr>
-          <w:color w:val="1F4E79"/>
-        </w:rPr>
-        <w:t>), toxostomes (</w:t>
-      </w:r>
-      <w:r>
-        <w:rPr>
-          <w:i/>
-          <w:color w:val="1F4E79"/>
-        </w:rPr>
-        <w:t>Parachondrostoma toxostoma</w:t>
-      </w:r>
-      <w:r>
-        <w:rPr>
-          <w:color w:val="1F4E79"/>
-        </w:rPr>
-        <w:t>) and their hybrids sampled at nine stations of the Rhône drainage, with ancestry resolved by genotyping across 25 chromosomes and hybrids defined in two pre-declared ways.</w:t>
-      </w:r>
-    </w:p>
-    <w:p>
-      <w:pPr/>
-      <w:r>
-        <w:rPr>
-          <w:b/>
-          <w:color w:val="1F4E79"/>
-        </w:rPr>
-        <w:t xml:space="preserve">Results: </w:t>
-      </w:r>
-      <w:r>
-        <w:rPr>
-          <w:color w:val="1F4E79"/>
-        </w:rPr>
-        <w:t xml:space="preserve">Sequencing of the V4 region of the 16S rRNA gene, replicated across two library preparations and three runs, contributed negligible technical variance. Station explained about a fifth of compositional variance and genotypic category 1.4–3.0 %. No transgressive pattern was found: hybrids were transgressive in none of 32 alpha-diversity tests, were more dispersed than both parents no more often than expected by chance, and no transgressive reading of the four-dimensional (4H) index survived the pre-declared robustness rule; hybrids preferentially retained the core taxa shared by both parents in every compartment. Departures of hybrids from their parents were specific to compartments and metrics: the midgut on Jaccard distances was detected under every analytical choice, whereas a caudal-fin signal on weighted UniFrac was present only when near-parental introgressed individuals were excluded from the hybrid class. In alpha diversity, intermediate hybrids resembled </w:t>
-      </w:r>
-      <w:r>
-        <w:rPr>
-          <w:i/>
-          <w:color w:val="1F4E79"/>
-        </w:rPr>
-        <w:t>C. nasus</w:t>
-      </w:r>
-      <w:r>
-        <w:rPr>
-          <w:color w:val="1F4E79"/>
-        </w:rPr>
-        <w:t xml:space="preserve"> in the caudal fin. Plate position affected composition and followed the order in which fish were processed, from which it cannot be separated in this design.</w:t>
-      </w:r>
-    </w:p>
-    <w:p>
-      <w:pPr/>
-      <w:r>
-        <w:rPr>
-          <w:b/>
-          <w:color w:val="1F4E79"/>
-        </w:rPr>
-        <w:t xml:space="preserve">Conclusions: </w:t>
-      </w:r>
-      <w:r>
-        <w:rPr>
-          <w:color w:val="1F4E79"/>
-        </w:rPr>
-        <w:t>In this mosaic hybrid zone the microbiota of hybrids lies within the parental range, and its departures from either parent are small relative to spatial variation, specific to compartments and metrics, and dependent on how hybrids are defined. The data give no support to a disrupted, transgressive hybrid microbiota.</w:t>
-      </w:r>
-    </w:p>
-    <w:p>
-      <w:pPr/>
-      <w:r>
-        <w:rPr>
-          <w:b/>
-          <w:color w:val="1F4E79"/>
-        </w:rPr>
-        <w:t xml:space="preserve">Keywords: </w:t>
-      </w:r>
-      <w:r>
-        <w:rPr>
-          <w:color w:val="1F4E79"/>
-        </w:rPr>
-        <w:t xml:space="preserve">hybridisation; hybrid zone; host-associated microbiota; 16S rRNA gene; Cyprinidae; </w:t>
-      </w:r>
-      <w:r>
-        <w:rPr>
-          <w:i/>
-          <w:color w:val="1F4E79"/>
-        </w:rPr>
-        <w:t>Chondrostoma nasus</w:t>
-      </w:r>
-      <w:r>
-        <w:rPr>
-          <w:color w:val="1F4E79"/>
-        </w:rPr>
-        <w:t xml:space="preserve">; </w:t>
-      </w:r>
-      <w:r>
-        <w:rPr>
-          <w:i/>
-          <w:color w:val="1F4E79"/>
-        </w:rPr>
-        <w:t>Parachondrostoma toxostoma</w:t>
-      </w:r>
-      <w:r>
-        <w:rPr>
-          <w:color w:val="1F4E79"/>
-        </w:rPr>
-        <w:t>; transgressive segregation; 4H index; tissue compartment</w:t>
+          <w:color w:val="888888"/>
+          <w:sz w:val="18"/>
+        </w:rPr>
+        <w:t>[Version resserrée du 2026-10-05. Les passages retirés des Methods sont déplacés sans modification dans la nouvelle note supplémentaire S2 de Supplementary_Data_resserre.docx ; l'ancienne note S2 devient la note S3. Comparaison paragraphe par paragraphe : docs/manuscrit/resserrement_2026-10-05_comparaison.docx. Article.docx reste la version de référence jusqu'à validation par JF.]</w:t>
       </w:r>
     </w:p>
     <w:p>
@@ -162,111 +32,136 @@
         <w:rPr>
           <w:color w:val="1F4E79"/>
         </w:rPr>
-        <w:t>Background</w:t>
+        <w:t>Abstract</w:t>
       </w:r>
     </w:p>
     <w:p>
       <w:pPr/>
       <w:r>
         <w:rPr>
-          <w:i w:val="0"/>
-        </w:rPr>
-        <w:t>Animals and the microbial communities they harbour form composite biological units in which microbial composition contributes to host performance and to tolerance of environmental constraints [1]. These associations are established largely by the sorting of microbial pools from the surrounding environment, a sorting that reflects host ecology and physiology — feeding behaviour, which selects among available resources, and the immune pathways underlying tolerance of or resistance to microbes [2–4]. Environmental acquisition is particularly important in fish, which live in a medium favourable to bacterial growth, are continuously exposed to microbes at their epithelial barriers, and are mostly oviparous with limited maternal effects compared with mammals [5]; accordingly, surveys of wild populations report a predominant environmental component of variation in bacterial composition [6–8]. Host genotype is nonetheless not without effect. A fourteen-year follow-up of wild baboons found microbiome phenotypes to be almost universally heritable, but with a typically low heritability that depends on context, and its authors concluded that large sample sizes are required to quantify it [9]; in stickleback, a host genetic influence on the gut microbiome became measurable once biological and technical components of variance had been decomposed beforehand [10]. If host ancestry shapes the fish microbiota, the expected effect is therefore small relative to the environmental one, and detecting it requires both substantial sample sizes and explicit control of the spatial and technical axes along which it could be mimicked.</w:t>
+          <w:b/>
+          <w:color w:val="1F4E79"/>
+        </w:rPr>
+        <w:t xml:space="preserve">Background: </w:t>
+      </w:r>
+      <w:r>
+        <w:rPr>
+          <w:color w:val="1F4E79"/>
+        </w:rPr>
+        <w:t>Hybridisation can reorganise host–microbe associations, but whether the microbiota of hybrids is intermediate between the parental species, dominated by one of them or transgressive has rarely been tested in natural hybrid zones, and never across several tissues of the same fish. We characterised the bacterial microbiota of the caudal fin, gill, midgut and hindgut of 180 nases (</w:t>
+      </w:r>
+      <w:r>
+        <w:rPr>
+          <w:i/>
+          <w:color w:val="1F4E79"/>
+        </w:rPr>
+        <w:t>Chondrostoma nasus</w:t>
+      </w:r>
+      <w:r>
+        <w:rPr>
+          <w:color w:val="1F4E79"/>
+        </w:rPr>
+        <w:t>), toxostomes (</w:t>
+      </w:r>
+      <w:r>
+        <w:rPr>
+          <w:i/>
+          <w:color w:val="1F4E79"/>
+        </w:rPr>
+        <w:t>Parachondrostoma toxostoma</w:t>
+      </w:r>
+      <w:r>
+        <w:rPr>
+          <w:color w:val="1F4E79"/>
+        </w:rPr>
+        <w:t>) and their hybrids sampled at nine stations of the Rhône drainage, with ancestry resolved by genotyping across 25 chromosomes and hybrids defined in two pre-declared ways.</w:t>
       </w:r>
     </w:p>
     <w:p>
       <w:pPr/>
       <w:r>
         <w:rPr>
-          <w:i w:val="0"/>
-        </w:rPr>
-        <w:t>Secondary contact zones make host ancestry a naturally occurring and naturally replicated variable, and they are where the question of a genomic contribution to microbiota assembly is posed most directly. Introgressive hybridisation may disrupt co-adapted gene complexes and thereby alter close host–microbe interactions [11]; conversely, hybridisation is a source of genomic diversity and adaptive novelty involved in speciation and in range expansion into enlarged ecological niches [12, 13], and this diversity may extend to the microbiota through the acquisition of new microbial taxa. Three outcomes are usually contrasted: an intermediate or additive microbiota, varying monotonically with ancestry; dominance, in which hybrids resemble one parental species; and a transgressive microbiota, lying outside the range of both parents. Camper et al. [14] gave this comparison an explicit framework for host-associated microbiomes, in which four idealised models of taxon membership — Union, Intersection, Gain and Loss — are never realised in pure form, so that the index measures the relative weight of each and the four weights sum to one. The Gain–Loss axis of that framework provides an operational definition of a transgressive microbiota, one that does not presuppose a cost to the host. The distinction matters, because the equation between transgression and dysbiosis has been challenged: on an ecologically successful hybrid lizard, Camper et al. [15] report widespread transgressive segregation correlated with a restructuring of niche, and argue that the negative conclusions of the literature rest disproportionately on hybrids of low adaptive value. We follow the framework's own statement of scope, that the index describes a pattern and not a process, in the same sense as a beta-diversity measure.</w:t>
+          <w:b/>
+          <w:color w:val="1F4E79"/>
+        </w:rPr>
+        <w:t xml:space="preserve">Results: </w:t>
+      </w:r>
+      <w:r>
+        <w:rPr>
+          <w:color w:val="1F4E79"/>
+        </w:rPr>
+        <w:t xml:space="preserve">Sequencing of the V4 region of the 16S rRNA gene, replicated across two library preparations and three runs, contributed negligible technical variance. Station explained about a fifth of compositional variance and genotypic category 1.4–3.0 %. No transgressive pattern was found: hybrids were transgressive in none of 32 alpha-diversity tests, were more dispersed than both parents no more often than expected by chance, and no transgressive reading of the four-dimensional (4H) index survived the pre-declared robustness rule; hybrids preferentially retained the core taxa shared by both parents in every compartment. Departures of hybrids from their parents were specific to compartments and metrics: the midgut on Jaccard distances was detected under every analytical choice, whereas a caudal-fin signal on weighted UniFrac was present only when near-parental introgressed individuals were excluded from the hybrid class. In alpha diversity, intermediate hybrids resembled </w:t>
+      </w:r>
+      <w:r>
+        <w:rPr>
+          <w:i/>
+          <w:color w:val="1F4E79"/>
+        </w:rPr>
+        <w:t>C. nasus</w:t>
+      </w:r>
+      <w:r>
+        <w:rPr>
+          <w:color w:val="1F4E79"/>
+        </w:rPr>
+        <w:t xml:space="preserve"> in the caudal fin. Plate position affected composition and followed the order in which fish were processed, from which it cannot be separated in this design.</w:t>
       </w:r>
     </w:p>
     <w:p>
       <w:pPr/>
       <w:r>
         <w:rPr>
-          <w:i w:val="0"/>
-        </w:rPr>
-        <w:t xml:space="preserve">What is known of hybrid microbiota in fish comes almost entirely from controlled crosses. Reciprocal hybrids of bream and culter, whose parents have contrasting feeding habits, show a strong correspondence between genotype and intestinal characteristics [16]; in intrageneric </w:t>
-      </w:r>
-      <w:r>
-        <w:rPr>
-          <w:i/>
-        </w:rPr>
-        <w:t>Takifugu</w:t>
-      </w:r>
-      <w:r>
-        <w:rPr>
-          <w:i w:val="0"/>
-        </w:rPr>
-        <w:t xml:space="preserve"> hybrids, host hybridisation outweighs cohabitation in shaping the gut microbiota [17]; reciprocal hybrids of koi and goldfish resemble one parent rather than the midpoint of the two [18]; and whitefish species pairs with their reciprocal hybrids have been compared in natural and controlled environments [19]. This body of work has been reviewed recently [20]. Studies of natural hybrid zones in other vertebrates, for their part, do not converge. Host ancestry predominates in </w:t>
-      </w:r>
-      <w:r>
-        <w:rPr>
-          <w:i/>
-        </w:rPr>
-        <w:t>Neotoma</w:t>
-      </w:r>
-      <w:r>
-        <w:rPr>
-          <w:i w:val="0"/>
-        </w:rPr>
-        <w:t xml:space="preserve"> woodrats, where habitat determines diet but genotype determines the gut microbiota [21], and in hybridising brown lemurs along a 180 km transect [22]. The opposite conclusion is reached in baboons spanning a hybrid zone, where site soil properties rather than genetic ancestry, relatedness or between-population genetic distance explain the gut microbiota [23], and in wild house mice, where an apparent effect of admixture becomes weak once spatial autocorrelation is taken into account, on two replicates of the same hybrid zone [24]. In hybridising chickadees moved to a common environment, the change of environment affected microbiota richness but not community composition, while a corresponding effect of ancestry on composition was not statistically supported [25] — a result that argues for reporting alpha and beta diversity separately rather than for a directed expectation on either. Across this literature, no study combines a natural hybrid zone in fish, host ancestry quantified by genotyping rather than assigned by cross class, and several tissue compartments characterised in the same individual.</w:t>
+          <w:b/>
+          <w:color w:val="1F4E79"/>
+        </w:rPr>
+        <w:t xml:space="preserve">Conclusions: </w:t>
+      </w:r>
+      <w:r>
+        <w:rPr>
+          <w:color w:val="1F4E79"/>
+        </w:rPr>
+        <w:t>In this mosaic hybrid zone the microbiota of hybrids lies within the parental range, and its departures from either parent are small relative to spatial variation, specific to compartments and metrics, and dependent on how hybrids are defined. The data give no support to a disrupted, transgressive hybrid microbiota.</w:t>
       </w:r>
     </w:p>
     <w:p>
       <w:pPr/>
       <w:r>
         <w:rPr>
-          <w:i w:val="0"/>
-        </w:rPr>
-        <w:t xml:space="preserve">The nase </w:t>
+          <w:b/>
+          <w:color w:val="1F4E79"/>
+        </w:rPr>
+        <w:t xml:space="preserve">Keywords: </w:t>
+      </w:r>
+      <w:r>
+        <w:rPr>
+          <w:color w:val="1F4E79"/>
+        </w:rPr>
+        <w:t xml:space="preserve">hybridisation; hybrid zone; host-associated microbiota; 16S rRNA gene; Cyprinidae; </w:t>
       </w:r>
       <w:r>
         <w:rPr>
           <w:i/>
+          <w:color w:val="1F4E79"/>
         </w:rPr>
         <w:t>Chondrostoma nasus</w:t>
       </w:r>
       <w:r>
         <w:rPr>
-          <w:i w:val="0"/>
-        </w:rPr>
-        <w:t xml:space="preserve"> and the South-west European nase, or toxostome, </w:t>
+          <w:color w:val="1F4E79"/>
+        </w:rPr>
+        <w:t xml:space="preserve">; </w:t>
       </w:r>
       <w:r>
         <w:rPr>
           <w:i/>
+          <w:color w:val="1F4E79"/>
         </w:rPr>
         <w:t>Parachondrostoma toxostoma</w:t>
       </w:r>
       <w:r>
         <w:rPr>
-          <w:i w:val="0"/>
-        </w:rPr>
-        <w:t xml:space="preserve"> offer that combination. The toxostome is endemic to southern France, where it is declining and is a species of conservation concern; the nase originates from central Europe and entered the Rhône basin following the construction of navigable connections across Europe during the last century [26], so that the two distributions have partially overlapped for about a hundred years. Hybridisation has been detected in the patchily distributed sympatric areas of the basin, with an incidence unrelated to habitat characteristics [27–29] — the configuration of a mosaic hybrid zone [30]. Guivier et al. [31] characterised the microbiota of four tissue compartments of the two species in strict parapatry on a single river, and found the tissue compartment to be the first factor of variation, with a marked contrast between externally and internally exposed tissues and with proportions of species-specific taxa that were asymmetric between compartments: the nase carried many specific taxa on its external tissues, the toxostome in its intestine. On that basis the authors proposed that introgressive hybridisation might affect the microbiota differently depending on the tissue considered, and closed by announcing the exploration of hybrid microbiota rearrangement, which their sample of sixteen fish at two stations could not support. The present study is that exploration, on 180 fish sampled at nine stations over six watercourses of the Rhône drainage in two years, with host ancestry resolved by genotyping across 25 chromosomes rather than by morphology, and with the same four compartments — caudal fin, gill, midgut and hindgut — characterised in each individual.</w:t>
-      </w:r>
-    </w:p>
-    <w:p>
-      <w:pPr/>
-      <w:r>
-        <w:rPr>
-          <w:i w:val="0"/>
-        </w:rPr>
-        <w:t>We ask whether the microbiota of individuals of mixed ancestry is intermediate between the two parental species, dominated by one of them, or displaced outside their range, and whether the answer is the same in all four compartments. Three points of design are stated at the outset rather than introduced with the results. First, because genotyping across 25 chromosomes separates an intermediate genome from a near-parental genome introgressed on one or a few chromosomes — a single one in 17 of the 22 such individuals —, what counts as a hybrid is a decision and not a given: the contrast is therefore run twice, on intermediate genomes alone and on the wider set including introgressed near-parental individuals, with both passes declared in advance, and the displacement of the result between them measures the contribution of the introgressed individuals, a random-removal control separating that contribution from the accompanying change in sample size. Second, the comparison is reported both as a category contrast in a model spanning all stations — the only admissible form given the low heritability expected from Grieneisen et al. [9] — and, as a complementary characterisation, as the four-dimensional index of Camper et al. [14], whose core threshold and taxonomic rank are fixed a priori and whose sensitivity is reported, since on a natural hybrid system these choices move the index more than sample size or sequencing depth do. Third, genotypic category is entangled with the spatial axis in this design, station being by far the strongest correlate of composition, and field processing order propagated to plate position, whose effect on composition is real; results on category are consequently reported bracketed between the two sequential orderings rather than as a single decomposition, without plate position in the principal models and with it as a covariate in a sensitivity analysis, and read as patterns co-varying with station and with category rather than as effects of ancestry alone. Two stations of the same river, 25 km apart and separated by a weir passable only downstream, were sampled in two successive years and provide an internal reference in which the two parental species occupy separate stations of one river: C. nasus with two intermediate hybrids at one (14 individuals), P. toxostoma alone at the other (19). Following Guivier et al. [31], we expect any hybrid signal to be most pronounced in the digestive compartments, where the two parental species diverge most, rather than uniformly across the four tissues.</w:t>
-      </w:r>
-    </w:p>
-    <w:p>
-      <w:pPr/>
-      <w:r>
-        <w:rPr>
-          <w:i/>
-          <w:color w:val="888888"/>
-          <w:sz w:val="18"/>
-        </w:rPr>
-        <w:t>[Introduction — reste ouvert (note réduite le 2026-10-05 ; points réglés retirés : structure Animal Microbiome, description du 4H au §8.11, effectifs des quasi-purs, corrections Small 2019 et Sevellec 2019 propagées dans la .bib). (i) Titre provisoire (sous-titre du supplément, JF 2026-10-03) ; titre définitif en fin d'écriture. (ii) Wang et al. 2015 [11] et Sevellec et al. 2014 [6] viennent de la liste du manuscrit d'origine et n'ont pas été relus en texte intégral : vérifier leur pertinence là où ils sont cités.]</w:t>
+          <w:color w:val="1F4E79"/>
+        </w:rPr>
+        <w:t>; transgressive segregation; 4H index; tissue compartment</w:t>
       </w:r>
     </w:p>
     <w:p>
@@ -275,6 +170,125 @@
       </w:pPr>
       <w:r>
         <w:rPr>
+          <w:color w:val="1F4E79"/>
+        </w:rPr>
+        <w:t>Background</w:t>
+      </w:r>
+    </w:p>
+    <w:p>
+      <w:pPr/>
+      <w:r>
+        <w:rPr>
+          <w:color w:val="1F4E79"/>
+        </w:rPr>
+        <w:t>Animals and their microbial communities form composite biological units in which microbial composition contributes to host performance and to tolerance of environmental constraints [1]. These associations are established largely by the sorting of environmental microbial pools according to host ecology and physiology — feeding behaviour and the immune pathways underlying tolerance of or resistance to microbes [2–4]. Environmental acquisition is particularly important in fish, which live in a medium favourable to bacterial growth, are continuously exposed to microbes at their epithelial barriers and are mostly oviparous, with limited maternal effects compared with mammals [5]; surveys of wild populations accordingly report a predominant environmental component of variation in bacterial composition [6–8]. Host genotype is nonetheless not without effect. In wild baboons followed over fourteen years, microbiome phenotypes were almost universally heritable, but with a typically low, context-dependent heritability that only large samples can quantify [9]; in stickleback, a host genetic influence on the gut microbiome became measurable once biological and technical components of variance had been decomposed [10]. Any effect of host ancestry on the fish microbiota is therefore expected to be small relative to the environmental one, and detecting it requires large samples and explicit control of the spatial and technical axes along which it could be mimicked.</w:t>
+      </w:r>
+    </w:p>
+    <w:p>
+      <w:pPr/>
+      <w:r>
+        <w:rPr>
+          <w:color w:val="1F4E79"/>
+        </w:rPr>
+        <w:t>Secondary contact zones make host ancestry a naturally occurring and naturally replicated variable. Introgressive hybridisation may disrupt co-adapted gene complexes and thereby alter close host–microbe interactions [11]; conversely, hybridisation is a source of genomic diversity and adaptive novelty [12, 13], which may extend to the microbiota through the acquisition of new microbial taxa. Three outcomes are usually contrasted: an intermediate microbiota, varying monotonically with ancestry; dominance, in which hybrids resemble one parental species; and a transgressive microbiota, lying outside the range of both parents. Camper et al. [14] formalised this comparison for host-associated microbiomes with four idealised models of taxon membership — Union, Intersection, Gain and Loss — whose relative weights sum to one; the Gain–Loss axis gives an operational definition of a transgressive microbiota that does not presuppose a cost to the host. The distinction matters: on an ecologically successful hybrid lizard, widespread transgressive segregation was correlated with a restructuring of niche, and the authors argue that the equation of transgression with dysbiosis rests disproportionately on hybrids of low adaptive value [15]. Following the framework's own statement of scope, we read the index as describing a pattern and not a process.</w:t>
+      </w:r>
+    </w:p>
+    <w:p>
+      <w:pPr/>
+      <w:r>
+        <w:rPr>
+          <w:color w:val="1F4E79"/>
+        </w:rPr>
+        <w:t xml:space="preserve">What is known of hybrid microbiota in fish comes almost entirely from controlled crosses: genotype corresponds closely to intestinal characteristics in reciprocal hybrids of bream and culter, whose parents have contrasting feeding habits [16]; host hybridisation outweighs cohabitation in intrageneric </w:t>
+      </w:r>
+      <w:r>
+        <w:rPr>
+          <w:i/>
+          <w:color w:val="1F4E79"/>
+        </w:rPr>
+        <w:t>Takifugu</w:t>
+      </w:r>
+      <w:r>
+        <w:rPr>
+          <w:color w:val="1F4E79"/>
+        </w:rPr>
+        <w:t xml:space="preserve"> hybrids [17]; reciprocal hybrids of koi and goldfish resemble one parent rather than the midpoint of the two [18]; and whitefish species pairs and their hybrids have been compared in natural and controlled environments [19] (reviewed in [20]). Studies of natural hybrid zones in other vertebrates do not converge. Host ancestry predominates in </w:t>
+      </w:r>
+      <w:r>
+        <w:rPr>
+          <w:i/>
+          <w:color w:val="1F4E79"/>
+        </w:rPr>
+        <w:t>Neotoma</w:t>
+      </w:r>
+      <w:r>
+        <w:rPr>
+          <w:color w:val="1F4E79"/>
+        </w:rPr>
+        <w:t xml:space="preserve"> woodrats, where habitat determines diet but genotype determines the gut microbiota [21], and in hybridising brown lemurs [22]; site soil properties rather than genetic ancestry explain the gut microbiota of baboons spanning a hybrid zone [23], and an apparent effect of admixture in wild house mice becomes weak once spatial autocorrelation is taken into account [24]. In hybridising chickadees moved to a common environment, the change of environment affected richness but not composition, while an effect of ancestry on composition was not supported [25] — an argument for reporting alpha and beta diversity separately. No study yet combines a natural hybrid zone in fish, host ancestry quantified by genotyping rather than assigned by cross class, and several tissue compartments characterised in the same individual.</w:t>
+      </w:r>
+    </w:p>
+    <w:p>
+      <w:pPr/>
+      <w:r>
+        <w:rPr>
+          <w:color w:val="1F4E79"/>
+        </w:rPr>
+        <w:t xml:space="preserve">The nase </w:t>
+      </w:r>
+      <w:r>
+        <w:rPr>
+          <w:i/>
+          <w:color w:val="1F4E79"/>
+        </w:rPr>
+        <w:t>Chondrostoma nasus</w:t>
+      </w:r>
+      <w:r>
+        <w:rPr>
+          <w:color w:val="1F4E79"/>
+        </w:rPr>
+        <w:t xml:space="preserve"> and the South-west European nase, or toxostome, </w:t>
+      </w:r>
+      <w:r>
+        <w:rPr>
+          <w:i/>
+          <w:color w:val="1F4E79"/>
+        </w:rPr>
+        <w:t>Parachondrostoma toxostoma</w:t>
+      </w:r>
+      <w:r>
+        <w:rPr>
+          <w:color w:val="1F4E79"/>
+        </w:rPr>
+        <w:t xml:space="preserve"> offer that combination. The toxostome is endemic to southern France, where it is declining and is a species of conservation concern; the nase, native to central Europe, entered the Rhône basin through navigable connections built across Europe during the last century [26], so that the two distributions have partially overlapped for about a hundred years. Hybridisation occurs in the patchily distributed sympatric areas of the basin, with an incidence unrelated to habitat characteristics [27–29] — the configuration of a mosaic hybrid zone [30]. Guivier et al. [31] characterised four tissue compartments of the two species in strict parapatry on a single river: the tissue compartment was the first factor of variation, externally and internally exposed tissues contrasted markedly, and species-specific taxa were asymmetric between compartments, numerous on the external tissues of the nase and in the intestine of the toxostome. They proposed that introgressive hybridisation might affect the microbiota differently depending on the tissue, a question their sixteen fish at two stations could not address. The present study addresses it on 180 fish sampled at nine stations over six watercourses of the Rhône drainage in two years, with host ancestry resolved by genotyping across 25 chromosomes and the same four compartments — caudal fin, gill, midgut and hindgut — characterised in each individual.</w:t>
+      </w:r>
+    </w:p>
+    <w:p>
+      <w:pPr/>
+      <w:r>
+        <w:rPr>
+          <w:color w:val="1F4E79"/>
+        </w:rPr>
+        <w:t>We ask whether the microbiota of individuals of mixed ancestry is intermediate between the two parental species, dominated by one of them or displaced outside their range, and whether the answer is the same in all four compartments. Three features of the design shape how the answer is reported. First, genotyping separates intermediate genomes from near-parental genomes introgressed on one or a few chromosomes, so that what counts as a hybrid is a decision: every contrast is run on intermediate hybrids alone and on all hybrids, both passes being declared in advance. Second, the comparison is reported both as a category contrast across stations and as the four-dimensional (4H) index of Camper et al. [14], whose settings are fixed a priori and whose sensitivity is reported. Third, genotypic category is entangled with station, the strongest correlate of composition, and with plate position, which followed field processing order; category effects are therefore bracketed between the two sequential orderings, with plate position as a covariate in a sensitivity analysis, and read as patterns co-varying with station and category rather than as effects of ancestry alone. Following Guivier et al. [31], we expect any hybrid signal to be most pronounced in the digestive compartments, where the two parental species diverge most.</w:t>
+      </w:r>
+    </w:p>
+    <w:p>
+      <w:pPr/>
+      <w:r>
+        <w:rPr>
+          <w:i/>
+          <w:color w:val="888888"/>
+          <w:sz w:val="18"/>
+        </w:rPr>
+        <w:t>[Introduction — reste ouvert (note réduite le 2026-10-05 ; points réglés retirés : structure Animal Microbiome, description du 4H au §8.11, effectifs des quasi-purs, corrections Small 2019 et Sevellec 2019 propagées dans la .bib). (i) Titre provisoire (sous-titre du supplément, JF 2026-10-03) ; titre définitif en fin d'écriture. (ii) Wang et al. 2015 [11] et Sevellec et al. 2014 [6] viennent de la liste du manuscrit d'origine et n'ont pas été relus en texte intégral : vérifier leur pertinence là où ils sont cités.]</w:t>
+      </w:r>
+    </w:p>
+    <w:p>
+      <w:pPr>
+        <w:pStyle w:val="Title"/>
+      </w:pPr>
+      <w:r>
+        <w:rPr>
           <w:i w:val="0"/>
           <w:color w:val="1F4E79"/>
         </w:rPr>
@@ -302,21 +316,35 @@
     <w:p>
       <w:r>
         <w:rPr>
-          <w:b w:val="0"/>
-          <w:i w:val="0"/>
-        </w:rPr>
-      </w:r>
-      <w:r>
-        <w:rPr>
-          <w:i w:val="0"/>
-          <w:color w:val="1F4E79"/>
-        </w:rPr>
-      </w:r>
-      <w:r>
-        <w:rPr>
-          <w:i w:val="0"/>
-        </w:rPr>
-        <w:t>We studied the host-associated bacterial microbiota of two interbreeding cyprinid fishes, the nase Chondrostoma nasus (code Cn) and the toxostome Parachondrostoma toxostoma (code Pt), together with their hybrids (code Hy), in their contact zone. Fish were sampled at nine stations of the Rhône drainage (rivers Durance, Suran, Buech, Beaume and Ardèche, and one canal fed by the Largue; south-eastern France) over two years (2014 and 2015), spanning a gradient of hybrid-zone context (allopatry, sympatry with hybridisation, and asymmetric introgression). Two of the nine stations lie on the Suran, 25.4 km apart and separated by a barrier passable only downstream; they are treated as distinct stations throughout because they carry different taxa.</w:t>
+          <w:color w:val="1F4E79"/>
+        </w:rPr>
+        <w:t xml:space="preserve">We studied the host-associated bacterial microbiota of two interbreeding cyprinid fishes, the nase </w:t>
+      </w:r>
+      <w:r>
+        <w:rPr>
+          <w:i/>
+          <w:color w:val="1F4E79"/>
+        </w:rPr>
+        <w:t>Chondrostoma nasus</w:t>
+      </w:r>
+      <w:r>
+        <w:rPr>
+          <w:color w:val="1F4E79"/>
+        </w:rPr>
+        <w:t xml:space="preserve"> (code Cn) and the toxostome </w:t>
+      </w:r>
+      <w:r>
+        <w:rPr>
+          <w:i/>
+          <w:color w:val="1F4E79"/>
+        </w:rPr>
+        <w:t>Parachondrostoma toxostoma</w:t>
+      </w:r>
+      <w:r>
+        <w:rPr>
+          <w:color w:val="1F4E79"/>
+        </w:rPr>
+        <w:t xml:space="preserve"> (code Pt), and of their hybrids (code Hy), in their contact zone. Fish were sampled at nine stations of the Rhône drainage (rivers Durance, Suran, Buech, Beaume and Ardèche, and one canal fed by the Largue; south-eastern France) in 2014 and 2015, spanning a gradient of hybrid-zone context (allopatry, sympatry with hybridisation, asymmetric introgression). Two stations lie on the Suran, 25.4 km apart and separated by a barrier passable only downstream; they are treated as distinct because they carry different taxa.</w:t>
       </w:r>
     </w:p>
     <w:p>
@@ -354,99 +382,19 @@
       </w:r>
     </w:p>
     <w:p>
-      <w:r/>
-      <w:r>
-        <w:rPr>
-          <w:i w:val="0"/>
-          <w:color w:val="1F4E79"/>
-        </w:rPr>
-        <w:t>Stations, rivers, WGS84 coordinates, collection dates, years of sampling, genotypic composition and the number of individuals and libraries per station are given in Supplementary Table S</w:t>
-      </w:r>
-      <w:r>
-        <w:rPr>
-          <w:i w:val="0"/>
-          <w:color w:val="1F4E79"/>
-        </w:rPr>
-        <w:t>1</w:t>
-      </w:r>
-      <w:r>
-        <w:rPr>
-          <w:i w:val="0"/>
-          <w:color w:val="1F4E79"/>
-        </w:rPr>
-        <w:t>. Coordinates and collection dates are field records supplied by the collecting team; an earlier version of this dataset carried coordinates extrapolated from commune names, which have been replaced (see the note to Table S</w:t>
-      </w:r>
-      <w:r>
-        <w:rPr>
-          <w:i w:val="0"/>
-          <w:color w:val="1F4E79"/>
-        </w:rPr>
-        <w:t>1</w:t>
-      </w:r>
-      <w:r>
-        <w:rPr>
-          <w:i w:val="0"/>
-          <w:color w:val="1F4E79"/>
-        </w:rPr>
-        <w:t>).</w:t>
+      <w:r>
+        <w:rPr>
+          <w:color w:val="1F4E79"/>
+        </w:rPr>
+        <w:t>Stations, coordinates, collection dates, genotypic composition and the numbers of individuals and libraries per station are given in Supplementary Table S1; coordinates and dates are field records supplied by the collecting team (see the note to Table S1). Individuals are counted per site code and year of sampling, which gives 180 individuals (156 if years are collapsed, because individual numbering restarts each year).</w:t>
       </w:r>
     </w:p>
     <w:p>
-      <w:pPr/>
-      <w:r>
-        <w:rPr>
-          <w:i w:val="0"/>
-        </w:rPr>
-      </w:r>
-      <w:r>
-        <w:rPr>
-          <w:i w:val="0"/>
-          <w:color w:val="1F4E79"/>
-        </w:rPr>
-        <w:t>Individuals are counted per site code and year of sampling, since the same station sampled in two years contributes distinct individuals to the design. Counting this way gives 180 individuals; collapsing years gives 156, because individual numbering restarts each year and identical numbers at one site are then merged. The two figures describe the same fish: 180 is the count used in the analyses, 156 the count obtained if the year is ignored.</w:t>
-      </w:r>
-    </w:p>
-    <w:p>
-      <w:r>
-        <w:rPr>
-          <w:b w:val="0"/>
-          <w:i/>
-        </w:rPr>
-      </w:r>
-      <w:r>
-        <w:rPr>
-          <w:i w:val="0"/>
-          <w:color w:val="1F4E79"/>
-        </w:rPr>
-        <w:t>Species identity was resolved by genotyping rather than by morphology. Each individual was assigned, from a chromosome-level assignment across 25 chromosomes, to one of three categories — Cn (59 individuals), Hy (42) and Pt (79) — and not by thresholding a median hybrid index, because a substantial minority of hybrids carry an extreme median index and their inter-chromosome discordance is what identifies them. Of the 180 individuals, 175 were genotyped from Q-scores on liver tissue.</w:t>
-      </w:r>
-      <w:r>
-        <w:rPr>
-          <w:i w:val="0"/>
-          <w:color w:val="1F4E79"/>
-        </w:rPr>
-        <w:t xml:space="preserve"> Individual genotypes, with the tissue on which each was obtained, are given in Supplementary Table S</w:t>
-      </w:r>
-      <w:r>
-        <w:rPr>
-          <w:i w:val="0"/>
-          <w:color w:val="1F4E79"/>
-        </w:rPr>
-        <w:t>2</w:t>
-      </w:r>
-      <w:r>
-        <w:rPr>
-          <w:i w:val="0"/>
-          <w:color w:val="1F4E79"/>
-        </w:rPr>
-        <w:t>.</w:t>
-      </w:r>
-      <w:r>
-        <w:rPr>
-          <w:i w:val="0"/>
-          <w:color w:val="1F4E79"/>
-        </w:rPr>
-        <w:t xml:space="preserve"> The remaining five, all assigned to a parental category, were resolved by other routes: three from Q-score fits on midgut and caudal fin, which agreed in assigning them to P. toxostoma, and two from an earlier and closely related method that left no Q-score record, so that no median index and no inter-chromosome discordance are reported for the latter two. The Hy category comprises two genome types: 20 intermediate genomes, and 22 near-parental genomes, introgressed on a single chromosome in 17 cases, on two in four and on six in one. What counts as a hybrid is therefore a decision, and every analysis of category is run twice, both passes being declared in advance: pass 1 retains the 20 intermediate hybrids and excludes the 22 near-parental individuals, which are not reassigned to a parental category (158 individuals); pass 2 retains all 42 (180 individuals). Nine of the 49 individuals previously identified on morphology were reclassified. Three stations carry all three categories — 74 individuals in pass 2 and 65 in pass 1, where Saint-Just-d'Ardèche retains a single hybrid — which is the subset in which the hybrid contrast can be tested within a station.</w:t>
+      <w:r>
+        <w:rPr>
+          <w:color w:val="1F4E79"/>
+        </w:rPr>
+        <w:t>Species identity was resolved by genotyping rather than by morphology. Each individual was assigned, from a chromosome-level assignment across 25 chromosomes, to one of three categories — Cn (59 individuals), Hy (42) and Pt (79) — and not by thresholding a median hybrid index, because a substantial minority of hybrids carry an extreme median index and are identified by their inter-chromosome discordance. Genotypes were obtained from Q-scores on liver tissue for 175 individuals; of the remaining five, all parental, three were resolved from Q-score fits on midgut and caudal fin and two by an earlier, closely related method that left no Q-score record (Supplementary Table S2). Nine of the 49 individuals previously identified on morphology were reclassified. The Hy category comprises 20 intermediate genomes and 22 near-parental genomes, introgressed on a single chromosome in 17 cases, on two in four and on six in one. Every analysis of category is therefore run twice, both passes being declared in advance: pass 1 retains the 20 intermediate hybrids and excludes the 22 near-parental individuals, which are not reassigned to a parental category (158 individuals); pass 2 retains all 42 (180 individuals). Three stations carry all three categories — 74 individuals in pass 2 and 65 in pass 1, where Saint-Just-d'Ardèche retains a single hybrid — the subset in which the hybrid contrast can be tested within a station.</w:t>
       </w:r>
     </w:p>
     <w:p>
@@ -502,55 +450,17 @@
     <w:p>
       <w:r>
         <w:rPr>
-          <w:b w:val="0"/>
-          <w:i w:val="0"/>
-        </w:rPr>
-        <w:t xml:space="preserve">Bacterial DNA was extracted from each tissue with the Qiagen Food Mericon kit (Qiagen, Venlo, Netherlands), following a slightly modified protocol detailed in </w:t>
-      </w:r>
-      <w:r>
-        <w:rPr>
-          <w:b w:val="0"/>
-          <w:i w:val="0"/>
-          <w:color w:val="1F4E79"/>
-        </w:rPr>
-        <w:t>Guivier et al. [31]</w:t>
-      </w:r>
-      <w:r>
-        <w:rPr>
-          <w:b w:val="0"/>
-          <w:i w:val="0"/>
-        </w:rPr>
-        <w:t>. A 251 bp fragment of the V4 region of the bacterial 16S rRNA gene was amplified using the dual-index method of Kozich et al. [32], with forward and reverse primers carrying an 8 bp index and Illumina adapters (Caporaso primers 515F GTGCCAGCMGCCGCGGTAA / 806R GGACTACHVGGGTWTCTAAT). DNA amplification, purification and pooling of PCR products followed Galan et al. [33]. The final library was quantified with the Kapa quantification kit (Kapa Biosystems) and loaded on an Illumina MiSeq flow cell with reagent kit v3 (600 cycles), run as 2 × 251 bp paired-end reads with two 8 bp index reads (518 of the 600 cycles).</w:t>
+          <w:color w:val="1F4E79"/>
+        </w:rPr>
+        <w:t>Bacterial DNA was extracted from each tissue with the Qiagen Food Mericon kit (Qiagen, Venlo, Netherlands), following a slightly modified protocol detailed in Guivier et al. [31]. A 251 bp fragment of the V4 region of the bacterial 16S rRNA gene was amplified with the dual-index method of Kozich et al. [32], with primers 515F GTGCCAGCMGCCGCGGTAA and 806R GGACTACHVGGGTWTCTAAT carrying an 8 bp index and Illumina adapters; amplification, purification and pooling followed Galan et al. [33]. Libraries were quantified with the Kapa quantification kit (Kapa Biosystems) and sequenced on an Illumina MiSeq with reagent kit v3 (2 × 251 bp paired-end reads, two 8 bp index reads) and a 10 % PhiX spike-in, on 10 July (durance1), 5 October (durance2) and 3 November 2017 (durance3).</w:t>
       </w:r>
     </w:p>
     <w:p>
       <w:r>
         <w:rPr>
-          <w:b w:val="0"/>
-          <w:i w:val="0"/>
-        </w:rPr>
-        <w:t>For the present study the 768 samples were processed through two independent library preparations, each using the one-step dual-index PCR of Kozich et al. [32], in which the indices are incorporated during amplification. The first amplicon library was sequenced once (run durance1); the second, prepared from an independent PCR of the same samples, was sequenced twice on separate flow cells (runs durance2 and durance3). The same plate layout and the same set of 768 index combinations were used for both preparations, but the assignment of index pairs to wells differs between them: relative to durance1, the i7 index differs for 384 of the 768 libraries and the i5 index for 576, whereas durance2 and durance3 carry identical index pairs throughout (Supplementary Data, Index assignment). A distinct index assignment is a direct consequence of the one-step protocol, in which re-indexing an existing amplicon pool is not possible. Each biological sample is therefore represented three times, but with a nested rather than a flat replication structure: two levels of library preparation, and two sequencing runs within the second library. This design separates the variability contributed by library preparation from that contributed by sequencing alone, and neither is confounded with any biological factor.</w:t>
-      </w:r>
-    </w:p>
-    <w:p>
-      <w:r>
-        <w:rPr>
-          <w:i w:val="0"/>
-          <w:color w:val="1F4E79"/>
-        </w:rPr>
-        <w:t>Libraries were sequenced on an Illumina MiSeq on 10 July 2017 (durance1), 5 October 2017 (durance2) and 3 November 2017 (durance3), with a 10 % PhiX spike-in. PCR conditions, purification and pooling followed Galan et al. [33].</w:t>
-      </w:r>
-      <w:r>
-        <w:t xml:space="preserve"> Run labels, flow cells, dates and the mapping of runs to library preparations are given in Supplementary Table S</w:t>
-      </w:r>
-      <w:r>
-        <w:rPr>
-          <w:color w:val="1F4E79"/>
-        </w:rPr>
-        <w:t>3</w:t>
-      </w:r>
-      <w:r>
-        <w:t>.</w:t>
+          <w:color w:val="1F4E79"/>
+        </w:rPr>
+        <w:t>The 768 samples were processed through two independent library preparations, each by the one-step dual-index PCR of Kozich et al. [32]. The first library was sequenced once (run durance1); the second, prepared from an independent PCR of the same samples, was sequenced twice on separate flow cells (durance2 and durance3). Because indices are incorporated during amplification, the two preparations carry different index assignments on the same plate layout (Supplementary Table S3). Each biological sample is thus represented three times in a nested structure — two library preparations, and two sequencing runs within the second — which separates the variability contributed by library preparation from that contributed by sequencing alone, neither being confounded with any biological factor; the structure was verified on the deposited data (Supplementary Note S1).</w:t>
       </w:r>
     </w:p>
     <w:p>
@@ -564,31 +474,9 @@
     <w:p>
       <w:r>
         <w:rPr>
-          <w:b w:val="0"/>
-          <w:i w:val="0"/>
-        </w:rPr>
-        <w:t>Negative controls comprised extraction blanks and no-template PCR controls; the original sequencing project of this laboratory reports the same two categories (four extraction negative controls and eight amplification negative controls). In the Durance dataset we verified four extraction blanks — one per tissue (Blanc-Caudal, Blanc-Branchie, Blanc-Midgut, Blanc-Hindgut) — and eight no-template PCR controls (T-1 to T-8), each sequenced in all three runs, i.e. 12 and 24 control samples respectively (36 negative controls in total). Two aliquots of a commercial mock community — the ZymoBIOMICS Microbial Community Standard (Zymo Research, Irvine, CA, USA), a defined mixture of eight known bacterial taxa — were processed alongside the samples as positive controls (6 mock samples across runs). In addition, 25 empty wells received no library and were sequenced in all three runs — 75 empty-well samples — to monitor index hopping between libraries.</w:t>
-      </w:r>
-    </w:p>
-    <w:p>
-      <w:r>
-        <w:rPr>
-          <w:i w:val="0"/>
-          <w:color w:val="1F4E79"/>
-        </w:rPr>
-        <w:t>The mock community was the ZymoBIOMICS Microbial Community Standard (Zymo Research, cat. D6300).</w:t>
-      </w:r>
-      <w:r>
-        <w:t xml:space="preserve"> The number of biological samples, controls and empty wells actually deposited is given in Supplementary Table S</w:t>
-      </w:r>
-      <w:r>
-        <w:rPr>
-          <w:color w:val="1F4E79"/>
-        </w:rPr>
-        <w:t>4</w:t>
-      </w:r>
-      <w:r>
-        <w:t>.</w:t>
+          <w:color w:val="1F4E79"/>
+        </w:rPr>
+        <w:t>Negative controls comprised four extraction blanks, one per tissue, and eight no-template PCR controls, each sequenced in all three runs (36 negative-control samples). Two aliquots of the ZymoBIOMICS Microbial Community Standard (Zymo Research, cat. D6300), a defined mixture of eight bacterial taxa, served as positive controls (six mock samples across runs), and 25 empty wells that received no library were sequenced in all three runs (75 samples) to monitor index hopping. The biological samples, controls and empty wells deposited are listed in Supplementary Table S4.</w:t>
       </w:r>
     </w:p>
     <w:p>
@@ -596,61 +484,67 @@
         <w:pStyle w:val="Heading1"/>
       </w:pPr>
       <w:r>
-        <w:t>5. Sequence processing overview</w:t>
+        <w:t>5. Sequence processing</w:t>
       </w:r>
     </w:p>
     <w:p>
       <w:r>
         <w:rPr>
-          <w:b w:val="0"/>
-          <w:i w:val="0"/>
-        </w:rPr>
-        <w:t xml:space="preserve">Reads were processed with a custom, version-controlled pipeline (git-tracked; each parameter justified in the script headers). The three runs were processed separately through denoising and merged thereafter. Software versions: </w:t>
-      </w:r>
-      <w:r>
-        <w:rPr>
-          <w:b w:val="0"/>
-          <w:i w:val="0"/>
-          <w:color w:val="1F4E79"/>
-        </w:rPr>
-        <w:t>cutadapt 5.0 [34];</w:t>
-      </w:r>
-      <w:r>
-        <w:rPr>
-          <w:b w:val="0"/>
-          <w:i w:val="0"/>
-        </w:rPr>
-        <w:t xml:space="preserve"> R 4.5.3 with </w:t>
-      </w:r>
-      <w:r>
-        <w:rPr>
-          <w:b w:val="0"/>
-          <w:i w:val="0"/>
-          <w:color w:val="1F4E79"/>
-        </w:rPr>
-        <w:t>DADA2 1.38.0 [35];</w:t>
-      </w:r>
-      <w:r>
-        <w:rPr>
-          <w:b w:val="0"/>
-          <w:i w:val="0"/>
-        </w:rPr>
-        <w:t xml:space="preserve"> </w:t>
-      </w:r>
-      <w:r>
-        <w:rPr>
-          <w:b w:val="0"/>
-          <w:i w:val="0"/>
-          <w:color w:val="1F4E79"/>
-        </w:rPr>
-        <w:t>SILVA reference v138.2 [36]</w:t>
-      </w:r>
-      <w:r>
-        <w:rPr>
-          <w:b w:val="0"/>
-          <w:i w:val="0"/>
-        </w:rPr>
-        <w:t xml:space="preserve"> (DADA2 formatted, Zenodo 14169026); BLAST+ 2.13.0; FastQC and MultiQC for quality control. The 16S V4 primers, being also the sequencing primers (Schloss dual-index protocol), are not present in the reads; no 5′ primer trimming was therefore applied.</w:t>
+          <w:color w:val="1F4E79"/>
+        </w:rPr>
+        <w:t xml:space="preserve">Reads were processed with a version-controlled pipeline (cutadapt 5.0 [34]; R 4.5.3 with DADA2 1.38.0 [35]; SILVA v138.2 [36]; BLAST+ 2.13.0; FastQC and MultiQC), each run being processed separately through denoising. The 16S V4 primers co-amplify the host mitochondrial 12S rRNA gene </w:t>
+      </w:r>
+      <w:r>
+        <w:rPr>
+          <w:color w:val="1F4E79"/>
+        </w:rPr>
+        <w:t>(host 12S and primer dimers: 14–15 % of reads per run; median 12 % per biological sample, range 0–99 %)</w:t>
+      </w:r>
+      <w:r>
+        <w:rPr>
+          <w:color w:val="1F4E79"/>
+        </w:rPr>
+        <w:t>; because the host amplicon (~190 bp) is shorter than the bacterial one (~253 bp), host reads were removed by length with cutadapt. Amplicon sequence variants (ASVs) were inferred per run with DADA2 after quality filtering and truncation, with error models learned per run; the three sequence tables were merged keeping runs distinct, chimeras were removed (consensus method) and taxonomy was assigned against SILVA with the naïve Bayesian classifier and exact species matching. ASVs assigned to Eukaryota, Chloroplast or Mitochondria, or unassigned at the domain level, were removed. Parameters and their justification are given in Supplementary Note S2.</w:t>
+      </w:r>
+    </w:p>
+    <w:p>
+      <w:pPr>
+        <w:pStyle w:val="Heading1"/>
+      </w:pPr>
+      <w:r>
+        <w:t>6. Resulting dataset</w:t>
+      </w:r>
+    </w:p>
+    <w:p>
+      <w:r>
+        <w:rPr>
+          <w:color w:val="1F4E79"/>
+        </w:rPr>
+        <w:t>Processing yielded 44,349 ASVs across 2,295 of the 2,304 expected samples (nine were empty after filtering: eight controls and one biological sample present in the two other runs). ASV length peaked sharply at 251 bp, with no residual 12S.</w:t>
+      </w:r>
+    </w:p>
+    <w:p>
+      <w:pPr>
+        <w:pStyle w:val="Heading1"/>
+      </w:pPr>
+      <w:r>
+        <w:t>7. Positive-control validation with the mock community</w:t>
+      </w:r>
+    </w:p>
+    <w:p>
+      <w:r>
+        <w:rPr>
+          <w:color w:val="1F4E79"/>
+        </w:rPr>
+        <w:t>The six mock samples (two aliquots × three runs) validated ASV inference: all recovered the eight expected species, the eight dominant ASVs matched the ZymoBIOMICS reference at 100 % identity over 251 bp, confidently matching reads (BLASTn, ≥99 % identity over ≥240 aligned bp) represented ~100 % of reads in every mock, and no spurious ASV exceeded 1 % (reference strain set and lot in Supplementary Note S2).</w:t>
+      </w:r>
+    </w:p>
+    <w:p>
+      <w:pPr>
+        <w:pStyle w:val="Heading1"/>
+      </w:pPr>
+      <w:r>
+        <w:t>8. Downstream ecological analysis</w:t>
       </w:r>
     </w:p>
     <w:p>
@@ -658,16 +552,20 @@
         <w:pStyle w:val="Heading2"/>
       </w:pPr>
       <w:r>
-        <w:t>5.1 Quality control</w:t>
+        <w:rPr>
+          <w:b w:val="0"/>
+          <w:i w:val="0"/>
+        </w:rPr>
+        <w:t>8.1 Decontamination</w:t>
       </w:r>
     </w:p>
     <w:p>
-      <w:r>
-        <w:rPr>
-          <w:b w:val="0"/>
-          <w:i w:val="0"/>
-        </w:rPr>
-        <w:t>Per-run read quality was assessed with FastQC and aggregated with MultiQC.</w:t>
+      <w:pPr/>
+      <w:r>
+        <w:rPr>
+          <w:color w:val="1F4E79"/>
+        </w:rPr>
+        <w:t>Contaminants were identified with decontam v1.30.0 [37] by the prevalence method against the 36 negative controls, batches being defined by sequencing run; DNA concentrations, required by the frequency method, were not available. The default threshold of 0.1 flagged 66 ASVs (0.15 % of ASVs) while retaining 99.76 % of reads, the flagged taxa being typical reagent contaminants; a threshold of 0.5 removed 1.89 points more reads, including ASVs carrying biological signal, and was rejected (Supplementary Note S2).</w:t>
       </w:r>
     </w:p>
     <w:p>
@@ -675,31 +573,20 @@
         <w:pStyle w:val="Heading2"/>
       </w:pPr>
       <w:r>
-        <w:t>5.2 Removal of co-amplified host 12S rRNA</w:t>
+        <w:rPr>
+          <w:b w:val="0"/>
+          <w:i w:val="0"/>
+        </w:rPr>
+        <w:t>8.2 Index-hopping assessment</w:t>
       </w:r>
     </w:p>
     <w:p>
-      <w:r>
-        <w:rPr>
-          <w:b w:val="0"/>
-          <w:i w:val="0"/>
-        </w:rPr>
-        <w:t xml:space="preserve">The 16S V4 primers co-amplify the host mitochondrial 12S rRNA gene </w:t>
-      </w:r>
-      <w:r>
-        <w:rPr>
-          <w:b w:val="0"/>
-          <w:i w:val="0"/>
-          <w:color w:val="1F4E79"/>
-        </w:rPr>
-        <w:t>(host 12S and primer dimers: 14–15 % of reads per run; median 12 % per biological sample, range 0–99 %)</w:t>
-      </w:r>
-      <w:r>
-        <w:rPr>
-          <w:b w:val="0"/>
-          <w:i w:val="0"/>
-        </w:rPr>
-        <w:t>. Because the host 12S amplicon (~190 bp) is shorter than the bacterial V4 amplicon (~253 bp), host reads were removed upstream by length with cutadapt 5.0: the reverse complements of 806R and 515F were sought at the 3′ end of R1 and R2 respectively (options -a/-A, error rate -e 0.1, minimum overlap -O 10), and read pairs shorter than 240 bp after trimming (--minimum-length 240) were discarded. In a genuine ~253 bp V4 amplicon the opposite primer is never reached within a 251 bp read, so the read stays near full length and is retained; shorter host 12S reads are trimmed below threshold and removed. Discarded reads were kept separately (--too-short-output) as an exploitable host signal.</w:t>
+      <w:pPr/>
+      <w:r>
+        <w:rPr>
+          <w:color w:val="1F4E79"/>
+        </w:rPr>
+        <w:t>Index hopping was quantified on the 75 empty-well samples, in which any read represents leakage: they accumulated 41 reads out of 26.8 million (0.0002 %; median 0 reads per well, maximum 13), and no background subtraction was applied.</w:t>
       </w:r>
     </w:p>
     <w:p>
@@ -707,16 +594,20 @@
         <w:pStyle w:val="Heading2"/>
       </w:pPr>
       <w:r>
-        <w:t>5.3 ASV inference (DADA2, per run)</w:t>
+        <w:rPr>
+          <w:b w:val="0"/>
+          <w:i w:val="0"/>
+        </w:rPr>
+        <w:t>8.3 Mock-derived sample-level artefacts</w:t>
       </w:r>
     </w:p>
     <w:p>
-      <w:r>
-        <w:rPr>
-          <w:b w:val="0"/>
-          <w:i w:val="0"/>
-        </w:rPr>
-        <w:t>Amplicon sequence variants (ASVs) were inferred with DADA2 1.38.0, independently for each run. Reads were quality-filtered and truncated with filterAndTrim (truncLen = 230 for R1 and 190 for R2; maxN = 0; maxEE = c(2, 2); truncQ = 2; rm.phix = TRUE), preserving a large (~167 bp) overlap for the ~253 bp V4 insert with 2×251 bp reads. Error models were learned separately per run (learnErrors), reflecting three distinct MiSeq runs, and reads were denoised (dada) and merged (mergePairs) into per-run sequence tables (makeSequenceTable).</w:t>
+      <w:pPr/>
+      <w:r>
+        <w:rPr>
+          <w:color w:val="1F4E79"/>
+        </w:rPr>
+        <w:t>The ten ASVs matching the mock reference strains were used as exogenous tracers. Two nominal individuals, each a single caudal-fin sample dominated by mock ASVs (70 % and 99 % of reads) and placed in the wells and index series of the mock controls, were mislabelled mock wells and were excluded. Nine further individuals carried mock ASVs at 20–65 % in a single well-tissue combination, their other tissues being unaffected, consistent with well-level contamination (Supplementary Note S2). Mock ASVs were removed from all samples, and ASVs left with zero counts were discarded.</w:t>
       </w:r>
     </w:p>
     <w:p>
@@ -724,16 +615,21 @@
         <w:pStyle w:val="Heading2"/>
       </w:pPr>
       <w:r>
-        <w:t>5.4 Table merging, chimera removal and taxonomy</w:t>
+        <w:rPr>
+          <w:b w:val="0"/>
+          <w:i w:val="0"/>
+        </w:rPr>
+        <w:t>8.4 Analysis dataset</w:t>
       </w:r>
     </w:p>
     <w:p>
+      <w:pPr/>
       <w:r>
         <w:rPr>
           <w:b w:val="0"/>
           <w:i w:val="0"/>
         </w:rPr>
-        <w:t>The three per-run sequence tables were combined with mergeSequenceTables, keeping the runs of each library distinct (samples suffixed by run, e.g. __durance1) so that the run effect remains estimable. Chimeras were removed from the merged table with removeBimeraDenovo (method = "consensus"). Taxonomy was assigned against SILVA v138.2 with the naïve Bayesian classifier (assignTaxonomy, tryRC = TRUE) and species-level exact matching (addSpecies). assignTaxonomy replicates the reference per thread and required 256 GB RAM.</w:t>
+        <w:t>After decontamination and removal of mock-derived artefacts, the analysis table comprised 44,200 ASVs across 2,180 biological samples (26.1 million reads). Median sequencing depth was 10,129 reads per sample.</w:t>
       </w:r>
     </w:p>
     <w:p>
@@ -741,16 +637,383 @@
         <w:pStyle w:val="Heading2"/>
       </w:pPr>
       <w:r>
-        <w:t>5.5 Non-target filtering</w:t>
+        <w:rPr>
+          <w:b w:val="0"/>
+          <w:i w:val="0"/>
+        </w:rPr>
+        <w:t>8.5 Phylogenetic tree</w:t>
       </w:r>
     </w:p>
     <w:p>
+      <w:pPr/>
+      <w:r>
+        <w:rPr>
+          <w:color w:val="1F4E79"/>
+        </w:rPr>
+        <w:t>A de novo phylogeny of the ASVs was built with QIIME 2 [38] (MAFFT alignment [39], masking of highly variable positions, FastTree 2 [40], midpoint rooting), de novo alignment being appropriate for near-complete V4 amplicons; it supports UniFrac distances [41] and Faith's phylogenetic diversity [42].</w:t>
+      </w:r>
+    </w:p>
+    <w:p>
+      <w:pPr>
+        <w:pStyle w:val="Heading2"/>
+      </w:pPr>
       <w:r>
         <w:rPr>
           <w:b w:val="0"/>
           <w:i w:val="0"/>
         </w:rPr>
-        <w:t>ASVs assigned to Eukaryota or unassigned at the domain level, to Chloroplast (Order) or to Mitochondria (Family) were removed; the mitochondrial ASVs correspond to residual full-length host 12S captured by the taxonomic safety net.</w:t>
+        <w:t>8.6 Normalization of sequencing effort</w:t>
+      </w:r>
+    </w:p>
+    <w:p>
+      <w:pPr/>
+      <w:r>
+        <w:rPr>
+          <w:color w:val="1F4E79"/>
+        </w:rPr>
+        <w:t>Sequencing effort was equalised by rarefaction [43]. A depth of 3,000 reads was chosen on three criteria: richness plateaued below it in rarefaction curves; it retained 81.8 % of samples (1,784/2,180), against 72.6 % at 5,000 reads; and retention was balanced across sequencing runs (80.2–83.5 % per run), so that depth is not confounded with batch.</w:t>
+      </w:r>
+    </w:p>
+    <w:p>
+      <w:pPr/>
+      <w:r>
+        <w:rPr>
+          <w:color w:val="1F4E79"/>
+        </w:rPr>
+        <w:t>Rarefaction was repeated rather than drawn once [44], and metrics rather than count tables were averaged, since averaging tables would inflate observed richness above what 3,000 reads can support: alpha indices over 1,000 rarefactions, Bray–Curtis and Jaccard matrices over 400, and unweighted UniFrac, weighted normalized UniFrac and Faith's phylogenetic diversity over 400 draws run as two independent chains. Monte-Carlo error, measured between independent chains, was negligible relative to the technical and biological dissimilarities (Supplementary Table S5; details in Supplementary Note S2).</w:t>
+      </w:r>
+    </w:p>
+    <w:p>
+      <w:pPr/>
+      <w:r>
+        <w:rPr>
+          <w:color w:val="1F4E79"/>
+        </w:rPr>
+        <w:t xml:space="preserve">Because the threshold also decides which samples enter, the two effects were separated. On the samples retained at 3,000 reads, matrices recomputed at 500 reads were nearly invariant for the abundance-weighted metrics (weighted UniFrac r = 0.9994, Bray-Curtis r = 0.9985) but not for the presence-based ones (Jaccard r = 0.9617, unweighted UniFrac r = 0.9373), observed richness falling by 42 %. Retention at 3,000 reads is not random with respect to category: </w:t>
+      </w:r>
+      <w:r>
+        <w:rPr>
+          <w:color w:val="1F4E79"/>
+        </w:rPr>
+        <w:t>in the caudal fin, in sequencing run durance1, 50 % of intermediate hybrids</w:t>
+      </w:r>
+      <w:r>
+        <w:rPr>
+          <w:color w:val="1F4E79"/>
+        </w:rPr>
+        <w:t xml:space="preserve"> passed the threshold against 86 % of </w:t>
+      </w:r>
+      <w:r>
+        <w:rPr>
+          <w:i/>
+          <w:color w:val="1F4E79"/>
+        </w:rPr>
+        <w:t>P. toxostoma</w:t>
+      </w:r>
+      <w:r>
+        <w:rPr>
+          <w:color w:val="1F4E79"/>
+        </w:rPr>
+        <w:t xml:space="preserve"> (pass 1), and 67 % of all 42 hybrids (pass 2), a gap of 36 and 20 points respectively. Claims resting on abundance-weighted metrics are therefore accompanied by a sensitivity analysis at 500 reads, where the caudal-fin gap falls to 3.8 points (pass 1) and 5.7 points (pass 2) and 2,067 samples are retained (1,825 in pass 1); claims resting on presence-based metrics are reported at 3,000 reads with the selection declared, the midgut gap (14.0 and 8.9 points) persisting at 500 reads in any case (Supplementary Table S6 and Figure S1).</w:t>
+      </w:r>
+      <w:r>
+        <w:rPr>
+          <w:i/>
+          <w:color w:val="888888"/>
+          <w:sz w:val="18"/>
+        </w:rPr>
+        <w:t xml:space="preserve"> [Écarts de rétention : valeurs du run durance1 (scripts/43-retention_profondeur.py, results/depth_agreement/retention_par_categorie.tsv, 2026-10-05) ; aucun script ne les produisait auparavant. Sur les trois runs : caudale à 3 000 lectures 29,0–36,4 points (passe 1) et 14,7–19,8 (passe 2) ; à 500 lectures 2,6–3,8 et 3,4–5,7 ; midgut à 500 lectures 5,7–14,0 et 7,8–8,9 (runs confondus : 32,3 / 17,2 ; 3,4 / 4,5 ; 8,5 / 8,2). Le midgut de la passe 1 dépend du run (14,0 dans durance1, 5,7 dans les deux autres). Rapporter la valeur d'un run ou l'étendue : à trancher par JF.]</w:t>
+      </w:r>
+    </w:p>
+    <w:p>
+      <w:pPr>
+        <w:pStyle w:val="Heading2"/>
+      </w:pPr>
+      <w:r>
+        <w:rPr>
+          <w:color w:val="1F4E79"/>
+        </w:rPr>
+        <w:t>8.7 Statistical framework</w:t>
+      </w:r>
+    </w:p>
+    <w:p>
+      <w:pPr/>
+      <w:r>
+        <w:rPr>
+          <w:color w:val="1F4E79"/>
+        </w:rPr>
+        <w:t>Community composition was analysed by PERMANOVA [45] on the averaged dissimilarity matrices, stratified by tissue, a stratification imposed by the design: 168 of the 180 fish occupy the same plate column across all four tissues, so that plate position is not estimable in a pooled model carrying fish identity. Station, not site code, is the spatial unit, since two site codes each span two Suran stations that share no genotypic category; sequencing run is nested within library preparation (§8.8), and every analysis of category is run in the two passes of §1. Because genotypic category, station and plate position are mutually entangled (Results), each model is fitted in both sequential orderings and the interval between them is reported, the ordering that serves category first bounding it from above and the ordering that serves it last from below. Plate column is not entered in the principal models, but every model testing category is refitted with it as a covariate and reported as a sensitivity analysis. Permutations are constrained within station blocks where the question concerns a within-station contrast. Dispersion was tested with PERMDISP [46], since the transgressive hypothesis concerns the variability of hybrid microbiota and PERMANOVA is itself sensitive to heterogeneous dispersion; distances to group medians were corrected for small-sample bias (bias.adjust = TRUE [48]), hybrids being the smallest category in every stratum. Both analyses were run with vegan 2.7-5 [47]. Four dissimilarities — Bray–Curtis, Jaccard, unweighted and weighted UniFrac — and four alpha indices — observed richness, Shannon, inverse Simpson and Faith's phylogenetic diversity — are reported per tissue. Because resequencing one library recovers only 48 % of the ASVs present at 1–3 reads (Results), a result is stated as established only where at least one abundance-weighted and one presence-based metric support it, and is otherwise reported as metric-dependent with the supporting metrics named; the rule is applied metric by metric, since Bray–Curtis patterns with the two presence-based dissimilarities whereas weighted UniFrac stands apart. Running text quotes Shannon and Bray–Curtis, the remaining metrics being reported alongside.</w:t>
+      </w:r>
+      <w:r>
+        <w:rPr>
+          <w:i/>
+          <w:color w:val="888888"/>
+          <w:sz w:val="18"/>
+        </w:rPr>
+      </w:r>
+      <w:r>
+        <w:rPr>
+          <w:i/>
+          <w:color w:val="888888"/>
+          <w:sz w:val="18"/>
+        </w:rPr>
+        <w:t xml:space="preserve"> [Phrase retirée au resserrement du 2026-10-05 : « The choice of a differential-abundance method remains to be fixed. » Aucune analyse d'abondance différentielle n'est rapportée ; à trancher par JF.]</w:t>
+      </w:r>
+    </w:p>
+    <w:p>
+      <w:pPr>
+        <w:pStyle w:val="Heading2"/>
+      </w:pPr>
+      <w:r>
+        <w:rPr>
+          <w:i w:val="0"/>
+          <w:color w:val="1F4E79"/>
+        </w:rPr>
+        <w:t>8.8 Technical replication structure</w:t>
+      </w:r>
+    </w:p>
+    <w:p>
+      <w:pPr/>
+      <w:r>
+        <w:rPr>
+          <w:color w:val="1F4E79"/>
+        </w:rPr>
+        <w:t>Technical replication was assessed in two ways. Each pair of runs was compared within sample after rarefaction to a common depth, on the 548 samples reaching 3,000 reads in all three runs, so that detection probability is identical by construction; Bray–Curtis and Jaccard dissimilarities and the recapture of rare ASVs (1–3 reads) were contrasted between the pair of runs sharing a library and the two library-crossing pairs with paired Wilcoxon tests. The variance attributable to library preparation and to sequencing run was then estimated by PERMANOVA on Bray–Curtis distances over the 1,784 rarefied samples, with the technical terms entered first so that they absorb the maximum variance a sequential decomposition can assign them, followed by tissue and fish identity.</w:t>
+      </w:r>
+    </w:p>
+    <w:p>
+      <w:pPr>
+        <w:pStyle w:val="Heading2"/>
+      </w:pPr>
+      <w:r>
+        <w:rPr>
+          <w:i w:val="0"/>
+          <w:color w:val="1F4E79"/>
+        </w:rPr>
+        <w:t>8.9 Plate position</w:t>
+      </w:r>
+      <w:r>
+        <w:rPr>
+          <w:i w:val="0"/>
+        </w:rPr>
+      </w:r>
+    </w:p>
+    <w:p>
+      <w:pPr/>
+      <w:r/>
+      <w:r>
+        <w:rPr>
+          <w:b w:val="0"/>
+          <w:i w:val="0"/>
+        </w:rPr>
+      </w:r>
+      <w:r>
+        <w:rPr>
+          <w:b w:val="0"/>
+          <w:i w:val="0"/>
+          <w:color w:val="1F4E79"/>
+        </w:rPr>
+        <w:t xml:space="preserve">Individuals were numbered in the field in sampling order, which is not random with respect to genotype: the more fragile nases were processed first, except at one station (Saint-Just-d'Ardèche), </w:t>
+      </w:r>
+      <w:r>
+        <w:rPr>
+          <w:b w:val="0"/>
+          <w:i w:val="0"/>
+          <w:color w:val="1F4E79"/>
+        </w:rPr>
+        <w:t>and plates were loaded in processing order within every fishing campaign (Spearman ρ between individual number and plate column within campaigns, 0.55–0.95)</w:t>
+      </w:r>
+      <w:r>
+        <w:rPr>
+          <w:b w:val="0"/>
+          <w:i w:val="0"/>
+          <w:color w:val="1F4E79"/>
+        </w:rPr>
+        <w:t>. Genotypic category and plate column are accordingly strongly associated (Cramér's V = 0.53 in pass 1 and 0.48 in pass 2, computed on individuals). Whether plate position affects composition was therefore tested rather than assumed. Rarefaction equalises depth, so a test on read depth would not have answered the question; PERMANOVA was run on composition, stratified by tissue, with permutations constrained within station blocks so that a detected column effect cannot be a station effect, and with each sequencing run analysed separately, plate position being identical across runs.</w:t>
+      </w:r>
+    </w:p>
+    <w:p>
+      <w:pPr>
+        <w:pStyle w:val="Heading2"/>
+      </w:pPr>
+      <w:r>
+        <w:rPr>
+          <w:color w:val="1F4E79"/>
+        </w:rPr>
+        <w:t>8.10 Alpha diversity</w:t>
+      </w:r>
+    </w:p>
+    <w:p>
+      <w:pPr/>
+      <w:r>
+        <w:rPr>
+          <w:color w:val="1F4E79"/>
+        </w:rPr>
+        <w:t xml:space="preserve">Alpha diversity was summarised per individual and tissue as the mean over the three runs of the four rarefied indices, analysed on the log scale. First, external (caudal fin, gill) and internal (midgut, hindgut) compartments, and midgut and hindgut, were contrasted within individual by paired t-tests on log values, with Wilcoxon signed-rank tests alongside, and expressed as ratios of geometric means with 95 % confidence intervals. Second, the variance of log alpha diversity over the 1,784 rarefied samples was partitioned by a linear model with tissue, site-year, individual, library preparation and sequencing run, reporting sequential and marginal shares. Third, genotypic category was tested per tissue and pass by ordinary least squares, log(index) ~ station + category, with an F test of the category term and the contrasts hybrid − </w:t>
+      </w:r>
+      <w:r>
+        <w:rPr>
+          <w:i/>
+          <w:color w:val="1F4E79"/>
+        </w:rPr>
+        <w:t>C. nasus</w:t>
+      </w:r>
+      <w:r>
+        <w:rPr>
+          <w:color w:val="1F4E79"/>
+        </w:rPr>
+        <w:t xml:space="preserve">, hybrid − </w:t>
+      </w:r>
+      <w:r>
+        <w:rPr>
+          <w:i/>
+          <w:color w:val="1F4E79"/>
+        </w:rPr>
+        <w:t>P. toxostoma</w:t>
+      </w:r>
+      <w:r>
+        <w:rPr>
+          <w:color w:val="1F4E79"/>
+        </w:rPr>
+        <w:t xml:space="preserve"> and hybrid − parental midpoint with 95 % confidence intervals; plate position was added as a covariate in a sensitivity model. Hybrids were classified as intermediate when their estimate lay between the two parental estimates and did not differ from their midpoint; as dominant when their interval included one parent and excluded the other; as transgressive when their estimate lay beyond the parental range with an interval excluding the nearer parent; and as undetermined when no criterion or more than one was met. This rule, and the controls of §8.12, were declared before computation.</w:t>
+      </w:r>
+    </w:p>
+    <w:p>
+      <w:pPr>
+        <w:pStyle w:val="Heading2"/>
+      </w:pPr>
+      <w:r>
+        <w:rPr>
+          <w:color w:val="1F4E79"/>
+        </w:rPr>
+        <w:t>8.11 Four-dimensional (4H) index</w:t>
+      </w:r>
+    </w:p>
+    <w:p>
+      <w:pPr/>
+      <w:r>
+        <w:rPr>
+          <w:color w:val="1F4E79"/>
+        </w:rPr>
+        <w:t xml:space="preserve">The 4H index [14] was computed with the R package HybridMicrobiomes 0.1.1 [49] and phyloseq [50] on three host classes — </w:t>
+      </w:r>
+      <w:r>
+        <w:rPr>
+          <w:i/>
+          <w:color w:val="1F4E79"/>
+        </w:rPr>
+        <w:t>C. nasus</w:t>
+      </w:r>
+      <w:r>
+        <w:rPr>
+          <w:color w:val="1F4E79"/>
+        </w:rPr>
+        <w:t xml:space="preserve">, hybrids and </w:t>
+      </w:r>
+      <w:r>
+        <w:rPr>
+          <w:i/>
+          <w:color w:val="1F4E79"/>
+        </w:rPr>
+        <w:t>P. toxostoma</w:t>
+      </w:r>
+      <w:r>
+        <w:rPr>
+          <w:color w:val="1F4E79"/>
+        </w:rPr>
+        <w:t xml:space="preserve"> — in each pass, tissue and sequencing run. Its parameters and reading rules were fixed in a document committed before any index was computed: core fraction ρ = 0.5 at genus rank, with sensitivity at ρ = 0.3 and 0.7 and at family rank, and no abundance threshold (ϑ = ε = 0); ρ ≥ 0.8 was excluded because the Intersection dimension vanishes there on the published natural hybrid system. Counts were aggregated to genus — 48.6 % of ASVs, carrying 64.1 % of reads, were assigned to a genus (family: 77.9 % and 90.6 %) — and unassigned ASVs were excluded. Samples carrying at least 1,000 genus-assigned reads (1,749 of the 1,784 rarefied samples) were rarefied to that depth at each of 500 bootstraps; on the published natural hybrid system the parental axis </w:t>
+      </w:r>
+      <w:r>
+        <w:rPr>
+          <w:color w:val="1F4E79"/>
+        </w:rPr>
+        <w:t>varies by at most 0.066 between 1,000 and 10,000 reads [14]</w:t>
+      </w:r>
+      <w:r>
+        <w:rPr>
+          <w:color w:val="1F4E79"/>
+        </w:rPr>
+        <w:t>. Each bootstrap drew without replacement the same number of hosts N from each class, N being one less than the smallest class of pass 1 in the stratum (9 in the caudal fin, 10–19 elsewhere), and the same N was applied to pass 2; pass 2 was also computed at its own N. The abundance-based version of the index, the pre-analysis of core fractions, the null plane and a null hybrid averaging one randomly drawn individual of each parental species were computed with the same settings. An axis — parental (Union + Intersection) or transgressive (Gain + Loss) — was called dominant when it exceeded 0.5 in all three runs, and robust when the same axis also dominated at ρ = 0.3, at ρ = 0.7, at family rank and in the abundance-based version; two compartments were called different when the 95 % bootstrap intervals of the transgressive axis were disjoint in all three runs. The PERMANOVA comparison of bootstrap sets offered by the package was not used, because its p-value decreases with the arbitrarily chosen number of bootstraps. Preferential retention of the taxa shared by both parents was inferred when more than 95 % of bootstraps lay on the Intersection side of the null plane in all three runs.</w:t>
+      </w:r>
+      <w:r>
+        <w:rPr>
+          <w:i/>
+          <w:color w:val="888888"/>
+          <w:sz w:val="18"/>
+        </w:rPr>
+        <w:t xml:space="preserve"> [0,066 : Camper et al. 2024, Supporting Information, Table S.4.1 (lézard Aspidoscelis, version Jaccard, axe parental 0,4183 → 0,4847) ; 0,045 en version Bray-Curtis (Table S.4.2). L'ancienne valeur 0,067 était mal arrondie. Exclusion de ρ ≥ 0,8 vérifiée : Intersection = 0 à ρ = 0,8 dans les Tables S.2.1 et S.2.2 (0,015 et 0,010 à ρ = 0,7). Vérifié le 2026-10-05.]</w:t>
+      </w:r>
+    </w:p>
+    <w:p>
+      <w:pPr>
+        <w:pStyle w:val="Heading2"/>
+      </w:pPr>
+      <w:r>
+        <w:rPr>
+          <w:color w:val="1F4E79"/>
+        </w:rPr>
+        <w:t>8.12 Pre-declared controls</w:t>
+      </w:r>
+    </w:p>
+    <w:p>
+      <w:pPr/>
+      <w:r>
+        <w:rPr>
+          <w:color w:val="1F4E79"/>
+        </w:rPr>
+        <w:t xml:space="preserve">Four further controls were declared, with their reading rules, in a document committed before computation, and their verdicts were applied by script. (i) Whether the attenuation of the caudal-fin signal at 500 reads reflects depth or the sample set: the 500-read matrices were restricted to the samples retained at 3,000 reads. (ii) Whether near-parental hybrids dilute the caudal-fin contrast: 19 </w:t>
+      </w:r>
+      <w:r>
+        <w:rPr>
+          <w:i/>
+          <w:color w:val="1F4E79"/>
+        </w:rPr>
+        <w:t>P. toxostoma</w:t>
+      </w:r>
+      <w:r>
+        <w:rPr>
+          <w:color w:val="1F4E79"/>
+        </w:rPr>
+        <w:t xml:space="preserve"> and 3 </w:t>
+      </w:r>
+      <w:r>
+        <w:rPr>
+          <w:i/>
+          <w:color w:val="1F4E79"/>
+        </w:rPr>
+        <w:t>C. nasus</w:t>
+      </w:r>
+      <w:r>
+        <w:rPr>
+          <w:color w:val="1F4E79"/>
+        </w:rPr>
+        <w:t xml:space="preserve"> drawn from the stations of the near-parental individuals were relabelled as hybrids in pass 1 (20 draws), and near-parental hybrids of </w:t>
+      </w:r>
+      <w:r>
+        <w:rPr>
+          <w:i/>
+          <w:color w:val="1F4E79"/>
+        </w:rPr>
+        <w:t>P. toxostoma</w:t>
+      </w:r>
+      <w:r>
+        <w:rPr>
+          <w:color w:val="1F4E79"/>
+        </w:rPr>
+        <w:t xml:space="preserve"> background were compared directly with pure </w:t>
+      </w:r>
+      <w:r>
+        <w:rPr>
+          <w:i/>
+          <w:color w:val="1F4E79"/>
+        </w:rPr>
+        <w:t>P. toxostoma</w:t>
+      </w:r>
+      <w:r>
+        <w:rPr>
+          <w:color w:val="1F4E79"/>
+        </w:rPr>
+        <w:t xml:space="preserve"> and with intermediate hybrids. (iii) The classification of hybrid alpha diversity described in §8.10. (iv) Whether plate column and processing order can be separated, by the Spearman correlation between individual number and plate column within each fishing campaign.</w:t>
       </w:r>
     </w:p>
     <w:p>
@@ -758,7 +1021,7 @@
         <w:pStyle w:val="Heading1"/>
       </w:pPr>
       <w:r>
-        <w:t>6. Resulting dataset</w:t>
+        <w:t>9. Reproducibility and data availability</w:t>
       </w:r>
     </w:p>
     <w:p>
@@ -767,7 +1030,64 @@
           <w:b w:val="0"/>
           <w:i w:val="0"/>
         </w:rPr>
-        <w:t>Processing yielded a filtered ASV table of 44,349 ASVs across 2,295 samples (of 2,304 expected; nine empty after filtering: eight controls and one biological sample present in the two other runs). Median read-pair merging was 93–94% and ~98% of reads were retained after chimera removal; ASV length peaked sharply at 251 bp with no residual 12S. The ASV table is joined to the sample metadata (taxon, tissue, site, year, length, weight, sex) by a composite key of the form {sample}__{run}.</w:t>
+        <w:t>All processing steps are scripted, version-controlled with git and logged (runs.log), with parameter choices justified in the script headers; metadata corrections are traced by explicit flags rather than applied silently.</w:t>
+      </w:r>
+      <w:r>
+        <w:rPr>
+          <w:b w:val="0"/>
+          <w:i w:val="0"/>
+          <w:color w:val="1F4E79"/>
+        </w:rPr>
+        <w:t xml:space="preserve"> The code is publicly available at https://github.com/martinjfsupagro/microbiome-hybrid.</w:t>
+      </w:r>
+    </w:p>
+    <w:p>
+      <w:r>
+        <w:rPr>
+          <w:color w:val="1F4E79"/>
+        </w:rPr>
+        <w:t>Raw sequence data have been deposited in the European Nucleotide Archive (ENA) under accession PRJEB124417: 768 samples and 2,304 sequencing runs (4,608 FASTQ files, 11.7 GB), with run titles encoding the nested replication structure of §8.8, sample metadata following the GSC MIxS host-associated checklist (ERC000013), and controls, mock aliquots and empty wells included and identified as such. Per-run accessions, file names and MD5 checksums are given in Supplementary Table S7.</w:t>
+      </w:r>
+    </w:p>
+    <w:p>
+      <w:r>
+        <w:rPr>
+          <w:color w:val="1F4E79"/>
+        </w:rPr>
+        <w:t>ENA metadata were corrected after the initial deposit to field-record coordinates, exact collection dates and genotype-resolved host identities, without altering any accession, alias or sequence file (Supplementary Note S2); host subject identifiers are reused between years (Supplementary Note S3). Collection dates are given at day resolution for every station except Pertuis, where the two 2014 fishing campaigns are deposited as the interval 2014-07-07/2014-08-20.</w:t>
+      </w:r>
+    </w:p>
+    <w:p>
+      <w:pPr/>
+      <w:r>
+        <w:rPr>
+          <w:i/>
+          <w:color w:val="888888"/>
+          <w:sz w:val="18"/>
+        </w:rPr>
+        <w:t>[Pertuis : les individus sont désormais assignés à leur campagne (série 1011-1014 au 07/07/2014, série 2011-2015 au 20/08/2014 — André, 2026-09-30). La table de correction ena_deposit/ena_corrections_pertuis_dates.tsv est prête (44 échantillons) mais n'est pas encore soumise ; remplacer l'intervalle par les deux dates ici une fois le MODIFY passé.]</w:t>
+      </w:r>
+    </w:p>
+    <w:p>
+      <w:pPr/>
+      <w:r>
+        <w:rPr>
+          <w:i/>
+          <w:color w:val="888888"/>
+          <w:sz w:val="18"/>
+        </w:rPr>
+        <w:t>[À COMPLÉTER : DOI Zenodo de la version utilisée pour l'article, le cas échéant (question 2.7, non tranché). Dépôt GitHub public (JF, 2026-10-03) ; vérifier que le miroir public est à jour au moment de la soumission — le 2026-10-03 il s'arrêtait au commit du 2026-09-25.]</w:t>
+      </w:r>
+    </w:p>
+    <w:p>
+      <w:pPr>
+        <w:pStyle w:val="Title"/>
+      </w:pPr>
+      <w:r>
+        <w:rPr>
+          <w:color w:val="1F4E79"/>
+        </w:rPr>
+        <w:t>Results</w:t>
       </w:r>
     </w:p>
     <w:p>
@@ -775,25 +1095,138 @@
         <w:pStyle w:val="Heading1"/>
       </w:pPr>
       <w:r>
-        <w:t>7. Positive-control validation with the mock community</w:t>
+        <w:rPr>
+          <w:color w:val="1F4E79"/>
+        </w:rPr>
+        <w:t>Genotypic design and its entanglement with station</w:t>
       </w:r>
     </w:p>
     <w:p>
+      <w:pPr/>
+      <w:r>
+        <w:rPr>
+          <w:color w:val="1F4E79"/>
+        </w:rPr>
+        <w:t xml:space="preserve">The 180 fish comprised 59 </w:t>
+      </w:r>
+      <w:r>
+        <w:rPr>
+          <w:i/>
+          <w:color w:val="1F4E79"/>
+        </w:rPr>
+        <w:t>C. nasus</w:t>
+      </w:r>
+      <w:r>
+        <w:rPr>
+          <w:color w:val="1F4E79"/>
+        </w:rPr>
+        <w:t xml:space="preserve">, 42 hybrids and 79 </w:t>
+      </w:r>
+      <w:r>
+        <w:rPr>
+          <w:i/>
+          <w:color w:val="1F4E79"/>
+        </w:rPr>
+        <w:t>P. toxostoma</w:t>
+      </w:r>
+      <w:r>
+        <w:rPr>
+          <w:color w:val="1F4E79"/>
+        </w:rPr>
+        <w:t xml:space="preserve">, unevenly distributed across the nine stations (Fig. 1a). Near-parental hybrids carry a median hybrid index close to that of one parent but an inter-chromosome discordance D of 0.15–0.60, against at most 0.12 in parental individuals (Fig. 1b); categories were assigned from chromosome-level assignments rather than by thresholding either quantity (§1). Of the 22 near-parental hybrids, 19 have a </w:t>
+      </w:r>
+      <w:r>
+        <w:rPr>
+          <w:i/>
+          <w:color w:val="1F4E79"/>
+        </w:rPr>
+        <w:t>P. toxostoma</w:t>
+      </w:r>
+      <w:r>
+        <w:rPr>
+          <w:color w:val="1F4E79"/>
+        </w:rPr>
+        <w:t xml:space="preserve"> background and 3 a </w:t>
+      </w:r>
+      <w:r>
+        <w:rPr>
+          <w:i/>
+          <w:color w:val="1F4E79"/>
+        </w:rPr>
+        <w:t>C. nasus</w:t>
+      </w:r>
+      <w:r>
+        <w:rPr>
+          <w:color w:val="1F4E79"/>
+        </w:rPr>
+        <w:t xml:space="preserve"> background.</w:t>
+      </w:r>
+    </w:p>
+    <w:p>
+      <w:pPr/>
+      <w:r/>
       <w:r>
         <w:rPr>
           <w:b w:val="0"/>
           <w:i w:val="0"/>
         </w:rPr>
-        <w:t>The six mock samples (two aliquots × three runs) were used to validate ASV inference. Mock ASVs were compared by BLASTn (BLAST+ 2.13.0) against a reference of the eight bacterial 16S sequences of the ZymoBIOMICS standard. Because Zymo changed five strains from lot ZRC190633 onward, the earlier strain-set reference (archive ZR160406, corresponding to lots predating the 2019 strain change) was used. A confident match required ≥99% identity over ≥240 aligned bp. For each mock we computed the proportion of confidently Zymo-matching reads, the number of the eight expected species recovered, and the number of spurious ASVs (≥1% of sample reads without a confident hit). All six mocks recovered the eight expected species, with the eight dominant ASVs matching the reference at 100% identity over 251 bp; confidently matching reads represented ~100% of reads in every mock and no spurious ASV exceeded 1%, confirming accurate and clean ASV inference. (Escherichia coli and Salmonella enterica each contributed a second divergent ASV at ~99.6%, consistent with their multiple non-identical 16S operons.)</w:t>
-      </w:r>
-    </w:p>
-    <w:p>
-      <w:r>
-        <w:rPr>
+      </w:r>
+      <w:r>
+        <w:rPr>
+          <w:b w:val="0"/>
           <w:i w:val="0"/>
-          <w:color w:val="C00000"/>
-        </w:rPr>
-        <w:t>Lot numbers were not recorded for the standard used here; however, sequencing was performed in 2017 (July–November), which predates the ZRC190633 lot from which the five strains were changed, so the earlier strain set applies. This choice does not affect the validation: we verified that over the amplified V4 region the 16S sequences of the two reference sets are identical for all eight species — including Enterococcus faecalis and Staphylococcus aureus, whose full-length 16S differ between lots — so the mock ASVs match either reference equally and the recovery of 8/8 expected species is independent of the lot assignment.</w:t>
+          <w:color w:val="1F4E79"/>
+        </w:rPr>
+      </w:r>
+      <w:r>
+        <w:rPr>
+          <w:b w:val="0"/>
+          <w:i w:val="0"/>
+          <w:color w:val="1F4E79"/>
+        </w:rPr>
+      </w:r>
+      <w:r>
+        <w:rPr>
+          <w:b w:val="0"/>
+          <w:i w:val="0"/>
+          <w:color w:val="1F4E79"/>
+        </w:rPr>
+      </w:r>
+      <w:r>
+        <w:rPr>
+          <w:b w:val="0"/>
+          <w:i w:val="0"/>
+        </w:rPr>
+      </w:r>
+      <w:r>
+        <w:rPr>
+          <w:b w:val="0"/>
+          <w:i w:val="0"/>
+        </w:rPr>
+      </w:r>
+      <w:r>
+        <w:rPr>
+          <w:b w:val="0"/>
+          <w:i w:val="0"/>
+          <w:color w:val="1F4E79"/>
+        </w:rPr>
+        <w:t>Genotypic category is entangled with both the spatial and the technical axes, and the entanglement is a property of the design rather than a caveat of presentation. Between stations, category is confounded with station: of nine stations, three carry all three categories (74 individuals in pass 2, 65 in pass 1, where Saint-Just-d'Ardèche retains a single hybrid), the others one or two. Within those three stations, category and plate column are in turn strongly associated, because field numbering followed sampling order (</w:t>
+      </w:r>
+      <w:r>
+        <w:rPr>
+          <w:b w:val="0"/>
+          <w:i w:val="0"/>
+          <w:color w:val="1F4E79"/>
+        </w:rPr>
+        <w:t>§8.9</w:t>
+      </w:r>
+      <w:r>
+        <w:rPr>
+          <w:b w:val="0"/>
+          <w:i w:val="0"/>
+          <w:color w:val="1F4E79"/>
+        </w:rPr>
+        <w:t>). The sub-design in which category and position are fully separable at constant station comprises 31 individuals in pass 1 and 32 in pass 2, too few to carry a principal test. One station, Rosières, carries category and position independently (Cramér's V = 0.18, p = 0.35, in pass 2) and serves as a small clean witness; in pass 1 it retains a single hybrid and cannot witness a category effect.</w:t>
       </w:r>
     </w:p>
     <w:p>
@@ -801,748 +1234,28 @@
         <w:pStyle w:val="Heading1"/>
       </w:pPr>
       <w:r>
-        <w:t>8. Downstream ecological analysis</w:t>
-      </w:r>
-    </w:p>
-    <w:p>
-      <w:pPr>
-        <w:pStyle w:val="Heading2"/>
-      </w:pPr>
-      <w:r>
-        <w:rPr>
-          <w:b w:val="0"/>
-          <w:i w:val="0"/>
-        </w:rPr>
-        <w:t>8.1 Decontamination</w:t>
+        <w:rPr>
+          <w:color w:val="1F4E79"/>
+        </w:rPr>
+        <w:t>Technical variation is small relative to biological variation</w:t>
       </w:r>
     </w:p>
     <w:p>
       <w:pPr/>
       <w:r>
         <w:rPr>
-          <w:b w:val="0"/>
-          <w:i w:val="0"/>
-        </w:rPr>
-        <w:t>Reagent and laboratory contaminants were identified with decontam v1.30.0 [37] using the prevalence method, which contrasts the prevalence of each ASV in true samples against negative controls. DNA concentrations were not available for the Durance libraries, precluding the frequency method. The negative set comprised extraction blanks and PCR (no-template) negative controls, each present in all three sequencing runs (36 control samples in total); mock communities and empty wells were excluded from this step. Batches were defined by sequencing run. Two classification thresholds were compared (0.1, the package default, and 0.5). The default threshold of 0.1 was retained: it flagged 66 ASVs (0.15 % of ASVs) while retaining 99.76 % of reads, and the flagged taxa were taxonomically consistent with common reagent contaminants (Pseudomonadaceae, Moraxellaceae, Micrococcaceae, Propionibacteriaceae, Streptococcaceae). The more aggressive 0.5 threshold removed 2.13 % of reads in total, 1.89 points more than the retained threshold, including ASVs carrying genuine biological signal — most notably a Candidatus Branchiomonas ASV that was prevalent in gill and external tissues and essentially absent from negative controls — and was therefore rejected.</w:t>
-      </w:r>
-    </w:p>
-    <w:p>
-      <w:pPr>
-        <w:pStyle w:val="Heading2"/>
-      </w:pPr>
-      <w:r>
-        <w:rPr>
-          <w:b w:val="0"/>
-          <w:i w:val="0"/>
-        </w:rPr>
-        <w:t>8.2 Index-hopping assessment</w:t>
+          <w:color w:val="1F4E79"/>
+        </w:rPr>
+        <w:t>The two runs sharing a library were markedly more similar to each other (mean Bray–Curtis 0.118, Jaccard 0.445) than either was to the run from the independent library (0.248 and 0.720 respectively; 548 samples reaching 3,000 reads in all three runs, §8.8); the two library-crossing comparisons were statistically indistinguishable from each other (paired Wilcoxon, p = 0.48) and both differed from the within-library comparison (p &lt; 10⁻⁸⁹). Recapture of rare ASVs (1–3 reads) showed the same pattern (0.48 within library vs 0.19 across): library preparation roughly doubles the technical dissimilarity contributed by sequencing alone, with a proportionally larger effect on presence–absence than on relative abundances. Sequencing run was accordingly modelled as nested within library preparation; because each sample is present in every batch, technical and biological factors are crossed rather than confounded, and no batch correction was applied.</w:t>
       </w:r>
     </w:p>
     <w:p>
       <w:pPr/>
       <w:r>
         <w:rPr>
-          <w:b w:val="0"/>
-          <w:i w:val="0"/>
-        </w:rPr>
-        <w:t>Cross-talk between libraries (index hopping) was quantified using the 25 empty wells, which received no library and in which any read therefore represents leakage; across the three runs they give 75 empty-well samples, of which 67 retained at least one read after filtering and 8 none. Across all empty wells these accumulated 41 reads out of 26.8 million (0.0002 %; median 0 reads per well, maximum 13), indicating negligible index hopping. No background-noise subtraction was applied on this basis.</w:t>
-      </w:r>
-    </w:p>
-    <w:p>
-      <w:pPr>
-        <w:pStyle w:val="Heading2"/>
-      </w:pPr>
-      <w:r>
-        <w:rPr>
-          <w:b w:val="0"/>
-          <w:i w:val="0"/>
-        </w:rPr>
-        <w:t>8.3 Mock-derived sample-level artefacts</w:t>
-      </w:r>
-    </w:p>
-    <w:p>
-      <w:pPr/>
-      <w:r>
-        <w:rPr>
-          <w:b w:val="0"/>
-          <w:i w:val="0"/>
-        </w:rPr>
-        <w:t>The ten ASVs matching the ZymoBIOMICS reference strains were used as exogenous tracers to screen biological samples. Two nominal individuals consisted of a single caudal-fin sample dominated by mock ASVs (70 % and 99 % of reads) and were positioned in the wells and index series of the mock controls; they were confirmed as mislabelled mock wells and excluded from the biological dataset. A further nine complete individuals showed mock ASVs at 20–65 % in a single well-tissue combination, with their remaining tissues unaffected, consistent with well-level contamination rather than sample-wide carry-over. The affected wells were mostly external tissues (13 caudal fin, 3 gill) but also included four digestive-tissue wells (3 hindgut, 1 midgut). For these samples the mock ASVs were removed and the remaining, legitimate ASVs retained. Mock ASVs were removed from all samples, and ASVs left with zero counts were discarded.</w:t>
-      </w:r>
-    </w:p>
-    <w:p>
-      <w:pPr>
-        <w:pStyle w:val="Heading2"/>
-      </w:pPr>
-      <w:r>
-        <w:rPr>
-          <w:b w:val="0"/>
-          <w:i w:val="0"/>
-        </w:rPr>
-        <w:t>8.4 Analysis dataset</w:t>
-      </w:r>
-    </w:p>
-    <w:p>
-      <w:pPr/>
-      <w:r>
-        <w:rPr>
-          <w:b w:val="0"/>
-          <w:i w:val="0"/>
-        </w:rPr>
-        <w:t>After decontamination and removal of mock-derived artefacts, the analysis table comprised 44,200 ASVs across 2,180 biological samples (26.1 million reads). Median sequencing depth was 10,129 reads per sample.</w:t>
-      </w:r>
-    </w:p>
-    <w:p>
-      <w:pPr>
-        <w:pStyle w:val="Heading2"/>
-      </w:pPr>
-      <w:r>
-        <w:rPr>
-          <w:b w:val="0"/>
-          <w:i w:val="0"/>
-        </w:rPr>
-        <w:t>8.5 Phylogenetic tree</w:t>
-      </w:r>
-    </w:p>
-    <w:p>
-      <w:pPr/>
-      <w:r>
-        <w:rPr>
-          <w:b w:val="0"/>
-          <w:i w:val="0"/>
-        </w:rPr>
-        <w:t xml:space="preserve">A de novo phylogeny was built from the ASV sequences with </w:t>
-      </w:r>
-      <w:r>
-        <w:rPr>
-          <w:b w:val="0"/>
-          <w:i w:val="0"/>
-          <w:color w:val="1F4E79"/>
-        </w:rPr>
-        <w:t>QIIME 2 [38]</w:t>
-      </w:r>
-      <w:r>
-        <w:rPr>
-          <w:b w:val="0"/>
-          <w:i w:val="0"/>
-        </w:rPr>
-        <w:t xml:space="preserve"> (align-to-tree-mafft-fasttree): multiple alignment with </w:t>
-      </w:r>
-      <w:r>
-        <w:rPr>
-          <w:b w:val="0"/>
-          <w:i w:val="0"/>
-          <w:color w:val="1F4E79"/>
-        </w:rPr>
-        <w:t>MAFFT [39],</w:t>
-      </w:r>
-      <w:r>
-        <w:rPr>
-          <w:b w:val="0"/>
-          <w:i w:val="0"/>
-        </w:rPr>
-        <w:t xml:space="preserve"> masking of highly variable positions, tree inference with </w:t>
-      </w:r>
-      <w:r>
-        <w:rPr>
-          <w:b w:val="0"/>
-          <w:i w:val="0"/>
-          <w:color w:val="1F4E79"/>
-        </w:rPr>
-        <w:t>FastTree 2 [40],</w:t>
-      </w:r>
-      <w:r>
-        <w:rPr>
-          <w:b w:val="0"/>
-          <w:i w:val="0"/>
-        </w:rPr>
-        <w:t xml:space="preserve"> and midpoint rooting. Fragment insertion into a reference backbone (SEPP) was not used because the ASVs are near-complete V4 amplicons (~251 bp) for which de novo alignment is appropriate. The resulting rooted tree covers all ASVs of the analysis table and supports </w:t>
-      </w:r>
-      <w:r>
-        <w:rPr>
-          <w:b w:val="0"/>
-          <w:i w:val="0"/>
-          <w:color w:val="1F4E79"/>
-        </w:rPr>
-        <w:t>UniFrac distances [41] and Faith's phylogenetic diversity [42]</w:t>
-      </w:r>
-      <w:r>
-        <w:rPr>
-          <w:b w:val="0"/>
-          <w:i w:val="0"/>
-        </w:rPr>
-        <w:t>.</w:t>
-      </w:r>
-    </w:p>
-    <w:p>
-      <w:pPr>
-        <w:pStyle w:val="Heading2"/>
-      </w:pPr>
-      <w:r>
-        <w:rPr>
-          <w:b w:val="0"/>
-          <w:i w:val="0"/>
-        </w:rPr>
-        <w:t>8.6 Normalization of sequencing effort</w:t>
-      </w:r>
-    </w:p>
-    <w:p>
-      <w:pPr/>
-      <w:r>
-        <w:rPr>
-          <w:b w:val="0"/>
-          <w:i w:val="0"/>
-        </w:rPr>
-        <w:t>Uneven sequencing effort was controlled by rarefaction, currently the most robust approach for alpha- and beta-diversity metrics [43]. No universal threshold exists; the depth was therefore chosen on the data using three criteria. First, richness plateaued below 3,000 reads in rarefaction curves, so this depth captures the recoverable diversity. Second, a threshold of 3,000 reads retained 81.8 % of samples (1,784/2,180), against 72.6 % at 5,000 reads. Third — and decisively — sample retention at 3,000 reads was balanced across sequencing runs (80.2–83.5 % per run), the main technical batch factor, so rarefaction does not confound depth with batch. A higher threshold was rejected because it increased uneven sample loss across sites and taxa without improving coverage.</w:t>
-      </w:r>
-    </w:p>
-    <w:p>
-      <w:pPr/>
-      <w:r>
-        <w:rPr>
-          <w:i w:val="0"/>
-        </w:rPr>
-        <w:t>Rarefaction was applied repeatedly rather than as a single draw [44]. Alpha-diversity indices (observed richness, Shannon, inverse Simpson) were averaged over 1,000 independent rarefactions, and Bray–Curtis and Jaccard dissimilarity matrices over 400. Metrics were averaged rather than count tables: averaging tables would populate each cell with the union of detections across draws and inflate observed richness above what 3,000 reads can support, reintroducing the very depth dependence that rarefaction removes.</w:t>
-      </w:r>
-    </w:p>
-    <w:p>
-      <w:pPr/>
-      <w:r>
-        <w:rPr>
-          <w:i w:val="0"/>
-        </w:rPr>
-        <w:t xml:space="preserve">Monte-Carlo error was quantified rather than assumed. Because a cumulative mean at N draws and one at 2N share their first N draws and are therefore autocorrelated, convergence was assessed by running two independent chains with disjoint seeds and comparing their means at matched iteration counts, the standard error of a single chain being sd(chain₁ − chain₂)/√2. This error decreased as N^−0.49 (Bray–Curtis) and N^−0.51 (Jaccard), matching the N^−0.5 expected for an average of independent draws. At 100 iterations it stood at 0.04 % of the mean dissimilarity (0.0004 in absolute terms), three orders of magnitude below both the technical (0.118–0.248) and the biological (0.880) dissimilarity scales reported in </w:t>
-      </w:r>
-      <w:r>
-        <w:rPr>
-          <w:i w:val="0"/>
-          <w:color w:val="1F4E79"/>
-        </w:rPr>
-        <w:t>Results</w:t>
-      </w:r>
-      <w:r>
-        <w:rPr>
-          <w:i w:val="0"/>
-        </w:rPr>
-        <w:t>, so 100 iterations would have sufficed for the beta-diversity matrices. Median Monte-Carlo standard deviations for the alpha indices were 0.023 for Shannon (0.8 % of the median value), 2.37 for observed richness (1.9 %) and 0.21 for inverse Simpson (2.5 %); the abundance-weighted indices were thus the more stable, consistent with the limited reproducibility of rare ASVs (</w:t>
-      </w:r>
-      <w:r>
-        <w:rPr>
-          <w:i w:val="0"/>
-          <w:color w:val="1F4E79"/>
-        </w:rPr>
-        <w:t>Results</w:t>
-      </w:r>
-      <w:r>
-        <w:rPr>
-          <w:i w:val="0"/>
-        </w:rPr>
-        <w:t>).</w:t>
-      </w:r>
-      <w:r>
-        <w:rPr>
-          <w:color w:val="1F4E79"/>
-        </w:rPr>
-        <w:t xml:space="preserve"> Convergence values are given in Supplementary Table S</w:t>
-      </w:r>
-      <w:r>
-        <w:rPr>
-          <w:color w:val="1F4E79"/>
-        </w:rPr>
-        <w:t>5</w:t>
-      </w:r>
-      <w:r>
-        <w:rPr>
-          <w:color w:val="1F4E79"/>
-        </w:rPr>
-        <w:t>.</w:t>
-      </w:r>
-    </w:p>
-    <w:p>
-      <w:pPr/>
-      <w:r>
-        <w:rPr>
-          <w:i w:val="0"/>
-        </w:rPr>
-        <w:t>Note that an averaged dissimilarity matrix is not guaranteed to satisfy the triangle inequality. This does not affect PERMANOVA or principal coordinates analysis, both of which accept semi-metrics, but the averaged matrices were not used in any method requiring a true metric.</w:t>
-      </w:r>
-    </w:p>
-    <w:p>
-      <w:pPr/>
-      <w:r>
-        <w:rPr>
-          <w:i w:val="0"/>
-        </w:rPr>
-      </w:r>
-      <w:r>
-        <w:rPr>
-          <w:b w:val="0"/>
-          <w:i w:val="0"/>
-          <w:color w:val="1F4E79"/>
-        </w:rPr>
-        <w:t>Phylogenetic metrics were computed on the same draws as the taxonomic ones. Unweighted UniFrac, weighted normalized UniFrac and Faith's phylogenetic diversity were averaged over 400 rarefactions at 3,000 reads, run as two independent chains of 200 with disjoint seeds so that Monte-Carlo error could be measured rather than assumed: relative standard error ranged from 0.04 % (Shannon) to 0.18 % (inverse Simpson), with between-chain correlations of at least 0.99987 on every metric. Convergence established on Bray-Curtis was not assumed to transfer to UniFrac. As a control that could have failed, the three taxonomic alpha indices were recomputed on these draws and compared with the earlier, independently drawn series: agreement was r &gt; 0.999997 with mean relative deviations of 0.04-0.15 %.</w:t>
-      </w:r>
-    </w:p>
-    <w:p>
-      <w:pPr/>
-      <w:r>
-        <w:rPr>
-          <w:i w:val="0"/>
-        </w:rPr>
-      </w:r>
-      <w:r>
-        <w:rPr>
-          <w:b w:val="0"/>
-          <w:i w:val="0"/>
-          <w:color w:val="1F4E79"/>
-        </w:rPr>
-        <w:t xml:space="preserve">Because the rarefaction threshold both equalises depth and decides which samples enter, the second of these effects was quantified separately. On a fixed set of samples - those retained at 3,000 reads, so that only depth varies - dissimilarity matrices recomputed at 500 to 2,000 reads were compared with the 3,000-read reference. The two abundance-weighted metrics proved essentially invariant down to 500 reads (weighted UniFrac r = 0.9994, Bray-Curtis r = 0.9985), whereas the two presence-based metrics degraded (Jaccard r = 0.9617, unweighted UniFrac r = 0.9373) and observed richness fell by 42 %, confirming that the loss is driven by rare taxa rather than by a general low-depth artefact. Sample retention at 3,000 reads is not random with respect to the variable of interest: </w:t>
-      </w:r>
-      <w:r>
-        <w:rPr>
-          <w:b w:val="0"/>
-          <w:i w:val="0"/>
-          <w:color w:val="1F4E79"/>
-        </w:rPr>
-        <w:t>in the caudal fin, in sequencing run durance1, 50 % of intermediate hybrids</w:t>
-      </w:r>
-      <w:r>
-        <w:rPr>
-          <w:b w:val="0"/>
-          <w:i w:val="0"/>
-          <w:color w:val="1F4E79"/>
-        </w:rPr>
-        <w:t xml:space="preserve"> passed the threshold against 86 % of P. toxostoma (pass 1), and 67 % of all 42 hybrids (pass 2), a gap of 36 and 20 points respectively, reaching 48 and 36 points at one of the three stations carrying the full genotypic gradient. No threshold removes this selection without the corresponding loss of richness. Claims resting on abundance-weighted metrics are therefore accompanied by a sensitivity analysis at 500 reads, where the caudal-fin gap falls to 3.8 points (pass 1) and 5.7 points (pass 2) and 2,067 samples are retained (1,825 in pass 1); claims resting on presence-based metrics are reported at 3,000 reads with the selection declared, since they cannot be tested at 500 and the midgut gap (14.0 and 8.9 points) persists there in any case. Supplementary Table S</w:t>
-      </w:r>
-      <w:r>
-        <w:rPr>
-          <w:b w:val="0"/>
-          <w:i w:val="0"/>
-          <w:color w:val="1F4E79"/>
-        </w:rPr>
-        <w:t>6</w:t>
-      </w:r>
-      <w:r>
-        <w:rPr>
-          <w:b w:val="0"/>
-          <w:i w:val="0"/>
-          <w:color w:val="1F4E79"/>
-        </w:rPr>
-        <w:t xml:space="preserve"> and Figure S1.</w:t>
-      </w:r>
-      <w:r>
-        <w:rPr>
-          <w:color w:val="1F4E79"/>
-        </w:rPr>
-      </w:r>
-      <w:r>
-        <w:rPr>
-          <w:i/>
-          <w:color w:val="888888"/>
-          <w:sz w:val="18"/>
-        </w:rPr>
-        <w:t xml:space="preserve"> [Écarts de rétention : valeurs du run durance1 (scripts/43-retention_profondeur.py, results/depth_agreement/retention_par_categorie.tsv, 2026-10-05) ; aucun script ne les produisait auparavant. Sur les trois runs : caudale à 3 000 lectures 29,0–36,4 points (passe 1) et 14,7–19,8 (passe 2) ; à 500 lectures 2,6–3,8 et 3,4–5,7 ; midgut à 500 lectures 5,7–14,0 et 7,8–8,9 (runs confondus : 32,3 / 17,2 ; 3,4 / 4,5 ; 8,5 / 8,2). Le midgut de la passe 1 dépend du run (14,0 dans durance1, 5,7 dans les deux autres). Rapporter la valeur d'un run ou l'étendue : à trancher par JF.]</w:t>
-      </w:r>
-    </w:p>
-    <w:p>
-      <w:pPr>
-        <w:pStyle w:val="Heading2"/>
-      </w:pPr>
-      <w:r>
-        <w:rPr>
-          <w:color w:val="1F4E79"/>
-        </w:rPr>
-        <w:t>8.7 Statistical framework</w:t>
-      </w:r>
-    </w:p>
-    <w:p>
-      <w:pPr/>
-      <w:r>
-        <w:rPr>
-          <w:i/>
-          <w:color w:val="888888"/>
-          <w:sz w:val="18"/>
-        </w:rPr>
-      </w:r>
-      <w:r>
-        <w:rPr>
-          <w:b w:val="0"/>
-          <w:i w:val="0"/>
-          <w:color w:val="1F4E79"/>
-        </w:rPr>
-        <w:t xml:space="preserve">Community composition is analysed </w:t>
-      </w:r>
-      <w:r>
-        <w:rPr>
-          <w:b w:val="0"/>
-          <w:i w:val="0"/>
-          <w:color w:val="1F4E79"/>
-        </w:rPr>
-        <w:t>by PERMANOVA [45] on</w:t>
-      </w:r>
-      <w:r>
-        <w:rPr>
-          <w:b w:val="0"/>
-          <w:i w:val="0"/>
-          <w:color w:val="1F4E79"/>
-        </w:rPr>
-        <w:t xml:space="preserve"> the averaged dissimilarity matrices, stratified by tissue. Stratification is imposed by the design rather than chosen: 168 of the 180 fish occupy the same plate column across all four tissues, so plate position is not estimable in a pooled model carrying fish identity. Station, not site code, is the spatial unit, since two site codes each span two Suran stations that share no genotypic category. Sequencing run is nested within library preparation (</w:t>
-      </w:r>
-      <w:r>
-        <w:rPr>
-          <w:b w:val="0"/>
-          <w:i w:val="0"/>
-          <w:color w:val="1F4E79"/>
-        </w:rPr>
-        <w:t>§8.8</w:t>
-      </w:r>
-      <w:r>
-        <w:rPr>
-          <w:b w:val="0"/>
-          <w:i w:val="0"/>
-          <w:color w:val="1F4E79"/>
-        </w:rPr>
-        <w:t>). Every analysis of genotypic category is run in the two passes defined in §1. Plate column is not entered in the principal models, which report patterns co-varying with station and category without separating them; because its effect on composition is real (</w:t>
-      </w:r>
-      <w:r>
-        <w:rPr>
-          <w:b w:val="0"/>
-          <w:i w:val="0"/>
-          <w:color w:val="1F4E79"/>
-        </w:rPr>
-        <w:t>§8.9; Results</w:t>
-      </w:r>
-      <w:r>
-        <w:rPr>
-          <w:b w:val="0"/>
-          <w:i w:val="0"/>
-          <w:color w:val="1F4E79"/>
-        </w:rPr>
-        <w:t>), every model testing category is also fitted with plate column as a covariate and reported as a sensitivity analysis. Because genotypic category, station and plate position are mutually entangled (</w:t>
-      </w:r>
-      <w:r>
-        <w:rPr>
-          <w:b w:val="0"/>
-          <w:i w:val="0"/>
-          <w:color w:val="1F4E79"/>
-        </w:rPr>
-        <w:t>Results</w:t>
-      </w:r>
-      <w:r>
-        <w:rPr>
-          <w:b w:val="0"/>
-          <w:i w:val="0"/>
-          <w:color w:val="1F4E79"/>
-        </w:rPr>
-        <w:t xml:space="preserve">), no single sequential decomposition is reported: each model is fitted in both orderings and the interval between them is given, the ordering that serves category first bounding it from above and the ordering that serves it last from below. Permutations are constrained within station blocks where the question concerns a within-station contrast. Dispersion is tested separately </w:t>
-      </w:r>
-      <w:r>
-        <w:rPr>
-          <w:b w:val="0"/>
-          <w:i w:val="0"/>
-          <w:color w:val="1F4E79"/>
-        </w:rPr>
-        <w:t>with PERMDISP [46],</w:t>
-      </w:r>
-      <w:r>
-        <w:rPr>
-          <w:b w:val="0"/>
-          <w:i w:val="0"/>
-          <w:color w:val="1F4E79"/>
-        </w:rPr>
-        <w:t xml:space="preserve"> since the transgressive hypothesis concerns the variability of hybrid microbiota and not only the position of its centroid, and since PERMANOVA is itself sensitive to heterogeneous dispersion. </w:t>
-      </w:r>
-      <w:r>
-        <w:rPr>
-          <w:b w:val="0"/>
-          <w:i w:val="0"/>
-          <w:color w:val="1F4E79"/>
-        </w:rPr>
-        <w:t>Every claim is reported per metric and per tissue. Four dissimilarities are carried throughout — Bray–Curtis, Jaccard, unweighted and weighted UniFrac — together with four alpha indices: observed richness, Shannon, inverse Simpson and Faith's phylogenetic diversity. Because resequencing one library recovers only 48 % of the ASVs present at 1–3 reads (</w:t>
-      </w:r>
-      <w:r>
-        <w:rPr>
-          <w:b w:val="0"/>
-          <w:i w:val="0"/>
-          <w:color w:val="1F4E79"/>
-        </w:rPr>
-        <w:t>Results</w:t>
-      </w:r>
-      <w:r>
-        <w:rPr>
-          <w:b w:val="0"/>
-          <w:i w:val="0"/>
-          <w:color w:val="1F4E79"/>
-        </w:rPr>
-        <w:t>), presence-based metrics are not treated as sufficient on their own: a result is stated as established only where at least one abundance-weighted and one presence-based metric support it, and is otherwise reported as metric-dependent with the supporting metrics named. Figures quoted in running text use Shannon for alpha diversity and Bray–Curtis for composition, both abundance-weighted, with the remaining metrics reported alongside rather than relegated. Weighting is not the operative axis for composition: Bray–Curtis, though abundance-weighted, patterns with the two presence-based dissimilarities on both category and dispersion, whereas weighted UniFrac stands apart, so the rule is applied metric by metric rather than by weighting class. The choice of a differential-abundance method remains to be fixed.</w:t>
-      </w:r>
-      <w:r>
-        <w:rPr>
-          <w:color w:val="1F4E79"/>
-        </w:rPr>
-        <w:t xml:space="preserve"> PERMANOVA (adonis2) and PERMDISP (betadisper) were run with vegan 2.7-5 [47].</w:t>
-      </w:r>
-      <w:r>
-        <w:rPr>
-          <w:color w:val="1F4E79"/>
-        </w:rPr>
-        <w:t xml:space="preserve"> Distances to group medians in PERMDISP were corrected for small-sample bias (bias.adjust = TRUE [48]), hybrids being the smallest category in every stratum.</w:t>
-      </w:r>
-    </w:p>
-    <w:p>
-      <w:pPr>
-        <w:pStyle w:val="Heading2"/>
-      </w:pPr>
-      <w:r>
-        <w:rPr>
-          <w:i w:val="0"/>
-          <w:color w:val="1F4E79"/>
-        </w:rPr>
-        <w:t>8.8 Technical replication structure</w:t>
-      </w:r>
-    </w:p>
-    <w:p>
-      <w:pPr/>
-      <w:r>
-        <w:rPr>
-          <w:color w:val="1F4E79"/>
-        </w:rPr>
-        <w:t>Technical replication was assessed in two ways. Each pair of runs was compared within sample after rarefaction to a common depth, on the 548 samples reaching 3,000 reads in all three runs, so that detection probability is identical by construction; Bray–Curtis and Jaccard dissimilarities and the recapture of rare ASVs (1–3 reads) were contrasted between the pair of runs sharing a library and the two library-crossing pairs with paired Wilcoxon tests. The variance attributable to library preparation and to sequencing run was then estimated by PERMANOVA on Bray–Curtis distances over the 1,784 rarefied samples, with the technical terms entered first so that they absorb the maximum variance a sequential decomposition can assign them, followed by tissue and fish identity.</w:t>
-      </w:r>
-    </w:p>
-    <w:p>
-      <w:pPr>
-        <w:pStyle w:val="Heading2"/>
-      </w:pPr>
-      <w:r>
-        <w:rPr>
-          <w:i w:val="0"/>
-          <w:color w:val="1F4E79"/>
-        </w:rPr>
-        <w:t>8.9 Plate position</w:t>
-      </w:r>
-      <w:r>
-        <w:rPr>
-          <w:i w:val="0"/>
-        </w:rPr>
-      </w:r>
-    </w:p>
-    <w:p>
-      <w:pPr/>
-      <w:r/>
-      <w:r>
-        <w:rPr>
-          <w:b w:val="0"/>
-          <w:i w:val="0"/>
-        </w:rPr>
-      </w:r>
-      <w:r>
-        <w:rPr>
-          <w:b w:val="0"/>
-          <w:i w:val="0"/>
-          <w:color w:val="1F4E79"/>
-        </w:rPr>
-        <w:t xml:space="preserve">Individuals were numbered in the field in sampling order, which is not random with respect to genotype: the more fragile nases were processed first, except at one station (Saint-Just-d'Ardèche), </w:t>
-      </w:r>
-      <w:r>
-        <w:rPr>
-          <w:b w:val="0"/>
-          <w:i w:val="0"/>
-          <w:color w:val="1F4E79"/>
-        </w:rPr>
-        <w:t>and plates were loaded in processing order within every fishing campaign (Spearman ρ between individual number and plate column within campaigns, 0.55–0.95)</w:t>
-      </w:r>
-      <w:r>
-        <w:rPr>
-          <w:b w:val="0"/>
-          <w:i w:val="0"/>
-          <w:color w:val="1F4E79"/>
-        </w:rPr>
-        <w:t>. Genotypic category and plate column are accordingly strongly associated (Cramér's V = 0.53 in pass 1 and 0.48 in pass 2, computed on individuals). Whether plate position affects composition was therefore tested rather than assumed. Rarefaction equalises depth, so a test on read depth would not have answered the question; PERMANOVA was run on composition, stratified by tissue, with permutations constrained within station blocks so that a detected column effect cannot be a station effect, and with each sequencing run analysed separately, plate position being identical across runs.</w:t>
-      </w:r>
-    </w:p>
-    <w:p>
-      <w:pPr>
-        <w:pStyle w:val="Heading2"/>
-      </w:pPr>
-      <w:r>
-        <w:rPr>
-          <w:color w:val="1F4E79"/>
-        </w:rPr>
-        <w:t>8.10 Alpha diversity</w:t>
-      </w:r>
-    </w:p>
-    <w:p>
-      <w:pPr/>
-      <w:r>
-        <w:rPr>
-          <w:color w:val="1F4E79"/>
-        </w:rPr>
-        <w:t xml:space="preserve">Alpha diversity was summarised per individual and tissue as the mean over the three runs of the rarefied indices (observed richness, Shannon, inverse Simpson and Faith's phylogenetic diversity), analysed on the log scale, every analysis being run on the four indices. First, the contrasts between external (caudal fin, gill) and internal (midgut, hindgut) compartments, and between midgut and hindgut, were tested within individual by a paired t-test on log values, with the Wilcoxon signed-rank test reported alongside, and expressed as ratios of geometric means with 95 % confidence intervals. Second, the variance of log alpha diversity over the 1,784 rarefied samples was partitioned by a linear model with tissue, site-year, individual, library preparation and sequencing run; sequential and marginal shares of the sum of squares are reported, nested terms having no marginal share of their own. Third, the effect of genotypic category was tested per tissue and pass by ordinary least squares, log(index) ~ station + category, with an F test of the category term and the contrasts hybrid − </w:t>
-      </w:r>
-      <w:r>
-        <w:rPr>
-          <w:i/>
-          <w:color w:val="1F4E79"/>
-        </w:rPr>
-        <w:t>C. nasus</w:t>
-      </w:r>
-      <w:r>
-        <w:rPr>
-          <w:color w:val="1F4E79"/>
-        </w:rPr>
-        <w:t xml:space="preserve">, hybrid − </w:t>
-      </w:r>
-      <w:r>
-        <w:rPr>
-          <w:i/>
-          <w:color w:val="1F4E79"/>
-        </w:rPr>
-        <w:t>P. toxostoma</w:t>
-      </w:r>
-      <w:r>
-        <w:rPr>
-          <w:color w:val="1F4E79"/>
-        </w:rPr>
-        <w:t xml:space="preserve"> and hybrid − parental midpoint with 95 % confidence intervals; plate position was added as a covariate in a sensitivity model. Hybrids were classified as intermediate when their estimate lay between the two parental estimates and did not differ from their midpoint; as dominant when their interval included one parent and excluded the other; and as transgressive when their estimate lay beyond the parental range with an interval excluding the nearer parent. When no criterion or more than one was met, the class is reported as undetermined. This rule, and the three tests of §8.12, were declared before computation.</w:t>
-      </w:r>
-    </w:p>
-    <w:p>
-      <w:pPr>
-        <w:pStyle w:val="Heading2"/>
-      </w:pPr>
-      <w:r>
-        <w:rPr>
-          <w:color w:val="1F4E79"/>
-        </w:rPr>
-        <w:t>8.11 Four-dimensional (4H) index</w:t>
-      </w:r>
-    </w:p>
-    <w:p>
-      <w:pPr/>
-      <w:r>
-        <w:rPr>
-          <w:color w:val="1F4E79"/>
-        </w:rPr>
-        <w:t xml:space="preserve">The 4H index [14] was computed with the R package HybridMicrobiomes 0.1.1 [49] and phyloseq [50], on three host classes — </w:t>
-      </w:r>
-      <w:r>
-        <w:rPr>
-          <w:i/>
-          <w:color w:val="1F4E79"/>
-        </w:rPr>
-        <w:t>C. nasus</w:t>
-      </w:r>
-      <w:r>
-        <w:rPr>
-          <w:color w:val="1F4E79"/>
-        </w:rPr>
-        <w:t xml:space="preserve">, hybrids and </w:t>
-      </w:r>
-      <w:r>
-        <w:rPr>
-          <w:i/>
-          <w:color w:val="1F4E79"/>
-        </w:rPr>
-        <w:t>P. toxostoma</w:t>
-      </w:r>
-      <w:r>
-        <w:rPr>
-          <w:color w:val="1F4E79"/>
-        </w:rPr>
-        <w:t xml:space="preserve"> — in each pass, tissue and sequencing run separately. Its parameters and reading rules were fixed in a document committed before any index was computed: core fraction ρ = 0.5 at genus rank, with sensitivity at ρ = 0.3 and 0.7 and at family rank, and no abundance threshold (ϑ = ε = 0); ρ ≥ 0.8 was excluded because the Intersection dimension vanishes there on the published natural hybrid system. ASV counts were aggregated to genus; 48.6 % of ASVs, carrying 64.1 % of reads, were assigned to a genus (family: 77.9 % and 90.6 %), and unassigned ASVs were excluded. Because the package rarefies the aggregated table, samples were required to carry at least 1,000 genus-assigned reads (1,749 of the 1,784 rarefied samples) and were rarefied to that depth at each of 500 bootstraps; on the published natural hybrid system the parental axis </w:t>
-      </w:r>
-      <w:r>
-        <w:rPr>
-          <w:color w:val="1F4E79"/>
-        </w:rPr>
-        <w:t>varies by at most 0.066 between 1,000 and 10,000 reads [14]</w:t>
-      </w:r>
-      <w:r>
-        <w:rPr>
-          <w:color w:val="1F4E79"/>
-        </w:rPr>
-        <w:t>. Each bootstrap drew without replacement the same number of hosts N from each class, N being one less than the smallest class of pass 1 in the stratum (9 in the caudal fin, 10–19 elsewhere), and the same N was applied to pass 2 so that the two passes are compared on equal footing; pass 2 was also computed at its own N. An abundance-based version of the index (inspired by Bray–Curtis), the pre-analysis of core fractions, the null plane and a null hybrid model averaging one randomly drawn individual of each parental species were computed with the same settings. The index is reported along its parental (Union + Intersection) and transgressive (Gain + Loss) axes. An axis was called dominant when it exceeded 0.5 in all three runs, and robust when the same axis dominated at ρ = 0.3, at ρ = 0.7, at family rank and in the abundance-based version; two compartments were called different when the 95 % bootstrap intervals of the transgressive axis were disjoint in all three runs. The PERMANOVA comparison of bootstrap sets offered by the package was not used, because its p-value decreases with the arbitrarily chosen number of bootstraps. Preferential retention of the taxa shared by both parents was inferred when more than 95 % of bootstraps lay on the Intersection side of the null plane in all three runs. Following the framework's own statement of scope, the index is read as a pattern of taxon membership, not as evidence of an assembly process.</w:t>
-      </w:r>
-      <w:r>
-        <w:rPr>
-          <w:i/>
-          <w:color w:val="888888"/>
-          <w:sz w:val="18"/>
-        </w:rPr>
-        <w:t xml:space="preserve"> [0,066 : Camper et al. 2024, Supporting Information, Table S.4.1 (lézard Aspidoscelis, version Jaccard, axe parental 0,4183 → 0,4847) ; 0,045 en version Bray-Curtis (Table S.4.2). L'ancienne valeur 0,067 était mal arrondie. Exclusion de ρ ≥ 0,8 vérifiée : Intersection = 0 à ρ = 0,8 dans les Tables S.2.1 et S.2.2 (0,015 et 0,010 à ρ = 0,7). Vérifié le 2026-10-05.]</w:t>
-      </w:r>
-    </w:p>
-    <w:p>
-      <w:pPr>
-        <w:pStyle w:val="Heading2"/>
-      </w:pPr>
-      <w:r>
-        <w:rPr>
-          <w:color w:val="1F4E79"/>
-        </w:rPr>
-        <w:t>8.12 Pre-declared controls</w:t>
-      </w:r>
-    </w:p>
-    <w:p>
-      <w:pPr/>
-      <w:r>
-        <w:rPr>
-          <w:color w:val="1F4E79"/>
-        </w:rPr>
-        <w:t xml:space="preserve">Four further controls were declared, with their reading rules, in a document committed before computation, and their verdicts were applied by script. (i) Whether the attenuation of the caudal-fin signal at 500 reads reflects depth or the sample set: the 500-read matrices were restricted to the samples retained at 3,000 reads. (ii) Whether near-parental hybrids dilute the caudal-fin contrast: 19 </w:t>
-      </w:r>
-      <w:r>
-        <w:rPr>
-          <w:i/>
-          <w:color w:val="1F4E79"/>
-        </w:rPr>
-        <w:t>P. toxostoma</w:t>
-      </w:r>
-      <w:r>
-        <w:rPr>
-          <w:color w:val="1F4E79"/>
-        </w:rPr>
-        <w:t xml:space="preserve"> and 3 </w:t>
-      </w:r>
-      <w:r>
-        <w:rPr>
-          <w:i/>
-          <w:color w:val="1F4E79"/>
-        </w:rPr>
-        <w:t>C. nasus</w:t>
-      </w:r>
-      <w:r>
-        <w:rPr>
-          <w:color w:val="1F4E79"/>
-        </w:rPr>
-        <w:t xml:space="preserve"> drawn from the stations of the near-parental individuals were relabelled as hybrids in pass 1 (20 draws), and near-parental hybrids of </w:t>
-      </w:r>
-      <w:r>
-        <w:rPr>
-          <w:i/>
-          <w:color w:val="1F4E79"/>
-        </w:rPr>
-        <w:t>P. toxostoma</w:t>
-      </w:r>
-      <w:r>
-        <w:rPr>
-          <w:color w:val="1F4E79"/>
-        </w:rPr>
-        <w:t xml:space="preserve"> background were compared directly with pure </w:t>
-      </w:r>
-      <w:r>
-        <w:rPr>
-          <w:i/>
-          <w:color w:val="1F4E79"/>
-        </w:rPr>
-        <w:t>P. toxostoma</w:t>
-      </w:r>
-      <w:r>
-        <w:rPr>
-          <w:color w:val="1F4E79"/>
-        </w:rPr>
-        <w:t xml:space="preserve"> and with intermediate hybrids. (iii) The classification of hybrid alpha diversity described in §8.10. (iv) Whether plate column and processing order can be separated, by the Spearman correlation between individual number and plate column within each fishing campaign.</w:t>
+          <w:color w:val="1F4E79"/>
+        </w:rPr>
+        <w:t>Relative to the biological signal, this technical variation is negligible. With the technical terms entered first, library preparation explained 0.03 % of the Bray–Curtis variance over the 1,784 rarefied samples (R² = 0.0003, p = 0.63) and sequencing run within library 0.005 % (p = 1.00), against 9.2 % for tissue and 37.7 % for fish identity (both p = 0.002); library preparation cannot be tested marginally, being aliased with run label. Mean Bray–Curtis dissimilarity was 0.13 between two sequencing runs of one library and 0.25 across libraries, against 0.88 between different fish of the same tissue and 0.94 across tissues.</w:t>
       </w:r>
     </w:p>
     <w:p>
@@ -1550,105 +1263,127 @@
         <w:pStyle w:val="Heading1"/>
       </w:pPr>
       <w:r>
-        <w:t>9. Reproducibility and data availability</w:t>
-      </w:r>
-    </w:p>
-    <w:p>
-      <w:r>
-        <w:rPr>
-          <w:b w:val="0"/>
-          <w:i w:val="0"/>
-        </w:rPr>
-        <w:t>All processing steps are scripted, version-controlled with git and logged (runs.log), with parameter choices justified in the script headers; metadata corrections are traced by explicit flags rather than applied silently.</w:t>
-      </w:r>
-      <w:r>
-        <w:rPr>
-          <w:b w:val="0"/>
-          <w:i w:val="0"/>
-          <w:color w:val="1F4E79"/>
-        </w:rPr>
-        <w:t xml:space="preserve"> The code is publicly available at https://github.com/martinjfsupagro/microbiome-hybrid.</w:t>
-      </w:r>
-    </w:p>
-    <w:p>
-      <w:r>
-        <w:rPr>
-          <w:i w:val="0"/>
-        </w:rPr>
-        <w:t xml:space="preserve">Raw sequence data have been deposited in the European Nucleotide Archive (ENA) at EMBL-EBI under accession number PRJEB124417. The submission comprises 768 samples and 2,304 sequencing runs (4,608 FASTQ files, 11.7 GB). Each sample was processed through two independent one-step dual-index PCR library preparations: the first library was sequenced once (run label durance1) and the second was sequenced twice on separate flow cells (durance2, durance3). Runs are named accordingly, so that the nested replication structure described in </w:t>
-      </w:r>
-      <w:r>
-        <w:rPr>
-          <w:i w:val="0"/>
-          <w:color w:val="1F4E79"/>
-        </w:rPr>
-        <w:t>§8.8</w:t>
-      </w:r>
-      <w:r>
-        <w:rPr>
-          <w:i w:val="0"/>
-        </w:rPr>
-        <w:t xml:space="preserve"> — sequencing replication nested within library preparation — can be recovered directly from the run titles. Sample metadata follow the GSC MIxS host-associated checklist (ERC000013) and report collection year, sampling-site coordinates, host species and sampled tissue. Extraction blanks, no-template PCR controls and mock community aliquots are included in the submission and are identified as such in the sample titles; the 25 empty wells used to quantify index hopping (§8.2) are likewise deposited. Per-run accessions, file names and MD5 checksums for all 4,608 files are given in Supplementary Table S</w:t>
-      </w:r>
-      <w:r>
-        <w:rPr>
-          <w:i w:val="0"/>
-          <w:color w:val="1F4E79"/>
-        </w:rPr>
-        <w:t>7</w:t>
-      </w:r>
-      <w:r>
-        <w:rPr>
-          <w:i w:val="0"/>
-        </w:rPr>
-        <w:t>.</w:t>
-      </w:r>
-    </w:p>
-    <w:p>
-      <w:r>
-        <w:rPr>
-          <w:i w:val="0"/>
-        </w:rPr>
-      </w:r>
-      <w:r>
-        <w:rPr>
-          <w:b w:val="0"/>
-          <w:i w:val="0"/>
-          <w:color w:val="1F4E79"/>
-        </w:rPr>
-        <w:t>ENA metadata were corrected on 2026-08-31 (field-record coordinates, exact collection dates and genotype-resolved host identities); PRJEB124417 is up to date. The correction covered 3,472 fields across the 727 biological samples and was verified field by field; the 41 controls, the sample accessions, the aliases and the sequence files were unchanged. A second correction, on 2026-09-25, aligned host identity on the 25-chromosome genotyping: sample title, host scientific name and host common name were updated for 568 samples (1,199 fields), hybrids being recorded as nasus x toxostoma. It was then verified against the archive itself: 727 samples queried, 1,199 fields conforming, none discrepant. Neither correction altered a sample accession, an alias or a sequence file.</w:t>
+        <w:rPr>
+          <w:color w:val="1F4E79"/>
+        </w:rPr>
+        <w:t>Plate position</w:t>
       </w:r>
     </w:p>
     <w:p>
       <w:pPr/>
       <w:r>
         <w:rPr>
+          <w:color w:val="1F4E79"/>
+        </w:rPr>
+        <w:t xml:space="preserve">Plate column affected composition. </w:t>
+      </w:r>
+      <w:r/>
+      <w:r>
+        <w:rPr>
+          <w:b w:val="0"/>
           <w:i w:val="0"/>
         </w:rPr>
-        <w:t>Metadata completeness. Sampling-site coordinates and environmental context terms were obtained from the field records and are reported per site in Supplementary Table S</w:t>
-      </w:r>
-      <w:r>
-        <w:rPr>
+      </w:r>
+      <w:r>
+        <w:rPr>
+          <w:b w:val="0"/>
           <w:i w:val="0"/>
-        </w:rPr>
-        <w:t>1</w:t>
-      </w:r>
-      <w:r>
-        <w:rPr>
+          <w:color w:val="1F4E79"/>
+        </w:rPr>
+      </w:r>
+      <w:r>
+        <w:rPr>
+          <w:b w:val="0"/>
           <w:i w:val="0"/>
-        </w:rPr>
-        <w:t>. Collection dates are given at day resolution for every station except Pertuis, where the two 2014 fishing campaigns are deposited as the interval 2014-07-07/2014-08-20.</w:t>
+          <w:color w:val="1F4E79"/>
+        </w:rPr>
+        <w:t>The effect is present in all 24 strata (12 tissue × run strata × 2 metrics) in both passes (p ≤ 0.033 in pass 1, p ≤ 0.007 in pass 2), replicated across the three runs; it does not depend on category labels, and the two passes differ only by the 22 individuals excluded from pass 1. Because the terms differ in degrees of freedom, effect sizes are reported relative to their expectation under the null, R2/(df/(n−1)): plate column reaches 1.84 in pass 1 and 1.95 in pass 2 (median R2 = 0.152 and 0.141, 11 df), the same order as genotypic category fitted after column (1.61 and 1.77; median R2 = 0.026 and 0.024, 2 df; significant in 19 and 18 of 24 strata) and below station (3.32 and 3.69; median R2 = 0.204 and 0.196, 8 df). Supplementary Table S</w:t>
+      </w:r>
+      <w:r>
+        <w:rPr>
+          <w:b w:val="0"/>
+          <w:i w:val="0"/>
+          <w:color w:val="1F4E79"/>
+        </w:rPr>
+        <w:t>8</w:t>
+      </w:r>
+      <w:r>
+        <w:rPr>
+          <w:b w:val="0"/>
+          <w:i w:val="0"/>
+          <w:color w:val="1F4E79"/>
+        </w:rPr>
+        <w:t xml:space="preserve"> and Figure S2.</w:t>
+      </w:r>
+      <w:r>
+        <w:rPr>
+          <w:color w:val="1F4E79"/>
+        </w:rPr>
       </w:r>
     </w:p>
     <w:p>
       <w:pPr/>
       <w:r>
         <w:rPr>
+          <w:color w:val="1F4E79"/>
+        </w:rPr>
+        <w:t xml:space="preserve">Three witnesses separate this effect from the biology it could be mistaken for. Within a single genotypic category, where a column effect cannot be a category effect, it persists but more weakly: among </w:t>
+      </w:r>
+      <w:r>
+        <w:rPr>
+          <w:i/>
+          <w:color w:val="1F4E79"/>
+        </w:rPr>
+        <w:t>P. toxostoma</w:t>
+      </w:r>
+      <w:r>
+        <w:rPr>
+          <w:color w:val="1F4E79"/>
+        </w:rPr>
+        <w:t xml:space="preserve"> alone in 17 of 24 strata in both passes (ratio 1.65), among </w:t>
+      </w:r>
+      <w:r>
+        <w:rPr>
+          <w:i/>
+          <w:color w:val="1F4E79"/>
+        </w:rPr>
+        <w:t>C. nasus</w:t>
+      </w:r>
+      <w:r>
+        <w:rPr>
+          <w:color w:val="1F4E79"/>
+        </w:rPr>
+        <w:t xml:space="preserve"> alone in 6 (pass 1) and 7 (pass 2) of 24 (ratio 1.63); hybrids alone are too few to be tested, and the only single-category station (Chavannes-sur-Suran, 19 </w:t>
+      </w:r>
+      <w:r>
+        <w:rPr>
+          <w:i/>
+          <w:color w:val="1F4E79"/>
+        </w:rPr>
+        <w:t>P. toxostoma</w:t>
+      </w:r>
+      <w:r>
+        <w:rPr>
+          <w:color w:val="1F4E79"/>
+        </w:rPr>
+        <w:t>) is too small for a separate witness. In the symmetric ordering with category fitted first, column still contributes (21 and 22 of 24 strata). And plate row is significant in 7 and 6 of 24 strata and plate edge in none, making the effect specific to column, as expected of an effect tracking processing order rather than evaporation or thermal gradients. The mechanism of the column effect is not identified: extraction order, reagent-batch drift within a plate, cross-contamination between adjacent wells and the delay between capture and dissection are not separated by these data, and no negative control isolates any of them.</w:t>
+      </w:r>
+    </w:p>
+    <w:p>
+      <w:pPr/>
+      <w:r>
+        <w:rPr>
+          <w:color w:val="1F4E79"/>
+        </w:rPr>
+        <w:t>Within every fishing campaign, plate column followed the order in which fish were processed (Spearman ρ between individual number and plate column, 0.55–0.95 over 12 station-year campaigns; §8.9 and §8.12), so that in this design the column effect cannot be separated from processing order, and therefore from the time each fish spent in the holding tank before dissection.</w:t>
+      </w:r>
+      <w:r>
+        <w:rPr>
           <w:i/>
           <w:color w:val="888888"/>
           <w:sz w:val="18"/>
         </w:rPr>
-        <w:t>[Pertuis : les individus sont désormais assignés à leur campagne (série 1011-1014 au 07/07/2014, série 2011-2015 au 20/08/2014 — André, 2026-09-30). La table de correction ena_deposit/ena_corrections_pertuis_dates.tsv est prête (44 échantillons) mais n'est pas encore soumise ; remplacer l'intervalle par les deux dates ici une fois le MODIFY passé.]</w:t>
+        <w:t xml:space="preserve"> [ρ recalculé par scripts/40-verif_article_v2.py (results/verif_article/spearman_toutes_campagnes.tsv) : 0,548–0,950. Les deux campagnes de Pertuis 2014 sont agrégées ; Pont-d'Ain 2014 (moins de 4 poissons) n'est pas calculable.]</w:t>
       </w:r>
     </w:p>
     <w:p>
@@ -1659,7 +1394,319 @@
           <w:color w:val="888888"/>
           <w:sz w:val="18"/>
         </w:rPr>
-        <w:t>[À COMPLÉTER : DOI Zenodo de la version utilisée pour l'article, le cas échéant (question 2.7, non tranché). Dépôt GitHub public (JF, 2026-10-03) ; vérifier que le miroir public est à jour au moment de la soumission — le 2026-10-03 il s'arrêtait au commit du 2026-09-25.]</w:t>
+        <w:t>[À reformuler après l'arbitrage D2 de JF : « the delay between capture and dissection » ne correspond plus au protocole. Les poissons sont gardés vivants en vivier jusqu'à la dissection, 4–6 min par poisson (André, 2026-10-03) ; le confondant est la durée de séjour en vivier, c'est-à-dire l'ordre de traitement. Dans chaque campagne, la colonne suit cet ordre, et le test du 2026-10-03 ne peut pas séparer les deux (RESULTATS R32, docs/recalcul/note_tests_2026-10-03.md).]</w:t>
+      </w:r>
+    </w:p>
+    <w:p>
+      <w:pPr>
+        <w:pStyle w:val="Heading1"/>
+      </w:pPr>
+      <w:r>
+        <w:rPr>
+          <w:color w:val="1F4E79"/>
+        </w:rPr>
+        <w:t>Alpha diversity</w:t>
+      </w:r>
+    </w:p>
+    <w:p>
+      <w:pPr/>
+      <w:r>
+        <w:rPr>
+          <w:color w:val="1F4E79"/>
+        </w:rPr>
+        <w:t>Alpha diversity was higher in the external than in the internal compartments on all four indices (Fig. 2): the ratio of geometric means was 1.51 for Shannon (95 % confidence interval 1.40–1.64), 3.00 for inverse Simpson (2.48–3.63), 1.93 for observed richness (1.71–2.18) and 1.62 for Faith's phylogenetic diversity (1.50–1.76; n = 174 individuals; Wilcoxon p ≤ 4.6 × 10⁻¹⁷). The midgut was less diverse than the hindgut on the two unweighted indices only — observed richness, ratio 0.83 (p = 0.009), and Faith's phylogenetic diversity, 0.87 (p = 0.003) — and not on Shannon (0.94, p = 0.18) or inverse Simpson (0.87, p = 0.25; n = 136), so that this contrast is metric-dependent under the rule of §8.7. Tissue was the largest identifiable source of variance in log alpha diversity (marginal share 19–26 % depending on the index), followed by individual (17–21 %) and site-year (10–14 %, sequential share), with technical terms contributing at most 0.3 % and a residual of 38–45 %; the order of the factors was the same on the four indices.</w:t>
+      </w:r>
+    </w:p>
+    <w:p>
+      <w:pPr/>
+      <w:r>
+        <w:rPr>
+          <w:color w:val="1F4E79"/>
+        </w:rPr>
+        <w:t xml:space="preserve">Hybrids were transgressive in none of the 32 combinations of pass, tissue and index (Fig. 2). The only classification supported by both an abundance-weighted and a presence-based index was dominance of </w:t>
+      </w:r>
+      <w:r>
+        <w:rPr>
+          <w:i/>
+          <w:color w:val="1F4E79"/>
+        </w:rPr>
+        <w:t>C. nasus</w:t>
+      </w:r>
+      <w:r>
+        <w:rPr>
+          <w:color w:val="1F4E79"/>
+        </w:rPr>
+        <w:t xml:space="preserve"> — hybrids not distinguishable from </w:t>
+      </w:r>
+      <w:r>
+        <w:rPr>
+          <w:i/>
+          <w:color w:val="1F4E79"/>
+        </w:rPr>
+        <w:t>C. nasus</w:t>
+      </w:r>
+      <w:r>
+        <w:rPr>
+          <w:color w:val="1F4E79"/>
+        </w:rPr>
+        <w:t xml:space="preserve"> but distinct from </w:t>
+      </w:r>
+      <w:r>
+        <w:rPr>
+          <w:i/>
+          <w:color w:val="1F4E79"/>
+        </w:rPr>
+        <w:t>P. toxostoma</w:t>
+      </w:r>
+      <w:r>
+        <w:rPr>
+          <w:color w:val="1F4E79"/>
+        </w:rPr>
+        <w:t xml:space="preserve"> — in the caudal fin in pass 1 (four indices of four; p for category 0.012–0.128) and in the midgut in pass 2 (three of four; p = 0.040–0.111). The first was unchanged with plate position as a covariate; the second was not, two indices becoming intermediate and two undetermined. Five of the 32 principal tests reached p &lt; 0.05, without correction for multiplicity, and dominance denotes here the absence of a detectable difference from </w:t>
+      </w:r>
+      <w:r>
+        <w:rPr>
+          <w:i/>
+          <w:color w:val="1F4E79"/>
+        </w:rPr>
+        <w:t>C. nasus</w:t>
+      </w:r>
+      <w:r>
+        <w:rPr>
+          <w:color w:val="1F4E79"/>
+        </w:rPr>
+        <w:t>, not an equality.</w:t>
+      </w:r>
+      <w:r>
+        <w:rPr>
+          <w:i/>
+          <w:color w:val="888888"/>
+          <w:sz w:val="18"/>
+        </w:rPr>
+        <w:t xml:space="preserve"> [Non testé : C. nasus étant en général traité en premier (§1), le classement « dominant Cn » pourrait refléter l'ordre de traitement (RESULTATS R31). Le contraste femelles/mâles (R27) n'est pas rapporté tant que le code de sexe « X » n'est pas confirmé.]</w:t>
+      </w:r>
+    </w:p>
+    <w:p>
+      <w:pPr>
+        <w:pStyle w:val="Heading1"/>
+      </w:pPr>
+      <w:r>
+        <w:rPr>
+          <w:color w:val="1F4E79"/>
+        </w:rPr>
+        <w:t>Composition by genotypic category</w:t>
+      </w:r>
+    </w:p>
+    <w:p>
+      <w:pPr/>
+      <w:r>
+        <w:rPr>
+          <w:color w:val="1F4E79"/>
+        </w:rPr>
+        <w:t>Fitted in both orderings without plate position, genotypic category accounted for a median of 1.7 % to 2.8 % of compositional variance across the 48 metric × tissue × run strata in pass 1 and 1.4 % to 3.0 % in pass 2, against a median of 19 % and 18 % for station fitted after category (range across strata 14–36 % in pass 1 and 14–35 % in pass 2) and of 20.9 % and 20.1 % for station fitted first (Fig. 3c; Supplementary Table S9). No tissue is detected by all four metrics in all three runs under both permutation schemes, in either pass, with or without plate position (Fig. 3a, b), so a global statement that hybrids differ is not supportable. One result is robust to every choice made here — both passes, with and without plate position, all three runs and both permutation schemes: the midgut on Jaccard (p ≤ 0.044). The caudal fin on weighted UniFrac is detected in all three runs and both schemes in pass 1 (p = 0.007–0.024), with or without plate position, and in no run in pass 2 (p = 0.073–0.235). Removing 22 randomly chosen individuals from the 158 that are not introgressed, twenty times, never restored the caudal signal in pass 2, which attributes this displacement to the definition of hybrids rather than to sample size. At 500 reads the caudal signal is partial in pass 1 (three runs sequentially, p = 0.022–0.049; one of three with station fixed by blocks) and absent in pass 2; restricted to the samples retained at 3,000 reads, the 500-read matrices give the same result as at 3,000 reads (all three runs, both station-blocked schemes, p = 0.010–0.026), so that the attenuation reflects dilution by the caudal-fin samples that pass the threshold only at 500 reads, not depth. As at 3,000 reads, none of twenty random removals of 22 non-introgressed individuals from pass 2 reproduced the pass-1 pattern at 500 reads. The hindgut is the weakest tissue in pass 1 (only Jaccard is significant, in one run of three with station fixed by blocks) but in pass 2 all four metrics detect it in all three runs with station fixed by blocks; the witness does not resolve whether this difference reflects sample size or the definition of hybrids. The principal and sensitivity models differ in 7 of the 16 metric × tissue cells in each pass, of which 5 (pass 1) and 3 (pass 2) move between robust detection (three runs, both schemes), partial detection and none. The separable sub-design detects category in 3 of 48 tests in pass 1 and 1 of 48 in pass 2 (with plate position), and Rosières, in pass 2, detects it in the gill on Jaccard and unweighted UniFrac in all three runs (p = 0.010–0.030).</w:t>
+      </w:r>
+    </w:p>
+    <w:p>
+      <w:pPr/>
+      <w:r>
+        <w:rPr>
+          <w:color w:val="1F4E79"/>
+        </w:rPr>
+        <w:t>Whether the loss of the caudal-fin signal between passes is produced by dilution of the hybrid–</w:t>
+      </w:r>
+      <w:r>
+        <w:rPr>
+          <w:i/>
+          <w:color w:val="1F4E79"/>
+        </w:rPr>
+        <w:t>P. toxostoma</w:t>
+      </w:r>
+      <w:r>
+        <w:rPr>
+          <w:color w:val="1F4E79"/>
+        </w:rPr>
+        <w:t xml:space="preserve"> contrast by the 19 near-parental hybrids of </w:t>
+      </w:r>
+      <w:r>
+        <w:rPr>
+          <w:i/>
+          <w:color w:val="1F4E79"/>
+        </w:rPr>
+        <w:t>P. toxostoma</w:t>
+      </w:r>
+      <w:r>
+        <w:rPr>
+          <w:color w:val="1F4E79"/>
+        </w:rPr>
+        <w:t xml:space="preserve"> background was tested (§8.12) and remains undetermined. Relabelling as hybrids 19 </w:t>
+      </w:r>
+      <w:r>
+        <w:rPr>
+          <w:i/>
+          <w:color w:val="1F4E79"/>
+        </w:rPr>
+        <w:t>P. toxostoma</w:t>
+      </w:r>
+      <w:r>
+        <w:rPr>
+          <w:color w:val="1F4E79"/>
+        </w:rPr>
+        <w:t xml:space="preserve"> and 3 </w:t>
+      </w:r>
+      <w:r>
+        <w:rPr>
+          <w:i/>
+          <w:color w:val="1F4E79"/>
+        </w:rPr>
+        <w:t>C. nasus</w:t>
+      </w:r>
+      <w:r>
+        <w:rPr>
+          <w:color w:val="1F4E79"/>
+        </w:rPr>
+        <w:t xml:space="preserve"> drawn from the stations of the near-parental individuals removed the pass-1 signal in 16 of 20 draws, so that such dilution is sufficient to produce the displacement; but the near-parental hybrids of </w:t>
+      </w:r>
+      <w:r>
+        <w:rPr>
+          <w:i/>
+          <w:color w:val="1F4E79"/>
+        </w:rPr>
+        <w:t>P. toxostoma</w:t>
+      </w:r>
+      <w:r>
+        <w:rPr>
+          <w:color w:val="1F4E79"/>
+        </w:rPr>
+        <w:t xml:space="preserve"> background differed neither from pure </w:t>
+      </w:r>
+      <w:r>
+        <w:rPr>
+          <w:i/>
+          <w:color w:val="1F4E79"/>
+        </w:rPr>
+        <w:t>P. toxostoma</w:t>
+      </w:r>
+      <w:r>
+        <w:rPr>
+          <w:color w:val="1F4E79"/>
+        </w:rPr>
+        <w:t xml:space="preserve"> (p = 0.28–0.60) nor from intermediate hybrids (p = 0.15–0.26; n = 25–26), so that dilution is not established.</w:t>
+      </w:r>
+      <w:r>
+        <w:rPr>
+          <w:i/>
+          <w:color w:val="888888"/>
+          <w:sz w:val="18"/>
+        </w:rPr>
+        <w:t xml:space="preserve"> [Médianes de station : 19 % et 18 % lorsque la station est servie après la catégorie (étendue 14–36 % et 14–35 %), 20,9 % et 20,1 % lorsqu'elle est servie en premier. La formulation « not as a result of it » a disparu au resserrement du 2026-10-05.]</w:t>
+      </w:r>
+    </w:p>
+    <w:p>
+      <w:pPr>
+        <w:pStyle w:val="Heading1"/>
+      </w:pPr>
+      <w:r>
+        <w:rPr>
+          <w:color w:val="1F4E79"/>
+        </w:rPr>
+        <w:t>Dispersion</w:t>
+      </w:r>
+    </w:p>
+    <w:p>
+      <w:pPr/>
+      <w:r>
+        <w:rPr>
+          <w:color w:val="1F4E79"/>
+        </w:rPr>
+        <w:t xml:space="preserve">The transgressive prediction in its dispersion form — hybrids more variable than both parental categories — was not supported in either pass (Fig. 4). With station fixed by blocks, hybrids were the least dispersed of the three categories in 22 of 48 tests in pass 1 and 32 of 48 in pass 2, against the third expected under no ordering (one-sided binomial p = 0.048 and 2.4 × 10⁻⁶), and the most dispersed in 18 and 10 (p = 0.32 and 0.98). Within the stations carrying all three categories, where a dispersion difference cannot be spatial, neither direction departed from chance: hybrids were the least dispersed in 25 of 68 tests in pass 1 and 39 of 120 in pass 2, and the most dispersed in 17 and 45. The lower dispersion of hybrids is therefore a pattern of the station-blocked analysis, clear in pass 2 only and carried mainly by Bray–Curtis (median difference between hybrids and the parental mean −0.068 in pass 2 and −0.008 in pass 1), the other metrics differing by less than 0.013. Significant tests in the transgressive direction numbered 3 in pass 1 (the gill on unweighted UniFrac in two runs and the caudal fin on weighted UniFrac in one) and none in pass 2 with station fixed by blocks, and none and 5 within stations, the five of pass 2 all concerning the gill at Saint-Just-d'Ardèche, where each stratum holds three or four </w:t>
+      </w:r>
+      <w:r>
+        <w:rPr>
+          <w:i/>
+          <w:color w:val="1F4E79"/>
+        </w:rPr>
+        <w:t>P. toxostoma</w:t>
+      </w:r>
+      <w:r>
+        <w:rPr>
+          <w:color w:val="1F4E79"/>
+        </w:rPr>
+        <w:t>.</w:t>
+      </w:r>
+    </w:p>
+    <w:p>
+      <w:pPr/>
+      <w:r>
+        <w:rPr>
+          <w:color w:val="1F4E79"/>
+        </w:rPr>
+        <w:t xml:space="preserve">Because PERMANOVA is sensitive to heterogeneous dispersion, this bears on the location results. With station fixed by blocks, dispersion in the caudal fin was homogeneous on all four metrics in pass 2 and in all but one test in pass 1 (weighted UniFrac, one run of three, p = 0.048, hybrids most dispersed), so that the caudal-fin location signal on weighted UniFrac in pass 1 is a difference in composition in two runs and cannot be separated from a dispersion difference in the third. The robust midgut signal on Jaccard was accompanied by homogeneous dispersion in pass 1 and in two runs of three in pass 2. By contrast, dispersion was heterogeneous in all three runs in the midgut on unweighted UniFrac in both passes and, in pass 2, in the midgut and hindgut on Bray–Curtis, </w:t>
+      </w:r>
+      <w:r>
+        <w:rPr>
+          <w:i/>
+          <w:color w:val="1F4E79"/>
+        </w:rPr>
+        <w:t>P. toxostoma</w:t>
+      </w:r>
+      <w:r>
+        <w:rPr>
+          <w:color w:val="1F4E79"/>
+        </w:rPr>
+        <w:t xml:space="preserve"> being the most dispersed category there; the location signals on those metrics in those compartments cannot be separated from a dispersion effect. Because betadisper accepts no covariate, the plate-position effect is not adjusted for, and a category whose samples are more spread across plate columns could carry inflated dispersion. Supplementary Table S10 and Figure S3.</w:t>
+      </w:r>
+      <w:r>
+        <w:rPr>
+          <w:i/>
+          <w:color w:val="888888"/>
+          <w:sz w:val="18"/>
+        </w:rPr>
+        <w:t xml:space="preserve"> [Correction du 2026-10-03 : l'ancienne version de ces deux paragraphes, sans correction de petit effectif, donnait 32/48 (passe 1) et 34/48 (passe 2) en station bloquée, 45/68 intra-station en passe 1 et une dispersion hétérogène en caudale ; elle est retirée (docs/plan_permdisp_biais_2026-10-03.md, scripts 24 et 39). Table S</w:t>
+      </w:r>
+      <w:r>
+        <w:rPr>
+          <w:i/>
+          <w:color w:val="888888"/>
+          <w:sz w:val="18"/>
+        </w:rPr>
+        <w:t>10</w:t>
+      </w:r>
+      <w:r>
+        <w:rPr>
+          <w:i/>
+          <w:color w:val="888888"/>
+          <w:sz w:val="18"/>
+        </w:rPr>
+        <w:t xml:space="preserve"> et Figure S3 du supplément régénérées avec les valeurs corrigées le 2026-10-05 (scripts/41-supp_S10_S3.py).]</w:t>
+      </w:r>
+    </w:p>
+    <w:p>
+      <w:pPr>
+        <w:pStyle w:val="Heading1"/>
+      </w:pPr>
+      <w:r>
+        <w:rPr>
+          <w:color w:val="1F4E79"/>
+        </w:rPr>
+        <w:t>Four-dimensional index</w:t>
+      </w:r>
+    </w:p>
+    <w:p>
+      <w:pPr/>
+      <w:r>
+        <w:rPr>
+          <w:color w:val="1F4E79"/>
+        </w:rPr>
+        <w:t>Under the principal setting, the transgressive axis of the 4H index exceeded 0.5 in all three runs in the caudal fin, midgut and hindgut of both passes (Gain + Loss = 0.58–0.69), carried by the Loss model, whereas the parental axis dominated in the gill (Gain + Loss = 0.41–0.46), carried by Intersection (Fig. 5a). None of these transgressive readings was robust under the pre-declared rule (Fig. 5b): the abundance-based version placed all eight tissue × pass combinations on the parental axis, and at family rank the caudal fin also fell on the parental side. The only robust reading was the parental axis of the gill in pass 2; in pass 1 the gill was undetermined at ρ = 0.7. No pair of compartments was distinguished, the 95 % bootstrap intervals of the transgressive axis overlapping in at least one run for every pair, in both passes. In every tissue and both passes at least 98.4 % of bootstraps lay on the Intersection side of the null plane: hybrids preferentially retain the core taxa shared by both parental species. The core of hybrids represented less than half of the mean parental core in the midgut of pass 1 (two runs of three; ratio 0.45–0.64) and 0.51–1.07 of it elsewhere. Compared at equal N, passes 1 and 2 fell on the same axis in every tissue.</w:t>
+      </w:r>
+    </w:p>
+    <w:p>
+      <w:pPr/>
+      <w:r>
+        <w:rPr>
+          <w:color w:val="1F4E79"/>
+        </w:rPr>
+        <w:t>Two observations lie outside the pre-declared rules and are reported as descriptions only. A null hybrid built by averaging one randomly drawn individual of each parental species already reached a transgressive share of 0.40–0.57; the observed share exceeded it by 0.08–0.15 in the caudal fin, 0.09–0.22 in the midgut and 0.03–0.13 in the hindgut, and differed from it by −0.04 to +0.06 in the gill (Fig. 5). Computed at its own, larger N (26–40 hosts per class), pass 2 moved the caudal fin to the parental axis (Gain + Loss = 0.42–0.47), while the midgut and hindgut remained on the transgressive side.</w:t>
       </w:r>
     </w:p>
     <w:p>
@@ -1670,18 +1717,7 @@
         <w:rPr>
           <w:color w:val="1F4E79"/>
         </w:rPr>
-        <w:t>Results</w:t>
-      </w:r>
-    </w:p>
-    <w:p>
-      <w:pPr>
-        <w:pStyle w:val="Heading1"/>
-      </w:pPr>
-      <w:r>
-        <w:rPr>
-          <w:color w:val="1F4E79"/>
-        </w:rPr>
-        <w:t>Genotypic design and its entanglement with station</w:t>
+        <w:t>Discussion</w:t>
       </w:r>
     </w:p>
     <w:p>
@@ -1690,7 +1726,7 @@
         <w:rPr>
           <w:color w:val="1F4E79"/>
         </w:rPr>
-        <w:t xml:space="preserve">The 180 fish comprised 59 </w:t>
+        <w:t xml:space="preserve">Across alpha diversity, community dispersion and the 4H index, the microbiota of hybrids between </w:t>
       </w:r>
       <w:r>
         <w:rPr>
@@ -1703,7 +1739,7 @@
         <w:rPr>
           <w:color w:val="1F4E79"/>
         </w:rPr>
-        <w:t xml:space="preserve">, 42 hybrids and 79 </w:t>
+        <w:t xml:space="preserve"> and </w:t>
       </w:r>
       <w:r>
         <w:rPr>
@@ -1716,155 +1752,133 @@
         <w:rPr>
           <w:color w:val="1F4E79"/>
         </w:rPr>
-        <w:t xml:space="preserve">, unevenly distributed across the nine stations (Fig. 1a). Near-parental hybrids carry a median hybrid index close to that of one parent but an inter-chromosome discordance D of 0.15–0.60, against at most 0.12 in parental individuals (Fig. 1b); categories were assigned from chromosome-level assignments rather than by thresholding either quantity (§1). Of the 22 near-parental hybrids, 19 have a </w:t>
+        <w:t xml:space="preserve"> showed no transgressive pattern. Where hybrids could be placed relative to their parents, they fell within the parental range: dominance of </w:t>
       </w:r>
       <w:r>
         <w:rPr>
           <w:i/>
           <w:color w:val="1F4E79"/>
         </w:rPr>
-        <w:t>P. toxostoma</w:t>
-      </w:r>
-      <w:r>
-        <w:rPr>
-          <w:color w:val="1F4E79"/>
-        </w:rPr>
-        <w:t xml:space="preserve"> background and 3 a </w:t>
-      </w:r>
-      <w:r>
-        <w:rPr>
-          <w:i/>
-          <w:color w:val="1F4E79"/>
-        </w:rPr>
         <w:t>C. nasus</w:t>
       </w:r>
       <w:r>
         <w:rPr>
           <w:color w:val="1F4E79"/>
         </w:rPr>
-        <w:t xml:space="preserve"> background.</w:t>
+        <w:t xml:space="preserve"> in caudal-fin alpha diversity in pass 1, a parental, Intersection-dominated 4H index in the gill, and preferential retention of the core taxa shared by both parental species in every compartment. The departures detected in composition were small — genotypic category accounted for a median of 1.4–3.0 % of compositional variance against about a fifth for station — and confined to particular compartments, metrics and definitions of a hybrid. This places the system with natural hybrid zones in which the environmental component dominates [23, 24] rather than with those in which host ancestry does [21, 22], while keeping in view that a small genetic effect is the expected magnitude for a heritable but weakly heritable trait [9], detectable only once the spatial and technical axes have been separated [10].</w:t>
       </w:r>
     </w:p>
     <w:p>
       <w:pPr/>
-      <w:r/>
-      <w:r>
-        <w:rPr>
-          <w:b w:val="0"/>
-          <w:i w:val="0"/>
-        </w:rPr>
-      </w:r>
-      <w:r>
-        <w:rPr>
-          <w:b w:val="0"/>
-          <w:i w:val="0"/>
-          <w:color w:val="1F4E79"/>
-        </w:rPr>
-      </w:r>
-      <w:r>
-        <w:rPr>
-          <w:b w:val="0"/>
-          <w:i w:val="0"/>
-          <w:color w:val="1F4E79"/>
-        </w:rPr>
-      </w:r>
-      <w:r>
-        <w:rPr>
-          <w:b w:val="0"/>
-          <w:i w:val="0"/>
-          <w:color w:val="1F4E79"/>
-        </w:rPr>
-      </w:r>
-      <w:r>
-        <w:rPr>
-          <w:b w:val="0"/>
-          <w:i w:val="0"/>
-        </w:rPr>
-      </w:r>
-      <w:r>
-        <w:rPr>
-          <w:b w:val="0"/>
-          <w:i w:val="0"/>
-        </w:rPr>
-      </w:r>
-      <w:r>
-        <w:rPr>
-          <w:b w:val="0"/>
-          <w:i w:val="0"/>
-          <w:color w:val="1F4E79"/>
-        </w:rPr>
-        <w:t>Genotypic category is entangled with both the spatial and the technical axes, and the entanglement is a property of the design rather than a caveat of presentation. Between stations, category is confounded with station: of nine stations, three carry all three categories (74 individuals in pass 2, 65 in pass 1, where Saint-Just-d'Ardèche retains a single hybrid), the others one or two. Within those three stations, category and plate column are in turn strongly associated, because field numbering followed sampling order (</w:t>
-      </w:r>
-      <w:r>
-        <w:rPr>
-          <w:b w:val="0"/>
-          <w:i w:val="0"/>
-          <w:color w:val="1F4E79"/>
-        </w:rPr>
-        <w:t>§8.9</w:t>
-      </w:r>
-      <w:r>
-        <w:rPr>
-          <w:b w:val="0"/>
-          <w:i w:val="0"/>
-          <w:color w:val="1F4E79"/>
-        </w:rPr>
-        <w:t>). The sub-design in which category and position are fully separable at constant station comprises 31 individuals in pass 1 and 32 in pass 2, too few to carry a principal test. One station, Rosières, carries category and position independently (Cramér's V = 0.18, p = 0.35, in pass 2) and serves as a small clean witness; in pass 1 it retains a single hybrid and cannot witness a category effect.</w:t>
-      </w:r>
-    </w:p>
-    <w:p>
-      <w:pPr>
-        <w:pStyle w:val="Heading1"/>
-      </w:pPr>
-      <w:r>
-        <w:rPr>
-          <w:color w:val="1F4E79"/>
-        </w:rPr>
-        <w:t>Technical variation is small relative to biological variation</w:t>
+      <w:r>
+        <w:rPr>
+          <w:color w:val="1F4E79"/>
+        </w:rPr>
+        <w:t>The expectation derived from Guivier et al. [31], that a hybrid signal would be most pronounced in the digestive compartments, is partly supported. The only compositional result that withstood every analytical choice concerned the midgut, on a presence-based metric, and in pass 2 both digestive compartments were detected by all four metrics with station fixed by blocks. But the caudal fin carried, in pass 1, a signal on weighted UniFrac that no digestive compartment showed on that metric, the gill was the compartment in which the 4H index was robustly parental, and the 4H index distinguished no pair of compartments. Hybrid status therefore does not matter equally in all compartments, but which compartment carries a difference depends on the metric. Requiring both an abundance-weighted and a presence-based metric makes this dependence explicit rather than resolving it; it also accounts for the 4H index, a presence-based construct in its principal form, departing from its abundance-based version in every compartment but the gill.</w:t>
       </w:r>
     </w:p>
     <w:p>
       <w:pPr/>
       <w:r>
-        <w:t>The nested replication structure was verified directly from the data. Each pair of runs was compared within sample after rarefaction to a common depth, so that detection probability is identical by construction (548 samples reaching 3,000 reads in all three runs). The two runs sharing a library were markedly more similar to each other (mean Bray–Curtis 0.118, Jaccard 0.445) than either was to the run from the independent library (0.248 and 0.720 respectively); the two library-crossing comparisons were statistically indistinguishable from each other (paired Wilcoxon, p = 0.48) and both differed from the within-library comparison (p &lt; 10⁻⁸⁹). Recapture of rare ASVs (1–3 reads) showed the same pattern (0.48 within library vs 0.19 across).</w:t>
+        <w:rPr>
+          <w:color w:val="1F4E79"/>
+        </w:rPr>
+        <w:t xml:space="preserve">How hybrids are defined mattered as much as which compartment is examined. The caudal-fin signal obtained with the 20 intermediate hybrids disappeared when the 22 near-parental individuals were added, and random removals of 22 non-introgressed fish never reproduced the displacement, which is therefore attributable to who is called a hybrid rather than to sample size; whether near-parental hybrids of </w:t>
+      </w:r>
+      <w:r>
+        <w:rPr>
+          <w:i/>
+          <w:color w:val="1F4E79"/>
+        </w:rPr>
+        <w:t>P. toxostoma</w:t>
+      </w:r>
+      <w:r>
+        <w:rPr>
+          <w:color w:val="1F4E79"/>
+        </w:rPr>
+        <w:t xml:space="preserve"> background dilute the contrast because their microbiota resembles that of </w:t>
+      </w:r>
+      <w:r>
+        <w:rPr>
+          <w:i/>
+          <w:color w:val="1F4E79"/>
+        </w:rPr>
+        <w:t>P. toxostoma</w:t>
+      </w:r>
+      <w:r>
+        <w:rPr>
+          <w:color w:val="1F4E79"/>
+        </w:rPr>
+        <w:t xml:space="preserve"> could not be established at the available sample size. In a mosaic hybrid zone [30] in which most introgressed individuals depart from a parental genome on a single chromosome, a hybrid class is a decision, and we suggest that studies of natural hybrid zones report their results under both definitions.</w:t>
       </w:r>
     </w:p>
     <w:p>
       <w:pPr/>
       <w:r>
-        <w:t>Library preparation therefore roughly doubles the technical dissimilarity contributed by sequencing alone, with a proportionally larger effect on presence–absence than on relative abundances. Sequencing run was accordingly modelled as nested within library preparation rather than as a three-level factor with interchangeable levels. Because each sample is present in every batch, technical and biological factors are crossed rather than confounded, so batch-correction methods designed for confounded meta-analyses were not applied.</w:t>
-      </w:r>
-      <w:r>
-        <w:t xml:space="preserve"> Index assignment across preparations and the verification of sample-to-file matching are detailed in Supplementary Table S</w:t>
-      </w:r>
-      <w:r>
-        <w:rPr>
-          <w:color w:val="1F4E79"/>
-        </w:rPr>
-        <w:t>3</w:t>
-      </w:r>
-      <w:r>
-        <w:t xml:space="preserve"> and Note S1.</w:t>
+        <w:rPr>
+          <w:color w:val="1F4E79"/>
+        </w:rPr>
+        <w:t>That hybrids were not more dispersed than their parents runs against the expectation that genomes combining parental elements in variable proportions carry more variable microbiota. The opposite tendency, hybrids less dispersed than both parents, was clear only in pass 2 with station fixed by blocks, absent within stations and carried mainly by Bray–Curtis, and should not be read as a general property of hybrids here. The analysis also illustrates a pitfall of unbalanced designs: without correction for group size, the distance to the group centre is underestimated in small groups, and because hybrids were the smallest category in every stratum, the uncorrected analysis yielded a strong and apparently replicated reduction of hybrid dispersion — 32 of 48 station-blocked tests in pass 1 and 45 of 68 within stations — that largely disappeared once corrected. Hybrid classes are small in most natural hybrid zones, and the correction should be applied by default in that setting [48].</w:t>
       </w:r>
     </w:p>
     <w:p>
       <w:pPr/>
       <w:r>
         <w:rPr>
-          <w:i w:val="0"/>
-        </w:rPr>
-        <w:t>Relative to the biological signal, this technical variation is negligible. In a PERMANOVA on Bray–Curtis distances over the 1,784 samples retained after rarefaction, with the technical terms entered first so that they absorb the maximum variance the sequential decomposition can assign them, library preparation explained 0.03 % of the variance (R² = 0.0003, p = 0.63) and sequencing run within library 0.005 % (p = 1.00), against 9.2 % for tissue and 37.7 % for fish identity (both p = 0.002). Mean Bray–Curtis dissimilarity was 0.13 between two sequencing runs of one library and 0.25 across libraries, against 0.88 between different fish of the same tissue and 0.94 across tissues. Note that library preparation cannot be tested marginally, being perfectly aliased with run label (durance1 is the sole run of the first preparation).</w:t>
-      </w:r>
-    </w:p>
-    <w:p>
-      <w:pPr>
-        <w:pStyle w:val="Heading1"/>
-      </w:pPr>
-      <w:r>
-        <w:rPr>
-          <w:color w:val="1F4E79"/>
-        </w:rPr>
-        <w:t>Plate position</w:t>
+          <w:color w:val="1F4E79"/>
+        </w:rPr>
+        <w:t xml:space="preserve">The 4H index adds two points. First, in its abundance-based version — </w:t>
+      </w:r>
+      <w:r>
+        <w:rPr>
+          <w:color w:val="1F4E79"/>
+        </w:rPr>
+        <w:t>one of the two forms in which the framework's authors compared published systems [14]</w:t>
+      </w:r>
+      <w:r>
+        <w:rPr>
+          <w:color w:val="1F4E79"/>
+        </w:rPr>
+        <w:t xml:space="preserve"> — the index placed every compartment on the parental axis (Gain + Loss = 0.22–0.35), as in the </w:t>
+      </w:r>
+      <w:r>
+        <w:rPr>
+          <w:i/>
+          <w:color w:val="1F4E79"/>
+        </w:rPr>
+        <w:t>Neotoma</w:t>
+      </w:r>
+      <w:r>
+        <w:rPr>
+          <w:color w:val="1F4E79"/>
+        </w:rPr>
+        <w:t xml:space="preserve"> woodrat system (0.12) and unlike the </w:t>
+      </w:r>
+      <w:r>
+        <w:rPr>
+          <w:i/>
+          <w:color w:val="1F4E79"/>
+        </w:rPr>
+        <w:t>Aspidoscelis</w:t>
+      </w:r>
+      <w:r>
+        <w:rPr>
+          <w:color w:val="1F4E79"/>
+        </w:rPr>
+        <w:t xml:space="preserve"> lizard and </w:t>
+      </w:r>
+      <w:r>
+        <w:rPr>
+          <w:i/>
+          <w:color w:val="1F4E79"/>
+        </w:rPr>
+        <w:t>Kikihia</w:t>
+      </w:r>
+      <w:r>
+        <w:rPr>
+          <w:color w:val="1F4E79"/>
+        </w:rPr>
+        <w:t xml:space="preserve"> cicada systems (0.71 and 0.64); since transgression has been associated with ecological success rather than with dysbiosis in a hybrid lizard [15], its absence here carries no implication for hybrid fitness either way. Second, as its authors found for a natural hybrid system, the index was sensitive to its settings: the choice between presence and abundance reversed the reading in three compartments of four, and in the caudal fin so did the number of hosts per class, from 9 to 26–27. A null hybrid built from parental individuals already sits close to the 0.5 boundary between the two axes, which makes that boundary a weak criterion for calling a hybrid microbiota transgressive. We therefore read the 4H index as a description of taxon membership conditional on its settings, not as an independent test of the intermediate, dominant and transgressive hypotheses.</w:t>
       </w:r>
     </w:p>
     <w:p>
@@ -1873,740 +1887,7 @@
         <w:rPr>
           <w:color w:val="1F4E79"/>
         </w:rPr>
-        <w:t xml:space="preserve">Plate column affected composition. </w:t>
-      </w:r>
-      <w:r/>
-      <w:r>
-        <w:rPr>
-          <w:b w:val="0"/>
-          <w:i w:val="0"/>
-        </w:rPr>
-      </w:r>
-      <w:r>
-        <w:rPr>
-          <w:b w:val="0"/>
-          <w:i w:val="0"/>
-          <w:color w:val="1F4E79"/>
-        </w:rPr>
-      </w:r>
-      <w:r>
-        <w:rPr>
-          <w:b w:val="0"/>
-          <w:i w:val="0"/>
-          <w:color w:val="1F4E79"/>
-        </w:rPr>
-        <w:t>The effect is present in all 24 strata (12 tissue × run strata × 2 metrics) in both passes (p ≤ 0.033 in pass 1, p ≤ 0.007 in pass 2), replicated across the three runs; it does not depend on category labels, and the two passes differ only by the 22 individuals excluded from pass 1. Because the terms differ in degrees of freedom, effect sizes are reported relative to their expectation under the null, R2/(df/(n−1)): plate column reaches 1.84 in pass 1 and 1.95 in pass 2 (median R2 = 0.152 and 0.141, 11 df), the same order as genotypic category fitted after column (1.61 and 1.77; median R2 = 0.026 and 0.024, 2 df; significant in 19 and 18 of 24 strata) and below station (3.32 and 3.69; median R2 = 0.204 and 0.196, 8 df). Supplementary Table S</w:t>
-      </w:r>
-      <w:r>
-        <w:rPr>
-          <w:b w:val="0"/>
-          <w:i w:val="0"/>
-          <w:color w:val="1F4E79"/>
-        </w:rPr>
-        <w:t>8</w:t>
-      </w:r>
-      <w:r>
-        <w:rPr>
-          <w:b w:val="0"/>
-          <w:i w:val="0"/>
-          <w:color w:val="1F4E79"/>
-        </w:rPr>
-        <w:t xml:space="preserve"> and Figure S2.</w:t>
-      </w:r>
-      <w:r>
-        <w:rPr>
-          <w:color w:val="1F4E79"/>
-        </w:rPr>
-      </w:r>
-    </w:p>
-    <w:p>
-      <w:pPr/>
-      <w:r/>
-      <w:r>
-        <w:rPr>
-          <w:b w:val="0"/>
-          <w:i w:val="0"/>
-        </w:rPr>
-      </w:r>
-      <w:r>
-        <w:rPr>
-          <w:b w:val="0"/>
-          <w:i w:val="0"/>
-          <w:color w:val="1F4E79"/>
-        </w:rPr>
-      </w:r>
-      <w:r>
-        <w:rPr>
-          <w:b w:val="0"/>
-          <w:i w:val="0"/>
-          <w:color w:val="1F4E79"/>
-        </w:rPr>
-      </w:r>
-      <w:r>
-        <w:rPr>
-          <w:b w:val="0"/>
-          <w:i w:val="0"/>
-          <w:color w:val="1F4E79"/>
-        </w:rPr>
-        <w:t>Three witnesses separate this effect from the biology it could be mistaken for. Within a single genotypic category, where a column effect cannot be a category effect, it persists but more weakly: among P. toxostoma alone in 17 of 24 strata in both passes (ratio 1.65), among C. nasus alone in 6 (pass 1) and 7 (pass 2) of 24 (ratio 1.63); hybrids alone are too few to be tested (two strata in pass 2, none in pass 1). No site code carries a single genotypic category, and the only single-category station (Chavannes-sur-Suran, 19 P. toxostoma) is too small for a separate witness; the within-category subsets therefore replace the single-category-station witness of an earlier analysis, which rested on fish left unresolved by morphology. In the symmetric ordering with category fitted first, column still contributes (21 and 22 of 24 strata). And the classic plate artefacts are absent: plate row is significant in 7 and 6 of 24 strata and plate edge in none, making the effect specific to column, as expected of an effect tracking processing order rather than evaporation or thermal gradients. The origin of the association between category and column is documented above, but the mechanism of the column effect itself is not identified: extraction order, reagent-batch drift within a plate, cross-contamination between adjacent wells and the delay between capture and dissection are not separated by these data, and no negative control isolates any of them. Plate column is therefore not entered in the principal models (</w:t>
-      </w:r>
-      <w:r>
-        <w:rPr>
-          <w:b w:val="0"/>
-          <w:i w:val="0"/>
-          <w:color w:val="1F4E79"/>
-        </w:rPr>
-        <w:t>§8.7</w:t>
-      </w:r>
-      <w:r>
-        <w:rPr>
-          <w:b w:val="0"/>
-          <w:i w:val="0"/>
-          <w:color w:val="1F4E79"/>
-        </w:rPr>
-        <w:t xml:space="preserve">), but every model testing category is also reported with plate column as a covariate, and the two versions are </w:t>
-      </w:r>
-      <w:r>
-        <w:rPr>
-          <w:b w:val="0"/>
-          <w:i w:val="0"/>
-          <w:color w:val="1F4E79"/>
-        </w:rPr>
-        <w:t>compared below</w:t>
-      </w:r>
-      <w:r>
-        <w:rPr>
-          <w:b w:val="0"/>
-          <w:i w:val="0"/>
-          <w:color w:val="1F4E79"/>
-        </w:rPr>
-        <w:t>.</w:t>
-      </w:r>
-    </w:p>
-    <w:p>
-      <w:pPr/>
-      <w:r>
-        <w:rPr>
-          <w:color w:val="1F4E79"/>
-        </w:rPr>
-        <w:t>Within every fishing campaign, plate column followed the order in which fish were processed (Spearman ρ between individual number and plate column, 0.55–0.95 over 12 station-year campaigns; §8.9 and §8.12), so that in this design the column effect cannot be separated from processing order, and therefore from the time each fish spent in the holding tank before dissection.</w:t>
-      </w:r>
-      <w:r>
-        <w:rPr>
-          <w:i/>
-          <w:color w:val="888888"/>
-          <w:sz w:val="18"/>
-        </w:rPr>
-        <w:t xml:space="preserve"> [ρ recalculé par scripts/40-verif_article_v2.py (results/verif_article/spearman_toutes_campagnes.tsv) : 0,548–0,950. Les deux campagnes de Pertuis 2014 sont agrégées ; Pont-d'Ain 2014 (moins de 4 poissons) n'est pas calculable.]</w:t>
-      </w:r>
-    </w:p>
-    <w:p>
-      <w:pPr/>
-      <w:r>
-        <w:rPr>
-          <w:i/>
-          <w:color w:val="888888"/>
-          <w:sz w:val="18"/>
-        </w:rPr>
-        <w:t>[À reformuler après l'arbitrage D2 de JF : « the delay between capture and dissection » ne correspond plus au protocole. Les poissons sont gardés vivants en vivier jusqu'à la dissection, 4–6 min par poisson (André, 2026-10-03) ; le confondant est la durée de séjour en vivier, c'est-à-dire l'ordre de traitement. Dans chaque campagne, la colonne suit cet ordre, et le test du 2026-10-03 ne peut pas séparer les deux (RESULTATS R32, docs/recalcul/note_tests_2026-10-03.md).]</w:t>
-      </w:r>
-    </w:p>
-    <w:p>
-      <w:pPr>
-        <w:pStyle w:val="Heading1"/>
-      </w:pPr>
-      <w:r>
-        <w:rPr>
-          <w:color w:val="1F4E79"/>
-        </w:rPr>
-        <w:t>Alpha diversity</w:t>
-      </w:r>
-    </w:p>
-    <w:p>
-      <w:pPr/>
-      <w:r>
-        <w:rPr>
-          <w:color w:val="1F4E79"/>
-        </w:rPr>
-        <w:t>Alpha diversity was higher in the external than in the internal compartments on all four indices (Fig. 2): the ratio of geometric means was 1.51 for Shannon (95 % confidence interval 1.40–1.64), 3.00 for inverse Simpson (2.48–3.63), 1.93 for observed richness (1.71–2.18) and 1.62 for Faith's phylogenetic diversity (1.50–1.76; n = 174 individuals; Wilcoxon p ≤ 4.6 × 10⁻¹⁷). The midgut was less diverse than the hindgut on the two unweighted indices only — observed richness, ratio 0.83 (p = 0.009), and Faith's phylogenetic diversity, 0.87 (p = 0.003) — and not on Shannon (0.94, p = 0.18) or inverse Simpson (0.87, p = 0.25; n = 136), so that this contrast is metric-dependent under the rule of §8.7. Tissue was the largest identifiable source of variance in log alpha diversity (marginal share 19–26 % depending on the index), followed by individual (17–21 %) and site-year (10–14 %, sequential share), with technical terms contributing at most 0.3 % and a residual of 38–45 %; the order of the factors was the same on the four indices.</w:t>
-      </w:r>
-    </w:p>
-    <w:p>
-      <w:pPr/>
-      <w:r>
-        <w:rPr>
-          <w:color w:val="1F4E79"/>
-        </w:rPr>
-        <w:t xml:space="preserve">Hybrids were transgressive in none of the 32 combinations of pass, tissue and index (Fig. 2). The only classification supported by both an abundance-weighted and a presence-based index was dominance of </w:t>
-      </w:r>
-      <w:r>
-        <w:rPr>
-          <w:i/>
-          <w:color w:val="1F4E79"/>
-        </w:rPr>
-        <w:t>C. nasus</w:t>
-      </w:r>
-      <w:r>
-        <w:rPr>
-          <w:color w:val="1F4E79"/>
-        </w:rPr>
-        <w:t xml:space="preserve"> — hybrids not distinguishable from </w:t>
-      </w:r>
-      <w:r>
-        <w:rPr>
-          <w:i/>
-          <w:color w:val="1F4E79"/>
-        </w:rPr>
-        <w:t>C. nasus</w:t>
-      </w:r>
-      <w:r>
-        <w:rPr>
-          <w:color w:val="1F4E79"/>
-        </w:rPr>
-        <w:t xml:space="preserve"> but distinct from </w:t>
-      </w:r>
-      <w:r>
-        <w:rPr>
-          <w:i/>
-          <w:color w:val="1F4E79"/>
-        </w:rPr>
-        <w:t>P. toxostoma</w:t>
-      </w:r>
-      <w:r>
-        <w:rPr>
-          <w:color w:val="1F4E79"/>
-        </w:rPr>
-        <w:t xml:space="preserve"> — in the caudal fin in pass 1 (four indices of four; p for category 0.012–0.128) and in the midgut in pass 2 (three of four; p = 0.040–0.111). The first was unchanged with plate position as a covariate; the second was not, two indices becoming intermediate and two undetermined. Five of the 32 principal tests reached p &lt; 0.05, without correction for multiplicity, and dominance denotes here the absence of a detectable difference from </w:t>
-      </w:r>
-      <w:r>
-        <w:rPr>
-          <w:i/>
-          <w:color w:val="1F4E79"/>
-        </w:rPr>
-        <w:t>C. nasus</w:t>
-      </w:r>
-      <w:r>
-        <w:rPr>
-          <w:color w:val="1F4E79"/>
-        </w:rPr>
-        <w:t>, not an equality.</w:t>
-      </w:r>
-      <w:r>
-        <w:rPr>
-          <w:i/>
-          <w:color w:val="888888"/>
-          <w:sz w:val="18"/>
-        </w:rPr>
-        <w:t xml:space="preserve"> [Non testé : C. nasus étant en général traité en premier (§1), le classement « dominant Cn » pourrait refléter l'ordre de traitement (RESULTATS R31). Le contraste femelles/mâles (R27) n'est pas rapporté tant que le code de sexe « X » n'est pas confirmé.]</w:t>
-      </w:r>
-    </w:p>
-    <w:p>
-      <w:pPr>
-        <w:pStyle w:val="Heading1"/>
-      </w:pPr>
-      <w:r>
-        <w:rPr>
-          <w:color w:val="1F4E79"/>
-        </w:rPr>
-        <w:t>Composition by genotypic category</w:t>
-      </w:r>
-    </w:p>
-    <w:p>
-      <w:pPr/>
-      <w:r/>
-      <w:r>
-        <w:rPr>
-          <w:b w:val="0"/>
-          <w:i w:val="0"/>
-        </w:rPr>
-      </w:r>
-      <w:r>
-        <w:rPr>
-          <w:b w:val="0"/>
-          <w:i w:val="0"/>
-          <w:color w:val="1F4E79"/>
-        </w:rPr>
-      </w:r>
-      <w:r>
-        <w:rPr>
-          <w:b w:val="0"/>
-          <w:i w:val="0"/>
-          <w:color w:val="1F4E79"/>
-        </w:rPr>
-      </w:r>
-      <w:r>
-        <w:rPr>
-          <w:b w:val="0"/>
-          <w:i w:val="0"/>
-          <w:color w:val="1F4E79"/>
-        </w:rPr>
-      </w:r>
-      <w:r>
-        <w:rPr>
-          <w:b w:val="0"/>
-          <w:i w:val="0"/>
-        </w:rPr>
-      </w:r>
-      <w:r>
-        <w:rPr>
-          <w:b w:val="0"/>
-          <w:i w:val="0"/>
-        </w:rPr>
-      </w:r>
-      <w:r>
-        <w:rPr>
-          <w:b w:val="0"/>
-          <w:i w:val="0"/>
-          <w:color w:val="1F4E79"/>
-        </w:rPr>
-      </w:r>
-      <w:r>
-        <w:rPr>
-          <w:b w:val="0"/>
-          <w:i w:val="0"/>
-          <w:color w:val="1F4E79"/>
-        </w:rPr>
-      </w:r>
-      <w:r>
-        <w:rPr>
-          <w:color w:val="1F4E79"/>
-        </w:rPr>
-      </w:r>
-      <w:r>
-        <w:t xml:space="preserve">A preliminary variance partition was run to size these terms before the ecological analysis, not as a result of it, in both passes and on the four metrics. Fitted in both orderings without plate position, genotypic category accounts for a median of 1.7 % to 2.8 % of compositional variance across the 48 metric × tissue × run strata in pass 1 and 1.4 % to 3.0 % in pass 2, against a median of 19 % and 18 % for station (range across strata 14–36 % in pass 1 and 14–35 % in pass 2). No tissue is detected by all four metrics in all three runs under both permutation schemes, in either pass, with or without plate position, so a global statement that hybrids differ is not supportable: the analysis must say which metric supports which claim, in which tissue, and under which definition of a hybrid. One result is robust to every choice made here — both passes, with and without plate position, all three runs and both permutation schemes: the midgut on Jaccard (p ≤ 0.044). The caudal fin on weighted UniFrac is detected in all three runs and both schemes in pass 1 (p = 0.007–0.024), with or without plate position, and in no run in pass 2 (p = 0.073–0.235). A witness attributes this displacement to the definition of hybrids rather than to sample size: removing 22 randomly chosen individuals from the 158 that are not introgressed, twenty times, never restored the caudal signal in pass 2. At 500 reads the caudal signal is partial in pass 1 (three runs sequentially, p = 0.022–0.049; one of three with station fixed by blocks) and absent in pass 2, </w:t>
-      </w:r>
-      <w:r>
-        <w:rPr>
-          <w:i w:val="0"/>
-          <w:color w:val="1F4E79"/>
-        </w:rPr>
-        <w:t>an attenuation that is not an effect of depth: restricted to the samples retained at 3,000 reads, the 500-read matrices give the same result as at 3,000 reads (all three runs, both station-blocked schemes, p = 0.010–0.026), so the signal is diluted by the caudal-fin samples that pass the threshold only at 500 reads. As at 3,000 reads, none of twenty random removals of 22 non-introgressed individuals from pass 2 reproduced the pass-1 pattern at 500 reads.</w:t>
-      </w:r>
-      <w:r>
-        <w:rPr>
-          <w:i w:val="0"/>
-        </w:rPr>
-        <w:t xml:space="preserve"> The hindgut is the weakest tissue in pass 1 (only Jaccard is significant, in one run of three with station fixed by blocks) but not in pass 2, where with station fixed by blocks all four metrics detect it in all three runs; the witness does not resolve whether this difference reflects sample size or the definition of hybrids. The principal and sensitivity models differ in 7 of the 16 metric × tissue cells in each pass, of which 5 (pass 1) and 3 (pass 2) move between robust detection (three runs, both schemes), partial detection and none. Of the two witnesses that could have discriminated further, the separable sub-design detects category in 3 of 48 tests in pass 1 and 1 of 48 in pass 2 (with plate position), and Rosières, in pass 2, detects it in the gill on Jaccard and unweighted UniFrac in all three runs (p = 0.010–0.030); in pass 1 Rosières is not interpretable. Supplementary Table S</w:t>
-      </w:r>
-      <w:r>
-        <w:rPr>
-          <w:i w:val="0"/>
-        </w:rPr>
-        <w:t>9</w:t>
-      </w:r>
-      <w:r>
-        <w:rPr>
-          <w:i w:val="0"/>
-        </w:rPr>
-        <w:t>.</w:t>
-      </w:r>
-    </w:p>
-    <w:p>
-      <w:pPr/>
-      <w:r>
-        <w:rPr>
-          <w:color w:val="1F4E79"/>
-        </w:rPr>
-        <w:t>Figure 3 summarises these detections in the principal model with permutations constrained within station blocks (Fig. 3a, b), and the variance shares on which they rest (Fig. 3c). Fitted before category, station accounted for a median of 20.9 % (pass 1) and 20.1 % (pass 2) of compositional variance; category accounted for 2.8 % and 3.0 % when fitted first and 1.7 % and 1.4 % when fitted last. Whether the loss of the caudal-fin signal between passes is produced by dilution of the hybrid–</w:t>
-      </w:r>
-      <w:r>
-        <w:rPr>
-          <w:i/>
-          <w:color w:val="1F4E79"/>
-        </w:rPr>
-        <w:t>P. toxostoma</w:t>
-      </w:r>
-      <w:r>
-        <w:rPr>
-          <w:color w:val="1F4E79"/>
-        </w:rPr>
-        <w:t xml:space="preserve"> contrast by the 19 near-parental hybrids of </w:t>
-      </w:r>
-      <w:r>
-        <w:rPr>
-          <w:i/>
-          <w:color w:val="1F4E79"/>
-        </w:rPr>
-        <w:t>P. toxostoma</w:t>
-      </w:r>
-      <w:r>
-        <w:rPr>
-          <w:color w:val="1F4E79"/>
-        </w:rPr>
-        <w:t xml:space="preserve"> background was tested (§8.12) and remains undetermined. Relabelling as hybrids 19 </w:t>
-      </w:r>
-      <w:r>
-        <w:rPr>
-          <w:i/>
-          <w:color w:val="1F4E79"/>
-        </w:rPr>
-        <w:t>P. toxostoma</w:t>
-      </w:r>
-      <w:r>
-        <w:rPr>
-          <w:color w:val="1F4E79"/>
-        </w:rPr>
-        <w:t xml:space="preserve"> and 3 </w:t>
-      </w:r>
-      <w:r>
-        <w:rPr>
-          <w:i/>
-          <w:color w:val="1F4E79"/>
-        </w:rPr>
-        <w:t>C. nasus</w:t>
-      </w:r>
-      <w:r>
-        <w:rPr>
-          <w:color w:val="1F4E79"/>
-        </w:rPr>
-        <w:t xml:space="preserve"> drawn from the stations of the near-parental individuals removed the pass-1 signal in 16 of 20 draws, so that such dilution is sufficient to produce the displacement; but the near-parental hybrids of </w:t>
-      </w:r>
-      <w:r>
-        <w:rPr>
-          <w:i/>
-          <w:color w:val="1F4E79"/>
-        </w:rPr>
-        <w:t>P. toxostoma</w:t>
-      </w:r>
-      <w:r>
-        <w:rPr>
-          <w:color w:val="1F4E79"/>
-        </w:rPr>
-        <w:t xml:space="preserve"> background differed neither from pure </w:t>
-      </w:r>
-      <w:r>
-        <w:rPr>
-          <w:i/>
-          <w:color w:val="1F4E79"/>
-        </w:rPr>
-        <w:t>P. toxostoma</w:t>
-      </w:r>
-      <w:r>
-        <w:rPr>
-          <w:color w:val="1F4E79"/>
-        </w:rPr>
-        <w:t xml:space="preserve"> (p = 0.28–0.60) nor from intermediate hybrids (p = 0.15–0.26; n = 25–26), so that dilution is not established.</w:t>
-      </w:r>
-      <w:r>
-        <w:rPr>
-          <w:i/>
-          <w:color w:val="888888"/>
-          <w:sz w:val="18"/>
-        </w:rPr>
-        <w:t xml:space="preserve"> [Le paragraphe précédent vient des Methods (ancien §8.9) : « not as a result of it » est à reformuler maintenant qu'il figure en Results. Les médianes de station de ce paragraphe (19 % et 18 %) sont celles de la station servie après la catégorie ; 20,9 % et 20,1 % ci-dessus, station servie en premier.]</w:t>
-      </w:r>
-    </w:p>
-    <w:p>
-      <w:pPr>
-        <w:pStyle w:val="Heading1"/>
-      </w:pPr>
-      <w:r>
-        <w:rPr>
-          <w:color w:val="1F4E79"/>
-        </w:rPr>
-        <w:t>Dispersion</w:t>
-      </w:r>
-    </w:p>
-    <w:p>
-      <w:pPr/>
-      <w:r>
-        <w:rPr>
-          <w:color w:val="1F4E79"/>
-        </w:rPr>
-        <w:t xml:space="preserve">The transgressive prediction in its dispersion form — hybrids more variable than both parental categories — was not supported in either pass (Fig. 4). With station fixed by blocks, hybrids were the least dispersed of the three categories in 22 of 48 tests in pass 1 and 32 of 48 in pass 2, against the third expected under no ordering (one-sided binomial p = 0.048 and 2.4 × 10⁻⁶), and the most dispersed in 18 and 10 (p = 0.32 and 0.98). Within the stations carrying all three categories, where a dispersion difference cannot be spatial, neither direction departed from chance: hybrids were the least dispersed in 25 of 68 tests in pass 1 and 39 of 120 in pass 2, and the most dispersed in 17 and 45. The lower dispersion of hybrids is therefore a pattern of the station-blocked analysis, clear in pass 2 only and carried mainly by Bray–Curtis (median difference between hybrids and the parental mean −0.068 in pass 2 and −0.008 in pass 1), the other metrics differing by less than 0.013. Significant tests in the transgressive direction numbered 3 in pass 1 (the gill on unweighted UniFrac in two runs and the caudal fin on weighted UniFrac in one) and none in pass 2 with station fixed by blocks, and none and 5 within stations, the five of pass 2 all concerning the gill at Saint-Just-d'Ardèche, where each stratum holds three or four </w:t>
-      </w:r>
-      <w:r>
-        <w:rPr>
-          <w:i/>
-          <w:color w:val="1F4E79"/>
-        </w:rPr>
-        <w:t>P. toxostoma</w:t>
-      </w:r>
-      <w:r>
-        <w:rPr>
-          <w:color w:val="1F4E79"/>
-        </w:rPr>
-        <w:t>.</w:t>
-      </w:r>
-    </w:p>
-    <w:p>
-      <w:pPr/>
-      <w:r>
-        <w:rPr>
-          <w:color w:val="1F4E79"/>
-        </w:rPr>
-        <w:t xml:space="preserve">This bears on how the location results are read, because PERMANOVA is sensitive to heterogeneous dispersion. With station fixed by blocks, dispersion in the caudal fin was homogeneous on all four metrics in pass 2 and in all but one test in pass 1 (weighted UniFrac, one run of three, p = 0.048, hybrids most dispersed): the caudal-fin location signal on weighted UniFrac in pass 1 is a difference in composition in two runs and cannot be separated from a dispersion difference in the third. The robust midgut signal on Jaccard was accompanied by homogeneous dispersion in pass 1 and in two runs of three in pass 2. By contrast, dispersion was heterogeneous in all three runs in the midgut on unweighted UniFrac in both passes and, in pass 2, in the midgut and hindgut on Bray–Curtis, </w:t>
-      </w:r>
-      <w:r>
-        <w:rPr>
-          <w:i/>
-          <w:color w:val="1F4E79"/>
-        </w:rPr>
-        <w:t>P. toxostoma</w:t>
-      </w:r>
-      <w:r>
-        <w:rPr>
-          <w:color w:val="1F4E79"/>
-        </w:rPr>
-        <w:t xml:space="preserve"> being the most dispersed category there; the location signals detected on those metrics in those compartments cannot be separated from a dispersion effect. One reservation is not resolved: betadisper accepts no covariate, so the plate-position effect (§8.9) is not adjusted for, and a category whose samples are more spread across plate columns could carry inflated dispersion. Supplementary Table S</w:t>
-      </w:r>
-      <w:r>
-        <w:rPr>
-          <w:color w:val="1F4E79"/>
-        </w:rPr>
-        <w:t>10</w:t>
-      </w:r>
-      <w:r>
-        <w:rPr>
-          <w:color w:val="1F4E79"/>
-        </w:rPr>
-        <w:t xml:space="preserve"> and Figure S3.</w:t>
-      </w:r>
-      <w:r>
-        <w:rPr>
-          <w:i/>
-          <w:color w:val="888888"/>
-          <w:sz w:val="18"/>
-        </w:rPr>
-        <w:t xml:space="preserve"> [Correction du 2026-10-03 : l'ancienne version de ces deux paragraphes, sans correction de petit effectif, donnait 32/48 (passe 1) et 34/48 (passe 2) en station bloquée, 45/68 intra-station en passe 1 et une dispersion hétérogène en caudale ; elle est retirée (docs/plan_permdisp_biais_2026-10-03.md, scripts 24 et 39). Table S</w:t>
-      </w:r>
-      <w:r>
-        <w:rPr>
-          <w:i/>
-          <w:color w:val="888888"/>
-          <w:sz w:val="18"/>
-        </w:rPr>
-        <w:t>10</w:t>
-      </w:r>
-      <w:r>
-        <w:rPr>
-          <w:i/>
-          <w:color w:val="888888"/>
-          <w:sz w:val="18"/>
-        </w:rPr>
-        <w:t xml:space="preserve"> et Figure S3 du supplément régénérées avec les valeurs corrigées le 2026-10-05 (scripts/41-supp_S10_S3.py).]</w:t>
-      </w:r>
-    </w:p>
-    <w:p>
-      <w:pPr>
-        <w:pStyle w:val="Heading1"/>
-      </w:pPr>
-      <w:r>
-        <w:rPr>
-          <w:color w:val="1F4E79"/>
-        </w:rPr>
-        <w:t>Four-dimensional index</w:t>
-      </w:r>
-    </w:p>
-    <w:p>
-      <w:pPr/>
-      <w:r>
-        <w:rPr>
-          <w:color w:val="1F4E79"/>
-        </w:rPr>
-        <w:t>Under the principal setting, the transgressive axis of the 4H index exceeded 0.5 in all three runs in the caudal fin, midgut and hindgut of both passes (Gain + Loss = 0.58–0.69), carried by the Loss model, whereas the parental axis dominated in the gill (Gain + Loss = 0.41–0.46), carried by Intersection (Fig. 5a). None of these transgressive readings was robust under the pre-declared rule (Fig. 5b): the abundance-based version placed all eight tissue × pass combinations on the parental axis, and at family rank the caudal fin also fell on the parental side. The only robust reading was the parental axis of the gill in pass 2; in pass 1 the gill was undetermined at ρ = 0.7. No pair of compartments was distinguished, the 95 % bootstrap intervals of the transgressive axis overlapping in at least one run for every pair, in both passes. In every tissue and both passes at least 98.4 % of bootstraps lay on the Intersection side of the null plane: hybrids preferentially retain the core taxa shared by both parental species. The core of hybrids represented less than half of the mean parental core in the midgut of pass 1 (two runs of three; ratio 0.45–0.64) and 0.51–1.07 of it elsewhere. Compared at equal N, passes 1 and 2 fell on the same axis in every tissue.</w:t>
-      </w:r>
-    </w:p>
-    <w:p>
-      <w:pPr/>
-      <w:r>
-        <w:rPr>
-          <w:color w:val="1F4E79"/>
-        </w:rPr>
-        <w:t>Two observations lie outside the pre-declared rules and are reported as descriptions only. A null hybrid built by averaging one randomly drawn individual of each parental species already reached a transgressive share of 0.40–0.57; the observed share exceeded it by 0.08–0.15 in the caudal fin, 0.09–0.22 in the midgut and 0.03–0.13 in the hindgut, and differed from it by −0.04 to +0.06 in the gill (Fig. 5). Computed at its own, larger N (26–40 hosts per class), pass 2 moved the caudal fin to the parental axis (Gain + Loss = 0.42–0.47), while the midgut and hindgut remained on the transgressive side.</w:t>
-      </w:r>
-    </w:p>
-    <w:p>
-      <w:pPr>
-        <w:pStyle w:val="Title"/>
-      </w:pPr>
-      <w:r>
-        <w:rPr>
-          <w:color w:val="1F4E79"/>
-        </w:rPr>
-        <w:t>Discussion</w:t>
-      </w:r>
-    </w:p>
-    <w:p>
-      <w:pPr/>
-      <w:r>
-        <w:rPr>
-          <w:color w:val="1F4E79"/>
-        </w:rPr>
-        <w:t xml:space="preserve">Across alpha diversity, community dispersion and the 4H index, the microbiota of hybrids between </w:t>
-      </w:r>
-      <w:r>
-        <w:rPr>
-          <w:i/>
-          <w:color w:val="1F4E79"/>
-        </w:rPr>
-        <w:t>C. nasus</w:t>
-      </w:r>
-      <w:r>
-        <w:rPr>
-          <w:color w:val="1F4E79"/>
-        </w:rPr>
-        <w:t xml:space="preserve"> and </w:t>
-      </w:r>
-      <w:r>
-        <w:rPr>
-          <w:i/>
-          <w:color w:val="1F4E79"/>
-        </w:rPr>
-        <w:t>P. toxostoma</w:t>
-      </w:r>
-      <w:r>
-        <w:rPr>
-          <w:color w:val="1F4E79"/>
-        </w:rPr>
-        <w:t xml:space="preserve"> showed no transgressive pattern. Hybrids were transgressive in none of 32 alpha-diversity tests, </w:t>
-      </w:r>
-      <w:r>
-        <w:rPr>
-          <w:color w:val="1F4E79"/>
-        </w:rPr>
-        <w:t>were more dispersed than both parents no more often than expected by chance,</w:t>
-      </w:r>
-      <w:r>
-        <w:rPr>
-          <w:color w:val="1F4E79"/>
-        </w:rPr>
-        <w:t xml:space="preserve"> and no transgressive reading of the 4H index survived the robustness rule declared before computation. Where hybrids could be placed relative to their parents, they fell within the parental range: dominance of </w:t>
-      </w:r>
-      <w:r>
-        <w:rPr>
-          <w:i/>
-          <w:color w:val="1F4E79"/>
-        </w:rPr>
-        <w:t>C. nasus</w:t>
-      </w:r>
-      <w:r>
-        <w:rPr>
-          <w:color w:val="1F4E79"/>
-        </w:rPr>
-        <w:t xml:space="preserve"> in caudal-fin alpha diversity in pass 1, a parental, Intersection-dominated 4H index in the gill, and preferential retention of the core taxa shared by both parental species in every compartment. The departures detected in composition were small — genotypic category accounted for a median of 1.4–3.0 % of compositional variance against about a fifth for station — and confined to particular compartments, metrics and definitions of a hybrid. This places the system with natural hybrid zones in which the environmental component dominates [23, 24] rather than with those in which host ancestry does [21, 22], while keeping in view that a small genetic effect is the expected magnitude for a heritable but weakly heritable trait [9] and that its detection required separating the spatial and technical axes beforehand, as in stickleback [10].</w:t>
-      </w:r>
-    </w:p>
-    <w:p>
-      <w:pPr/>
-      <w:r>
-        <w:rPr>
-          <w:color w:val="1F4E79"/>
-        </w:rPr>
-        <w:t>The expectation derived from Guivier et al. [31], that a hybrid signal would be most pronounced in the digestive compartments, is partly supported. The only compositional result that withstood every analytical choice concerned the midgut, on a presence-based metric, and in pass 2 both digestive compartments were detected by all four metrics with station fixed by blocks. But the caudal fin carried, in pass 1, a signal on weighted UniFrac that no digestive compartment showed on that metric, the gill was the compartment in which the 4H index was robustly parental, and the 4H index distinguished no pair of compartments. Hybrid status therefore does not matter equally in all compartments, but which compartment carries a difference depends on the metric. The rule adopted here, which states a result as established only when an abundance-weighted and a presence-based metric both support it, makes this dependence explicit rather than resolving it; it also explains why the 4H index, a presence-based construct in its principal form, departed from its abundance-based version in every compartment but the gill.</w:t>
-      </w:r>
-    </w:p>
-    <w:p>
-      <w:pPr/>
-      <w:r>
-        <w:rPr>
-          <w:color w:val="1F4E79"/>
-        </w:rPr>
-        <w:t xml:space="preserve">How hybrids are defined mattered as much as which compartment is examined. The caudal-fin signal obtained with the 20 intermediate hybrids disappeared when the 22 near-parental individuals were added, and twenty random removals of 22 non-introgressed fish never reproduced the displacement, so that it is attributable to who is called a hybrid rather than to sample size. Whether near-parental hybrids of </w:t>
-      </w:r>
-      <w:r>
-        <w:rPr>
-          <w:i/>
-          <w:color w:val="1F4E79"/>
-        </w:rPr>
-        <w:t>P. toxostoma</w:t>
-      </w:r>
-      <w:r>
-        <w:rPr>
-          <w:color w:val="1F4E79"/>
-        </w:rPr>
-        <w:t xml:space="preserve"> background dilute the contrast because their microbiota resembles that of </w:t>
-      </w:r>
-      <w:r>
-        <w:rPr>
-          <w:i/>
-          <w:color w:val="1F4E79"/>
-        </w:rPr>
-        <w:t>P. toxostoma</w:t>
-      </w:r>
-      <w:r>
-        <w:rPr>
-          <w:color w:val="1F4E79"/>
-        </w:rPr>
-        <w:t xml:space="preserve"> could not be established at the available sample size. In a mosaic hybrid zone [30] in which most introgressed individuals depart from a parental genome on a single chromosome, a hybrid class is a decision; reporting both passes shows how much of any conclusion rests on that decision, and we suggest that studies of natural hybrid zones report it in the same way.</w:t>
-      </w:r>
-    </w:p>
-    <w:p>
-      <w:pPr/>
-      <w:r>
-        <w:rPr>
-          <w:color w:val="1F4E79"/>
-        </w:rPr>
-        <w:t>That hybrids were not more dispersed than their parents runs against the expectation that the microbiota of hybrids is more variable because their genomes combine parental elements in variable proportions. The opposite tendency, hybrids less dispersed than both parents, was clear only in pass 2 with station fixed by blocks, absent within stations and carried mainly by Bray–Curtis, and should not be read as a general property of hybrids here. The dispersion analysis also illustrates a pitfall of unbalanced designs: without correction for group size the distance to the group centre is underestimated in small groups, and because hybrids were the smallest category in every stratum, the uncorrected analysis yielded a strong and apparently replicated reduction of hybrid dispersion — 32 of 48 station-blocked tests in pass 1 and 45 of 68 within stations — that largely disappeared once corrected. Hybrid classes are small in most natural hybrid zones, and the correction should be applied by default in that setting [48].</w:t>
-      </w:r>
-    </w:p>
-    <w:p>
-      <w:pPr/>
-      <w:r>
-        <w:rPr>
-          <w:color w:val="1F4E79"/>
-        </w:rPr>
-        <w:t xml:space="preserve">The 4H index adds two points that the location and dispersion analyses do not. First, in its abundance-based version — </w:t>
-      </w:r>
-      <w:r>
-        <w:rPr>
-          <w:color w:val="1F4E79"/>
-        </w:rPr>
-        <w:t>one of the two forms in which the framework's authors compared published systems [14]</w:t>
-      </w:r>
-      <w:r>
-        <w:rPr>
-          <w:color w:val="1F4E79"/>
-        </w:rPr>
-        <w:t xml:space="preserve"> — the index placed every compartment on the parental axis (Gain + Loss = 0.22–0.35), as in the </w:t>
-      </w:r>
-      <w:r>
-        <w:rPr>
-          <w:i/>
-          <w:color w:val="1F4E79"/>
-        </w:rPr>
-        <w:t>Neotoma</w:t>
-      </w:r>
-      <w:r>
-        <w:rPr>
-          <w:color w:val="1F4E79"/>
-        </w:rPr>
-        <w:t xml:space="preserve"> woodrat system (0.12) and unlike the </w:t>
-      </w:r>
-      <w:r>
-        <w:rPr>
-          <w:i/>
-          <w:color w:val="1F4E79"/>
-        </w:rPr>
-        <w:t>Aspidoscelis</w:t>
-      </w:r>
-      <w:r>
-        <w:rPr>
-          <w:color w:val="1F4E79"/>
-        </w:rPr>
-        <w:t xml:space="preserve"> lizard and </w:t>
-      </w:r>
-      <w:r>
-        <w:rPr>
-          <w:i/>
-          <w:color w:val="1F4E79"/>
-        </w:rPr>
-        <w:t>Kikihia</w:t>
-      </w:r>
-      <w:r>
-        <w:rPr>
-          <w:color w:val="1F4E79"/>
-        </w:rPr>
-        <w:t xml:space="preserve"> cicada systems (0.71 and 0.64); on a hybrid lizard, transgression has been associated with ecological success rather than with dysbiosis [15], so the absence of transgression here carries no implication for hybrid fitness either way. Second, as its authors found for a natural hybrid system, the index was sensitive to its settings: the choice between presence and abundance reversed the reading in three compartments of four, and in the caudal fin so did the number of hosts per class, from 9 to 26–27. A null hybrid built from parental individuals already sits close to the 0.5 boundary between the two axes, which makes that boundary a weak criterion for calling a hybrid microbiota transgressive. We therefore read the 4H index as a description of taxon membership conditional on its settings, and not as an independent test of the intermediate, dominant and transgressive hypotheses.</w:t>
-      </w:r>
-    </w:p>
-    <w:p>
-      <w:pPr/>
-      <w:r>
-        <w:rPr>
-          <w:color w:val="1F4E79"/>
-        </w:rPr>
-        <w:t xml:space="preserve">Four limits bound these conclusions. Genotypic category is confounded with station, and the three stations that carry all three categories hold 65–74 individuals, so that every category effect is estimated mostly between stations and is read as a pattern co-varying with station and category. Plate position affected composition and followed processing order in every campaign; the mechanism — extraction order, reagent drift within a plate, cross-contamination between adjacent wells or time spent in the holding tank — is not identified, and because </w:t>
+        <w:t xml:space="preserve">Four limits bound these conclusions. Genotypic category is confounded with station, and the three stations carrying all three categories hold 65–74 individuals, so that category effects are estimated mostly between stations. Plate position affected composition and followed processing order in every campaign; its mechanism — extraction order, reagent drift within a plate, cross-contamination between adjacent wells or time spent in the holding tank — is not identified, and because </w:t>
       </w:r>
       <w:r>
         <w:rPr>

</xml_diff>

<commit_message>
feat: D2 tranchee par JF le 06/10 (option ii) - l article propose la duree de sejour en vivier avant dissection comme mecanisme candidat de l effet de colonne. Results : protocole corrige ("delay between capture and dissection" ne correspondait pas au protocole d Andre), lecture du mecanisme ajoutee avec ses deux appuis (effet specifique a la colonne, rang 7 et 6 de 24 strates et bord aucun ; position sur plaque sans effet mesurable au laboratoire, observation non publiee) et statut d hypothese explicite. Discussion : meme lecture, meme reserve. Note grise "A reformuler apres l arbitrage D2" supprimee, note de tracabilite ajoutee. La premisse est exterieure au jeu de donnees : R32 montre que colonne, ordre de traitement et duree de sejour ne sont pas separables ici. scripts/49 s execute hors cluster (python-docx absent de meso), comme 42, 44, 47 et 48.
</commit_message>
<xml_diff>
--- a/docs/manuscrit/Article.docx
+++ b/docs/manuscrit/Article.docx
@@ -1366,7 +1366,7 @@
         <w:rPr>
           <w:color w:val="1F4E79"/>
         </w:rPr>
-        <w:t>) is too small for a separate witness. In the symmetric ordering with category fitted first, column still contributes (21 and 22 of 24 strata). And plate row is significant in 7 and 6 of 24 strata and plate edge in none, making the effect specific to column, as expected of an effect tracking processing order rather than evaporation or thermal gradients. The mechanism of the column effect is not identified: extraction order, reagent-batch drift within a plate, cross-contamination between adjacent wells and the delay between capture and dissection are not separated by these data, and no negative control isolates any of them.</w:t>
+        <w:t>) is too small for a separate witness. In the symmetric ordering with category fitted first, column still contributes (21 and 22 of 24 strata). And plate row is significant in 7 and 6 of 24 strata and plate edge in none, making the effect specific to column, as expected of an effect tracking processing order rather than evaporation or thermal gradients. The mechanism of the column effect is not identified: extraction order, reagent-batch drift within a plate, cross-contamination between adjacent wells and the time each fish spent in the holding tank before dissection are not separated by these data, and no negative control isolates any of them.</w:t>
       </w:r>
     </w:p>
     <w:p>
@@ -1375,7 +1375,7 @@
         <w:rPr>
           <w:color w:val="1F4E79"/>
         </w:rPr>
-        <w:t>Within every fishing campaign, plate column followed the order in which fish were processed (Spearman ρ between individual number and plate column, 0.55–0.95 over 12 station-year campaigns; §8.9 and §8.12), so that in this design the column effect cannot be separated from processing order, and therefore from the time each fish spent in the holding tank before dissection.</w:t>
+        <w:t>Within every fishing campaign, plate column followed the order in which fish were processed (Spearman ρ between individual number and plate column, 0.55–0.95 over 12 station-year campaigns; §8.9 and §8.12), so that in this design the column effect cannot be separated from processing order, and therefore from the time each fish spent in the holding tank before dissection. Two observations make a physical plate artefact the less likely reading: the effect is specific to column, row reaching significance in only 7 and 6 of 24 strata and edge in none, and position within a plate has shown no measurable effect on 16S community composition in our laboratory (unpublished observations). We therefore read the column effect as a marker of processing order and propose the time spent in the holding tank before dissection as the candidate mechanism; this design cannot test that proposal, which remains a hypothesis.</w:t>
       </w:r>
       <w:r>
         <w:rPr>
@@ -1385,16 +1385,13 @@
         </w:rPr>
         <w:t xml:space="preserve"> [ρ recalculé par scripts/40-verif_article_v2.py (results/verif_article/spearman_toutes_campagnes.tsv) : 0,548–0,950. Les deux campagnes de Pertuis 2014 sont agrégées ; Pont-d'Ain 2014 (moins de 4 poissons) n'est pas calculable.]</w:t>
       </w:r>
-    </w:p>
-    <w:p>
-      <w:pPr/>
       <w:r>
         <w:rPr>
           <w:i/>
           <w:color w:val="888888"/>
           <w:sz w:val="18"/>
         </w:rPr>
-        <w:t>[À reformuler après l'arbitrage D2 de JF : « the delay between capture and dissection » ne correspond plus au protocole. Les poissons sont gardés vivants en vivier jusqu'à la dissection, 4–6 min par poisson (André, 2026-10-03) ; le confondant est la durée de séjour en vivier, c'est-à-dire l'ordre de traitement. Dans chaque campagne, la colonne suit cet ordre, et le test du 2026-10-03 ne peut pas séparer les deux (RESULTATS R32, docs/recalcul/note_tests_2026-10-03.md).]</w:t>
+        <w:t xml:space="preserve"> [Mécanisme proposé sur arbitrage de JF du 2026-10-06 (D2, option ii). La prémisse — la position sur plaque n'a pas d'effet mesurable sur la composition — est une observation non publiée du laboratoire, extérieure à ce jeu de données : R32 montre que colonne, ordre de traitement et durée de séjour ne sont pas séparables ici. À retirer avant soumission.]</w:t>
       </w:r>
     </w:p>
     <w:p>
@@ -1887,20 +1884,19 @@
         <w:rPr>
           <w:color w:val="1F4E79"/>
         </w:rPr>
-        <w:t xml:space="preserve">Four limits bound these conclusions. Genotypic category is confounded with station, and the three stations carrying all three categories hold 65–74 individuals, so that category effects are estimated mostly between stations. Plate position affected composition and followed processing order in every campaign; its mechanism — extraction order, reagent drift within a plate, cross-contamination between adjacent wells or time spent in the holding tank — is not identified, and because </w:t>
+        <w:t>Four limits bound these conclusions. Genotypic category is confounded with station, and the three stations carrying all three categories hold 65–74 individuals, so that category effects are estimated mostly between stations. Plate position affected composition and followed processing order in every campaign; its mechanism — extraction order, reagent drift within a plate, cross-contamination between adjacent wells or time spent in the holding tank — is not identified by these data; position within a plate has no measurable effect on 16S composition in our laboratory (unpublished observations) and the effect was specific to column, so we read it as a marker of processing order and propose the time spent in the holding tank before dissection as the candidate mechanism, a hypothesis this design cannot test. Because C. nasus was generally processed first, processing order could contribute to</w:t>
       </w:r>
       <w:r>
         <w:rPr>
           <w:i/>
           <w:color w:val="1F4E79"/>
         </w:rPr>
-        <w:t>C. nasus</w:t>
-      </w:r>
-      <w:r>
-        <w:rPr>
-          <w:color w:val="1F4E79"/>
-        </w:rPr>
-        <w:t xml:space="preserve"> was generally processed first it could contribute to the dominance of </w:t>
+      </w:r>
+      <w:r>
+        <w:rPr>
+          <w:color w:val="1F4E79"/>
+        </w:rPr>
+        <w:t xml:space="preserve"> the dominance of </w:t>
       </w:r>
       <w:r>
         <w:rPr>

</xml_diff>

<commit_message>
feat: decisions 5 et 7 de JF du 06/10 - (5) ecarts de retention rapportes comme l etendue sur les trois runs et non plus sur le seul run durance1 : article 8.6 (caudale 3 000 : 50 % contre 79-86 %, 64-67 %, ecarts 29-36 et 15-20 points ; 500 lectures 2,6-3,8 et 3,4-5,7 ; midgut 5,7-14,0 et 7,8-8,9) ; supplement Note S2 (dont station Confluence Buech-Meouge 20-48 et 7-36), Table S6 (colonne et note) et legende de la Figure S1 ; valeurs calculees par scripts/50 depuis les effectifs du script 43 (double arrondi evite : 32,654 -> 32,7). Script 40 : controles 8.6 sur l etendue des trois runs, controle d absence ajoute. (7) script 30 : attente metadonnees contenant la table, seule ligne en trop admise et nommee 15Bue1014Ch03A__durance3.
</commit_message>
<xml_diff>
--- a/docs/manuscrit/Article.docx
+++ b/docs/manuscrit/Article.docx
@@ -695,13 +695,13 @@
         <w:rPr>
           <w:color w:val="1F4E79"/>
         </w:rPr>
-        <w:t>in the caudal fin, in sequencing run durance1, 50 % of intermediate hybrids</w:t>
-      </w:r>
-      <w:r>
-        <w:rPr>
-          <w:color w:val="1F4E79"/>
-        </w:rPr>
-        <w:t xml:space="preserve"> passed the threshold against 86 % of </w:t>
+        <w:t>in the caudal fin, across the three sequencing runs, 50 % of intermediate hybrids</w:t>
+      </w:r>
+      <w:r>
+        <w:rPr>
+          <w:color w:val="1F4E79"/>
+        </w:rPr>
+        <w:t xml:space="preserve"> passed the threshold against 79–86 % of </w:t>
       </w:r>
       <w:r>
         <w:rPr>
@@ -714,7 +714,7 @@
         <w:rPr>
           <w:color w:val="1F4E79"/>
         </w:rPr>
-        <w:t xml:space="preserve"> (pass 1), and 67 % of all 42 hybrids (pass 2), a gap of 36 and 20 points respectively. Claims resting on abundance-weighted metrics are therefore accompanied by a sensitivity analysis at 500 reads, where the caudal-fin gap falls to 3.8 points (pass 1) and 5.7 points (pass 2) and 2,067 samples are retained (1,825 in pass 1); claims resting on presence-based metrics are reported at 3,000 reads with the selection declared, the midgut gap (14.0 and 8.9 points) persisting at 500 reads in any case (Supplementary Table S6 and Figure S1).</w:t>
+        <w:t xml:space="preserve"> (pass 1), and 64–67 % of all 42 hybrids (pass 2), a gap of 29–36 and 15–20 points respectively. Claims resting on abundance-weighted metrics are therefore accompanied by a sensitivity analysis at 500 reads, where the caudal-fin gap falls to 2.6–3.8 points (pass 1) and 3.4–5.7 points (pass 2) and 2,067 samples are retained (1,825 in pass 1); claims resting on presence-based metrics are reported at 3,000 reads with the selection declared, the midgut gap (5.7–14.0 and 7.8–8.9 points) persisting at 500 reads in any case (Supplementary Table S6 and Figure S1).</w:t>
       </w:r>
       <w:r>
         <w:rPr>
@@ -722,7 +722,7 @@
           <w:color w:val="888888"/>
           <w:sz w:val="18"/>
         </w:rPr>
-        <w:t xml:space="preserve"> [Écarts de rétention : valeurs du run durance1 (scripts/43-retention_profondeur.py, results/depth_agreement/retention_par_categorie.tsv, 2026-10-05) ; aucun script ne les produisait auparavant. Sur les trois runs : caudale à 3 000 lectures 29,0–36,4 points (passe 1) et 14,7–19,8 (passe 2) ; à 500 lectures 2,6–3,8 et 3,4–5,7 ; midgut à 500 lectures 5,7–14,0 et 7,8–8,9 (runs confondus : 32,3 / 17,2 ; 3,4 / 4,5 ; 8,5 / 8,2). Le midgut de la passe 1 dépend du run (14,0 dans durance1, 5,7 dans les deux autres). Rapporter la valeur d'un run ou l'étendue : à trancher par JF.]</w:t>
+        <w:t xml:space="preserve"> [Écarts de rétention : étendue sur les trois runs de séquençage, arbitrage de JF du 2026-10-06 (décision 5), au lieu des valeurs du seul run durance1. Source : scripts/43-retention_profondeur.py, results/depth_agreement/retention_par_categorie.tsv ; insertion par scripts/50-retention_trois_runs.py. À retirer avant soumission.]</w:t>
       </w:r>
     </w:p>
     <w:p>

</xml_diff>

<commit_message>
docs: reponses d Andre du 06/10 consignees mot pour mot et portees au manuscrit - (1) autorisations : ONEMA et DDT 04, 05, 84 ; Suran avec la Federation de l Ain pour la peche et la protection des milieux aquatiques, Ardeche avec l ONEMA 07 (aucun numero pour ces deux bassins ; place de Benjamin Herodet a preciser) ; (2) euthanasie par dislocation cervicale confirmee, avec sa raison (ne pas alterer l expression des genes des tissus partages avec le transcriptome) ; (3) tube ethanol 95 % sur glace sur le terrain puis -80 C au laboratoire ; (4) reference au projet FACIES retiree du Funding, avec la mention du financement de Guivier et al. qui reposait sur le meme rattachement (a valider par JF) ; (5) code de sexe X : non sexe, legende de la Table S2 completee ; X et vide sont deux categories (juveniles / non attribues) dont la correspondance reste a confirmer. Script 52.
</commit_message>
<xml_diff>
--- a/docs/manuscrit/Article.docx
+++ b/docs/manuscrit/Article.docx
@@ -361,14 +361,44 @@
           <w:i w:val="0"/>
           <w:color w:val="1F4E79"/>
         </w:rPr>
-        <w:t xml:space="preserve"> (30 min to 1 h per station) and kept alive in a large holding tank filled with river water until dissection. They were then processed one at a time: each fish was euthanised by cervical dislocation and immediately dissected with sterile material, which took 4–6 min per fish, so that the catch of a station (4 to 25 retained fish per session) was processed in about 2 h. The time spent in the holding tank therefore ranged from a few minutes to about 2 h; nases, which are more fragile, were generally processed first.</w:t>
+        <w:t xml:space="preserve"> (30 min to 1 h per station) and kept alive in a large holding tank filled with river water until dissection. They were then processed one at a time: </w:t>
       </w:r>
       <w:r>
         <w:rPr>
           <w:b w:val="0"/>
           <w:i w:val="0"/>
-        </w:rPr>
-        <w:t xml:space="preserve"> The study was conducted according to international guidelines of animal care and under national protocol authorisations n° 2014-156-0001 and n° 2015-1426DDT605.</w:t>
+          <w:color w:val="1F4E79"/>
+        </w:rPr>
+        <w:t>each fish was euthanised by cervical dislocation, the method retained so as not to alter gene expression in the tissues shared with transcriptome analyses (§2), and immediately dissected</w:t>
+      </w:r>
+      <w:r>
+        <w:rPr>
+          <w:b w:val="0"/>
+          <w:i w:val="0"/>
+          <w:color w:val="1F4E79"/>
+        </w:rPr>
+        <w:t xml:space="preserve"> with sterile material, which took 4–6 min per fish, so that the catch of a station (4 to 25 retained fish per session) was processed in about 2 h. The time spent in the holding tank therefore ranged from a few minutes to about 2 h; nases, which are more fragile, were generally processed first.</w:t>
+      </w:r>
+      <w:r>
+        <w:rPr>
+          <w:b w:val="0"/>
+          <w:i w:val="0"/>
+        </w:rPr>
+        <w:t xml:space="preserve"> The study was conducted according to international guidelines of animal care </w:t>
+      </w:r>
+      <w:r>
+        <w:rPr>
+          <w:b w:val="0"/>
+          <w:i w:val="0"/>
+          <w:color w:val="1F4E79"/>
+        </w:rPr>
+        <w:t>and under authorisations n° 2014-156-0001 and n° 2015-1426DDT605, approved by ONEMA and the Directions départementales des territoires of Alpes-de-Haute-Provence, Hautes-Alpes and Vaucluse; fishing in the Suran was conducted with the Fédération de l'Ain pour la pêche et la protection des milieux aquatiques, and in the Ardèche with the Ardèche departmental service of ONEMA.</w:t>
+      </w:r>
+      <w:r>
+        <w:rPr>
+          <w:b w:val="0"/>
+          <w:i w:val="0"/>
+        </w:rPr>
       </w:r>
     </w:p>
     <w:p>
@@ -378,7 +408,7 @@
           <w:color w:val="888888"/>
           <w:sz w:val="18"/>
         </w:rPr>
-        <w:t>[À confirmer par André — questions de suivi envoyées le 2026-10-03. (1) Autorisations : André confirme les deux numéros et indique une approbation par l'ONEMA et les DDT des Alpes-de-Haute-Provence, des Hautes-Alpes et du Vaucluse ; or les stations du Suran (Ain) et de l'Ardèche (Saint-Just-d'Ardèche, Rosières) sont hors de ces départements. Remplacer « national protocol authorisations » une fois la couverture établie. (2) Euthanasie par dislocation cervicale juste avant la dissection de chaque poisson : non confirmée explicitement. La séquence pêche → vivier → dissection, les durées et l'ordre de traitement viennent d'André (2026-10-03 ; hotus en priorité : 2026-09-25).]</w:t>
+        <w:t>[Autorités, euthanasie et raison de la méthode : André, 2026-10-06 (docs/reponses_andre_2026-10-06.md). Reste ouvert : aucun numéro d'autorisation n'est donné pour le Suran ni pour l'Ardèche ; place de Benjamin Hérodet (Fédération de l'Ain) à préciser — déclaration d'éthique, remerciements ou auteurs. La séquence pêche → vivier → dissection, les durées et l'ordre de traitement viennent d'André (2026-10-03 ; hotus en priorité : 2026-09-25).]</w:t>
       </w:r>
     </w:p>
     <w:p>
@@ -419,7 +449,23 @@
           <w:i w:val="0"/>
           <w:color w:val="1F4E79"/>
         </w:rPr>
-        <w:t>a lobe of the caudal fin (code 01), the gill (05), the hindgut (03) and the midgut (02), dissected in that order. Each tissue was cut in two and placed in two 1.5 mL tubes: one half was stored in 95% ethanol at −80 °C for microbiota analysis, the other was frozen at −80 °C for transcriptome analyses, including genotyping.</w:t>
+        <w:t xml:space="preserve">a lobe of the caudal fin (code 01), the gill (05), the hindgut (03) and the midgut (02), dissected in that order. Each tissue was cut in two and placed in two 1.5 mL tubes: </w:t>
+      </w:r>
+      <w:r>
+        <w:rPr>
+          <w:b w:val="0"/>
+          <w:i w:val="0"/>
+          <w:color w:val="1F4E79"/>
+        </w:rPr>
+        <w:t>one half was placed in 95% ethanol for microbiota analysis, kept on ice in the field and stored at −80 °C in the laboratory; the other</w:t>
+      </w:r>
+      <w:r>
+        <w:rPr>
+          <w:b w:val="0"/>
+          <w:i w:val="0"/>
+          <w:color w:val="1F4E79"/>
+        </w:rPr>
+        <w:t xml:space="preserve"> was frozen at −80 °C for transcriptome analyses, including genotyping.</w:t>
       </w:r>
       <w:r>
         <w:rPr>
@@ -436,7 +482,7 @@
           <w:color w:val="888888"/>
           <w:sz w:val="18"/>
         </w:rPr>
-        <w:t>[À confirmer par André — question de suivi envoyée le 2026-10-03 : température de conservation du tube en éthanol 95 % destiné au microbiote (−80 °C dans Guivier et al. 2017 ; non précisée dans sa réponse). Tissu 01 = lobe de nageoire caudale, ordre de dissection et partage de chaque tissu en deux tubes : André, 2026-10-03.]</w:t>
+        <w:t>[Conservation du tube éthanol (glace sur le terrain, −80 °C au laboratoire) : André, 2026-10-06. Tissu 01 = lobe de nageoire caudale, ordre de dissection et partage de chaque tissu en deux tubes : André, 2026-10-03. À retirer avant soumission.]</w:t>
       </w:r>
     </w:p>
     <w:p>
@@ -1480,7 +1526,7 @@
           <w:color w:val="888888"/>
           <w:sz w:val="18"/>
         </w:rPr>
-        <w:t xml:space="preserve"> [Non testé : C. nasus étant en général traité en premier (§1), le classement « dominant Cn » pourrait refléter l'ordre de traitement (RESULTATS R31). Le contraste femelles/mâles (R27) n'est pas rapporté tant que le code de sexe « X » n'est pas confirmé.]</w:t>
+        <w:t xml:space="preserve"> [Ordre de traitement testé le 2026-10-06 (plan docs/plan_R31_ordre_2026-10-06.md, f3916c1 ; scripts/51) : dominance de C. nasus non attribuable à l'ordre ; intégration au texte en attente de JF. Code de sexe « X » : individus non sexés (André, 2026-10-06) ; le contraste femelles/mâles de R27 (F 33, M 78 ; X et vides exclus) peut être rapporté — décision de JF attendue.]</w:t>
       </w:r>
     </w:p>
     <w:p>
@@ -2057,7 +2103,17 @@
         <w:rPr>
           <w:color w:val="1F4E79"/>
         </w:rPr>
-        <w:t>Fish were captured by electrofishing and euthanised before dissection under authorisations n° 2014-156-0001 and n° 2015-1426DDT605, following international guidelines of animal care.</w:t>
+      </w:r>
+      <w:r>
+        <w:rPr>
+          <w:color w:val="1F4E79"/>
+        </w:rPr>
+        <w:t>Fish were captured by electrofishing and euthanised by cervical dislocation immediately before dissection, following international guidelines of animal care, under authorisations n° 2014-156-0001 and n° 2015-1426DDT605, approved by ONEMA and the Directions départementales des territoires of Alpes-de-Haute-Provence, Hautes-Alpes and Vaucluse; fishing in the Suran was conducted with the Fédération de l'Ain pour la pêche et la protection des milieux aquatiques, and in the Ardèche with the Ardèche departmental service of ONEMA.</w:t>
+      </w:r>
+      <w:r>
+        <w:rPr>
+          <w:color w:val="1F4E79"/>
+        </w:rPr>
       </w:r>
       <w:r>
         <w:rPr>
@@ -2065,7 +2121,7 @@
           <w:color w:val="888888"/>
           <w:sz w:val="18"/>
         </w:rPr>
-        <w:t xml:space="preserve"> [À compléter (questions de suivi à André, 2026-10-03) : autorités de délivrance — ONEMA et DDT 04, 05 et 84 selon André — et couverture des stations de l'Ain et de l'Ardèche ; méthode d'euthanasie (dislocation cervicale, non confirmée). Consentement : sans objet.]</w:t>
+        <w:t xml:space="preserve"> [Autorités et euthanasie : André, 2026-10-06. Reste ouvert : aucun numéro d'autorisation n'est donné pour le Suran ni pour l'Ardèche ; place de Benjamin Hérodet (Fédération de l'Ain) à préciser — déclaration d'éthique, remerciements ou auteurs. Consentement : sans objet.]</w:t>
       </w:r>
     </w:p>
     <w:p>
@@ -2171,7 +2227,21 @@
           <w:i w:val="0"/>
           <w:color w:val="1F4E79"/>
         </w:rPr>
-        <w:t>This work was funded by Électricité de France (EDF) through an EDF–CNRS doctoral contract (AGDI 428481) financing the thesis of Arnaud Ungaro, the contract that also funded Guivier et al. [31] within the FACIES project, with the support of the Fédération de l'Ain pour la pêche et la protection des milieux aquatiques.</w:t>
+        <w:t xml:space="preserve">This work was funded by Électricité de France (EDF) through an EDF–CNRS doctoral contract (AGDI 428481) </w:t>
+      </w:r>
+      <w:r>
+        <w:rPr>
+          <w:i w:val="0"/>
+          <w:color w:val="1F4E79"/>
+        </w:rPr>
+        <w:t>financing the thesis of Arnaud Ungaro, with the support</w:t>
+      </w:r>
+      <w:r>
+        <w:rPr>
+          <w:i w:val="0"/>
+          <w:color w:val="1F4E79"/>
+        </w:rPr>
+        <w:t xml:space="preserve"> of the Fédération de l'Ain pour la pêche et la protection des milieux aquatiques.</w:t>
       </w:r>
     </w:p>
     <w:p>
@@ -2182,7 +2252,7 @@
           <w:color w:val="888888"/>
           <w:sz w:val="18"/>
         </w:rPr>
-        <w:t>[Financement : référence du contrat « EDF-CNRS AGDI 428481 » (André, 2026-10-03). Le rattachement de ce contrat de thèse au projet FACIES de Guivier et al. (2017) combine deux réponses d'André (2026-09-30 et 2026-10-03) et n'est pas confirmé explicitement — à vérifier. Section Acknowledgements : à rédiger en fin de manuscrit (André, 2026-10-03).]</w:t>
+        <w:t>[Financement : contrat « EDF-CNRS AGDI 428481 » (André, 2026-10-03). Référence au projet FACIES retirée sur décision d'André (2026-10-06 : rattachement non établi) ; la mention « the contract that also funded Guivier et al. [31] », qui reposait sur ce même rattachement, est retirée avec elle — à valider par JF. Section Acknowledgements : à rédiger (André) ; y nommer Benjamin Hérodet si c'est la place retenue.]</w:t>
       </w:r>
     </w:p>
     <w:p>

</xml_diff>

<commit_message>
feat: test R31 (controle v) et effet de l ordre sur l alpha integres au manuscrit (decision de JF du 06/10) - 8.12 : controle (v) decrit avec sa chronologie (declare apres les resultats de iii, avant son calcul) ; Results : ordre incapable de produire la dominance de C. nasus (ecart de rang Hy - Pt 0,5 et 0,4 ; pente requise 16 a 37 fois la pente intra-cellule), alpha du hindgut en baisse avec le rang (8/8, p <= 0,008, 25-46 % par dix rangs), midgut sur indices de presence (3/8), sans biais des contrastes du hindgut ; Discussion : 'which was not tested' remplace. Corrige l italique de C. nasus perdu au matin par le remplacement a travers les runs du script 49 (erreur de l agent). Script 40 : 5 controles chiffres, 1 controle d absence, 1 controle d italique.
</commit_message>
<xml_diff>
--- a/docs/manuscrit/Article.docx
+++ b/docs/manuscrit/Article.docx
@@ -1061,6 +1061,38 @@
         </w:rPr>
         <w:t xml:space="preserve"> and with intermediate hybrids. (iii) The classification of hybrid alpha diversity described in §8.10. (iv) Whether plate column and processing order can be separated, by the Spearman correlation between individual number and plate column within each fishing campaign.</w:t>
       </w:r>
+      <w:r>
+        <w:rPr>
+          <w:color w:val="1F4E79"/>
+        </w:rPr>
+        <w:t xml:space="preserve"> A fifth control was declared in the same way, in a document committed after the results of (iii) were known but before its own computation. (v) Whether processing order could produce the classification of hybrid alpha diversity: fish were ranked by individual number within each campaign (1 = first dissected; the two 2014 Pertuis series, fished on different days, were ranked separately); the slope of log alpha diversity on rank was estimated within station × category cells, where it cannot carry a category effect, and compared with the slope that rank alone would require to produce the hybrid − </w:t>
+      </w:r>
+      <w:r>
+        <w:rPr>
+          <w:i/>
+          <w:color w:val="1F4E79"/>
+        </w:rPr>
+        <w:t>P. toxostoma</w:t>
+      </w:r>
+      <w:r>
+        <w:rPr>
+          <w:color w:val="1F4E79"/>
+        </w:rPr>
+        <w:t xml:space="preserve"> contrast, given the mean rank difference between hybrids and </w:t>
+      </w:r>
+      <w:r>
+        <w:rPr>
+          <w:i/>
+          <w:color w:val="1F4E79"/>
+        </w:rPr>
+        <w:t>P. toxostoma</w:t>
+      </w:r>
+      <w:r>
+        <w:rPr>
+          <w:color w:val="1F4E79"/>
+        </w:rPr>
+        <w:t xml:space="preserve"> within stations.</w:t>
+      </w:r>
     </w:p>
     <w:p>
       <w:pPr>
@@ -1522,11 +1554,56 @@
       </w:r>
       <w:r>
         <w:rPr>
+          <w:color w:val="1F4E79"/>
+        </w:rPr>
+        <w:t xml:space="preserve"> Processing order could not produce either classification (§8.12, control v): within stations, hybrids and </w:t>
+      </w:r>
+      <w:r>
+        <w:rPr>
+          <w:i/>
+          <w:color w:val="1F4E79"/>
+        </w:rPr>
+        <w:t>P. toxostoma</w:t>
+      </w:r>
+      <w:r>
+        <w:rPr>
+          <w:color w:val="1F4E79"/>
+        </w:rPr>
+        <w:t xml:space="preserve"> were dissected at the same mean rank (differences of 0.5 ranks in the caudal fin in pass 1 and 0.4 in the midgut in pass 2), so that the slope required to produce the hybrid − </w:t>
+      </w:r>
+      <w:r>
+        <w:rPr>
+          <w:i/>
+          <w:color w:val="1F4E79"/>
+        </w:rPr>
+        <w:t>P. toxostoma</w:t>
+      </w:r>
+      <w:r>
+        <w:rPr>
+          <w:color w:val="1F4E79"/>
+        </w:rPr>
+        <w:t xml:space="preserve"> contrast exceeded the within-cell slope on rank by a factor of 16 to 37 on every index. Alpha diversity nevertheless declined with processing rank within station × category cells in the hindgut, on all four indices in both passes (p ≤ 0.008), by 25–46 % per ten ranks, and in the midgut on presence-based indices only (3 of 8 tests). Hybrids and </w:t>
+      </w:r>
+      <w:r>
+        <w:rPr>
+          <w:i/>
+          <w:color w:val="1F4E79"/>
+        </w:rPr>
+        <w:t>P. toxostoma</w:t>
+      </w:r>
+      <w:r>
+        <w:rPr>
+          <w:color w:val="1F4E79"/>
+        </w:rPr>
+        <w:t xml:space="preserve"> having been processed at the same mean rank in the hindgut (differences of 0.2 and 0.1 ranks), this decline does not bias the hindgut category contrasts; the time spent in the holding tank, which grows with rank, is consistent with it but cannot be separated from plate column in this design.</w:t>
+      </w:r>
+      <w:r>
+        <w:rPr>
           <w:i/>
           <w:color w:val="888888"/>
           <w:sz w:val="18"/>
         </w:rPr>
-        <w:t xml:space="preserve"> [Ordre de traitement testé le 2026-10-06 (plan docs/plan_R31_ordre_2026-10-06.md, f3916c1 ; scripts/51) : dominance de C. nasus non attribuable à l'ordre ; intégration au texte en attente de JF. Code de sexe « X » : individus non sexés (André, 2026-10-06) ; le contraste femelles/mâles de R27 (F 33, M 78 ; X et vides exclus) peut être rapporté — décision de JF attendue.]</w:t>
+        <w:t xml:space="preserve"> [Contrôle (v) : plan docs/plan_R31_ordre_2026-10-06.md (f3916c1), scripts/51, R36 ; intégré sur décision de JF du 2026-10-06. Contraste femelles/mâles (R27) non rapporté : décision de JF attendue — les femelles ont été disséquées plus tôt (rang médian 5 contre 8, p = 0,02), et l'ordre abaisse l'alpha digestive. À retirer avant soumission.]</w:t>
       </w:r>
     </w:p>
     <w:p>
@@ -1930,19 +2007,26 @@
         <w:rPr>
           <w:color w:val="1F4E79"/>
         </w:rPr>
-        <w:t>Four limits bound these conclusions. Genotypic category is confounded with station, and the three stations carrying all three categories hold 65–74 individuals, so that category effects are estimated mostly between stations. Plate position affected composition and followed processing order in every campaign; its mechanism — extraction order, reagent drift within a plate, cross-contamination between adjacent wells or time spent in the holding tank — is not identified by these data; position within a plate has no measurable effect on 16S composition in our laboratory (unpublished observations) and the effect was specific to column, so we read it as a marker of processing order and propose the time spent in the holding tank before dissection as the candidate mechanism, a hypothesis this design cannot test. Because C. nasus was generally processed first, processing order could contribute to</w:t>
+        <w:t xml:space="preserve">Four limits bound these conclusions. Genotypic category is confounded with station, and the three stations carrying all three categories hold 65–74 individuals, so that category effects are estimated mostly between stations. Plate position affected composition and followed processing order in every campaign; its mechanism — extraction order, reagent drift within a plate, cross-contamination between adjacent wells or time spent in the holding tank — is not identified by these data; position within a plate has no measurable effect on 16S composition in our laboratory (unpublished observations) and the effect was specific to column, so we read it as a marker of processing order and propose the time spent in the holding tank before dissection as the candidate mechanism, a hypothesis this design cannot test. </w:t>
+      </w:r>
+      <w:r>
+        <w:rPr>
+          <w:color w:val="1F4E79"/>
+        </w:rPr>
+        <w:t xml:space="preserve">Hindgut alpha diversity declined with processing rank within station and category, which is consistent with this proposal without testing it, rank being confounded with column; processing order could not, however, produce the dominance of </w:t>
       </w:r>
       <w:r>
         <w:rPr>
           <w:i/>
           <w:color w:val="1F4E79"/>
         </w:rPr>
-      </w:r>
-      <w:r>
-        <w:rPr>
-          <w:color w:val="1F4E79"/>
-        </w:rPr>
-        <w:t xml:space="preserve"> the dominance of </w:t>
+        <w:t>C. nasus</w:t>
+      </w:r>
+      <w:r>
+        <w:rPr>
+          <w:color w:val="1F4E79"/>
+        </w:rPr>
+        <w:t xml:space="preserve"> in alpha diversity, although </w:t>
       </w:r>
       <w:r>
         <w:rPr>
@@ -1955,7 +2039,26 @@
         <w:rPr>
           <w:color w:val="1F4E79"/>
         </w:rPr>
-        <w:t xml:space="preserve"> in caudal-fin alpha diversity, which was not tested. Rarefaction to 3,000 reads retained intermediate hybrids less often than </w:t>
+        <w:t xml:space="preserve"> was generally processed first, hybrids and </w:t>
+      </w:r>
+      <w:r>
+        <w:rPr>
+          <w:i/>
+          <w:color w:val="1F4E79"/>
+        </w:rPr>
+        <w:t>P. toxostoma</w:t>
+      </w:r>
+      <w:r>
+        <w:rPr>
+          <w:color w:val="1F4E79"/>
+        </w:rPr>
+        <w:t xml:space="preserve"> having been dissected at the same mean rank within stations. </w:t>
+      </w:r>
+      <w:r>
+        <w:rPr>
+          <w:color w:val="1F4E79"/>
+        </w:rPr>
+        <w:t xml:space="preserve">Rarefaction to 3,000 reads retained intermediate hybrids less often than </w:t>
       </w:r>
       <w:r>
         <w:rPr>

</xml_diff>

<commit_message>
docs: integration de la figure de composition en phylums comme Figure S3 (scripts/62, demande JF 06/10) - appel en tete de Results « Composition by genotypic category » ; l ancienne Figure S3 (PERMDISP) devient Figure S4 (appel Dispersion + note grise) ; fichiers renommes fig_S3_phyla.*, legende_fig_S3_phyla.md, src/figure_S3_phyla_src.py, fig_S4_permdisp.png (le script 41 ecrit toujours fig_S3_permdisp.png, nom historique). Legende : derniere phrase corrigee (« tested at ASV level » faux : composition testee sur dissimilarites, Fig. 3). Script 40 : ordre S1-S4 et deux controles chiffres de la nouvelle phrase. Article f211ce82, Supplementary_Data 4b13d50b.
</commit_message>
<xml_diff>
--- a/docs/manuscrit/Article.docx
+++ b/docs/manuscrit/Article.docx
@@ -1621,6 +1621,39 @@
       <w:pPr/>
       <w:r>
         <w:rPr>
+          <w:i/>
+        </w:rPr>
+        <w:t>Pseudomonadota</w:t>
+      </w:r>
+      <w:r>
+        <w:rPr/>
+        <w:t xml:space="preserve"> was the most abundant phylum in 33 of the 36 tissue × station profiles; at the three stations where the three categories co-occur, </w:t>
+      </w:r>
+      <w:r>
+        <w:rPr>
+          <w:i/>
+        </w:rPr>
+        <w:t>Fusobacteriota</w:t>
+      </w:r>
+      <w:r>
+        <w:rPr/>
+        <w:t xml:space="preserve"> and </w:t>
+      </w:r>
+      <w:r>
+        <w:rPr>
+          <w:i/>
+        </w:rPr>
+        <w:t>Bacillota</w:t>
+      </w:r>
+      <w:r>
+        <w:rPr/>
+        <w:t xml:space="preserve"> were more abundant in both gut sections than in both external tissues in each genotypic category (Supplementary Figure S3).</w:t>
+      </w:r>
+    </w:p>
+    <w:p>
+      <w:pPr/>
+      <w:r>
+        <w:rPr>
           <w:color w:val="1F4E79"/>
         </w:rPr>
         <w:t>Fitted in both orderings without plate position, genotypic category accounted for a median of 1.7 % to 2.8 % of compositional variance across the 48 metric × tissue × run strata in pass 1 and 1.4 % to 3.0 % in pass 2, against a median of 19 % and 18 % for station fitted after category (range across strata 14–36 % in pass 1 and 14–35 % in pass 2) and of 20.9 % and 20.1 % for station fitted first (Fig. 3c; Supplementary Table S9). No tissue is detected by all four metrics in all three runs under both permutation schemes, in either pass, with or without plate position (Fig. 3a, b), so a global statement that hybrids differ is not supportable. One result is robust to every choice made here — both passes, with and without plate position, all three runs and both permutation schemes: the midgut on Jaccard (p ≤ 0.044). The caudal fin on weighted UniFrac is detected in all three runs and both schemes in pass 1 (p = 0.007–0.024), with or without plate position, and in no run in pass 2 (p = 0.073–0.235). Removing 22 randomly chosen individuals from the 158 that are not introgressed, twenty times, never restored the caudal signal in pass 2, which attributes this displacement to the definition of hybrids rather than to sample size. At 500 reads the caudal signal is partial in pass 1 (three runs sequentially, p = 0.022–0.049; one of three with station fixed by blocks) and absent in pass 2; restricted to the samples retained at 3,000 reads, the 500-read matrices give the same result as at 3,000 reads (all three runs, both station-blocked schemes, p = 0.010–0.026), so that the attenuation reflects dilution by the caudal-fin samples that pass the threshold only at 500 reads, not depth. As at 3,000 reads, none of twenty random removals of 22 non-introgressed individuals from pass 2 reproduced the pass-1 pattern at 500 reads. The hindgut is the weakest tissue in pass 1 (only Jaccard is significant, in one run of three with station fixed by blocks) but in pass 2 all four metrics detect it in all three runs with station fixed by blocks; the witness does not resolve whether this difference reflects sample size or the definition of hybrids. The principal and sensitivity models differ in 7 of the 16 metric × tissue cells in each pass, of which 5 (pass 1) and 3 (pass 2) move between robust detection (three runs, both schemes), partial detection and none. The separable sub-design detects category in 3 of 48 tests in pass 1 and 1 of 48 in pass 2 (with plate position), and Rosières, in pass 2, detects it in the gill on Jaccard and unweighted UniFrac in all three runs (p = 0.010–0.030).</w:t>
@@ -1773,7 +1806,7 @@
         <w:rPr>
           <w:color w:val="1F4E79"/>
         </w:rPr>
-        <w:t xml:space="preserve"> being the most dispersed category there; the location signals on those metrics in those compartments cannot be separated from a dispersion effect. Because betadisper accepts no covariate, the plate-position effect is not adjusted for, and a category whose samples are more spread across plate columns could carry inflated dispersion. Supplementary Table S10 and Figure S3.</w:t>
+        <w:t xml:space="preserve"> being the most dispersed category there; the location signals on those metrics in those compartments cannot be separated from a dispersion effect. Because betadisper accepts no covariate, the plate-position effect is not adjusted for, and a category whose samples are more spread across plate columns could carry inflated dispersion. Supplementary Table S10 and Figure S4.</w:t>
       </w:r>
       <w:r>
         <w:rPr>
@@ -1797,7 +1830,7 @@
           <w:color w:val="888888"/>
           <w:sz w:val="18"/>
         </w:rPr>
-        <w:t xml:space="preserve"> et Figure S3 du supplément régénérées avec les valeurs corrigées le 2026-10-05 (scripts/41-supp_S10_S3.py).]</w:t>
+        <w:t xml:space="preserve"> et Figure S4 (numérotée S3 avant le 2026-10-06) du supplément régénérées avec les valeurs corrigées le 2026-10-05 (scripts/41-supp_S10_S3.py).]</w:t>
       </w:r>
     </w:p>
     <w:p>

</xml_diff>

<commit_message>
docs: second lot de reponses d Andre du 06/10 (scripts/63) - X = juveniles confirme, NA dans la Table S2 et X/vide gardes dans les metadonnees ; pas de numero d autorisation Suran/Ardeche (Federation de l Ain, ONEMA 07 suffisent) ; Benjamin Herodet nomme dans les remerciements (role a preciser) ; remerciements et contributions en fin de manuscrit. Article cd2e6b6c, Supplementary_Data 43a118b1.
</commit_message>
<xml_diff>
--- a/docs/manuscrit/Article.docx
+++ b/docs/manuscrit/Article.docx
@@ -408,7 +408,7 @@
           <w:color w:val="888888"/>
           <w:sz w:val="18"/>
         </w:rPr>
-        <w:t>[Autorités, euthanasie et raison de la méthode : André, 2026-10-06 (docs/reponses_andre_2026-10-06.md). Reste ouvert : aucun numéro d'autorisation n'est donné pour le Suran ni pour l'Ardèche ; place de Benjamin Hérodet (Fédération de l'Ain) à préciser — déclaration d'éthique, remerciements ou auteurs. La séquence pêche → vivier → dissection, les durées et l'ordre de traitement viennent d'André (2026-10-03 ; hotus en priorité : 2026-09-25).]</w:t>
+        <w:t>[Autorités, euthanasie et raison de la méthode : André, 2026-10-06 (docs/reponses_andre_2026-10-06.md). Suran et Ardèche : pas de numéro d'autorisation, la mention de la Fédération de l'Ain et de l'ONEMA 07 suffit ; Benjamin Hérodet (Fédération de l'Ain) est nommé dans les remerciements (André, 2026-10-06, second lot). La séquence pêche → vivier → dissection, les durées et l'ordre de traitement viennent d'André (2026-10-03 ; hotus en priorité : 2026-09-25).]</w:t>
       </w:r>
     </w:p>
     <w:p>
@@ -2257,7 +2257,7 @@
           <w:color w:val="888888"/>
           <w:sz w:val="18"/>
         </w:rPr>
-        <w:t xml:space="preserve"> [Autorités et euthanasie : André, 2026-10-06. Reste ouvert : aucun numéro d'autorisation n'est donné pour le Suran ni pour l'Ardèche ; place de Benjamin Hérodet (Fédération de l'Ain) à préciser — déclaration d'éthique, remerciements ou auteurs. Consentement : sans objet.]</w:t>
+        <w:t xml:space="preserve"> [Autorités et euthanasie : André, 2026-10-06. Suran et Ardèche : pas de numéro d'autorisation, la mention de la Fédération de l'Ain et de l'ONEMA 07 suffit ; Benjamin Hérodet (Fédération de l'Ain) est nommé dans les remerciements (André, 2026-10-06, second lot). Consentement : sans objet.]</w:t>
       </w:r>
     </w:p>
     <w:p>
@@ -2388,7 +2388,7 @@
           <w:color w:val="888888"/>
           <w:sz w:val="18"/>
         </w:rPr>
-        <w:t>[Financement : contrat « EDF-CNRS AGDI 428481 » (André, 2026-10-03). Référence au projet FACIES retirée sur décision d'André (2026-10-06 : rattachement non établi) ; la mention « the contract that also funded Guivier et al. [31] », qui reposait sur ce même rattachement, est retirée avec elle — à valider par JF. Section Acknowledgements : à rédiger (André) ; y nommer Benjamin Hérodet si c'est la place retenue.]</w:t>
+        <w:t>[Financement : contrat « EDF-CNRS AGDI 428481 » (André, 2026-10-03). Référence au projet FACIES retirée sur décision d'André (2026-10-06 : rattachement non établi) ; la mention « the contract that also funded Guivier et al. [31] », qui reposait sur ce même rattachement, est retirée avec elle — à valider par JF. Benjamin Hérodet est nommé dans les remerciements (André, 2026-10-06) ; le reste des remerciements et les contributions des auteurs seront rédigés en fin de manuscrit.]</w:t>
       </w:r>
     </w:p>
     <w:p>
@@ -2428,11 +2428,18 @@
       <w:pPr/>
       <w:r>
         <w:rPr>
+          <w:i w:val="0"/>
+          <w:color w:val="1F4E79"/>
+        </w:rPr>
+        <w:t xml:space="preserve">We thank Benjamin Hérodet (Fédération de l'Ain pour la pêche et la protection des milieux aquatiques). </w:t>
+      </w:r>
+      <w:r>
+        <w:rPr>
           <w:i/>
           <w:color w:val="888888"/>
           <w:sz w:val="18"/>
         </w:rPr>
-        <w:t>[À rédiger en fin de manuscrit (André, 2026-10-03).]</w:t>
+        <w:t>[Rôle de Benjamin Hérodet à préciser (aide aux pêches du Suran ?) ; autres remerciements à rédiger en fin de manuscrit (André, 2026-10-03 et 2026-10-06).]</w:t>
       </w:r>
     </w:p>
     <w:p>

</xml_diff>

<commit_message>
docs+ena: etat du depot ENA apres la correction du 06/10 (scripts/64) - MODIFY Pertuis (44 dates de peche) + host subject id prefixe par la campagne (727) soumis le 06/10 (recu 111847, success=true, accessions inchangees) ; verifie sur l archive par JF le 06/10 a 15:02 : 5 339 champs conformes sur 727 echantillons, 0 ecart. Article §9 et supplement (Note S2, Note S3 reecrite et retitree) mis a jour. Commite aussi les recus du diagnostic (noop/nouveau), le recu de production, les rapports de verification 1108 (avant soumission) et 1502, et runs.log. Article dbdfd899, Supplementary_Data 764bebdc.
</commit_message>
<xml_diff>
--- a/docs/manuscrit/Article.docx
+++ b/docs/manuscrit/Article.docx
@@ -1132,7 +1132,7 @@
         <w:rPr>
           <w:color w:val="1F4E79"/>
         </w:rPr>
-        <w:t>ENA metadata were corrected after the initial deposit to field-record coordinates, exact collection dates and genotype-resolved host identities, without altering any accession, alias or sequence file (Supplementary Note S2); host subject identifiers are reused between years (Supplementary Note S3). Collection dates are given at day resolution for every station except Pertuis, where the two 2014 fishing campaigns are deposited as the interval 2014-07-07/2014-08-20.</w:t>
+        <w:t>ENA metadata were corrected after the initial deposit to field-record coordinates, exact collection dates, genotype-resolved host identities and campaign-prefixed host subject identifiers, without altering any accession, alias or sequence file, and the corrected state was verified against the archive (5,339 fields on 727 samples; Supplementary Note S2); host subject identifiers reused between years in the field records are disambiguated by the campaign prefix (Supplementary Note S3). Collection dates are given at day resolution for every station, the two 2014 fishing campaigns at Pertuis being dated separately (2014-07-07 and 2014-08-20).</w:t>
       </w:r>
     </w:p>
     <w:p>
@@ -1143,7 +1143,7 @@
           <w:color w:val="888888"/>
           <w:sz w:val="18"/>
         </w:rPr>
-        <w:t>[Pertuis : les individus sont désormais assignés à leur campagne (série 1011-1014 au 07/07/2014, série 2011-2015 au 20/08/2014 — André, 2026-09-30). La table de correction ena_deposit/ena_corrections_pertuis_dates.tsv est prête (44 échantillons) mais n'est pas encore soumise ; remplacer l'intervalle par les deux dates ici une fois le MODIFY passé.]</w:t>
+        <w:t>[ENA : MODIFY du 2026-10-06 (dates des deux pêches de Pertuis, 44 échantillons ; host subject id préfixé par la campagne, 727 échantillons) — reçu ena_deposit/receipt_pertuis_sujet_prod_20261006_111847.xml, success=true, accessions inchangées ; vérifié sur l'archive par JF le 2026-10-06 à 15:02 : 5 339 champs conformes sur 727 échantillons, aucun écart (ena_deposit/verification_cumulee_20261006_1502.txt). À retirer avant soumission.]</w:t>
       </w:r>
     </w:p>
     <w:p>

</xml_diff>

<commit_message>
docs: integration du controle (vi), campagne de peche (scripts/67, decision JF 06/10) - Methods 8.12 : declaration (declare apres observation, avant calcul) ; Results : detections inchangees en substance sous blocs station x campagne (46 -> 52 strates, 2 perdues en UniFrac non pondere passe 2), R2 median de la categorie 1,53 -> 1,46 %, effet propre de la campagne chez les parentaux 6,7-27,3 % ; Discussion : phrase ajoutee a la premiere limite. Script 40 : 7 controles du controle (vi). Article 4e141d99.
</commit_message>
<xml_diff>
--- a/docs/manuscrit/Article.docx
+++ b/docs/manuscrit/Article.docx
@@ -1093,6 +1093,12 @@
         </w:rPr>
         <w:t xml:space="preserve"> within stations.</w:t>
       </w:r>
+      <w:r>
+        <w:rPr>
+          <w:color w:val="1F4E79"/>
+        </w:rPr>
+        <w:t xml:space="preserve"> A sixth control was declared after an exploratory ordination showed the samples of one station separating by fishing campaign, in a document committed before its own computation. (vi) Whether fishing campaign, which the models do not include within stations, could produce the category effects: at the five stations fished twice, hybrids were mostly sampled in the second campaign, so the principal model was refitted with permutations restricted within the 14 station × campaign blocks (station × year, the two 2014 fishing days at Pertuis kept separate), the share of category was re-estimated after these blocks, and the effect of campaign was tested in the parental species alone, with permutations within station × species blocks.</w:t>
+      </w:r>
     </w:p>
     <w:p>
       <w:pPr>
@@ -1755,58 +1761,12 @@
       </w:r>
     </w:p>
     <w:p>
-      <w:pPr>
-        <w:pStyle w:val="Heading1"/>
-      </w:pPr>
-      <w:r>
-        <w:rPr>
-          <w:color w:val="1F4E79"/>
-        </w:rPr>
-        <w:t>Dispersion</w:t>
-      </w:r>
-    </w:p>
-    <w:p>
       <w:pPr/>
       <w:r>
         <w:rPr>
           <w:color w:val="1F4E79"/>
         </w:rPr>
-        <w:t xml:space="preserve">The transgressive prediction in its dispersion form — hybrids more variable than both parental categories — was not supported in either pass (Fig. 4). With station fixed by blocks, hybrids were the least dispersed of the three categories in 22 of 48 tests in pass 1 and 32 of 48 in pass 2, against the third expected under no ordering (one-sided binomial p = 0.048 and 2.4 × 10⁻⁶), and the most dispersed in 18 and 10 (p = 0.32 and 0.98). Within the stations carrying all three categories, where a dispersion difference cannot be spatial, neither direction departed from chance: hybrids were the least dispersed in 25 of 68 tests in pass 1 and 39 of 120 in pass 2, and the most dispersed in 17 and 45. The lower dispersion of hybrids is therefore a pattern of the station-blocked analysis, clear in pass 2 only and carried mainly by Bray–Curtis (median difference between hybrids and the parental mean −0.068 in pass 2 and −0.008 in pass 1), the other metrics differing by less than 0.013. Significant tests in the transgressive direction numbered 3 in pass 1 (the gill on unweighted UniFrac in two runs and the caudal fin on weighted UniFrac in one) and none in pass 2 with station fixed by blocks, and none and 5 within stations, the five of pass 2 all concerning the gill at Saint-Just-d'Ardèche, where each stratum holds three or four </w:t>
-      </w:r>
-      <w:r>
-        <w:rPr>
-          <w:i/>
-          <w:color w:val="1F4E79"/>
-        </w:rPr>
-        <w:t>P. toxostoma</w:t>
-      </w:r>
-      <w:r>
-        <w:rPr>
-          <w:color w:val="1F4E79"/>
-        </w:rPr>
-        <w:t>.</w:t>
-      </w:r>
-    </w:p>
-    <w:p>
-      <w:pPr/>
-      <w:r>
-        <w:rPr>
-          <w:color w:val="1F4E79"/>
-        </w:rPr>
-        <w:t xml:space="preserve">Because PERMANOVA is sensitive to heterogeneous dispersion, this bears on the location results. With station fixed by blocks, dispersion in the caudal fin was homogeneous on all four metrics in pass 2 and in all but one test in pass 1 (weighted UniFrac, one run of three, p = 0.048, hybrids most dispersed), so that the caudal-fin location signal on weighted UniFrac in pass 1 is a difference in composition in two runs and cannot be separated from a dispersion difference in the third. The robust midgut signal on Jaccard was accompanied by homogeneous dispersion in pass 1 and in two runs of three in pass 2. By contrast, dispersion was heterogeneous in all three runs in the midgut on unweighted UniFrac in both passes and, in pass 2, in the midgut and hindgut on Bray–Curtis, </w:t>
-      </w:r>
-      <w:r>
-        <w:rPr>
-          <w:i/>
-          <w:color w:val="1F4E79"/>
-        </w:rPr>
-        <w:t>P. toxostoma</w:t>
-      </w:r>
-      <w:r>
-        <w:rPr>
-          <w:color w:val="1F4E79"/>
-        </w:rPr>
-        <w:t xml:space="preserve"> being the most dispersed category there; the location signals on those metrics in those compartments cannot be separated from a dispersion effect. Because betadisper accepts no covariate, the plate-position effect is not adjusted for, and a category whose samples are more spread across plate columns could carry inflated dispersion. Supplementary Table S10 and Figure S4.</w:t>
+        <w:t xml:space="preserve">Restricting permutations to the 14 station × campaign blocks (§8.12, control vi) left these detections unchanged in substance. The midgut on Jaccard remained significant in all three runs of both passes, and the caudal fin on weighted UniFrac in all three runs of pass 1. Of the 96 metric × tissue × run × pass strata, 46 were significant with station blocks and 52 with station × campaign blocks; the 2 lost were both on unweighted UniFrac in pass 2, with p moving from 0.042–0.045 to 0.065–0.068. The share of category fitted after the station × campaign blocks (median 1.46 % over the 96 strata) was that fitted after station (1.53 %). Fishing campaign nevertheless structured composition on its own: in the parental species alone, at the five stations fished twice, it accounted for 6.7–27.3 % of variance within station and species (p ≤ 0.039 in all 48 metric × tissue × run strata). </w:t>
       </w:r>
       <w:r>
         <w:rPr>
@@ -1814,23 +1774,7 @@
           <w:color w:val="888888"/>
           <w:sz w:val="18"/>
         </w:rPr>
-        <w:t xml:space="preserve"> [Correction du 2026-10-03 : l'ancienne version de ces deux paragraphes, sans correction de petit effectif, donnait 32/48 (passe 1) et 34/48 (passe 2) en station bloquée, 45/68 intra-station en passe 1 et une dispersion hétérogène en caudale ; elle est retirée (docs/plan_permdisp_biais_2026-10-03.md, scripts 24 et 39). Table S</w:t>
-      </w:r>
-      <w:r>
-        <w:rPr>
-          <w:i/>
-          <w:color w:val="888888"/>
-          <w:sz w:val="18"/>
-        </w:rPr>
-        <w:t>10</w:t>
-      </w:r>
-      <w:r>
-        <w:rPr>
-          <w:i/>
-          <w:color w:val="888888"/>
-          <w:sz w:val="18"/>
-        </w:rPr>
-        <w:t xml:space="preserve"> et Figure S4 (numérotée S3 avant le 2026-10-06) du supplément régénérées avec les valeurs corrigées le 2026-10-05 (scripts/41-supp_S10_S3.py).]</w:t>
+        <w:t>[Contrôle (vi), campagne de pêche : plan docs/plan_controle_campagne_2026-10-06.md, scripts/66-controle_campagne.R (commit 118d09a), sorties results/controle_campagne/ ; déclaré après observation (ordinations exploratoires du script 65, figure candidate non retenue à ce jour). Témoin de montage : la référence à blocs de station reproduit les p et R² de results/recat dans les 96 strates. À retirer avant soumission.]</w:t>
       </w:r>
     </w:p>
     <w:p>
@@ -1841,6 +1785,85 @@
         <w:rPr>
           <w:color w:val="1F4E79"/>
         </w:rPr>
+        <w:t>Dispersion</w:t>
+      </w:r>
+    </w:p>
+    <w:p>
+      <w:pPr/>
+      <w:r>
+        <w:rPr>
+          <w:color w:val="1F4E79"/>
+        </w:rPr>
+        <w:t xml:space="preserve">The transgressive prediction in its dispersion form — hybrids more variable than both parental categories — was not supported in either pass (Fig. 4). With station fixed by blocks, hybrids were the least dispersed of the three categories in 22 of 48 tests in pass 1 and 32 of 48 in pass 2, against the third expected under no ordering (one-sided binomial p = 0.048 and 2.4 × 10⁻⁶), and the most dispersed in 18 and 10 (p = 0.32 and 0.98). Within the stations carrying all three categories, where a dispersion difference cannot be spatial, neither direction departed from chance: hybrids were the least dispersed in 25 of 68 tests in pass 1 and 39 of 120 in pass 2, and the most dispersed in 17 and 45. The lower dispersion of hybrids is therefore a pattern of the station-blocked analysis, clear in pass 2 only and carried mainly by Bray–Curtis (median difference between hybrids and the parental mean −0.068 in pass 2 and −0.008 in pass 1), the other metrics differing by less than 0.013. Significant tests in the transgressive direction numbered 3 in pass 1 (the gill on unweighted UniFrac in two runs and the caudal fin on weighted UniFrac in one) and none in pass 2 with station fixed by blocks, and none and 5 within stations, the five of pass 2 all concerning the gill at Saint-Just-d'Ardèche, where each stratum holds three or four </w:t>
+      </w:r>
+      <w:r>
+        <w:rPr>
+          <w:i/>
+          <w:color w:val="1F4E79"/>
+        </w:rPr>
+        <w:t>P. toxostoma</w:t>
+      </w:r>
+      <w:r>
+        <w:rPr>
+          <w:color w:val="1F4E79"/>
+        </w:rPr>
+        <w:t>.</w:t>
+      </w:r>
+    </w:p>
+    <w:p>
+      <w:pPr/>
+      <w:r>
+        <w:rPr>
+          <w:color w:val="1F4E79"/>
+        </w:rPr>
+        <w:t xml:space="preserve">Because PERMANOVA is sensitive to heterogeneous dispersion, this bears on the location results. With station fixed by blocks, dispersion in the caudal fin was homogeneous on all four metrics in pass 2 and in all but one test in pass 1 (weighted UniFrac, one run of three, p = 0.048, hybrids most dispersed), so that the caudal-fin location signal on weighted UniFrac in pass 1 is a difference in composition in two runs and cannot be separated from a dispersion difference in the third. The robust midgut signal on Jaccard was accompanied by homogeneous dispersion in pass 1 and in two runs of three in pass 2. By contrast, dispersion was heterogeneous in all three runs in the midgut on unweighted UniFrac in both passes and, in pass 2, in the midgut and hindgut on Bray–Curtis, </w:t>
+      </w:r>
+      <w:r>
+        <w:rPr>
+          <w:i/>
+          <w:color w:val="1F4E79"/>
+        </w:rPr>
+        <w:t>P. toxostoma</w:t>
+      </w:r>
+      <w:r>
+        <w:rPr>
+          <w:color w:val="1F4E79"/>
+        </w:rPr>
+        <w:t xml:space="preserve"> being the most dispersed category there; the location signals on those metrics in those compartments cannot be separated from a dispersion effect. Because betadisper accepts no covariate, the plate-position effect is not adjusted for, and a category whose samples are more spread across plate columns could carry inflated dispersion. Supplementary Table S10 and Figure S4.</w:t>
+      </w:r>
+      <w:r>
+        <w:rPr>
+          <w:i/>
+          <w:color w:val="888888"/>
+          <w:sz w:val="18"/>
+        </w:rPr>
+        <w:t xml:space="preserve"> [Correction du 2026-10-03 : l'ancienne version de ces deux paragraphes, sans correction de petit effectif, donnait 32/48 (passe 1) et 34/48 (passe 2) en station bloquée, 45/68 intra-station en passe 1 et une dispersion hétérogène en caudale ; elle est retirée (docs/plan_permdisp_biais_2026-10-03.md, scripts 24 et 39). Table S</w:t>
+      </w:r>
+      <w:r>
+        <w:rPr>
+          <w:i/>
+          <w:color w:val="888888"/>
+          <w:sz w:val="18"/>
+        </w:rPr>
+        <w:t>10</w:t>
+      </w:r>
+      <w:r>
+        <w:rPr>
+          <w:i/>
+          <w:color w:val="888888"/>
+          <w:sz w:val="18"/>
+        </w:rPr>
+        <w:t xml:space="preserve"> et Figure S4 (numérotée S3 avant le 2026-10-06) du supplément régénérées avec les valeurs corrigées le 2026-10-05 (scripts/41-supp_S10_S3.py).]</w:t>
+      </w:r>
+    </w:p>
+    <w:p>
+      <w:pPr>
+        <w:pStyle w:val="Heading1"/>
+      </w:pPr>
+      <w:r>
+        <w:rPr>
+          <w:color w:val="1F4E79"/>
+        </w:rPr>
         <w:t>Four-dimensional index</w:t>
       </w:r>
     </w:p>
@@ -2040,7 +2063,7 @@
         <w:rPr>
           <w:color w:val="1F4E79"/>
         </w:rPr>
-        <w:t xml:space="preserve">Four limits bound these conclusions. Genotypic category is confounded with station, and the three stations carrying all three categories hold 65–74 individuals, so that category effects are estimated mostly between stations. Plate position affected composition and followed processing order in every campaign; its mechanism — extraction order, reagent drift within a plate, cross-contamination between adjacent wells or time spent in the holding tank — is not identified by these data; position within a plate has no measurable effect on 16S composition in our laboratory (unpublished observations) and the effect was specific to column, so we read it as a marker of processing order and propose the time spent in the holding tank before dissection as the candidate mechanism, a hypothesis this design cannot test. </w:t>
+        <w:t xml:space="preserve">Four limits bound these conclusions. Genotypic category is confounded with station, and the three stations carrying all three categories hold 65–74 individuals, so that category effects are estimated mostly between stations. Station itself includes, at the five stations fished twice, a difference between fishing campaigns that accounted for 7–27 % of compositional variance in the parental species alone; restricting permutations within campaigns left the category results unchanged (§8.12, control vi), and what this campaign effect consists of — year, date or conditions of capture and handling — is not resolved by these data. Plate position affected composition and followed processing order in every campaign; its mechanism — extraction order, reagent drift within a plate, cross-contamination between adjacent wells or time spent in the holding tank — is not identified by these data; position within a plate has no measurable effect on 16S composition in our laboratory (unpublished observations) and the effect was specific to column, so we read it as a marker of processing order and propose the time spent in the holding tank before dissection as the candidate mechanism, a hypothesis this design cannot test. </w:t>
       </w:r>
       <w:r>
         <w:rPr>

</xml_diff>

<commit_message>
docs: ordination (version 1, b = trois stations, choix JF et Andre 06/10) integree comme Figure S4 (scripts/68) - appel en Results apres la part de variance de la station ; PERMDISP devient Figure S5 (appel Dispersion + note grise) ; fichiers fig_S4_ordination.*, legende_fig_S4_ordination.md, src/figure_S4_ordination_src.py, fig_S5_permdisp.png ; la version 2 reste dans figures/candidats. Legende : separation par campagne a Buech renvoyee au controle (vi). Script 40 : ordre S1-S5. Article 4398edc2, Supplementary_Data be86753f.
</commit_message>
<xml_diff>
--- a/docs/manuscrit/Article.docx
+++ b/docs/manuscrit/Article.docx
@@ -1662,7 +1662,7 @@
         <w:rPr>
           <w:color w:val="1F4E79"/>
         </w:rPr>
-        <w:t>Fitted in both orderings without plate position, genotypic category accounted for a median of 1.7 % to 2.8 % of compositional variance across the 48 metric × tissue × run strata in pass 1 and 1.4 % to 3.0 % in pass 2, against a median of 19 % and 18 % for station fitted after category (range across strata 14–36 % in pass 1 and 14–35 % in pass 2) and of 20.9 % and 20.1 % for station fitted first (Fig. 3c; Supplementary Table S9). No tissue is detected by all four metrics in all three runs under both permutation schemes, in either pass, with or without plate position (Fig. 3a, b), so a global statement that hybrids differ is not supportable. One result is robust to every choice made here — both passes, with and without plate position, all three runs and both permutation schemes: the midgut on Jaccard (p ≤ 0.044). The caudal fin on weighted UniFrac is detected in all three runs and both schemes in pass 1 (p = 0.007–0.024), with or without plate position, and in no run in pass 2 (p = 0.073–0.235). Removing 22 randomly chosen individuals from the 158 that are not introgressed, twenty times, never restored the caudal signal in pass 2, which attributes this displacement to the definition of hybrids rather than to sample size. At 500 reads the caudal signal is partial in pass 1 (three runs sequentially, p = 0.022–0.049; one of three with station fixed by blocks) and absent in pass 2; restricted to the samples retained at 3,000 reads, the 500-read matrices give the same result as at 3,000 reads (all three runs, both station-blocked schemes, p = 0.010–0.026), so that the attenuation reflects dilution by the caudal-fin samples that pass the threshold only at 500 reads, not depth. As at 3,000 reads, none of twenty random removals of 22 non-introgressed individuals from pass 2 reproduced the pass-1 pattern at 500 reads. The hindgut is the weakest tissue in pass 1 (only Jaccard is significant, in one run of three with station fixed by blocks) but in pass 2 all four metrics detect it in all three runs with station fixed by blocks; the witness does not resolve whether this difference reflects sample size or the definition of hybrids. The principal and sensitivity models differ in 7 of the 16 metric × tissue cells in each pass, of which 5 (pass 1) and 3 (pass 2) move between robust detection (three runs, both schemes), partial detection and none. The separable sub-design detects category in 3 of 48 tests in pass 1 and 1 of 48 in pass 2 (with plate position), and Rosières, in pass 2, detects it in the gill on Jaccard and unweighted UniFrac in all three runs (p = 0.010–0.030).</w:t>
+        <w:t>Fitted in both orderings without plate position, genotypic category accounted for a median of 1.7 % to 2.8 % of compositional variance across the 48 metric × tissue × run strata in pass 1 and 1.4 % to 3.0 % in pass 2, against a median of 19 % and 18 % for station fitted after category (range across strata 14–36 % in pass 1 and 14–35 % in pass 2) and of 20.9 % and 20.1 % for station fitted first (Fig. 3c; Supplementary Table S9). In ordination space, the samples of the three stations carrying all three categories group by station rather than by category in every tissue (Supplementary Figure S4). No tissue is detected by all four metrics in all three runs under both permutation schemes, in either pass, with or without plate position (Fig. 3a, b), so a global statement that hybrids differ is not supportable. One result is robust to every choice made here — both passes, with and without plate position, all three runs and both permutation schemes: the midgut on Jaccard (p ≤ 0.044). The caudal fin on weighted UniFrac is detected in all three runs and both schemes in pass 1 (p = 0.007–0.024), with or without plate position, and in no run in pass 2 (p = 0.073–0.235). Removing 22 randomly chosen individuals from the 158 that are not introgressed, twenty times, never restored the caudal signal in pass 2, which attributes this displacement to the definition of hybrids rather than to sample size. At 500 reads the caudal signal is partial in pass 1 (three runs sequentially, p = 0.022–0.049; one of three with station fixed by blocks) and absent in pass 2; restricted to the samples retained at 3,000 reads, the 500-read matrices give the same result as at 3,000 reads (all three runs, both station-blocked schemes, p = 0.010–0.026), so that the attenuation reflects dilution by the caudal-fin samples that pass the threshold only at 500 reads, not depth. As at 3,000 reads, none of twenty random removals of 22 non-introgressed individuals from pass 2 reproduced the pass-1 pattern at 500 reads. The hindgut is the weakest tissue in pass 1 (only Jaccard is significant, in one run of three with station fixed by blocks) but in pass 2 all four metrics detect it in all three runs with station fixed by blocks; the witness does not resolve whether this difference reflects sample size or the definition of hybrids. The principal and sensitivity models differ in 7 of the 16 metric × tissue cells in each pass, of which 5 (pass 1) and 3 (pass 2) move between robust detection (three runs, both schemes), partial detection and none. The separable sub-design detects category in 3 of 48 tests in pass 1 and 1 of 48 in pass 2 (with plate position), and Rosières, in pass 2, detects it in the gill on Jaccard and unweighted UniFrac in all three runs (p = 0.010–0.030).</w:t>
       </w:r>
     </w:p>
     <w:p>
@@ -1829,7 +1829,7 @@
         <w:rPr>
           <w:color w:val="1F4E79"/>
         </w:rPr>
-        <w:t xml:space="preserve"> being the most dispersed category there; the location signals on those metrics in those compartments cannot be separated from a dispersion effect. Because betadisper accepts no covariate, the plate-position effect is not adjusted for, and a category whose samples are more spread across plate columns could carry inflated dispersion. Supplementary Table S10 and Figure S4.</w:t>
+        <w:t xml:space="preserve"> being the most dispersed category there; the location signals on those metrics in those compartments cannot be separated from a dispersion effect. Because betadisper accepts no covariate, the plate-position effect is not adjusted for, and a category whose samples are more spread across plate columns could carry inflated dispersion. Supplementary Table S10 and Figure S5.</w:t>
       </w:r>
       <w:r>
         <w:rPr>
@@ -1853,7 +1853,7 @@
           <w:color w:val="888888"/>
           <w:sz w:val="18"/>
         </w:rPr>
-        <w:t xml:space="preserve"> et Figure S4 (numérotée S3 avant le 2026-10-06) du supplément régénérées avec les valeurs corrigées le 2026-10-05 (scripts/41-supp_S10_S3.py).]</w:t>
+        <w:t xml:space="preserve"> et Figure S5 (numérotée S3, puis S4, avant le 2026-10-06) du supplément régénérées avec les valeurs corrigées le 2026-10-05 (scripts/41-supp_S10_S3.py).]</w:t>
       </w:r>
     </w:p>
     <w:p>

</xml_diff>

<commit_message>
docs: decisions JF du 06/10 apres-midi (scripts/69) - Figure S3 validee ; retrait de la mention Guivier [31] valide ; pas d abondance differentielle (decision 6) ; limites : phrase sur la taille par categorie (TL moyenne Cn 24,4 / Hy 19,4 / Pt 16,0 cm, Kruskal-Wallis p = 0,004, age non estime), Five limits. Script 40 : controle de la taille. Article b2791c95.
</commit_message>
<xml_diff>
--- a/docs/manuscrit/Article.docx
+++ b/docs/manuscrit/Article.docx
@@ -803,7 +803,7 @@
           <w:color w:val="888888"/>
           <w:sz w:val="18"/>
         </w:rPr>
-        <w:t xml:space="preserve"> [Phrase retirée au resserrement du 2026-10-05 : « The choice of a differential-abundance method remains to be fixed. » Aucune analyse d'abondance différentielle n'est rapportée ; à trancher par JF.]</w:t>
+        <w:t xml:space="preserve"> [Phrase retirée au resserrement du 2026-10-05 : « The choice of a differential-abundance method remains to be fixed. » Aucune analyse d'abondance différentielle n'est faite : décision de JF du 2026-10-06 (décision 6).]</w:t>
       </w:r>
     </w:p>
     <w:p>
@@ -2063,7 +2063,45 @@
         <w:rPr>
           <w:color w:val="1F4E79"/>
         </w:rPr>
-        <w:t xml:space="preserve">Four limits bound these conclusions. Genotypic category is confounded with station, and the three stations carrying all three categories hold 65–74 individuals, so that category effects are estimated mostly between stations. Station itself includes, at the five stations fished twice, a difference between fishing campaigns that accounted for 7–27 % of compositional variance in the parental species alone; restricting permutations within campaigns left the category results unchanged (§8.12, control vi), and what this campaign effect consists of — year, date or conditions of capture and handling — is not resolved by these data. Plate position affected composition and followed processing order in every campaign; its mechanism — extraction order, reagent drift within a plate, cross-contamination between adjacent wells or time spent in the holding tank — is not identified by these data; position within a plate has no measurable effect on 16S composition in our laboratory (unpublished observations) and the effect was specific to column, so we read it as a marker of processing order and propose the time spent in the holding tank before dissection as the candidate mechanism, a hypothesis this design cannot test. </w:t>
+        <w:t>Five limits bound these conclusions. Genotypic category is confounded with station, and the three stations carrying all three categories hold 65–74 individuals, so that category effects are estimated mostly between stations. Station itself includes, at the five stations fished twice, a difference between fishing campaigns that accounted for 7–27 % of compositional variance in the parental species alone; restricting permutations within campaigns left the category results unchanged (§8.12, control vi), and what this campaign effect consists of — year, date or conditions of capture and handling — is not resolved by these data.</w:t>
+      </w:r>
+      <w:r>
+        <w:rPr>
+          <w:color w:val="1F4E79"/>
+        </w:rPr>
+        <w:t xml:space="preserve"> Body size also differed between genotypic categories (mean total length 24.4 cm in </w:t>
+      </w:r>
+      <w:r>
+        <w:rPr>
+          <w:i/>
+          <w:color w:val="1F4E79"/>
+        </w:rPr>
+        <w:t>C. nasus</w:t>
+      </w:r>
+      <w:r>
+        <w:rPr>
+          <w:color w:val="1F4E79"/>
+        </w:rPr>
+        <w:t xml:space="preserve">, 19.4 cm in hybrids and 16.0 cm in </w:t>
+      </w:r>
+      <w:r>
+        <w:rPr>
+          <w:i/>
+          <w:color w:val="1F4E79"/>
+        </w:rPr>
+        <w:t>P. toxostoma</w:t>
+      </w:r>
+      <w:r>
+        <w:rPr>
+          <w:color w:val="1F4E79"/>
+        </w:rPr>
+        <w:t>; Kruskal–Wallis p = 0.004), and age was not estimated, so that category contrasts may include effects of size or age that this design cannot separate from those of ancestry.</w:t>
+      </w:r>
+      <w:r>
+        <w:rPr>
+          <w:color w:val="1F4E79"/>
+        </w:rPr>
+        <w:t xml:space="preserve"> Plate position affected composition and followed processing order in every campaign; its mechanism — extraction order, reagent drift within a plate, cross-contamination between adjacent wells or time spent in the holding tank — is not identified by these data; position within a plate has no measurable effect on 16S composition in our laboratory (unpublished observations) and the effect was specific to column, so we read it as a marker of processing order and propose the time spent in the holding tank before dissection as the candidate mechanism, a hypothesis this design cannot test. </w:t>
       </w:r>
       <w:r>
         <w:rPr>
@@ -2411,7 +2449,7 @@
           <w:color w:val="888888"/>
           <w:sz w:val="18"/>
         </w:rPr>
-        <w:t>[Financement : contrat « EDF-CNRS AGDI 428481 » (André, 2026-10-03). Référence au projet FACIES retirée sur décision d'André (2026-10-06 : rattachement non établi) ; la mention « the contract that also funded Guivier et al. [31] », qui reposait sur ce même rattachement, est retirée avec elle — à valider par JF. Benjamin Hérodet est nommé dans les remerciements (André, 2026-10-06) ; le reste des remerciements et les contributions des auteurs seront rédigés en fin de manuscrit.]</w:t>
+        <w:t>[Financement : contrat « EDF-CNRS AGDI 428481 » (André, 2026-10-03). Référence au projet FACIES retirée sur décision d'André (2026-10-06 : rattachement non établi) ; la mention « the contract that also funded Guivier et al. [31] », qui reposait sur ce même rattachement, est retirée avec elle — retrait validé par JF le 2026-10-06. Benjamin Hérodet est nommé dans les remerciements (André, 2026-10-06) ; le reste des remerciements et les contributions des auteurs seront rédigés en fin de manuscrit.]</w:t>
       </w:r>
     </w:p>
     <w:p>

</xml_diff>

<commit_message>
docs: ajouts du Largue (scripts/71, decision JF 06/10) - limites : la selection en nageoire caudale suit en partie la position (plaque 2, colonnes 06-08 : 12S hote 93 % Largue, 74 % Saint-Just, 25 % ailleurs ; sans le Largue l ecart Pt-Hy passe de 29-36 a 22-31 points en passe 1) ; legende Figure S4 chiffree. Script 40 : 2 controles. Article 45f52898, Supplementary_Data e6b95f56.
</commit_message>
<xml_diff>
--- a/docs/manuscrit/Article.docx
+++ b/docs/manuscrit/Article.docx
@@ -2165,7 +2165,32 @@
         <w:rPr>
           <w:color w:val="1F4E79"/>
         </w:rPr>
-        <w:t xml:space="preserve"> in the caudal fin, a selection that is declared but cannot be removed for presence-based metrics. And only 64 % of reads could be aggregated to genus for the 4H index, whose genus-level reading therefore rests on the better-assigned part of each community.</w:t>
+        <w:t xml:space="preserve"> in the caudal fin, a selection that is declared but cannot be removed for presence-based metrics.</w:t>
+      </w:r>
+      <w:r>
+        <w:rPr>
+          <w:color w:val="1F4E79"/>
+        </w:rPr>
+        <w:t xml:space="preserve"> Part of this selection follows sample position rather than genotype: the caudal-fin samples placed in three columns of one plate, from all 20 fish of the Largue canal and 4 of Saint-Just-d'Ardèche, consisted mostly of host mitochondrial 12S rRNA gene reads (median 93 % and 74 % of raw reads, against 25 % for the other caudal-fin samples), and excluding the Largue canal narrows the gap between </w:t>
+      </w:r>
+      <w:r>
+        <w:rPr>
+          <w:i/>
+          <w:color w:val="1F4E79"/>
+        </w:rPr>
+        <w:t>P. toxostoma</w:t>
+      </w:r>
+      <w:r>
+        <w:rPr>
+          <w:color w:val="1F4E79"/>
+        </w:rPr>
+        <w:t xml:space="preserve"> and intermediate hybrids from 29–36 to 22–31 points across runs in pass 1, so that most of it remains.</w:t>
+      </w:r>
+      <w:r>
+        <w:rPr>
+          <w:color w:val="1F4E79"/>
+        </w:rPr>
+        <w:t xml:space="preserve"> And only 64 % of reads could be aggregated to genus for the 4H index, whose genus-level reading therefore rests on the better-assigned part of each community.</w:t>
       </w:r>
     </w:p>
     <w:p>

</xml_diff>